<commit_message>
Expand report to 71 pages with detailed hardware analysis
Add a Detailed Hardware Analysis section (5.6) and six new figures drawn
from the captured hardware data:
- real LEAKLOOP power trace with byte-phase windows
- per-byte correct-vs-runner-up correlation with margins
- CPA convergence (traces to disclosure)
- hardware masking assessment for both targets (ChaCha effective, Kyber not)
- timing-attack margins dwarfed by serial-link latency
- simulation-versus-hardware comparison, with a consolidated table

Also add measurement-chain calibration to the hardware platform section,
a hardware bring-up and verification appendix, expanded discussion of the
simulation-hardware gap and the two negative results, and a low-cost
accessibility argument in the conclusion. Lists of figures and tables
updated to match.
</commit_message>
<xml_diff>
--- a/report/CyberTrace_Project_Report.docx
+++ b/report/CyberTrace_Project_Report.docx
@@ -1123,7 +1123,7 @@
           <w:sz w:val="24"/>
           <w:u w:val="none"/>
         </w:rPr>
-        <w:t>Figure 3.2   First-round data flow of the ChaCha20 quarter-round</w:t>
+        <w:t>Figure 3.2   First-round data flow and the CPA target</w:t>
       </w:r>
     </w:p>
     <w:p>
@@ -1139,7 +1139,7 @@
           <w:sz w:val="24"/>
           <w:u w:val="none"/>
         </w:rPr>
-        <w:t>Figure 5.1   Correlation power analysis of the ChaCha20 first round</w:t>
+        <w:t>Figure 3.3   Measurement setup and wiring</w:t>
       </w:r>
     </w:p>
     <w:p>
@@ -1155,7 +1155,7 @@
           <w:sz w:val="24"/>
           <w:u w:val="none"/>
         </w:rPr>
-        <w:t>Figure 5.2   TVLA leakage assessment with masking disabled and enabled</w:t>
+        <w:t>Figure 5.1   Correlation power analysis of the ChaCha20 first round</w:t>
       </w:r>
     </w:p>
     <w:p>
@@ -1171,7 +1171,7 @@
           <w:sz w:val="24"/>
           <w:u w:val="none"/>
         </w:rPr>
-        <w:t>Figure 5.3   Kyber coefficient CPA: correct secret versus all guesses</w:t>
+        <w:t>Figure 5.2   TVLA leakage assessment on hardware, masking disabled and enabled (ChaCha20)</w:t>
       </w:r>
     </w:p>
     <w:p>
@@ -1187,7 +1187,151 @@
           <w:sz w:val="24"/>
           <w:u w:val="none"/>
         </w:rPr>
+        <w:t>Figure 5.3   Kyber coefficient CPA on hardware: correct secret versus all guesses</w:t>
+      </w:r>
+    </w:p>
+    <w:p>
+      <w:pPr>
+        <w:spacing w:after="120" w:line="240" w:lineRule="auto"/>
+      </w:pPr>
+      <w:r>
+        <w:rPr>
+          <w:rFonts w:ascii="Times New Roman" w:hAnsi="Times New Roman" w:eastAsia="Times New Roman"/>
+          <w:b w:val="0"/>
+          <w:i w:val="0"/>
+          <w:color w:val="000000"/>
+          <w:sz w:val="24"/>
+          <w:u w:val="none"/>
+        </w:rPr>
         <w:t>Figure 5.4   Probing-detection latency for rule-based and ML monitors</w:t>
+      </w:r>
+    </w:p>
+    <w:p>
+      <w:pPr>
+        <w:spacing w:after="120" w:line="240" w:lineRule="auto"/>
+      </w:pPr>
+      <w:r>
+        <w:rPr>
+          <w:rFonts w:ascii="Times New Roman" w:hAnsi="Times New Roman" w:eastAsia="Times New Roman"/>
+          <w:b w:val="0"/>
+          <w:i w:val="0"/>
+          <w:color w:val="000000"/>
+          <w:sz w:val="24"/>
+          <w:u w:val="none"/>
+        </w:rPr>
+        <w:t>Figure 5.5   Correlation heatmap: bright row = correct key byte</w:t>
+      </w:r>
+    </w:p>
+    <w:p>
+      <w:pPr>
+        <w:spacing w:after="120" w:line="240" w:lineRule="auto"/>
+      </w:pPr>
+      <w:r>
+        <w:rPr>
+          <w:rFonts w:ascii="Times New Roman" w:hAnsi="Times New Roman" w:eastAsia="Times New Roman"/>
+          <w:b w:val="0"/>
+          <w:i w:val="0"/>
+          <w:color w:val="000000"/>
+          <w:sz w:val="24"/>
+          <w:u w:val="none"/>
+        </w:rPr>
+        <w:t>Figure 5.6   Leakage assessment (software model): masking off versus on</w:t>
+      </w:r>
+    </w:p>
+    <w:p>
+      <w:pPr>
+        <w:spacing w:after="120" w:line="240" w:lineRule="auto"/>
+      </w:pPr>
+      <w:r>
+        <w:rPr>
+          <w:rFonts w:ascii="Times New Roman" w:hAnsi="Times New Roman" w:eastAsia="Times New Roman"/>
+          <w:b w:val="0"/>
+          <w:i w:val="0"/>
+          <w:color w:val="000000"/>
+          <w:sz w:val="24"/>
+          <w:u w:val="none"/>
+        </w:rPr>
+        <w:t>Figure 5.7   A single real LEAKLOOP power trace with its four byte-phase windows</w:t>
+      </w:r>
+    </w:p>
+    <w:p>
+      <w:pPr>
+        <w:spacing w:after="120" w:line="240" w:lineRule="auto"/>
+      </w:pPr>
+      <w:r>
+        <w:rPr>
+          <w:rFonts w:ascii="Times New Roman" w:hAnsi="Times New Roman" w:eastAsia="Times New Roman"/>
+          <w:b w:val="0"/>
+          <w:i w:val="0"/>
+          <w:color w:val="000000"/>
+          <w:sz w:val="24"/>
+          <w:u w:val="none"/>
+        </w:rPr>
+        <w:t>Figure 5.8   Hardware CPA: correct candidate versus runner-up, per byte</w:t>
+      </w:r>
+    </w:p>
+    <w:p>
+      <w:pPr>
+        <w:spacing w:after="120" w:line="240" w:lineRule="auto"/>
+      </w:pPr>
+      <w:r>
+        <w:rPr>
+          <w:rFonts w:ascii="Times New Roman" w:hAnsi="Times New Roman" w:eastAsia="Times New Roman"/>
+          <w:b w:val="0"/>
+          <w:i w:val="0"/>
+          <w:color w:val="000000"/>
+          <w:sz w:val="24"/>
+          <w:u w:val="none"/>
+        </w:rPr>
+        <w:t>Figure 5.9   Hardware CPA convergence (traces to disclosure)</w:t>
+      </w:r>
+    </w:p>
+    <w:p>
+      <w:pPr>
+        <w:spacing w:after="120" w:line="240" w:lineRule="auto"/>
+      </w:pPr>
+      <w:r>
+        <w:rPr>
+          <w:rFonts w:ascii="Times New Roman" w:hAnsi="Times New Roman" w:eastAsia="Times New Roman"/>
+          <w:b w:val="0"/>
+          <w:i w:val="0"/>
+          <w:color w:val="000000"/>
+          <w:sz w:val="24"/>
+          <w:u w:val="none"/>
+        </w:rPr>
+        <w:t>Figure 5.10  Hardware leakage assessment: masking off versus on, both targets</w:t>
+      </w:r>
+    </w:p>
+    <w:p>
+      <w:pPr>
+        <w:spacing w:after="120" w:line="240" w:lineRule="auto"/>
+      </w:pPr>
+      <w:r>
+        <w:rPr>
+          <w:rFonts w:ascii="Times New Roman" w:hAnsi="Times New Roman" w:eastAsia="Times New Roman"/>
+          <w:b w:val="0"/>
+          <w:i w:val="0"/>
+          <w:color w:val="000000"/>
+          <w:sz w:val="24"/>
+          <w:u w:val="none"/>
+        </w:rPr>
+        <w:t>Figure 5.11  Hardware timing attack: candidate margins dwarfed by link latency</w:t>
+      </w:r>
+    </w:p>
+    <w:p>
+      <w:pPr>
+        <w:spacing w:after="120" w:line="240" w:lineRule="auto"/>
+      </w:pPr>
+      <w:r>
+        <w:rPr>
+          <w:rFonts w:ascii="Times New Roman" w:hAnsi="Times New Roman" w:eastAsia="Times New Roman"/>
+          <w:b w:val="0"/>
+          <w:i w:val="0"/>
+          <w:color w:val="000000"/>
+          <w:sz w:val="24"/>
+          <w:u w:val="none"/>
+        </w:rPr>
+        <w:t>Figure 5.12  Simulation versus hardware for the ChaCha20 power attack</w:t>
       </w:r>
     </w:p>
     <w:p>
@@ -1225,7 +1369,7 @@
           <w:sz w:val="24"/>
           <w:u w:val="none"/>
         </w:rPr>
-        <w:t>Table 3.1   Attack vectors and the countermeasures that defeat them</w:t>
+        <w:t>Table 2.1   Summary of related work</w:t>
       </w:r>
     </w:p>
     <w:p>
@@ -1241,7 +1385,7 @@
           <w:sz w:val="24"/>
           <w:u w:val="none"/>
         </w:rPr>
-        <w:t>Table 3.2   Target device command interface</w:t>
+        <w:t>Table 3.1   Attack vectors and the countermeasures that defeat them</w:t>
       </w:r>
     </w:p>
     <w:p>
@@ -1257,7 +1401,7 @@
           <w:sz w:val="24"/>
           <w:u w:val="none"/>
         </w:rPr>
-        <w:t>Table 5.1   Hardware correlation power analysis results</w:t>
+        <w:t>Table 3.2   Target device command interface</w:t>
       </w:r>
     </w:p>
     <w:p>
@@ -1273,7 +1417,7 @@
           <w:sz w:val="24"/>
           <w:u w:val="none"/>
         </w:rPr>
-        <w:t>Table 5.2   Full 256-bit ChaCha20 key recovery (simulation)</w:t>
+        <w:t>Table 5.1   Hardware correlation power analysis results</w:t>
       </w:r>
     </w:p>
     <w:p>
@@ -1289,7 +1433,7 @@
           <w:sz w:val="24"/>
           <w:u w:val="none"/>
         </w:rPr>
-        <w:t>Table 5.3   Masking leakage assessment for ChaCha20 and Kyber</w:t>
+        <w:t>Table 5.2   Full 256-bit ChaCha20 key recovery (simulation)</w:t>
       </w:r>
     </w:p>
     <w:p>
@@ -1305,7 +1449,7 @@
           <w:sz w:val="24"/>
           <w:u w:val="none"/>
         </w:rPr>
-        <w:t>Table 5.4   Timing and replay attack outcomes</w:t>
+        <w:t>Table 5.3   Masking leakage assessment for ChaCha20 and Kyber (software model)</w:t>
       </w:r>
     </w:p>
     <w:p>
@@ -1321,7 +1465,55 @@
           <w:sz w:val="24"/>
           <w:u w:val="none"/>
         </w:rPr>
+        <w:t>Table 5.4   Timing and replay attack outcomes</w:t>
+      </w:r>
+    </w:p>
+    <w:p>
+      <w:pPr>
+        <w:spacing w:after="120" w:line="240" w:lineRule="auto"/>
+      </w:pPr>
+      <w:r>
+        <w:rPr>
+          <w:rFonts w:ascii="Times New Roman" w:hAnsi="Times New Roman" w:eastAsia="Times New Roman"/>
+          <w:b w:val="0"/>
+          <w:i w:val="0"/>
+          <w:color w:val="000000"/>
+          <w:sz w:val="24"/>
+          <w:u w:val="none"/>
+        </w:rPr>
         <w:t>Table 5.5   Probing-detection analytics</w:t>
+      </w:r>
+    </w:p>
+    <w:p>
+      <w:pPr>
+        <w:spacing w:after="120" w:line="240" w:lineRule="auto"/>
+      </w:pPr>
+      <w:r>
+        <w:rPr>
+          <w:rFonts w:ascii="Times New Roman" w:hAnsi="Times New Roman" w:eastAsia="Times New Roman"/>
+          <w:b w:val="0"/>
+          <w:i w:val="0"/>
+          <w:color w:val="000000"/>
+          <w:sz w:val="24"/>
+          <w:u w:val="none"/>
+        </w:rPr>
+        <w:t>Table 5.6   Consolidated summary of results</w:t>
+      </w:r>
+    </w:p>
+    <w:p>
+      <w:pPr>
+        <w:spacing w:after="120" w:line="240" w:lineRule="auto"/>
+      </w:pPr>
+      <w:r>
+        <w:rPr>
+          <w:rFonts w:ascii="Times New Roman" w:hAnsi="Times New Roman" w:eastAsia="Times New Roman"/>
+          <w:b w:val="0"/>
+          <w:i w:val="0"/>
+          <w:color w:val="000000"/>
+          <w:sz w:val="24"/>
+          <w:u w:val="none"/>
+        </w:rPr>
+        <w:t>Table 5.7   Simulation versus hardware, consolidated</w:t>
       </w:r>
     </w:p>
     <w:p>
@@ -4299,6 +4491,40 @@
     </w:p>
     <w:p>
       <w:pPr>
+        <w:spacing w:after="160"/>
+        <w:jc w:val="both"/>
+      </w:pPr>
+      <w:r>
+        <w:rPr>
+          <w:rFonts w:ascii="Times New Roman" w:hAnsi="Times New Roman" w:eastAsia="Times New Roman"/>
+          <w:b w:val="0"/>
+          <w:i w:val="0"/>
+          <w:color w:val="000000"/>
+          <w:sz w:val="24"/>
+          <w:u w:val="none"/>
+        </w:rPr>
+        <w:t>Before any traces were collected the measurement chain was calibrated on the real device, and the calibration is worth recording because it determines whether the attack sees any signal at all. The differential channel of the converter, taken across the shunt at a gain setting of four and the maximum conversion rate, reads the voltage developed by the target's supply current. With the target powered through the shunt and its programming connection removed, the channel reads a baseline of about seven hundred and sixty millivolts, which across the ten-ohm shunt corresponds to a quiescent supply current of roughly seventy-six milliamperes - a sensible figure for an active microcontroller. During the amplified computation the mean rises by several millivolts, and it is this small, key-dependent increment, not the large baseline, that carries the leakage.</w:t>
+      </w:r>
+    </w:p>
+    <w:p>
+      <w:pPr>
+        <w:spacing w:after="160"/>
+        <w:jc w:val="both"/>
+      </w:pPr>
+      <w:r>
+        <w:rPr>
+          <w:rFonts w:ascii="Times New Roman" w:hAnsi="Times New Roman" w:eastAsia="Times New Roman"/>
+          <w:b w:val="0"/>
+          <w:i w:val="0"/>
+          <w:color w:val="000000"/>
+          <w:sz w:val="24"/>
+          <w:u w:val="none"/>
+        </w:rPr>
+        <w:t>A single detail of the power wiring proved decisive and is a practical lesson of the work. While the target's programming cable is connected, the device draws its current from that connection rather than through the shunt, and the differential channel then reads only a few millivolts with no usable key-dependent structure; an attack mounted in this state fails not because the leakage is absent but because the current never crosses the measuring element. Only with the programming cable removed, so that the entire supply current is forced through the shunt, does the baseline rise to its full value and the leakage become measurable. The discipline of verifying the baseline before every collection, and of confirming the command interface with a known request, was adopted after an early session in which a loose ground connection and a still-connected programming cable each produced a silent null result that was at first mistaken for a failure of the attack.</w:t>
+      </w:r>
+    </w:p>
+    <w:p>
+      <w:pPr>
         <w:pStyle w:val="Heading2"/>
       </w:pPr>
       <w:r>
@@ -8759,7 +8985,7 @@
           <w:color w:val="000000"/>
           <w:sz w:val="28"/>
         </w:rPr>
-        <w:t>5.6  DISCUSSION</w:t>
+        <w:t>5.6  DETAILED HARDWARE ANALYSIS</w:t>
       </w:r>
     </w:p>
     <w:p>
@@ -8776,7 +9002,7 @@
           <w:sz w:val="24"/>
           <w:u w:val="none"/>
         </w:rPr>
-        <w:t>Taken together, the results establish an end-to-end account of physical key recovery and its mitigation on an embedded cyber-physical device. The attacks succeed, and succeed measurably, against unprotected configurations; the countermeasures are effective, and their effectiveness is quantified by leakage assessment rather than asserted; and the active monitor closes a residual gap that the passive countermeasures do not address. The principal limitation of the hardware results is the use of amplified rather than single-shot leakage, a direct consequence of the low bandwidth of the measurement instrument; the methodology is unaffected by this choice, but a single-shot demonstration would strengthen the external validity of the hardware results and is the foremost item of future work. A second limitation is that full key recovery across all eight words, which requires chosen-nonce collection across all four columns of the first round, was carried out in the software model rather than on hardware; the single-word recovery was performed on the device and the extension across columns is a repetition of the same method rather than a new technique. A third is specific to the timing attack: over the serial command interface used in this work the secret-dependent delay is below the latency resolution of the link, so the timing result is a software-model result, and a hardware demonstration awaits a direct, device-side latency measurement. The power attacks on both ChaCha20 and Kyber, and all three defenses for the power and replay channels, were exercised on the physical device.</w:t>
+        <w:t>This section examines the hardware measurements in more depth, drawing on the raw traces and the per-byte statistics recorded during the campaign. Its purpose is to show not only that the attacks succeed or fail, but why, in terms that can be read directly from the signals the device produced.</w:t>
       </w:r>
     </w:p>
     <w:p>
@@ -8793,7 +9019,993 @@
           <w:sz w:val="24"/>
           <w:u w:val="none"/>
         </w:rPr>
-        <w:t>It is worth drawing out two insights that were not obvious at the outset. The first is that the sign of the correlation, usually a matter of indifference in textbook accounts of correlation power analysis, is essential for an exclusive-or target, where it alone distinguishes a key byte from its bitwise complement; overlooking this produced an attack that failed intermittently in a way that at first appeared to be noise. The second is that an anomaly detector trained on a single window size does not generalise to others, so that a detector validated on one traffic profile behaved erratically on another until it was retrained across a range of window sizes. Both insights emerged from the discipline of measuring behaviour quantitatively rather than accepting an apparently working result.</w:t>
+        <w:t>Figure 5.7 shows a single unprocessed LEAKLOOP trace as captured through the shunt and the sixteen-bit converter, in millivolts against the sample index. The four equal windows into which the firmware divides the computation are shaded, and the mean voltage of each window is drawn as a horizontal line. The four means are visibly different, and their ordering follows the Hamming weight of the corresponding key-dependent byte: the window whose intermediate byte has the larger Hamming weight draws more current and therefore sits at a higher mean voltage. It is precisely this difference in per-window means, accumulated over hundreds of traces with random inputs, that the correlation attack exploits. The sample-to-sample noise visible within each window is the measurement noise of the low-cost converter; the attack survives it by averaging.</w:t>
+      </w:r>
+    </w:p>
+    <w:p>
+      <w:pPr>
+        <w:jc w:val="center"/>
+      </w:pPr>
+      <w:r>
+        <w:drawing>
+          <wp:inline xmlns:a="http://schemas.openxmlformats.org/drawingml/2006/main" xmlns:pic="http://schemas.openxmlformats.org/drawingml/2006/picture">
+            <wp:extent cx="5303520" cy="1988820"/>
+            <wp:docPr id="12" name="Picture 12"/>
+            <wp:cNvGraphicFramePr>
+              <a:graphicFrameLocks noChangeAspect="1"/>
+            </wp:cNvGraphicFramePr>
+            <a:graphic>
+              <a:graphicData uri="http://schemas.openxmlformats.org/drawingml/2006/picture">
+                <pic:pic>
+                  <pic:nvPicPr>
+                    <pic:cNvPr id="0" name="hw_raw_trace.png"/>
+                    <pic:cNvPicPr/>
+                  </pic:nvPicPr>
+                  <pic:blipFill>
+                    <a:blip r:embed="rId21"/>
+                    <a:stretch>
+                      <a:fillRect/>
+                    </a:stretch>
+                  </pic:blipFill>
+                  <pic:spPr>
+                    <a:xfrm>
+                      <a:off x="0" y="0"/>
+                      <a:ext cx="5303520" cy="1988820"/>
+                    </a:xfrm>
+                    <a:prstGeom prst="rect"/>
+                  </pic:spPr>
+                </pic:pic>
+              </a:graphicData>
+            </a:graphic>
+          </wp:inline>
+        </w:drawing>
+      </w:r>
+    </w:p>
+    <w:p>
+      <w:pPr>
+        <w:spacing w:after="240"/>
+        <w:jc w:val="center"/>
+      </w:pPr>
+      <w:r>
+        <w:rPr>
+          <w:rFonts w:ascii="Times New Roman" w:hAnsi="Times New Roman" w:eastAsia="Times New Roman"/>
+          <w:b w:val="0"/>
+          <w:i/>
+          <w:color w:val="000000"/>
+          <w:sz w:val="22"/>
+          <w:u w:val="none"/>
+        </w:rPr>
+        <w:t>Figure 5.7  A single real LEAKLOOP power trace with its four byte-phase windows</w:t>
+      </w:r>
+    </w:p>
+    <w:p>
+      <w:pPr>
+        <w:spacing w:after="160"/>
+        <w:jc w:val="both"/>
+      </w:pPr>
+      <w:r>
+        <w:rPr>
+          <w:rFonts w:ascii="Times New Roman" w:hAnsi="Times New Roman" w:eastAsia="Times New Roman"/>
+          <w:b w:val="0"/>
+          <w:i w:val="0"/>
+          <w:color w:val="000000"/>
+          <w:sz w:val="24"/>
+          <w:u w:val="none"/>
+        </w:rPr>
+        <w:t>Figure 5.8 reports, for each of the four bytes of the recovered word, the correlation of the winning candidate against that of the runner-up, with the margin between them printed above each pair. For the first three bytes the correct candidate stands clearly above the runner-up, the margin being the quantity that distinguishes a trustworthy recovery from a coincidence. The fourth byte is instructive: its margin is essentially zero, the correct value and its nearest rival being indistinguishable at this trace count. The word is still recovered correctly because the addition that relates the leaked intermediate to the key couples the bytes, so that the three confident bytes constrain the fourth; but the figure is an honest picture of where the per-byte evidence is strong and where it is marginal, and it is the kind of detail that a bare report of the recovered key would conceal.</w:t>
+      </w:r>
+    </w:p>
+    <w:p>
+      <w:pPr>
+        <w:jc w:val="center"/>
+      </w:pPr>
+      <w:r>
+        <w:drawing>
+          <wp:inline xmlns:a="http://schemas.openxmlformats.org/drawingml/2006/main" xmlns:pic="http://schemas.openxmlformats.org/drawingml/2006/picture">
+            <wp:extent cx="5303520" cy="2495774"/>
+            <wp:docPr id="13" name="Picture 13"/>
+            <wp:cNvGraphicFramePr>
+              <a:graphicFrameLocks noChangeAspect="1"/>
+            </wp:cNvGraphicFramePr>
+            <a:graphic>
+              <a:graphicData uri="http://schemas.openxmlformats.org/drawingml/2006/picture">
+                <pic:pic>
+                  <pic:nvPicPr>
+                    <pic:cNvPr id="0" name="hw_perbyte_corr.png"/>
+                    <pic:cNvPicPr/>
+                  </pic:nvPicPr>
+                  <pic:blipFill>
+                    <a:blip r:embed="rId22"/>
+                    <a:stretch>
+                      <a:fillRect/>
+                    </a:stretch>
+                  </pic:blipFill>
+                  <pic:spPr>
+                    <a:xfrm>
+                      <a:off x="0" y="0"/>
+                      <a:ext cx="5303520" cy="2495774"/>
+                    </a:xfrm>
+                    <a:prstGeom prst="rect"/>
+                  </pic:spPr>
+                </pic:pic>
+              </a:graphicData>
+            </a:graphic>
+          </wp:inline>
+        </w:drawing>
+      </w:r>
+    </w:p>
+    <w:p>
+      <w:pPr>
+        <w:spacing w:after="240"/>
+        <w:jc w:val="center"/>
+      </w:pPr>
+      <w:r>
+        <w:rPr>
+          <w:rFonts w:ascii="Times New Roman" w:hAnsi="Times New Roman" w:eastAsia="Times New Roman"/>
+          <w:b w:val="0"/>
+          <w:i/>
+          <w:color w:val="000000"/>
+          <w:sz w:val="22"/>
+          <w:u w:val="none"/>
+        </w:rPr>
+        <w:t>Figure 5.8  Hardware CPA: correct candidate versus runner-up, per byte</w:t>
+      </w:r>
+    </w:p>
+    <w:p>
+      <w:pPr>
+        <w:spacing w:after="160"/>
+        <w:jc w:val="both"/>
+      </w:pPr>
+      <w:r>
+        <w:rPr>
+          <w:rFonts w:ascii="Times New Roman" w:hAnsi="Times New Roman" w:eastAsia="Times New Roman"/>
+          <w:b w:val="0"/>
+          <w:i w:val="0"/>
+          <w:color w:val="000000"/>
+          <w:sz w:val="24"/>
+          <w:u w:val="none"/>
+        </w:rPr>
+        <w:t>Figure 5.9 plots the convergence of the attack: whether the full key word is recovered correctly as a function of the number of traces used. The attack first discloses the key at about one hundred and fifty traces, and from roughly two hundred and sixty traces onward it is recovered at every trace count tested. The single point between these two, at which the recovery briefly fails again, is characteristic of a correlation that is near its detection boundary: with few traces the estimate is noisy and can cross back and forth over the decision threshold before it settles. The number of traces to disclosure is therefore best read not as the first lucky success but as the count beyond which success is stable, and on this device that count is a few hundred traces, each collected in a fraction of a second.</w:t>
+      </w:r>
+    </w:p>
+    <w:p>
+      <w:pPr>
+        <w:jc w:val="center"/>
+      </w:pPr>
+      <w:r>
+        <w:drawing>
+          <wp:inline xmlns:a="http://schemas.openxmlformats.org/drawingml/2006/main" xmlns:pic="http://schemas.openxmlformats.org/drawingml/2006/picture">
+            <wp:extent cx="5303520" cy="2272937"/>
+            <wp:docPr id="14" name="Picture 14"/>
+            <wp:cNvGraphicFramePr>
+              <a:graphicFrameLocks noChangeAspect="1"/>
+            </wp:cNvGraphicFramePr>
+            <a:graphic>
+              <a:graphicData uri="http://schemas.openxmlformats.org/drawingml/2006/picture">
+                <pic:pic>
+                  <pic:nvPicPr>
+                    <pic:cNvPr id="0" name="hw_ntd_curve.png"/>
+                    <pic:cNvPicPr/>
+                  </pic:nvPicPr>
+                  <pic:blipFill>
+                    <a:blip r:embed="rId23"/>
+                    <a:stretch>
+                      <a:fillRect/>
+                    </a:stretch>
+                  </pic:blipFill>
+                  <pic:spPr>
+                    <a:xfrm>
+                      <a:off x="0" y="0"/>
+                      <a:ext cx="5303520" cy="2272937"/>
+                    </a:xfrm>
+                    <a:prstGeom prst="rect"/>
+                  </pic:spPr>
+                </pic:pic>
+              </a:graphicData>
+            </a:graphic>
+          </wp:inline>
+        </w:drawing>
+      </w:r>
+    </w:p>
+    <w:p>
+      <w:pPr>
+        <w:spacing w:after="240"/>
+        <w:jc w:val="center"/>
+      </w:pPr>
+      <w:r>
+        <w:rPr>
+          <w:rFonts w:ascii="Times New Roman" w:hAnsi="Times New Roman" w:eastAsia="Times New Roman"/>
+          <w:b w:val="0"/>
+          <w:i/>
+          <w:color w:val="000000"/>
+          <w:sz w:val="22"/>
+          <w:u w:val="none"/>
+        </w:rPr>
+        <w:t>Figure 5.9  Hardware CPA convergence (traces to disclosure)</w:t>
+      </w:r>
+    </w:p>
+    <w:p>
+      <w:pPr>
+        <w:spacing w:after="160"/>
+        <w:jc w:val="both"/>
+      </w:pPr>
+      <w:r>
+        <w:rPr>
+          <w:rFonts w:ascii="Times New Roman" w:hAnsi="Times New Roman" w:eastAsia="Times New Roman"/>
+          <w:b w:val="0"/>
+          <w:i w:val="0"/>
+          <w:color w:val="000000"/>
+          <w:sz w:val="24"/>
+          <w:u w:val="none"/>
+        </w:rPr>
+        <w:t>Figure 5.10 contrasts the leakage assessment of the two targets on hardware. For ChaCha20 the statistic crosses from above the threshold with masking off to clearly below it with masking on: the countermeasure works on the device. For Kyber both bars stand above the threshold: the statistic barely moves when masking is enabled, and the secret coefficient is still recovered. This side-by-side view makes the central negative finding of the hardware campaign immediate - the same masking discipline that protects the classical cipher on silicon does not, as currently implemented in firmware, protect the post-quantum one - and motivates the specific firmware correction identified in the future work.</w:t>
+      </w:r>
+    </w:p>
+    <w:p>
+      <w:pPr>
+        <w:jc w:val="center"/>
+      </w:pPr>
+      <w:r>
+        <w:drawing>
+          <wp:inline xmlns:a="http://schemas.openxmlformats.org/drawingml/2006/main" xmlns:pic="http://schemas.openxmlformats.org/drawingml/2006/picture">
+            <wp:extent cx="5303520" cy="2571404"/>
+            <wp:docPr id="15" name="Picture 15"/>
+            <wp:cNvGraphicFramePr>
+              <a:graphicFrameLocks noChangeAspect="1"/>
+            </wp:cNvGraphicFramePr>
+            <a:graphic>
+              <a:graphicData uri="http://schemas.openxmlformats.org/drawingml/2006/picture">
+                <pic:pic>
+                  <pic:nvPicPr>
+                    <pic:cNvPr id="0" name="hw_masking_bar.png"/>
+                    <pic:cNvPicPr/>
+                  </pic:nvPicPr>
+                  <pic:blipFill>
+                    <a:blip r:embed="rId24"/>
+                    <a:stretch>
+                      <a:fillRect/>
+                    </a:stretch>
+                  </pic:blipFill>
+                  <pic:spPr>
+                    <a:xfrm>
+                      <a:off x="0" y="0"/>
+                      <a:ext cx="5303520" cy="2571404"/>
+                    </a:xfrm>
+                    <a:prstGeom prst="rect"/>
+                  </pic:spPr>
+                </pic:pic>
+              </a:graphicData>
+            </a:graphic>
+          </wp:inline>
+        </w:drawing>
+      </w:r>
+    </w:p>
+    <w:p>
+      <w:pPr>
+        <w:spacing w:after="240"/>
+        <w:jc w:val="center"/>
+      </w:pPr>
+      <w:r>
+        <w:rPr>
+          <w:rFonts w:ascii="Times New Roman" w:hAnsi="Times New Roman" w:eastAsia="Times New Roman"/>
+          <w:b w:val="0"/>
+          <w:i/>
+          <w:color w:val="000000"/>
+          <w:sz w:val="22"/>
+          <w:u w:val="none"/>
+        </w:rPr>
+        <w:t>Figure 5.10  Hardware leakage assessment: masking off versus on, both targets</w:t>
+      </w:r>
+    </w:p>
+    <w:p>
+      <w:pPr>
+        <w:spacing w:after="160"/>
+        <w:jc w:val="both"/>
+      </w:pPr>
+      <w:r>
+        <w:rPr>
+          <w:rFonts w:ascii="Times New Roman" w:hAnsi="Times New Roman" w:eastAsia="Times New Roman"/>
+          <w:b w:val="0"/>
+          <w:i w:val="0"/>
+          <w:color w:val="000000"/>
+          <w:sz w:val="24"/>
+          <w:u w:val="none"/>
+        </w:rPr>
+        <w:t>Figure 5.11 explains the failure of the timing attack on hardware in a single picture. It plots, for each byte position, the measured margin between the best and second-best candidate latency, against the scale of the secret-dependent computation the attack is trying to detect. Every margin is a fraction of a microsecond - two of them effectively zero, the third a spurious outlier - whereas the computation the attack depends on is some two hundred microseconds and the serial round-trip that carries the measurement is some eight thousand microseconds. The signal is three to four orders of magnitude below the transport that observes it, and no amount of averaging over the twenty-five trials per candidate recovers it. The attack does not fail because the timing leak is absent - the software model, which measures the computation directly, recovers the secret - but because the chosen measurement path cannot see it.</w:t>
+      </w:r>
+    </w:p>
+    <w:p>
+      <w:pPr>
+        <w:jc w:val="center"/>
+      </w:pPr>
+      <w:r>
+        <w:drawing>
+          <wp:inline xmlns:a="http://schemas.openxmlformats.org/drawingml/2006/main" xmlns:pic="http://schemas.openxmlformats.org/drawingml/2006/picture">
+            <wp:extent cx="5303520" cy="2339788"/>
+            <wp:docPr id="16" name="Picture 16"/>
+            <wp:cNvGraphicFramePr>
+              <a:graphicFrameLocks noChangeAspect="1"/>
+            </wp:cNvGraphicFramePr>
+            <a:graphic>
+              <a:graphicData uri="http://schemas.openxmlformats.org/drawingml/2006/picture">
+                <pic:pic>
+                  <pic:nvPicPr>
+                    <pic:cNvPr id="0" name="timing_margin.png"/>
+                    <pic:cNvPicPr/>
+                  </pic:nvPicPr>
+                  <pic:blipFill>
+                    <a:blip r:embed="rId25"/>
+                    <a:stretch>
+                      <a:fillRect/>
+                    </a:stretch>
+                  </pic:blipFill>
+                  <pic:spPr>
+                    <a:xfrm>
+                      <a:off x="0" y="0"/>
+                      <a:ext cx="5303520" cy="2339788"/>
+                    </a:xfrm>
+                    <a:prstGeom prst="rect"/>
+                  </pic:spPr>
+                </pic:pic>
+              </a:graphicData>
+            </a:graphic>
+          </wp:inline>
+        </w:drawing>
+      </w:r>
+    </w:p>
+    <w:p>
+      <w:pPr>
+        <w:spacing w:after="240"/>
+        <w:jc w:val="center"/>
+      </w:pPr>
+      <w:r>
+        <w:rPr>
+          <w:rFonts w:ascii="Times New Roman" w:hAnsi="Times New Roman" w:eastAsia="Times New Roman"/>
+          <w:b w:val="0"/>
+          <w:i/>
+          <w:color w:val="000000"/>
+          <w:sz w:val="22"/>
+          <w:u w:val="none"/>
+        </w:rPr>
+        <w:t>Figure 5.11  Hardware timing attack: candidate margins dwarfed by link latency</w:t>
+      </w:r>
+    </w:p>
+    <w:p>
+      <w:pPr>
+        <w:spacing w:after="160"/>
+        <w:jc w:val="both"/>
+      </w:pPr>
+      <w:r>
+        <w:rPr>
+          <w:rFonts w:ascii="Times New Roman" w:hAnsi="Times New Roman" w:eastAsia="Times New Roman"/>
+          <w:b w:val="0"/>
+          <w:i w:val="0"/>
+          <w:color w:val="000000"/>
+          <w:sz w:val="24"/>
+          <w:u w:val="none"/>
+        </w:rPr>
+        <w:t>Finally, Figure 5.12 and Table 5.7 place the simulation and the hardware side by side for the ChaCha20 power attack. The model recovers the key with a higher correlation and from fewer traces than the device; the hardware is noisier and demands more effort, exactly as physical measurement through a low-cost converter should. The agreement that matters is qualitative and directional - the same key, recovered by the same method, defeated by the same countermeasure - while the quantitative gap between the clean model and the noisy silicon is itself a result worth reporting, because it calibrates how much the idealised model flatters the attacker relative to a real low-budget adversary.</w:t>
+      </w:r>
+    </w:p>
+    <w:p>
+      <w:pPr>
+        <w:jc w:val="center"/>
+      </w:pPr>
+      <w:r>
+        <w:drawing>
+          <wp:inline xmlns:a="http://schemas.openxmlformats.org/drawingml/2006/main" xmlns:pic="http://schemas.openxmlformats.org/drawingml/2006/picture">
+            <wp:extent cx="5303520" cy="1988820"/>
+            <wp:docPr id="17" name="Picture 17"/>
+            <wp:cNvGraphicFramePr>
+              <a:graphicFrameLocks noChangeAspect="1"/>
+            </wp:cNvGraphicFramePr>
+            <a:graphic>
+              <a:graphicData uri="http://schemas.openxmlformats.org/drawingml/2006/picture">
+                <pic:pic>
+                  <pic:nvPicPr>
+                    <pic:cNvPr id="0" name="sim_vs_hw.png"/>
+                    <pic:cNvPicPr/>
+                  </pic:nvPicPr>
+                  <pic:blipFill>
+                    <a:blip r:embed="rId26"/>
+                    <a:stretch>
+                      <a:fillRect/>
+                    </a:stretch>
+                  </pic:blipFill>
+                  <pic:spPr>
+                    <a:xfrm>
+                      <a:off x="0" y="0"/>
+                      <a:ext cx="5303520" cy="1988820"/>
+                    </a:xfrm>
+                    <a:prstGeom prst="rect"/>
+                  </pic:spPr>
+                </pic:pic>
+              </a:graphicData>
+            </a:graphic>
+          </wp:inline>
+        </w:drawing>
+      </w:r>
+    </w:p>
+    <w:p>
+      <w:pPr>
+        <w:spacing w:after="240"/>
+        <w:jc w:val="center"/>
+      </w:pPr>
+      <w:r>
+        <w:rPr>
+          <w:rFonts w:ascii="Times New Roman" w:hAnsi="Times New Roman" w:eastAsia="Times New Roman"/>
+          <w:b w:val="0"/>
+          <w:i/>
+          <w:color w:val="000000"/>
+          <w:sz w:val="22"/>
+          <w:u w:val="none"/>
+        </w:rPr>
+        <w:t>Figure 5.12  Simulation versus hardware for the ChaCha20 power attack</w:t>
+      </w:r>
+    </w:p>
+    <w:tbl>
+      <w:tblPr>
+        <w:tblStyle w:val="TableGrid"/>
+        <w:tblW w:type="auto" w:w="0"/>
+        <w:tblLook w:firstColumn="1" w:firstRow="1" w:lastColumn="0" w:lastRow="0" w:noHBand="0" w:noVBand="1" w:val="04A0"/>
+      </w:tblPr>
+      <w:tblGrid>
+        <w:gridCol w:w="2880"/>
+        <w:gridCol w:w="2880"/>
+        <w:gridCol w:w="2880"/>
+      </w:tblGrid>
+      <w:tr>
+        <w:tc>
+          <w:tcPr>
+            <w:tcW w:type="dxa" w:w="2880"/>
+          </w:tcPr>
+          <w:p>
+            <w:r/>
+            <w:r>
+              <w:rPr>
+                <w:rFonts w:ascii="Times New Roman" w:hAnsi="Times New Roman" w:eastAsia="Times New Roman"/>
+                <w:b/>
+                <w:i w:val="0"/>
+                <w:color w:val="000000"/>
+                <w:sz w:val="22"/>
+                <w:u w:val="none"/>
+              </w:rPr>
+              <w:t>Metric</w:t>
+            </w:r>
+          </w:p>
+        </w:tc>
+        <w:tc>
+          <w:tcPr>
+            <w:tcW w:type="dxa" w:w="2880"/>
+          </w:tcPr>
+          <w:p>
+            <w:r/>
+            <w:r>
+              <w:rPr>
+                <w:rFonts w:ascii="Times New Roman" w:hAnsi="Times New Roman" w:eastAsia="Times New Roman"/>
+                <w:b/>
+                <w:i w:val="0"/>
+                <w:color w:val="000000"/>
+                <w:sz w:val="22"/>
+                <w:u w:val="none"/>
+              </w:rPr>
+              <w:t>Simulation</w:t>
+            </w:r>
+          </w:p>
+        </w:tc>
+        <w:tc>
+          <w:tcPr>
+            <w:tcW w:type="dxa" w:w="2880"/>
+          </w:tcPr>
+          <w:p>
+            <w:r/>
+            <w:r>
+              <w:rPr>
+                <w:rFonts w:ascii="Times New Roman" w:hAnsi="Times New Roman" w:eastAsia="Times New Roman"/>
+                <w:b/>
+                <w:i w:val="0"/>
+                <w:color w:val="000000"/>
+                <w:sz w:val="22"/>
+                <w:u w:val="none"/>
+              </w:rPr>
+              <w:t>Hardware</w:t>
+            </w:r>
+          </w:p>
+        </w:tc>
+      </w:tr>
+      <w:tr>
+        <w:tc>
+          <w:tcPr>
+            <w:tcW w:type="dxa" w:w="2880"/>
+          </w:tcPr>
+          <w:p>
+            <w:r/>
+            <w:r>
+              <w:rPr>
+                <w:rFonts w:ascii="Times New Roman" w:hAnsi="Times New Roman" w:eastAsia="Times New Roman"/>
+                <w:b w:val="0"/>
+                <w:i w:val="0"/>
+                <w:color w:val="000000"/>
+                <w:sz w:val="22"/>
+                <w:u w:val="none"/>
+              </w:rPr>
+              <w:t>Key word recovered</w:t>
+            </w:r>
+          </w:p>
+        </w:tc>
+        <w:tc>
+          <w:tcPr>
+            <w:tcW w:type="dxa" w:w="2880"/>
+          </w:tcPr>
+          <w:p>
+            <w:r/>
+            <w:r>
+              <w:rPr>
+                <w:rFonts w:ascii="Times New Roman" w:hAnsi="Times New Roman" w:eastAsia="Times New Roman"/>
+                <w:b w:val="0"/>
+                <w:i w:val="0"/>
+                <w:color w:val="000000"/>
+                <w:sz w:val="22"/>
+                <w:u w:val="none"/>
+              </w:rPr>
+              <w:t>0xDEADBEEF</w:t>
+            </w:r>
+          </w:p>
+        </w:tc>
+        <w:tc>
+          <w:tcPr>
+            <w:tcW w:type="dxa" w:w="2880"/>
+          </w:tcPr>
+          <w:p>
+            <w:r/>
+            <w:r>
+              <w:rPr>
+                <w:rFonts w:ascii="Times New Roman" w:hAnsi="Times New Roman" w:eastAsia="Times New Roman"/>
+                <w:b w:val="0"/>
+                <w:i w:val="0"/>
+                <w:color w:val="000000"/>
+                <w:sz w:val="22"/>
+                <w:u w:val="none"/>
+              </w:rPr>
+              <w:t>0xDEADBEEF</w:t>
+            </w:r>
+          </w:p>
+        </w:tc>
+      </w:tr>
+      <w:tr>
+        <w:tc>
+          <w:tcPr>
+            <w:tcW w:type="dxa" w:w="2880"/>
+          </w:tcPr>
+          <w:p>
+            <w:r/>
+            <w:r>
+              <w:rPr>
+                <w:rFonts w:ascii="Times New Roman" w:hAnsi="Times New Roman" w:eastAsia="Times New Roman"/>
+                <w:b w:val="0"/>
+                <w:i w:val="0"/>
+                <w:color w:val="000000"/>
+                <w:sz w:val="22"/>
+                <w:u w:val="none"/>
+              </w:rPr>
+              <w:t>Mean peak correlation</w:t>
+            </w:r>
+          </w:p>
+        </w:tc>
+        <w:tc>
+          <w:tcPr>
+            <w:tcW w:type="dxa" w:w="2880"/>
+          </w:tcPr>
+          <w:p>
+            <w:r/>
+            <w:r>
+              <w:rPr>
+                <w:rFonts w:ascii="Times New Roman" w:hAnsi="Times New Roman" w:eastAsia="Times New Roman"/>
+                <w:b w:val="0"/>
+                <w:i w:val="0"/>
+                <w:color w:val="000000"/>
+                <w:sz w:val="22"/>
+                <w:u w:val="none"/>
+              </w:rPr>
+              <w:t>~0.49</w:t>
+            </w:r>
+          </w:p>
+        </w:tc>
+        <w:tc>
+          <w:tcPr>
+            <w:tcW w:type="dxa" w:w="2880"/>
+          </w:tcPr>
+          <w:p>
+            <w:r/>
+            <w:r>
+              <w:rPr>
+                <w:rFonts w:ascii="Times New Roman" w:hAnsi="Times New Roman" w:eastAsia="Times New Roman"/>
+                <w:b w:val="0"/>
+                <w:i w:val="0"/>
+                <w:color w:val="000000"/>
+                <w:sz w:val="22"/>
+                <w:u w:val="none"/>
+              </w:rPr>
+              <w:t>~0.32</w:t>
+            </w:r>
+          </w:p>
+        </w:tc>
+      </w:tr>
+      <w:tr>
+        <w:tc>
+          <w:tcPr>
+            <w:tcW w:type="dxa" w:w="2880"/>
+          </w:tcPr>
+          <w:p>
+            <w:r/>
+            <w:r>
+              <w:rPr>
+                <w:rFonts w:ascii="Times New Roman" w:hAnsi="Times New Roman" w:eastAsia="Times New Roman"/>
+                <w:b w:val="0"/>
+                <w:i w:val="0"/>
+                <w:color w:val="000000"/>
+                <w:sz w:val="22"/>
+                <w:u w:val="none"/>
+              </w:rPr>
+              <w:t>Traces to disclosure (typical)</w:t>
+            </w:r>
+          </w:p>
+        </w:tc>
+        <w:tc>
+          <w:tcPr>
+            <w:tcW w:type="dxa" w:w="2880"/>
+          </w:tcPr>
+          <w:p>
+            <w:r/>
+            <w:r>
+              <w:rPr>
+                <w:rFonts w:ascii="Times New Roman" w:hAnsi="Times New Roman" w:eastAsia="Times New Roman"/>
+                <w:b w:val="0"/>
+                <w:i w:val="0"/>
+                <w:color w:val="000000"/>
+                <w:sz w:val="22"/>
+                <w:u w:val="none"/>
+              </w:rPr>
+              <w:t>~100</w:t>
+            </w:r>
+          </w:p>
+        </w:tc>
+        <w:tc>
+          <w:tcPr>
+            <w:tcW w:type="dxa" w:w="2880"/>
+          </w:tcPr>
+          <w:p>
+            <w:r/>
+            <w:r>
+              <w:rPr>
+                <w:rFonts w:ascii="Times New Roman" w:hAnsi="Times New Roman" w:eastAsia="Times New Roman"/>
+                <w:b w:val="0"/>
+                <w:i w:val="0"/>
+                <w:color w:val="000000"/>
+                <w:sz w:val="22"/>
+                <w:u w:val="none"/>
+              </w:rPr>
+              <w:t>~150-400</w:t>
+            </w:r>
+          </w:p>
+        </w:tc>
+      </w:tr>
+      <w:tr>
+        <w:tc>
+          <w:tcPr>
+            <w:tcW w:type="dxa" w:w="2880"/>
+          </w:tcPr>
+          <w:p>
+            <w:r/>
+            <w:r>
+              <w:rPr>
+                <w:rFonts w:ascii="Times New Roman" w:hAnsi="Times New Roman" w:eastAsia="Times New Roman"/>
+                <w:b w:val="0"/>
+                <w:i w:val="0"/>
+                <w:color w:val="000000"/>
+                <w:sz w:val="22"/>
+                <w:u w:val="none"/>
+              </w:rPr>
+              <w:t>Masking verdict (ChaCha20)</w:t>
+            </w:r>
+          </w:p>
+        </w:tc>
+        <w:tc>
+          <w:tcPr>
+            <w:tcW w:type="dxa" w:w="2880"/>
+          </w:tcPr>
+          <w:p>
+            <w:r/>
+            <w:r>
+              <w:rPr>
+                <w:rFonts w:ascii="Times New Roman" w:hAnsi="Times New Roman" w:eastAsia="Times New Roman"/>
+                <w:b w:val="0"/>
+                <w:i w:val="0"/>
+                <w:color w:val="000000"/>
+                <w:sz w:val="22"/>
+                <w:u w:val="none"/>
+              </w:rPr>
+              <w:t>leaks -&gt; pass</w:t>
+            </w:r>
+          </w:p>
+        </w:tc>
+        <w:tc>
+          <w:tcPr>
+            <w:tcW w:type="dxa" w:w="2880"/>
+          </w:tcPr>
+          <w:p>
+            <w:r/>
+            <w:r>
+              <w:rPr>
+                <w:rFonts w:ascii="Times New Roman" w:hAnsi="Times New Roman" w:eastAsia="Times New Roman"/>
+                <w:b w:val="0"/>
+                <w:i w:val="0"/>
+                <w:color w:val="000000"/>
+                <w:sz w:val="22"/>
+                <w:u w:val="none"/>
+              </w:rPr>
+              <w:t>leaks -&gt; pass</w:t>
+            </w:r>
+          </w:p>
+        </w:tc>
+      </w:tr>
+      <w:tr>
+        <w:tc>
+          <w:tcPr>
+            <w:tcW w:type="dxa" w:w="2880"/>
+          </w:tcPr>
+          <w:p>
+            <w:r/>
+            <w:r>
+              <w:rPr>
+                <w:rFonts w:ascii="Times New Roman" w:hAnsi="Times New Roman" w:eastAsia="Times New Roman"/>
+                <w:b w:val="0"/>
+                <w:i w:val="0"/>
+                <w:color w:val="000000"/>
+                <w:sz w:val="22"/>
+                <w:u w:val="none"/>
+              </w:rPr>
+              <w:t>Kyber coefficient recovered</w:t>
+            </w:r>
+          </w:p>
+        </w:tc>
+        <w:tc>
+          <w:tcPr>
+            <w:tcW w:type="dxa" w:w="2880"/>
+          </w:tcPr>
+          <w:p>
+            <w:r/>
+            <w:r>
+              <w:rPr>
+                <w:rFonts w:ascii="Times New Roman" w:hAnsi="Times New Roman" w:eastAsia="Times New Roman"/>
+                <w:b w:val="0"/>
+                <w:i w:val="0"/>
+                <w:color w:val="000000"/>
+                <w:sz w:val="22"/>
+                <w:u w:val="none"/>
+              </w:rPr>
+              <w:t>1234</w:t>
+            </w:r>
+          </w:p>
+        </w:tc>
+        <w:tc>
+          <w:tcPr>
+            <w:tcW w:type="dxa" w:w="2880"/>
+          </w:tcPr>
+          <w:p>
+            <w:r/>
+            <w:r>
+              <w:rPr>
+                <w:rFonts w:ascii="Times New Roman" w:hAnsi="Times New Roman" w:eastAsia="Times New Roman"/>
+                <w:b w:val="0"/>
+                <w:i w:val="0"/>
+                <w:color w:val="000000"/>
+                <w:sz w:val="22"/>
+                <w:u w:val="none"/>
+              </w:rPr>
+              <w:t>1234</w:t>
+            </w:r>
+          </w:p>
+        </w:tc>
+      </w:tr>
+      <w:tr>
+        <w:tc>
+          <w:tcPr>
+            <w:tcW w:type="dxa" w:w="2880"/>
+          </w:tcPr>
+          <w:p>
+            <w:r/>
+            <w:r>
+              <w:rPr>
+                <w:rFonts w:ascii="Times New Roman" w:hAnsi="Times New Roman" w:eastAsia="Times New Roman"/>
+                <w:b w:val="0"/>
+                <w:i w:val="0"/>
+                <w:color w:val="000000"/>
+                <w:sz w:val="22"/>
+                <w:u w:val="none"/>
+              </w:rPr>
+              <w:t>Kyber masking</w:t>
+            </w:r>
+          </w:p>
+        </w:tc>
+        <w:tc>
+          <w:tcPr>
+            <w:tcW w:type="dxa" w:w="2880"/>
+          </w:tcPr>
+          <w:p>
+            <w:r/>
+            <w:r>
+              <w:rPr>
+                <w:rFonts w:ascii="Times New Roman" w:hAnsi="Times New Roman" w:eastAsia="Times New Roman"/>
+                <w:b w:val="0"/>
+                <w:i w:val="0"/>
+                <w:color w:val="000000"/>
+                <w:sz w:val="22"/>
+                <w:u w:val="none"/>
+              </w:rPr>
+              <w:t>suppresses leakage</w:t>
+            </w:r>
+          </w:p>
+        </w:tc>
+        <w:tc>
+          <w:tcPr>
+            <w:tcW w:type="dxa" w:w="2880"/>
+          </w:tcPr>
+          <w:p>
+            <w:r/>
+            <w:r>
+              <w:rPr>
+                <w:rFonts w:ascii="Times New Roman" w:hAnsi="Times New Roman" w:eastAsia="Times New Roman"/>
+                <w:b w:val="0"/>
+                <w:i w:val="0"/>
+                <w:color w:val="000000"/>
+                <w:sz w:val="22"/>
+                <w:u w:val="none"/>
+              </w:rPr>
+              <w:t>ineffective (finding)</w:t>
+            </w:r>
+          </w:p>
+        </w:tc>
+      </w:tr>
+      <w:tr>
+        <w:tc>
+          <w:tcPr>
+            <w:tcW w:type="dxa" w:w="2880"/>
+          </w:tcPr>
+          <w:p>
+            <w:r/>
+            <w:r>
+              <w:rPr>
+                <w:rFonts w:ascii="Times New Roman" w:hAnsi="Times New Roman" w:eastAsia="Times New Roman"/>
+                <w:b w:val="0"/>
+                <w:i w:val="0"/>
+                <w:color w:val="000000"/>
+                <w:sz w:val="22"/>
+                <w:u w:val="none"/>
+              </w:rPr>
+              <w:t>Timing attack</w:t>
+            </w:r>
+          </w:p>
+        </w:tc>
+        <w:tc>
+          <w:tcPr>
+            <w:tcW w:type="dxa" w:w="2880"/>
+          </w:tcPr>
+          <w:p>
+            <w:r/>
+            <w:r>
+              <w:rPr>
+                <w:rFonts w:ascii="Times New Roman" w:hAnsi="Times New Roman" w:eastAsia="Times New Roman"/>
+                <w:b w:val="0"/>
+                <w:i w:val="0"/>
+                <w:color w:val="000000"/>
+                <w:sz w:val="22"/>
+                <w:u w:val="none"/>
+              </w:rPr>
+              <w:t>3 of 4 bytes</w:t>
+            </w:r>
+          </w:p>
+        </w:tc>
+        <w:tc>
+          <w:tcPr>
+            <w:tcW w:type="dxa" w:w="2880"/>
+          </w:tcPr>
+          <w:p>
+            <w:r/>
+            <w:r>
+              <w:rPr>
+                <w:rFonts w:ascii="Times New Roman" w:hAnsi="Times New Roman" w:eastAsia="Times New Roman"/>
+                <w:b w:val="0"/>
+                <w:i w:val="0"/>
+                <w:color w:val="000000"/>
+                <w:sz w:val="22"/>
+                <w:u w:val="none"/>
+              </w:rPr>
+              <w:t>not resolved over serial link</w:t>
+            </w:r>
+          </w:p>
+        </w:tc>
+      </w:tr>
+      <w:tr>
+        <w:tc>
+          <w:tcPr>
+            <w:tcW w:type="dxa" w:w="2880"/>
+          </w:tcPr>
+          <w:p>
+            <w:r/>
+            <w:r>
+              <w:rPr>
+                <w:rFonts w:ascii="Times New Roman" w:hAnsi="Times New Roman" w:eastAsia="Times New Roman"/>
+                <w:b w:val="0"/>
+                <w:i w:val="0"/>
+                <w:color w:val="000000"/>
+                <w:sz w:val="22"/>
+                <w:u w:val="none"/>
+              </w:rPr>
+              <w:t>Replay without nonce / with nonce</w:t>
+            </w:r>
+          </w:p>
+        </w:tc>
+        <w:tc>
+          <w:tcPr>
+            <w:tcW w:type="dxa" w:w="2880"/>
+          </w:tcPr>
+          <w:p>
+            <w:r/>
+            <w:r>
+              <w:rPr>
+                <w:rFonts w:ascii="Times New Roman" w:hAnsi="Times New Roman" w:eastAsia="Times New Roman"/>
+                <w:b w:val="0"/>
+                <w:i w:val="0"/>
+                <w:color w:val="000000"/>
+                <w:sz w:val="22"/>
+                <w:u w:val="none"/>
+              </w:rPr>
+              <w:t>accepted / blocked</w:t>
+            </w:r>
+          </w:p>
+        </w:tc>
+        <w:tc>
+          <w:tcPr>
+            <w:tcW w:type="dxa" w:w="2880"/>
+          </w:tcPr>
+          <w:p>
+            <w:r/>
+            <w:r>
+              <w:rPr>
+                <w:rFonts w:ascii="Times New Roman" w:hAnsi="Times New Roman" w:eastAsia="Times New Roman"/>
+                <w:b w:val="0"/>
+                <w:i w:val="0"/>
+                <w:color w:val="000000"/>
+                <w:sz w:val="22"/>
+                <w:u w:val="none"/>
+              </w:rPr>
+              <w:t>accepted / blocked</w:t>
+            </w:r>
+          </w:p>
+        </w:tc>
+      </w:tr>
+    </w:tbl>
+    <w:p>
+      <w:pPr>
+        <w:spacing w:after="120"/>
+      </w:pPr>
+    </w:p>
+    <w:p>
+      <w:pPr>
+        <w:spacing w:after="240"/>
+        <w:jc w:val="center"/>
+      </w:pPr>
+      <w:r>
+        <w:rPr>
+          <w:rFonts w:ascii="Times New Roman" w:hAnsi="Times New Roman" w:eastAsia="Times New Roman"/>
+          <w:b w:val="0"/>
+          <w:i/>
+          <w:color w:val="000000"/>
+          <w:sz w:val="22"/>
+          <w:u w:val="none"/>
+        </w:rPr>
+        <w:t>Table 5.7  Simulation versus hardware, consolidated</w:t>
       </w:r>
     </w:p>
     <w:p>
@@ -8807,7 +10019,89 @@
           <w:color w:val="000000"/>
           <w:sz w:val="28"/>
         </w:rPr>
-        <w:t>5.7  SUMMARY OF RESULTS</w:t>
+        <w:t>5.7  DISCUSSION</w:t>
+      </w:r>
+    </w:p>
+    <w:p>
+      <w:pPr>
+        <w:spacing w:after="160"/>
+        <w:jc w:val="both"/>
+      </w:pPr>
+      <w:r>
+        <w:rPr>
+          <w:rFonts w:ascii="Times New Roman" w:hAnsi="Times New Roman" w:eastAsia="Times New Roman"/>
+          <w:b w:val="0"/>
+          <w:i w:val="0"/>
+          <w:color w:val="000000"/>
+          <w:sz w:val="24"/>
+          <w:u w:val="none"/>
+        </w:rPr>
+        <w:t>Taken together, the results establish an end-to-end account of physical key recovery and its mitigation on an embedded cyber-physical device. The attacks succeed, and succeed measurably, against unprotected configurations; the countermeasures are effective, and their effectiveness is quantified by leakage assessment rather than asserted; and the active monitor closes a residual gap that the passive countermeasures do not address. The principal limitation of the hardware results is the use of amplified rather than single-shot leakage, a direct consequence of the low bandwidth of the measurement instrument; the methodology is unaffected by this choice, but a single-shot demonstration would strengthen the external validity of the hardware results and is the foremost item of future work. A second limitation is that full key recovery across all eight words, which requires chosen-nonce collection across all four columns of the first round, was carried out in the software model rather than on hardware; the single-word recovery was performed on the device and the extension across columns is a repetition of the same method rather than a new technique. A third is specific to the timing attack: over the serial command interface used in this work the secret-dependent delay is below the latency resolution of the link, so the timing result is a software-model result, and a hardware demonstration awaits a direct, device-side latency measurement. The power attacks on both ChaCha20 and Kyber, and all three defenses for the power and replay channels, were exercised on the physical device.</w:t>
+      </w:r>
+    </w:p>
+    <w:p>
+      <w:pPr>
+        <w:spacing w:after="160"/>
+        <w:jc w:val="both"/>
+      </w:pPr>
+      <w:r>
+        <w:rPr>
+          <w:rFonts w:ascii="Times New Roman" w:hAnsi="Times New Roman" w:eastAsia="Times New Roman"/>
+          <w:b w:val="0"/>
+          <w:i w:val="0"/>
+          <w:color w:val="000000"/>
+          <w:sz w:val="24"/>
+          <w:u w:val="none"/>
+        </w:rPr>
+        <w:t>It is worth drawing out two insights that were not obvious at the outset. The first is that the sign of the correlation, usually a matter of indifference in textbook accounts of correlation power analysis, is essential for an exclusive-or target, where it alone distinguishes a key byte from its bitwise complement; overlooking this produced an attack that failed intermittently in a way that at first appeared to be noise. The second is that an anomaly detector trained on a single window size does not generalise to others, so that a detector validated on one traffic profile behaved erratically on another until it was retrained across a range of window sizes. Both insights emerged from the discipline of measuring behaviour quantitatively rather than accepting an apparently working result.</w:t>
+      </w:r>
+    </w:p>
+    <w:p>
+      <w:pPr>
+        <w:spacing w:after="160"/>
+        <w:jc w:val="both"/>
+      </w:pPr>
+      <w:r>
+        <w:rPr>
+          <w:rFonts w:ascii="Times New Roman" w:hAnsi="Times New Roman" w:eastAsia="Times New Roman"/>
+          <w:b w:val="0"/>
+          <w:i w:val="0"/>
+          <w:color w:val="000000"/>
+          <w:sz w:val="24"/>
+          <w:u w:val="none"/>
+        </w:rPr>
+        <w:t>A third insight concerns the relationship between the software model and the hardware, which this work is unusually placed to comment on because it carried the identical attack code against both. The model is systematically kinder to the attacker than the device: for the ChaCha20 power attack it reports a correlation around one half where the hardware yields about one third, and it discloses the key in roughly a hundred traces where the hardware needs several hundred. Neither gap indicates an error; both are the expected consequence of real measurement noise, quantisation, and the amplified rather than single-shot leakage path. The practical consequence is that a result demonstrated only in simulation should be read as an optimistic bound on the real attacker, and the honest way to report a simulation-only finding - as this report does for the full-key recovery and the software-model timing attack - is to say plainly that the hardware figure will be weaker. The converse is the reassurance that where the hardware confirms the model, as it does for the ChaCha20 recovery and its masking countermeasure, the model can be trusted for the extensions that were not run on silicon.</w:t>
+      </w:r>
+    </w:p>
+    <w:p>
+      <w:pPr>
+        <w:spacing w:after="160"/>
+        <w:jc w:val="both"/>
+      </w:pPr>
+      <w:r>
+        <w:rPr>
+          <w:rFonts w:ascii="Times New Roman" w:hAnsi="Times New Roman" w:eastAsia="Times New Roman"/>
+          <w:b w:val="0"/>
+          <w:i w:val="0"/>
+          <w:color w:val="000000"/>
+          <w:sz w:val="24"/>
+          <w:u w:val="none"/>
+        </w:rPr>
+        <w:t>The two negative results deserve emphasis rather than apology, because a framework that reported only successes would be the less trustworthy for it. The failure of the Kyber masking on hardware, while it succeeds in the model, is a concrete finding about an implementation gap between a countermeasure's principle and its realisation, of exactly the kind that side-channel engineering exists to catch; it would have been invisible to a study that evaluated the defense only in simulation. The failure of the timing attack over the serial link is a finding about the measurement path, not the vulnerability, and it draws a precise line between what a low-cost serial-tethered setup can and cannot observe. Together they illustrate the value of carrying every claim to the hardware wherever the apparatus allows, and of saying clearly where it does not.</w:t>
+      </w:r>
+    </w:p>
+    <w:p>
+      <w:pPr>
+        <w:pStyle w:val="Heading2"/>
+      </w:pPr>
+      <w:r>
+        <w:rPr>
+          <w:rFonts w:ascii="Times New Roman" w:hAnsi="Times New Roman"/>
+          <w:b/>
+          <w:color w:val="000000"/>
+          <w:sz w:val="28"/>
+        </w:rPr>
+        <w:t>5.8  SUMMARY OF RESULTS</w:t>
       </w:r>
     </w:p>
     <w:p>
@@ -9573,22 +10867,8 @@
     </w:p>
     <w:p>
       <w:pPr>
-        <w:pStyle w:val="Heading2"/>
-      </w:pPr>
-      <w:r>
-        <w:rPr>
-          <w:rFonts w:ascii="Times New Roman" w:hAnsi="Times New Roman"/>
-          <w:b/>
-          <w:color w:val="000000"/>
-          <w:sz w:val="28"/>
-        </w:rPr>
-        <w:t>6.2  FUTURE WORK</w:t>
-      </w:r>
-    </w:p>
-    <w:p>
-      <w:pPr>
-        <w:pStyle w:val="ListBullet"/>
-        <w:spacing w:after="60"/>
+        <w:spacing w:after="160"/>
+        <w:jc w:val="both"/>
       </w:pPr>
       <w:r>
         <w:rPr>
@@ -9599,7 +10879,21 @@
           <w:sz w:val="24"/>
           <w:u w:val="none"/>
         </w:rPr>
-        <w:t>Acquisition with a high-bandwidth oscilloscope to perform single-shot rather than amplified power analysis, strengthening the external validity of the hardware results.</w:t>
+        <w:t>Beyond the individual results, the work makes a case for accessibility that is relevant to a cyber-physical-systems curriculum. The entire testbed was assembled from a single-board computer, two inexpensive microcontroller boards, a sixteen-bit converter, and a ten-ohm resistor, at a total hardware cost of under two thousand rupees, yet it reproduces the full arc of a side-channel study: a real key recovered from measured power, a countermeasure shown to close the channel by a recognised leakage-assessment standard, a post-quantum primitive shown to be just as exposed as a classical one, and two honest negative results that mark the boundaries of the apparatus. That this is achievable without an oscilloscope matters, because it places a hands-on understanding of physical cryptographic attack and defense within reach of a student laboratory rather than only a specialised facility. The software architecture reinforces the point: because the attacker and defender programs run unchanged against either the software model or the device, the same material supports a purely simulated exercise, with no hardware at all, and a full hardware campaign, with the model serving as the reference against which the measured results are judged. The combination of a low-cost rig, a faithful model, and a disciplined separation of attacker from defender is, taken as a whole, the contribution the project is most confident will outlast any single measurement in it.</w:t>
+      </w:r>
+    </w:p>
+    <w:p>
+      <w:pPr>
+        <w:pStyle w:val="Heading2"/>
+      </w:pPr>
+      <w:r>
+        <w:rPr>
+          <w:rFonts w:ascii="Times New Roman" w:hAnsi="Times New Roman"/>
+          <w:b/>
+          <w:color w:val="000000"/>
+          <w:sz w:val="28"/>
+        </w:rPr>
+        <w:t>6.2  FUTURE WORK</w:t>
       </w:r>
     </w:p>
     <w:p>
@@ -9616,7 +10910,7 @@
           <w:sz w:val="24"/>
           <w:u w:val="none"/>
         </w:rPr>
-        <w:t>Direct device-side measurement of the authentication response latency, with a logic analyser or an input/output-pin timer rather than the serial command link, to realise the timing attack on hardware without the link latency that masks the signal in the present apparatus.</w:t>
+        <w:t>Acquisition with a high-bandwidth oscilloscope to perform single-shot rather than amplified power analysis, strengthening the external validity of the hardware results.</w:t>
       </w:r>
     </w:p>
     <w:p>
@@ -9633,7 +10927,7 @@
           <w:sz w:val="24"/>
           <w:u w:val="none"/>
         </w:rPr>
-        <w:t>Full physical recovery of all key words on hardware, using chosen-nonce collection across every column of the first round.</w:t>
+        <w:t>Direct device-side measurement of the authentication response latency, with a logic analyser or an input/output-pin timer rather than the serial command link, to realise the timing attack on hardware without the link latency that masks the signal in the present apparatus.</w:t>
       </w:r>
     </w:p>
     <w:p>
@@ -9650,7 +10944,7 @@
           <w:sz w:val="24"/>
           <w:u w:val="none"/>
         </w:rPr>
-        <w:t>Correction of the Kyber masking in firmware, which was found ineffective on hardware against the amplified-leakage attack: re-randomising the mask within the measured window or adopting an arithmetic share for the modular product, verified by a second-order leakage assessment.</w:t>
+        <w:t>Full physical recovery of all key words on hardware, using chosen-nonce collection across every column of the first round.</w:t>
       </w:r>
     </w:p>
     <w:p>
@@ -9667,7 +10961,7 @@
           <w:sz w:val="24"/>
           <w:u w:val="none"/>
         </w:rPr>
-        <w:t>A complete on-device implementation of the CRYSTALS-Kyber key-encapsulation mechanism and a second-order attack against its masked implementation.</w:t>
+        <w:t>Correction of the Kyber masking in firmware, which was found ineffective on hardware against the amplified-leakage attack: re-randomising the mask within the measured window or adopting an arithmetic share for the modular product, verified by a second-order leakage assessment.</w:t>
       </w:r>
     </w:p>
     <w:p>
@@ -9684,7 +10978,7 @@
           <w:sz w:val="24"/>
           <w:u w:val="none"/>
         </w:rPr>
-        <w:t>Evaluation of the electromagnetic side channel as a non-contact alternative to the power channel, and of fault injection as an active attack.</w:t>
+        <w:t>A complete on-device implementation of the CRYSTALS-Kyber key-encapsulation mechanism and a second-order attack against its masked implementation.</w:t>
       </w:r>
     </w:p>
     <w:p>
@@ -9701,7 +10995,7 @@
           <w:sz w:val="24"/>
           <w:u w:val="none"/>
         </w:rPr>
-        <w:t>Profiled template attacks that exploit a cloned device to recover the key from very few traces of the target.</w:t>
+        <w:t>Evaluation of the electromagnetic side channel as a non-contact alternative to the power channel, and of fault injection as an active attack.</w:t>
       </w:r>
     </w:p>
     <w:p>
@@ -9718,37 +11012,13 @@
           <w:sz w:val="24"/>
           <w:u w:val="none"/>
         </w:rPr>
-        <w:t>Extension of the framework to a production-representative industrial controller and its real communication protocols.</w:t>
-      </w:r>
-    </w:p>
-    <w:p>
-      <w:r>
-        <w:br w:type="page"/>
-      </w:r>
-    </w:p>
-    <w:p>
-      <w:pPr>
-        <w:pStyle w:val="Heading1"/>
-        <w:jc w:val="center"/>
-      </w:pPr>
-      <w:r>
-        <w:rPr>
-          <w:rFonts w:ascii="Times New Roman" w:hAnsi="Times New Roman"/>
-          <w:b/>
-          <w:color w:val="000000"/>
-          <w:sz w:val="32"/>
-        </w:rPr>
-        <w:t>REFERENCES</w:t>
-      </w:r>
-    </w:p>
-    <w:p>
-      <w:pPr>
-        <w:spacing w:after="160"/>
-      </w:pPr>
-    </w:p>
-    <w:p>
-      <w:pPr>
-        <w:spacing w:after="160"/>
+        <w:t>Profiled template attacks that exploit a cloned device to recover the key from very few traces of the target.</w:t>
+      </w:r>
+    </w:p>
+    <w:p>
+      <w:pPr>
+        <w:pStyle w:val="ListBullet"/>
+        <w:spacing w:after="60"/>
       </w:pPr>
       <w:r>
         <w:rPr>
@@ -9759,8 +11029,33 @@
           <w:sz w:val="24"/>
           <w:u w:val="none"/>
         </w:rPr>
-        <w:t>[1]  Bernstein, D. J. (2008). ChaCha, a variant of Salsa20. Workshop Record of the State of the Art in Stream Ciphers (SASC 2008).</w:t>
-      </w:r>
+        <w:t>Extension of the framework to a production-representative industrial controller and its real communication protocols.</w:t>
+      </w:r>
+    </w:p>
+    <w:p>
+      <w:r>
+        <w:br w:type="page"/>
+      </w:r>
+    </w:p>
+    <w:p>
+      <w:pPr>
+        <w:pStyle w:val="Heading1"/>
+        <w:jc w:val="center"/>
+      </w:pPr>
+      <w:r>
+        <w:rPr>
+          <w:rFonts w:ascii="Times New Roman" w:hAnsi="Times New Roman"/>
+          <w:b/>
+          <w:color w:val="000000"/>
+          <w:sz w:val="32"/>
+        </w:rPr>
+        <w:t>REFERENCES</w:t>
+      </w:r>
+    </w:p>
+    <w:p>
+      <w:pPr>
+        <w:spacing w:after="160"/>
+      </w:pPr>
     </w:p>
     <w:p>
       <w:pPr>
@@ -9775,7 +11070,7 @@
           <w:sz w:val="24"/>
           <w:u w:val="none"/>
         </w:rPr>
-        <w:t>[2]  Bos, J., Ducas, L., Kiltz, E., Lepoint, T., Lyubashevsky, V., Schanck, J. M., Schwabe, P., Seiler, G., &amp; Stehlé, D. (2018). CRYSTALS-Kyber: A CCA-secure module-lattice-based KEM. IEEE European Symposium on Security and Privacy (EuroS&amp;P), 353–367.</w:t>
+        <w:t>[1]  Bernstein, D. J. (2008). ChaCha, a variant of Salsa20. Workshop Record of the State of the Art in Stream Ciphers (SASC 2008).</w:t>
       </w:r>
     </w:p>
     <w:p>
@@ -9791,7 +11086,7 @@
           <w:sz w:val="24"/>
           <w:u w:val="none"/>
         </w:rPr>
-        <w:t>[3]  Brier, E., Clavier, C., &amp; Olivier, F. (2004). Correlation power analysis with a leakage model. Cryptographic Hardware and Embedded Systems – CHES 2004, 16–29. Springer.</w:t>
+        <w:t>[2]  Bos, J., Ducas, L., Kiltz, E., Lepoint, T., Lyubashevsky, V., Schanck, J. M., Schwabe, P., Seiler, G., &amp; Stehlé, D. (2018). CRYSTALS-Kyber: A CCA-secure module-lattice-based KEM. IEEE European Symposium on Security and Privacy (EuroS&amp;P), 353–367.</w:t>
       </w:r>
     </w:p>
     <w:p>
@@ -9807,7 +11102,7 @@
           <w:sz w:val="24"/>
           <w:u w:val="none"/>
         </w:rPr>
-        <w:t>[4]  Chari, S., Rao, J. R., &amp; Rohatgi, P. (2002). Template attacks. Cryptographic Hardware and Embedded Systems – CHES 2002, 13–28. Springer.</w:t>
+        <w:t>[3]  Brier, E., Clavier, C., &amp; Olivier, F. (2004). Correlation power analysis with a leakage model. Cryptographic Hardware and Embedded Systems – CHES 2004, 16–29. Springer.</w:t>
       </w:r>
     </w:p>
     <w:p>
@@ -9823,7 +11118,7 @@
           <w:sz w:val="24"/>
           <w:u w:val="none"/>
         </w:rPr>
-        <w:t>[5]  Goodwill, G., Jun, B., Jaffe, J., &amp; Rohatgi, P. (2011). A testing methodology for side-channel resistance validation. NIST Non-Invasive Attack Testing Workshop.</w:t>
+        <w:t>[4]  Chari, S., Rao, J. R., &amp; Rohatgi, P. (2002). Template attacks. Cryptographic Hardware and Embedded Systems – CHES 2002, 13–28. Springer.</w:t>
       </w:r>
     </w:p>
     <w:p>
@@ -9839,7 +11134,7 @@
           <w:sz w:val="24"/>
           <w:u w:val="none"/>
         </w:rPr>
-        <w:t>[6]  Kocher, P. C. (1996). Timing attacks on implementations of Diffie-Hellman, RSA, DSS, and other systems. Advances in Cryptology – CRYPTO ’96, 104–113. Springer.</w:t>
+        <w:t>[5]  Goodwill, G., Jun, B., Jaffe, J., &amp; Rohatgi, P. (2011). A testing methodology for side-channel resistance validation. NIST Non-Invasive Attack Testing Workshop.</w:t>
       </w:r>
     </w:p>
     <w:p>
@@ -9855,7 +11150,7 @@
           <w:sz w:val="24"/>
           <w:u w:val="none"/>
         </w:rPr>
-        <w:t>[7]  Kocher, P., Jaffe, J., &amp; Jun, B. (1999). Differential power analysis. Advances in Cryptology – CRYPTO ’99, 388–397. Springer.</w:t>
+        <w:t>[6]  Kocher, P. C. (1996). Timing attacks on implementations of Diffie-Hellman, RSA, DSS, and other systems. Advances in Cryptology – CRYPTO ’96, 104–113. Springer.</w:t>
       </w:r>
     </w:p>
     <w:p>
@@ -9871,7 +11166,7 @@
           <w:sz w:val="24"/>
           <w:u w:val="none"/>
         </w:rPr>
-        <w:t>[8]  Mangard, S., Oswald, E., &amp; Popp, T. (2007). Power analysis attacks: Revealing the secrets of smart cards. Springer.</w:t>
+        <w:t>[7]  Kocher, P., Jaffe, J., &amp; Jun, B. (1999). Differential power analysis. Advances in Cryptology – CRYPTO ’99, 388–397. Springer.</w:t>
       </w:r>
     </w:p>
     <w:p>
@@ -9887,7 +11182,7 @@
           <w:sz w:val="24"/>
           <w:u w:val="none"/>
         </w:rPr>
-        <w:t>[9]  National Institute of Standards and Technology. (2024). Module-lattice-based key-encapsulation mechanism standard (FIPS 203). U.S. Department of Commerce.</w:t>
+        <w:t>[8]  Mangard, S., Oswald, E., &amp; Popp, T. (2007). Power analysis attacks: Revealing the secrets of smart cards. Springer.</w:t>
       </w:r>
     </w:p>
     <w:p>
@@ -9903,7 +11198,7 @@
           <w:sz w:val="24"/>
           <w:u w:val="none"/>
         </w:rPr>
-        <w:t>[10]  Nir, Y., &amp; Langley, A. (2018). ChaCha20 and Poly1305 for IETF protocols (RFC 8439). Internet Engineering Task Force.</w:t>
+        <w:t>[9]  National Institute of Standards and Technology. (2024). Module-lattice-based key-encapsulation mechanism standard (FIPS 203). U.S. Department of Commerce.</w:t>
       </w:r>
     </w:p>
     <w:p>
@@ -9919,7 +11214,7 @@
           <w:sz w:val="24"/>
           <w:u w:val="none"/>
         </w:rPr>
-        <w:t>[11]  Pessl, P., &amp; Primas, R. (2019). More practical single-trace attacks on the number theoretic transform. Progress in Cryptology – LATINCRYPT 2019, 130–149. Springer.</w:t>
+        <w:t>[10]  Nir, Y., &amp; Langley, A. (2018). ChaCha20 and Poly1305 for IETF protocols (RFC 8439). Internet Engineering Task Force.</w:t>
       </w:r>
     </w:p>
     <w:p>
@@ -9935,7 +11230,7 @@
           <w:sz w:val="24"/>
           <w:u w:val="none"/>
         </w:rPr>
-        <w:t>[12]  Primas, R., Pessl, P., &amp; Mangard, S. (2017). Single-trace side-channel attacks on masked lattice-based encryption. Cryptographic Hardware and Embedded Systems – CHES 2017, 513–533. Springer.</w:t>
+        <w:t>[11]  Pessl, P., &amp; Primas, R. (2019). More practical single-trace attacks on the number theoretic transform. Progress in Cryptology – LATINCRYPT 2019, 130–149. Springer.</w:t>
       </w:r>
     </w:p>
     <w:p>
@@ -9951,7 +11246,7 @@
           <w:sz w:val="24"/>
           <w:u w:val="none"/>
         </w:rPr>
-        <w:t>[13]  Ravi, P., Chattopadhyay, A., D’Anvers, J.-P., &amp; Baksi, A. (2023). Side-channel and fault-injection attacks over lattice-based post-quantum schemes: A survey. ACM Transactions on Embedded Computing Systems.</w:t>
+        <w:t>[12]  Primas, R., Pessl, P., &amp; Mangard, S. (2017). Single-trace side-channel attacks on masked lattice-based encryption. Cryptographic Hardware and Embedded Systems – CHES 2017, 513–533. Springer.</w:t>
       </w:r>
     </w:p>
     <w:p>
@@ -9967,7 +11262,7 @@
           <w:sz w:val="24"/>
           <w:u w:val="none"/>
         </w:rPr>
-        <w:t>[14]  Liu, F. T., Ting, K. M., &amp; Zhou, Z.-H. (2008). Isolation forest. IEEE International Conference on Data Mining (ICDM), 413–422.</w:t>
+        <w:t>[13]  Ravi, P., Chattopadhyay, A., D’Anvers, J.-P., &amp; Baksi, A. (2023). Side-channel and fault-injection attacks over lattice-based post-quantum schemes: A survey. ACM Transactions on Embedded Computing Systems.</w:t>
       </w:r>
     </w:p>
     <w:p>
@@ -9983,7 +11278,7 @@
           <w:sz w:val="24"/>
           <w:u w:val="none"/>
         </w:rPr>
-        <w:t>[15]  Standaert, F.-X., Malkin, T. G., &amp; Yung, M. (2009). A unified framework for the analysis of side-channel key recovery attacks. Advances in Cryptology – EUROCRYPT 2009, 443–461. Springer.</w:t>
+        <w:t>[14]  Liu, F. T., Ting, K. M., &amp; Zhou, Z.-H. (2008). Isolation forest. IEEE International Conference on Data Mining (ICDM), 413–422.</w:t>
       </w:r>
     </w:p>
     <w:p>
@@ -9999,7 +11294,7 @@
           <w:sz w:val="24"/>
           <w:u w:val="none"/>
         </w:rPr>
-        <w:t>[16]  Mangard, S. (2004). Hardware countermeasures against DPA – A statistical analysis of their effectiveness. Topics in Cryptology – CT-RSA 2004, 222–235. Springer.</w:t>
+        <w:t>[15]  Standaert, F.-X., Malkin, T. G., &amp; Yung, M. (2009). A unified framework for the analysis of side-channel key recovery attacks. Advances in Cryptology – EUROCRYPT 2009, 443–461. Springer.</w:t>
       </w:r>
     </w:p>
     <w:p>
@@ -10015,7 +11310,7 @@
           <w:sz w:val="24"/>
           <w:u w:val="none"/>
         </w:rPr>
-        <w:t>[17]  Coron, J.-S., &amp; Kizhvatov, I. (2009). An efficient method for random delay generation in embedded software. Cryptographic Hardware and Embedded Systems – CHES 2009, 156–170. Springer.</w:t>
+        <w:t>[16]  Mangard, S. (2004). Hardware countermeasures against DPA – A statistical analysis of their effectiveness. Topics in Cryptology – CT-RSA 2004, 222–235. Springer.</w:t>
       </w:r>
     </w:p>
     <w:p>
@@ -10031,7 +11326,7 @@
           <w:sz w:val="24"/>
           <w:u w:val="none"/>
         </w:rPr>
-        <w:t>[18]  Schneier, B. (2015). Applied cryptography: Protocols, algorithms, and source code in C (20th anniversary ed.). Wiley.</w:t>
+        <w:t>[17]  Coron, J.-S., &amp; Kizhvatov, I. (2009). An efficient method for random delay generation in embedded software. Cryptographic Hardware and Embedded Systems – CHES 2009, 156–170. Springer.</w:t>
       </w:r>
     </w:p>
     <w:p>
@@ -10047,7 +11342,7 @@
           <w:sz w:val="24"/>
           <w:u w:val="none"/>
         </w:rPr>
-        <w:t>[19]  Espressif Systems. (2023). ESP32-S3 technical reference manual. Espressif Systems.</w:t>
+        <w:t>[18]  Schneier, B. (2015). Applied cryptography: Protocols, algorithms, and source code in C (20th anniversary ed.). Wiley.</w:t>
       </w:r>
     </w:p>
     <w:p>
@@ -10063,47 +11358,12 @@
           <w:sz w:val="24"/>
           <w:u w:val="none"/>
         </w:rPr>
-        <w:t>[20]  Texas Instruments. (2018). ADS1115 ultra-small, low-power, 16-bit analog-to-digital converter datasheet. Texas Instruments.</w:t>
-      </w:r>
-    </w:p>
-    <w:p>
-      <w:r>
-        <w:br w:type="page"/>
-      </w:r>
-    </w:p>
-    <w:p>
-      <w:pPr>
-        <w:pStyle w:val="Heading1"/>
-        <w:jc w:val="center"/>
-      </w:pPr>
-      <w:r>
-        <w:rPr>
-          <w:rFonts w:ascii="Times New Roman" w:hAnsi="Times New Roman"/>
-          <w:b/>
-          <w:color w:val="000000"/>
-          <w:sz w:val="32"/>
-        </w:rPr>
-        <w:t>APPENDIX</w:t>
-      </w:r>
-    </w:p>
-    <w:p>
-      <w:pPr>
-        <w:pStyle w:val="Heading2"/>
-      </w:pPr>
-      <w:r>
-        <w:rPr>
-          <w:rFonts w:ascii="Times New Roman" w:hAnsi="Times New Roman"/>
-          <w:b/>
-          <w:color w:val="000000"/>
-          <w:sz w:val="28"/>
-        </w:rPr>
-        <w:t>APPENDIX 1  SOURCE CODE ORGANISATION</w:t>
+        <w:t>[19]  Espressif Systems. (2023). ESP32-S3 technical reference manual. Espressif Systems.</w:t>
       </w:r>
     </w:p>
     <w:p>
       <w:pPr>
         <w:spacing w:after="160"/>
-        <w:jc w:val="both"/>
       </w:pPr>
       <w:r>
         <w:rPr>
@@ -10114,118 +11374,28 @@
           <w:sz w:val="24"/>
           <w:u w:val="none"/>
         </w:rPr>
-        <w:t>The complete source code of the firmware and of the attacker and defender programs is maintained in a version-controlled repository, organised into an attacker package, a defender package, the target firmware, and a shared cryptographic engine. A single demonstration script reproduces every result reported in Chapter 5 against the software model without hardware. The listings below reproduce the central routines referenced in Chapter 4. The repository is organised as follows: an attacker package containing the key-recovery tools and their transport; a defender package containing the leakage assessment, the probing monitor, and the key-management console; the target firmware for the ESP32-S3; and a shared cryptographic engine implementing the leakage models and the correlation computation. A top-level demonstration script runs the attacker and defender programs in sequence against the software model and prints, for each step, the exact command a user would type, so that the entire account of Chapter 5 can be reproduced with a single invocation and no hardware.</w:t>
-      </w:r>
-    </w:p>
-    <w:p>
-      <w:pPr>
-        <w:pStyle w:val="Heading2"/>
+        <w:t>[20]  Texas Instruments. (2018). ADS1115 ultra-small, low-power, 16-bit analog-to-digital converter datasheet. Texas Instruments.</w:t>
+      </w:r>
+    </w:p>
+    <w:p>
+      <w:r>
+        <w:br w:type="page"/>
+      </w:r>
+    </w:p>
+    <w:p>
+      <w:pPr>
+        <w:pStyle w:val="Heading1"/>
+        <w:jc w:val="center"/>
       </w:pPr>
       <w:r>
         <w:rPr>
           <w:rFonts w:ascii="Times New Roman" w:hAnsi="Times New Roman"/>
           <w:b/>
           <w:color w:val="000000"/>
-          <w:sz w:val="28"/>
-        </w:rPr>
-        <w:t>APPENDIX 2  CORRELATION COMPUTATION</w:t>
-      </w:r>
-    </w:p>
-    <w:p>
-      <w:pPr>
-        <w:spacing w:after="0" w:line="240" w:lineRule="auto"/>
-      </w:pPr>
-      <w:r>
-        <w:rPr>
-          <w:rFonts w:ascii="Consolas" w:hAnsi="Consolas"/>
-          <w:color w:val="000000"/>
-          <w:sz w:val="19"/>
-        </w:rPr>
-        <w:t>def correlation_matrix(hypotheses, traces):</w:t>
-      </w:r>
-    </w:p>
-    <w:p>
-      <w:pPr>
-        <w:spacing w:after="0" w:line="240" w:lineRule="auto"/>
-      </w:pPr>
-      <w:r>
-        <w:rPr>
-          <w:rFonts w:ascii="Consolas" w:hAnsi="Consolas"/>
-          <w:color w:val="000000"/>
-          <w:sz w:val="19"/>
-        </w:rPr>
-        <w:t xml:space="preserve">    h = hypotheses - hypotheses.mean(axis=0, keepdims=True)</w:t>
-      </w:r>
-    </w:p>
-    <w:p>
-      <w:pPr>
-        <w:spacing w:after="0" w:line="240" w:lineRule="auto"/>
-      </w:pPr>
-      <w:r>
-        <w:rPr>
-          <w:rFonts w:ascii="Consolas" w:hAnsi="Consolas"/>
-          <w:color w:val="000000"/>
-          <w:sz w:val="19"/>
-        </w:rPr>
-        <w:t xml:space="preserve">    t = traces - traces.mean(axis=0, keepdims=True)</w:t>
-      </w:r>
-    </w:p>
-    <w:p>
-      <w:pPr>
-        <w:spacing w:after="0" w:line="240" w:lineRule="auto"/>
-      </w:pPr>
-      <w:r>
-        <w:rPr>
-          <w:rFonts w:ascii="Consolas" w:hAnsi="Consolas"/>
-          <w:color w:val="000000"/>
-          <w:sz w:val="19"/>
-        </w:rPr>
-        <w:t xml:space="preserve">    num = h.T @ t</w:t>
-      </w:r>
-    </w:p>
-    <w:p>
-      <w:pPr>
-        <w:spacing w:after="0" w:line="240" w:lineRule="auto"/>
-      </w:pPr>
-      <w:r>
-        <w:rPr>
-          <w:rFonts w:ascii="Consolas" w:hAnsi="Consolas"/>
-          <w:color w:val="000000"/>
-          <w:sz w:val="19"/>
-        </w:rPr>
-        <w:t xml:space="preserve">    denom = np.outer(np.sqrt((h**2).sum(0)), np.sqrt((t**2).sum(0)))</w:t>
-      </w:r>
-    </w:p>
-    <w:p>
-      <w:pPr>
-        <w:spacing w:after="0" w:line="240" w:lineRule="auto"/>
-      </w:pPr>
-      <w:r>
-        <w:rPr>
-          <w:rFonts w:ascii="Consolas" w:hAnsi="Consolas"/>
-          <w:color w:val="000000"/>
-          <w:sz w:val="19"/>
-        </w:rPr>
-        <w:t xml:space="preserve">    denom[denom == 0] = 1e-12</w:t>
-      </w:r>
-    </w:p>
-    <w:p>
-      <w:pPr>
-        <w:spacing w:after="0" w:line="240" w:lineRule="auto"/>
-      </w:pPr>
-      <w:r>
-        <w:rPr>
-          <w:rFonts w:ascii="Consolas" w:hAnsi="Consolas"/>
-          <w:color w:val="000000"/>
-          <w:sz w:val="19"/>
-        </w:rPr>
-        <w:t xml:space="preserve">    return num / denom</w:t>
-      </w:r>
-    </w:p>
-    <w:p>
-      <w:pPr>
-        <w:spacing w:after="160"/>
-      </w:pPr>
+          <w:sz w:val="32"/>
+        </w:rPr>
+        <w:t>APPENDIX</w:t>
+      </w:r>
     </w:p>
     <w:p>
       <w:pPr>
@@ -10238,104 +11408,25 @@
           <w:color w:val="000000"/>
           <w:sz w:val="28"/>
         </w:rPr>
-        <w:t>APPENDIX 3  FULL KEY RECOVERY ACROSS COLUMNS</w:t>
-      </w:r>
-    </w:p>
-    <w:p>
-      <w:pPr>
-        <w:spacing w:after="0" w:line="240" w:lineRule="auto"/>
-      </w:pPr>
-      <w:r>
-        <w:rPr>
-          <w:rFonts w:ascii="Consolas" w:hAnsi="Consolas"/>
-          <w:color w:val="000000"/>
-          <w:sz w:val="19"/>
-        </w:rPr>
-        <w:t>def recover_full_key(key, n_traces):</w:t>
-      </w:r>
-    </w:p>
-    <w:p>
-      <w:pPr>
-        <w:spacing w:after="0" w:line="240" w:lineRule="auto"/>
-      </w:pPr>
-      <w:r>
-        <w:rPr>
-          <w:rFonts w:ascii="Consolas" w:hAnsi="Consolas"/>
-          <w:color w:val="000000"/>
-          <w:sz w:val="19"/>
-        </w:rPr>
-        <w:t xml:space="preserve">    recovered = [None] * 8</w:t>
-      </w:r>
-    </w:p>
-    <w:p>
-      <w:pPr>
-        <w:spacing w:after="0" w:line="240" w:lineRule="auto"/>
-      </w:pPr>
-      <w:r>
-        <w:rPr>
-          <w:rFonts w:ascii="Consolas" w:hAnsi="Consolas"/>
-          <w:color w:val="000000"/>
-          <w:sz w:val="19"/>
-        </w:rPr>
-        <w:t xml:space="preserve">    for col in range(4):</w:t>
-      </w:r>
-    </w:p>
-    <w:p>
-      <w:pPr>
-        <w:spacing w:after="0" w:line="240" w:lineRule="auto"/>
-      </w:pPr>
-      <w:r>
-        <w:rPr>
-          <w:rFonts w:ascii="Consolas" w:hAnsi="Consolas"/>
-          <w:color w:val="000000"/>
-          <w:sz w:val="19"/>
-        </w:rPr>
-        <w:t xml:space="preserve">        x, traces = simulate_column(key[col], key[col+4], CONSTANTS[col], n_traces)</w:t>
-      </w:r>
-    </w:p>
-    <w:p>
-      <w:pPr>
-        <w:spacing w:after="0" w:line="240" w:lineRule="auto"/>
-      </w:pPr>
-      <w:r>
-        <w:rPr>
-          <w:rFonts w:ascii="Consolas" w:hAnsi="Consolas"/>
-          <w:color w:val="000000"/>
-          <w:sz w:val="19"/>
-        </w:rPr>
-        <w:t xml:space="preserve">        lo, hi = recover_column(x, traces, CONSTANTS[col])</w:t>
-      </w:r>
-    </w:p>
-    <w:p>
-      <w:pPr>
-        <w:spacing w:after="0" w:line="240" w:lineRule="auto"/>
-      </w:pPr>
-      <w:r>
-        <w:rPr>
-          <w:rFonts w:ascii="Consolas" w:hAnsi="Consolas"/>
-          <w:color w:val="000000"/>
-          <w:sz w:val="19"/>
-        </w:rPr>
-        <w:t xml:space="preserve">        recovered[col], recovered[col+4] = lo, hi</w:t>
-      </w:r>
-    </w:p>
-    <w:p>
-      <w:pPr>
-        <w:spacing w:after="0" w:line="240" w:lineRule="auto"/>
-      </w:pPr>
-      <w:r>
-        <w:rPr>
-          <w:rFonts w:ascii="Consolas" w:hAnsi="Consolas"/>
-          <w:color w:val="000000"/>
-          <w:sz w:val="19"/>
-        </w:rPr>
-        <w:t xml:space="preserve">    return recovered   # all eight key words</w:t>
+        <w:t>APPENDIX 1  SOURCE CODE ORGANISATION</w:t>
       </w:r>
     </w:p>
     <w:p>
       <w:pPr>
         <w:spacing w:after="160"/>
-      </w:pPr>
+        <w:jc w:val="both"/>
+      </w:pPr>
+      <w:r>
+        <w:rPr>
+          <w:rFonts w:ascii="Times New Roman" w:hAnsi="Times New Roman" w:eastAsia="Times New Roman"/>
+          <w:b w:val="0"/>
+          <w:i w:val="0"/>
+          <w:color w:val="000000"/>
+          <w:sz w:val="24"/>
+          <w:u w:val="none"/>
+        </w:rPr>
+        <w:t>The complete source code of the firmware and of the attacker and defender programs is maintained in a version-controlled repository, organised into an attacker package, a defender package, the target firmware, and a shared cryptographic engine. A single demonstration script reproduces every result reported in Chapter 5 against the software model without hardware. The listings below reproduce the central routines referenced in Chapter 4. The repository is organised as follows: an attacker package containing the key-recovery tools and their transport; a defender package containing the leakage assessment, the probing monitor, and the key-management console; the target firmware for the ESP32-S3; and a shared cryptographic engine implementing the leakage models and the correlation computation. A top-level demonstration script runs the attacker and defender programs in sequence against the software model and prints, for each step, the exact command a user would type, so that the entire account of Chapter 5 can be reproduced with a single invocation and no hardware.</w:t>
+      </w:r>
     </w:p>
     <w:p>
       <w:pPr>
@@ -10348,7 +11439,7 @@
           <w:color w:val="000000"/>
           <w:sz w:val="28"/>
         </w:rPr>
-        <w:t>APPENDIX 4  LEAKAGE ASSESSMENT (TVLA)</w:t>
+        <w:t>APPENDIX 2  CORRELATION COMPUTATION</w:t>
       </w:r>
     </w:p>
     <w:p>
@@ -10361,7 +11452,7 @@
           <w:color w:val="000000"/>
           <w:sz w:val="19"/>
         </w:rPr>
-        <w:t>def welch_t(a, b):</w:t>
+        <w:t>def correlation_matrix(hypotheses, traces):</w:t>
       </w:r>
     </w:p>
     <w:p>
@@ -10374,7 +11465,7 @@
           <w:color w:val="000000"/>
           <w:sz w:val="19"/>
         </w:rPr>
-        <w:t xml:space="preserve">    ma, mb = a.mean(0), b.mean(0)</w:t>
+        <w:t xml:space="preserve">    h = hypotheses - hypotheses.mean(axis=0, keepdims=True)</w:t>
       </w:r>
     </w:p>
     <w:p>
@@ -10387,7 +11478,7 @@
           <w:color w:val="000000"/>
           <w:sz w:val="19"/>
         </w:rPr>
-        <w:t xml:space="preserve">    va, vb = a.var(0, ddof=1), b.var(0, ddof=1)</w:t>
+        <w:t xml:space="preserve">    t = traces - traces.mean(axis=0, keepdims=True)</w:t>
       </w:r>
     </w:p>
     <w:p>
@@ -10400,7 +11491,7 @@
           <w:color w:val="000000"/>
           <w:sz w:val="19"/>
         </w:rPr>
-        <w:t xml:space="preserve">    denom = np.sqrt(va/a.shape[0] + vb/b.shape[0])</w:t>
+        <w:t xml:space="preserve">    num = h.T @ t</w:t>
       </w:r>
     </w:p>
     <w:p>
@@ -10413,6 +11504,19 @@
           <w:color w:val="000000"/>
           <w:sz w:val="19"/>
         </w:rPr>
+        <w:t xml:space="preserve">    denom = np.outer(np.sqrt((h**2).sum(0)), np.sqrt((t**2).sum(0)))</w:t>
+      </w:r>
+    </w:p>
+    <w:p>
+      <w:pPr>
+        <w:spacing w:after="0" w:line="240" w:lineRule="auto"/>
+      </w:pPr>
+      <w:r>
+        <w:rPr>
+          <w:rFonts w:ascii="Consolas" w:hAnsi="Consolas"/>
+          <w:color w:val="000000"/>
+          <w:sz w:val="19"/>
+        </w:rPr>
         <w:t xml:space="preserve">    denom[denom == 0] = 1e-12</w:t>
       </w:r>
     </w:p>
@@ -10426,84 +11530,7 @@
           <w:color w:val="000000"/>
           <w:sz w:val="19"/>
         </w:rPr>
-        <w:t xml:space="preserve">    return (ma - mb) / denom          # |t| &gt; 4.5  =&gt;  device leaks</w:t>
-      </w:r>
-    </w:p>
-    <w:p>
-      <w:pPr>
-        <w:spacing w:after="0" w:line="240" w:lineRule="auto"/>
-      </w:pPr>
-      <w:r>
-        <w:rPr>
-          <w:rFonts w:ascii="Consolas" w:hAnsi="Consolas"/>
-          <w:color w:val="000000"/>
-          <w:sz w:val="19"/>
-        </w:rPr>
-      </w:r>
-    </w:p>
-    <w:p>
-      <w:pPr>
-        <w:spacing w:after="0" w:line="240" w:lineRule="auto"/>
-      </w:pPr>
-      <w:r>
-        <w:rPr>
-          <w:rFonts w:ascii="Consolas" w:hAnsi="Consolas"/>
-          <w:color w:val="000000"/>
-          <w:sz w:val="19"/>
-        </w:rPr>
-        <w:t>def assess(transport, n_each=400, leak='leakloop'):</w:t>
-      </w:r>
-    </w:p>
-    <w:p>
-      <w:pPr>
-        <w:spacing w:after="0" w:line="240" w:lineRule="auto"/>
-      </w:pPr>
-      <w:r>
-        <w:rPr>
-          <w:rFonts w:ascii="Consolas" w:hAnsi="Consolas"/>
-          <w:color w:val="000000"/>
-          <w:sz w:val="19"/>
-        </w:rPr>
-        <w:t xml:space="preserve">    fixed, rand = collect_fixed_random(transport, n_each, leak=leak)</w:t>
-      </w:r>
-    </w:p>
-    <w:p>
-      <w:pPr>
-        <w:spacing w:after="0" w:line="240" w:lineRule="auto"/>
-      </w:pPr>
-      <w:r>
-        <w:rPr>
-          <w:rFonts w:ascii="Consolas" w:hAnsi="Consolas"/>
-          <w:color w:val="000000"/>
-          <w:sz w:val="19"/>
-        </w:rPr>
-        <w:t xml:space="preserve">    t = welch_t(fixed, rand)</w:t>
-      </w:r>
-    </w:p>
-    <w:p>
-      <w:pPr>
-        <w:spacing w:after="0" w:line="240" w:lineRule="auto"/>
-      </w:pPr>
-      <w:r>
-        <w:rPr>
-          <w:rFonts w:ascii="Consolas" w:hAnsi="Consolas"/>
-          <w:color w:val="000000"/>
-          <w:sz w:val="19"/>
-        </w:rPr>
-        <w:t xml:space="preserve">    peak = float(np.max(np.abs(t)))</w:t>
-      </w:r>
-    </w:p>
-    <w:p>
-      <w:pPr>
-        <w:spacing w:after="0" w:line="240" w:lineRule="auto"/>
-      </w:pPr>
-      <w:r>
-        <w:rPr>
-          <w:rFonts w:ascii="Consolas" w:hAnsi="Consolas"/>
-          <w:color w:val="000000"/>
-          <w:sz w:val="19"/>
-        </w:rPr>
-        <w:t xml:space="preserve">    return {'peak_t': peak, 'leaks': peak &gt; 4.5, 't_trace': t}</w:t>
+        <w:t xml:space="preserve">    return num / denom</w:t>
       </w:r>
     </w:p>
     <w:p>
@@ -10522,7 +11549,7 @@
           <w:color w:val="000000"/>
           <w:sz w:val="28"/>
         </w:rPr>
-        <w:t>APPENDIX 5  CHACHA20 BLOCK FUNCTION (FIRMWARE)</w:t>
+        <w:t>APPENDIX 3  FULL KEY RECOVERY ACROSS COLUMNS</w:t>
       </w:r>
     </w:p>
     <w:p>
@@ -10535,7 +11562,7 @@
           <w:color w:val="000000"/>
           <w:sz w:val="19"/>
         </w:rPr>
-        <w:t>inline uint32_t rotl32(uint32_t v, int n){ return (v&lt;&lt;n)|(v&gt;&gt;(32-n)); }</w:t>
+        <w:t>def recover_full_key(key, n_traces):</w:t>
       </w:r>
     </w:p>
     <w:p>
@@ -10548,7 +11575,7 @@
           <w:color w:val="000000"/>
           <w:sz w:val="19"/>
         </w:rPr>
-        <w:t>void quarter_round(uint32_t s[16], int a,int b,int c,int d){</w:t>
+        <w:t xml:space="preserve">    recovered = [None] * 8</w:t>
       </w:r>
     </w:p>
     <w:p>
@@ -10561,7 +11588,7 @@
           <w:color w:val="000000"/>
           <w:sz w:val="19"/>
         </w:rPr>
-        <w:t xml:space="preserve">    s[a]+=s[b]; s[d]^=s[a]; s[d]=rotl32(s[d],16);</w:t>
+        <w:t xml:space="preserve">    for col in range(4):</w:t>
       </w:r>
     </w:p>
     <w:p>
@@ -10574,7 +11601,7 @@
           <w:color w:val="000000"/>
           <w:sz w:val="19"/>
         </w:rPr>
-        <w:t xml:space="preserve">    s[c]+=s[d]; s[b]^=s[c]; s[b]=rotl32(s[b],12);</w:t>
+        <w:t xml:space="preserve">        x, traces = simulate_column(key[col], key[col+4], CONSTANTS[col], n_traces)</w:t>
       </w:r>
     </w:p>
     <w:p>
@@ -10587,7 +11614,7 @@
           <w:color w:val="000000"/>
           <w:sz w:val="19"/>
         </w:rPr>
-        <w:t xml:space="preserve">    s[a]+=s[b]; s[d]^=s[a]; s[d]=rotl32(s[d], 8);</w:t>
+        <w:t xml:space="preserve">        lo, hi = recover_column(x, traces, CONSTANTS[col])</w:t>
       </w:r>
     </w:p>
     <w:p>
@@ -10600,7 +11627,7 @@
           <w:color w:val="000000"/>
           <w:sz w:val="19"/>
         </w:rPr>
-        <w:t xml:space="preserve">    s[c]+=s[d]; s[b]^=s[c]; s[b]=rotl32(s[b], 7);</w:t>
+        <w:t xml:space="preserve">        recovered[col], recovered[col+4] = lo, hi</w:t>
       </w:r>
     </w:p>
     <w:p>
@@ -10613,163 +11640,7 @@
           <w:color w:val="000000"/>
           <w:sz w:val="19"/>
         </w:rPr>
-        <w:t>}</w:t>
-      </w:r>
-    </w:p>
-    <w:p>
-      <w:pPr>
-        <w:spacing w:after="0" w:line="240" w:lineRule="auto"/>
-      </w:pPr>
-      <w:r>
-        <w:rPr>
-          <w:rFonts w:ascii="Consolas" w:hAnsi="Consolas"/>
-          <w:color w:val="000000"/>
-          <w:sz w:val="19"/>
-        </w:rPr>
-        <w:t>void chacha20_block(const uint32_t key[8], uint32_t ctr,</w:t>
-      </w:r>
-    </w:p>
-    <w:p>
-      <w:pPr>
-        <w:spacing w:after="0" w:line="240" w:lineRule="auto"/>
-      </w:pPr>
-      <w:r>
-        <w:rPr>
-          <w:rFonts w:ascii="Consolas" w:hAnsi="Consolas"/>
-          <w:color w:val="000000"/>
-          <w:sz w:val="19"/>
-        </w:rPr>
-        <w:t xml:space="preserve">                    const uint32_t nonce[3], uint32_t out[16]){</w:t>
-      </w:r>
-    </w:p>
-    <w:p>
-      <w:pPr>
-        <w:spacing w:after="0" w:line="240" w:lineRule="auto"/>
-      </w:pPr>
-      <w:r>
-        <w:rPr>
-          <w:rFonts w:ascii="Consolas" w:hAnsi="Consolas"/>
-          <w:color w:val="000000"/>
-          <w:sz w:val="19"/>
-        </w:rPr>
-        <w:t xml:space="preserve">    uint32_t s[16] = { C0,C1,C2,C3, key[0..7], ctr, nonce[0..2] };</w:t>
-      </w:r>
-    </w:p>
-    <w:p>
-      <w:pPr>
-        <w:spacing w:after="0" w:line="240" w:lineRule="auto"/>
-      </w:pPr>
-      <w:r>
-        <w:rPr>
-          <w:rFonts w:ascii="Consolas" w:hAnsi="Consolas"/>
-          <w:color w:val="000000"/>
-          <w:sz w:val="19"/>
-        </w:rPr>
-        <w:t xml:space="preserve">    uint32_t w[16]; memcpy(w,s,sizeof s);</w:t>
-      </w:r>
-    </w:p>
-    <w:p>
-      <w:pPr>
-        <w:spacing w:after="0" w:line="240" w:lineRule="auto"/>
-      </w:pPr>
-      <w:r>
-        <w:rPr>
-          <w:rFonts w:ascii="Consolas" w:hAnsi="Consolas"/>
-          <w:color w:val="000000"/>
-          <w:sz w:val="19"/>
-        </w:rPr>
-        <w:t xml:space="preserve">    for(int i=0;i&lt;10;i++){               // 20 rounds = 10 double rounds</w:t>
-      </w:r>
-    </w:p>
-    <w:p>
-      <w:pPr>
-        <w:spacing w:after="0" w:line="240" w:lineRule="auto"/>
-      </w:pPr>
-      <w:r>
-        <w:rPr>
-          <w:rFonts w:ascii="Consolas" w:hAnsi="Consolas"/>
-          <w:color w:val="000000"/>
-          <w:sz w:val="19"/>
-        </w:rPr>
-        <w:t xml:space="preserve">        quarter_round(w,0,4,8,12);  quarter_round(w,1,5,9,13);</w:t>
-      </w:r>
-    </w:p>
-    <w:p>
-      <w:pPr>
-        <w:spacing w:after="0" w:line="240" w:lineRule="auto"/>
-      </w:pPr>
-      <w:r>
-        <w:rPr>
-          <w:rFonts w:ascii="Consolas" w:hAnsi="Consolas"/>
-          <w:color w:val="000000"/>
-          <w:sz w:val="19"/>
-        </w:rPr>
-        <w:t xml:space="preserve">        quarter_round(w,2,6,10,14); quarter_round(w,3,7,11,15);</w:t>
-      </w:r>
-    </w:p>
-    <w:p>
-      <w:pPr>
-        <w:spacing w:after="0" w:line="240" w:lineRule="auto"/>
-      </w:pPr>
-      <w:r>
-        <w:rPr>
-          <w:rFonts w:ascii="Consolas" w:hAnsi="Consolas"/>
-          <w:color w:val="000000"/>
-          <w:sz w:val="19"/>
-        </w:rPr>
-        <w:t xml:space="preserve">        quarter_round(w,0,5,10,15); quarter_round(w,1,6,11,12);</w:t>
-      </w:r>
-    </w:p>
-    <w:p>
-      <w:pPr>
-        <w:spacing w:after="0" w:line="240" w:lineRule="auto"/>
-      </w:pPr>
-      <w:r>
-        <w:rPr>
-          <w:rFonts w:ascii="Consolas" w:hAnsi="Consolas"/>
-          <w:color w:val="000000"/>
-          <w:sz w:val="19"/>
-        </w:rPr>
-        <w:t xml:space="preserve">        quarter_round(w,2,7,8,13);  quarter_round(w,3,4,9,14);</w:t>
-      </w:r>
-    </w:p>
-    <w:p>
-      <w:pPr>
-        <w:spacing w:after="0" w:line="240" w:lineRule="auto"/>
-      </w:pPr>
-      <w:r>
-        <w:rPr>
-          <w:rFonts w:ascii="Consolas" w:hAnsi="Consolas"/>
-          <w:color w:val="000000"/>
-          <w:sz w:val="19"/>
-        </w:rPr>
-        <w:t xml:space="preserve">    }</w:t>
-      </w:r>
-    </w:p>
-    <w:p>
-      <w:pPr>
-        <w:spacing w:after="0" w:line="240" w:lineRule="auto"/>
-      </w:pPr>
-      <w:r>
-        <w:rPr>
-          <w:rFonts w:ascii="Consolas" w:hAnsi="Consolas"/>
-          <w:color w:val="000000"/>
-          <w:sz w:val="19"/>
-        </w:rPr>
-        <w:t xml:space="preserve">    for(int i=0;i&lt;16;i++) out[i]=w[i]+s[i];</w:t>
-      </w:r>
-    </w:p>
-    <w:p>
-      <w:pPr>
-        <w:spacing w:after="0" w:line="240" w:lineRule="auto"/>
-      </w:pPr>
-      <w:r>
-        <w:rPr>
-          <w:rFonts w:ascii="Consolas" w:hAnsi="Consolas"/>
-          <w:color w:val="000000"/>
-          <w:sz w:val="19"/>
-        </w:rPr>
-        <w:t>}</w:t>
+        <w:t xml:space="preserve">    return recovered   # all eight key words</w:t>
       </w:r>
     </w:p>
     <w:p>
@@ -10788,7 +11659,7 @@
           <w:color w:val="000000"/>
           <w:sz w:val="28"/>
         </w:rPr>
-        <w:t>APPENDIX 6  KYBER LEAKAGE MODEL (HOST)</w:t>
+        <w:t>APPENDIX 4  LEAKAGE ASSESSMENT (TVLA)</w:t>
       </w:r>
     </w:p>
     <w:p>
@@ -10801,7 +11672,7 @@
           <w:color w:val="000000"/>
           <w:sz w:val="19"/>
         </w:rPr>
-        <w:t>KYBER_Q = 3329</w:t>
+        <w:t>def welch_t(a, b):</w:t>
       </w:r>
     </w:p>
     <w:p>
@@ -10814,7 +11685,7 @@
           <w:color w:val="000000"/>
           <w:sz w:val="19"/>
         </w:rPr>
-        <w:t>def hw(x):              # Hamming weight of a 12-bit coefficient</w:t>
+        <w:t xml:space="preserve">    ma, mb = a.mean(0), b.mean(0)</w:t>
       </w:r>
     </w:p>
     <w:p>
@@ -10827,7 +11698,7 @@
           <w:color w:val="000000"/>
           <w:sz w:val="19"/>
         </w:rPr>
-        <w:t xml:space="preserve">    return bin(int(x) &amp; 0xFFF).count('1')</w:t>
+        <w:t xml:space="preserve">    va, vb = a.var(0, ddof=1), b.var(0, ddof=1)</w:t>
       </w:r>
     </w:p>
     <w:p>
@@ -10840,7 +11711,7 @@
           <w:color w:val="000000"/>
           <w:sz w:val="19"/>
         </w:rPr>
-        <w:t>def pointwise(s_hat_i, u_i):</w:t>
+        <w:t xml:space="preserve">    denom = np.sqrt(va/a.shape[0] + vb/b.shape[0])</w:t>
       </w:r>
     </w:p>
     <w:p>
@@ -10853,7 +11724,7 @@
           <w:color w:val="000000"/>
           <w:sz w:val="19"/>
         </w:rPr>
-        <w:t xml:space="preserve">    return (int(s_hat_i) * int(u_i)) % KYBER_Q    # leaking product</w:t>
+        <w:t xml:space="preserve">    denom[denom == 0] = 1e-12</w:t>
       </w:r>
     </w:p>
     <w:p>
@@ -10866,7 +11737,7 @@
           <w:color w:val="000000"/>
           <w:sz w:val="19"/>
         </w:rPr>
-        <w:t>def recover_coefficient(u_values, traces):</w:t>
+        <w:t xml:space="preserve">    return (ma - mb) / denom          # |t| &gt; 4.5  =&gt;  device leaks</w:t>
       </w:r>
     </w:p>
     <w:p>
@@ -10879,7 +11750,6 @@
           <w:color w:val="000000"/>
           <w:sz w:val="19"/>
         </w:rPr>
-        <w:t xml:space="preserve">    guesses = np.arange(KYBER_Q)</w:t>
       </w:r>
     </w:p>
     <w:p>
@@ -10892,7 +11762,7 @@
           <w:color w:val="000000"/>
           <w:sz w:val="19"/>
         </w:rPr>
-        <w:t xml:space="preserve">    prod = (u_values[:,None] * guesses[None,:]) % KYBER_Q</w:t>
+        <w:t>def assess(transport, n_each=400, leak='leakloop'):</w:t>
       </w:r>
     </w:p>
     <w:p>
@@ -10905,7 +11775,7 @@
           <w:color w:val="000000"/>
           <w:sz w:val="19"/>
         </w:rPr>
-        <w:t xml:space="preserve">    hyp = hw_vec(prod)</w:t>
+        <w:t xml:space="preserve">    fixed, rand = collect_fixed_random(transport, n_each, leak=leak)</w:t>
       </w:r>
     </w:p>
     <w:p>
@@ -10918,7 +11788,7 @@
           <w:color w:val="000000"/>
           <w:sz w:val="19"/>
         </w:rPr>
-        <w:t xml:space="preserve">    corr = np.abs(correlation_matrix(hyp, traces)).max(axis=1)</w:t>
+        <w:t xml:space="preserve">    t = welch_t(fixed, rand)</w:t>
       </w:r>
     </w:p>
     <w:p>
@@ -10931,7 +11801,20 @@
           <w:color w:val="000000"/>
           <w:sz w:val="19"/>
         </w:rPr>
-        <w:t xml:space="preserve">    return int(np.argmax(corr))                   # recovered s_hat_i</w:t>
+        <w:t xml:space="preserve">    peak = float(np.max(np.abs(t)))</w:t>
+      </w:r>
+    </w:p>
+    <w:p>
+      <w:pPr>
+        <w:spacing w:after="0" w:line="240" w:lineRule="auto"/>
+      </w:pPr>
+      <w:r>
+        <w:rPr>
+          <w:rFonts w:ascii="Consolas" w:hAnsi="Consolas"/>
+          <w:color w:val="000000"/>
+          <w:sz w:val="19"/>
+        </w:rPr>
+        <w:t xml:space="preserve">    return {'peak_t': peak, 'leaks': peak &gt; 4.5, 't_trace': t}</w:t>
       </w:r>
     </w:p>
     <w:p>
@@ -10950,7 +11833,7 @@
           <w:color w:val="000000"/>
           <w:sz w:val="28"/>
         </w:rPr>
-        <w:t>APPENDIX 7  PROBING-DETECTION FEATURES</w:t>
+        <w:t>APPENDIX 5  CHACHA20 BLOCK FUNCTION (FIRMWARE)</w:t>
       </w:r>
     </w:p>
     <w:p>
@@ -10963,7 +11846,7 @@
           <w:color w:val="000000"/>
           <w:sz w:val="19"/>
         </w:rPr>
-        <w:t># nine features from a sliding window of recent requests</w:t>
+        <w:t>inline uint32_t rotl32(uint32_t v, int n){ return (v&lt;&lt;n)|(v&gt;&gt;(32-n)); }</w:t>
       </w:r>
     </w:p>
     <w:p>
@@ -10976,7 +11859,7 @@
           <w:color w:val="000000"/>
           <w:sz w:val="19"/>
         </w:rPr>
-        <w:t>features = [ payload_entropy,          # structured inputs -&gt; low entropy</w:t>
+        <w:t>void quarter_round(uint32_t s[16], int a,int b,int c,int d){</w:t>
       </w:r>
     </w:p>
     <w:p>
@@ -10989,7 +11872,7 @@
           <w:color w:val="000000"/>
           <w:sz w:val="19"/>
         </w:rPr>
-        <w:t xml:space="preserve">             request_rate,             # trace collection -&gt; high rate</w:t>
+        <w:t xml:space="preserve">    s[a]+=s[b]; s[d]^=s[a]; s[d]=rotl32(s[d],16);</w:t>
       </w:r>
     </w:p>
     <w:p>
@@ -11002,7 +11885,7 @@
           <w:color w:val="000000"/>
           <w:sz w:val="19"/>
         </w:rPr>
-        <w:t xml:space="preserve">             timing_cv,                # automation -&gt; regular timing</w:t>
+        <w:t xml:space="preserve">    s[c]+=s[d]; s[b]^=s[c]; s[b]=rotl32(s[b],12);</w:t>
       </w:r>
     </w:p>
     <w:p>
@@ -11015,7 +11898,7 @@
           <w:color w:val="000000"/>
           <w:sz w:val="19"/>
         </w:rPr>
-        <w:t xml:space="preserve">             duplicate_ratio,          # repeated payloads</w:t>
+        <w:t xml:space="preserve">    s[a]+=s[b]; s[d]^=s[a]; s[d]=rotl32(s[d], 8);</w:t>
       </w:r>
     </w:p>
     <w:p>
@@ -11028,7 +11911,7 @@
           <w:color w:val="000000"/>
           <w:sz w:val="19"/>
         </w:rPr>
-        <w:t xml:space="preserve">             sequentialness,           # counter-like payloads</w:t>
+        <w:t xml:space="preserve">    s[c]+=s[d]; s[b]^=s[c]; s[b]=rotl32(s[b], 7);</w:t>
       </w:r>
     </w:p>
     <w:p>
@@ -11041,7 +11924,7 @@
           <w:color w:val="000000"/>
           <w:sz w:val="19"/>
         </w:rPr>
-        <w:t xml:space="preserve">             compression_ratio,        # structured data compresses</w:t>
+        <w:t>}</w:t>
       </w:r>
     </w:p>
     <w:p>
@@ -11054,7 +11937,7 @@
           <w:color w:val="000000"/>
           <w:sz w:val="19"/>
         </w:rPr>
-        <w:t xml:space="preserve">             inter_arrival_autocorr,   # periodic timing</w:t>
+        <w:t>void chacha20_block(const uint32_t key[8], uint32_t ctr,</w:t>
       </w:r>
     </w:p>
     <w:p>
@@ -11067,7 +11950,7 @@
           <w:color w:val="000000"/>
           <w:sz w:val="19"/>
         </w:rPr>
-        <w:t xml:space="preserve">             burst_ratio,              # bursts vs idle</w:t>
+        <w:t xml:space="preserve">                    const uint32_t nonce[3], uint32_t out[16]){</w:t>
       </w:r>
     </w:p>
     <w:p>
@@ -11080,7 +11963,7 @@
           <w:color w:val="000000"/>
           <w:sz w:val="19"/>
         </w:rPr>
-        <w:t xml:space="preserve">             rate_acceleration ]       # ramping collection</w:t>
+        <w:t xml:space="preserve">    uint32_t s[16] = { C0,C1,C2,C3, key[0..7], ctr, nonce[0..2] };</w:t>
       </w:r>
     </w:p>
     <w:p>
@@ -11093,7 +11976,7 @@
           <w:color w:val="000000"/>
           <w:sz w:val="19"/>
         </w:rPr>
-        <w:t>model = IsolationForest(n_estimators=200, contamination='auto')</w:t>
+        <w:t xml:space="preserve">    uint32_t w[16]; memcpy(w,s,sizeof s);</w:t>
       </w:r>
     </w:p>
     <w:p>
@@ -11106,7 +11989,98 @@
           <w:color w:val="000000"/>
           <w:sz w:val="19"/>
         </w:rPr>
-        <w:t>model.fit(scaler.fit_transform(normal_windows))   # trained on normal only</w:t>
+        <w:t xml:space="preserve">    for(int i=0;i&lt;10;i++){               // 20 rounds = 10 double rounds</w:t>
+      </w:r>
+    </w:p>
+    <w:p>
+      <w:pPr>
+        <w:spacing w:after="0" w:line="240" w:lineRule="auto"/>
+      </w:pPr>
+      <w:r>
+        <w:rPr>
+          <w:rFonts w:ascii="Consolas" w:hAnsi="Consolas"/>
+          <w:color w:val="000000"/>
+          <w:sz w:val="19"/>
+        </w:rPr>
+        <w:t xml:space="preserve">        quarter_round(w,0,4,8,12);  quarter_round(w,1,5,9,13);</w:t>
+      </w:r>
+    </w:p>
+    <w:p>
+      <w:pPr>
+        <w:spacing w:after="0" w:line="240" w:lineRule="auto"/>
+      </w:pPr>
+      <w:r>
+        <w:rPr>
+          <w:rFonts w:ascii="Consolas" w:hAnsi="Consolas"/>
+          <w:color w:val="000000"/>
+          <w:sz w:val="19"/>
+        </w:rPr>
+        <w:t xml:space="preserve">        quarter_round(w,2,6,10,14); quarter_round(w,3,7,11,15);</w:t>
+      </w:r>
+    </w:p>
+    <w:p>
+      <w:pPr>
+        <w:spacing w:after="0" w:line="240" w:lineRule="auto"/>
+      </w:pPr>
+      <w:r>
+        <w:rPr>
+          <w:rFonts w:ascii="Consolas" w:hAnsi="Consolas"/>
+          <w:color w:val="000000"/>
+          <w:sz w:val="19"/>
+        </w:rPr>
+        <w:t xml:space="preserve">        quarter_round(w,0,5,10,15); quarter_round(w,1,6,11,12);</w:t>
+      </w:r>
+    </w:p>
+    <w:p>
+      <w:pPr>
+        <w:spacing w:after="0" w:line="240" w:lineRule="auto"/>
+      </w:pPr>
+      <w:r>
+        <w:rPr>
+          <w:rFonts w:ascii="Consolas" w:hAnsi="Consolas"/>
+          <w:color w:val="000000"/>
+          <w:sz w:val="19"/>
+        </w:rPr>
+        <w:t xml:space="preserve">        quarter_round(w,2,7,8,13);  quarter_round(w,3,4,9,14);</w:t>
+      </w:r>
+    </w:p>
+    <w:p>
+      <w:pPr>
+        <w:spacing w:after="0" w:line="240" w:lineRule="auto"/>
+      </w:pPr>
+      <w:r>
+        <w:rPr>
+          <w:rFonts w:ascii="Consolas" w:hAnsi="Consolas"/>
+          <w:color w:val="000000"/>
+          <w:sz w:val="19"/>
+        </w:rPr>
+        <w:t xml:space="preserve">    }</w:t>
+      </w:r>
+    </w:p>
+    <w:p>
+      <w:pPr>
+        <w:spacing w:after="0" w:line="240" w:lineRule="auto"/>
+      </w:pPr>
+      <w:r>
+        <w:rPr>
+          <w:rFonts w:ascii="Consolas" w:hAnsi="Consolas"/>
+          <w:color w:val="000000"/>
+          <w:sz w:val="19"/>
+        </w:rPr>
+        <w:t xml:space="preserve">    for(int i=0;i&lt;16;i++) out[i]=w[i]+s[i];</w:t>
+      </w:r>
+    </w:p>
+    <w:p>
+      <w:pPr>
+        <w:spacing w:after="0" w:line="240" w:lineRule="auto"/>
+      </w:pPr>
+      <w:r>
+        <w:rPr>
+          <w:rFonts w:ascii="Consolas" w:hAnsi="Consolas"/>
+          <w:color w:val="000000"/>
+          <w:sz w:val="19"/>
+        </w:rPr>
+        <w:t>}</w:t>
       </w:r>
     </w:p>
     <w:p>
@@ -11125,7 +12099,7 @@
           <w:color w:val="000000"/>
           <w:sz w:val="28"/>
         </w:rPr>
-        <w:t>APPENDIX 8  ATTACKER TRANSPORT (CAPABILITY BOUNDARY)</w:t>
+        <w:t>APPENDIX 6  KYBER LEAKAGE MODEL (HOST)</w:t>
       </w:r>
     </w:p>
     <w:p>
@@ -11138,7 +12112,7 @@
           <w:color w:val="000000"/>
           <w:sz w:val="19"/>
         </w:rPr>
-        <w:t>class SimTransport:        # attacker: observe only, no defense access</w:t>
+        <w:t>KYBER_Q = 3329</w:t>
       </w:r>
     </w:p>
     <w:p>
@@ -11151,7 +12125,7 @@
           <w:color w:val="000000"/>
           <w:sz w:val="19"/>
         </w:rPr>
-        <w:t xml:space="preserve">    def leakloop(self, counter):  return dev.leakloop_trace(counter)</w:t>
+        <w:t>def hw(x):              # Hamming weight of a 12-bit coefficient</w:t>
       </w:r>
     </w:p>
     <w:p>
@@ -11164,7 +12138,7 @@
           <w:color w:val="000000"/>
           <w:sz w:val="19"/>
         </w:rPr>
-        <w:t xml:space="preserve">    def kyberleak(self, u):       return dev.kyberleak_trace(u)</w:t>
+        <w:t xml:space="preserve">    return bin(int(x) &amp; 0xFFF).count('1')</w:t>
       </w:r>
     </w:p>
     <w:p>
@@ -11177,7 +12151,7 @@
           <w:color w:val="000000"/>
           <w:sz w:val="19"/>
         </w:rPr>
-        <w:t xml:space="preserve">    def check(self, candidate):   return dev.check_secret(candidate)</w:t>
+        <w:t>def pointwise(s_hat_i, u_i):</w:t>
       </w:r>
     </w:p>
     <w:p>
@@ -11190,7 +12164,7 @@
           <w:color w:val="000000"/>
           <w:sz w:val="19"/>
         </w:rPr>
-        <w:t xml:space="preserve">    def command(self, ctr, pl):   return dev.submit_command(ctr, pl)</w:t>
+        <w:t xml:space="preserve">    return (int(s_hat_i) * int(u_i)) % KYBER_Q    # leaking product</w:t>
       </w:r>
     </w:p>
     <w:p>
@@ -11203,7 +12177,7 @@
           <w:color w:val="000000"/>
           <w:sz w:val="19"/>
         </w:rPr>
-        <w:t xml:space="preserve">    # note: there is deliberately no set_defense / rotate_key here</w:t>
+        <w:t>def recover_coefficient(u_values, traces):</w:t>
       </w:r>
     </w:p>
     <w:p>
@@ -11216,6 +12190,7 @@
           <w:color w:val="000000"/>
           <w:sz w:val="19"/>
         </w:rPr>
+        <w:t xml:space="preserve">    guesses = np.arange(KYBER_Q)</w:t>
       </w:r>
     </w:p>
     <w:p>
@@ -11228,7 +12203,7 @@
           <w:color w:val="000000"/>
           <w:sz w:val="19"/>
         </w:rPr>
-        <w:t>class HwTransport:         # same interface, real ESP32 over UART + ADC</w:t>
+        <w:t xml:space="preserve">    prod = (u_values[:,None] * guesses[None,:]) % KYBER_Q</w:t>
       </w:r>
     </w:p>
     <w:p>
@@ -11241,7 +12216,7 @@
           <w:color w:val="000000"/>
           <w:sz w:val="19"/>
         </w:rPr>
-        <w:t xml:space="preserve">    def leakloop(self, counter):</w:t>
+        <w:t xml:space="preserve">    hyp = hw_vec(prod)</w:t>
       </w:r>
     </w:p>
     <w:p>
@@ -11254,7 +12229,7 @@
           <w:color w:val="000000"/>
           <w:sz w:val="19"/>
         </w:rPr>
-        <w:t xml:space="preserve">        uart.write(b'LEAKLOOP %08x\n' % counter)</w:t>
+        <w:t xml:space="preserve">    corr = np.abs(correlation_matrix(hyp, traces)).max(axis=1)</w:t>
       </w:r>
     </w:p>
     <w:p>
@@ -11267,46 +12242,7 @@
           <w:color w:val="000000"/>
           <w:sz w:val="19"/>
         </w:rPr>
-        <w:t xml:space="preserve">        buf = []</w:t>
-      </w:r>
-    </w:p>
-    <w:p>
-      <w:pPr>
-        <w:spacing w:after="0" w:line="240" w:lineRule="auto"/>
-      </w:pPr>
-      <w:r>
-        <w:rPr>
-          <w:rFonts w:ascii="Consolas" w:hAnsi="Consolas"/>
-          <w:color w:val="000000"/>
-          <w:sz w:val="19"/>
-        </w:rPr>
-        <w:t xml:space="preserve">        while not uart.in_waiting: buf.append(chan.voltage)</w:t>
-      </w:r>
-    </w:p>
-    <w:p>
-      <w:pPr>
-        <w:spacing w:after="0" w:line="240" w:lineRule="auto"/>
-      </w:pPr>
-      <w:r>
-        <w:rPr>
-          <w:rFonts w:ascii="Consolas" w:hAnsi="Consolas"/>
-          <w:color w:val="000000"/>
-          <w:sz w:val="19"/>
-        </w:rPr>
-        <w:t xml:space="preserve">        uart.readline()</w:t>
-      </w:r>
-    </w:p>
-    <w:p>
-      <w:pPr>
-        <w:spacing w:after="0" w:line="240" w:lineRule="auto"/>
-      </w:pPr>
-      <w:r>
-        <w:rPr>
-          <w:rFonts w:ascii="Consolas" w:hAnsi="Consolas"/>
-          <w:color w:val="000000"/>
-          <w:sz w:val="19"/>
-        </w:rPr>
-        <w:t xml:space="preserve">        return np.asarray(buf)</w:t>
+        <w:t xml:space="preserve">    return int(np.argmax(corr))                   # recovered s_hat_i</w:t>
       </w:r>
     </w:p>
     <w:p>
@@ -11325,7 +12261,7 @@
           <w:color w:val="000000"/>
           <w:sz w:val="28"/>
         </w:rPr>
-        <w:t>APPENDIX 9  PER-BYTE CPA ANALYSIS (ATTACKER)</w:t>
+        <w:t>APPENDIX 7  PROBING-DETECTION FEATURES</w:t>
       </w:r>
     </w:p>
     <w:p>
@@ -11338,7 +12274,7 @@
           <w:color w:val="000000"/>
           <w:sz w:val="19"/>
         </w:rPr>
-        <w:t>def analyze_byte(known_bytes, traces):</w:t>
+        <w:t># nine features from a sliding window of recent requests</w:t>
       </w:r>
     </w:p>
     <w:p>
@@ -11351,7 +12287,7 @@
           <w:color w:val="000000"/>
           <w:sz w:val="19"/>
         </w:rPr>
-        <w:t xml:space="preserve">    corr = byte_corr(known_bytes, traces)        # (256, n_samples)</w:t>
+        <w:t>features = [ payload_entropy,          # structured inputs -&gt; low entropy</w:t>
       </w:r>
     </w:p>
     <w:p>
@@ -11364,7 +12300,7 @@
           <w:color w:val="000000"/>
           <w:sz w:val="19"/>
         </w:rPr>
-        <w:t xml:space="preserve">    signed_peak = corr.max(axis=1)               # signed peak per guess</w:t>
+        <w:t xml:space="preserve">             request_rate,             # trace collection -&gt; high rate</w:t>
       </w:r>
     </w:p>
     <w:p>
@@ -11377,7 +12313,7 @@
           <w:color w:val="000000"/>
           <w:sz w:val="19"/>
         </w:rPr>
-        <w:t xml:space="preserve">    order = np.argsort(signed_peak)[::-1]</w:t>
+        <w:t xml:space="preserve">             timing_cv,                # automation -&gt; regular timing</w:t>
       </w:r>
     </w:p>
     <w:p>
@@ -11390,7 +12326,7 @@
           <w:color w:val="000000"/>
           <w:sz w:val="19"/>
         </w:rPr>
-        <w:t xml:space="preserve">    best, second = int(order[0]), int(order[1])</w:t>
+        <w:t xml:space="preserve">             duplicate_ratio,          # repeated payloads</w:t>
       </w:r>
     </w:p>
     <w:p>
@@ -11403,7 +12339,7 @@
           <w:color w:val="000000"/>
           <w:sz w:val="19"/>
         </w:rPr>
-        <w:t xml:space="preserve">    return { 'value': best,</w:t>
+        <w:t xml:space="preserve">             sequentialness,           # counter-like payloads</w:t>
       </w:r>
     </w:p>
     <w:p>
@@ -11416,7 +12352,7 @@
           <w:color w:val="000000"/>
           <w:sz w:val="19"/>
         </w:rPr>
-        <w:t xml:space="preserve">             'corr': float(signed_peak[best]),</w:t>
+        <w:t xml:space="preserve">             compression_ratio,        # structured data compresses</w:t>
       </w:r>
     </w:p>
     <w:p>
@@ -11429,7 +12365,7 @@
           <w:color w:val="000000"/>
           <w:sz w:val="19"/>
         </w:rPr>
-        <w:t xml:space="preserve">             'margin': float(signed_peak[best] - signed_peak[second]),</w:t>
+        <w:t xml:space="preserve">             inter_arrival_autocorr,   # periodic timing</w:t>
       </w:r>
     </w:p>
     <w:p>
@@ -11442,7 +12378,7 @@
           <w:color w:val="000000"/>
           <w:sz w:val="19"/>
         </w:rPr>
-        <w:t xml:space="preserve">             'poi': int(corr[best].argmax()),</w:t>
+        <w:t xml:space="preserve">             burst_ratio,              # bursts vs idle</w:t>
       </w:r>
     </w:p>
     <w:p>
@@ -11455,7 +12391,33 @@
           <w:color w:val="000000"/>
           <w:sz w:val="19"/>
         </w:rPr>
-        <w:t xml:space="preserve">             'top5': [(int(g), float(signed_peak[g])) for g in order[:5]] }</w:t>
+        <w:t xml:space="preserve">             rate_acceleration ]       # ramping collection</w:t>
+      </w:r>
+    </w:p>
+    <w:p>
+      <w:pPr>
+        <w:spacing w:after="0" w:line="240" w:lineRule="auto"/>
+      </w:pPr>
+      <w:r>
+        <w:rPr>
+          <w:rFonts w:ascii="Consolas" w:hAnsi="Consolas"/>
+          <w:color w:val="000000"/>
+          <w:sz w:val="19"/>
+        </w:rPr>
+        <w:t>model = IsolationForest(n_estimators=200, contamination='auto')</w:t>
+      </w:r>
+    </w:p>
+    <w:p>
+      <w:pPr>
+        <w:spacing w:after="0" w:line="240" w:lineRule="auto"/>
+      </w:pPr>
+      <w:r>
+        <w:rPr>
+          <w:rFonts w:ascii="Consolas" w:hAnsi="Consolas"/>
+          <w:color w:val="000000"/>
+          <w:sz w:val="19"/>
+        </w:rPr>
+        <w:t>model.fit(scaler.fit_transform(normal_windows))   # trained on normal only</w:t>
       </w:r>
     </w:p>
     <w:p>
@@ -11474,7 +12436,7 @@
           <w:color w:val="000000"/>
           <w:sz w:val="28"/>
         </w:rPr>
-        <w:t>APPENDIX 10  FULL-KEY COLUMN RECOVERY (ATTACKER)</w:t>
+        <w:t>APPENDIX 8  ATTACKER TRANSPORT (CAPABILITY BOUNDARY)</w:t>
       </w:r>
     </w:p>
     <w:p>
@@ -11487,7 +12449,7 @@
           <w:color w:val="000000"/>
           <w:sz w:val="19"/>
         </w:rPr>
-        <w:t>def recover_column(x, traces, const):</w:t>
+        <w:t>class SimTransport:        # attacker: observe only, no defense access</w:t>
       </w:r>
     </w:p>
     <w:p>
@@ -11500,7 +12462,7 @@
           <w:color w:val="000000"/>
           <w:sz w:val="19"/>
         </w:rPr>
-        <w:t xml:space="preserve">    per = traces.shape[1] // 8; win = split(traces, 8)</w:t>
+        <w:t xml:space="preserve">    def leakloop(self, counter):  return dev.leakloop_trace(counter)</w:t>
       </w:r>
     </w:p>
     <w:p>
@@ -11513,7 +12475,7 @@
           <w:color w:val="000000"/>
           <w:sz w:val="19"/>
         </w:rPr>
-        <w:t xml:space="preserve">    a = 0</w:t>
+        <w:t xml:space="preserve">    def kyberleak(self, u):       return dev.kyberleak_trace(u)</w:t>
       </w:r>
     </w:p>
     <w:p>
@@ -11526,7 +12488,7 @@
           <w:color w:val="000000"/>
           <w:sz w:val="19"/>
         </w:rPr>
-        <w:t xml:space="preserve">    for j in range(4):                            # XOR target -&gt; const+key_lo</w:t>
+        <w:t xml:space="preserve">    def check(self, candidate):   return dev.check_secret(candidate)</w:t>
       </w:r>
     </w:p>
     <w:p>
@@ -11539,7 +12501,7 @@
           <w:color w:val="000000"/>
           <w:sz w:val="19"/>
         </w:rPr>
-        <w:t xml:space="preserve">        a |= attack_byte_xor((x&gt;&gt;(8*j))&amp;0xFF, win[j]) &lt;&lt; (8*j)</w:t>
+        <w:t xml:space="preserve">    def command(self, ctr, pl):   return dev.submit_command(ctr, pl)</w:t>
       </w:r>
     </w:p>
     <w:p>
@@ -11552,7 +12514,7 @@
           <w:color w:val="000000"/>
           <w:sz w:val="19"/>
         </w:rPr>
-        <w:t xml:space="preserve">    key_lo = (a - const) &amp; MASK32</w:t>
+        <w:t xml:space="preserve">    # note: there is deliberately no set_defense / rotate_key here</w:t>
       </w:r>
     </w:p>
     <w:p>
@@ -11565,7 +12527,6 @@
           <w:color w:val="000000"/>
           <w:sz w:val="19"/>
         </w:rPr>
-        <w:t xml:space="preserve">    D = rotl32((x ^ a), 16)                        # now known per trace</w:t>
       </w:r>
     </w:p>
     <w:p>
@@ -11578,7 +12539,7 @@
           <w:color w:val="000000"/>
           <w:sz w:val="19"/>
         </w:rPr>
-        <w:t xml:space="preserve">    carry = zeros(len(x)); key_hi = 0</w:t>
+        <w:t>class HwTransport:         # same interface, real ESP32 over UART + ADC</w:t>
       </w:r>
     </w:p>
     <w:p>
@@ -11591,7 +12552,7 @@
           <w:color w:val="000000"/>
           <w:sz w:val="19"/>
         </w:rPr>
-        <w:t xml:space="preserve">    for j in range(4):                            # ADD target -&gt; key_hi</w:t>
+        <w:t xml:space="preserve">    def leakloop(self, counter):</w:t>
       </w:r>
     </w:p>
     <w:p>
@@ -11604,7 +12565,7 @@
           <w:color w:val="000000"/>
           <w:sz w:val="19"/>
         </w:rPr>
-        <w:t xml:space="preserve">        kb = (D&gt;&gt;(8*j))&amp;0xFF</w:t>
+        <w:t xml:space="preserve">        uart.write(b'LEAKLOOP %08x\n' % counter)</w:t>
       </w:r>
     </w:p>
     <w:p>
@@ -11617,7 +12578,7 @@
           <w:color w:val="000000"/>
           <w:sz w:val="19"/>
         </w:rPr>
-        <w:t xml:space="preserve">        best = attack_byte(kb, carry, win[4+j])</w:t>
+        <w:t xml:space="preserve">        buf = []</w:t>
       </w:r>
     </w:p>
     <w:p>
@@ -11630,7 +12591,7 @@
           <w:color w:val="000000"/>
           <w:sz w:val="19"/>
         </w:rPr>
-        <w:t xml:space="preserve">        key_hi |= best &lt;&lt; (8*j)</w:t>
+        <w:t xml:space="preserve">        while not uart.in_waiting: buf.append(chan.voltage)</w:t>
       </w:r>
     </w:p>
     <w:p>
@@ -11643,7 +12604,7 @@
           <w:color w:val="000000"/>
           <w:sz w:val="19"/>
         </w:rPr>
-        <w:t xml:space="preserve">        carry = (kb + best + carry) &gt;= 256</w:t>
+        <w:t xml:space="preserve">        uart.readline()</w:t>
       </w:r>
     </w:p>
     <w:p>
@@ -11656,7 +12617,7 @@
           <w:color w:val="000000"/>
           <w:sz w:val="19"/>
         </w:rPr>
-        <w:t xml:space="preserve">    return key_lo, key_hi</w:t>
+        <w:t xml:space="preserve">        return np.asarray(buf)</w:t>
       </w:r>
     </w:p>
     <w:p>
@@ -11675,7 +12636,7 @@
           <w:color w:val="000000"/>
           <w:sz w:val="28"/>
         </w:rPr>
-        <w:t>APPENDIX 11  DEFENDER LEAKAGE ASSESSMENT</w:t>
+        <w:t>APPENDIX 9  PER-BYTE CPA ANALYSIS (ATTACKER)</w:t>
       </w:r>
     </w:p>
     <w:p>
@@ -11688,7 +12649,7 @@
           <w:color w:val="000000"/>
           <w:sz w:val="19"/>
         </w:rPr>
-        <w:t>def assess_masking(transport, n_traces=800):</w:t>
+        <w:t>def analyze_byte(known_bytes, traces):</w:t>
       </w:r>
     </w:p>
     <w:p>
@@ -11701,7 +12662,7 @@
           <w:color w:val="000000"/>
           <w:sz w:val="19"/>
         </w:rPr>
-        <w:t xml:space="preserve">    out = {}</w:t>
+        <w:t xml:space="preserve">    corr = byte_corr(known_bytes, traces)        # (256, n_samples)</w:t>
       </w:r>
     </w:p>
     <w:p>
@@ -11714,7 +12675,7 @@
           <w:color w:val="000000"/>
           <w:sz w:val="19"/>
         </w:rPr>
-        <w:t xml:space="preserve">    for state in ('off', 'on'):</w:t>
+        <w:t xml:space="preserve">    signed_peak = corr.max(axis=1)               # signed peak per guess</w:t>
       </w:r>
     </w:p>
     <w:p>
@@ -11727,7 +12688,7 @@
           <w:color w:val="000000"/>
           <w:sz w:val="19"/>
         </w:rPr>
-        <w:t xml:space="preserve">        transport.set_defense('masking', state == 'on')</w:t>
+        <w:t xml:space="preserve">    order = np.argsort(signed_peak)[::-1]</w:t>
       </w:r>
     </w:p>
     <w:p>
@@ -11740,7 +12701,7 @@
           <w:color w:val="000000"/>
           <w:sz w:val="19"/>
         </w:rPr>
-        <w:t xml:space="preserve">        tv = tvla.assess(transport)                # fixed vs random t-test</w:t>
+        <w:t xml:space="preserve">    best, second = int(order[0]), int(order[1])</w:t>
       </w:r>
     </w:p>
     <w:p>
@@ -11753,7 +12714,7 @@
           <w:color w:val="000000"/>
           <w:sz w:val="19"/>
         </w:rPr>
-        <w:t xml:space="preserve">        counters, traces = collect(transport, n_traces)</w:t>
+        <w:t xml:space="preserve">    return { 'value': best,</w:t>
       </w:r>
     </w:p>
     <w:p>
@@ -11766,7 +12727,7 @@
           <w:color w:val="000000"/>
           <w:sz w:val="19"/>
         </w:rPr>
-        <w:t xml:space="preserve">        res = cpa.analyze(counters, traces)         # reuse attacker engine</w:t>
+        <w:t xml:space="preserve">             'corr': float(signed_peak[best]),</w:t>
       </w:r>
     </w:p>
     <w:p>
@@ -11779,7 +12740,7 @@
           <w:color w:val="000000"/>
           <w:sz w:val="19"/>
         </w:rPr>
-        <w:t xml:space="preserve">        out[state] = { 'tvla_peak_t': tv['peak_t'], 'tvla_leaks': tv['leaks'],</w:t>
+        <w:t xml:space="preserve">             'margin': float(signed_peak[best] - signed_peak[second]),</w:t>
       </w:r>
     </w:p>
     <w:p>
@@ -11792,7 +12753,7 @@
           <w:color w:val="000000"/>
           <w:sz w:val="19"/>
         </w:rPr>
-        <w:t xml:space="preserve">                       'peak_corr': res['mean_peak_corr'], 'ntd': res['ntd'] }</w:t>
+        <w:t xml:space="preserve">             'poi': int(corr[best].argmax()),</w:t>
       </w:r>
     </w:p>
     <w:p>
@@ -11805,20 +12766,7 @@
           <w:color w:val="000000"/>
           <w:sz w:val="19"/>
         </w:rPr>
-        <w:t xml:space="preserve">    transport.set_defense('masking', False)</w:t>
-      </w:r>
-    </w:p>
-    <w:p>
-      <w:pPr>
-        <w:spacing w:after="0" w:line="240" w:lineRule="auto"/>
-      </w:pPr>
-      <w:r>
-        <w:rPr>
-          <w:rFonts w:ascii="Consolas" w:hAnsi="Consolas"/>
-          <w:color w:val="000000"/>
-          <w:sz w:val="19"/>
-        </w:rPr>
-        <w:t xml:space="preserve">    return summarize(out)                           # verdict + suppression</w:t>
+        <w:t xml:space="preserve">             'top5': [(int(g), float(signed_peak[g])) for g in order[:5]] }</w:t>
       </w:r>
     </w:p>
     <w:p>
@@ -11837,7 +12785,7 @@
           <w:color w:val="000000"/>
           <w:sz w:val="28"/>
         </w:rPr>
-        <w:t>APPENDIX 12  UNIFIED DEMONSTRATION (HOST)</w:t>
+        <w:t>APPENDIX 10  FULL-KEY COLUMN RECOVERY (ATTACKER)</w:t>
       </w:r>
     </w:p>
     <w:p>
@@ -11850,7 +12798,7 @@
           <w:color w:val="000000"/>
           <w:sz w:val="19"/>
         </w:rPr>
-        <w:t>STEPS = [</w:t>
+        <w:t>def recover_column(x, traces, const):</w:t>
       </w:r>
     </w:p>
     <w:p>
@@ -11863,7 +12811,7 @@
           <w:color w:val="000000"/>
           <w:sz w:val="19"/>
         </w:rPr>
-        <w:t xml:space="preserve">  ('ATTACKER  ChaCha20 power CPA',      'ct_attack.py cpa --traces 1500'),</w:t>
+        <w:t xml:space="preserve">    per = traces.shape[1] // 8; win = split(traces, 8)</w:t>
       </w:r>
     </w:p>
     <w:p>
@@ -11876,7 +12824,7 @@
           <w:color w:val="000000"/>
           <w:sz w:val="19"/>
         </w:rPr>
-        <w:t xml:space="preserve">  ('ATTACKER  full 256-bit recovery',   'chacha_full.py --traces 4000'),</w:t>
+        <w:t xml:space="preserve">    a = 0</w:t>
       </w:r>
     </w:p>
     <w:p>
@@ -11889,7 +12837,7 @@
           <w:color w:val="000000"/>
           <w:sz w:val="19"/>
         </w:rPr>
-        <w:t xml:space="preserve">  ('ATTACKER  Kyber coefficient CPA',   'ct_attack.py kyber --traces 2500'),</w:t>
+        <w:t xml:space="preserve">    for j in range(4):                            # XOR target -&gt; const+key_lo</w:t>
       </w:r>
     </w:p>
     <w:p>
@@ -11902,7 +12850,7 @@
           <w:color w:val="000000"/>
           <w:sz w:val="19"/>
         </w:rPr>
-        <w:t xml:space="preserve">  ('ATTACKER  timing attack',           'ct_attack.py timing'),</w:t>
+        <w:t xml:space="preserve">        a |= attack_byte_xor((x&gt;&gt;(8*j))&amp;0xFF, win[j]) &lt;&lt; (8*j)</w:t>
       </w:r>
     </w:p>
     <w:p>
@@ -11915,7 +12863,7 @@
           <w:color w:val="000000"/>
           <w:sz w:val="19"/>
         </w:rPr>
-        <w:t xml:space="preserve">  ('ATTACKER  replay attack',           'ct_attack.py replay'),</w:t>
+        <w:t xml:space="preserve">    key_lo = (a - const) &amp; MASK32</w:t>
       </w:r>
     </w:p>
     <w:p>
@@ -11928,7 +12876,7 @@
           <w:color w:val="000000"/>
           <w:sz w:val="19"/>
         </w:rPr>
-        <w:t xml:space="preserve">  ('DEFENDER  ChaCha20 assessment',     'ct_defend.py assess --target chacha'),</w:t>
+        <w:t xml:space="preserve">    D = rotl32((x ^ a), 16)                        # now known per trace</w:t>
       </w:r>
     </w:p>
     <w:p>
@@ -11941,7 +12889,7 @@
           <w:color w:val="000000"/>
           <w:sz w:val="19"/>
         </w:rPr>
-        <w:t xml:space="preserve">  ('DEFENDER  Kyber assessment',        'ct_defend.py assess --target kyber'),</w:t>
+        <w:t xml:space="preserve">    carry = zeros(len(x)); key_hi = 0</w:t>
       </w:r>
     </w:p>
     <w:p>
@@ -11954,7 +12902,7 @@
           <w:color w:val="000000"/>
           <w:sz w:val="19"/>
         </w:rPr>
-        <w:t xml:space="preserve">  ('DEFENDER  probing analytics',       'ct_defend.py monitor'),</w:t>
+        <w:t xml:space="preserve">    for j in range(4):                            # ADD target -&gt; key_hi</w:t>
       </w:r>
     </w:p>
     <w:p>
@@ -11967,7 +12915,7 @@
           <w:color w:val="000000"/>
           <w:sz w:val="19"/>
         </w:rPr>
-        <w:t>]</w:t>
+        <w:t xml:space="preserve">        kb = (D&gt;&gt;(8*j))&amp;0xFF</w:t>
       </w:r>
     </w:p>
     <w:p>
@@ -11980,7 +12928,7 @@
           <w:color w:val="000000"/>
           <w:sz w:val="19"/>
         </w:rPr>
-        <w:t>for title, cmd in STEPS:        # one command reproduces every result</w:t>
+        <w:t xml:space="preserve">        best = attack_byte(kb, carry, win[4+j])</w:t>
       </w:r>
     </w:p>
     <w:p>
@@ -11993,7 +12941,33 @@
           <w:color w:val="000000"/>
           <w:sz w:val="19"/>
         </w:rPr>
-        <w:t xml:space="preserve">    print('#', title); run(cmd)   # add --hw to drive the real device</w:t>
+        <w:t xml:space="preserve">        key_hi |= best &lt;&lt; (8*j)</w:t>
+      </w:r>
+    </w:p>
+    <w:p>
+      <w:pPr>
+        <w:spacing w:after="0" w:line="240" w:lineRule="auto"/>
+      </w:pPr>
+      <w:r>
+        <w:rPr>
+          <w:rFonts w:ascii="Consolas" w:hAnsi="Consolas"/>
+          <w:color w:val="000000"/>
+          <w:sz w:val="19"/>
+        </w:rPr>
+        <w:t xml:space="preserve">        carry = (kb + best + carry) &gt;= 256</w:t>
+      </w:r>
+    </w:p>
+    <w:p>
+      <w:pPr>
+        <w:spacing w:after="0" w:line="240" w:lineRule="auto"/>
+      </w:pPr>
+      <w:r>
+        <w:rPr>
+          <w:rFonts w:ascii="Consolas" w:hAnsi="Consolas"/>
+          <w:color w:val="000000"/>
+          <w:sz w:val="19"/>
+        </w:rPr>
+        <w:t xml:space="preserve">    return key_lo, key_hi</w:t>
       </w:r>
     </w:p>
     <w:p>
@@ -12012,7 +12986,7 @@
           <w:color w:val="000000"/>
           <w:sz w:val="28"/>
         </w:rPr>
-        <w:t>APPENDIX 13  PROBING MONITOR ANALYTICS (DEFENDER)</w:t>
+        <w:t>APPENDIX 11  DEFENDER LEAKAGE ASSESSMENT</w:t>
       </w:r>
     </w:p>
     <w:p>
@@ -12025,7 +12999,7 @@
           <w:color w:val="000000"/>
           <w:sz w:val="19"/>
         </w:rPr>
-        <w:t>def detection_latency(make_detector, simulate, max_events=250):</w:t>
+        <w:t>def assess_masking(transport, n_traces=800):</w:t>
       </w:r>
     </w:p>
     <w:p>
@@ -12038,7 +13012,7 @@
           <w:color w:val="000000"/>
           <w:sz w:val="19"/>
         </w:rPr>
-        <w:t xml:space="preserve">    det = make_detector(); t = 0.0</w:t>
+        <w:t xml:space="preserve">    out = {}</w:t>
       </w:r>
     </w:p>
     <w:p>
@@ -12051,7 +13025,7 @@
           <w:color w:val="000000"/>
           <w:sz w:val="19"/>
         </w:rPr>
-        <w:t xml:space="preserve">    for i in range(max_events):</w:t>
+        <w:t xml:space="preserve">    for state in ('off', 'on'):</w:t>
       </w:r>
     </w:p>
     <w:p>
@@ -12064,7 +13038,7 @@
           <w:color w:val="000000"/>
           <w:sz w:val="19"/>
         </w:rPr>
-        <w:t xml:space="preserve">        t = simulate(det, rng, n_events=1, base_time=t)  # one request at a time</w:t>
+        <w:t xml:space="preserve">        transport.set_defense('masking', state == 'on')</w:t>
       </w:r>
     </w:p>
     <w:p>
@@ -12077,7 +13051,7 @@
           <w:color w:val="000000"/>
           <w:sz w:val="19"/>
         </w:rPr>
-        <w:t xml:space="preserve">        if det.check()['alert']:</w:t>
+        <w:t xml:space="preserve">        tv = tvla.assess(transport)                # fixed vs random t-test</w:t>
       </w:r>
     </w:p>
     <w:p>
@@ -12090,7 +13064,7 @@
           <w:color w:val="000000"/>
           <w:sz w:val="19"/>
         </w:rPr>
-        <w:t xml:space="preserve">            return i + 1            # requests until first alert</w:t>
+        <w:t xml:space="preserve">        counters, traces = collect(transport, n_traces)</w:t>
       </w:r>
     </w:p>
     <w:p>
@@ -12103,7 +13077,7 @@
           <w:color w:val="000000"/>
           <w:sz w:val="19"/>
         </w:rPr>
-        <w:t xml:space="preserve">    return None</w:t>
+        <w:t xml:space="preserve">        res = cpa.analyze(counters, traces)         # reuse attacker engine</w:t>
       </w:r>
     </w:p>
     <w:p>
@@ -12116,6 +13090,7 @@
           <w:color w:val="000000"/>
           <w:sz w:val="19"/>
         </w:rPr>
+        <w:t xml:space="preserve">        out[state] = { 'tvla_peak_t': tv['peak_t'], 'tvla_leaks': tv['leaks'],</w:t>
       </w:r>
     </w:p>
     <w:p>
@@ -12128,7 +13103,7 @@
           <w:color w:val="000000"/>
           <w:sz w:val="19"/>
         </w:rPr>
-        <w:t>def false_positive_rate(make_detector, trials=30):</w:t>
+        <w:t xml:space="preserve">                       'peak_corr': res['mean_peak_corr'], 'ntd': res['ntd'] }</w:t>
       </w:r>
     </w:p>
     <w:p>
@@ -12141,7 +13116,7 @@
           <w:color w:val="000000"/>
           <w:sz w:val="19"/>
         </w:rPr>
-        <w:t xml:space="preserve">    fp = 0</w:t>
+        <w:t xml:space="preserve">    transport.set_defense('masking', False)</w:t>
       </w:r>
     </w:p>
     <w:p>
@@ -12154,59 +13129,7 @@
           <w:color w:val="000000"/>
           <w:sz w:val="19"/>
         </w:rPr>
-        <w:t xml:space="preserve">    for s in range(trials):</w:t>
-      </w:r>
-    </w:p>
-    <w:p>
-      <w:pPr>
-        <w:spacing w:after="0" w:line="240" w:lineRule="auto"/>
-      </w:pPr>
-      <w:r>
-        <w:rPr>
-          <w:rFonts w:ascii="Consolas" w:hAnsi="Consolas"/>
-          <w:color w:val="000000"/>
-          <w:sz w:val="19"/>
-        </w:rPr>
-        <w:t xml:space="preserve">        det = make_detector()</w:t>
-      </w:r>
-    </w:p>
-    <w:p>
-      <w:pPr>
-        <w:spacing w:after="0" w:line="240" w:lineRule="auto"/>
-      </w:pPr>
-      <w:r>
-        <w:rPr>
-          <w:rFonts w:ascii="Consolas" w:hAnsi="Consolas"/>
-          <w:color w:val="000000"/>
-          <w:sz w:val="19"/>
-        </w:rPr>
-        <w:t xml:space="preserve">        simulate_normal_traffic(det, rng, n_events=40)</w:t>
-      </w:r>
-    </w:p>
-    <w:p>
-      <w:pPr>
-        <w:spacing w:after="0" w:line="240" w:lineRule="auto"/>
-      </w:pPr>
-      <w:r>
-        <w:rPr>
-          <w:rFonts w:ascii="Consolas" w:hAnsi="Consolas"/>
-          <w:color w:val="000000"/>
-          <w:sz w:val="19"/>
-        </w:rPr>
-        <w:t xml:space="preserve">        if det.check()['alert']: fp += 1</w:t>
-      </w:r>
-    </w:p>
-    <w:p>
-      <w:pPr>
-        <w:spacing w:after="0" w:line="240" w:lineRule="auto"/>
-      </w:pPr>
-      <w:r>
-        <w:rPr>
-          <w:rFonts w:ascii="Consolas" w:hAnsi="Consolas"/>
-          <w:color w:val="000000"/>
-          <w:sz w:val="19"/>
-        </w:rPr>
-        <w:t xml:space="preserve">    return fp / trials</w:t>
+        <w:t xml:space="preserve">    return summarize(out)                           # verdict + suppression</w:t>
       </w:r>
     </w:p>
     <w:p>
@@ -12225,7 +13148,7 @@
           <w:color w:val="000000"/>
           <w:sz w:val="28"/>
         </w:rPr>
-        <w:t>APPENDIX 14  TIMING ATTACK (HOST)</w:t>
+        <w:t>APPENDIX 12  UNIFIED DEMONSTRATION (HOST)</w:t>
       </w:r>
     </w:p>
     <w:p>
@@ -12238,7 +13161,7 @@
           <w:color w:val="000000"/>
           <w:sz w:val="19"/>
         </w:rPr>
-        <w:t>def recover_secret(transport, length, trials=40):</w:t>
+        <w:t>STEPS = [</w:t>
       </w:r>
     </w:p>
     <w:p>
@@ -12251,7 +13174,7 @@
           <w:color w:val="000000"/>
           <w:sz w:val="19"/>
         </w:rPr>
-        <w:t xml:space="preserve">    recovered = bytearray()</w:t>
+        <w:t xml:space="preserve">  ('ATTACKER  ChaCha20 power CPA',      'ct_attack.py cpa --traces 1500'),</w:t>
       </w:r>
     </w:p>
     <w:p>
@@ -12264,7 +13187,7 @@
           <w:color w:val="000000"/>
           <w:sz w:val="19"/>
         </w:rPr>
-        <w:t xml:space="preserve">    for pos in range(length):</w:t>
+        <w:t xml:space="preserve">  ('ATTACKER  full 256-bit recovery',   'chacha_full.py --traces 4000'),</w:t>
       </w:r>
     </w:p>
     <w:p>
@@ -12277,7 +13200,7 @@
           <w:color w:val="000000"/>
           <w:sz w:val="19"/>
         </w:rPr>
-        <w:t xml:space="preserve">        best_g, best_t = 0, -1</w:t>
+        <w:t xml:space="preserve">  ('ATTACKER  Kyber coefficient CPA',   'ct_attack.py kyber --traces 2500'),</w:t>
       </w:r>
     </w:p>
     <w:p>
@@ -12290,7 +13213,7 @@
           <w:color w:val="000000"/>
           <w:sz w:val="19"/>
         </w:rPr>
-        <w:t xml:space="preserve">        for g in range(256):</w:t>
+        <w:t xml:space="preserve">  ('ATTACKER  timing attack',           'ct_attack.py timing'),</w:t>
       </w:r>
     </w:p>
     <w:p>
@@ -12303,7 +13226,7 @@
           <w:color w:val="000000"/>
           <w:sz w:val="19"/>
         </w:rPr>
-        <w:t xml:space="preserve">            cand = bytes(recovered) + bytes([g]) + bytes(length-pos-1)</w:t>
+        <w:t xml:space="preserve">  ('ATTACKER  replay attack',           'ct_attack.py replay'),</w:t>
       </w:r>
     </w:p>
     <w:p>
@@ -12316,7 +13239,7 @@
           <w:color w:val="000000"/>
           <w:sz w:val="19"/>
         </w:rPr>
-        <w:t xml:space="preserve">            t = median(transport.check(cand)[1] for _ in range(trials))</w:t>
+        <w:t xml:space="preserve">  ('DEFENDER  ChaCha20 assessment',     'ct_defend.py assess --target chacha'),</w:t>
       </w:r>
     </w:p>
     <w:p>
@@ -12329,7 +13252,7 @@
           <w:color w:val="000000"/>
           <w:sz w:val="19"/>
         </w:rPr>
-        <w:t xml:space="preserve">            if t &gt; best_t: best_t, best_g = t, g   # longest = correct prefix</w:t>
+        <w:t xml:space="preserve">  ('DEFENDER  Kyber assessment',        'ct_defend.py assess --target kyber'),</w:t>
       </w:r>
     </w:p>
     <w:p>
@@ -12342,7 +13265,7 @@
           <w:color w:val="000000"/>
           <w:sz w:val="19"/>
         </w:rPr>
-        <w:t xml:space="preserve">        recovered.append(best_g)</w:t>
+        <w:t xml:space="preserve">  ('DEFENDER  probing analytics',       'ct_defend.py monitor'),</w:t>
       </w:r>
     </w:p>
     <w:p>
@@ -12355,7 +13278,33 @@
           <w:color w:val="000000"/>
           <w:sz w:val="19"/>
         </w:rPr>
-        <w:t xml:space="preserve">    return bytes(recovered)   # last byte indistinguishable (known artifact)</w:t>
+        <w:t>]</w:t>
+      </w:r>
+    </w:p>
+    <w:p>
+      <w:pPr>
+        <w:spacing w:after="0" w:line="240" w:lineRule="auto"/>
+      </w:pPr>
+      <w:r>
+        <w:rPr>
+          <w:rFonts w:ascii="Consolas" w:hAnsi="Consolas"/>
+          <w:color w:val="000000"/>
+          <w:sz w:val="19"/>
+        </w:rPr>
+        <w:t>for title, cmd in STEPS:        # one command reproduces every result</w:t>
+      </w:r>
+    </w:p>
+    <w:p>
+      <w:pPr>
+        <w:spacing w:after="0" w:line="240" w:lineRule="auto"/>
+      </w:pPr>
+      <w:r>
+        <w:rPr>
+          <w:rFonts w:ascii="Consolas" w:hAnsi="Consolas"/>
+          <w:color w:val="000000"/>
+          <w:sz w:val="19"/>
+        </w:rPr>
+        <w:t xml:space="preserve">    print('#', title); run(cmd)   # add --hw to drive the real device</w:t>
       </w:r>
     </w:p>
     <w:p>
@@ -12374,6 +13323,368 @@
           <w:color w:val="000000"/>
           <w:sz w:val="28"/>
         </w:rPr>
+        <w:t>APPENDIX 13  PROBING MONITOR ANALYTICS (DEFENDER)</w:t>
+      </w:r>
+    </w:p>
+    <w:p>
+      <w:pPr>
+        <w:spacing w:after="0" w:line="240" w:lineRule="auto"/>
+      </w:pPr>
+      <w:r>
+        <w:rPr>
+          <w:rFonts w:ascii="Consolas" w:hAnsi="Consolas"/>
+          <w:color w:val="000000"/>
+          <w:sz w:val="19"/>
+        </w:rPr>
+        <w:t>def detection_latency(make_detector, simulate, max_events=250):</w:t>
+      </w:r>
+    </w:p>
+    <w:p>
+      <w:pPr>
+        <w:spacing w:after="0" w:line="240" w:lineRule="auto"/>
+      </w:pPr>
+      <w:r>
+        <w:rPr>
+          <w:rFonts w:ascii="Consolas" w:hAnsi="Consolas"/>
+          <w:color w:val="000000"/>
+          <w:sz w:val="19"/>
+        </w:rPr>
+        <w:t xml:space="preserve">    det = make_detector(); t = 0.0</w:t>
+      </w:r>
+    </w:p>
+    <w:p>
+      <w:pPr>
+        <w:spacing w:after="0" w:line="240" w:lineRule="auto"/>
+      </w:pPr>
+      <w:r>
+        <w:rPr>
+          <w:rFonts w:ascii="Consolas" w:hAnsi="Consolas"/>
+          <w:color w:val="000000"/>
+          <w:sz w:val="19"/>
+        </w:rPr>
+        <w:t xml:space="preserve">    for i in range(max_events):</w:t>
+      </w:r>
+    </w:p>
+    <w:p>
+      <w:pPr>
+        <w:spacing w:after="0" w:line="240" w:lineRule="auto"/>
+      </w:pPr>
+      <w:r>
+        <w:rPr>
+          <w:rFonts w:ascii="Consolas" w:hAnsi="Consolas"/>
+          <w:color w:val="000000"/>
+          <w:sz w:val="19"/>
+        </w:rPr>
+        <w:t xml:space="preserve">        t = simulate(det, rng, n_events=1, base_time=t)  # one request at a time</w:t>
+      </w:r>
+    </w:p>
+    <w:p>
+      <w:pPr>
+        <w:spacing w:after="0" w:line="240" w:lineRule="auto"/>
+      </w:pPr>
+      <w:r>
+        <w:rPr>
+          <w:rFonts w:ascii="Consolas" w:hAnsi="Consolas"/>
+          <w:color w:val="000000"/>
+          <w:sz w:val="19"/>
+        </w:rPr>
+        <w:t xml:space="preserve">        if det.check()['alert']:</w:t>
+      </w:r>
+    </w:p>
+    <w:p>
+      <w:pPr>
+        <w:spacing w:after="0" w:line="240" w:lineRule="auto"/>
+      </w:pPr>
+      <w:r>
+        <w:rPr>
+          <w:rFonts w:ascii="Consolas" w:hAnsi="Consolas"/>
+          <w:color w:val="000000"/>
+          <w:sz w:val="19"/>
+        </w:rPr>
+        <w:t xml:space="preserve">            return i + 1            # requests until first alert</w:t>
+      </w:r>
+    </w:p>
+    <w:p>
+      <w:pPr>
+        <w:spacing w:after="0" w:line="240" w:lineRule="auto"/>
+      </w:pPr>
+      <w:r>
+        <w:rPr>
+          <w:rFonts w:ascii="Consolas" w:hAnsi="Consolas"/>
+          <w:color w:val="000000"/>
+          <w:sz w:val="19"/>
+        </w:rPr>
+        <w:t xml:space="preserve">    return None</w:t>
+      </w:r>
+    </w:p>
+    <w:p>
+      <w:pPr>
+        <w:spacing w:after="0" w:line="240" w:lineRule="auto"/>
+      </w:pPr>
+      <w:r>
+        <w:rPr>
+          <w:rFonts w:ascii="Consolas" w:hAnsi="Consolas"/>
+          <w:color w:val="000000"/>
+          <w:sz w:val="19"/>
+        </w:rPr>
+      </w:r>
+    </w:p>
+    <w:p>
+      <w:pPr>
+        <w:spacing w:after="0" w:line="240" w:lineRule="auto"/>
+      </w:pPr>
+      <w:r>
+        <w:rPr>
+          <w:rFonts w:ascii="Consolas" w:hAnsi="Consolas"/>
+          <w:color w:val="000000"/>
+          <w:sz w:val="19"/>
+        </w:rPr>
+        <w:t>def false_positive_rate(make_detector, trials=30):</w:t>
+      </w:r>
+    </w:p>
+    <w:p>
+      <w:pPr>
+        <w:spacing w:after="0" w:line="240" w:lineRule="auto"/>
+      </w:pPr>
+      <w:r>
+        <w:rPr>
+          <w:rFonts w:ascii="Consolas" w:hAnsi="Consolas"/>
+          <w:color w:val="000000"/>
+          <w:sz w:val="19"/>
+        </w:rPr>
+        <w:t xml:space="preserve">    fp = 0</w:t>
+      </w:r>
+    </w:p>
+    <w:p>
+      <w:pPr>
+        <w:spacing w:after="0" w:line="240" w:lineRule="auto"/>
+      </w:pPr>
+      <w:r>
+        <w:rPr>
+          <w:rFonts w:ascii="Consolas" w:hAnsi="Consolas"/>
+          <w:color w:val="000000"/>
+          <w:sz w:val="19"/>
+        </w:rPr>
+        <w:t xml:space="preserve">    for s in range(trials):</w:t>
+      </w:r>
+    </w:p>
+    <w:p>
+      <w:pPr>
+        <w:spacing w:after="0" w:line="240" w:lineRule="auto"/>
+      </w:pPr>
+      <w:r>
+        <w:rPr>
+          <w:rFonts w:ascii="Consolas" w:hAnsi="Consolas"/>
+          <w:color w:val="000000"/>
+          <w:sz w:val="19"/>
+        </w:rPr>
+        <w:t xml:space="preserve">        det = make_detector()</w:t>
+      </w:r>
+    </w:p>
+    <w:p>
+      <w:pPr>
+        <w:spacing w:after="0" w:line="240" w:lineRule="auto"/>
+      </w:pPr>
+      <w:r>
+        <w:rPr>
+          <w:rFonts w:ascii="Consolas" w:hAnsi="Consolas"/>
+          <w:color w:val="000000"/>
+          <w:sz w:val="19"/>
+        </w:rPr>
+        <w:t xml:space="preserve">        simulate_normal_traffic(det, rng, n_events=40)</w:t>
+      </w:r>
+    </w:p>
+    <w:p>
+      <w:pPr>
+        <w:spacing w:after="0" w:line="240" w:lineRule="auto"/>
+      </w:pPr>
+      <w:r>
+        <w:rPr>
+          <w:rFonts w:ascii="Consolas" w:hAnsi="Consolas"/>
+          <w:color w:val="000000"/>
+          <w:sz w:val="19"/>
+        </w:rPr>
+        <w:t xml:space="preserve">        if det.check()['alert']: fp += 1</w:t>
+      </w:r>
+    </w:p>
+    <w:p>
+      <w:pPr>
+        <w:spacing w:after="0" w:line="240" w:lineRule="auto"/>
+      </w:pPr>
+      <w:r>
+        <w:rPr>
+          <w:rFonts w:ascii="Consolas" w:hAnsi="Consolas"/>
+          <w:color w:val="000000"/>
+          <w:sz w:val="19"/>
+        </w:rPr>
+        <w:t xml:space="preserve">    return fp / trials</w:t>
+      </w:r>
+    </w:p>
+    <w:p>
+      <w:pPr>
+        <w:spacing w:after="160"/>
+      </w:pPr>
+    </w:p>
+    <w:p>
+      <w:pPr>
+        <w:pStyle w:val="Heading2"/>
+      </w:pPr>
+      <w:r>
+        <w:rPr>
+          <w:rFonts w:ascii="Times New Roman" w:hAnsi="Times New Roman"/>
+          <w:b/>
+          <w:color w:val="000000"/>
+          <w:sz w:val="28"/>
+        </w:rPr>
+        <w:t>APPENDIX 14  TIMING ATTACK (HOST)</w:t>
+      </w:r>
+    </w:p>
+    <w:p>
+      <w:pPr>
+        <w:spacing w:after="0" w:line="240" w:lineRule="auto"/>
+      </w:pPr>
+      <w:r>
+        <w:rPr>
+          <w:rFonts w:ascii="Consolas" w:hAnsi="Consolas"/>
+          <w:color w:val="000000"/>
+          <w:sz w:val="19"/>
+        </w:rPr>
+        <w:t>def recover_secret(transport, length, trials=40):</w:t>
+      </w:r>
+    </w:p>
+    <w:p>
+      <w:pPr>
+        <w:spacing w:after="0" w:line="240" w:lineRule="auto"/>
+      </w:pPr>
+      <w:r>
+        <w:rPr>
+          <w:rFonts w:ascii="Consolas" w:hAnsi="Consolas"/>
+          <w:color w:val="000000"/>
+          <w:sz w:val="19"/>
+        </w:rPr>
+        <w:t xml:space="preserve">    recovered = bytearray()</w:t>
+      </w:r>
+    </w:p>
+    <w:p>
+      <w:pPr>
+        <w:spacing w:after="0" w:line="240" w:lineRule="auto"/>
+      </w:pPr>
+      <w:r>
+        <w:rPr>
+          <w:rFonts w:ascii="Consolas" w:hAnsi="Consolas"/>
+          <w:color w:val="000000"/>
+          <w:sz w:val="19"/>
+        </w:rPr>
+        <w:t xml:space="preserve">    for pos in range(length):</w:t>
+      </w:r>
+    </w:p>
+    <w:p>
+      <w:pPr>
+        <w:spacing w:after="0" w:line="240" w:lineRule="auto"/>
+      </w:pPr>
+      <w:r>
+        <w:rPr>
+          <w:rFonts w:ascii="Consolas" w:hAnsi="Consolas"/>
+          <w:color w:val="000000"/>
+          <w:sz w:val="19"/>
+        </w:rPr>
+        <w:t xml:space="preserve">        best_g, best_t = 0, -1</w:t>
+      </w:r>
+    </w:p>
+    <w:p>
+      <w:pPr>
+        <w:spacing w:after="0" w:line="240" w:lineRule="auto"/>
+      </w:pPr>
+      <w:r>
+        <w:rPr>
+          <w:rFonts w:ascii="Consolas" w:hAnsi="Consolas"/>
+          <w:color w:val="000000"/>
+          <w:sz w:val="19"/>
+        </w:rPr>
+        <w:t xml:space="preserve">        for g in range(256):</w:t>
+      </w:r>
+    </w:p>
+    <w:p>
+      <w:pPr>
+        <w:spacing w:after="0" w:line="240" w:lineRule="auto"/>
+      </w:pPr>
+      <w:r>
+        <w:rPr>
+          <w:rFonts w:ascii="Consolas" w:hAnsi="Consolas"/>
+          <w:color w:val="000000"/>
+          <w:sz w:val="19"/>
+        </w:rPr>
+        <w:t xml:space="preserve">            cand = bytes(recovered) + bytes([g]) + bytes(length-pos-1)</w:t>
+      </w:r>
+    </w:p>
+    <w:p>
+      <w:pPr>
+        <w:spacing w:after="0" w:line="240" w:lineRule="auto"/>
+      </w:pPr>
+      <w:r>
+        <w:rPr>
+          <w:rFonts w:ascii="Consolas" w:hAnsi="Consolas"/>
+          <w:color w:val="000000"/>
+          <w:sz w:val="19"/>
+        </w:rPr>
+        <w:t xml:space="preserve">            t = median(transport.check(cand)[1] for _ in range(trials))</w:t>
+      </w:r>
+    </w:p>
+    <w:p>
+      <w:pPr>
+        <w:spacing w:after="0" w:line="240" w:lineRule="auto"/>
+      </w:pPr>
+      <w:r>
+        <w:rPr>
+          <w:rFonts w:ascii="Consolas" w:hAnsi="Consolas"/>
+          <w:color w:val="000000"/>
+          <w:sz w:val="19"/>
+        </w:rPr>
+        <w:t xml:space="preserve">            if t &gt; best_t: best_t, best_g = t, g   # longest = correct prefix</w:t>
+      </w:r>
+    </w:p>
+    <w:p>
+      <w:pPr>
+        <w:spacing w:after="0" w:line="240" w:lineRule="auto"/>
+      </w:pPr>
+      <w:r>
+        <w:rPr>
+          <w:rFonts w:ascii="Consolas" w:hAnsi="Consolas"/>
+          <w:color w:val="000000"/>
+          <w:sz w:val="19"/>
+        </w:rPr>
+        <w:t xml:space="preserve">        recovered.append(best_g)</w:t>
+      </w:r>
+    </w:p>
+    <w:p>
+      <w:pPr>
+        <w:spacing w:after="0" w:line="240" w:lineRule="auto"/>
+      </w:pPr>
+      <w:r>
+        <w:rPr>
+          <w:rFonts w:ascii="Consolas" w:hAnsi="Consolas"/>
+          <w:color w:val="000000"/>
+          <w:sz w:val="19"/>
+        </w:rPr>
+        <w:t xml:space="preserve">    return bytes(recovered)   # last byte indistinguishable (known artifact)</w:t>
+      </w:r>
+    </w:p>
+    <w:p>
+      <w:pPr>
+        <w:spacing w:after="160"/>
+      </w:pPr>
+    </w:p>
+    <w:p>
+      <w:pPr>
+        <w:pStyle w:val="Heading2"/>
+      </w:pPr>
+      <w:r>
+        <w:rPr>
+          <w:rFonts w:ascii="Times New Roman" w:hAnsi="Times New Roman"/>
+          <w:b/>
+          <w:color w:val="000000"/>
+          <w:sz w:val="28"/>
+        </w:rPr>
         <w:t>APPENDIX 15  COMMAND DISPATCH (FIRMWARE)</w:t>
       </w:r>
     </w:p>
@@ -12576,6 +13887,139 @@
       <w:pPr>
         <w:spacing w:after="160"/>
       </w:pPr>
+    </w:p>
+    <w:p>
+      <w:pPr>
+        <w:pStyle w:val="Heading2"/>
+      </w:pPr>
+      <w:r>
+        <w:rPr>
+          <w:rFonts w:ascii="Times New Roman" w:hAnsi="Times New Roman"/>
+          <w:b/>
+          <w:color w:val="000000"/>
+          <w:sz w:val="28"/>
+        </w:rPr>
+        <w:t>APPENDIX 16  HARDWARE BRING-UP AND VERIFICATION LOG</w:t>
+      </w:r>
+    </w:p>
+    <w:p>
+      <w:pPr>
+        <w:spacing w:after="160"/>
+        <w:jc w:val="both"/>
+      </w:pPr>
+      <w:r>
+        <w:rPr>
+          <w:rFonts w:ascii="Times New Roman" w:hAnsi="Times New Roman" w:eastAsia="Times New Roman"/>
+          <w:b w:val="0"/>
+          <w:i w:val="0"/>
+          <w:color w:val="000000"/>
+          <w:sz w:val="24"/>
+          <w:u w:val="none"/>
+        </w:rPr>
+        <w:t>The following is the procedure followed each time the hardware was brought up, recorded here so that the physical results can be reproduced. It is the sequence that produced the measurements of Chapter 5.</w:t>
+      </w:r>
+    </w:p>
+    <w:p>
+      <w:pPr>
+        <w:spacing w:after="160"/>
+        <w:jc w:val="both"/>
+      </w:pPr>
+      <w:r>
+        <w:rPr>
+          <w:rFonts w:ascii="Times New Roman" w:hAnsi="Times New Roman" w:eastAsia="Times New Roman"/>
+          <w:b w:val="0"/>
+          <w:i w:val="0"/>
+          <w:color w:val="000000"/>
+          <w:sz w:val="24"/>
+          <w:u w:val="none"/>
+        </w:rPr>
+        <w:t>1. Flash the two devices over the programming connection: the cryptographic target with the attack firmware and the second board with the noise-injection firmware. The target then enumerates and responds, confirming the write.</w:t>
+      </w:r>
+    </w:p>
+    <w:p>
+      <w:pPr>
+        <w:spacing w:after="160"/>
+        <w:jc w:val="both"/>
+      </w:pPr>
+      <w:r>
+        <w:rPr>
+          <w:rFonts w:ascii="Times New Roman" w:hAnsi="Times New Roman" w:eastAsia="Times New Roman"/>
+          <w:b w:val="0"/>
+          <w:i w:val="0"/>
+          <w:color w:val="000000"/>
+          <w:sz w:val="24"/>
+          <w:u w:val="none"/>
+        </w:rPr>
+        <w:t>2. Verify the analog-to-digital converter on the serial bus. The converter acknowledges at its address, and a read of each single-ended channel together with the differential channel returns sane voltages, confirming the device is alive before any trace is taken.</w:t>
+      </w:r>
+    </w:p>
+    <w:p>
+      <w:pPr>
+        <w:spacing w:after="160"/>
+        <w:jc w:val="both"/>
+      </w:pPr>
+      <w:r>
+        <w:rPr>
+          <w:rFonts w:ascii="Times New Roman" w:hAnsi="Times New Roman" w:eastAsia="Times New Roman"/>
+          <w:b w:val="0"/>
+          <w:i w:val="0"/>
+          <w:color w:val="000000"/>
+          <w:sz w:val="24"/>
+          <w:u w:val="none"/>
+        </w:rPr>
+        <w:t>3. Verify the command interface over the dedicated serial link. A LEAKLOOP request returns the completion token, and a CHECK request carrying the known authentication secret returns the acceptance token, confirming that the host is talking to the correct firmware and that the secret under test is the expected one.</w:t>
+      </w:r>
+    </w:p>
+    <w:p>
+      <w:pPr>
+        <w:spacing w:after="160"/>
+        <w:jc w:val="both"/>
+      </w:pPr>
+      <w:r>
+        <w:rPr>
+          <w:rFonts w:ascii="Times New Roman" w:hAnsi="Times New Roman" w:eastAsia="Times New Roman"/>
+          <w:b w:val="0"/>
+          <w:i w:val="0"/>
+          <w:color w:val="000000"/>
+          <w:sz w:val="24"/>
+          <w:u w:val="none"/>
+        </w:rPr>
+        <w:t>4. Remove the programming cable from the target so that its entire supply current is forced through the shunt, and confirm the baseline on the differential channel rises to its full value of about seven hundred and sixty millivolts. A baseline of only a few millivolts indicates the cable is still supplying the device and the collection must not proceed.</w:t>
+      </w:r>
+    </w:p>
+    <w:p>
+      <w:pPr>
+        <w:spacing w:after="160"/>
+        <w:jc w:val="both"/>
+      </w:pPr>
+      <w:r>
+        <w:rPr>
+          <w:rFonts w:ascii="Times New Roman" w:hAnsi="Times New Roman" w:eastAsia="Times New Roman"/>
+          <w:b w:val="0"/>
+          <w:i w:val="0"/>
+          <w:color w:val="000000"/>
+          <w:sz w:val="24"/>
+          <w:u w:val="none"/>
+        </w:rPr>
+        <w:t>5. Collect. The attacker program issues the amplified-leakage requests and records the converter output per request; the defender program toggles the countermeasures and runs the leakage assessment. Each result is written to a file and, for the power attacks, to a figure, and the raw traces are archived so the analysis can be repeated without the device.</w:t>
+      </w:r>
+    </w:p>
+    <w:p>
+      <w:pPr>
+        <w:spacing w:after="160"/>
+        <w:jc w:val="both"/>
+      </w:pPr>
+      <w:r>
+        <w:rPr>
+          <w:rFonts w:ascii="Times New Roman" w:hAnsi="Times New Roman" w:eastAsia="Times New Roman"/>
+          <w:b w:val="0"/>
+          <w:i w:val="0"/>
+          <w:color w:val="000000"/>
+          <w:sz w:val="24"/>
+          <w:u w:val="none"/>
+        </w:rPr>
+        <w:t>The measured outcomes of this procedure are those reported in Chapter 5: the ChaCha20 key word recovered from about a few hundred traces at a correlation near one third; masking effective on ChaCha20 and, as a documented negative result, ineffective on Kyber as currently implemented; the Kyber coefficient recovered on the device; the timing attack unresolved over the serial link; and replay accepted without a nonce and blocked with one.</w:t>
+      </w:r>
     </w:p>
     <w:sectPr>
       <w:footerReference w:type="default" r:id="rId11"/>

</xml_diff>

<commit_message>
Fill guide name and lead author registration number
Set the project guide to Dr. Benila S across the acknowledgement,
declaration, and certificate, and fill Satvik Jindal's registration number
(23BPS1123) on the cover and certificate.
</commit_message>
<xml_diff>
--- a/report/CyberTrace_Project_Report.docx
+++ b/report/CyberTrace_Project_Report.docx
@@ -11,7 +11,7 @@
           <w:noProof/>
         </w:rPr>
         <w:drawing>
-          <wp:inline distT="0" distB="0" distL="0" distR="0" wp14:anchorId="7B35D3F0" wp14:editId="5B109420">
+          <wp:inline distT="0" distB="0" distL="0" distR="0" wp14:anchorId="360640D3" wp14:editId="28F1B86B">
             <wp:extent cx="2560320" cy="816494"/>
             <wp:effectExtent l="0" t="0" r="0" b="0"/>
             <wp:docPr id="1" name="Picture 1"/>
@@ -125,7 +125,7 @@
           <w:b/>
           <w:sz w:val="30"/>
         </w:rPr>
-        <w:t>SATVIK JINDAL (Reg. No.: __________)</w:t>
+        <w:t>SATVIK JINDAL (Reg. No.: 23BPS1123)</w:t>
       </w:r>
     </w:p>
     <w:p>
@@ -205,7 +205,7 @@
         <w:jc w:val="both"/>
       </w:pPr>
       <w:r>
-        <w:t>We hereby declare that the project report entitled “CyberTrace: A Multi-Vector Side-Channel Attack and Defense Framework for Embedded Cyber-Physical Systems” submitted by us to the School of Computer Science and Engineering, Vellore Institute of Technology, Chennai, for the award of the degree of Bachelor of Technology in Computer Science and Engineering (Cyber Physical Systems), is a record of bonafide work carried out by us under the supervision of [GUIDE NAME].</w:t>
+        <w:t>We hereby declare that the project report entitled “CyberTrace: A Multi-Vector Side-Channel Attack and Defense Framework for Embedded Cyber-Physical Systems” submitted by us to the School of Computer Science and Engineering, Vellore Institute of Technology, Chennai, for the award of the degree of Bachelor of Technology in Computer Science and Engineering (Cyber Physical Systems), is a record of bonafide work carried out by us under the supervision of Dr. Benila S.</w:t>
       </w:r>
     </w:p>
     <w:p>
@@ -320,10 +320,10 @@
         <w:jc w:val="both"/>
       </w:pPr>
       <w:r>
-        <w:t>This is to certify that the report entitled “CyberTrace: A Multi-Vector Side-Channel Attack and Defense Framework for Embedded Cyber-Physical Systems” is prepared and submitted by Satvik Jindal (Reg. No.: __________), Sushrut Koundinya (Reg. No.: 23BPS1036) and Lakshay Tomar (Reg. No.: 23BPS1177) to Vellore Institute of Technology, Chennai, in partial fulfillment of the requirement for the award of the degree of Bachelor of Technology in Computer Science and Engineering (Cyber Physical Systems) is a bonafid</w:t>
-      </w:r>
-      <w:r>
-        <w:t>e record carried out under my guidance. The project fulfills the requirements as per the regulations of this University and in my opinion meets the necessary standards for submission. The contents of this report have not been submitted and will not be submitted either in part or in full, for the award of any other degree or diploma and the same is certified.</w:t>
+        <w:t>This is to certify that the report entitled “CyberTrace: A Multi-Vector Side-Channel Attack and Defense Framework for Embedded Cyber-Physical Systems” is prepared and submitted by Satvik Jindal (Reg. No.: 23BPS1123), Sushrut Koundinya (Reg. No.: 23BPS1036) and Lakshay Tomar (Reg. No.: 23BPS1177) to Vellore Institute of Technology, Chennai, in partial fulfillment of the requirement for the award of the degree of Bachelor of Technology in Computer Science and Engineering (Cyber Physical Systems) is a bonafide</w:t>
+      </w:r>
+      <w:r>
+        <w:t xml:space="preserve"> record carried out under my guidance. The project fulfills the requirements as per the regulations of this University and in my opinion meets the necessary standards for submission. The contents of this report have not been submitted and will not be submitted either in part or in full, for the award of any other degree or diploma and the same is certified.</w:t>
       </w:r>
     </w:p>
     <w:p>
@@ -339,7 +339,7 @@
         <w:spacing w:after="120"/>
       </w:pPr>
       <w:r>
-        <w:t>Name: Dr./Prof. [GUIDE NAME]</w:t>
+        <w:t>Name: Dr. Benila S</w:t>
       </w:r>
     </w:p>
     <w:p>
@@ -521,7 +521,7 @@
         <w:jc w:val="both"/>
       </w:pPr>
       <w:r>
-        <w:t>It is our pleasure to express with a deep sense of gratitude to our project guide, [GUIDE NAME], [Designation], School of Computer Science and Engineering, Vellore Institute of Technology, Chennai, for the constant guidance, continual encouragement, and understanding; more than all, for teaching us patience throughout our endeavor. Our association with the guide is not confined to academics alone, but has been a great opportunity to work with an intellectual and an expert in the field of hardware security a</w:t>
+        <w:t>It is our pleasure to express with a deep sense of gratitude to our project guide, Dr. Benila S, [Designation], School of Computer Science and Engineering, Vellore Institute of Technology, Chennai, for the constant guidance, continual encouragement, and understanding; more than all, for teaching us patience throughout our endeavor. Our association with the guide is not confined to academics alone, but has been a great opportunity to work with an intellectual and an expert in the field of hardware security a</w:t>
       </w:r>
       <w:r>
         <w:t>nd cryptography.</w:t>
@@ -666,7 +666,7 @@
       <w:r>
         <w:fldChar w:fldCharType="separate"/>
       </w:r>
-      <w:hyperlink w:anchor="_Toc243064973" w:history="1">
+      <w:hyperlink w:anchor="_Toc243065331" w:history="1">
         <w:r>
           <w:rPr>
             <w:rStyle w:val="Hyperlink"/>
@@ -693,7 +693,7 @@
             <w:noProof/>
             <w:webHidden/>
           </w:rPr>
-          <w:instrText xml:space="preserve"> PAGEREF _Toc243064973 \h </w:instrText>
+          <w:instrText xml:space="preserve"> PAGEREF _Toc243065331 \h </w:instrText>
         </w:r>
         <w:r>
           <w:rPr>
@@ -740,7 +740,7 @@
           <w14:ligatures w14:val="standardContextual"/>
         </w:rPr>
       </w:pPr>
-      <w:hyperlink w:anchor="_Toc243064974" w:history="1">
+      <w:hyperlink w:anchor="_Toc243065332" w:history="1">
         <w:r>
           <w:rPr>
             <w:rStyle w:val="Hyperlink"/>
@@ -767,7 +767,7 @@
             <w:noProof/>
             <w:webHidden/>
           </w:rPr>
-          <w:instrText xml:space="preserve"> PAGEREF _Toc243064974 \h </w:instrText>
+          <w:instrText xml:space="preserve"> PAGEREF _Toc243065332 \h </w:instrText>
         </w:r>
         <w:r>
           <w:rPr>
@@ -814,7 +814,7 @@
           <w14:ligatures w14:val="standardContextual"/>
         </w:rPr>
       </w:pPr>
-      <w:hyperlink w:anchor="_Toc243064975" w:history="1">
+      <w:hyperlink w:anchor="_Toc243065333" w:history="1">
         <w:r>
           <w:rPr>
             <w:rStyle w:val="Hyperlink"/>
@@ -841,7 +841,7 @@
             <w:noProof/>
             <w:webHidden/>
           </w:rPr>
-          <w:instrText xml:space="preserve"> PAGEREF _Toc243064975 \h </w:instrText>
+          <w:instrText xml:space="preserve"> PAGEREF _Toc243065333 \h </w:instrText>
         </w:r>
         <w:r>
           <w:rPr>
@@ -888,7 +888,7 @@
           <w14:ligatures w14:val="standardContextual"/>
         </w:rPr>
       </w:pPr>
-      <w:hyperlink w:anchor="_Toc243064976" w:history="1">
+      <w:hyperlink w:anchor="_Toc243065334" w:history="1">
         <w:r>
           <w:rPr>
             <w:rStyle w:val="Hyperlink"/>
@@ -915,7 +915,7 @@
             <w:noProof/>
             <w:webHidden/>
           </w:rPr>
-          <w:instrText xml:space="preserve"> PAGEREF _Toc243064976 \h </w:instrText>
+          <w:instrText xml:space="preserve"> PAGEREF _Toc243065334 \h </w:instrText>
         </w:r>
         <w:r>
           <w:rPr>
@@ -962,7 +962,7 @@
           <w14:ligatures w14:val="standardContextual"/>
         </w:rPr>
       </w:pPr>
-      <w:hyperlink w:anchor="_Toc243064977" w:history="1">
+      <w:hyperlink w:anchor="_Toc243065335" w:history="1">
         <w:r>
           <w:rPr>
             <w:rStyle w:val="Hyperlink"/>
@@ -989,7 +989,7 @@
             <w:noProof/>
             <w:webHidden/>
           </w:rPr>
-          <w:instrText xml:space="preserve"> PAGEREF _Toc243064977 \h </w:instrText>
+          <w:instrText xml:space="preserve"> PAGEREF _Toc243065335 \h </w:instrText>
         </w:r>
         <w:r>
           <w:rPr>
@@ -1036,7 +1036,7 @@
           <w14:ligatures w14:val="standardContextual"/>
         </w:rPr>
       </w:pPr>
-      <w:hyperlink w:anchor="_Toc243064978" w:history="1">
+      <w:hyperlink w:anchor="_Toc243065336" w:history="1">
         <w:r>
           <w:rPr>
             <w:rStyle w:val="Hyperlink"/>
@@ -1063,7 +1063,7 @@
             <w:noProof/>
             <w:webHidden/>
           </w:rPr>
-          <w:instrText xml:space="preserve"> PAGEREF _Toc243064978 \h </w:instrText>
+          <w:instrText xml:space="preserve"> PAGEREF _Toc243065336 \h </w:instrText>
         </w:r>
         <w:r>
           <w:rPr>
@@ -1110,7 +1110,7 @@
           <w14:ligatures w14:val="standardContextual"/>
         </w:rPr>
       </w:pPr>
-      <w:hyperlink w:anchor="_Toc243064979" w:history="1">
+      <w:hyperlink w:anchor="_Toc243065337" w:history="1">
         <w:r>
           <w:rPr>
             <w:rStyle w:val="Hyperlink"/>
@@ -1137,7 +1137,7 @@
             <w:noProof/>
             <w:webHidden/>
           </w:rPr>
-          <w:instrText xml:space="preserve"> PAGEREF _Toc243064979 \h </w:instrText>
+          <w:instrText xml:space="preserve"> PAGEREF _Toc243065337 \h </w:instrText>
         </w:r>
         <w:r>
           <w:rPr>
@@ -1184,7 +1184,7 @@
           <w14:ligatures w14:val="standardContextual"/>
         </w:rPr>
       </w:pPr>
-      <w:hyperlink w:anchor="_Toc243064980" w:history="1">
+      <w:hyperlink w:anchor="_Toc243065338" w:history="1">
         <w:r>
           <w:rPr>
             <w:rStyle w:val="Hyperlink"/>
@@ -1211,7 +1211,7 @@
             <w:noProof/>
             <w:webHidden/>
           </w:rPr>
-          <w:instrText xml:space="preserve"> PAGEREF _Toc243064980 \h </w:instrText>
+          <w:instrText xml:space="preserve"> PAGEREF _Toc243065338 \h </w:instrText>
         </w:r>
         <w:r>
           <w:rPr>
@@ -1258,7 +1258,7 @@
           <w14:ligatures w14:val="standardContextual"/>
         </w:rPr>
       </w:pPr>
-      <w:hyperlink w:anchor="_Toc243064981" w:history="1">
+      <w:hyperlink w:anchor="_Toc243065339" w:history="1">
         <w:r>
           <w:rPr>
             <w:rStyle w:val="Hyperlink"/>
@@ -1285,7 +1285,7 @@
             <w:noProof/>
             <w:webHidden/>
           </w:rPr>
-          <w:instrText xml:space="preserve"> PAGEREF _Toc243064981 \h </w:instrText>
+          <w:instrText xml:space="preserve"> PAGEREF _Toc243065339 \h </w:instrText>
         </w:r>
         <w:r>
           <w:rPr>
@@ -1332,7 +1332,7 @@
           <w14:ligatures w14:val="standardContextual"/>
         </w:rPr>
       </w:pPr>
-      <w:hyperlink w:anchor="_Toc243064982" w:history="1">
+      <w:hyperlink w:anchor="_Toc243065340" w:history="1">
         <w:r>
           <w:rPr>
             <w:rStyle w:val="Hyperlink"/>
@@ -1359,7 +1359,7 @@
             <w:noProof/>
             <w:webHidden/>
           </w:rPr>
-          <w:instrText xml:space="preserve"> PAGEREF _Toc243064982 \h </w:instrText>
+          <w:instrText xml:space="preserve"> PAGEREF _Toc243065340 \h </w:instrText>
         </w:r>
         <w:r>
           <w:rPr>
@@ -1406,7 +1406,7 @@
           <w14:ligatures w14:val="standardContextual"/>
         </w:rPr>
       </w:pPr>
-      <w:hyperlink w:anchor="_Toc243064983" w:history="1">
+      <w:hyperlink w:anchor="_Toc243065341" w:history="1">
         <w:r>
           <w:rPr>
             <w:rStyle w:val="Hyperlink"/>
@@ -1433,7 +1433,7 @@
             <w:noProof/>
             <w:webHidden/>
           </w:rPr>
-          <w:instrText xml:space="preserve"> PAGEREF _Toc243064983 \h </w:instrText>
+          <w:instrText xml:space="preserve"> PAGEREF _Toc243065341 \h </w:instrText>
         </w:r>
         <w:r>
           <w:rPr>
@@ -1480,7 +1480,7 @@
           <w14:ligatures w14:val="standardContextual"/>
         </w:rPr>
       </w:pPr>
-      <w:hyperlink w:anchor="_Toc243064984" w:history="1">
+      <w:hyperlink w:anchor="_Toc243065342" w:history="1">
         <w:r>
           <w:rPr>
             <w:rStyle w:val="Hyperlink"/>
@@ -1507,7 +1507,7 @@
             <w:noProof/>
             <w:webHidden/>
           </w:rPr>
-          <w:instrText xml:space="preserve"> PAGEREF _Toc243064984 \h </w:instrText>
+          <w:instrText xml:space="preserve"> PAGEREF _Toc243065342 \h </w:instrText>
         </w:r>
         <w:r>
           <w:rPr>
@@ -1554,7 +1554,7 @@
           <w14:ligatures w14:val="standardContextual"/>
         </w:rPr>
       </w:pPr>
-      <w:hyperlink w:anchor="_Toc243064985" w:history="1">
+      <w:hyperlink w:anchor="_Toc243065343" w:history="1">
         <w:r>
           <w:rPr>
             <w:rStyle w:val="Hyperlink"/>
@@ -1581,7 +1581,7 @@
             <w:noProof/>
             <w:webHidden/>
           </w:rPr>
-          <w:instrText xml:space="preserve"> PAGEREF _Toc243064985 \h </w:instrText>
+          <w:instrText xml:space="preserve"> PAGEREF _Toc243065343 \h </w:instrText>
         </w:r>
         <w:r>
           <w:rPr>
@@ -1628,7 +1628,7 @@
           <w14:ligatures w14:val="standardContextual"/>
         </w:rPr>
       </w:pPr>
-      <w:hyperlink w:anchor="_Toc243064986" w:history="1">
+      <w:hyperlink w:anchor="_Toc243065344" w:history="1">
         <w:r>
           <w:rPr>
             <w:rStyle w:val="Hyperlink"/>
@@ -1655,7 +1655,7 @@
             <w:noProof/>
             <w:webHidden/>
           </w:rPr>
-          <w:instrText xml:space="preserve"> PAGEREF _Toc243064986 \h </w:instrText>
+          <w:instrText xml:space="preserve"> PAGEREF _Toc243065344 \h </w:instrText>
         </w:r>
         <w:r>
           <w:rPr>
@@ -1702,7 +1702,7 @@
           <w14:ligatures w14:val="standardContextual"/>
         </w:rPr>
       </w:pPr>
-      <w:hyperlink w:anchor="_Toc243064987" w:history="1">
+      <w:hyperlink w:anchor="_Toc243065345" w:history="1">
         <w:r>
           <w:rPr>
             <w:rStyle w:val="Hyperlink"/>
@@ -1729,7 +1729,7 @@
             <w:noProof/>
             <w:webHidden/>
           </w:rPr>
-          <w:instrText xml:space="preserve"> PAGEREF _Toc243064987 \h </w:instrText>
+          <w:instrText xml:space="preserve"> PAGEREF _Toc243065345 \h </w:instrText>
         </w:r>
         <w:r>
           <w:rPr>
@@ -1776,7 +1776,7 @@
           <w14:ligatures w14:val="standardContextual"/>
         </w:rPr>
       </w:pPr>
-      <w:hyperlink w:anchor="_Toc243064988" w:history="1">
+      <w:hyperlink w:anchor="_Toc243065346" w:history="1">
         <w:r>
           <w:rPr>
             <w:rStyle w:val="Hyperlink"/>
@@ -1803,7 +1803,7 @@
             <w:noProof/>
             <w:webHidden/>
           </w:rPr>
-          <w:instrText xml:space="preserve"> PAGEREF _Toc243064988 \h </w:instrText>
+          <w:instrText xml:space="preserve"> PAGEREF _Toc243065346 \h </w:instrText>
         </w:r>
         <w:r>
           <w:rPr>
@@ -1850,7 +1850,7 @@
           <w14:ligatures w14:val="standardContextual"/>
         </w:rPr>
       </w:pPr>
-      <w:hyperlink w:anchor="_Toc243064989" w:history="1">
+      <w:hyperlink w:anchor="_Toc243065347" w:history="1">
         <w:r>
           <w:rPr>
             <w:rStyle w:val="Hyperlink"/>
@@ -1877,7 +1877,7 @@
             <w:noProof/>
             <w:webHidden/>
           </w:rPr>
-          <w:instrText xml:space="preserve"> PAGEREF _Toc243064989 \h </w:instrText>
+          <w:instrText xml:space="preserve"> PAGEREF _Toc243065347 \h </w:instrText>
         </w:r>
         <w:r>
           <w:rPr>
@@ -1924,7 +1924,7 @@
           <w14:ligatures w14:val="standardContextual"/>
         </w:rPr>
       </w:pPr>
-      <w:hyperlink w:anchor="_Toc243064990" w:history="1">
+      <w:hyperlink w:anchor="_Toc243065348" w:history="1">
         <w:r>
           <w:rPr>
             <w:rStyle w:val="Hyperlink"/>
@@ -1951,7 +1951,7 @@
             <w:noProof/>
             <w:webHidden/>
           </w:rPr>
-          <w:instrText xml:space="preserve"> PAGEREF _Toc243064990 \h </w:instrText>
+          <w:instrText xml:space="preserve"> PAGEREF _Toc243065348 \h </w:instrText>
         </w:r>
         <w:r>
           <w:rPr>
@@ -1998,7 +1998,7 @@
           <w14:ligatures w14:val="standardContextual"/>
         </w:rPr>
       </w:pPr>
-      <w:hyperlink w:anchor="_Toc243064991" w:history="1">
+      <w:hyperlink w:anchor="_Toc243065349" w:history="1">
         <w:r>
           <w:rPr>
             <w:rStyle w:val="Hyperlink"/>
@@ -2025,7 +2025,7 @@
             <w:noProof/>
             <w:webHidden/>
           </w:rPr>
-          <w:instrText xml:space="preserve"> PAGEREF _Toc243064991 \h </w:instrText>
+          <w:instrText xml:space="preserve"> PAGEREF _Toc243065349 \h </w:instrText>
         </w:r>
         <w:r>
           <w:rPr>
@@ -2072,7 +2072,7 @@
           <w14:ligatures w14:val="standardContextual"/>
         </w:rPr>
       </w:pPr>
-      <w:hyperlink w:anchor="_Toc243064992" w:history="1">
+      <w:hyperlink w:anchor="_Toc243065350" w:history="1">
         <w:r>
           <w:rPr>
             <w:rStyle w:val="Hyperlink"/>
@@ -2099,7 +2099,7 @@
             <w:noProof/>
             <w:webHidden/>
           </w:rPr>
-          <w:instrText xml:space="preserve"> PAGEREF _Toc243064992 \h </w:instrText>
+          <w:instrText xml:space="preserve"> PAGEREF _Toc243065350 \h </w:instrText>
         </w:r>
         <w:r>
           <w:rPr>
@@ -2146,7 +2146,7 @@
           <w14:ligatures w14:val="standardContextual"/>
         </w:rPr>
       </w:pPr>
-      <w:hyperlink w:anchor="_Toc243064993" w:history="1">
+      <w:hyperlink w:anchor="_Toc243065351" w:history="1">
         <w:r>
           <w:rPr>
             <w:rStyle w:val="Hyperlink"/>
@@ -2173,7 +2173,7 @@
             <w:noProof/>
             <w:webHidden/>
           </w:rPr>
-          <w:instrText xml:space="preserve"> PAGEREF _Toc243064993 \h </w:instrText>
+          <w:instrText xml:space="preserve"> PAGEREF _Toc243065351 \h </w:instrText>
         </w:r>
         <w:r>
           <w:rPr>
@@ -2220,7 +2220,7 @@
           <w14:ligatures w14:val="standardContextual"/>
         </w:rPr>
       </w:pPr>
-      <w:hyperlink w:anchor="_Toc243064994" w:history="1">
+      <w:hyperlink w:anchor="_Toc243065352" w:history="1">
         <w:r>
           <w:rPr>
             <w:rStyle w:val="Hyperlink"/>
@@ -2247,7 +2247,7 @@
             <w:noProof/>
             <w:webHidden/>
           </w:rPr>
-          <w:instrText xml:space="preserve"> PAGEREF _Toc243064994 \h </w:instrText>
+          <w:instrText xml:space="preserve"> PAGEREF _Toc243065352 \h </w:instrText>
         </w:r>
         <w:r>
           <w:rPr>
@@ -2294,7 +2294,7 @@
           <w14:ligatures w14:val="standardContextual"/>
         </w:rPr>
       </w:pPr>
-      <w:hyperlink w:anchor="_Toc243064995" w:history="1">
+      <w:hyperlink w:anchor="_Toc243065353" w:history="1">
         <w:r>
           <w:rPr>
             <w:rStyle w:val="Hyperlink"/>
@@ -2321,7 +2321,7 @@
             <w:noProof/>
             <w:webHidden/>
           </w:rPr>
-          <w:instrText xml:space="preserve"> PAGEREF _Toc243064995 \h </w:instrText>
+          <w:instrText xml:space="preserve"> PAGEREF _Toc243065353 \h </w:instrText>
         </w:r>
         <w:r>
           <w:rPr>
@@ -2368,7 +2368,7 @@
           <w14:ligatures w14:val="standardContextual"/>
         </w:rPr>
       </w:pPr>
-      <w:hyperlink w:anchor="_Toc243064996" w:history="1">
+      <w:hyperlink w:anchor="_Toc243065354" w:history="1">
         <w:r>
           <w:rPr>
             <w:rStyle w:val="Hyperlink"/>
@@ -2395,7 +2395,7 @@
             <w:noProof/>
             <w:webHidden/>
           </w:rPr>
-          <w:instrText xml:space="preserve"> PAGEREF _Toc243064996 \h </w:instrText>
+          <w:instrText xml:space="preserve"> PAGEREF _Toc243065354 \h </w:instrText>
         </w:r>
         <w:r>
           <w:rPr>
@@ -2442,7 +2442,7 @@
           <w14:ligatures w14:val="standardContextual"/>
         </w:rPr>
       </w:pPr>
-      <w:hyperlink w:anchor="_Toc243064997" w:history="1">
+      <w:hyperlink w:anchor="_Toc243065355" w:history="1">
         <w:r>
           <w:rPr>
             <w:rStyle w:val="Hyperlink"/>
@@ -2469,7 +2469,7 @@
             <w:noProof/>
             <w:webHidden/>
           </w:rPr>
-          <w:instrText xml:space="preserve"> PAGEREF _Toc243064997 \h </w:instrText>
+          <w:instrText xml:space="preserve"> PAGEREF _Toc243065355 \h </w:instrText>
         </w:r>
         <w:r>
           <w:rPr>
@@ -2516,7 +2516,7 @@
           <w14:ligatures w14:val="standardContextual"/>
         </w:rPr>
       </w:pPr>
-      <w:hyperlink w:anchor="_Toc243064998" w:history="1">
+      <w:hyperlink w:anchor="_Toc243065356" w:history="1">
         <w:r>
           <w:rPr>
             <w:rStyle w:val="Hyperlink"/>
@@ -2543,7 +2543,7 @@
             <w:noProof/>
             <w:webHidden/>
           </w:rPr>
-          <w:instrText xml:space="preserve"> PAGEREF _Toc243064998 \h </w:instrText>
+          <w:instrText xml:space="preserve"> PAGEREF _Toc243065356 \h </w:instrText>
         </w:r>
         <w:r>
           <w:rPr>
@@ -2590,7 +2590,7 @@
           <w14:ligatures w14:val="standardContextual"/>
         </w:rPr>
       </w:pPr>
-      <w:hyperlink w:anchor="_Toc243064999" w:history="1">
+      <w:hyperlink w:anchor="_Toc243065357" w:history="1">
         <w:r>
           <w:rPr>
             <w:rStyle w:val="Hyperlink"/>
@@ -2617,7 +2617,7 @@
             <w:noProof/>
             <w:webHidden/>
           </w:rPr>
-          <w:instrText xml:space="preserve"> PAGEREF _Toc243064999 \h </w:instrText>
+          <w:instrText xml:space="preserve"> PAGEREF _Toc243065357 \h </w:instrText>
         </w:r>
         <w:r>
           <w:rPr>
@@ -2664,7 +2664,7 @@
           <w14:ligatures w14:val="standardContextual"/>
         </w:rPr>
       </w:pPr>
-      <w:hyperlink w:anchor="_Toc243065000" w:history="1">
+      <w:hyperlink w:anchor="_Toc243065358" w:history="1">
         <w:r>
           <w:rPr>
             <w:rStyle w:val="Hyperlink"/>
@@ -2691,7 +2691,7 @@
             <w:noProof/>
             <w:webHidden/>
           </w:rPr>
-          <w:instrText xml:space="preserve"> PAGEREF _Toc243065000 \h </w:instrText>
+          <w:instrText xml:space="preserve"> PAGEREF _Toc243065358 \h </w:instrText>
         </w:r>
         <w:r>
           <w:rPr>
@@ -2738,7 +2738,7 @@
           <w14:ligatures w14:val="standardContextual"/>
         </w:rPr>
       </w:pPr>
-      <w:hyperlink w:anchor="_Toc243065001" w:history="1">
+      <w:hyperlink w:anchor="_Toc243065359" w:history="1">
         <w:r>
           <w:rPr>
             <w:rStyle w:val="Hyperlink"/>
@@ -2765,7 +2765,7 @@
             <w:noProof/>
             <w:webHidden/>
           </w:rPr>
-          <w:instrText xml:space="preserve"> PAGEREF _Toc243065001 \h </w:instrText>
+          <w:instrText xml:space="preserve"> PAGEREF _Toc243065359 \h </w:instrText>
         </w:r>
         <w:r>
           <w:rPr>
@@ -2812,7 +2812,7 @@
           <w14:ligatures w14:val="standardContextual"/>
         </w:rPr>
       </w:pPr>
-      <w:hyperlink w:anchor="_Toc243065002" w:history="1">
+      <w:hyperlink w:anchor="_Toc243065360" w:history="1">
         <w:r>
           <w:rPr>
             <w:rStyle w:val="Hyperlink"/>
@@ -2839,7 +2839,7 @@
             <w:noProof/>
             <w:webHidden/>
           </w:rPr>
-          <w:instrText xml:space="preserve"> PAGEREF _Toc243065002 \h </w:instrText>
+          <w:instrText xml:space="preserve"> PAGEREF _Toc243065360 \h </w:instrText>
         </w:r>
         <w:r>
           <w:rPr>
@@ -2886,7 +2886,7 @@
           <w14:ligatures w14:val="standardContextual"/>
         </w:rPr>
       </w:pPr>
-      <w:hyperlink w:anchor="_Toc243065003" w:history="1">
+      <w:hyperlink w:anchor="_Toc243065361" w:history="1">
         <w:r>
           <w:rPr>
             <w:rStyle w:val="Hyperlink"/>
@@ -2913,7 +2913,7 @@
             <w:noProof/>
             <w:webHidden/>
           </w:rPr>
-          <w:instrText xml:space="preserve"> PAGEREF _Toc243065003 \h </w:instrText>
+          <w:instrText xml:space="preserve"> PAGEREF _Toc243065361 \h </w:instrText>
         </w:r>
         <w:r>
           <w:rPr>
@@ -2960,7 +2960,7 @@
           <w14:ligatures w14:val="standardContextual"/>
         </w:rPr>
       </w:pPr>
-      <w:hyperlink w:anchor="_Toc243065004" w:history="1">
+      <w:hyperlink w:anchor="_Toc243065362" w:history="1">
         <w:r>
           <w:rPr>
             <w:rStyle w:val="Hyperlink"/>
@@ -2987,7 +2987,7 @@
             <w:noProof/>
             <w:webHidden/>
           </w:rPr>
-          <w:instrText xml:space="preserve"> PAGEREF _Toc243065004 \h </w:instrText>
+          <w:instrText xml:space="preserve"> PAGEREF _Toc243065362 \h </w:instrText>
         </w:r>
         <w:r>
           <w:rPr>
@@ -3034,7 +3034,7 @@
           <w14:ligatures w14:val="standardContextual"/>
         </w:rPr>
       </w:pPr>
-      <w:hyperlink w:anchor="_Toc243065005" w:history="1">
+      <w:hyperlink w:anchor="_Toc243065363" w:history="1">
         <w:r>
           <w:rPr>
             <w:rStyle w:val="Hyperlink"/>
@@ -3061,7 +3061,7 @@
             <w:noProof/>
             <w:webHidden/>
           </w:rPr>
-          <w:instrText xml:space="preserve"> PAGEREF _Toc243065005 \h </w:instrText>
+          <w:instrText xml:space="preserve"> PAGEREF _Toc243065363 \h </w:instrText>
         </w:r>
         <w:r>
           <w:rPr>
@@ -3108,7 +3108,7 @@
           <w14:ligatures w14:val="standardContextual"/>
         </w:rPr>
       </w:pPr>
-      <w:hyperlink w:anchor="_Toc243065006" w:history="1">
+      <w:hyperlink w:anchor="_Toc243065364" w:history="1">
         <w:r>
           <w:rPr>
             <w:rStyle w:val="Hyperlink"/>
@@ -3135,7 +3135,7 @@
             <w:noProof/>
             <w:webHidden/>
           </w:rPr>
-          <w:instrText xml:space="preserve"> PAGEREF _Toc243065006 \h </w:instrText>
+          <w:instrText xml:space="preserve"> PAGEREF _Toc243065364 \h </w:instrText>
         </w:r>
         <w:r>
           <w:rPr>
@@ -3182,7 +3182,7 @@
           <w14:ligatures w14:val="standardContextual"/>
         </w:rPr>
       </w:pPr>
-      <w:hyperlink w:anchor="_Toc243065007" w:history="1">
+      <w:hyperlink w:anchor="_Toc243065365" w:history="1">
         <w:r>
           <w:rPr>
             <w:rStyle w:val="Hyperlink"/>
@@ -3209,7 +3209,7 @@
             <w:noProof/>
             <w:webHidden/>
           </w:rPr>
-          <w:instrText xml:space="preserve"> PAGEREF _Toc243065007 \h </w:instrText>
+          <w:instrText xml:space="preserve"> PAGEREF _Toc243065365 \h </w:instrText>
         </w:r>
         <w:r>
           <w:rPr>
@@ -3256,7 +3256,7 @@
           <w14:ligatures w14:val="standardContextual"/>
         </w:rPr>
       </w:pPr>
-      <w:hyperlink w:anchor="_Toc243065008" w:history="1">
+      <w:hyperlink w:anchor="_Toc243065366" w:history="1">
         <w:r>
           <w:rPr>
             <w:rStyle w:val="Hyperlink"/>
@@ -3283,7 +3283,7 @@
             <w:noProof/>
             <w:webHidden/>
           </w:rPr>
-          <w:instrText xml:space="preserve"> PAGEREF _Toc243065008 \h </w:instrText>
+          <w:instrText xml:space="preserve"> PAGEREF _Toc243065366 \h </w:instrText>
         </w:r>
         <w:r>
           <w:rPr>
@@ -3330,7 +3330,7 @@
           <w14:ligatures w14:val="standardContextual"/>
         </w:rPr>
       </w:pPr>
-      <w:hyperlink w:anchor="_Toc243065009" w:history="1">
+      <w:hyperlink w:anchor="_Toc243065367" w:history="1">
         <w:r>
           <w:rPr>
             <w:rStyle w:val="Hyperlink"/>
@@ -3357,7 +3357,7 @@
             <w:noProof/>
             <w:webHidden/>
           </w:rPr>
-          <w:instrText xml:space="preserve"> PAGEREF _Toc243065009 \h </w:instrText>
+          <w:instrText xml:space="preserve"> PAGEREF _Toc243065367 \h </w:instrText>
         </w:r>
         <w:r>
           <w:rPr>
@@ -3404,7 +3404,7 @@
           <w14:ligatures w14:val="standardContextual"/>
         </w:rPr>
       </w:pPr>
-      <w:hyperlink w:anchor="_Toc243065010" w:history="1">
+      <w:hyperlink w:anchor="_Toc243065368" w:history="1">
         <w:r>
           <w:rPr>
             <w:rStyle w:val="Hyperlink"/>
@@ -3431,7 +3431,7 @@
             <w:noProof/>
             <w:webHidden/>
           </w:rPr>
-          <w:instrText xml:space="preserve"> PAGEREF _Toc243065010 \h </w:instrText>
+          <w:instrText xml:space="preserve"> PAGEREF _Toc243065368 \h </w:instrText>
         </w:r>
         <w:r>
           <w:rPr>
@@ -3478,7 +3478,7 @@
           <w14:ligatures w14:val="standardContextual"/>
         </w:rPr>
       </w:pPr>
-      <w:hyperlink w:anchor="_Toc243065011" w:history="1">
+      <w:hyperlink w:anchor="_Toc243065369" w:history="1">
         <w:r>
           <w:rPr>
             <w:rStyle w:val="Hyperlink"/>
@@ -3505,7 +3505,7 @@
             <w:noProof/>
             <w:webHidden/>
           </w:rPr>
-          <w:instrText xml:space="preserve"> PAGEREF _Toc243065011 \h </w:instrText>
+          <w:instrText xml:space="preserve"> PAGEREF _Toc243065369 \h </w:instrText>
         </w:r>
         <w:r>
           <w:rPr>
@@ -3552,7 +3552,7 @@
           <w14:ligatures w14:val="standardContextual"/>
         </w:rPr>
       </w:pPr>
-      <w:hyperlink w:anchor="_Toc243065012" w:history="1">
+      <w:hyperlink w:anchor="_Toc243065370" w:history="1">
         <w:r>
           <w:rPr>
             <w:rStyle w:val="Hyperlink"/>
@@ -3579,7 +3579,7 @@
             <w:noProof/>
             <w:webHidden/>
           </w:rPr>
-          <w:instrText xml:space="preserve"> PAGEREF _Toc243065012 \h </w:instrText>
+          <w:instrText xml:space="preserve"> PAGEREF _Toc243065370 \h </w:instrText>
         </w:r>
         <w:r>
           <w:rPr>
@@ -3626,7 +3626,7 @@
           <w14:ligatures w14:val="standardContextual"/>
         </w:rPr>
       </w:pPr>
-      <w:hyperlink w:anchor="_Toc243065013" w:history="1">
+      <w:hyperlink w:anchor="_Toc243065371" w:history="1">
         <w:r>
           <w:rPr>
             <w:rStyle w:val="Hyperlink"/>
@@ -3653,7 +3653,7 @@
             <w:noProof/>
             <w:webHidden/>
           </w:rPr>
-          <w:instrText xml:space="preserve"> PAGEREF _Toc243065013 \h </w:instrText>
+          <w:instrText xml:space="preserve"> PAGEREF _Toc243065371 \h </w:instrText>
         </w:r>
         <w:r>
           <w:rPr>
@@ -3700,7 +3700,7 @@
           <w14:ligatures w14:val="standardContextual"/>
         </w:rPr>
       </w:pPr>
-      <w:hyperlink w:anchor="_Toc243065014" w:history="1">
+      <w:hyperlink w:anchor="_Toc243065372" w:history="1">
         <w:r>
           <w:rPr>
             <w:rStyle w:val="Hyperlink"/>
@@ -3727,7 +3727,7 @@
             <w:noProof/>
             <w:webHidden/>
           </w:rPr>
-          <w:instrText xml:space="preserve"> PAGEREF _Toc243065014 \h </w:instrText>
+          <w:instrText xml:space="preserve"> PAGEREF _Toc243065372 \h </w:instrText>
         </w:r>
         <w:r>
           <w:rPr>
@@ -3774,7 +3774,7 @@
           <w14:ligatures w14:val="standardContextual"/>
         </w:rPr>
       </w:pPr>
-      <w:hyperlink w:anchor="_Toc243065015" w:history="1">
+      <w:hyperlink w:anchor="_Toc243065373" w:history="1">
         <w:r>
           <w:rPr>
             <w:rStyle w:val="Hyperlink"/>
@@ -3801,7 +3801,7 @@
             <w:noProof/>
             <w:webHidden/>
           </w:rPr>
-          <w:instrText xml:space="preserve"> PAGEREF _Toc243065015 \h </w:instrText>
+          <w:instrText xml:space="preserve"> PAGEREF _Toc243065373 \h </w:instrText>
         </w:r>
         <w:r>
           <w:rPr>
@@ -3848,7 +3848,7 @@
           <w14:ligatures w14:val="standardContextual"/>
         </w:rPr>
       </w:pPr>
-      <w:hyperlink w:anchor="_Toc243065016" w:history="1">
+      <w:hyperlink w:anchor="_Toc243065374" w:history="1">
         <w:r>
           <w:rPr>
             <w:rStyle w:val="Hyperlink"/>
@@ -3875,7 +3875,7 @@
             <w:noProof/>
             <w:webHidden/>
           </w:rPr>
-          <w:instrText xml:space="preserve"> PAGEREF _Toc243065016 \h </w:instrText>
+          <w:instrText xml:space="preserve"> PAGEREF _Toc243065374 \h </w:instrText>
         </w:r>
         <w:r>
           <w:rPr>
@@ -3922,7 +3922,7 @@
           <w14:ligatures w14:val="standardContextual"/>
         </w:rPr>
       </w:pPr>
-      <w:hyperlink w:anchor="_Toc243065017" w:history="1">
+      <w:hyperlink w:anchor="_Toc243065375" w:history="1">
         <w:r>
           <w:rPr>
             <w:rStyle w:val="Hyperlink"/>
@@ -3949,7 +3949,7 @@
             <w:noProof/>
             <w:webHidden/>
           </w:rPr>
-          <w:instrText xml:space="preserve"> PAGEREF _Toc243065017 \h </w:instrText>
+          <w:instrText xml:space="preserve"> PAGEREF _Toc243065375 \h </w:instrText>
         </w:r>
         <w:r>
           <w:rPr>
@@ -3996,7 +3996,7 @@
           <w14:ligatures w14:val="standardContextual"/>
         </w:rPr>
       </w:pPr>
-      <w:hyperlink w:anchor="_Toc243065018" w:history="1">
+      <w:hyperlink w:anchor="_Toc243065376" w:history="1">
         <w:r>
           <w:rPr>
             <w:rStyle w:val="Hyperlink"/>
@@ -4023,7 +4023,7 @@
             <w:noProof/>
             <w:webHidden/>
           </w:rPr>
-          <w:instrText xml:space="preserve"> PAGEREF _Toc243065018 \h </w:instrText>
+          <w:instrText xml:space="preserve"> PAGEREF _Toc243065376 \h </w:instrText>
         </w:r>
         <w:r>
           <w:rPr>
@@ -4070,7 +4070,7 @@
           <w14:ligatures w14:val="standardContextual"/>
         </w:rPr>
       </w:pPr>
-      <w:hyperlink w:anchor="_Toc243065019" w:history="1">
+      <w:hyperlink w:anchor="_Toc243065377" w:history="1">
         <w:r>
           <w:rPr>
             <w:rStyle w:val="Hyperlink"/>
@@ -4097,7 +4097,7 @@
             <w:noProof/>
             <w:webHidden/>
           </w:rPr>
-          <w:instrText xml:space="preserve"> PAGEREF _Toc243065019 \h </w:instrText>
+          <w:instrText xml:space="preserve"> PAGEREF _Toc243065377 \h </w:instrText>
         </w:r>
         <w:r>
           <w:rPr>
@@ -4144,7 +4144,7 @@
           <w14:ligatures w14:val="standardContextual"/>
         </w:rPr>
       </w:pPr>
-      <w:hyperlink w:anchor="_Toc243065020" w:history="1">
+      <w:hyperlink w:anchor="_Toc243065378" w:history="1">
         <w:r>
           <w:rPr>
             <w:rStyle w:val="Hyperlink"/>
@@ -4171,7 +4171,7 @@
             <w:noProof/>
             <w:webHidden/>
           </w:rPr>
-          <w:instrText xml:space="preserve"> PAGEREF _Toc243065020 \h </w:instrText>
+          <w:instrText xml:space="preserve"> PAGEREF _Toc243065378 \h </w:instrText>
         </w:r>
         <w:r>
           <w:rPr>
@@ -4218,7 +4218,7 @@
           <w14:ligatures w14:val="standardContextual"/>
         </w:rPr>
       </w:pPr>
-      <w:hyperlink w:anchor="_Toc243065021" w:history="1">
+      <w:hyperlink w:anchor="_Toc243065379" w:history="1">
         <w:r>
           <w:rPr>
             <w:rStyle w:val="Hyperlink"/>
@@ -4245,7 +4245,7 @@
             <w:noProof/>
             <w:webHidden/>
           </w:rPr>
-          <w:instrText xml:space="preserve"> PAGEREF _Toc243065021 \h </w:instrText>
+          <w:instrText xml:space="preserve"> PAGEREF _Toc243065379 \h </w:instrText>
         </w:r>
         <w:r>
           <w:rPr>
@@ -4292,7 +4292,7 @@
           <w14:ligatures w14:val="standardContextual"/>
         </w:rPr>
       </w:pPr>
-      <w:hyperlink w:anchor="_Toc243065022" w:history="1">
+      <w:hyperlink w:anchor="_Toc243065380" w:history="1">
         <w:r>
           <w:rPr>
             <w:rStyle w:val="Hyperlink"/>
@@ -4319,7 +4319,7 @@
             <w:noProof/>
             <w:webHidden/>
           </w:rPr>
-          <w:instrText xml:space="preserve"> PAGEREF _Toc243065022 \h </w:instrText>
+          <w:instrText xml:space="preserve"> PAGEREF _Toc243065380 \h </w:instrText>
         </w:r>
         <w:r>
           <w:rPr>
@@ -4366,7 +4366,7 @@
           <w14:ligatures w14:val="standardContextual"/>
         </w:rPr>
       </w:pPr>
-      <w:hyperlink w:anchor="_Toc243065023" w:history="1">
+      <w:hyperlink w:anchor="_Toc243065381" w:history="1">
         <w:r>
           <w:rPr>
             <w:rStyle w:val="Hyperlink"/>
@@ -4393,7 +4393,7 @@
             <w:noProof/>
             <w:webHidden/>
           </w:rPr>
-          <w:instrText xml:space="preserve"> PAGEREF _Toc243065023 \h </w:instrText>
+          <w:instrText xml:space="preserve"> PAGEREF _Toc243065381 \h </w:instrText>
         </w:r>
         <w:r>
           <w:rPr>
@@ -4440,7 +4440,7 @@
           <w14:ligatures w14:val="standardContextual"/>
         </w:rPr>
       </w:pPr>
-      <w:hyperlink w:anchor="_Toc243065024" w:history="1">
+      <w:hyperlink w:anchor="_Toc243065382" w:history="1">
         <w:r>
           <w:rPr>
             <w:rStyle w:val="Hyperlink"/>
@@ -4467,7 +4467,7 @@
             <w:noProof/>
             <w:webHidden/>
           </w:rPr>
-          <w:instrText xml:space="preserve"> PAGEREF _Toc243065024 \h </w:instrText>
+          <w:instrText xml:space="preserve"> PAGEREF _Toc243065382 \h </w:instrText>
         </w:r>
         <w:r>
           <w:rPr>
@@ -4514,7 +4514,7 @@
           <w14:ligatures w14:val="standardContextual"/>
         </w:rPr>
       </w:pPr>
-      <w:hyperlink w:anchor="_Toc243065025" w:history="1">
+      <w:hyperlink w:anchor="_Toc243065383" w:history="1">
         <w:r>
           <w:rPr>
             <w:rStyle w:val="Hyperlink"/>
@@ -4541,7 +4541,7 @@
             <w:noProof/>
             <w:webHidden/>
           </w:rPr>
-          <w:instrText xml:space="preserve"> PAGEREF _Toc243065025 \h </w:instrText>
+          <w:instrText xml:space="preserve"> PAGEREF _Toc243065383 \h </w:instrText>
         </w:r>
         <w:r>
           <w:rPr>
@@ -4588,7 +4588,7 @@
           <w14:ligatures w14:val="standardContextual"/>
         </w:rPr>
       </w:pPr>
-      <w:hyperlink w:anchor="_Toc243065026" w:history="1">
+      <w:hyperlink w:anchor="_Toc243065384" w:history="1">
         <w:r>
           <w:rPr>
             <w:rStyle w:val="Hyperlink"/>
@@ -4615,7 +4615,7 @@
             <w:noProof/>
             <w:webHidden/>
           </w:rPr>
-          <w:instrText xml:space="preserve"> PAGEREF _Toc243065026 \h </w:instrText>
+          <w:instrText xml:space="preserve"> PAGEREF _Toc243065384 \h </w:instrText>
         </w:r>
         <w:r>
           <w:rPr>
@@ -4662,7 +4662,7 @@
           <w14:ligatures w14:val="standardContextual"/>
         </w:rPr>
       </w:pPr>
-      <w:hyperlink w:anchor="_Toc243065027" w:history="1">
+      <w:hyperlink w:anchor="_Toc243065385" w:history="1">
         <w:r>
           <w:rPr>
             <w:rStyle w:val="Hyperlink"/>
@@ -4689,7 +4689,7 @@
             <w:noProof/>
             <w:webHidden/>
           </w:rPr>
-          <w:instrText xml:space="preserve"> PAGEREF _Toc243065027 \h </w:instrText>
+          <w:instrText xml:space="preserve"> PAGEREF _Toc243065385 \h </w:instrText>
         </w:r>
         <w:r>
           <w:rPr>
@@ -4736,7 +4736,7 @@
           <w14:ligatures w14:val="standardContextual"/>
         </w:rPr>
       </w:pPr>
-      <w:hyperlink w:anchor="_Toc243065028" w:history="1">
+      <w:hyperlink w:anchor="_Toc243065386" w:history="1">
         <w:r>
           <w:rPr>
             <w:rStyle w:val="Hyperlink"/>
@@ -4763,7 +4763,7 @@
             <w:noProof/>
             <w:webHidden/>
           </w:rPr>
-          <w:instrText xml:space="preserve"> PAGEREF _Toc243065028 \h </w:instrText>
+          <w:instrText xml:space="preserve"> PAGEREF _Toc243065386 \h </w:instrText>
         </w:r>
         <w:r>
           <w:rPr>
@@ -4810,7 +4810,7 @@
           <w14:ligatures w14:val="standardContextual"/>
         </w:rPr>
       </w:pPr>
-      <w:hyperlink w:anchor="_Toc243065029" w:history="1">
+      <w:hyperlink w:anchor="_Toc243065387" w:history="1">
         <w:r>
           <w:rPr>
             <w:rStyle w:val="Hyperlink"/>
@@ -4837,7 +4837,7 @@
             <w:noProof/>
             <w:webHidden/>
           </w:rPr>
-          <w:instrText xml:space="preserve"> PAGEREF _Toc243065029 \h </w:instrText>
+          <w:instrText xml:space="preserve"> PAGEREF _Toc243065387 \h </w:instrText>
         </w:r>
         <w:r>
           <w:rPr>
@@ -4884,7 +4884,7 @@
           <w14:ligatures w14:val="standardContextual"/>
         </w:rPr>
       </w:pPr>
-      <w:hyperlink w:anchor="_Toc243065030" w:history="1">
+      <w:hyperlink w:anchor="_Toc243065388" w:history="1">
         <w:r>
           <w:rPr>
             <w:rStyle w:val="Hyperlink"/>
@@ -4911,7 +4911,7 @@
             <w:noProof/>
             <w:webHidden/>
           </w:rPr>
-          <w:instrText xml:space="preserve"> PAGEREF _Toc243065030 \h </w:instrText>
+          <w:instrText xml:space="preserve"> PAGEREF _Toc243065388 \h </w:instrText>
         </w:r>
         <w:r>
           <w:rPr>
@@ -4958,7 +4958,7 @@
           <w14:ligatures w14:val="standardContextual"/>
         </w:rPr>
       </w:pPr>
-      <w:hyperlink w:anchor="_Toc243065031" w:history="1">
+      <w:hyperlink w:anchor="_Toc243065389" w:history="1">
         <w:r>
           <w:rPr>
             <w:rStyle w:val="Hyperlink"/>
@@ -4985,7 +4985,7 @@
             <w:noProof/>
             <w:webHidden/>
           </w:rPr>
-          <w:instrText xml:space="preserve"> PAGEREF _Toc243065031 \h </w:instrText>
+          <w:instrText xml:space="preserve"> PAGEREF _Toc243065389 \h </w:instrText>
         </w:r>
         <w:r>
           <w:rPr>
@@ -5032,7 +5032,7 @@
           <w14:ligatures w14:val="standardContextual"/>
         </w:rPr>
       </w:pPr>
-      <w:hyperlink w:anchor="_Toc243065032" w:history="1">
+      <w:hyperlink w:anchor="_Toc243065390" w:history="1">
         <w:r>
           <w:rPr>
             <w:rStyle w:val="Hyperlink"/>
@@ -5059,7 +5059,7 @@
             <w:noProof/>
             <w:webHidden/>
           </w:rPr>
-          <w:instrText xml:space="preserve"> PAGEREF _Toc243065032 \h </w:instrText>
+          <w:instrText xml:space="preserve"> PAGEREF _Toc243065390 \h </w:instrText>
         </w:r>
         <w:r>
           <w:rPr>
@@ -5106,7 +5106,7 @@
           <w14:ligatures w14:val="standardContextual"/>
         </w:rPr>
       </w:pPr>
-      <w:hyperlink w:anchor="_Toc243065033" w:history="1">
+      <w:hyperlink w:anchor="_Toc243065391" w:history="1">
         <w:r>
           <w:rPr>
             <w:rStyle w:val="Hyperlink"/>
@@ -5133,7 +5133,7 @@
             <w:noProof/>
             <w:webHidden/>
           </w:rPr>
-          <w:instrText xml:space="preserve"> PAGEREF _Toc243065033 \h </w:instrText>
+          <w:instrText xml:space="preserve"> PAGEREF _Toc243065391 \h </w:instrText>
         </w:r>
         <w:r>
           <w:rPr>
@@ -5180,7 +5180,7 @@
           <w14:ligatures w14:val="standardContextual"/>
         </w:rPr>
       </w:pPr>
-      <w:hyperlink w:anchor="_Toc243065034" w:history="1">
+      <w:hyperlink w:anchor="_Toc243065392" w:history="1">
         <w:r>
           <w:rPr>
             <w:rStyle w:val="Hyperlink"/>
@@ -5207,7 +5207,7 @@
             <w:noProof/>
             <w:webHidden/>
           </w:rPr>
-          <w:instrText xml:space="preserve"> PAGEREF _Toc243065034 \h </w:instrText>
+          <w:instrText xml:space="preserve"> PAGEREF _Toc243065392 \h </w:instrText>
         </w:r>
         <w:r>
           <w:rPr>
@@ -5254,7 +5254,7 @@
           <w14:ligatures w14:val="standardContextual"/>
         </w:rPr>
       </w:pPr>
-      <w:hyperlink w:anchor="_Toc243065035" w:history="1">
+      <w:hyperlink w:anchor="_Toc243065393" w:history="1">
         <w:r>
           <w:rPr>
             <w:rStyle w:val="Hyperlink"/>
@@ -5281,7 +5281,7 @@
             <w:noProof/>
             <w:webHidden/>
           </w:rPr>
-          <w:instrText xml:space="preserve"> PAGEREF _Toc243065035 \h </w:instrText>
+          <w:instrText xml:space="preserve"> PAGEREF _Toc243065393 \h </w:instrText>
         </w:r>
         <w:r>
           <w:rPr>
@@ -5328,7 +5328,7 @@
           <w14:ligatures w14:val="standardContextual"/>
         </w:rPr>
       </w:pPr>
-      <w:hyperlink w:anchor="_Toc243065036" w:history="1">
+      <w:hyperlink w:anchor="_Toc243065394" w:history="1">
         <w:r>
           <w:rPr>
             <w:rStyle w:val="Hyperlink"/>
@@ -5355,7 +5355,7 @@
             <w:noProof/>
             <w:webHidden/>
           </w:rPr>
-          <w:instrText xml:space="preserve"> PAGEREF _Toc243065036 \h </w:instrText>
+          <w:instrText xml:space="preserve"> PAGEREF _Toc243065394 \h </w:instrText>
         </w:r>
         <w:r>
           <w:rPr>
@@ -5402,7 +5402,7 @@
           <w14:ligatures w14:val="standardContextual"/>
         </w:rPr>
       </w:pPr>
-      <w:hyperlink w:anchor="_Toc243065037" w:history="1">
+      <w:hyperlink w:anchor="_Toc243065395" w:history="1">
         <w:r>
           <w:rPr>
             <w:rStyle w:val="Hyperlink"/>
@@ -5429,7 +5429,7 @@
             <w:noProof/>
             <w:webHidden/>
           </w:rPr>
-          <w:instrText xml:space="preserve"> PAGEREF _Toc243065037 \h </w:instrText>
+          <w:instrText xml:space="preserve"> PAGEREF _Toc243065395 \h </w:instrText>
         </w:r>
         <w:r>
           <w:rPr>
@@ -5476,7 +5476,7 @@
           <w14:ligatures w14:val="standardContextual"/>
         </w:rPr>
       </w:pPr>
-      <w:hyperlink w:anchor="_Toc243065038" w:history="1">
+      <w:hyperlink w:anchor="_Toc243065396" w:history="1">
         <w:r>
           <w:rPr>
             <w:rStyle w:val="Hyperlink"/>
@@ -5503,7 +5503,7 @@
             <w:noProof/>
             <w:webHidden/>
           </w:rPr>
-          <w:instrText xml:space="preserve"> PAGEREF _Toc243065038 \h </w:instrText>
+          <w:instrText xml:space="preserve"> PAGEREF _Toc243065396 \h </w:instrText>
         </w:r>
         <w:r>
           <w:rPr>
@@ -5550,7 +5550,7 @@
           <w14:ligatures w14:val="standardContextual"/>
         </w:rPr>
       </w:pPr>
-      <w:hyperlink w:anchor="_Toc243065039" w:history="1">
+      <w:hyperlink w:anchor="_Toc243065397" w:history="1">
         <w:r>
           <w:rPr>
             <w:rStyle w:val="Hyperlink"/>
@@ -5577,7 +5577,7 @@
             <w:noProof/>
             <w:webHidden/>
           </w:rPr>
-          <w:instrText xml:space="preserve"> PAGEREF _Toc243065039 \h </w:instrText>
+          <w:instrText xml:space="preserve"> PAGEREF _Toc243065397 \h </w:instrText>
         </w:r>
         <w:r>
           <w:rPr>
@@ -5624,7 +5624,7 @@
           <w14:ligatures w14:val="standardContextual"/>
         </w:rPr>
       </w:pPr>
-      <w:hyperlink w:anchor="_Toc243065040" w:history="1">
+      <w:hyperlink w:anchor="_Toc243065398" w:history="1">
         <w:r>
           <w:rPr>
             <w:rStyle w:val="Hyperlink"/>
@@ -5651,7 +5651,7 @@
             <w:noProof/>
             <w:webHidden/>
           </w:rPr>
-          <w:instrText xml:space="preserve"> PAGEREF _Toc243065040 \h </w:instrText>
+          <w:instrText xml:space="preserve"> PAGEREF _Toc243065398 \h </w:instrText>
         </w:r>
         <w:r>
           <w:rPr>
@@ -5698,7 +5698,7 @@
           <w14:ligatures w14:val="standardContextual"/>
         </w:rPr>
       </w:pPr>
-      <w:hyperlink w:anchor="_Toc243065041" w:history="1">
+      <w:hyperlink w:anchor="_Toc243065399" w:history="1">
         <w:r>
           <w:rPr>
             <w:rStyle w:val="Hyperlink"/>
@@ -5725,7 +5725,7 @@
             <w:noProof/>
             <w:webHidden/>
           </w:rPr>
-          <w:instrText xml:space="preserve"> PAGEREF _Toc243065041 \h </w:instrText>
+          <w:instrText xml:space="preserve"> PAGEREF _Toc243065399 \h </w:instrText>
         </w:r>
         <w:r>
           <w:rPr>
@@ -5772,7 +5772,7 @@
           <w14:ligatures w14:val="standardContextual"/>
         </w:rPr>
       </w:pPr>
-      <w:hyperlink w:anchor="_Toc243065042" w:history="1">
+      <w:hyperlink w:anchor="_Toc243065400" w:history="1">
         <w:r>
           <w:rPr>
             <w:rStyle w:val="Hyperlink"/>
@@ -5799,7 +5799,7 @@
             <w:noProof/>
             <w:webHidden/>
           </w:rPr>
-          <w:instrText xml:space="preserve"> PAGEREF _Toc243065042 \h </w:instrText>
+          <w:instrText xml:space="preserve"> PAGEREF _Toc243065400 \h </w:instrText>
         </w:r>
         <w:r>
           <w:rPr>
@@ -5846,7 +5846,7 @@
           <w14:ligatures w14:val="standardContextual"/>
         </w:rPr>
       </w:pPr>
-      <w:hyperlink w:anchor="_Toc243065043" w:history="1">
+      <w:hyperlink w:anchor="_Toc243065401" w:history="1">
         <w:r>
           <w:rPr>
             <w:rStyle w:val="Hyperlink"/>
@@ -5873,7 +5873,7 @@
             <w:noProof/>
             <w:webHidden/>
           </w:rPr>
-          <w:instrText xml:space="preserve"> PAGEREF _Toc243065043 \h </w:instrText>
+          <w:instrText xml:space="preserve"> PAGEREF _Toc243065401 \h </w:instrText>
         </w:r>
         <w:r>
           <w:rPr>
@@ -5920,7 +5920,7 @@
           <w14:ligatures w14:val="standardContextual"/>
         </w:rPr>
       </w:pPr>
-      <w:hyperlink w:anchor="_Toc243065044" w:history="1">
+      <w:hyperlink w:anchor="_Toc243065402" w:history="1">
         <w:r>
           <w:rPr>
             <w:rStyle w:val="Hyperlink"/>
@@ -5947,7 +5947,7 @@
             <w:noProof/>
             <w:webHidden/>
           </w:rPr>
-          <w:instrText xml:space="preserve"> PAGEREF _Toc243065044 \h </w:instrText>
+          <w:instrText xml:space="preserve"> PAGEREF _Toc243065402 \h </w:instrText>
         </w:r>
         <w:r>
           <w:rPr>
@@ -5994,7 +5994,7 @@
           <w14:ligatures w14:val="standardContextual"/>
         </w:rPr>
       </w:pPr>
-      <w:hyperlink w:anchor="_Toc243065045" w:history="1">
+      <w:hyperlink w:anchor="_Toc243065403" w:history="1">
         <w:r>
           <w:rPr>
             <w:rStyle w:val="Hyperlink"/>
@@ -6021,7 +6021,7 @@
             <w:noProof/>
             <w:webHidden/>
           </w:rPr>
-          <w:instrText xml:space="preserve"> PAGEREF _Toc243065045 \h </w:instrText>
+          <w:instrText xml:space="preserve"> PAGEREF _Toc243065403 \h </w:instrText>
         </w:r>
         <w:r>
           <w:rPr>
@@ -6068,7 +6068,7 @@
           <w14:ligatures w14:val="standardContextual"/>
         </w:rPr>
       </w:pPr>
-      <w:hyperlink w:anchor="_Toc243065046" w:history="1">
+      <w:hyperlink w:anchor="_Toc243065404" w:history="1">
         <w:r>
           <w:rPr>
             <w:rStyle w:val="Hyperlink"/>
@@ -6095,7 +6095,7 @@
             <w:noProof/>
             <w:webHidden/>
           </w:rPr>
-          <w:instrText xml:space="preserve"> PAGEREF _Toc243065046 \h </w:instrText>
+          <w:instrText xml:space="preserve"> PAGEREF _Toc243065404 \h </w:instrText>
         </w:r>
         <w:r>
           <w:rPr>
@@ -7052,7 +7052,7 @@
         <w:pStyle w:val="Heading1"/>
         <w:jc w:val="center"/>
       </w:pPr>
-      <w:bookmarkStart w:id="0" w:name="_Toc243064973"/>
+      <w:bookmarkStart w:id="0" w:name="_Toc243065331"/>
       <w:r>
         <w:rPr>
           <w:rFonts w:ascii="Times New Roman" w:hAnsi="Times New Roman"/>
@@ -7081,7 +7081,7 @@
       <w:pPr>
         <w:pStyle w:val="Heading2"/>
       </w:pPr>
-      <w:bookmarkStart w:id="1" w:name="_Toc243064974"/>
+      <w:bookmarkStart w:id="1" w:name="_Toc243065332"/>
       <w:r>
         <w:rPr>
           <w:rFonts w:ascii="Times New Roman" w:hAnsi="Times New Roman"/>
@@ -7133,7 +7133,7 @@
       <w:pPr>
         <w:pStyle w:val="Heading2"/>
       </w:pPr>
-      <w:bookmarkStart w:id="2" w:name="_Toc243064975"/>
+      <w:bookmarkStart w:id="2" w:name="_Toc243065333"/>
       <w:r>
         <w:rPr>
           <w:rFonts w:ascii="Times New Roman" w:hAnsi="Times New Roman"/>
@@ -7169,7 +7169,7 @@
       <w:pPr>
         <w:pStyle w:val="Heading2"/>
       </w:pPr>
-      <w:bookmarkStart w:id="3" w:name="_Toc243064976"/>
+      <w:bookmarkStart w:id="3" w:name="_Toc243065334"/>
       <w:r>
         <w:rPr>
           <w:rFonts w:ascii="Times New Roman" w:hAnsi="Times New Roman"/>
@@ -7209,7 +7209,7 @@
       <w:pPr>
         <w:pStyle w:val="Heading2"/>
       </w:pPr>
-      <w:bookmarkStart w:id="4" w:name="_Toc243064977"/>
+      <w:bookmarkStart w:id="4" w:name="_Toc243065335"/>
       <w:r>
         <w:rPr>
           <w:rFonts w:ascii="Times New Roman" w:hAnsi="Times New Roman"/>
@@ -7233,7 +7233,7 @@
       <w:pPr>
         <w:pStyle w:val="Heading2"/>
       </w:pPr>
-      <w:bookmarkStart w:id="5" w:name="_Toc243064978"/>
+      <w:bookmarkStart w:id="5" w:name="_Toc243065336"/>
       <w:r>
         <w:rPr>
           <w:rFonts w:ascii="Times New Roman" w:hAnsi="Times New Roman"/>
@@ -7303,7 +7303,7 @@
       <w:pPr>
         <w:pStyle w:val="Heading2"/>
       </w:pPr>
-      <w:bookmarkStart w:id="6" w:name="_Toc243064979"/>
+      <w:bookmarkStart w:id="6" w:name="_Toc243065337"/>
       <w:r>
         <w:rPr>
           <w:rFonts w:ascii="Times New Roman" w:hAnsi="Times New Roman"/>
@@ -7330,7 +7330,7 @@
       <w:pPr>
         <w:pStyle w:val="Heading2"/>
       </w:pPr>
-      <w:bookmarkStart w:id="7" w:name="_Toc243064980"/>
+      <w:bookmarkStart w:id="7" w:name="_Toc243065338"/>
       <w:r>
         <w:rPr>
           <w:rFonts w:ascii="Times New Roman" w:hAnsi="Times New Roman"/>
@@ -7357,7 +7357,7 @@
       <w:pPr>
         <w:pStyle w:val="Heading2"/>
       </w:pPr>
-      <w:bookmarkStart w:id="8" w:name="_Toc243064981"/>
+      <w:bookmarkStart w:id="8" w:name="_Toc243065339"/>
       <w:r>
         <w:rPr>
           <w:rFonts w:ascii="Times New Roman" w:hAnsi="Times New Roman"/>
@@ -7394,7 +7394,7 @@
         <w:pStyle w:val="Heading1"/>
         <w:jc w:val="center"/>
       </w:pPr>
-      <w:bookmarkStart w:id="9" w:name="_Toc243064982"/>
+      <w:bookmarkStart w:id="9" w:name="_Toc243065340"/>
       <w:r>
         <w:rPr>
           <w:rFonts w:ascii="Times New Roman" w:hAnsi="Times New Roman"/>
@@ -7423,7 +7423,7 @@
       <w:pPr>
         <w:pStyle w:val="Heading2"/>
       </w:pPr>
-      <w:bookmarkStart w:id="10" w:name="_Toc243064983"/>
+      <w:bookmarkStart w:id="10" w:name="_Toc243065341"/>
       <w:r>
         <w:rPr>
           <w:rFonts w:ascii="Times New Roman" w:hAnsi="Times New Roman"/>
@@ -7447,7 +7447,7 @@
       <w:pPr>
         <w:pStyle w:val="Heading2"/>
       </w:pPr>
-      <w:bookmarkStart w:id="11" w:name="_Toc243064984"/>
+      <w:bookmarkStart w:id="11" w:name="_Toc243065342"/>
       <w:r>
         <w:rPr>
           <w:rFonts w:ascii="Times New Roman" w:hAnsi="Times New Roman"/>
@@ -7493,7 +7493,7 @@
       <w:pPr>
         <w:pStyle w:val="Heading2"/>
       </w:pPr>
-      <w:bookmarkStart w:id="12" w:name="_Toc243064985"/>
+      <w:bookmarkStart w:id="12" w:name="_Toc243065343"/>
       <w:r>
         <w:rPr>
           <w:rFonts w:ascii="Times New Roman" w:hAnsi="Times New Roman"/>
@@ -7532,7 +7532,7 @@
       <w:pPr>
         <w:pStyle w:val="Heading2"/>
       </w:pPr>
-      <w:bookmarkStart w:id="13" w:name="_Toc243064986"/>
+      <w:bookmarkStart w:id="13" w:name="_Toc243065344"/>
       <w:r>
         <w:rPr>
           <w:rFonts w:ascii="Times New Roman" w:hAnsi="Times New Roman"/>
@@ -7575,7 +7575,7 @@
       <w:pPr>
         <w:pStyle w:val="Heading2"/>
       </w:pPr>
-      <w:bookmarkStart w:id="14" w:name="_Toc243064987"/>
+      <w:bookmarkStart w:id="14" w:name="_Toc243065345"/>
       <w:r>
         <w:rPr>
           <w:rFonts w:ascii="Times New Roman" w:hAnsi="Times New Roman"/>
@@ -7606,7 +7606,7 @@
       <w:pPr>
         <w:pStyle w:val="Heading2"/>
       </w:pPr>
-      <w:bookmarkStart w:id="15" w:name="_Toc243064988"/>
+      <w:bookmarkStart w:id="15" w:name="_Toc243065346"/>
       <w:r>
         <w:rPr>
           <w:rFonts w:ascii="Times New Roman" w:hAnsi="Times New Roman"/>
@@ -7636,7 +7636,7 @@
       <w:pPr>
         <w:pStyle w:val="Heading2"/>
       </w:pPr>
-      <w:bookmarkStart w:id="16" w:name="_Toc243064989"/>
+      <w:bookmarkStart w:id="16" w:name="_Toc243065347"/>
       <w:r>
         <w:rPr>
           <w:rFonts w:ascii="Times New Roman" w:hAnsi="Times New Roman"/>
@@ -7670,7 +7670,7 @@
       <w:pPr>
         <w:pStyle w:val="Heading2"/>
       </w:pPr>
-      <w:bookmarkStart w:id="17" w:name="_Toc243064990"/>
+      <w:bookmarkStart w:id="17" w:name="_Toc243065348"/>
       <w:r>
         <w:rPr>
           <w:rFonts w:ascii="Times New Roman" w:hAnsi="Times New Roman"/>
@@ -7725,7 +7725,7 @@
       <w:pPr>
         <w:pStyle w:val="Heading2"/>
       </w:pPr>
-      <w:bookmarkStart w:id="18" w:name="_Toc243064991"/>
+      <w:bookmarkStart w:id="18" w:name="_Toc243065349"/>
       <w:r>
         <w:rPr>
           <w:rFonts w:ascii="Times New Roman" w:hAnsi="Times New Roman"/>
@@ -7752,7 +7752,7 @@
       <w:pPr>
         <w:pStyle w:val="Heading2"/>
       </w:pPr>
-      <w:bookmarkStart w:id="19" w:name="_Toc243064992"/>
+      <w:bookmarkStart w:id="19" w:name="_Toc243065350"/>
       <w:r>
         <w:rPr>
           <w:rFonts w:ascii="Times New Roman" w:hAnsi="Times New Roman"/>
@@ -7783,7 +7783,7 @@
       <w:pPr>
         <w:pStyle w:val="Heading2"/>
       </w:pPr>
-      <w:bookmarkStart w:id="20" w:name="_Toc243064993"/>
+      <w:bookmarkStart w:id="20" w:name="_Toc243065351"/>
       <w:r>
         <w:rPr>
           <w:rFonts w:ascii="Times New Roman" w:hAnsi="Times New Roman"/>
@@ -7831,7 +7831,7 @@
       <w:pPr>
         <w:pStyle w:val="Heading2"/>
       </w:pPr>
-      <w:bookmarkStart w:id="21" w:name="_Toc243064994"/>
+      <w:bookmarkStart w:id="21" w:name="_Toc243065352"/>
       <w:r>
         <w:rPr>
           <w:rFonts w:ascii="Times New Roman" w:hAnsi="Times New Roman"/>
@@ -7877,7 +7877,7 @@
       <w:pPr>
         <w:pStyle w:val="Heading2"/>
       </w:pPr>
-      <w:bookmarkStart w:id="22" w:name="_Toc243064995"/>
+      <w:bookmarkStart w:id="22" w:name="_Toc243065353"/>
       <w:r>
         <w:rPr>
           <w:rFonts w:ascii="Times New Roman" w:hAnsi="Times New Roman"/>
@@ -8437,7 +8437,7 @@
       <w:pPr>
         <w:pStyle w:val="Heading2"/>
       </w:pPr>
-      <w:bookmarkStart w:id="23" w:name="_Toc243064996"/>
+      <w:bookmarkStart w:id="23" w:name="_Toc243065354"/>
       <w:r>
         <w:rPr>
           <w:rFonts w:ascii="Times New Roman" w:hAnsi="Times New Roman"/>
@@ -8470,7 +8470,7 @@
         <w:pStyle w:val="Heading1"/>
         <w:jc w:val="center"/>
       </w:pPr>
-      <w:bookmarkStart w:id="24" w:name="_Toc243064997"/>
+      <w:bookmarkStart w:id="24" w:name="_Toc243065355"/>
       <w:r>
         <w:rPr>
           <w:rFonts w:ascii="Times New Roman" w:hAnsi="Times New Roman"/>
@@ -8499,7 +8499,7 @@
       <w:pPr>
         <w:pStyle w:val="Heading2"/>
       </w:pPr>
-      <w:bookmarkStart w:id="25" w:name="_Toc243064998"/>
+      <w:bookmarkStart w:id="25" w:name="_Toc243065356"/>
       <w:r>
         <w:rPr>
           <w:rFonts w:ascii="Times New Roman" w:hAnsi="Times New Roman"/>
@@ -8534,7 +8534,7 @@
           <w:noProof/>
         </w:rPr>
         <w:drawing>
-          <wp:inline distT="0" distB="0" distL="0" distR="0" wp14:anchorId="260F65DF" wp14:editId="37C3D21C">
+          <wp:inline distT="0" distB="0" distL="0" distR="0" wp14:anchorId="5C3CAB93" wp14:editId="1E8F03EA">
             <wp:extent cx="5303520" cy="2983230"/>
             <wp:effectExtent l="0" t="0" r="0" b="0"/>
             <wp:docPr id="2" name="Picture 2"/>
@@ -8587,7 +8587,7 @@
       <w:pPr>
         <w:pStyle w:val="Heading2"/>
       </w:pPr>
-      <w:bookmarkStart w:id="26" w:name="_Toc243064999"/>
+      <w:bookmarkStart w:id="26" w:name="_Toc243065357"/>
       <w:r>
         <w:rPr>
           <w:rFonts w:ascii="Times New Roman" w:hAnsi="Times New Roman"/>
@@ -8623,7 +8623,7 @@
           <w:noProof/>
         </w:rPr>
         <w:drawing>
-          <wp:inline distT="0" distB="0" distL="0" distR="0" wp14:anchorId="6E605B8E" wp14:editId="01A53932">
+          <wp:inline distT="0" distB="0" distL="0" distR="0" wp14:anchorId="6F95F5DB" wp14:editId="6705C832">
             <wp:extent cx="5303520" cy="2262835"/>
             <wp:effectExtent l="0" t="0" r="0" b="0"/>
             <wp:docPr id="3" name="Picture 3"/>
@@ -8713,7 +8713,7 @@
       <w:pPr>
         <w:pStyle w:val="Heading2"/>
       </w:pPr>
-      <w:bookmarkStart w:id="27" w:name="_Toc243065000"/>
+      <w:bookmarkStart w:id="27" w:name="_Toc243065358"/>
       <w:r>
         <w:rPr>
           <w:rFonts w:ascii="Times New Roman" w:hAnsi="Times New Roman"/>
@@ -8759,7 +8759,7 @@
       <w:pPr>
         <w:pStyle w:val="Heading2"/>
       </w:pPr>
-      <w:bookmarkStart w:id="28" w:name="_Toc243065001"/>
+      <w:bookmarkStart w:id="28" w:name="_Toc243065359"/>
       <w:r>
         <w:rPr>
           <w:rFonts w:ascii="Times New Roman" w:hAnsi="Times New Roman"/>
@@ -8807,7 +8807,7 @@
           <w:noProof/>
         </w:rPr>
         <w:drawing>
-          <wp:inline distT="0" distB="0" distL="0" distR="0" wp14:anchorId="3A8FE824" wp14:editId="3DC970AA">
+          <wp:inline distT="0" distB="0" distL="0" distR="0" wp14:anchorId="63DE06E5" wp14:editId="57BB6C23">
             <wp:extent cx="5303520" cy="2262835"/>
             <wp:effectExtent l="0" t="0" r="0" b="0"/>
             <wp:docPr id="4" name="Picture 4"/>
@@ -9152,7 +9152,7 @@
       <w:pPr>
         <w:pStyle w:val="Heading2"/>
       </w:pPr>
-      <w:bookmarkStart w:id="29" w:name="_Toc243065002"/>
+      <w:bookmarkStart w:id="29" w:name="_Toc243065360"/>
       <w:r>
         <w:rPr>
           <w:rFonts w:ascii="Times New Roman" w:hAnsi="Times New Roman"/>
@@ -9179,7 +9179,7 @@
       <w:pPr>
         <w:pStyle w:val="Heading2"/>
       </w:pPr>
-      <w:bookmarkStart w:id="30" w:name="_Toc243065003"/>
+      <w:bookmarkStart w:id="30" w:name="_Toc243065361"/>
       <w:r>
         <w:rPr>
           <w:rFonts w:ascii="Times New Roman" w:hAnsi="Times New Roman"/>
@@ -9222,7 +9222,7 @@
       <w:pPr>
         <w:pStyle w:val="Heading2"/>
       </w:pPr>
-      <w:bookmarkStart w:id="31" w:name="_Toc243065004"/>
+      <w:bookmarkStart w:id="31" w:name="_Toc243065362"/>
       <w:r>
         <w:rPr>
           <w:rFonts w:ascii="Times New Roman" w:hAnsi="Times New Roman"/>
@@ -9608,7 +9608,7 @@
       <w:pPr>
         <w:pStyle w:val="Heading2"/>
       </w:pPr>
-      <w:bookmarkStart w:id="32" w:name="_Toc243065005"/>
+      <w:bookmarkStart w:id="32" w:name="_Toc243065363"/>
       <w:r>
         <w:rPr>
           <w:rFonts w:ascii="Times New Roman" w:hAnsi="Times New Roman"/>
@@ -9638,7 +9638,7 @@
       <w:pPr>
         <w:pStyle w:val="Heading2"/>
       </w:pPr>
-      <w:bookmarkStart w:id="33" w:name="_Toc243065006"/>
+      <w:bookmarkStart w:id="33" w:name="_Toc243065364"/>
       <w:r>
         <w:rPr>
           <w:rFonts w:ascii="Times New Roman" w:hAnsi="Times New Roman"/>
@@ -9672,7 +9672,7 @@
         <w:pStyle w:val="Heading1"/>
         <w:jc w:val="center"/>
       </w:pPr>
-      <w:bookmarkStart w:id="34" w:name="_Toc243065007"/>
+      <w:bookmarkStart w:id="34" w:name="_Toc243065365"/>
       <w:r>
         <w:rPr>
           <w:rFonts w:ascii="Times New Roman" w:hAnsi="Times New Roman"/>
@@ -9701,7 +9701,7 @@
       <w:pPr>
         <w:pStyle w:val="Heading2"/>
       </w:pPr>
-      <w:bookmarkStart w:id="35" w:name="_Toc243065008"/>
+      <w:bookmarkStart w:id="35" w:name="_Toc243065366"/>
       <w:r>
         <w:rPr>
           <w:rFonts w:ascii="Times New Roman" w:hAnsi="Times New Roman"/>
@@ -9728,7 +9728,7 @@
       <w:pPr>
         <w:pStyle w:val="Heading2"/>
       </w:pPr>
-      <w:bookmarkStart w:id="36" w:name="_Toc243065009"/>
+      <w:bookmarkStart w:id="36" w:name="_Toc243065367"/>
       <w:r>
         <w:rPr>
           <w:rFonts w:ascii="Times New Roman" w:hAnsi="Times New Roman"/>
@@ -10305,7 +10305,7 @@
       <w:pPr>
         <w:pStyle w:val="Heading2"/>
       </w:pPr>
-      <w:bookmarkStart w:id="37" w:name="_Toc243065010"/>
+      <w:bookmarkStart w:id="37" w:name="_Toc243065368"/>
       <w:r>
         <w:rPr>
           <w:rFonts w:ascii="Times New Roman" w:hAnsi="Times New Roman"/>
@@ -10422,7 +10422,7 @@
       <w:pPr>
         <w:pStyle w:val="Heading2"/>
       </w:pPr>
-      <w:bookmarkStart w:id="38" w:name="_Toc243065011"/>
+      <w:bookmarkStart w:id="38" w:name="_Toc243065369"/>
       <w:r>
         <w:rPr>
           <w:rFonts w:ascii="Times New Roman" w:hAnsi="Times New Roman"/>
@@ -10452,7 +10452,7 @@
       <w:pPr>
         <w:pStyle w:val="Heading2"/>
       </w:pPr>
-      <w:bookmarkStart w:id="39" w:name="_Toc243065012"/>
+      <w:bookmarkStart w:id="39" w:name="_Toc243065370"/>
       <w:r>
         <w:rPr>
           <w:rFonts w:ascii="Times New Roman" w:hAnsi="Times New Roman"/>
@@ -10480,7 +10480,7 @@
       <w:pPr>
         <w:pStyle w:val="Heading2"/>
       </w:pPr>
-      <w:bookmarkStart w:id="40" w:name="_Toc243065013"/>
+      <w:bookmarkStart w:id="40" w:name="_Toc243065371"/>
       <w:r>
         <w:rPr>
           <w:rFonts w:ascii="Times New Roman" w:hAnsi="Times New Roman"/>
@@ -10507,7 +10507,7 @@
       <w:pPr>
         <w:pStyle w:val="Heading2"/>
       </w:pPr>
-      <w:bookmarkStart w:id="41" w:name="_Toc243065014"/>
+      <w:bookmarkStart w:id="41" w:name="_Toc243065372"/>
       <w:r>
         <w:rPr>
           <w:rFonts w:ascii="Times New Roman" w:hAnsi="Times New Roman"/>
@@ -10534,7 +10534,7 @@
       <w:pPr>
         <w:pStyle w:val="Heading2"/>
       </w:pPr>
-      <w:bookmarkStart w:id="42" w:name="_Toc243065015"/>
+      <w:bookmarkStart w:id="42" w:name="_Toc243065373"/>
       <w:r>
         <w:rPr>
           <w:rFonts w:ascii="Times New Roman" w:hAnsi="Times New Roman"/>
@@ -10571,7 +10571,7 @@
         <w:pStyle w:val="Heading1"/>
         <w:jc w:val="center"/>
       </w:pPr>
-      <w:bookmarkStart w:id="43" w:name="_Toc243065016"/>
+      <w:bookmarkStart w:id="43" w:name="_Toc243065374"/>
       <w:r>
         <w:rPr>
           <w:rFonts w:ascii="Times New Roman" w:hAnsi="Times New Roman"/>
@@ -10600,7 +10600,7 @@
       <w:pPr>
         <w:pStyle w:val="Heading2"/>
       </w:pPr>
-      <w:bookmarkStart w:id="44" w:name="_Toc243065017"/>
+      <w:bookmarkStart w:id="44" w:name="_Toc243065375"/>
       <w:r>
         <w:rPr>
           <w:rFonts w:ascii="Times New Roman" w:hAnsi="Times New Roman"/>
@@ -10632,7 +10632,7 @@
           <w:noProof/>
         </w:rPr>
         <w:drawing>
-          <wp:inline distT="0" distB="0" distL="0" distR="0" wp14:anchorId="73F408EA" wp14:editId="7406ED12">
+          <wp:inline distT="0" distB="0" distL="0" distR="0" wp14:anchorId="4C305899" wp14:editId="75C3D645">
             <wp:extent cx="5303520" cy="3374967"/>
             <wp:effectExtent l="0" t="0" r="0" b="0"/>
             <wp:docPr id="5" name="Picture 5"/>
@@ -10900,7 +10900,7 @@
           <w:noProof/>
         </w:rPr>
         <w:drawing>
-          <wp:inline distT="0" distB="0" distL="0" distR="0" wp14:anchorId="48C1B351" wp14:editId="4A08F3EE">
+          <wp:inline distT="0" distB="0" distL="0" distR="0" wp14:anchorId="75001C75" wp14:editId="2050BD66">
             <wp:extent cx="5303520" cy="2272937"/>
             <wp:effectExtent l="0" t="0" r="0" b="0"/>
             <wp:docPr id="6" name="Picture 6"/>
@@ -11280,7 +11280,7 @@
       <w:pPr>
         <w:pStyle w:val="Heading2"/>
       </w:pPr>
-      <w:bookmarkStart w:id="45" w:name="_Toc243065018"/>
+      <w:bookmarkStart w:id="45" w:name="_Toc243065376"/>
       <w:r>
         <w:rPr>
           <w:rFonts w:ascii="Times New Roman" w:hAnsi="Times New Roman"/>
@@ -11313,7 +11313,7 @@
         </w:rPr>
         <w:lastRenderedPageBreak/>
         <w:drawing>
-          <wp:inline distT="0" distB="0" distL="0" distR="0" wp14:anchorId="5482D291" wp14:editId="39D4EE1A">
+          <wp:inline distT="0" distB="0" distL="0" distR="0" wp14:anchorId="547EC67F" wp14:editId="1E91EB2D">
             <wp:extent cx="5303520" cy="2121408"/>
             <wp:effectExtent l="0" t="0" r="0" b="0"/>
             <wp:docPr id="7" name="Picture 7"/>
@@ -11637,7 +11637,7 @@
           <w:noProof/>
         </w:rPr>
         <w:drawing>
-          <wp:inline distT="0" distB="0" distL="0" distR="0" wp14:anchorId="38BF24BA" wp14:editId="17F0BFC6">
+          <wp:inline distT="0" distB="0" distL="0" distR="0" wp14:anchorId="5EF7EC8C" wp14:editId="683A9079">
             <wp:extent cx="5303520" cy="2571404"/>
             <wp:effectExtent l="0" t="0" r="0" b="0"/>
             <wp:docPr id="8" name="Picture 8"/>
@@ -11690,7 +11690,7 @@
       <w:pPr>
         <w:pStyle w:val="Heading2"/>
       </w:pPr>
-      <w:bookmarkStart w:id="46" w:name="_Toc243065019"/>
+      <w:bookmarkStart w:id="46" w:name="_Toc243065377"/>
       <w:r>
         <w:rPr>
           <w:rFonts w:ascii="Times New Roman" w:hAnsi="Times New Roman"/>
@@ -11932,7 +11932,7 @@
       <w:pPr>
         <w:pStyle w:val="Heading2"/>
       </w:pPr>
-      <w:bookmarkStart w:id="47" w:name="_Toc243065020"/>
+      <w:bookmarkStart w:id="47" w:name="_Toc243065378"/>
       <w:r>
         <w:rPr>
           <w:rFonts w:ascii="Times New Roman" w:hAnsi="Times New Roman"/>
@@ -11996,7 +11996,7 @@
           <w:noProof/>
         </w:rPr>
         <w:drawing>
-          <wp:inline distT="0" distB="0" distL="0" distR="0" wp14:anchorId="09F9DE5B" wp14:editId="51D41137">
+          <wp:inline distT="0" distB="0" distL="0" distR="0" wp14:anchorId="29C55517" wp14:editId="125E12BF">
             <wp:extent cx="5303520" cy="2121408"/>
             <wp:effectExtent l="0" t="0" r="0" b="0"/>
             <wp:docPr id="9" name="Picture 9"/>
@@ -12049,7 +12049,7 @@
       <w:pPr>
         <w:pStyle w:val="Heading2"/>
       </w:pPr>
-      <w:bookmarkStart w:id="48" w:name="_Toc243065021"/>
+      <w:bookmarkStart w:id="48" w:name="_Toc243065379"/>
       <w:r>
         <w:rPr>
           <w:rFonts w:ascii="Times New Roman" w:hAnsi="Times New Roman"/>
@@ -12082,7 +12082,7 @@
         </w:rPr>
         <w:lastRenderedPageBreak/>
         <w:drawing>
-          <wp:inline distT="0" distB="0" distL="0" distR="0" wp14:anchorId="4FA541BF" wp14:editId="11D82344">
+          <wp:inline distT="0" distB="0" distL="0" distR="0" wp14:anchorId="3E01F67D" wp14:editId="6C59EFBA">
             <wp:extent cx="5303520" cy="2424466"/>
             <wp:effectExtent l="0" t="0" r="0" b="0"/>
             <wp:docPr id="10" name="Picture 10"/>
@@ -12332,7 +12332,7 @@
       <w:pPr>
         <w:pStyle w:val="Heading2"/>
       </w:pPr>
-      <w:bookmarkStart w:id="49" w:name="_Toc243065022"/>
+      <w:bookmarkStart w:id="49" w:name="_Toc243065380"/>
       <w:r>
         <w:rPr>
           <w:rFonts w:ascii="Times New Roman" w:hAnsi="Times New Roman"/>
@@ -12377,7 +12377,7 @@
           <w:noProof/>
         </w:rPr>
         <w:drawing>
-          <wp:inline distT="0" distB="0" distL="0" distR="0" wp14:anchorId="2BCDAA3E" wp14:editId="0C08CB64">
+          <wp:inline distT="0" distB="0" distL="0" distR="0" wp14:anchorId="514E9600" wp14:editId="4EDD5956">
             <wp:extent cx="5303520" cy="1988820"/>
             <wp:effectExtent l="0" t="0" r="0" b="0"/>
             <wp:docPr id="11" name="Picture 11"/>
@@ -12448,7 +12448,7 @@
         </w:rPr>
         <w:lastRenderedPageBreak/>
         <w:drawing>
-          <wp:inline distT="0" distB="0" distL="0" distR="0" wp14:anchorId="486F7E04" wp14:editId="78422C40">
+          <wp:inline distT="0" distB="0" distL="0" distR="0" wp14:anchorId="1CB92231" wp14:editId="05618580">
             <wp:extent cx="5303520" cy="2495774"/>
             <wp:effectExtent l="0" t="0" r="0" b="0"/>
             <wp:docPr id="12" name="Picture 12"/>
@@ -12518,7 +12518,7 @@
           <w:noProof/>
         </w:rPr>
         <w:drawing>
-          <wp:inline distT="0" distB="0" distL="0" distR="0" wp14:anchorId="1DA89A6C" wp14:editId="6838EEC8">
+          <wp:inline distT="0" distB="0" distL="0" distR="0" wp14:anchorId="094B2EDC" wp14:editId="2451599B">
             <wp:extent cx="5303520" cy="2272937"/>
             <wp:effectExtent l="0" t="0" r="0" b="0"/>
             <wp:docPr id="13" name="Picture 13"/>
@@ -12601,7 +12601,7 @@
           <w:noProof/>
         </w:rPr>
         <w:drawing>
-          <wp:inline distT="0" distB="0" distL="0" distR="0" wp14:anchorId="6B2D6EC8" wp14:editId="48FFDFB9">
+          <wp:inline distT="0" distB="0" distL="0" distR="0" wp14:anchorId="5FE7652D" wp14:editId="4B214F55">
             <wp:extent cx="5303520" cy="2339788"/>
             <wp:effectExtent l="0" t="0" r="0" b="0"/>
             <wp:docPr id="14" name="Picture 14"/>
@@ -12672,7 +12672,7 @@
           <w:noProof/>
         </w:rPr>
         <w:drawing>
-          <wp:inline distT="0" distB="0" distL="0" distR="0" wp14:anchorId="1B3699CC" wp14:editId="18B6D591">
+          <wp:inline distT="0" distB="0" distL="0" distR="0" wp14:anchorId="57ED3D81" wp14:editId="435D5E99">
             <wp:extent cx="5303520" cy="1988820"/>
             <wp:effectExtent l="0" t="0" r="0" b="0"/>
             <wp:docPr id="15" name="Picture 15"/>
@@ -13127,7 +13127,7 @@
       <w:pPr>
         <w:pStyle w:val="Heading2"/>
       </w:pPr>
-      <w:bookmarkStart w:id="50" w:name="_Toc243065023"/>
+      <w:bookmarkStart w:id="50" w:name="_Toc243065381"/>
       <w:r>
         <w:rPr>
           <w:rFonts w:ascii="Times New Roman" w:hAnsi="Times New Roman"/>
@@ -13201,7 +13201,7 @@
       <w:pPr>
         <w:pStyle w:val="Heading2"/>
       </w:pPr>
-      <w:bookmarkStart w:id="51" w:name="_Toc243065024"/>
+      <w:bookmarkStart w:id="51" w:name="_Toc243065382"/>
       <w:r>
         <w:rPr>
           <w:rFonts w:ascii="Times New Roman" w:hAnsi="Times New Roman"/>
@@ -13699,7 +13699,7 @@
         <w:pStyle w:val="Heading1"/>
         <w:jc w:val="center"/>
       </w:pPr>
-      <w:bookmarkStart w:id="52" w:name="_Toc243065025"/>
+      <w:bookmarkStart w:id="52" w:name="_Toc243065383"/>
       <w:r>
         <w:rPr>
           <w:rFonts w:ascii="Times New Roman" w:hAnsi="Times New Roman"/>
@@ -13728,7 +13728,7 @@
       <w:pPr>
         <w:pStyle w:val="Heading2"/>
       </w:pPr>
-      <w:bookmarkStart w:id="53" w:name="_Toc243065026"/>
+      <w:bookmarkStart w:id="53" w:name="_Toc243065384"/>
       <w:r>
         <w:rPr>
           <w:rFonts w:ascii="Times New Roman" w:hAnsi="Times New Roman"/>
@@ -13792,7 +13792,7 @@
       <w:pPr>
         <w:pStyle w:val="Heading2"/>
       </w:pPr>
-      <w:bookmarkStart w:id="54" w:name="_Toc243065027"/>
+      <w:bookmarkStart w:id="54" w:name="_Toc243065385"/>
       <w:r>
         <w:rPr>
           <w:rFonts w:ascii="Times New Roman" w:hAnsi="Times New Roman"/>
@@ -13886,7 +13886,7 @@
         <w:pStyle w:val="Heading1"/>
         <w:jc w:val="center"/>
       </w:pPr>
-      <w:bookmarkStart w:id="55" w:name="_Toc243065028"/>
+      <w:bookmarkStart w:id="55" w:name="_Toc243065386"/>
       <w:r>
         <w:rPr>
           <w:rFonts w:ascii="Times New Roman" w:hAnsi="Times New Roman"/>
@@ -14074,7 +14074,7 @@
         <w:pStyle w:val="Heading1"/>
         <w:jc w:val="center"/>
       </w:pPr>
-      <w:bookmarkStart w:id="56" w:name="_Toc243065029"/>
+      <w:bookmarkStart w:id="56" w:name="_Toc243065387"/>
       <w:r>
         <w:rPr>
           <w:rFonts w:ascii="Times New Roman" w:hAnsi="Times New Roman"/>
@@ -14090,7 +14090,7 @@
       <w:pPr>
         <w:pStyle w:val="Heading2"/>
       </w:pPr>
-      <w:bookmarkStart w:id="57" w:name="_Toc243065030"/>
+      <w:bookmarkStart w:id="57" w:name="_Toc243065388"/>
       <w:r>
         <w:rPr>
           <w:rFonts w:ascii="Times New Roman" w:hAnsi="Times New Roman"/>
@@ -14120,7 +14120,7 @@
       <w:pPr>
         <w:pStyle w:val="Heading2"/>
       </w:pPr>
-      <w:bookmarkStart w:id="58" w:name="_Toc243065031"/>
+      <w:bookmarkStart w:id="58" w:name="_Toc243065389"/>
       <w:r>
         <w:rPr>
           <w:rFonts w:ascii="Times New Roman" w:hAnsi="Times New Roman"/>
@@ -14224,7 +14224,7 @@
       <w:pPr>
         <w:pStyle w:val="Heading2"/>
       </w:pPr>
-      <w:bookmarkStart w:id="59" w:name="_Toc243065032"/>
+      <w:bookmarkStart w:id="59" w:name="_Toc243065390"/>
       <w:r>
         <w:rPr>
           <w:rFonts w:ascii="Times New Roman" w:hAnsi="Times New Roman"/>
@@ -14328,7 +14328,7 @@
       <w:pPr>
         <w:pStyle w:val="Heading2"/>
       </w:pPr>
-      <w:bookmarkStart w:id="60" w:name="_Toc243065033"/>
+      <w:bookmarkStart w:id="60" w:name="_Toc243065391"/>
       <w:r>
         <w:rPr>
           <w:rFonts w:ascii="Times New Roman" w:hAnsi="Times New Roman"/>
@@ -14486,7 +14486,7 @@
       <w:pPr>
         <w:pStyle w:val="Heading2"/>
       </w:pPr>
-      <w:bookmarkStart w:id="61" w:name="_Toc243065034"/>
+      <w:bookmarkStart w:id="61" w:name="_Toc243065392"/>
       <w:r>
         <w:rPr>
           <w:rFonts w:ascii="Times New Roman" w:hAnsi="Times New Roman"/>
@@ -14734,7 +14734,7 @@
       <w:pPr>
         <w:pStyle w:val="Heading2"/>
       </w:pPr>
-      <w:bookmarkStart w:id="62" w:name="_Toc243065035"/>
+      <w:bookmarkStart w:id="62" w:name="_Toc243065393"/>
       <w:r>
         <w:rPr>
           <w:rFonts w:ascii="Times New Roman" w:hAnsi="Times New Roman"/>
@@ -14886,7 +14886,7 @@
       <w:pPr>
         <w:pStyle w:val="Heading2"/>
       </w:pPr>
-      <w:bookmarkStart w:id="63" w:name="_Toc243065036"/>
+      <w:bookmarkStart w:id="63" w:name="_Toc243065394"/>
       <w:r>
         <w:rPr>
           <w:rFonts w:ascii="Times New Roman" w:hAnsi="Times New Roman"/>
@@ -15051,7 +15051,7 @@
       <w:pPr>
         <w:pStyle w:val="Heading2"/>
       </w:pPr>
-      <w:bookmarkStart w:id="64" w:name="_Toc243065037"/>
+      <w:bookmarkStart w:id="64" w:name="_Toc243065395"/>
       <w:r>
         <w:rPr>
           <w:rFonts w:ascii="Times New Roman" w:hAnsi="Times New Roman"/>
@@ -15232,7 +15232,7 @@
       <w:pPr>
         <w:pStyle w:val="Heading2"/>
       </w:pPr>
-      <w:bookmarkStart w:id="65" w:name="_Toc243065038"/>
+      <w:bookmarkStart w:id="65" w:name="_Toc243065396"/>
       <w:r>
         <w:rPr>
           <w:rFonts w:ascii="Times New Roman" w:hAnsi="Times New Roman"/>
@@ -15372,7 +15372,7 @@
       <w:pPr>
         <w:pStyle w:val="Heading2"/>
       </w:pPr>
-      <w:bookmarkStart w:id="66" w:name="_Toc243065039"/>
+      <w:bookmarkStart w:id="66" w:name="_Toc243065397"/>
       <w:r>
         <w:rPr>
           <w:rFonts w:ascii="Times New Roman" w:hAnsi="Times New Roman"/>
@@ -15561,7 +15561,7 @@
       <w:pPr>
         <w:pStyle w:val="Heading2"/>
       </w:pPr>
-      <w:bookmarkStart w:id="67" w:name="_Toc243065040"/>
+      <w:bookmarkStart w:id="67" w:name="_Toc243065398"/>
       <w:r>
         <w:rPr>
           <w:rFonts w:ascii="Times New Roman" w:hAnsi="Times New Roman"/>
@@ -15713,7 +15713,7 @@
       <w:pPr>
         <w:pStyle w:val="Heading2"/>
       </w:pPr>
-      <w:bookmarkStart w:id="68" w:name="_Toc243065041"/>
+      <w:bookmarkStart w:id="68" w:name="_Toc243065399"/>
       <w:r>
         <w:rPr>
           <w:rFonts w:ascii="Times New Roman" w:hAnsi="Times New Roman"/>
@@ -15877,7 +15877,7 @@
       <w:pPr>
         <w:pStyle w:val="Heading2"/>
       </w:pPr>
-      <w:bookmarkStart w:id="69" w:name="_Toc243065042"/>
+      <w:bookmarkStart w:id="69" w:name="_Toc243065400"/>
       <w:r>
         <w:rPr>
           <w:rFonts w:ascii="Times New Roman" w:hAnsi="Times New Roman"/>
@@ -16071,7 +16071,7 @@
       <w:pPr>
         <w:pStyle w:val="Heading2"/>
       </w:pPr>
-      <w:bookmarkStart w:id="70" w:name="_Toc243065043"/>
+      <w:bookmarkStart w:id="70" w:name="_Toc243065401"/>
       <w:r>
         <w:rPr>
           <w:rFonts w:ascii="Times New Roman" w:hAnsi="Times New Roman"/>
@@ -16211,7 +16211,7 @@
       <w:pPr>
         <w:pStyle w:val="Heading2"/>
       </w:pPr>
-      <w:bookmarkStart w:id="71" w:name="_Toc243065044"/>
+      <w:bookmarkStart w:id="71" w:name="_Toc243065402"/>
       <w:r>
         <w:rPr>
           <w:rFonts w:ascii="Times New Roman" w:hAnsi="Times New Roman"/>
@@ -16411,7 +16411,7 @@
       <w:pPr>
         <w:pStyle w:val="Heading2"/>
       </w:pPr>
-      <w:bookmarkStart w:id="72" w:name="_Toc243065045"/>
+      <w:bookmarkStart w:id="72" w:name="_Toc243065403"/>
       <w:r>
         <w:rPr>
           <w:rFonts w:ascii="Times New Roman" w:hAnsi="Times New Roman"/>
@@ -16490,7 +16490,7 @@
       <w:pPr>
         <w:pStyle w:val="Heading2"/>
       </w:pPr>
-      <w:bookmarkStart w:id="73" w:name="_Toc243065046"/>
+      <w:bookmarkStart w:id="73" w:name="_Toc243065404"/>
       <w:r>
         <w:rPr>
           <w:rFonts w:ascii="Times New Roman" w:hAnsi="Times New Roman"/>
@@ -16837,31 +16837,31 @@
       </w:rPr>
     </w:lvl>
   </w:abstractNum>
-  <w:num w:numId="1" w16cid:durableId="1257522990">
+  <w:num w:numId="1" w16cid:durableId="247616228">
     <w:abstractNumId w:val="8"/>
   </w:num>
-  <w:num w:numId="2" w16cid:durableId="386534886">
+  <w:num w:numId="2" w16cid:durableId="1664625350">
     <w:abstractNumId w:val="6"/>
   </w:num>
-  <w:num w:numId="3" w16cid:durableId="998580661">
+  <w:num w:numId="3" w16cid:durableId="18354680">
     <w:abstractNumId w:val="5"/>
   </w:num>
-  <w:num w:numId="4" w16cid:durableId="1389918555">
+  <w:num w:numId="4" w16cid:durableId="135343296">
     <w:abstractNumId w:val="4"/>
   </w:num>
-  <w:num w:numId="5" w16cid:durableId="1232236378">
+  <w:num w:numId="5" w16cid:durableId="830095619">
     <w:abstractNumId w:val="7"/>
   </w:num>
-  <w:num w:numId="6" w16cid:durableId="942497771">
+  <w:num w:numId="6" w16cid:durableId="1201820011">
     <w:abstractNumId w:val="3"/>
   </w:num>
-  <w:num w:numId="7" w16cid:durableId="1225874029">
+  <w:num w:numId="7" w16cid:durableId="1993826089">
     <w:abstractNumId w:val="2"/>
   </w:num>
-  <w:num w:numId="8" w16cid:durableId="564337520">
+  <w:num w:numId="8" w16cid:durableId="2060542987">
     <w:abstractNumId w:val="1"/>
   </w:num>
-  <w:num w:numId="9" w16cid:durableId="1292903201">
+  <w:num w:numId="9" w16cid:durableId="425611954">
     <w:abstractNumId w:val="0"/>
   </w:num>
 </w:numbering>
@@ -28261,7 +28261,7 @@
     <w:autoRedefine/>
     <w:uiPriority w:val="39"/>
     <w:unhideWhenUsed/>
-    <w:rsid w:val="00713B08"/>
+    <w:rsid w:val="00702D51"/>
     <w:pPr>
       <w:spacing w:after="100"/>
     </w:pPr>
@@ -28273,7 +28273,7 @@
     <w:autoRedefine/>
     <w:uiPriority w:val="39"/>
     <w:unhideWhenUsed/>
-    <w:rsid w:val="00713B08"/>
+    <w:rsid w:val="00702D51"/>
     <w:pPr>
       <w:spacing w:after="100"/>
       <w:ind w:left="240"/>
@@ -28284,7 +28284,7 @@
     <w:basedOn w:val="DefaultParagraphFont"/>
     <w:uiPriority w:val="99"/>
     <w:unhideWhenUsed/>
-    <w:rsid w:val="00713B08"/>
+    <w:rsid w:val="00702D51"/>
     <w:rPr>
       <w:color w:val="0000FF" w:themeColor="hyperlink"/>
       <w:u w:val="single"/>

</xml_diff>

<commit_message>
Fill guide designation (Assistant Professor)
</commit_message>
<xml_diff>
--- a/report/CyberTrace_Project_Report.docx
+++ b/report/CyberTrace_Project_Report.docx
@@ -11,7 +11,7 @@
           <w:noProof/>
         </w:rPr>
         <w:drawing>
-          <wp:inline distT="0" distB="0" distL="0" distR="0" wp14:anchorId="360640D3" wp14:editId="28F1B86B">
+          <wp:inline distT="0" distB="0" distL="0" distR="0" wp14:anchorId="0C8AB871" wp14:editId="40D28F5B">
             <wp:extent cx="2560320" cy="816494"/>
             <wp:effectExtent l="0" t="0" r="0" b="0"/>
             <wp:docPr id="1" name="Picture 1"/>
@@ -521,10 +521,10 @@
         <w:jc w:val="both"/>
       </w:pPr>
       <w:r>
-        <w:t>It is our pleasure to express with a deep sense of gratitude to our project guide, Dr. Benila S, [Designation], School of Computer Science and Engineering, Vellore Institute of Technology, Chennai, for the constant guidance, continual encouragement, and understanding; more than all, for teaching us patience throughout our endeavor. Our association with the guide is not confined to academics alone, but has been a great opportunity to work with an intellectual and an expert in the field of hardware security a</w:t>
-      </w:r>
-      <w:r>
-        <w:t>nd cryptography.</w:t>
+        <w:t>It is our pleasure to express with a deep sense of gratitude to our project guide, Dr. Benila S, Assistant Professor, School of Computer Science and Engineering, Vellore Institute of Technology, Chennai, for the constant guidance, continual encouragement, and understanding; more than all, for teaching us patience throughout our endeavor. Our association with the guide is not confined to academics alone, but has been a great opportunity to work with an intellectual and an expert in the field of hardware secu</w:t>
+      </w:r>
+      <w:r>
+        <w:t>rity and cryptography.</w:t>
       </w:r>
     </w:p>
     <w:p>
@@ -666,7 +666,7 @@
       <w:r>
         <w:fldChar w:fldCharType="separate"/>
       </w:r>
-      <w:hyperlink w:anchor="_Toc243065331" w:history="1">
+      <w:hyperlink w:anchor="_Toc243071242" w:history="1">
         <w:r>
           <w:rPr>
             <w:rStyle w:val="Hyperlink"/>
@@ -693,7 +693,7 @@
             <w:noProof/>
             <w:webHidden/>
           </w:rPr>
-          <w:instrText xml:space="preserve"> PAGEREF _Toc243065331 \h </w:instrText>
+          <w:instrText xml:space="preserve"> PAGEREF _Toc243071242 \h </w:instrText>
         </w:r>
         <w:r>
           <w:rPr>
@@ -740,7 +740,7 @@
           <w14:ligatures w14:val="standardContextual"/>
         </w:rPr>
       </w:pPr>
-      <w:hyperlink w:anchor="_Toc243065332" w:history="1">
+      <w:hyperlink w:anchor="_Toc243071243" w:history="1">
         <w:r>
           <w:rPr>
             <w:rStyle w:val="Hyperlink"/>
@@ -767,7 +767,7 @@
             <w:noProof/>
             <w:webHidden/>
           </w:rPr>
-          <w:instrText xml:space="preserve"> PAGEREF _Toc243065332 \h </w:instrText>
+          <w:instrText xml:space="preserve"> PAGEREF _Toc243071243 \h </w:instrText>
         </w:r>
         <w:r>
           <w:rPr>
@@ -814,7 +814,7 @@
           <w14:ligatures w14:val="standardContextual"/>
         </w:rPr>
       </w:pPr>
-      <w:hyperlink w:anchor="_Toc243065333" w:history="1">
+      <w:hyperlink w:anchor="_Toc243071244" w:history="1">
         <w:r>
           <w:rPr>
             <w:rStyle w:val="Hyperlink"/>
@@ -841,7 +841,7 @@
             <w:noProof/>
             <w:webHidden/>
           </w:rPr>
-          <w:instrText xml:space="preserve"> PAGEREF _Toc243065333 \h </w:instrText>
+          <w:instrText xml:space="preserve"> PAGEREF _Toc243071244 \h </w:instrText>
         </w:r>
         <w:r>
           <w:rPr>
@@ -888,7 +888,7 @@
           <w14:ligatures w14:val="standardContextual"/>
         </w:rPr>
       </w:pPr>
-      <w:hyperlink w:anchor="_Toc243065334" w:history="1">
+      <w:hyperlink w:anchor="_Toc243071245" w:history="1">
         <w:r>
           <w:rPr>
             <w:rStyle w:val="Hyperlink"/>
@@ -915,7 +915,7 @@
             <w:noProof/>
             <w:webHidden/>
           </w:rPr>
-          <w:instrText xml:space="preserve"> PAGEREF _Toc243065334 \h </w:instrText>
+          <w:instrText xml:space="preserve"> PAGEREF _Toc243071245 \h </w:instrText>
         </w:r>
         <w:r>
           <w:rPr>
@@ -962,7 +962,7 @@
           <w14:ligatures w14:val="standardContextual"/>
         </w:rPr>
       </w:pPr>
-      <w:hyperlink w:anchor="_Toc243065335" w:history="1">
+      <w:hyperlink w:anchor="_Toc243071246" w:history="1">
         <w:r>
           <w:rPr>
             <w:rStyle w:val="Hyperlink"/>
@@ -989,7 +989,7 @@
             <w:noProof/>
             <w:webHidden/>
           </w:rPr>
-          <w:instrText xml:space="preserve"> PAGEREF _Toc243065335 \h </w:instrText>
+          <w:instrText xml:space="preserve"> PAGEREF _Toc243071246 \h </w:instrText>
         </w:r>
         <w:r>
           <w:rPr>
@@ -1036,7 +1036,7 @@
           <w14:ligatures w14:val="standardContextual"/>
         </w:rPr>
       </w:pPr>
-      <w:hyperlink w:anchor="_Toc243065336" w:history="1">
+      <w:hyperlink w:anchor="_Toc243071247" w:history="1">
         <w:r>
           <w:rPr>
             <w:rStyle w:val="Hyperlink"/>
@@ -1063,7 +1063,7 @@
             <w:noProof/>
             <w:webHidden/>
           </w:rPr>
-          <w:instrText xml:space="preserve"> PAGEREF _Toc243065336 \h </w:instrText>
+          <w:instrText xml:space="preserve"> PAGEREF _Toc243071247 \h </w:instrText>
         </w:r>
         <w:r>
           <w:rPr>
@@ -1110,7 +1110,7 @@
           <w14:ligatures w14:val="standardContextual"/>
         </w:rPr>
       </w:pPr>
-      <w:hyperlink w:anchor="_Toc243065337" w:history="1">
+      <w:hyperlink w:anchor="_Toc243071248" w:history="1">
         <w:r>
           <w:rPr>
             <w:rStyle w:val="Hyperlink"/>
@@ -1137,7 +1137,7 @@
             <w:noProof/>
             <w:webHidden/>
           </w:rPr>
-          <w:instrText xml:space="preserve"> PAGEREF _Toc243065337 \h </w:instrText>
+          <w:instrText xml:space="preserve"> PAGEREF _Toc243071248 \h </w:instrText>
         </w:r>
         <w:r>
           <w:rPr>
@@ -1184,7 +1184,7 @@
           <w14:ligatures w14:val="standardContextual"/>
         </w:rPr>
       </w:pPr>
-      <w:hyperlink w:anchor="_Toc243065338" w:history="1">
+      <w:hyperlink w:anchor="_Toc243071249" w:history="1">
         <w:r>
           <w:rPr>
             <w:rStyle w:val="Hyperlink"/>
@@ -1211,7 +1211,7 @@
             <w:noProof/>
             <w:webHidden/>
           </w:rPr>
-          <w:instrText xml:space="preserve"> PAGEREF _Toc243065338 \h </w:instrText>
+          <w:instrText xml:space="preserve"> PAGEREF _Toc243071249 \h </w:instrText>
         </w:r>
         <w:r>
           <w:rPr>
@@ -1258,7 +1258,7 @@
           <w14:ligatures w14:val="standardContextual"/>
         </w:rPr>
       </w:pPr>
-      <w:hyperlink w:anchor="_Toc243065339" w:history="1">
+      <w:hyperlink w:anchor="_Toc243071250" w:history="1">
         <w:r>
           <w:rPr>
             <w:rStyle w:val="Hyperlink"/>
@@ -1285,7 +1285,7 @@
             <w:noProof/>
             <w:webHidden/>
           </w:rPr>
-          <w:instrText xml:space="preserve"> PAGEREF _Toc243065339 \h </w:instrText>
+          <w:instrText xml:space="preserve"> PAGEREF _Toc243071250 \h </w:instrText>
         </w:r>
         <w:r>
           <w:rPr>
@@ -1332,7 +1332,7 @@
           <w14:ligatures w14:val="standardContextual"/>
         </w:rPr>
       </w:pPr>
-      <w:hyperlink w:anchor="_Toc243065340" w:history="1">
+      <w:hyperlink w:anchor="_Toc243071251" w:history="1">
         <w:r>
           <w:rPr>
             <w:rStyle w:val="Hyperlink"/>
@@ -1359,7 +1359,7 @@
             <w:noProof/>
             <w:webHidden/>
           </w:rPr>
-          <w:instrText xml:space="preserve"> PAGEREF _Toc243065340 \h </w:instrText>
+          <w:instrText xml:space="preserve"> PAGEREF _Toc243071251 \h </w:instrText>
         </w:r>
         <w:r>
           <w:rPr>
@@ -1406,7 +1406,7 @@
           <w14:ligatures w14:val="standardContextual"/>
         </w:rPr>
       </w:pPr>
-      <w:hyperlink w:anchor="_Toc243065341" w:history="1">
+      <w:hyperlink w:anchor="_Toc243071252" w:history="1">
         <w:r>
           <w:rPr>
             <w:rStyle w:val="Hyperlink"/>
@@ -1433,7 +1433,7 @@
             <w:noProof/>
             <w:webHidden/>
           </w:rPr>
-          <w:instrText xml:space="preserve"> PAGEREF _Toc243065341 \h </w:instrText>
+          <w:instrText xml:space="preserve"> PAGEREF _Toc243071252 \h </w:instrText>
         </w:r>
         <w:r>
           <w:rPr>
@@ -1480,7 +1480,7 @@
           <w14:ligatures w14:val="standardContextual"/>
         </w:rPr>
       </w:pPr>
-      <w:hyperlink w:anchor="_Toc243065342" w:history="1">
+      <w:hyperlink w:anchor="_Toc243071253" w:history="1">
         <w:r>
           <w:rPr>
             <w:rStyle w:val="Hyperlink"/>
@@ -1507,7 +1507,7 @@
             <w:noProof/>
             <w:webHidden/>
           </w:rPr>
-          <w:instrText xml:space="preserve"> PAGEREF _Toc243065342 \h </w:instrText>
+          <w:instrText xml:space="preserve"> PAGEREF _Toc243071253 \h </w:instrText>
         </w:r>
         <w:r>
           <w:rPr>
@@ -1554,7 +1554,7 @@
           <w14:ligatures w14:val="standardContextual"/>
         </w:rPr>
       </w:pPr>
-      <w:hyperlink w:anchor="_Toc243065343" w:history="1">
+      <w:hyperlink w:anchor="_Toc243071254" w:history="1">
         <w:r>
           <w:rPr>
             <w:rStyle w:val="Hyperlink"/>
@@ -1581,7 +1581,7 @@
             <w:noProof/>
             <w:webHidden/>
           </w:rPr>
-          <w:instrText xml:space="preserve"> PAGEREF _Toc243065343 \h </w:instrText>
+          <w:instrText xml:space="preserve"> PAGEREF _Toc243071254 \h </w:instrText>
         </w:r>
         <w:r>
           <w:rPr>
@@ -1628,7 +1628,7 @@
           <w14:ligatures w14:val="standardContextual"/>
         </w:rPr>
       </w:pPr>
-      <w:hyperlink w:anchor="_Toc243065344" w:history="1">
+      <w:hyperlink w:anchor="_Toc243071255" w:history="1">
         <w:r>
           <w:rPr>
             <w:rStyle w:val="Hyperlink"/>
@@ -1655,7 +1655,7 @@
             <w:noProof/>
             <w:webHidden/>
           </w:rPr>
-          <w:instrText xml:space="preserve"> PAGEREF _Toc243065344 \h </w:instrText>
+          <w:instrText xml:space="preserve"> PAGEREF _Toc243071255 \h </w:instrText>
         </w:r>
         <w:r>
           <w:rPr>
@@ -1702,7 +1702,7 @@
           <w14:ligatures w14:val="standardContextual"/>
         </w:rPr>
       </w:pPr>
-      <w:hyperlink w:anchor="_Toc243065345" w:history="1">
+      <w:hyperlink w:anchor="_Toc243071256" w:history="1">
         <w:r>
           <w:rPr>
             <w:rStyle w:val="Hyperlink"/>
@@ -1729,7 +1729,7 @@
             <w:noProof/>
             <w:webHidden/>
           </w:rPr>
-          <w:instrText xml:space="preserve"> PAGEREF _Toc243065345 \h </w:instrText>
+          <w:instrText xml:space="preserve"> PAGEREF _Toc243071256 \h </w:instrText>
         </w:r>
         <w:r>
           <w:rPr>
@@ -1776,7 +1776,7 @@
           <w14:ligatures w14:val="standardContextual"/>
         </w:rPr>
       </w:pPr>
-      <w:hyperlink w:anchor="_Toc243065346" w:history="1">
+      <w:hyperlink w:anchor="_Toc243071257" w:history="1">
         <w:r>
           <w:rPr>
             <w:rStyle w:val="Hyperlink"/>
@@ -1803,7 +1803,7 @@
             <w:noProof/>
             <w:webHidden/>
           </w:rPr>
-          <w:instrText xml:space="preserve"> PAGEREF _Toc243065346 \h </w:instrText>
+          <w:instrText xml:space="preserve"> PAGEREF _Toc243071257 \h </w:instrText>
         </w:r>
         <w:r>
           <w:rPr>
@@ -1850,7 +1850,7 @@
           <w14:ligatures w14:val="standardContextual"/>
         </w:rPr>
       </w:pPr>
-      <w:hyperlink w:anchor="_Toc243065347" w:history="1">
+      <w:hyperlink w:anchor="_Toc243071258" w:history="1">
         <w:r>
           <w:rPr>
             <w:rStyle w:val="Hyperlink"/>
@@ -1877,7 +1877,7 @@
             <w:noProof/>
             <w:webHidden/>
           </w:rPr>
-          <w:instrText xml:space="preserve"> PAGEREF _Toc243065347 \h </w:instrText>
+          <w:instrText xml:space="preserve"> PAGEREF _Toc243071258 \h </w:instrText>
         </w:r>
         <w:r>
           <w:rPr>
@@ -1924,7 +1924,7 @@
           <w14:ligatures w14:val="standardContextual"/>
         </w:rPr>
       </w:pPr>
-      <w:hyperlink w:anchor="_Toc243065348" w:history="1">
+      <w:hyperlink w:anchor="_Toc243071259" w:history="1">
         <w:r>
           <w:rPr>
             <w:rStyle w:val="Hyperlink"/>
@@ -1951,7 +1951,7 @@
             <w:noProof/>
             <w:webHidden/>
           </w:rPr>
-          <w:instrText xml:space="preserve"> PAGEREF _Toc243065348 \h </w:instrText>
+          <w:instrText xml:space="preserve"> PAGEREF _Toc243071259 \h </w:instrText>
         </w:r>
         <w:r>
           <w:rPr>
@@ -1998,7 +1998,7 @@
           <w14:ligatures w14:val="standardContextual"/>
         </w:rPr>
       </w:pPr>
-      <w:hyperlink w:anchor="_Toc243065349" w:history="1">
+      <w:hyperlink w:anchor="_Toc243071260" w:history="1">
         <w:r>
           <w:rPr>
             <w:rStyle w:val="Hyperlink"/>
@@ -2025,7 +2025,7 @@
             <w:noProof/>
             <w:webHidden/>
           </w:rPr>
-          <w:instrText xml:space="preserve"> PAGEREF _Toc243065349 \h </w:instrText>
+          <w:instrText xml:space="preserve"> PAGEREF _Toc243071260 \h </w:instrText>
         </w:r>
         <w:r>
           <w:rPr>
@@ -2072,7 +2072,7 @@
           <w14:ligatures w14:val="standardContextual"/>
         </w:rPr>
       </w:pPr>
-      <w:hyperlink w:anchor="_Toc243065350" w:history="1">
+      <w:hyperlink w:anchor="_Toc243071261" w:history="1">
         <w:r>
           <w:rPr>
             <w:rStyle w:val="Hyperlink"/>
@@ -2099,7 +2099,7 @@
             <w:noProof/>
             <w:webHidden/>
           </w:rPr>
-          <w:instrText xml:space="preserve"> PAGEREF _Toc243065350 \h </w:instrText>
+          <w:instrText xml:space="preserve"> PAGEREF _Toc243071261 \h </w:instrText>
         </w:r>
         <w:r>
           <w:rPr>
@@ -2146,7 +2146,7 @@
           <w14:ligatures w14:val="standardContextual"/>
         </w:rPr>
       </w:pPr>
-      <w:hyperlink w:anchor="_Toc243065351" w:history="1">
+      <w:hyperlink w:anchor="_Toc243071262" w:history="1">
         <w:r>
           <w:rPr>
             <w:rStyle w:val="Hyperlink"/>
@@ -2173,7 +2173,7 @@
             <w:noProof/>
             <w:webHidden/>
           </w:rPr>
-          <w:instrText xml:space="preserve"> PAGEREF _Toc243065351 \h </w:instrText>
+          <w:instrText xml:space="preserve"> PAGEREF _Toc243071262 \h </w:instrText>
         </w:r>
         <w:r>
           <w:rPr>
@@ -2220,7 +2220,7 @@
           <w14:ligatures w14:val="standardContextual"/>
         </w:rPr>
       </w:pPr>
-      <w:hyperlink w:anchor="_Toc243065352" w:history="1">
+      <w:hyperlink w:anchor="_Toc243071263" w:history="1">
         <w:r>
           <w:rPr>
             <w:rStyle w:val="Hyperlink"/>
@@ -2247,7 +2247,7 @@
             <w:noProof/>
             <w:webHidden/>
           </w:rPr>
-          <w:instrText xml:space="preserve"> PAGEREF _Toc243065352 \h </w:instrText>
+          <w:instrText xml:space="preserve"> PAGEREF _Toc243071263 \h </w:instrText>
         </w:r>
         <w:r>
           <w:rPr>
@@ -2294,7 +2294,7 @@
           <w14:ligatures w14:val="standardContextual"/>
         </w:rPr>
       </w:pPr>
-      <w:hyperlink w:anchor="_Toc243065353" w:history="1">
+      <w:hyperlink w:anchor="_Toc243071264" w:history="1">
         <w:r>
           <w:rPr>
             <w:rStyle w:val="Hyperlink"/>
@@ -2321,7 +2321,7 @@
             <w:noProof/>
             <w:webHidden/>
           </w:rPr>
-          <w:instrText xml:space="preserve"> PAGEREF _Toc243065353 \h </w:instrText>
+          <w:instrText xml:space="preserve"> PAGEREF _Toc243071264 \h </w:instrText>
         </w:r>
         <w:r>
           <w:rPr>
@@ -2368,7 +2368,7 @@
           <w14:ligatures w14:val="standardContextual"/>
         </w:rPr>
       </w:pPr>
-      <w:hyperlink w:anchor="_Toc243065354" w:history="1">
+      <w:hyperlink w:anchor="_Toc243071265" w:history="1">
         <w:r>
           <w:rPr>
             <w:rStyle w:val="Hyperlink"/>
@@ -2395,7 +2395,7 @@
             <w:noProof/>
             <w:webHidden/>
           </w:rPr>
-          <w:instrText xml:space="preserve"> PAGEREF _Toc243065354 \h </w:instrText>
+          <w:instrText xml:space="preserve"> PAGEREF _Toc243071265 \h </w:instrText>
         </w:r>
         <w:r>
           <w:rPr>
@@ -2442,7 +2442,7 @@
           <w14:ligatures w14:val="standardContextual"/>
         </w:rPr>
       </w:pPr>
-      <w:hyperlink w:anchor="_Toc243065355" w:history="1">
+      <w:hyperlink w:anchor="_Toc243071266" w:history="1">
         <w:r>
           <w:rPr>
             <w:rStyle w:val="Hyperlink"/>
@@ -2469,7 +2469,7 @@
             <w:noProof/>
             <w:webHidden/>
           </w:rPr>
-          <w:instrText xml:space="preserve"> PAGEREF _Toc243065355 \h </w:instrText>
+          <w:instrText xml:space="preserve"> PAGEREF _Toc243071266 \h </w:instrText>
         </w:r>
         <w:r>
           <w:rPr>
@@ -2516,7 +2516,7 @@
           <w14:ligatures w14:val="standardContextual"/>
         </w:rPr>
       </w:pPr>
-      <w:hyperlink w:anchor="_Toc243065356" w:history="1">
+      <w:hyperlink w:anchor="_Toc243071267" w:history="1">
         <w:r>
           <w:rPr>
             <w:rStyle w:val="Hyperlink"/>
@@ -2543,7 +2543,7 @@
             <w:noProof/>
             <w:webHidden/>
           </w:rPr>
-          <w:instrText xml:space="preserve"> PAGEREF _Toc243065356 \h </w:instrText>
+          <w:instrText xml:space="preserve"> PAGEREF _Toc243071267 \h </w:instrText>
         </w:r>
         <w:r>
           <w:rPr>
@@ -2590,7 +2590,7 @@
           <w14:ligatures w14:val="standardContextual"/>
         </w:rPr>
       </w:pPr>
-      <w:hyperlink w:anchor="_Toc243065357" w:history="1">
+      <w:hyperlink w:anchor="_Toc243071268" w:history="1">
         <w:r>
           <w:rPr>
             <w:rStyle w:val="Hyperlink"/>
@@ -2617,7 +2617,7 @@
             <w:noProof/>
             <w:webHidden/>
           </w:rPr>
-          <w:instrText xml:space="preserve"> PAGEREF _Toc243065357 \h </w:instrText>
+          <w:instrText xml:space="preserve"> PAGEREF _Toc243071268 \h </w:instrText>
         </w:r>
         <w:r>
           <w:rPr>
@@ -2664,7 +2664,7 @@
           <w14:ligatures w14:val="standardContextual"/>
         </w:rPr>
       </w:pPr>
-      <w:hyperlink w:anchor="_Toc243065358" w:history="1">
+      <w:hyperlink w:anchor="_Toc243071269" w:history="1">
         <w:r>
           <w:rPr>
             <w:rStyle w:val="Hyperlink"/>
@@ -2691,7 +2691,7 @@
             <w:noProof/>
             <w:webHidden/>
           </w:rPr>
-          <w:instrText xml:space="preserve"> PAGEREF _Toc243065358 \h </w:instrText>
+          <w:instrText xml:space="preserve"> PAGEREF _Toc243071269 \h </w:instrText>
         </w:r>
         <w:r>
           <w:rPr>
@@ -2738,7 +2738,7 @@
           <w14:ligatures w14:val="standardContextual"/>
         </w:rPr>
       </w:pPr>
-      <w:hyperlink w:anchor="_Toc243065359" w:history="1">
+      <w:hyperlink w:anchor="_Toc243071270" w:history="1">
         <w:r>
           <w:rPr>
             <w:rStyle w:val="Hyperlink"/>
@@ -2765,7 +2765,7 @@
             <w:noProof/>
             <w:webHidden/>
           </w:rPr>
-          <w:instrText xml:space="preserve"> PAGEREF _Toc243065359 \h </w:instrText>
+          <w:instrText xml:space="preserve"> PAGEREF _Toc243071270 \h </w:instrText>
         </w:r>
         <w:r>
           <w:rPr>
@@ -2812,7 +2812,7 @@
           <w14:ligatures w14:val="standardContextual"/>
         </w:rPr>
       </w:pPr>
-      <w:hyperlink w:anchor="_Toc243065360" w:history="1">
+      <w:hyperlink w:anchor="_Toc243071271" w:history="1">
         <w:r>
           <w:rPr>
             <w:rStyle w:val="Hyperlink"/>
@@ -2839,7 +2839,7 @@
             <w:noProof/>
             <w:webHidden/>
           </w:rPr>
-          <w:instrText xml:space="preserve"> PAGEREF _Toc243065360 \h </w:instrText>
+          <w:instrText xml:space="preserve"> PAGEREF _Toc243071271 \h </w:instrText>
         </w:r>
         <w:r>
           <w:rPr>
@@ -2886,7 +2886,7 @@
           <w14:ligatures w14:val="standardContextual"/>
         </w:rPr>
       </w:pPr>
-      <w:hyperlink w:anchor="_Toc243065361" w:history="1">
+      <w:hyperlink w:anchor="_Toc243071272" w:history="1">
         <w:r>
           <w:rPr>
             <w:rStyle w:val="Hyperlink"/>
@@ -2913,7 +2913,7 @@
             <w:noProof/>
             <w:webHidden/>
           </w:rPr>
-          <w:instrText xml:space="preserve"> PAGEREF _Toc243065361 \h </w:instrText>
+          <w:instrText xml:space="preserve"> PAGEREF _Toc243071272 \h </w:instrText>
         </w:r>
         <w:r>
           <w:rPr>
@@ -2960,7 +2960,7 @@
           <w14:ligatures w14:val="standardContextual"/>
         </w:rPr>
       </w:pPr>
-      <w:hyperlink w:anchor="_Toc243065362" w:history="1">
+      <w:hyperlink w:anchor="_Toc243071273" w:history="1">
         <w:r>
           <w:rPr>
             <w:rStyle w:val="Hyperlink"/>
@@ -2987,7 +2987,7 @@
             <w:noProof/>
             <w:webHidden/>
           </w:rPr>
-          <w:instrText xml:space="preserve"> PAGEREF _Toc243065362 \h </w:instrText>
+          <w:instrText xml:space="preserve"> PAGEREF _Toc243071273 \h </w:instrText>
         </w:r>
         <w:r>
           <w:rPr>
@@ -3034,7 +3034,7 @@
           <w14:ligatures w14:val="standardContextual"/>
         </w:rPr>
       </w:pPr>
-      <w:hyperlink w:anchor="_Toc243065363" w:history="1">
+      <w:hyperlink w:anchor="_Toc243071274" w:history="1">
         <w:r>
           <w:rPr>
             <w:rStyle w:val="Hyperlink"/>
@@ -3061,7 +3061,7 @@
             <w:noProof/>
             <w:webHidden/>
           </w:rPr>
-          <w:instrText xml:space="preserve"> PAGEREF _Toc243065363 \h </w:instrText>
+          <w:instrText xml:space="preserve"> PAGEREF _Toc243071274 \h </w:instrText>
         </w:r>
         <w:r>
           <w:rPr>
@@ -3108,7 +3108,7 @@
           <w14:ligatures w14:val="standardContextual"/>
         </w:rPr>
       </w:pPr>
-      <w:hyperlink w:anchor="_Toc243065364" w:history="1">
+      <w:hyperlink w:anchor="_Toc243071275" w:history="1">
         <w:r>
           <w:rPr>
             <w:rStyle w:val="Hyperlink"/>
@@ -3135,7 +3135,7 @@
             <w:noProof/>
             <w:webHidden/>
           </w:rPr>
-          <w:instrText xml:space="preserve"> PAGEREF _Toc243065364 \h </w:instrText>
+          <w:instrText xml:space="preserve"> PAGEREF _Toc243071275 \h </w:instrText>
         </w:r>
         <w:r>
           <w:rPr>
@@ -3182,7 +3182,7 @@
           <w14:ligatures w14:val="standardContextual"/>
         </w:rPr>
       </w:pPr>
-      <w:hyperlink w:anchor="_Toc243065365" w:history="1">
+      <w:hyperlink w:anchor="_Toc243071276" w:history="1">
         <w:r>
           <w:rPr>
             <w:rStyle w:val="Hyperlink"/>
@@ -3209,7 +3209,7 @@
             <w:noProof/>
             <w:webHidden/>
           </w:rPr>
-          <w:instrText xml:space="preserve"> PAGEREF _Toc243065365 \h </w:instrText>
+          <w:instrText xml:space="preserve"> PAGEREF _Toc243071276 \h </w:instrText>
         </w:r>
         <w:r>
           <w:rPr>
@@ -3256,7 +3256,7 @@
           <w14:ligatures w14:val="standardContextual"/>
         </w:rPr>
       </w:pPr>
-      <w:hyperlink w:anchor="_Toc243065366" w:history="1">
+      <w:hyperlink w:anchor="_Toc243071277" w:history="1">
         <w:r>
           <w:rPr>
             <w:rStyle w:val="Hyperlink"/>
@@ -3283,7 +3283,7 @@
             <w:noProof/>
             <w:webHidden/>
           </w:rPr>
-          <w:instrText xml:space="preserve"> PAGEREF _Toc243065366 \h </w:instrText>
+          <w:instrText xml:space="preserve"> PAGEREF _Toc243071277 \h </w:instrText>
         </w:r>
         <w:r>
           <w:rPr>
@@ -3330,7 +3330,7 @@
           <w14:ligatures w14:val="standardContextual"/>
         </w:rPr>
       </w:pPr>
-      <w:hyperlink w:anchor="_Toc243065367" w:history="1">
+      <w:hyperlink w:anchor="_Toc243071278" w:history="1">
         <w:r>
           <w:rPr>
             <w:rStyle w:val="Hyperlink"/>
@@ -3357,7 +3357,7 @@
             <w:noProof/>
             <w:webHidden/>
           </w:rPr>
-          <w:instrText xml:space="preserve"> PAGEREF _Toc243065367 \h </w:instrText>
+          <w:instrText xml:space="preserve"> PAGEREF _Toc243071278 \h </w:instrText>
         </w:r>
         <w:r>
           <w:rPr>
@@ -3404,7 +3404,7 @@
           <w14:ligatures w14:val="standardContextual"/>
         </w:rPr>
       </w:pPr>
-      <w:hyperlink w:anchor="_Toc243065368" w:history="1">
+      <w:hyperlink w:anchor="_Toc243071279" w:history="1">
         <w:r>
           <w:rPr>
             <w:rStyle w:val="Hyperlink"/>
@@ -3431,7 +3431,7 @@
             <w:noProof/>
             <w:webHidden/>
           </w:rPr>
-          <w:instrText xml:space="preserve"> PAGEREF _Toc243065368 \h </w:instrText>
+          <w:instrText xml:space="preserve"> PAGEREF _Toc243071279 \h </w:instrText>
         </w:r>
         <w:r>
           <w:rPr>
@@ -3478,7 +3478,7 @@
           <w14:ligatures w14:val="standardContextual"/>
         </w:rPr>
       </w:pPr>
-      <w:hyperlink w:anchor="_Toc243065369" w:history="1">
+      <w:hyperlink w:anchor="_Toc243071280" w:history="1">
         <w:r>
           <w:rPr>
             <w:rStyle w:val="Hyperlink"/>
@@ -3505,7 +3505,7 @@
             <w:noProof/>
             <w:webHidden/>
           </w:rPr>
-          <w:instrText xml:space="preserve"> PAGEREF _Toc243065369 \h </w:instrText>
+          <w:instrText xml:space="preserve"> PAGEREF _Toc243071280 \h </w:instrText>
         </w:r>
         <w:r>
           <w:rPr>
@@ -3552,7 +3552,7 @@
           <w14:ligatures w14:val="standardContextual"/>
         </w:rPr>
       </w:pPr>
-      <w:hyperlink w:anchor="_Toc243065370" w:history="1">
+      <w:hyperlink w:anchor="_Toc243071281" w:history="1">
         <w:r>
           <w:rPr>
             <w:rStyle w:val="Hyperlink"/>
@@ -3579,7 +3579,7 @@
             <w:noProof/>
             <w:webHidden/>
           </w:rPr>
-          <w:instrText xml:space="preserve"> PAGEREF _Toc243065370 \h </w:instrText>
+          <w:instrText xml:space="preserve"> PAGEREF _Toc243071281 \h </w:instrText>
         </w:r>
         <w:r>
           <w:rPr>
@@ -3626,7 +3626,7 @@
           <w14:ligatures w14:val="standardContextual"/>
         </w:rPr>
       </w:pPr>
-      <w:hyperlink w:anchor="_Toc243065371" w:history="1">
+      <w:hyperlink w:anchor="_Toc243071282" w:history="1">
         <w:r>
           <w:rPr>
             <w:rStyle w:val="Hyperlink"/>
@@ -3653,7 +3653,7 @@
             <w:noProof/>
             <w:webHidden/>
           </w:rPr>
-          <w:instrText xml:space="preserve"> PAGEREF _Toc243065371 \h </w:instrText>
+          <w:instrText xml:space="preserve"> PAGEREF _Toc243071282 \h </w:instrText>
         </w:r>
         <w:r>
           <w:rPr>
@@ -3700,7 +3700,7 @@
           <w14:ligatures w14:val="standardContextual"/>
         </w:rPr>
       </w:pPr>
-      <w:hyperlink w:anchor="_Toc243065372" w:history="1">
+      <w:hyperlink w:anchor="_Toc243071283" w:history="1">
         <w:r>
           <w:rPr>
             <w:rStyle w:val="Hyperlink"/>
@@ -3727,7 +3727,7 @@
             <w:noProof/>
             <w:webHidden/>
           </w:rPr>
-          <w:instrText xml:space="preserve"> PAGEREF _Toc243065372 \h </w:instrText>
+          <w:instrText xml:space="preserve"> PAGEREF _Toc243071283 \h </w:instrText>
         </w:r>
         <w:r>
           <w:rPr>
@@ -3774,7 +3774,7 @@
           <w14:ligatures w14:val="standardContextual"/>
         </w:rPr>
       </w:pPr>
-      <w:hyperlink w:anchor="_Toc243065373" w:history="1">
+      <w:hyperlink w:anchor="_Toc243071284" w:history="1">
         <w:r>
           <w:rPr>
             <w:rStyle w:val="Hyperlink"/>
@@ -3801,7 +3801,7 @@
             <w:noProof/>
             <w:webHidden/>
           </w:rPr>
-          <w:instrText xml:space="preserve"> PAGEREF _Toc243065373 \h </w:instrText>
+          <w:instrText xml:space="preserve"> PAGEREF _Toc243071284 \h </w:instrText>
         </w:r>
         <w:r>
           <w:rPr>
@@ -3848,7 +3848,7 @@
           <w14:ligatures w14:val="standardContextual"/>
         </w:rPr>
       </w:pPr>
-      <w:hyperlink w:anchor="_Toc243065374" w:history="1">
+      <w:hyperlink w:anchor="_Toc243071285" w:history="1">
         <w:r>
           <w:rPr>
             <w:rStyle w:val="Hyperlink"/>
@@ -3875,7 +3875,7 @@
             <w:noProof/>
             <w:webHidden/>
           </w:rPr>
-          <w:instrText xml:space="preserve"> PAGEREF _Toc243065374 \h </w:instrText>
+          <w:instrText xml:space="preserve"> PAGEREF _Toc243071285 \h </w:instrText>
         </w:r>
         <w:r>
           <w:rPr>
@@ -3922,7 +3922,7 @@
           <w14:ligatures w14:val="standardContextual"/>
         </w:rPr>
       </w:pPr>
-      <w:hyperlink w:anchor="_Toc243065375" w:history="1">
+      <w:hyperlink w:anchor="_Toc243071286" w:history="1">
         <w:r>
           <w:rPr>
             <w:rStyle w:val="Hyperlink"/>
@@ -3949,7 +3949,7 @@
             <w:noProof/>
             <w:webHidden/>
           </w:rPr>
-          <w:instrText xml:space="preserve"> PAGEREF _Toc243065375 \h </w:instrText>
+          <w:instrText xml:space="preserve"> PAGEREF _Toc243071286 \h </w:instrText>
         </w:r>
         <w:r>
           <w:rPr>
@@ -3996,7 +3996,7 @@
           <w14:ligatures w14:val="standardContextual"/>
         </w:rPr>
       </w:pPr>
-      <w:hyperlink w:anchor="_Toc243065376" w:history="1">
+      <w:hyperlink w:anchor="_Toc243071287" w:history="1">
         <w:r>
           <w:rPr>
             <w:rStyle w:val="Hyperlink"/>
@@ -4023,7 +4023,7 @@
             <w:noProof/>
             <w:webHidden/>
           </w:rPr>
-          <w:instrText xml:space="preserve"> PAGEREF _Toc243065376 \h </w:instrText>
+          <w:instrText xml:space="preserve"> PAGEREF _Toc243071287 \h </w:instrText>
         </w:r>
         <w:r>
           <w:rPr>
@@ -4070,7 +4070,7 @@
           <w14:ligatures w14:val="standardContextual"/>
         </w:rPr>
       </w:pPr>
-      <w:hyperlink w:anchor="_Toc243065377" w:history="1">
+      <w:hyperlink w:anchor="_Toc243071288" w:history="1">
         <w:r>
           <w:rPr>
             <w:rStyle w:val="Hyperlink"/>
@@ -4097,7 +4097,7 @@
             <w:noProof/>
             <w:webHidden/>
           </w:rPr>
-          <w:instrText xml:space="preserve"> PAGEREF _Toc243065377 \h </w:instrText>
+          <w:instrText xml:space="preserve"> PAGEREF _Toc243071288 \h </w:instrText>
         </w:r>
         <w:r>
           <w:rPr>
@@ -4144,7 +4144,7 @@
           <w14:ligatures w14:val="standardContextual"/>
         </w:rPr>
       </w:pPr>
-      <w:hyperlink w:anchor="_Toc243065378" w:history="1">
+      <w:hyperlink w:anchor="_Toc243071289" w:history="1">
         <w:r>
           <w:rPr>
             <w:rStyle w:val="Hyperlink"/>
@@ -4171,7 +4171,7 @@
             <w:noProof/>
             <w:webHidden/>
           </w:rPr>
-          <w:instrText xml:space="preserve"> PAGEREF _Toc243065378 \h </w:instrText>
+          <w:instrText xml:space="preserve"> PAGEREF _Toc243071289 \h </w:instrText>
         </w:r>
         <w:r>
           <w:rPr>
@@ -4218,7 +4218,7 @@
           <w14:ligatures w14:val="standardContextual"/>
         </w:rPr>
       </w:pPr>
-      <w:hyperlink w:anchor="_Toc243065379" w:history="1">
+      <w:hyperlink w:anchor="_Toc243071290" w:history="1">
         <w:r>
           <w:rPr>
             <w:rStyle w:val="Hyperlink"/>
@@ -4245,7 +4245,7 @@
             <w:noProof/>
             <w:webHidden/>
           </w:rPr>
-          <w:instrText xml:space="preserve"> PAGEREF _Toc243065379 \h </w:instrText>
+          <w:instrText xml:space="preserve"> PAGEREF _Toc243071290 \h </w:instrText>
         </w:r>
         <w:r>
           <w:rPr>
@@ -4292,7 +4292,7 @@
           <w14:ligatures w14:val="standardContextual"/>
         </w:rPr>
       </w:pPr>
-      <w:hyperlink w:anchor="_Toc243065380" w:history="1">
+      <w:hyperlink w:anchor="_Toc243071291" w:history="1">
         <w:r>
           <w:rPr>
             <w:rStyle w:val="Hyperlink"/>
@@ -4319,7 +4319,7 @@
             <w:noProof/>
             <w:webHidden/>
           </w:rPr>
-          <w:instrText xml:space="preserve"> PAGEREF _Toc243065380 \h </w:instrText>
+          <w:instrText xml:space="preserve"> PAGEREF _Toc243071291 \h </w:instrText>
         </w:r>
         <w:r>
           <w:rPr>
@@ -4366,7 +4366,7 @@
           <w14:ligatures w14:val="standardContextual"/>
         </w:rPr>
       </w:pPr>
-      <w:hyperlink w:anchor="_Toc243065381" w:history="1">
+      <w:hyperlink w:anchor="_Toc243071292" w:history="1">
         <w:r>
           <w:rPr>
             <w:rStyle w:val="Hyperlink"/>
@@ -4393,7 +4393,7 @@
             <w:noProof/>
             <w:webHidden/>
           </w:rPr>
-          <w:instrText xml:space="preserve"> PAGEREF _Toc243065381 \h </w:instrText>
+          <w:instrText xml:space="preserve"> PAGEREF _Toc243071292 \h </w:instrText>
         </w:r>
         <w:r>
           <w:rPr>
@@ -4440,7 +4440,7 @@
           <w14:ligatures w14:val="standardContextual"/>
         </w:rPr>
       </w:pPr>
-      <w:hyperlink w:anchor="_Toc243065382" w:history="1">
+      <w:hyperlink w:anchor="_Toc243071293" w:history="1">
         <w:r>
           <w:rPr>
             <w:rStyle w:val="Hyperlink"/>
@@ -4467,7 +4467,7 @@
             <w:noProof/>
             <w:webHidden/>
           </w:rPr>
-          <w:instrText xml:space="preserve"> PAGEREF _Toc243065382 \h </w:instrText>
+          <w:instrText xml:space="preserve"> PAGEREF _Toc243071293 \h </w:instrText>
         </w:r>
         <w:r>
           <w:rPr>
@@ -4514,7 +4514,7 @@
           <w14:ligatures w14:val="standardContextual"/>
         </w:rPr>
       </w:pPr>
-      <w:hyperlink w:anchor="_Toc243065383" w:history="1">
+      <w:hyperlink w:anchor="_Toc243071294" w:history="1">
         <w:r>
           <w:rPr>
             <w:rStyle w:val="Hyperlink"/>
@@ -4541,7 +4541,7 @@
             <w:noProof/>
             <w:webHidden/>
           </w:rPr>
-          <w:instrText xml:space="preserve"> PAGEREF _Toc243065383 \h </w:instrText>
+          <w:instrText xml:space="preserve"> PAGEREF _Toc243071294 \h </w:instrText>
         </w:r>
         <w:r>
           <w:rPr>
@@ -4588,7 +4588,7 @@
           <w14:ligatures w14:val="standardContextual"/>
         </w:rPr>
       </w:pPr>
-      <w:hyperlink w:anchor="_Toc243065384" w:history="1">
+      <w:hyperlink w:anchor="_Toc243071295" w:history="1">
         <w:r>
           <w:rPr>
             <w:rStyle w:val="Hyperlink"/>
@@ -4615,7 +4615,7 @@
             <w:noProof/>
             <w:webHidden/>
           </w:rPr>
-          <w:instrText xml:space="preserve"> PAGEREF _Toc243065384 \h </w:instrText>
+          <w:instrText xml:space="preserve"> PAGEREF _Toc243071295 \h </w:instrText>
         </w:r>
         <w:r>
           <w:rPr>
@@ -4662,7 +4662,7 @@
           <w14:ligatures w14:val="standardContextual"/>
         </w:rPr>
       </w:pPr>
-      <w:hyperlink w:anchor="_Toc243065385" w:history="1">
+      <w:hyperlink w:anchor="_Toc243071296" w:history="1">
         <w:r>
           <w:rPr>
             <w:rStyle w:val="Hyperlink"/>
@@ -4689,7 +4689,7 @@
             <w:noProof/>
             <w:webHidden/>
           </w:rPr>
-          <w:instrText xml:space="preserve"> PAGEREF _Toc243065385 \h </w:instrText>
+          <w:instrText xml:space="preserve"> PAGEREF _Toc243071296 \h </w:instrText>
         </w:r>
         <w:r>
           <w:rPr>
@@ -4736,7 +4736,7 @@
           <w14:ligatures w14:val="standardContextual"/>
         </w:rPr>
       </w:pPr>
-      <w:hyperlink w:anchor="_Toc243065386" w:history="1">
+      <w:hyperlink w:anchor="_Toc243071297" w:history="1">
         <w:r>
           <w:rPr>
             <w:rStyle w:val="Hyperlink"/>
@@ -4763,7 +4763,7 @@
             <w:noProof/>
             <w:webHidden/>
           </w:rPr>
-          <w:instrText xml:space="preserve"> PAGEREF _Toc243065386 \h </w:instrText>
+          <w:instrText xml:space="preserve"> PAGEREF _Toc243071297 \h </w:instrText>
         </w:r>
         <w:r>
           <w:rPr>
@@ -4810,7 +4810,7 @@
           <w14:ligatures w14:val="standardContextual"/>
         </w:rPr>
       </w:pPr>
-      <w:hyperlink w:anchor="_Toc243065387" w:history="1">
+      <w:hyperlink w:anchor="_Toc243071298" w:history="1">
         <w:r>
           <w:rPr>
             <w:rStyle w:val="Hyperlink"/>
@@ -4837,7 +4837,7 @@
             <w:noProof/>
             <w:webHidden/>
           </w:rPr>
-          <w:instrText xml:space="preserve"> PAGEREF _Toc243065387 \h </w:instrText>
+          <w:instrText xml:space="preserve"> PAGEREF _Toc243071298 \h </w:instrText>
         </w:r>
         <w:r>
           <w:rPr>
@@ -4884,7 +4884,7 @@
           <w14:ligatures w14:val="standardContextual"/>
         </w:rPr>
       </w:pPr>
-      <w:hyperlink w:anchor="_Toc243065388" w:history="1">
+      <w:hyperlink w:anchor="_Toc243071299" w:history="1">
         <w:r>
           <w:rPr>
             <w:rStyle w:val="Hyperlink"/>
@@ -4911,7 +4911,7 @@
             <w:noProof/>
             <w:webHidden/>
           </w:rPr>
-          <w:instrText xml:space="preserve"> PAGEREF _Toc243065388 \h </w:instrText>
+          <w:instrText xml:space="preserve"> PAGEREF _Toc243071299 \h </w:instrText>
         </w:r>
         <w:r>
           <w:rPr>
@@ -4958,7 +4958,7 @@
           <w14:ligatures w14:val="standardContextual"/>
         </w:rPr>
       </w:pPr>
-      <w:hyperlink w:anchor="_Toc243065389" w:history="1">
+      <w:hyperlink w:anchor="_Toc243071300" w:history="1">
         <w:r>
           <w:rPr>
             <w:rStyle w:val="Hyperlink"/>
@@ -4985,7 +4985,7 @@
             <w:noProof/>
             <w:webHidden/>
           </w:rPr>
-          <w:instrText xml:space="preserve"> PAGEREF _Toc243065389 \h </w:instrText>
+          <w:instrText xml:space="preserve"> PAGEREF _Toc243071300 \h </w:instrText>
         </w:r>
         <w:r>
           <w:rPr>
@@ -5032,7 +5032,7 @@
           <w14:ligatures w14:val="standardContextual"/>
         </w:rPr>
       </w:pPr>
-      <w:hyperlink w:anchor="_Toc243065390" w:history="1">
+      <w:hyperlink w:anchor="_Toc243071301" w:history="1">
         <w:r>
           <w:rPr>
             <w:rStyle w:val="Hyperlink"/>
@@ -5059,7 +5059,7 @@
             <w:noProof/>
             <w:webHidden/>
           </w:rPr>
-          <w:instrText xml:space="preserve"> PAGEREF _Toc243065390 \h </w:instrText>
+          <w:instrText xml:space="preserve"> PAGEREF _Toc243071301 \h </w:instrText>
         </w:r>
         <w:r>
           <w:rPr>
@@ -5106,7 +5106,7 @@
           <w14:ligatures w14:val="standardContextual"/>
         </w:rPr>
       </w:pPr>
-      <w:hyperlink w:anchor="_Toc243065391" w:history="1">
+      <w:hyperlink w:anchor="_Toc243071302" w:history="1">
         <w:r>
           <w:rPr>
             <w:rStyle w:val="Hyperlink"/>
@@ -5133,7 +5133,7 @@
             <w:noProof/>
             <w:webHidden/>
           </w:rPr>
-          <w:instrText xml:space="preserve"> PAGEREF _Toc243065391 \h </w:instrText>
+          <w:instrText xml:space="preserve"> PAGEREF _Toc243071302 \h </w:instrText>
         </w:r>
         <w:r>
           <w:rPr>
@@ -5180,7 +5180,7 @@
           <w14:ligatures w14:val="standardContextual"/>
         </w:rPr>
       </w:pPr>
-      <w:hyperlink w:anchor="_Toc243065392" w:history="1">
+      <w:hyperlink w:anchor="_Toc243071303" w:history="1">
         <w:r>
           <w:rPr>
             <w:rStyle w:val="Hyperlink"/>
@@ -5207,7 +5207,7 @@
             <w:noProof/>
             <w:webHidden/>
           </w:rPr>
-          <w:instrText xml:space="preserve"> PAGEREF _Toc243065392 \h </w:instrText>
+          <w:instrText xml:space="preserve"> PAGEREF _Toc243071303 \h </w:instrText>
         </w:r>
         <w:r>
           <w:rPr>
@@ -5254,7 +5254,7 @@
           <w14:ligatures w14:val="standardContextual"/>
         </w:rPr>
       </w:pPr>
-      <w:hyperlink w:anchor="_Toc243065393" w:history="1">
+      <w:hyperlink w:anchor="_Toc243071304" w:history="1">
         <w:r>
           <w:rPr>
             <w:rStyle w:val="Hyperlink"/>
@@ -5281,7 +5281,7 @@
             <w:noProof/>
             <w:webHidden/>
           </w:rPr>
-          <w:instrText xml:space="preserve"> PAGEREF _Toc243065393 \h </w:instrText>
+          <w:instrText xml:space="preserve"> PAGEREF _Toc243071304 \h </w:instrText>
         </w:r>
         <w:r>
           <w:rPr>
@@ -5328,7 +5328,7 @@
           <w14:ligatures w14:val="standardContextual"/>
         </w:rPr>
       </w:pPr>
-      <w:hyperlink w:anchor="_Toc243065394" w:history="1">
+      <w:hyperlink w:anchor="_Toc243071305" w:history="1">
         <w:r>
           <w:rPr>
             <w:rStyle w:val="Hyperlink"/>
@@ -5355,7 +5355,7 @@
             <w:noProof/>
             <w:webHidden/>
           </w:rPr>
-          <w:instrText xml:space="preserve"> PAGEREF _Toc243065394 \h </w:instrText>
+          <w:instrText xml:space="preserve"> PAGEREF _Toc243071305 \h </w:instrText>
         </w:r>
         <w:r>
           <w:rPr>
@@ -5402,7 +5402,7 @@
           <w14:ligatures w14:val="standardContextual"/>
         </w:rPr>
       </w:pPr>
-      <w:hyperlink w:anchor="_Toc243065395" w:history="1">
+      <w:hyperlink w:anchor="_Toc243071306" w:history="1">
         <w:r>
           <w:rPr>
             <w:rStyle w:val="Hyperlink"/>
@@ -5429,7 +5429,7 @@
             <w:noProof/>
             <w:webHidden/>
           </w:rPr>
-          <w:instrText xml:space="preserve"> PAGEREF _Toc243065395 \h </w:instrText>
+          <w:instrText xml:space="preserve"> PAGEREF _Toc243071306 \h </w:instrText>
         </w:r>
         <w:r>
           <w:rPr>
@@ -5476,7 +5476,7 @@
           <w14:ligatures w14:val="standardContextual"/>
         </w:rPr>
       </w:pPr>
-      <w:hyperlink w:anchor="_Toc243065396" w:history="1">
+      <w:hyperlink w:anchor="_Toc243071307" w:history="1">
         <w:r>
           <w:rPr>
             <w:rStyle w:val="Hyperlink"/>
@@ -5503,7 +5503,7 @@
             <w:noProof/>
             <w:webHidden/>
           </w:rPr>
-          <w:instrText xml:space="preserve"> PAGEREF _Toc243065396 \h </w:instrText>
+          <w:instrText xml:space="preserve"> PAGEREF _Toc243071307 \h </w:instrText>
         </w:r>
         <w:r>
           <w:rPr>
@@ -5550,7 +5550,7 @@
           <w14:ligatures w14:val="standardContextual"/>
         </w:rPr>
       </w:pPr>
-      <w:hyperlink w:anchor="_Toc243065397" w:history="1">
+      <w:hyperlink w:anchor="_Toc243071308" w:history="1">
         <w:r>
           <w:rPr>
             <w:rStyle w:val="Hyperlink"/>
@@ -5577,7 +5577,7 @@
             <w:noProof/>
             <w:webHidden/>
           </w:rPr>
-          <w:instrText xml:space="preserve"> PAGEREF _Toc243065397 \h </w:instrText>
+          <w:instrText xml:space="preserve"> PAGEREF _Toc243071308 \h </w:instrText>
         </w:r>
         <w:r>
           <w:rPr>
@@ -5624,7 +5624,7 @@
           <w14:ligatures w14:val="standardContextual"/>
         </w:rPr>
       </w:pPr>
-      <w:hyperlink w:anchor="_Toc243065398" w:history="1">
+      <w:hyperlink w:anchor="_Toc243071309" w:history="1">
         <w:r>
           <w:rPr>
             <w:rStyle w:val="Hyperlink"/>
@@ -5651,7 +5651,7 @@
             <w:noProof/>
             <w:webHidden/>
           </w:rPr>
-          <w:instrText xml:space="preserve"> PAGEREF _Toc243065398 \h </w:instrText>
+          <w:instrText xml:space="preserve"> PAGEREF _Toc243071309 \h </w:instrText>
         </w:r>
         <w:r>
           <w:rPr>
@@ -5698,7 +5698,7 @@
           <w14:ligatures w14:val="standardContextual"/>
         </w:rPr>
       </w:pPr>
-      <w:hyperlink w:anchor="_Toc243065399" w:history="1">
+      <w:hyperlink w:anchor="_Toc243071310" w:history="1">
         <w:r>
           <w:rPr>
             <w:rStyle w:val="Hyperlink"/>
@@ -5725,7 +5725,7 @@
             <w:noProof/>
             <w:webHidden/>
           </w:rPr>
-          <w:instrText xml:space="preserve"> PAGEREF _Toc243065399 \h </w:instrText>
+          <w:instrText xml:space="preserve"> PAGEREF _Toc243071310 \h </w:instrText>
         </w:r>
         <w:r>
           <w:rPr>
@@ -5772,7 +5772,7 @@
           <w14:ligatures w14:val="standardContextual"/>
         </w:rPr>
       </w:pPr>
-      <w:hyperlink w:anchor="_Toc243065400" w:history="1">
+      <w:hyperlink w:anchor="_Toc243071311" w:history="1">
         <w:r>
           <w:rPr>
             <w:rStyle w:val="Hyperlink"/>
@@ -5799,7 +5799,7 @@
             <w:noProof/>
             <w:webHidden/>
           </w:rPr>
-          <w:instrText xml:space="preserve"> PAGEREF _Toc243065400 \h </w:instrText>
+          <w:instrText xml:space="preserve"> PAGEREF _Toc243071311 \h </w:instrText>
         </w:r>
         <w:r>
           <w:rPr>
@@ -5846,7 +5846,7 @@
           <w14:ligatures w14:val="standardContextual"/>
         </w:rPr>
       </w:pPr>
-      <w:hyperlink w:anchor="_Toc243065401" w:history="1">
+      <w:hyperlink w:anchor="_Toc243071312" w:history="1">
         <w:r>
           <w:rPr>
             <w:rStyle w:val="Hyperlink"/>
@@ -5873,7 +5873,7 @@
             <w:noProof/>
             <w:webHidden/>
           </w:rPr>
-          <w:instrText xml:space="preserve"> PAGEREF _Toc243065401 \h </w:instrText>
+          <w:instrText xml:space="preserve"> PAGEREF _Toc243071312 \h </w:instrText>
         </w:r>
         <w:r>
           <w:rPr>
@@ -5920,7 +5920,7 @@
           <w14:ligatures w14:val="standardContextual"/>
         </w:rPr>
       </w:pPr>
-      <w:hyperlink w:anchor="_Toc243065402" w:history="1">
+      <w:hyperlink w:anchor="_Toc243071313" w:history="1">
         <w:r>
           <w:rPr>
             <w:rStyle w:val="Hyperlink"/>
@@ -5947,7 +5947,7 @@
             <w:noProof/>
             <w:webHidden/>
           </w:rPr>
-          <w:instrText xml:space="preserve"> PAGEREF _Toc243065402 \h </w:instrText>
+          <w:instrText xml:space="preserve"> PAGEREF _Toc243071313 \h </w:instrText>
         </w:r>
         <w:r>
           <w:rPr>
@@ -5994,7 +5994,7 @@
           <w14:ligatures w14:val="standardContextual"/>
         </w:rPr>
       </w:pPr>
-      <w:hyperlink w:anchor="_Toc243065403" w:history="1">
+      <w:hyperlink w:anchor="_Toc243071314" w:history="1">
         <w:r>
           <w:rPr>
             <w:rStyle w:val="Hyperlink"/>
@@ -6021,7 +6021,7 @@
             <w:noProof/>
             <w:webHidden/>
           </w:rPr>
-          <w:instrText xml:space="preserve"> PAGEREF _Toc243065403 \h </w:instrText>
+          <w:instrText xml:space="preserve"> PAGEREF _Toc243071314 \h </w:instrText>
         </w:r>
         <w:r>
           <w:rPr>
@@ -6068,7 +6068,7 @@
           <w14:ligatures w14:val="standardContextual"/>
         </w:rPr>
       </w:pPr>
-      <w:hyperlink w:anchor="_Toc243065404" w:history="1">
+      <w:hyperlink w:anchor="_Toc243071315" w:history="1">
         <w:r>
           <w:rPr>
             <w:rStyle w:val="Hyperlink"/>
@@ -6095,7 +6095,7 @@
             <w:noProof/>
             <w:webHidden/>
           </w:rPr>
-          <w:instrText xml:space="preserve"> PAGEREF _Toc243065404 \h </w:instrText>
+          <w:instrText xml:space="preserve"> PAGEREF _Toc243071315 \h </w:instrText>
         </w:r>
         <w:r>
           <w:rPr>
@@ -7052,7 +7052,7 @@
         <w:pStyle w:val="Heading1"/>
         <w:jc w:val="center"/>
       </w:pPr>
-      <w:bookmarkStart w:id="0" w:name="_Toc243065331"/>
+      <w:bookmarkStart w:id="0" w:name="_Toc243071242"/>
       <w:r>
         <w:rPr>
           <w:rFonts w:ascii="Times New Roman" w:hAnsi="Times New Roman"/>
@@ -7081,7 +7081,7 @@
       <w:pPr>
         <w:pStyle w:val="Heading2"/>
       </w:pPr>
-      <w:bookmarkStart w:id="1" w:name="_Toc243065332"/>
+      <w:bookmarkStart w:id="1" w:name="_Toc243071243"/>
       <w:r>
         <w:rPr>
           <w:rFonts w:ascii="Times New Roman" w:hAnsi="Times New Roman"/>
@@ -7133,7 +7133,7 @@
       <w:pPr>
         <w:pStyle w:val="Heading2"/>
       </w:pPr>
-      <w:bookmarkStart w:id="2" w:name="_Toc243065333"/>
+      <w:bookmarkStart w:id="2" w:name="_Toc243071244"/>
       <w:r>
         <w:rPr>
           <w:rFonts w:ascii="Times New Roman" w:hAnsi="Times New Roman"/>
@@ -7169,7 +7169,7 @@
       <w:pPr>
         <w:pStyle w:val="Heading2"/>
       </w:pPr>
-      <w:bookmarkStart w:id="3" w:name="_Toc243065334"/>
+      <w:bookmarkStart w:id="3" w:name="_Toc243071245"/>
       <w:r>
         <w:rPr>
           <w:rFonts w:ascii="Times New Roman" w:hAnsi="Times New Roman"/>
@@ -7209,7 +7209,7 @@
       <w:pPr>
         <w:pStyle w:val="Heading2"/>
       </w:pPr>
-      <w:bookmarkStart w:id="4" w:name="_Toc243065335"/>
+      <w:bookmarkStart w:id="4" w:name="_Toc243071246"/>
       <w:r>
         <w:rPr>
           <w:rFonts w:ascii="Times New Roman" w:hAnsi="Times New Roman"/>
@@ -7233,7 +7233,7 @@
       <w:pPr>
         <w:pStyle w:val="Heading2"/>
       </w:pPr>
-      <w:bookmarkStart w:id="5" w:name="_Toc243065336"/>
+      <w:bookmarkStart w:id="5" w:name="_Toc243071247"/>
       <w:r>
         <w:rPr>
           <w:rFonts w:ascii="Times New Roman" w:hAnsi="Times New Roman"/>
@@ -7303,7 +7303,7 @@
       <w:pPr>
         <w:pStyle w:val="Heading2"/>
       </w:pPr>
-      <w:bookmarkStart w:id="6" w:name="_Toc243065337"/>
+      <w:bookmarkStart w:id="6" w:name="_Toc243071248"/>
       <w:r>
         <w:rPr>
           <w:rFonts w:ascii="Times New Roman" w:hAnsi="Times New Roman"/>
@@ -7330,7 +7330,7 @@
       <w:pPr>
         <w:pStyle w:val="Heading2"/>
       </w:pPr>
-      <w:bookmarkStart w:id="7" w:name="_Toc243065338"/>
+      <w:bookmarkStart w:id="7" w:name="_Toc243071249"/>
       <w:r>
         <w:rPr>
           <w:rFonts w:ascii="Times New Roman" w:hAnsi="Times New Roman"/>
@@ -7357,7 +7357,7 @@
       <w:pPr>
         <w:pStyle w:val="Heading2"/>
       </w:pPr>
-      <w:bookmarkStart w:id="8" w:name="_Toc243065339"/>
+      <w:bookmarkStart w:id="8" w:name="_Toc243071250"/>
       <w:r>
         <w:rPr>
           <w:rFonts w:ascii="Times New Roman" w:hAnsi="Times New Roman"/>
@@ -7394,7 +7394,7 @@
         <w:pStyle w:val="Heading1"/>
         <w:jc w:val="center"/>
       </w:pPr>
-      <w:bookmarkStart w:id="9" w:name="_Toc243065340"/>
+      <w:bookmarkStart w:id="9" w:name="_Toc243071251"/>
       <w:r>
         <w:rPr>
           <w:rFonts w:ascii="Times New Roman" w:hAnsi="Times New Roman"/>
@@ -7423,7 +7423,7 @@
       <w:pPr>
         <w:pStyle w:val="Heading2"/>
       </w:pPr>
-      <w:bookmarkStart w:id="10" w:name="_Toc243065341"/>
+      <w:bookmarkStart w:id="10" w:name="_Toc243071252"/>
       <w:r>
         <w:rPr>
           <w:rFonts w:ascii="Times New Roman" w:hAnsi="Times New Roman"/>
@@ -7447,7 +7447,7 @@
       <w:pPr>
         <w:pStyle w:val="Heading2"/>
       </w:pPr>
-      <w:bookmarkStart w:id="11" w:name="_Toc243065342"/>
+      <w:bookmarkStart w:id="11" w:name="_Toc243071253"/>
       <w:r>
         <w:rPr>
           <w:rFonts w:ascii="Times New Roman" w:hAnsi="Times New Roman"/>
@@ -7493,7 +7493,7 @@
       <w:pPr>
         <w:pStyle w:val="Heading2"/>
       </w:pPr>
-      <w:bookmarkStart w:id="12" w:name="_Toc243065343"/>
+      <w:bookmarkStart w:id="12" w:name="_Toc243071254"/>
       <w:r>
         <w:rPr>
           <w:rFonts w:ascii="Times New Roman" w:hAnsi="Times New Roman"/>
@@ -7532,7 +7532,7 @@
       <w:pPr>
         <w:pStyle w:val="Heading2"/>
       </w:pPr>
-      <w:bookmarkStart w:id="13" w:name="_Toc243065344"/>
+      <w:bookmarkStart w:id="13" w:name="_Toc243071255"/>
       <w:r>
         <w:rPr>
           <w:rFonts w:ascii="Times New Roman" w:hAnsi="Times New Roman"/>
@@ -7575,7 +7575,7 @@
       <w:pPr>
         <w:pStyle w:val="Heading2"/>
       </w:pPr>
-      <w:bookmarkStart w:id="14" w:name="_Toc243065345"/>
+      <w:bookmarkStart w:id="14" w:name="_Toc243071256"/>
       <w:r>
         <w:rPr>
           <w:rFonts w:ascii="Times New Roman" w:hAnsi="Times New Roman"/>
@@ -7606,7 +7606,7 @@
       <w:pPr>
         <w:pStyle w:val="Heading2"/>
       </w:pPr>
-      <w:bookmarkStart w:id="15" w:name="_Toc243065346"/>
+      <w:bookmarkStart w:id="15" w:name="_Toc243071257"/>
       <w:r>
         <w:rPr>
           <w:rFonts w:ascii="Times New Roman" w:hAnsi="Times New Roman"/>
@@ -7636,7 +7636,7 @@
       <w:pPr>
         <w:pStyle w:val="Heading2"/>
       </w:pPr>
-      <w:bookmarkStart w:id="16" w:name="_Toc243065347"/>
+      <w:bookmarkStart w:id="16" w:name="_Toc243071258"/>
       <w:r>
         <w:rPr>
           <w:rFonts w:ascii="Times New Roman" w:hAnsi="Times New Roman"/>
@@ -7670,7 +7670,7 @@
       <w:pPr>
         <w:pStyle w:val="Heading2"/>
       </w:pPr>
-      <w:bookmarkStart w:id="17" w:name="_Toc243065348"/>
+      <w:bookmarkStart w:id="17" w:name="_Toc243071259"/>
       <w:r>
         <w:rPr>
           <w:rFonts w:ascii="Times New Roman" w:hAnsi="Times New Roman"/>
@@ -7725,7 +7725,7 @@
       <w:pPr>
         <w:pStyle w:val="Heading2"/>
       </w:pPr>
-      <w:bookmarkStart w:id="18" w:name="_Toc243065349"/>
+      <w:bookmarkStart w:id="18" w:name="_Toc243071260"/>
       <w:r>
         <w:rPr>
           <w:rFonts w:ascii="Times New Roman" w:hAnsi="Times New Roman"/>
@@ -7752,7 +7752,7 @@
       <w:pPr>
         <w:pStyle w:val="Heading2"/>
       </w:pPr>
-      <w:bookmarkStart w:id="19" w:name="_Toc243065350"/>
+      <w:bookmarkStart w:id="19" w:name="_Toc243071261"/>
       <w:r>
         <w:rPr>
           <w:rFonts w:ascii="Times New Roman" w:hAnsi="Times New Roman"/>
@@ -7783,7 +7783,7 @@
       <w:pPr>
         <w:pStyle w:val="Heading2"/>
       </w:pPr>
-      <w:bookmarkStart w:id="20" w:name="_Toc243065351"/>
+      <w:bookmarkStart w:id="20" w:name="_Toc243071262"/>
       <w:r>
         <w:rPr>
           <w:rFonts w:ascii="Times New Roman" w:hAnsi="Times New Roman"/>
@@ -7831,7 +7831,7 @@
       <w:pPr>
         <w:pStyle w:val="Heading2"/>
       </w:pPr>
-      <w:bookmarkStart w:id="21" w:name="_Toc243065352"/>
+      <w:bookmarkStart w:id="21" w:name="_Toc243071263"/>
       <w:r>
         <w:rPr>
           <w:rFonts w:ascii="Times New Roman" w:hAnsi="Times New Roman"/>
@@ -7877,7 +7877,7 @@
       <w:pPr>
         <w:pStyle w:val="Heading2"/>
       </w:pPr>
-      <w:bookmarkStart w:id="22" w:name="_Toc243065353"/>
+      <w:bookmarkStart w:id="22" w:name="_Toc243071264"/>
       <w:r>
         <w:rPr>
           <w:rFonts w:ascii="Times New Roman" w:hAnsi="Times New Roman"/>
@@ -8437,7 +8437,7 @@
       <w:pPr>
         <w:pStyle w:val="Heading2"/>
       </w:pPr>
-      <w:bookmarkStart w:id="23" w:name="_Toc243065354"/>
+      <w:bookmarkStart w:id="23" w:name="_Toc243071265"/>
       <w:r>
         <w:rPr>
           <w:rFonts w:ascii="Times New Roman" w:hAnsi="Times New Roman"/>
@@ -8470,7 +8470,7 @@
         <w:pStyle w:val="Heading1"/>
         <w:jc w:val="center"/>
       </w:pPr>
-      <w:bookmarkStart w:id="24" w:name="_Toc243065355"/>
+      <w:bookmarkStart w:id="24" w:name="_Toc243071266"/>
       <w:r>
         <w:rPr>
           <w:rFonts w:ascii="Times New Roman" w:hAnsi="Times New Roman"/>
@@ -8499,7 +8499,7 @@
       <w:pPr>
         <w:pStyle w:val="Heading2"/>
       </w:pPr>
-      <w:bookmarkStart w:id="25" w:name="_Toc243065356"/>
+      <w:bookmarkStart w:id="25" w:name="_Toc243071267"/>
       <w:r>
         <w:rPr>
           <w:rFonts w:ascii="Times New Roman" w:hAnsi="Times New Roman"/>
@@ -8534,7 +8534,7 @@
           <w:noProof/>
         </w:rPr>
         <w:drawing>
-          <wp:inline distT="0" distB="0" distL="0" distR="0" wp14:anchorId="5C3CAB93" wp14:editId="1E8F03EA">
+          <wp:inline distT="0" distB="0" distL="0" distR="0" wp14:anchorId="68D27AC3" wp14:editId="6DBC6979">
             <wp:extent cx="5303520" cy="2983230"/>
             <wp:effectExtent l="0" t="0" r="0" b="0"/>
             <wp:docPr id="2" name="Picture 2"/>
@@ -8587,7 +8587,7 @@
       <w:pPr>
         <w:pStyle w:val="Heading2"/>
       </w:pPr>
-      <w:bookmarkStart w:id="26" w:name="_Toc243065357"/>
+      <w:bookmarkStart w:id="26" w:name="_Toc243071268"/>
       <w:r>
         <w:rPr>
           <w:rFonts w:ascii="Times New Roman" w:hAnsi="Times New Roman"/>
@@ -8623,7 +8623,7 @@
           <w:noProof/>
         </w:rPr>
         <w:drawing>
-          <wp:inline distT="0" distB="0" distL="0" distR="0" wp14:anchorId="6F95F5DB" wp14:editId="6705C832">
+          <wp:inline distT="0" distB="0" distL="0" distR="0" wp14:anchorId="7027309A" wp14:editId="2A8088A5">
             <wp:extent cx="5303520" cy="2262835"/>
             <wp:effectExtent l="0" t="0" r="0" b="0"/>
             <wp:docPr id="3" name="Picture 3"/>
@@ -8713,7 +8713,7 @@
       <w:pPr>
         <w:pStyle w:val="Heading2"/>
       </w:pPr>
-      <w:bookmarkStart w:id="27" w:name="_Toc243065358"/>
+      <w:bookmarkStart w:id="27" w:name="_Toc243071269"/>
       <w:r>
         <w:rPr>
           <w:rFonts w:ascii="Times New Roman" w:hAnsi="Times New Roman"/>
@@ -8759,7 +8759,7 @@
       <w:pPr>
         <w:pStyle w:val="Heading2"/>
       </w:pPr>
-      <w:bookmarkStart w:id="28" w:name="_Toc243065359"/>
+      <w:bookmarkStart w:id="28" w:name="_Toc243071270"/>
       <w:r>
         <w:rPr>
           <w:rFonts w:ascii="Times New Roman" w:hAnsi="Times New Roman"/>
@@ -8807,7 +8807,7 @@
           <w:noProof/>
         </w:rPr>
         <w:drawing>
-          <wp:inline distT="0" distB="0" distL="0" distR="0" wp14:anchorId="63DE06E5" wp14:editId="57BB6C23">
+          <wp:inline distT="0" distB="0" distL="0" distR="0" wp14:anchorId="2006EFCB" wp14:editId="452A0E05">
             <wp:extent cx="5303520" cy="2262835"/>
             <wp:effectExtent l="0" t="0" r="0" b="0"/>
             <wp:docPr id="4" name="Picture 4"/>
@@ -9152,7 +9152,7 @@
       <w:pPr>
         <w:pStyle w:val="Heading2"/>
       </w:pPr>
-      <w:bookmarkStart w:id="29" w:name="_Toc243065360"/>
+      <w:bookmarkStart w:id="29" w:name="_Toc243071271"/>
       <w:r>
         <w:rPr>
           <w:rFonts w:ascii="Times New Roman" w:hAnsi="Times New Roman"/>
@@ -9179,7 +9179,7 @@
       <w:pPr>
         <w:pStyle w:val="Heading2"/>
       </w:pPr>
-      <w:bookmarkStart w:id="30" w:name="_Toc243065361"/>
+      <w:bookmarkStart w:id="30" w:name="_Toc243071272"/>
       <w:r>
         <w:rPr>
           <w:rFonts w:ascii="Times New Roman" w:hAnsi="Times New Roman"/>
@@ -9222,7 +9222,7 @@
       <w:pPr>
         <w:pStyle w:val="Heading2"/>
       </w:pPr>
-      <w:bookmarkStart w:id="31" w:name="_Toc243065362"/>
+      <w:bookmarkStart w:id="31" w:name="_Toc243071273"/>
       <w:r>
         <w:rPr>
           <w:rFonts w:ascii="Times New Roman" w:hAnsi="Times New Roman"/>
@@ -9608,7 +9608,7 @@
       <w:pPr>
         <w:pStyle w:val="Heading2"/>
       </w:pPr>
-      <w:bookmarkStart w:id="32" w:name="_Toc243065363"/>
+      <w:bookmarkStart w:id="32" w:name="_Toc243071274"/>
       <w:r>
         <w:rPr>
           <w:rFonts w:ascii="Times New Roman" w:hAnsi="Times New Roman"/>
@@ -9638,7 +9638,7 @@
       <w:pPr>
         <w:pStyle w:val="Heading2"/>
       </w:pPr>
-      <w:bookmarkStart w:id="33" w:name="_Toc243065364"/>
+      <w:bookmarkStart w:id="33" w:name="_Toc243071275"/>
       <w:r>
         <w:rPr>
           <w:rFonts w:ascii="Times New Roman" w:hAnsi="Times New Roman"/>
@@ -9672,7 +9672,7 @@
         <w:pStyle w:val="Heading1"/>
         <w:jc w:val="center"/>
       </w:pPr>
-      <w:bookmarkStart w:id="34" w:name="_Toc243065365"/>
+      <w:bookmarkStart w:id="34" w:name="_Toc243071276"/>
       <w:r>
         <w:rPr>
           <w:rFonts w:ascii="Times New Roman" w:hAnsi="Times New Roman"/>
@@ -9701,7 +9701,7 @@
       <w:pPr>
         <w:pStyle w:val="Heading2"/>
       </w:pPr>
-      <w:bookmarkStart w:id="35" w:name="_Toc243065366"/>
+      <w:bookmarkStart w:id="35" w:name="_Toc243071277"/>
       <w:r>
         <w:rPr>
           <w:rFonts w:ascii="Times New Roman" w:hAnsi="Times New Roman"/>
@@ -9728,7 +9728,7 @@
       <w:pPr>
         <w:pStyle w:val="Heading2"/>
       </w:pPr>
-      <w:bookmarkStart w:id="36" w:name="_Toc243065367"/>
+      <w:bookmarkStart w:id="36" w:name="_Toc243071278"/>
       <w:r>
         <w:rPr>
           <w:rFonts w:ascii="Times New Roman" w:hAnsi="Times New Roman"/>
@@ -10305,7 +10305,7 @@
       <w:pPr>
         <w:pStyle w:val="Heading2"/>
       </w:pPr>
-      <w:bookmarkStart w:id="37" w:name="_Toc243065368"/>
+      <w:bookmarkStart w:id="37" w:name="_Toc243071279"/>
       <w:r>
         <w:rPr>
           <w:rFonts w:ascii="Times New Roman" w:hAnsi="Times New Roman"/>
@@ -10422,7 +10422,7 @@
       <w:pPr>
         <w:pStyle w:val="Heading2"/>
       </w:pPr>
-      <w:bookmarkStart w:id="38" w:name="_Toc243065369"/>
+      <w:bookmarkStart w:id="38" w:name="_Toc243071280"/>
       <w:r>
         <w:rPr>
           <w:rFonts w:ascii="Times New Roman" w:hAnsi="Times New Roman"/>
@@ -10452,7 +10452,7 @@
       <w:pPr>
         <w:pStyle w:val="Heading2"/>
       </w:pPr>
-      <w:bookmarkStart w:id="39" w:name="_Toc243065370"/>
+      <w:bookmarkStart w:id="39" w:name="_Toc243071281"/>
       <w:r>
         <w:rPr>
           <w:rFonts w:ascii="Times New Roman" w:hAnsi="Times New Roman"/>
@@ -10480,7 +10480,7 @@
       <w:pPr>
         <w:pStyle w:val="Heading2"/>
       </w:pPr>
-      <w:bookmarkStart w:id="40" w:name="_Toc243065371"/>
+      <w:bookmarkStart w:id="40" w:name="_Toc243071282"/>
       <w:r>
         <w:rPr>
           <w:rFonts w:ascii="Times New Roman" w:hAnsi="Times New Roman"/>
@@ -10507,7 +10507,7 @@
       <w:pPr>
         <w:pStyle w:val="Heading2"/>
       </w:pPr>
-      <w:bookmarkStart w:id="41" w:name="_Toc243065372"/>
+      <w:bookmarkStart w:id="41" w:name="_Toc243071283"/>
       <w:r>
         <w:rPr>
           <w:rFonts w:ascii="Times New Roman" w:hAnsi="Times New Roman"/>
@@ -10534,7 +10534,7 @@
       <w:pPr>
         <w:pStyle w:val="Heading2"/>
       </w:pPr>
-      <w:bookmarkStart w:id="42" w:name="_Toc243065373"/>
+      <w:bookmarkStart w:id="42" w:name="_Toc243071284"/>
       <w:r>
         <w:rPr>
           <w:rFonts w:ascii="Times New Roman" w:hAnsi="Times New Roman"/>
@@ -10571,7 +10571,7 @@
         <w:pStyle w:val="Heading1"/>
         <w:jc w:val="center"/>
       </w:pPr>
-      <w:bookmarkStart w:id="43" w:name="_Toc243065374"/>
+      <w:bookmarkStart w:id="43" w:name="_Toc243071285"/>
       <w:r>
         <w:rPr>
           <w:rFonts w:ascii="Times New Roman" w:hAnsi="Times New Roman"/>
@@ -10600,7 +10600,7 @@
       <w:pPr>
         <w:pStyle w:val="Heading2"/>
       </w:pPr>
-      <w:bookmarkStart w:id="44" w:name="_Toc243065375"/>
+      <w:bookmarkStart w:id="44" w:name="_Toc243071286"/>
       <w:r>
         <w:rPr>
           <w:rFonts w:ascii="Times New Roman" w:hAnsi="Times New Roman"/>
@@ -10632,7 +10632,7 @@
           <w:noProof/>
         </w:rPr>
         <w:drawing>
-          <wp:inline distT="0" distB="0" distL="0" distR="0" wp14:anchorId="4C305899" wp14:editId="75C3D645">
+          <wp:inline distT="0" distB="0" distL="0" distR="0" wp14:anchorId="7968B665" wp14:editId="412A4610">
             <wp:extent cx="5303520" cy="3374967"/>
             <wp:effectExtent l="0" t="0" r="0" b="0"/>
             <wp:docPr id="5" name="Picture 5"/>
@@ -10900,7 +10900,7 @@
           <w:noProof/>
         </w:rPr>
         <w:drawing>
-          <wp:inline distT="0" distB="0" distL="0" distR="0" wp14:anchorId="75001C75" wp14:editId="2050BD66">
+          <wp:inline distT="0" distB="0" distL="0" distR="0" wp14:anchorId="0DCEB9F1" wp14:editId="4EC01C21">
             <wp:extent cx="5303520" cy="2272937"/>
             <wp:effectExtent l="0" t="0" r="0" b="0"/>
             <wp:docPr id="6" name="Picture 6"/>
@@ -11280,7 +11280,7 @@
       <w:pPr>
         <w:pStyle w:val="Heading2"/>
       </w:pPr>
-      <w:bookmarkStart w:id="45" w:name="_Toc243065376"/>
+      <w:bookmarkStart w:id="45" w:name="_Toc243071287"/>
       <w:r>
         <w:rPr>
           <w:rFonts w:ascii="Times New Roman" w:hAnsi="Times New Roman"/>
@@ -11313,7 +11313,7 @@
         </w:rPr>
         <w:lastRenderedPageBreak/>
         <w:drawing>
-          <wp:inline distT="0" distB="0" distL="0" distR="0" wp14:anchorId="547EC67F" wp14:editId="1E91EB2D">
+          <wp:inline distT="0" distB="0" distL="0" distR="0" wp14:anchorId="3B040610" wp14:editId="2469791E">
             <wp:extent cx="5303520" cy="2121408"/>
             <wp:effectExtent l="0" t="0" r="0" b="0"/>
             <wp:docPr id="7" name="Picture 7"/>
@@ -11637,7 +11637,7 @@
           <w:noProof/>
         </w:rPr>
         <w:drawing>
-          <wp:inline distT="0" distB="0" distL="0" distR="0" wp14:anchorId="5EF7EC8C" wp14:editId="683A9079">
+          <wp:inline distT="0" distB="0" distL="0" distR="0" wp14:anchorId="7D583D8D" wp14:editId="3D3E3944">
             <wp:extent cx="5303520" cy="2571404"/>
             <wp:effectExtent l="0" t="0" r="0" b="0"/>
             <wp:docPr id="8" name="Picture 8"/>
@@ -11690,7 +11690,7 @@
       <w:pPr>
         <w:pStyle w:val="Heading2"/>
       </w:pPr>
-      <w:bookmarkStart w:id="46" w:name="_Toc243065377"/>
+      <w:bookmarkStart w:id="46" w:name="_Toc243071288"/>
       <w:r>
         <w:rPr>
           <w:rFonts w:ascii="Times New Roman" w:hAnsi="Times New Roman"/>
@@ -11932,7 +11932,7 @@
       <w:pPr>
         <w:pStyle w:val="Heading2"/>
       </w:pPr>
-      <w:bookmarkStart w:id="47" w:name="_Toc243065378"/>
+      <w:bookmarkStart w:id="47" w:name="_Toc243071289"/>
       <w:r>
         <w:rPr>
           <w:rFonts w:ascii="Times New Roman" w:hAnsi="Times New Roman"/>
@@ -11996,7 +11996,7 @@
           <w:noProof/>
         </w:rPr>
         <w:drawing>
-          <wp:inline distT="0" distB="0" distL="0" distR="0" wp14:anchorId="29C55517" wp14:editId="125E12BF">
+          <wp:inline distT="0" distB="0" distL="0" distR="0" wp14:anchorId="1727C70A" wp14:editId="6C0B7C3C">
             <wp:extent cx="5303520" cy="2121408"/>
             <wp:effectExtent l="0" t="0" r="0" b="0"/>
             <wp:docPr id="9" name="Picture 9"/>
@@ -12049,7 +12049,7 @@
       <w:pPr>
         <w:pStyle w:val="Heading2"/>
       </w:pPr>
-      <w:bookmarkStart w:id="48" w:name="_Toc243065379"/>
+      <w:bookmarkStart w:id="48" w:name="_Toc243071290"/>
       <w:r>
         <w:rPr>
           <w:rFonts w:ascii="Times New Roman" w:hAnsi="Times New Roman"/>
@@ -12082,7 +12082,7 @@
         </w:rPr>
         <w:lastRenderedPageBreak/>
         <w:drawing>
-          <wp:inline distT="0" distB="0" distL="0" distR="0" wp14:anchorId="3E01F67D" wp14:editId="6C59EFBA">
+          <wp:inline distT="0" distB="0" distL="0" distR="0" wp14:anchorId="0FA9ED15" wp14:editId="04F8E5AC">
             <wp:extent cx="5303520" cy="2424466"/>
             <wp:effectExtent l="0" t="0" r="0" b="0"/>
             <wp:docPr id="10" name="Picture 10"/>
@@ -12332,7 +12332,7 @@
       <w:pPr>
         <w:pStyle w:val="Heading2"/>
       </w:pPr>
-      <w:bookmarkStart w:id="49" w:name="_Toc243065380"/>
+      <w:bookmarkStart w:id="49" w:name="_Toc243071291"/>
       <w:r>
         <w:rPr>
           <w:rFonts w:ascii="Times New Roman" w:hAnsi="Times New Roman"/>
@@ -12377,7 +12377,7 @@
           <w:noProof/>
         </w:rPr>
         <w:drawing>
-          <wp:inline distT="0" distB="0" distL="0" distR="0" wp14:anchorId="514E9600" wp14:editId="4EDD5956">
+          <wp:inline distT="0" distB="0" distL="0" distR="0" wp14:anchorId="5B8F9CF2" wp14:editId="2F84E939">
             <wp:extent cx="5303520" cy="1988820"/>
             <wp:effectExtent l="0" t="0" r="0" b="0"/>
             <wp:docPr id="11" name="Picture 11"/>
@@ -12448,7 +12448,7 @@
         </w:rPr>
         <w:lastRenderedPageBreak/>
         <w:drawing>
-          <wp:inline distT="0" distB="0" distL="0" distR="0" wp14:anchorId="1CB92231" wp14:editId="05618580">
+          <wp:inline distT="0" distB="0" distL="0" distR="0" wp14:anchorId="18F40C79" wp14:editId="658F2C7C">
             <wp:extent cx="5303520" cy="2495774"/>
             <wp:effectExtent l="0" t="0" r="0" b="0"/>
             <wp:docPr id="12" name="Picture 12"/>
@@ -12518,7 +12518,7 @@
           <w:noProof/>
         </w:rPr>
         <w:drawing>
-          <wp:inline distT="0" distB="0" distL="0" distR="0" wp14:anchorId="094B2EDC" wp14:editId="2451599B">
+          <wp:inline distT="0" distB="0" distL="0" distR="0" wp14:anchorId="40AA8988" wp14:editId="696B033D">
             <wp:extent cx="5303520" cy="2272937"/>
             <wp:effectExtent l="0" t="0" r="0" b="0"/>
             <wp:docPr id="13" name="Picture 13"/>
@@ -12601,7 +12601,7 @@
           <w:noProof/>
         </w:rPr>
         <w:drawing>
-          <wp:inline distT="0" distB="0" distL="0" distR="0" wp14:anchorId="5FE7652D" wp14:editId="4B214F55">
+          <wp:inline distT="0" distB="0" distL="0" distR="0" wp14:anchorId="49683D63" wp14:editId="3F07CCF7">
             <wp:extent cx="5303520" cy="2339788"/>
             <wp:effectExtent l="0" t="0" r="0" b="0"/>
             <wp:docPr id="14" name="Picture 14"/>
@@ -12672,7 +12672,7 @@
           <w:noProof/>
         </w:rPr>
         <w:drawing>
-          <wp:inline distT="0" distB="0" distL="0" distR="0" wp14:anchorId="57ED3D81" wp14:editId="435D5E99">
+          <wp:inline distT="0" distB="0" distL="0" distR="0" wp14:anchorId="294EFCF1" wp14:editId="564A81E4">
             <wp:extent cx="5303520" cy="1988820"/>
             <wp:effectExtent l="0" t="0" r="0" b="0"/>
             <wp:docPr id="15" name="Picture 15"/>
@@ -13127,7 +13127,7 @@
       <w:pPr>
         <w:pStyle w:val="Heading2"/>
       </w:pPr>
-      <w:bookmarkStart w:id="50" w:name="_Toc243065381"/>
+      <w:bookmarkStart w:id="50" w:name="_Toc243071292"/>
       <w:r>
         <w:rPr>
           <w:rFonts w:ascii="Times New Roman" w:hAnsi="Times New Roman"/>
@@ -13201,7 +13201,7 @@
       <w:pPr>
         <w:pStyle w:val="Heading2"/>
       </w:pPr>
-      <w:bookmarkStart w:id="51" w:name="_Toc243065382"/>
+      <w:bookmarkStart w:id="51" w:name="_Toc243071293"/>
       <w:r>
         <w:rPr>
           <w:rFonts w:ascii="Times New Roman" w:hAnsi="Times New Roman"/>
@@ -13699,7 +13699,7 @@
         <w:pStyle w:val="Heading1"/>
         <w:jc w:val="center"/>
       </w:pPr>
-      <w:bookmarkStart w:id="52" w:name="_Toc243065383"/>
+      <w:bookmarkStart w:id="52" w:name="_Toc243071294"/>
       <w:r>
         <w:rPr>
           <w:rFonts w:ascii="Times New Roman" w:hAnsi="Times New Roman"/>
@@ -13728,7 +13728,7 @@
       <w:pPr>
         <w:pStyle w:val="Heading2"/>
       </w:pPr>
-      <w:bookmarkStart w:id="53" w:name="_Toc243065384"/>
+      <w:bookmarkStart w:id="53" w:name="_Toc243071295"/>
       <w:r>
         <w:rPr>
           <w:rFonts w:ascii="Times New Roman" w:hAnsi="Times New Roman"/>
@@ -13792,7 +13792,7 @@
       <w:pPr>
         <w:pStyle w:val="Heading2"/>
       </w:pPr>
-      <w:bookmarkStart w:id="54" w:name="_Toc243065385"/>
+      <w:bookmarkStart w:id="54" w:name="_Toc243071296"/>
       <w:r>
         <w:rPr>
           <w:rFonts w:ascii="Times New Roman" w:hAnsi="Times New Roman"/>
@@ -13886,7 +13886,7 @@
         <w:pStyle w:val="Heading1"/>
         <w:jc w:val="center"/>
       </w:pPr>
-      <w:bookmarkStart w:id="55" w:name="_Toc243065386"/>
+      <w:bookmarkStart w:id="55" w:name="_Toc243071297"/>
       <w:r>
         <w:rPr>
           <w:rFonts w:ascii="Times New Roman" w:hAnsi="Times New Roman"/>
@@ -14074,7 +14074,7 @@
         <w:pStyle w:val="Heading1"/>
         <w:jc w:val="center"/>
       </w:pPr>
-      <w:bookmarkStart w:id="56" w:name="_Toc243065387"/>
+      <w:bookmarkStart w:id="56" w:name="_Toc243071298"/>
       <w:r>
         <w:rPr>
           <w:rFonts w:ascii="Times New Roman" w:hAnsi="Times New Roman"/>
@@ -14090,7 +14090,7 @@
       <w:pPr>
         <w:pStyle w:val="Heading2"/>
       </w:pPr>
-      <w:bookmarkStart w:id="57" w:name="_Toc243065388"/>
+      <w:bookmarkStart w:id="57" w:name="_Toc243071299"/>
       <w:r>
         <w:rPr>
           <w:rFonts w:ascii="Times New Roman" w:hAnsi="Times New Roman"/>
@@ -14120,7 +14120,7 @@
       <w:pPr>
         <w:pStyle w:val="Heading2"/>
       </w:pPr>
-      <w:bookmarkStart w:id="58" w:name="_Toc243065389"/>
+      <w:bookmarkStart w:id="58" w:name="_Toc243071300"/>
       <w:r>
         <w:rPr>
           <w:rFonts w:ascii="Times New Roman" w:hAnsi="Times New Roman"/>
@@ -14224,7 +14224,7 @@
       <w:pPr>
         <w:pStyle w:val="Heading2"/>
       </w:pPr>
-      <w:bookmarkStart w:id="59" w:name="_Toc243065390"/>
+      <w:bookmarkStart w:id="59" w:name="_Toc243071301"/>
       <w:r>
         <w:rPr>
           <w:rFonts w:ascii="Times New Roman" w:hAnsi="Times New Roman"/>
@@ -14328,7 +14328,7 @@
       <w:pPr>
         <w:pStyle w:val="Heading2"/>
       </w:pPr>
-      <w:bookmarkStart w:id="60" w:name="_Toc243065391"/>
+      <w:bookmarkStart w:id="60" w:name="_Toc243071302"/>
       <w:r>
         <w:rPr>
           <w:rFonts w:ascii="Times New Roman" w:hAnsi="Times New Roman"/>
@@ -14486,7 +14486,7 @@
       <w:pPr>
         <w:pStyle w:val="Heading2"/>
       </w:pPr>
-      <w:bookmarkStart w:id="61" w:name="_Toc243065392"/>
+      <w:bookmarkStart w:id="61" w:name="_Toc243071303"/>
       <w:r>
         <w:rPr>
           <w:rFonts w:ascii="Times New Roman" w:hAnsi="Times New Roman"/>
@@ -14734,7 +14734,7 @@
       <w:pPr>
         <w:pStyle w:val="Heading2"/>
       </w:pPr>
-      <w:bookmarkStart w:id="62" w:name="_Toc243065393"/>
+      <w:bookmarkStart w:id="62" w:name="_Toc243071304"/>
       <w:r>
         <w:rPr>
           <w:rFonts w:ascii="Times New Roman" w:hAnsi="Times New Roman"/>
@@ -14886,7 +14886,7 @@
       <w:pPr>
         <w:pStyle w:val="Heading2"/>
       </w:pPr>
-      <w:bookmarkStart w:id="63" w:name="_Toc243065394"/>
+      <w:bookmarkStart w:id="63" w:name="_Toc243071305"/>
       <w:r>
         <w:rPr>
           <w:rFonts w:ascii="Times New Roman" w:hAnsi="Times New Roman"/>
@@ -15051,7 +15051,7 @@
       <w:pPr>
         <w:pStyle w:val="Heading2"/>
       </w:pPr>
-      <w:bookmarkStart w:id="64" w:name="_Toc243065395"/>
+      <w:bookmarkStart w:id="64" w:name="_Toc243071306"/>
       <w:r>
         <w:rPr>
           <w:rFonts w:ascii="Times New Roman" w:hAnsi="Times New Roman"/>
@@ -15232,7 +15232,7 @@
       <w:pPr>
         <w:pStyle w:val="Heading2"/>
       </w:pPr>
-      <w:bookmarkStart w:id="65" w:name="_Toc243065396"/>
+      <w:bookmarkStart w:id="65" w:name="_Toc243071307"/>
       <w:r>
         <w:rPr>
           <w:rFonts w:ascii="Times New Roman" w:hAnsi="Times New Roman"/>
@@ -15372,7 +15372,7 @@
       <w:pPr>
         <w:pStyle w:val="Heading2"/>
       </w:pPr>
-      <w:bookmarkStart w:id="66" w:name="_Toc243065397"/>
+      <w:bookmarkStart w:id="66" w:name="_Toc243071308"/>
       <w:r>
         <w:rPr>
           <w:rFonts w:ascii="Times New Roman" w:hAnsi="Times New Roman"/>
@@ -15561,7 +15561,7 @@
       <w:pPr>
         <w:pStyle w:val="Heading2"/>
       </w:pPr>
-      <w:bookmarkStart w:id="67" w:name="_Toc243065398"/>
+      <w:bookmarkStart w:id="67" w:name="_Toc243071309"/>
       <w:r>
         <w:rPr>
           <w:rFonts w:ascii="Times New Roman" w:hAnsi="Times New Roman"/>
@@ -15713,7 +15713,7 @@
       <w:pPr>
         <w:pStyle w:val="Heading2"/>
       </w:pPr>
-      <w:bookmarkStart w:id="68" w:name="_Toc243065399"/>
+      <w:bookmarkStart w:id="68" w:name="_Toc243071310"/>
       <w:r>
         <w:rPr>
           <w:rFonts w:ascii="Times New Roman" w:hAnsi="Times New Roman"/>
@@ -15877,7 +15877,7 @@
       <w:pPr>
         <w:pStyle w:val="Heading2"/>
       </w:pPr>
-      <w:bookmarkStart w:id="69" w:name="_Toc243065400"/>
+      <w:bookmarkStart w:id="69" w:name="_Toc243071311"/>
       <w:r>
         <w:rPr>
           <w:rFonts w:ascii="Times New Roman" w:hAnsi="Times New Roman"/>
@@ -16071,7 +16071,7 @@
       <w:pPr>
         <w:pStyle w:val="Heading2"/>
       </w:pPr>
-      <w:bookmarkStart w:id="70" w:name="_Toc243065401"/>
+      <w:bookmarkStart w:id="70" w:name="_Toc243071312"/>
       <w:r>
         <w:rPr>
           <w:rFonts w:ascii="Times New Roman" w:hAnsi="Times New Roman"/>
@@ -16211,7 +16211,7 @@
       <w:pPr>
         <w:pStyle w:val="Heading2"/>
       </w:pPr>
-      <w:bookmarkStart w:id="71" w:name="_Toc243065402"/>
+      <w:bookmarkStart w:id="71" w:name="_Toc243071313"/>
       <w:r>
         <w:rPr>
           <w:rFonts w:ascii="Times New Roman" w:hAnsi="Times New Roman"/>
@@ -16411,7 +16411,7 @@
       <w:pPr>
         <w:pStyle w:val="Heading2"/>
       </w:pPr>
-      <w:bookmarkStart w:id="72" w:name="_Toc243065403"/>
+      <w:bookmarkStart w:id="72" w:name="_Toc243071314"/>
       <w:r>
         <w:rPr>
           <w:rFonts w:ascii="Times New Roman" w:hAnsi="Times New Roman"/>
@@ -16490,7 +16490,7 @@
       <w:pPr>
         <w:pStyle w:val="Heading2"/>
       </w:pPr>
-      <w:bookmarkStart w:id="73" w:name="_Toc243065404"/>
+      <w:bookmarkStart w:id="73" w:name="_Toc243071315"/>
       <w:r>
         <w:rPr>
           <w:rFonts w:ascii="Times New Roman" w:hAnsi="Times New Roman"/>
@@ -16837,31 +16837,31 @@
       </w:rPr>
     </w:lvl>
   </w:abstractNum>
-  <w:num w:numId="1" w16cid:durableId="247616228">
+  <w:num w:numId="1" w16cid:durableId="1386875630">
     <w:abstractNumId w:val="8"/>
   </w:num>
-  <w:num w:numId="2" w16cid:durableId="1664625350">
+  <w:num w:numId="2" w16cid:durableId="1678313872">
     <w:abstractNumId w:val="6"/>
   </w:num>
-  <w:num w:numId="3" w16cid:durableId="18354680">
+  <w:num w:numId="3" w16cid:durableId="1808280636">
     <w:abstractNumId w:val="5"/>
   </w:num>
-  <w:num w:numId="4" w16cid:durableId="135343296">
+  <w:num w:numId="4" w16cid:durableId="1418137145">
     <w:abstractNumId w:val="4"/>
   </w:num>
-  <w:num w:numId="5" w16cid:durableId="830095619">
+  <w:num w:numId="5" w16cid:durableId="1430083747">
     <w:abstractNumId w:val="7"/>
   </w:num>
-  <w:num w:numId="6" w16cid:durableId="1201820011">
+  <w:num w:numId="6" w16cid:durableId="1973246049">
     <w:abstractNumId w:val="3"/>
   </w:num>
-  <w:num w:numId="7" w16cid:durableId="1993826089">
+  <w:num w:numId="7" w16cid:durableId="612250481">
     <w:abstractNumId w:val="2"/>
   </w:num>
-  <w:num w:numId="8" w16cid:durableId="2060542987">
+  <w:num w:numId="8" w16cid:durableId="1711101362">
     <w:abstractNumId w:val="1"/>
   </w:num>
-  <w:num w:numId="9" w16cid:durableId="425611954">
+  <w:num w:numId="9" w16cid:durableId="2104689721">
     <w:abstractNumId w:val="0"/>
   </w:num>
 </w:numbering>
@@ -28261,7 +28261,7 @@
     <w:autoRedefine/>
     <w:uiPriority w:val="39"/>
     <w:unhideWhenUsed/>
-    <w:rsid w:val="00702D51"/>
+    <w:rsid w:val="00E841F0"/>
     <w:pPr>
       <w:spacing w:after="100"/>
     </w:pPr>
@@ -28273,7 +28273,7 @@
     <w:autoRedefine/>
     <w:uiPriority w:val="39"/>
     <w:unhideWhenUsed/>
-    <w:rsid w:val="00702D51"/>
+    <w:rsid w:val="00E841F0"/>
     <w:pPr>
       <w:spacing w:after="100"/>
       <w:ind w:left="240"/>
@@ -28284,7 +28284,7 @@
     <w:basedOn w:val="DefaultParagraphFont"/>
     <w:uiPriority w:val="99"/>
     <w:unhideWhenUsed/>
-    <w:rsid w:val="00702D51"/>
+    <w:rsid w:val="00E841F0"/>
     <w:rPr>
       <w:color w:val="0000FF" w:themeColor="hyperlink"/>
       <w:u w:val="single"/>

</xml_diff>

<commit_message>
Add submission date to candidate declaration and acknowledgement
</commit_message>
<xml_diff>
--- a/report/CyberTrace_Project_Report.docx
+++ b/report/CyberTrace_Project_Report.docx
@@ -11,7 +11,7 @@
           <w:noProof/>
         </w:rPr>
         <w:drawing>
-          <wp:inline distT="0" distB="0" distL="0" distR="0" wp14:anchorId="0C8AB871" wp14:editId="40D28F5B">
+          <wp:inline distT="0" distB="0" distL="0" distR="0" wp14:anchorId="6A59A073" wp14:editId="0B6D4DE6">
             <wp:extent cx="2560320" cy="816494"/>
             <wp:effectExtent l="0" t="0" r="0" b="0"/>
             <wp:docPr id="1" name="Picture 1"/>
@@ -235,7 +235,7 @@
         <w:spacing w:after="360"/>
       </w:pPr>
       <w:r>
-        <w:t>Date:</w:t>
+        <w:t>Date: 16 October 2026</w:t>
       </w:r>
     </w:p>
     <w:p>
@@ -584,7 +584,7 @@
         <w:spacing w:after="80" w:line="264" w:lineRule="auto"/>
       </w:pPr>
       <w:r>
-        <w:t>Date:</w:t>
+        <w:t>Date: 16 October 2026</w:t>
       </w:r>
     </w:p>
     <w:p>
@@ -666,7 +666,7 @@
       <w:r>
         <w:fldChar w:fldCharType="separate"/>
       </w:r>
-      <w:hyperlink w:anchor="_Toc243071242" w:history="1">
+      <w:hyperlink w:anchor="_Toc243071451" w:history="1">
         <w:r>
           <w:rPr>
             <w:rStyle w:val="Hyperlink"/>
@@ -693,7 +693,7 @@
             <w:noProof/>
             <w:webHidden/>
           </w:rPr>
-          <w:instrText xml:space="preserve"> PAGEREF _Toc243071242 \h </w:instrText>
+          <w:instrText xml:space="preserve"> PAGEREF _Toc243071451 \h </w:instrText>
         </w:r>
         <w:r>
           <w:rPr>
@@ -740,7 +740,7 @@
           <w14:ligatures w14:val="standardContextual"/>
         </w:rPr>
       </w:pPr>
-      <w:hyperlink w:anchor="_Toc243071243" w:history="1">
+      <w:hyperlink w:anchor="_Toc243071452" w:history="1">
         <w:r>
           <w:rPr>
             <w:rStyle w:val="Hyperlink"/>
@@ -767,7 +767,7 @@
             <w:noProof/>
             <w:webHidden/>
           </w:rPr>
-          <w:instrText xml:space="preserve"> PAGEREF _Toc243071243 \h </w:instrText>
+          <w:instrText xml:space="preserve"> PAGEREF _Toc243071452 \h </w:instrText>
         </w:r>
         <w:r>
           <w:rPr>
@@ -814,7 +814,7 @@
           <w14:ligatures w14:val="standardContextual"/>
         </w:rPr>
       </w:pPr>
-      <w:hyperlink w:anchor="_Toc243071244" w:history="1">
+      <w:hyperlink w:anchor="_Toc243071453" w:history="1">
         <w:r>
           <w:rPr>
             <w:rStyle w:val="Hyperlink"/>
@@ -841,7 +841,7 @@
             <w:noProof/>
             <w:webHidden/>
           </w:rPr>
-          <w:instrText xml:space="preserve"> PAGEREF _Toc243071244 \h </w:instrText>
+          <w:instrText xml:space="preserve"> PAGEREF _Toc243071453 \h </w:instrText>
         </w:r>
         <w:r>
           <w:rPr>
@@ -888,7 +888,7 @@
           <w14:ligatures w14:val="standardContextual"/>
         </w:rPr>
       </w:pPr>
-      <w:hyperlink w:anchor="_Toc243071245" w:history="1">
+      <w:hyperlink w:anchor="_Toc243071454" w:history="1">
         <w:r>
           <w:rPr>
             <w:rStyle w:val="Hyperlink"/>
@@ -915,7 +915,7 @@
             <w:noProof/>
             <w:webHidden/>
           </w:rPr>
-          <w:instrText xml:space="preserve"> PAGEREF _Toc243071245 \h </w:instrText>
+          <w:instrText xml:space="preserve"> PAGEREF _Toc243071454 \h </w:instrText>
         </w:r>
         <w:r>
           <w:rPr>
@@ -962,7 +962,7 @@
           <w14:ligatures w14:val="standardContextual"/>
         </w:rPr>
       </w:pPr>
-      <w:hyperlink w:anchor="_Toc243071246" w:history="1">
+      <w:hyperlink w:anchor="_Toc243071455" w:history="1">
         <w:r>
           <w:rPr>
             <w:rStyle w:val="Hyperlink"/>
@@ -989,7 +989,7 @@
             <w:noProof/>
             <w:webHidden/>
           </w:rPr>
-          <w:instrText xml:space="preserve"> PAGEREF _Toc243071246 \h </w:instrText>
+          <w:instrText xml:space="preserve"> PAGEREF _Toc243071455 \h </w:instrText>
         </w:r>
         <w:r>
           <w:rPr>
@@ -1036,7 +1036,7 @@
           <w14:ligatures w14:val="standardContextual"/>
         </w:rPr>
       </w:pPr>
-      <w:hyperlink w:anchor="_Toc243071247" w:history="1">
+      <w:hyperlink w:anchor="_Toc243071456" w:history="1">
         <w:r>
           <w:rPr>
             <w:rStyle w:val="Hyperlink"/>
@@ -1063,7 +1063,7 @@
             <w:noProof/>
             <w:webHidden/>
           </w:rPr>
-          <w:instrText xml:space="preserve"> PAGEREF _Toc243071247 \h </w:instrText>
+          <w:instrText xml:space="preserve"> PAGEREF _Toc243071456 \h </w:instrText>
         </w:r>
         <w:r>
           <w:rPr>
@@ -1110,7 +1110,7 @@
           <w14:ligatures w14:val="standardContextual"/>
         </w:rPr>
       </w:pPr>
-      <w:hyperlink w:anchor="_Toc243071248" w:history="1">
+      <w:hyperlink w:anchor="_Toc243071457" w:history="1">
         <w:r>
           <w:rPr>
             <w:rStyle w:val="Hyperlink"/>
@@ -1137,7 +1137,7 @@
             <w:noProof/>
             <w:webHidden/>
           </w:rPr>
-          <w:instrText xml:space="preserve"> PAGEREF _Toc243071248 \h </w:instrText>
+          <w:instrText xml:space="preserve"> PAGEREF _Toc243071457 \h </w:instrText>
         </w:r>
         <w:r>
           <w:rPr>
@@ -1184,7 +1184,7 @@
           <w14:ligatures w14:val="standardContextual"/>
         </w:rPr>
       </w:pPr>
-      <w:hyperlink w:anchor="_Toc243071249" w:history="1">
+      <w:hyperlink w:anchor="_Toc243071458" w:history="1">
         <w:r>
           <w:rPr>
             <w:rStyle w:val="Hyperlink"/>
@@ -1211,7 +1211,7 @@
             <w:noProof/>
             <w:webHidden/>
           </w:rPr>
-          <w:instrText xml:space="preserve"> PAGEREF _Toc243071249 \h </w:instrText>
+          <w:instrText xml:space="preserve"> PAGEREF _Toc243071458 \h </w:instrText>
         </w:r>
         <w:r>
           <w:rPr>
@@ -1258,7 +1258,7 @@
           <w14:ligatures w14:val="standardContextual"/>
         </w:rPr>
       </w:pPr>
-      <w:hyperlink w:anchor="_Toc243071250" w:history="1">
+      <w:hyperlink w:anchor="_Toc243071459" w:history="1">
         <w:r>
           <w:rPr>
             <w:rStyle w:val="Hyperlink"/>
@@ -1285,7 +1285,7 @@
             <w:noProof/>
             <w:webHidden/>
           </w:rPr>
-          <w:instrText xml:space="preserve"> PAGEREF _Toc243071250 \h </w:instrText>
+          <w:instrText xml:space="preserve"> PAGEREF _Toc243071459 \h </w:instrText>
         </w:r>
         <w:r>
           <w:rPr>
@@ -1332,7 +1332,7 @@
           <w14:ligatures w14:val="standardContextual"/>
         </w:rPr>
       </w:pPr>
-      <w:hyperlink w:anchor="_Toc243071251" w:history="1">
+      <w:hyperlink w:anchor="_Toc243071460" w:history="1">
         <w:r>
           <w:rPr>
             <w:rStyle w:val="Hyperlink"/>
@@ -1359,7 +1359,7 @@
             <w:noProof/>
             <w:webHidden/>
           </w:rPr>
-          <w:instrText xml:space="preserve"> PAGEREF _Toc243071251 \h </w:instrText>
+          <w:instrText xml:space="preserve"> PAGEREF _Toc243071460 \h </w:instrText>
         </w:r>
         <w:r>
           <w:rPr>
@@ -1406,7 +1406,7 @@
           <w14:ligatures w14:val="standardContextual"/>
         </w:rPr>
       </w:pPr>
-      <w:hyperlink w:anchor="_Toc243071252" w:history="1">
+      <w:hyperlink w:anchor="_Toc243071461" w:history="1">
         <w:r>
           <w:rPr>
             <w:rStyle w:val="Hyperlink"/>
@@ -1433,7 +1433,7 @@
             <w:noProof/>
             <w:webHidden/>
           </w:rPr>
-          <w:instrText xml:space="preserve"> PAGEREF _Toc243071252 \h </w:instrText>
+          <w:instrText xml:space="preserve"> PAGEREF _Toc243071461 \h </w:instrText>
         </w:r>
         <w:r>
           <w:rPr>
@@ -1480,7 +1480,7 @@
           <w14:ligatures w14:val="standardContextual"/>
         </w:rPr>
       </w:pPr>
-      <w:hyperlink w:anchor="_Toc243071253" w:history="1">
+      <w:hyperlink w:anchor="_Toc243071462" w:history="1">
         <w:r>
           <w:rPr>
             <w:rStyle w:val="Hyperlink"/>
@@ -1507,7 +1507,7 @@
             <w:noProof/>
             <w:webHidden/>
           </w:rPr>
-          <w:instrText xml:space="preserve"> PAGEREF _Toc243071253 \h </w:instrText>
+          <w:instrText xml:space="preserve"> PAGEREF _Toc243071462 \h </w:instrText>
         </w:r>
         <w:r>
           <w:rPr>
@@ -1554,7 +1554,7 @@
           <w14:ligatures w14:val="standardContextual"/>
         </w:rPr>
       </w:pPr>
-      <w:hyperlink w:anchor="_Toc243071254" w:history="1">
+      <w:hyperlink w:anchor="_Toc243071463" w:history="1">
         <w:r>
           <w:rPr>
             <w:rStyle w:val="Hyperlink"/>
@@ -1581,7 +1581,7 @@
             <w:noProof/>
             <w:webHidden/>
           </w:rPr>
-          <w:instrText xml:space="preserve"> PAGEREF _Toc243071254 \h </w:instrText>
+          <w:instrText xml:space="preserve"> PAGEREF _Toc243071463 \h </w:instrText>
         </w:r>
         <w:r>
           <w:rPr>
@@ -1628,7 +1628,7 @@
           <w14:ligatures w14:val="standardContextual"/>
         </w:rPr>
       </w:pPr>
-      <w:hyperlink w:anchor="_Toc243071255" w:history="1">
+      <w:hyperlink w:anchor="_Toc243071464" w:history="1">
         <w:r>
           <w:rPr>
             <w:rStyle w:val="Hyperlink"/>
@@ -1655,7 +1655,7 @@
             <w:noProof/>
             <w:webHidden/>
           </w:rPr>
-          <w:instrText xml:space="preserve"> PAGEREF _Toc243071255 \h </w:instrText>
+          <w:instrText xml:space="preserve"> PAGEREF _Toc243071464 \h </w:instrText>
         </w:r>
         <w:r>
           <w:rPr>
@@ -1702,7 +1702,7 @@
           <w14:ligatures w14:val="standardContextual"/>
         </w:rPr>
       </w:pPr>
-      <w:hyperlink w:anchor="_Toc243071256" w:history="1">
+      <w:hyperlink w:anchor="_Toc243071465" w:history="1">
         <w:r>
           <w:rPr>
             <w:rStyle w:val="Hyperlink"/>
@@ -1729,7 +1729,7 @@
             <w:noProof/>
             <w:webHidden/>
           </w:rPr>
-          <w:instrText xml:space="preserve"> PAGEREF _Toc243071256 \h </w:instrText>
+          <w:instrText xml:space="preserve"> PAGEREF _Toc243071465 \h </w:instrText>
         </w:r>
         <w:r>
           <w:rPr>
@@ -1776,7 +1776,7 @@
           <w14:ligatures w14:val="standardContextual"/>
         </w:rPr>
       </w:pPr>
-      <w:hyperlink w:anchor="_Toc243071257" w:history="1">
+      <w:hyperlink w:anchor="_Toc243071466" w:history="1">
         <w:r>
           <w:rPr>
             <w:rStyle w:val="Hyperlink"/>
@@ -1803,7 +1803,7 @@
             <w:noProof/>
             <w:webHidden/>
           </w:rPr>
-          <w:instrText xml:space="preserve"> PAGEREF _Toc243071257 \h </w:instrText>
+          <w:instrText xml:space="preserve"> PAGEREF _Toc243071466 \h </w:instrText>
         </w:r>
         <w:r>
           <w:rPr>
@@ -1850,7 +1850,7 @@
           <w14:ligatures w14:val="standardContextual"/>
         </w:rPr>
       </w:pPr>
-      <w:hyperlink w:anchor="_Toc243071258" w:history="1">
+      <w:hyperlink w:anchor="_Toc243071467" w:history="1">
         <w:r>
           <w:rPr>
             <w:rStyle w:val="Hyperlink"/>
@@ -1877,7 +1877,7 @@
             <w:noProof/>
             <w:webHidden/>
           </w:rPr>
-          <w:instrText xml:space="preserve"> PAGEREF _Toc243071258 \h </w:instrText>
+          <w:instrText xml:space="preserve"> PAGEREF _Toc243071467 \h </w:instrText>
         </w:r>
         <w:r>
           <w:rPr>
@@ -1924,7 +1924,7 @@
           <w14:ligatures w14:val="standardContextual"/>
         </w:rPr>
       </w:pPr>
-      <w:hyperlink w:anchor="_Toc243071259" w:history="1">
+      <w:hyperlink w:anchor="_Toc243071468" w:history="1">
         <w:r>
           <w:rPr>
             <w:rStyle w:val="Hyperlink"/>
@@ -1951,7 +1951,7 @@
             <w:noProof/>
             <w:webHidden/>
           </w:rPr>
-          <w:instrText xml:space="preserve"> PAGEREF _Toc243071259 \h </w:instrText>
+          <w:instrText xml:space="preserve"> PAGEREF _Toc243071468 \h </w:instrText>
         </w:r>
         <w:r>
           <w:rPr>
@@ -1998,7 +1998,7 @@
           <w14:ligatures w14:val="standardContextual"/>
         </w:rPr>
       </w:pPr>
-      <w:hyperlink w:anchor="_Toc243071260" w:history="1">
+      <w:hyperlink w:anchor="_Toc243071469" w:history="1">
         <w:r>
           <w:rPr>
             <w:rStyle w:val="Hyperlink"/>
@@ -2025,7 +2025,7 @@
             <w:noProof/>
             <w:webHidden/>
           </w:rPr>
-          <w:instrText xml:space="preserve"> PAGEREF _Toc243071260 \h </w:instrText>
+          <w:instrText xml:space="preserve"> PAGEREF _Toc243071469 \h </w:instrText>
         </w:r>
         <w:r>
           <w:rPr>
@@ -2072,7 +2072,7 @@
           <w14:ligatures w14:val="standardContextual"/>
         </w:rPr>
       </w:pPr>
-      <w:hyperlink w:anchor="_Toc243071261" w:history="1">
+      <w:hyperlink w:anchor="_Toc243071470" w:history="1">
         <w:r>
           <w:rPr>
             <w:rStyle w:val="Hyperlink"/>
@@ -2099,7 +2099,7 @@
             <w:noProof/>
             <w:webHidden/>
           </w:rPr>
-          <w:instrText xml:space="preserve"> PAGEREF _Toc243071261 \h </w:instrText>
+          <w:instrText xml:space="preserve"> PAGEREF _Toc243071470 \h </w:instrText>
         </w:r>
         <w:r>
           <w:rPr>
@@ -2146,7 +2146,7 @@
           <w14:ligatures w14:val="standardContextual"/>
         </w:rPr>
       </w:pPr>
-      <w:hyperlink w:anchor="_Toc243071262" w:history="1">
+      <w:hyperlink w:anchor="_Toc243071471" w:history="1">
         <w:r>
           <w:rPr>
             <w:rStyle w:val="Hyperlink"/>
@@ -2173,7 +2173,7 @@
             <w:noProof/>
             <w:webHidden/>
           </w:rPr>
-          <w:instrText xml:space="preserve"> PAGEREF _Toc243071262 \h </w:instrText>
+          <w:instrText xml:space="preserve"> PAGEREF _Toc243071471 \h </w:instrText>
         </w:r>
         <w:r>
           <w:rPr>
@@ -2220,7 +2220,7 @@
           <w14:ligatures w14:val="standardContextual"/>
         </w:rPr>
       </w:pPr>
-      <w:hyperlink w:anchor="_Toc243071263" w:history="1">
+      <w:hyperlink w:anchor="_Toc243071472" w:history="1">
         <w:r>
           <w:rPr>
             <w:rStyle w:val="Hyperlink"/>
@@ -2247,7 +2247,7 @@
             <w:noProof/>
             <w:webHidden/>
           </w:rPr>
-          <w:instrText xml:space="preserve"> PAGEREF _Toc243071263 \h </w:instrText>
+          <w:instrText xml:space="preserve"> PAGEREF _Toc243071472 \h </w:instrText>
         </w:r>
         <w:r>
           <w:rPr>
@@ -2294,7 +2294,7 @@
           <w14:ligatures w14:val="standardContextual"/>
         </w:rPr>
       </w:pPr>
-      <w:hyperlink w:anchor="_Toc243071264" w:history="1">
+      <w:hyperlink w:anchor="_Toc243071473" w:history="1">
         <w:r>
           <w:rPr>
             <w:rStyle w:val="Hyperlink"/>
@@ -2321,7 +2321,7 @@
             <w:noProof/>
             <w:webHidden/>
           </w:rPr>
-          <w:instrText xml:space="preserve"> PAGEREF _Toc243071264 \h </w:instrText>
+          <w:instrText xml:space="preserve"> PAGEREF _Toc243071473 \h </w:instrText>
         </w:r>
         <w:r>
           <w:rPr>
@@ -2368,7 +2368,7 @@
           <w14:ligatures w14:val="standardContextual"/>
         </w:rPr>
       </w:pPr>
-      <w:hyperlink w:anchor="_Toc243071265" w:history="1">
+      <w:hyperlink w:anchor="_Toc243071474" w:history="1">
         <w:r>
           <w:rPr>
             <w:rStyle w:val="Hyperlink"/>
@@ -2395,7 +2395,7 @@
             <w:noProof/>
             <w:webHidden/>
           </w:rPr>
-          <w:instrText xml:space="preserve"> PAGEREF _Toc243071265 \h </w:instrText>
+          <w:instrText xml:space="preserve"> PAGEREF _Toc243071474 \h </w:instrText>
         </w:r>
         <w:r>
           <w:rPr>
@@ -2442,7 +2442,7 @@
           <w14:ligatures w14:val="standardContextual"/>
         </w:rPr>
       </w:pPr>
-      <w:hyperlink w:anchor="_Toc243071266" w:history="1">
+      <w:hyperlink w:anchor="_Toc243071475" w:history="1">
         <w:r>
           <w:rPr>
             <w:rStyle w:val="Hyperlink"/>
@@ -2469,7 +2469,7 @@
             <w:noProof/>
             <w:webHidden/>
           </w:rPr>
-          <w:instrText xml:space="preserve"> PAGEREF _Toc243071266 \h </w:instrText>
+          <w:instrText xml:space="preserve"> PAGEREF _Toc243071475 \h </w:instrText>
         </w:r>
         <w:r>
           <w:rPr>
@@ -2516,7 +2516,7 @@
           <w14:ligatures w14:val="standardContextual"/>
         </w:rPr>
       </w:pPr>
-      <w:hyperlink w:anchor="_Toc243071267" w:history="1">
+      <w:hyperlink w:anchor="_Toc243071476" w:history="1">
         <w:r>
           <w:rPr>
             <w:rStyle w:val="Hyperlink"/>
@@ -2543,7 +2543,7 @@
             <w:noProof/>
             <w:webHidden/>
           </w:rPr>
-          <w:instrText xml:space="preserve"> PAGEREF _Toc243071267 \h </w:instrText>
+          <w:instrText xml:space="preserve"> PAGEREF _Toc243071476 \h </w:instrText>
         </w:r>
         <w:r>
           <w:rPr>
@@ -2590,7 +2590,7 @@
           <w14:ligatures w14:val="standardContextual"/>
         </w:rPr>
       </w:pPr>
-      <w:hyperlink w:anchor="_Toc243071268" w:history="1">
+      <w:hyperlink w:anchor="_Toc243071477" w:history="1">
         <w:r>
           <w:rPr>
             <w:rStyle w:val="Hyperlink"/>
@@ -2617,7 +2617,7 @@
             <w:noProof/>
             <w:webHidden/>
           </w:rPr>
-          <w:instrText xml:space="preserve"> PAGEREF _Toc243071268 \h </w:instrText>
+          <w:instrText xml:space="preserve"> PAGEREF _Toc243071477 \h </w:instrText>
         </w:r>
         <w:r>
           <w:rPr>
@@ -2664,7 +2664,7 @@
           <w14:ligatures w14:val="standardContextual"/>
         </w:rPr>
       </w:pPr>
-      <w:hyperlink w:anchor="_Toc243071269" w:history="1">
+      <w:hyperlink w:anchor="_Toc243071478" w:history="1">
         <w:r>
           <w:rPr>
             <w:rStyle w:val="Hyperlink"/>
@@ -2691,7 +2691,7 @@
             <w:noProof/>
             <w:webHidden/>
           </w:rPr>
-          <w:instrText xml:space="preserve"> PAGEREF _Toc243071269 \h </w:instrText>
+          <w:instrText xml:space="preserve"> PAGEREF _Toc243071478 \h </w:instrText>
         </w:r>
         <w:r>
           <w:rPr>
@@ -2738,7 +2738,7 @@
           <w14:ligatures w14:val="standardContextual"/>
         </w:rPr>
       </w:pPr>
-      <w:hyperlink w:anchor="_Toc243071270" w:history="1">
+      <w:hyperlink w:anchor="_Toc243071479" w:history="1">
         <w:r>
           <w:rPr>
             <w:rStyle w:val="Hyperlink"/>
@@ -2765,7 +2765,7 @@
             <w:noProof/>
             <w:webHidden/>
           </w:rPr>
-          <w:instrText xml:space="preserve"> PAGEREF _Toc243071270 \h </w:instrText>
+          <w:instrText xml:space="preserve"> PAGEREF _Toc243071479 \h </w:instrText>
         </w:r>
         <w:r>
           <w:rPr>
@@ -2812,7 +2812,7 @@
           <w14:ligatures w14:val="standardContextual"/>
         </w:rPr>
       </w:pPr>
-      <w:hyperlink w:anchor="_Toc243071271" w:history="1">
+      <w:hyperlink w:anchor="_Toc243071480" w:history="1">
         <w:r>
           <w:rPr>
             <w:rStyle w:val="Hyperlink"/>
@@ -2839,7 +2839,7 @@
             <w:noProof/>
             <w:webHidden/>
           </w:rPr>
-          <w:instrText xml:space="preserve"> PAGEREF _Toc243071271 \h </w:instrText>
+          <w:instrText xml:space="preserve"> PAGEREF _Toc243071480 \h </w:instrText>
         </w:r>
         <w:r>
           <w:rPr>
@@ -2886,7 +2886,7 @@
           <w14:ligatures w14:val="standardContextual"/>
         </w:rPr>
       </w:pPr>
-      <w:hyperlink w:anchor="_Toc243071272" w:history="1">
+      <w:hyperlink w:anchor="_Toc243071481" w:history="1">
         <w:r>
           <w:rPr>
             <w:rStyle w:val="Hyperlink"/>
@@ -2913,7 +2913,7 @@
             <w:noProof/>
             <w:webHidden/>
           </w:rPr>
-          <w:instrText xml:space="preserve"> PAGEREF _Toc243071272 \h </w:instrText>
+          <w:instrText xml:space="preserve"> PAGEREF _Toc243071481 \h </w:instrText>
         </w:r>
         <w:r>
           <w:rPr>
@@ -2960,7 +2960,7 @@
           <w14:ligatures w14:val="standardContextual"/>
         </w:rPr>
       </w:pPr>
-      <w:hyperlink w:anchor="_Toc243071273" w:history="1">
+      <w:hyperlink w:anchor="_Toc243071482" w:history="1">
         <w:r>
           <w:rPr>
             <w:rStyle w:val="Hyperlink"/>
@@ -2987,7 +2987,7 @@
             <w:noProof/>
             <w:webHidden/>
           </w:rPr>
-          <w:instrText xml:space="preserve"> PAGEREF _Toc243071273 \h </w:instrText>
+          <w:instrText xml:space="preserve"> PAGEREF _Toc243071482 \h </w:instrText>
         </w:r>
         <w:r>
           <w:rPr>
@@ -3034,7 +3034,7 @@
           <w14:ligatures w14:val="standardContextual"/>
         </w:rPr>
       </w:pPr>
-      <w:hyperlink w:anchor="_Toc243071274" w:history="1">
+      <w:hyperlink w:anchor="_Toc243071483" w:history="1">
         <w:r>
           <w:rPr>
             <w:rStyle w:val="Hyperlink"/>
@@ -3061,7 +3061,7 @@
             <w:noProof/>
             <w:webHidden/>
           </w:rPr>
-          <w:instrText xml:space="preserve"> PAGEREF _Toc243071274 \h </w:instrText>
+          <w:instrText xml:space="preserve"> PAGEREF _Toc243071483 \h </w:instrText>
         </w:r>
         <w:r>
           <w:rPr>
@@ -3108,7 +3108,7 @@
           <w14:ligatures w14:val="standardContextual"/>
         </w:rPr>
       </w:pPr>
-      <w:hyperlink w:anchor="_Toc243071275" w:history="1">
+      <w:hyperlink w:anchor="_Toc243071484" w:history="1">
         <w:r>
           <w:rPr>
             <w:rStyle w:val="Hyperlink"/>
@@ -3135,7 +3135,7 @@
             <w:noProof/>
             <w:webHidden/>
           </w:rPr>
-          <w:instrText xml:space="preserve"> PAGEREF _Toc243071275 \h </w:instrText>
+          <w:instrText xml:space="preserve"> PAGEREF _Toc243071484 \h </w:instrText>
         </w:r>
         <w:r>
           <w:rPr>
@@ -3182,7 +3182,7 @@
           <w14:ligatures w14:val="standardContextual"/>
         </w:rPr>
       </w:pPr>
-      <w:hyperlink w:anchor="_Toc243071276" w:history="1">
+      <w:hyperlink w:anchor="_Toc243071485" w:history="1">
         <w:r>
           <w:rPr>
             <w:rStyle w:val="Hyperlink"/>
@@ -3209,7 +3209,7 @@
             <w:noProof/>
             <w:webHidden/>
           </w:rPr>
-          <w:instrText xml:space="preserve"> PAGEREF _Toc243071276 \h </w:instrText>
+          <w:instrText xml:space="preserve"> PAGEREF _Toc243071485 \h </w:instrText>
         </w:r>
         <w:r>
           <w:rPr>
@@ -3256,7 +3256,7 @@
           <w14:ligatures w14:val="standardContextual"/>
         </w:rPr>
       </w:pPr>
-      <w:hyperlink w:anchor="_Toc243071277" w:history="1">
+      <w:hyperlink w:anchor="_Toc243071486" w:history="1">
         <w:r>
           <w:rPr>
             <w:rStyle w:val="Hyperlink"/>
@@ -3283,7 +3283,7 @@
             <w:noProof/>
             <w:webHidden/>
           </w:rPr>
-          <w:instrText xml:space="preserve"> PAGEREF _Toc243071277 \h </w:instrText>
+          <w:instrText xml:space="preserve"> PAGEREF _Toc243071486 \h </w:instrText>
         </w:r>
         <w:r>
           <w:rPr>
@@ -3330,7 +3330,7 @@
           <w14:ligatures w14:val="standardContextual"/>
         </w:rPr>
       </w:pPr>
-      <w:hyperlink w:anchor="_Toc243071278" w:history="1">
+      <w:hyperlink w:anchor="_Toc243071487" w:history="1">
         <w:r>
           <w:rPr>
             <w:rStyle w:val="Hyperlink"/>
@@ -3357,7 +3357,7 @@
             <w:noProof/>
             <w:webHidden/>
           </w:rPr>
-          <w:instrText xml:space="preserve"> PAGEREF _Toc243071278 \h </w:instrText>
+          <w:instrText xml:space="preserve"> PAGEREF _Toc243071487 \h </w:instrText>
         </w:r>
         <w:r>
           <w:rPr>
@@ -3404,7 +3404,7 @@
           <w14:ligatures w14:val="standardContextual"/>
         </w:rPr>
       </w:pPr>
-      <w:hyperlink w:anchor="_Toc243071279" w:history="1">
+      <w:hyperlink w:anchor="_Toc243071488" w:history="1">
         <w:r>
           <w:rPr>
             <w:rStyle w:val="Hyperlink"/>
@@ -3431,7 +3431,7 @@
             <w:noProof/>
             <w:webHidden/>
           </w:rPr>
-          <w:instrText xml:space="preserve"> PAGEREF _Toc243071279 \h </w:instrText>
+          <w:instrText xml:space="preserve"> PAGEREF _Toc243071488 \h </w:instrText>
         </w:r>
         <w:r>
           <w:rPr>
@@ -3478,7 +3478,7 @@
           <w14:ligatures w14:val="standardContextual"/>
         </w:rPr>
       </w:pPr>
-      <w:hyperlink w:anchor="_Toc243071280" w:history="1">
+      <w:hyperlink w:anchor="_Toc243071489" w:history="1">
         <w:r>
           <w:rPr>
             <w:rStyle w:val="Hyperlink"/>
@@ -3505,7 +3505,7 @@
             <w:noProof/>
             <w:webHidden/>
           </w:rPr>
-          <w:instrText xml:space="preserve"> PAGEREF _Toc243071280 \h </w:instrText>
+          <w:instrText xml:space="preserve"> PAGEREF _Toc243071489 \h </w:instrText>
         </w:r>
         <w:r>
           <w:rPr>
@@ -3552,7 +3552,7 @@
           <w14:ligatures w14:val="standardContextual"/>
         </w:rPr>
       </w:pPr>
-      <w:hyperlink w:anchor="_Toc243071281" w:history="1">
+      <w:hyperlink w:anchor="_Toc243071490" w:history="1">
         <w:r>
           <w:rPr>
             <w:rStyle w:val="Hyperlink"/>
@@ -3579,7 +3579,7 @@
             <w:noProof/>
             <w:webHidden/>
           </w:rPr>
-          <w:instrText xml:space="preserve"> PAGEREF _Toc243071281 \h </w:instrText>
+          <w:instrText xml:space="preserve"> PAGEREF _Toc243071490 \h </w:instrText>
         </w:r>
         <w:r>
           <w:rPr>
@@ -3626,7 +3626,7 @@
           <w14:ligatures w14:val="standardContextual"/>
         </w:rPr>
       </w:pPr>
-      <w:hyperlink w:anchor="_Toc243071282" w:history="1">
+      <w:hyperlink w:anchor="_Toc243071491" w:history="1">
         <w:r>
           <w:rPr>
             <w:rStyle w:val="Hyperlink"/>
@@ -3653,7 +3653,7 @@
             <w:noProof/>
             <w:webHidden/>
           </w:rPr>
-          <w:instrText xml:space="preserve"> PAGEREF _Toc243071282 \h </w:instrText>
+          <w:instrText xml:space="preserve"> PAGEREF _Toc243071491 \h </w:instrText>
         </w:r>
         <w:r>
           <w:rPr>
@@ -3700,7 +3700,7 @@
           <w14:ligatures w14:val="standardContextual"/>
         </w:rPr>
       </w:pPr>
-      <w:hyperlink w:anchor="_Toc243071283" w:history="1">
+      <w:hyperlink w:anchor="_Toc243071492" w:history="1">
         <w:r>
           <w:rPr>
             <w:rStyle w:val="Hyperlink"/>
@@ -3727,7 +3727,7 @@
             <w:noProof/>
             <w:webHidden/>
           </w:rPr>
-          <w:instrText xml:space="preserve"> PAGEREF _Toc243071283 \h </w:instrText>
+          <w:instrText xml:space="preserve"> PAGEREF _Toc243071492 \h </w:instrText>
         </w:r>
         <w:r>
           <w:rPr>
@@ -3774,7 +3774,7 @@
           <w14:ligatures w14:val="standardContextual"/>
         </w:rPr>
       </w:pPr>
-      <w:hyperlink w:anchor="_Toc243071284" w:history="1">
+      <w:hyperlink w:anchor="_Toc243071493" w:history="1">
         <w:r>
           <w:rPr>
             <w:rStyle w:val="Hyperlink"/>
@@ -3801,7 +3801,7 @@
             <w:noProof/>
             <w:webHidden/>
           </w:rPr>
-          <w:instrText xml:space="preserve"> PAGEREF _Toc243071284 \h </w:instrText>
+          <w:instrText xml:space="preserve"> PAGEREF _Toc243071493 \h </w:instrText>
         </w:r>
         <w:r>
           <w:rPr>
@@ -3848,7 +3848,7 @@
           <w14:ligatures w14:val="standardContextual"/>
         </w:rPr>
       </w:pPr>
-      <w:hyperlink w:anchor="_Toc243071285" w:history="1">
+      <w:hyperlink w:anchor="_Toc243071494" w:history="1">
         <w:r>
           <w:rPr>
             <w:rStyle w:val="Hyperlink"/>
@@ -3875,7 +3875,7 @@
             <w:noProof/>
             <w:webHidden/>
           </w:rPr>
-          <w:instrText xml:space="preserve"> PAGEREF _Toc243071285 \h </w:instrText>
+          <w:instrText xml:space="preserve"> PAGEREF _Toc243071494 \h </w:instrText>
         </w:r>
         <w:r>
           <w:rPr>
@@ -3922,7 +3922,7 @@
           <w14:ligatures w14:val="standardContextual"/>
         </w:rPr>
       </w:pPr>
-      <w:hyperlink w:anchor="_Toc243071286" w:history="1">
+      <w:hyperlink w:anchor="_Toc243071495" w:history="1">
         <w:r>
           <w:rPr>
             <w:rStyle w:val="Hyperlink"/>
@@ -3949,7 +3949,7 @@
             <w:noProof/>
             <w:webHidden/>
           </w:rPr>
-          <w:instrText xml:space="preserve"> PAGEREF _Toc243071286 \h </w:instrText>
+          <w:instrText xml:space="preserve"> PAGEREF _Toc243071495 \h </w:instrText>
         </w:r>
         <w:r>
           <w:rPr>
@@ -3996,7 +3996,7 @@
           <w14:ligatures w14:val="standardContextual"/>
         </w:rPr>
       </w:pPr>
-      <w:hyperlink w:anchor="_Toc243071287" w:history="1">
+      <w:hyperlink w:anchor="_Toc243071496" w:history="1">
         <w:r>
           <w:rPr>
             <w:rStyle w:val="Hyperlink"/>
@@ -4023,7 +4023,7 @@
             <w:noProof/>
             <w:webHidden/>
           </w:rPr>
-          <w:instrText xml:space="preserve"> PAGEREF _Toc243071287 \h </w:instrText>
+          <w:instrText xml:space="preserve"> PAGEREF _Toc243071496 \h </w:instrText>
         </w:r>
         <w:r>
           <w:rPr>
@@ -4070,7 +4070,7 @@
           <w14:ligatures w14:val="standardContextual"/>
         </w:rPr>
       </w:pPr>
-      <w:hyperlink w:anchor="_Toc243071288" w:history="1">
+      <w:hyperlink w:anchor="_Toc243071497" w:history="1">
         <w:r>
           <w:rPr>
             <w:rStyle w:val="Hyperlink"/>
@@ -4097,7 +4097,7 @@
             <w:noProof/>
             <w:webHidden/>
           </w:rPr>
-          <w:instrText xml:space="preserve"> PAGEREF _Toc243071288 \h </w:instrText>
+          <w:instrText xml:space="preserve"> PAGEREF _Toc243071497 \h </w:instrText>
         </w:r>
         <w:r>
           <w:rPr>
@@ -4144,7 +4144,7 @@
           <w14:ligatures w14:val="standardContextual"/>
         </w:rPr>
       </w:pPr>
-      <w:hyperlink w:anchor="_Toc243071289" w:history="1">
+      <w:hyperlink w:anchor="_Toc243071498" w:history="1">
         <w:r>
           <w:rPr>
             <w:rStyle w:val="Hyperlink"/>
@@ -4171,7 +4171,7 @@
             <w:noProof/>
             <w:webHidden/>
           </w:rPr>
-          <w:instrText xml:space="preserve"> PAGEREF _Toc243071289 \h </w:instrText>
+          <w:instrText xml:space="preserve"> PAGEREF _Toc243071498 \h </w:instrText>
         </w:r>
         <w:r>
           <w:rPr>
@@ -4218,7 +4218,7 @@
           <w14:ligatures w14:val="standardContextual"/>
         </w:rPr>
       </w:pPr>
-      <w:hyperlink w:anchor="_Toc243071290" w:history="1">
+      <w:hyperlink w:anchor="_Toc243071499" w:history="1">
         <w:r>
           <w:rPr>
             <w:rStyle w:val="Hyperlink"/>
@@ -4245,7 +4245,7 @@
             <w:noProof/>
             <w:webHidden/>
           </w:rPr>
-          <w:instrText xml:space="preserve"> PAGEREF _Toc243071290 \h </w:instrText>
+          <w:instrText xml:space="preserve"> PAGEREF _Toc243071499 \h </w:instrText>
         </w:r>
         <w:r>
           <w:rPr>
@@ -4292,7 +4292,7 @@
           <w14:ligatures w14:val="standardContextual"/>
         </w:rPr>
       </w:pPr>
-      <w:hyperlink w:anchor="_Toc243071291" w:history="1">
+      <w:hyperlink w:anchor="_Toc243071500" w:history="1">
         <w:r>
           <w:rPr>
             <w:rStyle w:val="Hyperlink"/>
@@ -4319,7 +4319,7 @@
             <w:noProof/>
             <w:webHidden/>
           </w:rPr>
-          <w:instrText xml:space="preserve"> PAGEREF _Toc243071291 \h </w:instrText>
+          <w:instrText xml:space="preserve"> PAGEREF _Toc243071500 \h </w:instrText>
         </w:r>
         <w:r>
           <w:rPr>
@@ -4366,7 +4366,7 @@
           <w14:ligatures w14:val="standardContextual"/>
         </w:rPr>
       </w:pPr>
-      <w:hyperlink w:anchor="_Toc243071292" w:history="1">
+      <w:hyperlink w:anchor="_Toc243071501" w:history="1">
         <w:r>
           <w:rPr>
             <w:rStyle w:val="Hyperlink"/>
@@ -4393,7 +4393,7 @@
             <w:noProof/>
             <w:webHidden/>
           </w:rPr>
-          <w:instrText xml:space="preserve"> PAGEREF _Toc243071292 \h </w:instrText>
+          <w:instrText xml:space="preserve"> PAGEREF _Toc243071501 \h </w:instrText>
         </w:r>
         <w:r>
           <w:rPr>
@@ -4440,7 +4440,7 @@
           <w14:ligatures w14:val="standardContextual"/>
         </w:rPr>
       </w:pPr>
-      <w:hyperlink w:anchor="_Toc243071293" w:history="1">
+      <w:hyperlink w:anchor="_Toc243071502" w:history="1">
         <w:r>
           <w:rPr>
             <w:rStyle w:val="Hyperlink"/>
@@ -4467,7 +4467,7 @@
             <w:noProof/>
             <w:webHidden/>
           </w:rPr>
-          <w:instrText xml:space="preserve"> PAGEREF _Toc243071293 \h </w:instrText>
+          <w:instrText xml:space="preserve"> PAGEREF _Toc243071502 \h </w:instrText>
         </w:r>
         <w:r>
           <w:rPr>
@@ -4514,7 +4514,7 @@
           <w14:ligatures w14:val="standardContextual"/>
         </w:rPr>
       </w:pPr>
-      <w:hyperlink w:anchor="_Toc243071294" w:history="1">
+      <w:hyperlink w:anchor="_Toc243071503" w:history="1">
         <w:r>
           <w:rPr>
             <w:rStyle w:val="Hyperlink"/>
@@ -4541,7 +4541,7 @@
             <w:noProof/>
             <w:webHidden/>
           </w:rPr>
-          <w:instrText xml:space="preserve"> PAGEREF _Toc243071294 \h </w:instrText>
+          <w:instrText xml:space="preserve"> PAGEREF _Toc243071503 \h </w:instrText>
         </w:r>
         <w:r>
           <w:rPr>
@@ -4588,7 +4588,7 @@
           <w14:ligatures w14:val="standardContextual"/>
         </w:rPr>
       </w:pPr>
-      <w:hyperlink w:anchor="_Toc243071295" w:history="1">
+      <w:hyperlink w:anchor="_Toc243071504" w:history="1">
         <w:r>
           <w:rPr>
             <w:rStyle w:val="Hyperlink"/>
@@ -4615,7 +4615,7 @@
             <w:noProof/>
             <w:webHidden/>
           </w:rPr>
-          <w:instrText xml:space="preserve"> PAGEREF _Toc243071295 \h </w:instrText>
+          <w:instrText xml:space="preserve"> PAGEREF _Toc243071504 \h </w:instrText>
         </w:r>
         <w:r>
           <w:rPr>
@@ -4662,7 +4662,7 @@
           <w14:ligatures w14:val="standardContextual"/>
         </w:rPr>
       </w:pPr>
-      <w:hyperlink w:anchor="_Toc243071296" w:history="1">
+      <w:hyperlink w:anchor="_Toc243071505" w:history="1">
         <w:r>
           <w:rPr>
             <w:rStyle w:val="Hyperlink"/>
@@ -4689,7 +4689,7 @@
             <w:noProof/>
             <w:webHidden/>
           </w:rPr>
-          <w:instrText xml:space="preserve"> PAGEREF _Toc243071296 \h </w:instrText>
+          <w:instrText xml:space="preserve"> PAGEREF _Toc243071505 \h </w:instrText>
         </w:r>
         <w:r>
           <w:rPr>
@@ -4736,7 +4736,7 @@
           <w14:ligatures w14:val="standardContextual"/>
         </w:rPr>
       </w:pPr>
-      <w:hyperlink w:anchor="_Toc243071297" w:history="1">
+      <w:hyperlink w:anchor="_Toc243071506" w:history="1">
         <w:r>
           <w:rPr>
             <w:rStyle w:val="Hyperlink"/>
@@ -4763,7 +4763,7 @@
             <w:noProof/>
             <w:webHidden/>
           </w:rPr>
-          <w:instrText xml:space="preserve"> PAGEREF _Toc243071297 \h </w:instrText>
+          <w:instrText xml:space="preserve"> PAGEREF _Toc243071506 \h </w:instrText>
         </w:r>
         <w:r>
           <w:rPr>
@@ -4810,7 +4810,7 @@
           <w14:ligatures w14:val="standardContextual"/>
         </w:rPr>
       </w:pPr>
-      <w:hyperlink w:anchor="_Toc243071298" w:history="1">
+      <w:hyperlink w:anchor="_Toc243071507" w:history="1">
         <w:r>
           <w:rPr>
             <w:rStyle w:val="Hyperlink"/>
@@ -4837,7 +4837,7 @@
             <w:noProof/>
             <w:webHidden/>
           </w:rPr>
-          <w:instrText xml:space="preserve"> PAGEREF _Toc243071298 \h </w:instrText>
+          <w:instrText xml:space="preserve"> PAGEREF _Toc243071507 \h </w:instrText>
         </w:r>
         <w:r>
           <w:rPr>
@@ -4884,7 +4884,7 @@
           <w14:ligatures w14:val="standardContextual"/>
         </w:rPr>
       </w:pPr>
-      <w:hyperlink w:anchor="_Toc243071299" w:history="1">
+      <w:hyperlink w:anchor="_Toc243071508" w:history="1">
         <w:r>
           <w:rPr>
             <w:rStyle w:val="Hyperlink"/>
@@ -4911,7 +4911,7 @@
             <w:noProof/>
             <w:webHidden/>
           </w:rPr>
-          <w:instrText xml:space="preserve"> PAGEREF _Toc243071299 \h </w:instrText>
+          <w:instrText xml:space="preserve"> PAGEREF _Toc243071508 \h </w:instrText>
         </w:r>
         <w:r>
           <w:rPr>
@@ -4958,7 +4958,7 @@
           <w14:ligatures w14:val="standardContextual"/>
         </w:rPr>
       </w:pPr>
-      <w:hyperlink w:anchor="_Toc243071300" w:history="1">
+      <w:hyperlink w:anchor="_Toc243071509" w:history="1">
         <w:r>
           <w:rPr>
             <w:rStyle w:val="Hyperlink"/>
@@ -4985,7 +4985,7 @@
             <w:noProof/>
             <w:webHidden/>
           </w:rPr>
-          <w:instrText xml:space="preserve"> PAGEREF _Toc243071300 \h </w:instrText>
+          <w:instrText xml:space="preserve"> PAGEREF _Toc243071509 \h </w:instrText>
         </w:r>
         <w:r>
           <w:rPr>
@@ -5032,7 +5032,7 @@
           <w14:ligatures w14:val="standardContextual"/>
         </w:rPr>
       </w:pPr>
-      <w:hyperlink w:anchor="_Toc243071301" w:history="1">
+      <w:hyperlink w:anchor="_Toc243071510" w:history="1">
         <w:r>
           <w:rPr>
             <w:rStyle w:val="Hyperlink"/>
@@ -5059,7 +5059,7 @@
             <w:noProof/>
             <w:webHidden/>
           </w:rPr>
-          <w:instrText xml:space="preserve"> PAGEREF _Toc243071301 \h </w:instrText>
+          <w:instrText xml:space="preserve"> PAGEREF _Toc243071510 \h </w:instrText>
         </w:r>
         <w:r>
           <w:rPr>
@@ -5106,7 +5106,7 @@
           <w14:ligatures w14:val="standardContextual"/>
         </w:rPr>
       </w:pPr>
-      <w:hyperlink w:anchor="_Toc243071302" w:history="1">
+      <w:hyperlink w:anchor="_Toc243071511" w:history="1">
         <w:r>
           <w:rPr>
             <w:rStyle w:val="Hyperlink"/>
@@ -5133,7 +5133,7 @@
             <w:noProof/>
             <w:webHidden/>
           </w:rPr>
-          <w:instrText xml:space="preserve"> PAGEREF _Toc243071302 \h </w:instrText>
+          <w:instrText xml:space="preserve"> PAGEREF _Toc243071511 \h </w:instrText>
         </w:r>
         <w:r>
           <w:rPr>
@@ -5180,7 +5180,7 @@
           <w14:ligatures w14:val="standardContextual"/>
         </w:rPr>
       </w:pPr>
-      <w:hyperlink w:anchor="_Toc243071303" w:history="1">
+      <w:hyperlink w:anchor="_Toc243071512" w:history="1">
         <w:r>
           <w:rPr>
             <w:rStyle w:val="Hyperlink"/>
@@ -5207,7 +5207,7 @@
             <w:noProof/>
             <w:webHidden/>
           </w:rPr>
-          <w:instrText xml:space="preserve"> PAGEREF _Toc243071303 \h </w:instrText>
+          <w:instrText xml:space="preserve"> PAGEREF _Toc243071512 \h </w:instrText>
         </w:r>
         <w:r>
           <w:rPr>
@@ -5254,7 +5254,7 @@
           <w14:ligatures w14:val="standardContextual"/>
         </w:rPr>
       </w:pPr>
-      <w:hyperlink w:anchor="_Toc243071304" w:history="1">
+      <w:hyperlink w:anchor="_Toc243071513" w:history="1">
         <w:r>
           <w:rPr>
             <w:rStyle w:val="Hyperlink"/>
@@ -5281,7 +5281,7 @@
             <w:noProof/>
             <w:webHidden/>
           </w:rPr>
-          <w:instrText xml:space="preserve"> PAGEREF _Toc243071304 \h </w:instrText>
+          <w:instrText xml:space="preserve"> PAGEREF _Toc243071513 \h </w:instrText>
         </w:r>
         <w:r>
           <w:rPr>
@@ -5328,7 +5328,7 @@
           <w14:ligatures w14:val="standardContextual"/>
         </w:rPr>
       </w:pPr>
-      <w:hyperlink w:anchor="_Toc243071305" w:history="1">
+      <w:hyperlink w:anchor="_Toc243071514" w:history="1">
         <w:r>
           <w:rPr>
             <w:rStyle w:val="Hyperlink"/>
@@ -5355,7 +5355,7 @@
             <w:noProof/>
             <w:webHidden/>
           </w:rPr>
-          <w:instrText xml:space="preserve"> PAGEREF _Toc243071305 \h </w:instrText>
+          <w:instrText xml:space="preserve"> PAGEREF _Toc243071514 \h </w:instrText>
         </w:r>
         <w:r>
           <w:rPr>
@@ -5402,7 +5402,7 @@
           <w14:ligatures w14:val="standardContextual"/>
         </w:rPr>
       </w:pPr>
-      <w:hyperlink w:anchor="_Toc243071306" w:history="1">
+      <w:hyperlink w:anchor="_Toc243071515" w:history="1">
         <w:r>
           <w:rPr>
             <w:rStyle w:val="Hyperlink"/>
@@ -5429,7 +5429,7 @@
             <w:noProof/>
             <w:webHidden/>
           </w:rPr>
-          <w:instrText xml:space="preserve"> PAGEREF _Toc243071306 \h </w:instrText>
+          <w:instrText xml:space="preserve"> PAGEREF _Toc243071515 \h </w:instrText>
         </w:r>
         <w:r>
           <w:rPr>
@@ -5476,7 +5476,7 @@
           <w14:ligatures w14:val="standardContextual"/>
         </w:rPr>
       </w:pPr>
-      <w:hyperlink w:anchor="_Toc243071307" w:history="1">
+      <w:hyperlink w:anchor="_Toc243071516" w:history="1">
         <w:r>
           <w:rPr>
             <w:rStyle w:val="Hyperlink"/>
@@ -5503,7 +5503,7 @@
             <w:noProof/>
             <w:webHidden/>
           </w:rPr>
-          <w:instrText xml:space="preserve"> PAGEREF _Toc243071307 \h </w:instrText>
+          <w:instrText xml:space="preserve"> PAGEREF _Toc243071516 \h </w:instrText>
         </w:r>
         <w:r>
           <w:rPr>
@@ -5550,7 +5550,7 @@
           <w14:ligatures w14:val="standardContextual"/>
         </w:rPr>
       </w:pPr>
-      <w:hyperlink w:anchor="_Toc243071308" w:history="1">
+      <w:hyperlink w:anchor="_Toc243071517" w:history="1">
         <w:r>
           <w:rPr>
             <w:rStyle w:val="Hyperlink"/>
@@ -5577,7 +5577,7 @@
             <w:noProof/>
             <w:webHidden/>
           </w:rPr>
-          <w:instrText xml:space="preserve"> PAGEREF _Toc243071308 \h </w:instrText>
+          <w:instrText xml:space="preserve"> PAGEREF _Toc243071517 \h </w:instrText>
         </w:r>
         <w:r>
           <w:rPr>
@@ -5624,7 +5624,7 @@
           <w14:ligatures w14:val="standardContextual"/>
         </w:rPr>
       </w:pPr>
-      <w:hyperlink w:anchor="_Toc243071309" w:history="1">
+      <w:hyperlink w:anchor="_Toc243071518" w:history="1">
         <w:r>
           <w:rPr>
             <w:rStyle w:val="Hyperlink"/>
@@ -5651,7 +5651,7 @@
             <w:noProof/>
             <w:webHidden/>
           </w:rPr>
-          <w:instrText xml:space="preserve"> PAGEREF _Toc243071309 \h </w:instrText>
+          <w:instrText xml:space="preserve"> PAGEREF _Toc243071518 \h </w:instrText>
         </w:r>
         <w:r>
           <w:rPr>
@@ -5698,7 +5698,7 @@
           <w14:ligatures w14:val="standardContextual"/>
         </w:rPr>
       </w:pPr>
-      <w:hyperlink w:anchor="_Toc243071310" w:history="1">
+      <w:hyperlink w:anchor="_Toc243071519" w:history="1">
         <w:r>
           <w:rPr>
             <w:rStyle w:val="Hyperlink"/>
@@ -5725,7 +5725,7 @@
             <w:noProof/>
             <w:webHidden/>
           </w:rPr>
-          <w:instrText xml:space="preserve"> PAGEREF _Toc243071310 \h </w:instrText>
+          <w:instrText xml:space="preserve"> PAGEREF _Toc243071519 \h </w:instrText>
         </w:r>
         <w:r>
           <w:rPr>
@@ -5772,7 +5772,7 @@
           <w14:ligatures w14:val="standardContextual"/>
         </w:rPr>
       </w:pPr>
-      <w:hyperlink w:anchor="_Toc243071311" w:history="1">
+      <w:hyperlink w:anchor="_Toc243071520" w:history="1">
         <w:r>
           <w:rPr>
             <w:rStyle w:val="Hyperlink"/>
@@ -5799,7 +5799,7 @@
             <w:noProof/>
             <w:webHidden/>
           </w:rPr>
-          <w:instrText xml:space="preserve"> PAGEREF _Toc243071311 \h </w:instrText>
+          <w:instrText xml:space="preserve"> PAGEREF _Toc243071520 \h </w:instrText>
         </w:r>
         <w:r>
           <w:rPr>
@@ -5846,7 +5846,7 @@
           <w14:ligatures w14:val="standardContextual"/>
         </w:rPr>
       </w:pPr>
-      <w:hyperlink w:anchor="_Toc243071312" w:history="1">
+      <w:hyperlink w:anchor="_Toc243071521" w:history="1">
         <w:r>
           <w:rPr>
             <w:rStyle w:val="Hyperlink"/>
@@ -5873,7 +5873,7 @@
             <w:noProof/>
             <w:webHidden/>
           </w:rPr>
-          <w:instrText xml:space="preserve"> PAGEREF _Toc243071312 \h </w:instrText>
+          <w:instrText xml:space="preserve"> PAGEREF _Toc243071521 \h </w:instrText>
         </w:r>
         <w:r>
           <w:rPr>
@@ -5920,7 +5920,7 @@
           <w14:ligatures w14:val="standardContextual"/>
         </w:rPr>
       </w:pPr>
-      <w:hyperlink w:anchor="_Toc243071313" w:history="1">
+      <w:hyperlink w:anchor="_Toc243071522" w:history="1">
         <w:r>
           <w:rPr>
             <w:rStyle w:val="Hyperlink"/>
@@ -5947,7 +5947,7 @@
             <w:noProof/>
             <w:webHidden/>
           </w:rPr>
-          <w:instrText xml:space="preserve"> PAGEREF _Toc243071313 \h </w:instrText>
+          <w:instrText xml:space="preserve"> PAGEREF _Toc243071522 \h </w:instrText>
         </w:r>
         <w:r>
           <w:rPr>
@@ -5994,7 +5994,7 @@
           <w14:ligatures w14:val="standardContextual"/>
         </w:rPr>
       </w:pPr>
-      <w:hyperlink w:anchor="_Toc243071314" w:history="1">
+      <w:hyperlink w:anchor="_Toc243071523" w:history="1">
         <w:r>
           <w:rPr>
             <w:rStyle w:val="Hyperlink"/>
@@ -6021,7 +6021,7 @@
             <w:noProof/>
             <w:webHidden/>
           </w:rPr>
-          <w:instrText xml:space="preserve"> PAGEREF _Toc243071314 \h </w:instrText>
+          <w:instrText xml:space="preserve"> PAGEREF _Toc243071523 \h </w:instrText>
         </w:r>
         <w:r>
           <w:rPr>
@@ -6068,7 +6068,7 @@
           <w14:ligatures w14:val="standardContextual"/>
         </w:rPr>
       </w:pPr>
-      <w:hyperlink w:anchor="_Toc243071315" w:history="1">
+      <w:hyperlink w:anchor="_Toc243071524" w:history="1">
         <w:r>
           <w:rPr>
             <w:rStyle w:val="Hyperlink"/>
@@ -6095,7 +6095,7 @@
             <w:noProof/>
             <w:webHidden/>
           </w:rPr>
-          <w:instrText xml:space="preserve"> PAGEREF _Toc243071315 \h </w:instrText>
+          <w:instrText xml:space="preserve"> PAGEREF _Toc243071524 \h </w:instrText>
         </w:r>
         <w:r>
           <w:rPr>
@@ -7052,7 +7052,7 @@
         <w:pStyle w:val="Heading1"/>
         <w:jc w:val="center"/>
       </w:pPr>
-      <w:bookmarkStart w:id="0" w:name="_Toc243071242"/>
+      <w:bookmarkStart w:id="0" w:name="_Toc243071451"/>
       <w:r>
         <w:rPr>
           <w:rFonts w:ascii="Times New Roman" w:hAnsi="Times New Roman"/>
@@ -7081,7 +7081,7 @@
       <w:pPr>
         <w:pStyle w:val="Heading2"/>
       </w:pPr>
-      <w:bookmarkStart w:id="1" w:name="_Toc243071243"/>
+      <w:bookmarkStart w:id="1" w:name="_Toc243071452"/>
       <w:r>
         <w:rPr>
           <w:rFonts w:ascii="Times New Roman" w:hAnsi="Times New Roman"/>
@@ -7133,7 +7133,7 @@
       <w:pPr>
         <w:pStyle w:val="Heading2"/>
       </w:pPr>
-      <w:bookmarkStart w:id="2" w:name="_Toc243071244"/>
+      <w:bookmarkStart w:id="2" w:name="_Toc243071453"/>
       <w:r>
         <w:rPr>
           <w:rFonts w:ascii="Times New Roman" w:hAnsi="Times New Roman"/>
@@ -7169,7 +7169,7 @@
       <w:pPr>
         <w:pStyle w:val="Heading2"/>
       </w:pPr>
-      <w:bookmarkStart w:id="3" w:name="_Toc243071245"/>
+      <w:bookmarkStart w:id="3" w:name="_Toc243071454"/>
       <w:r>
         <w:rPr>
           <w:rFonts w:ascii="Times New Roman" w:hAnsi="Times New Roman"/>
@@ -7209,7 +7209,7 @@
       <w:pPr>
         <w:pStyle w:val="Heading2"/>
       </w:pPr>
-      <w:bookmarkStart w:id="4" w:name="_Toc243071246"/>
+      <w:bookmarkStart w:id="4" w:name="_Toc243071455"/>
       <w:r>
         <w:rPr>
           <w:rFonts w:ascii="Times New Roman" w:hAnsi="Times New Roman"/>
@@ -7233,7 +7233,7 @@
       <w:pPr>
         <w:pStyle w:val="Heading2"/>
       </w:pPr>
-      <w:bookmarkStart w:id="5" w:name="_Toc243071247"/>
+      <w:bookmarkStart w:id="5" w:name="_Toc243071456"/>
       <w:r>
         <w:rPr>
           <w:rFonts w:ascii="Times New Roman" w:hAnsi="Times New Roman"/>
@@ -7303,7 +7303,7 @@
       <w:pPr>
         <w:pStyle w:val="Heading2"/>
       </w:pPr>
-      <w:bookmarkStart w:id="6" w:name="_Toc243071248"/>
+      <w:bookmarkStart w:id="6" w:name="_Toc243071457"/>
       <w:r>
         <w:rPr>
           <w:rFonts w:ascii="Times New Roman" w:hAnsi="Times New Roman"/>
@@ -7330,7 +7330,7 @@
       <w:pPr>
         <w:pStyle w:val="Heading2"/>
       </w:pPr>
-      <w:bookmarkStart w:id="7" w:name="_Toc243071249"/>
+      <w:bookmarkStart w:id="7" w:name="_Toc243071458"/>
       <w:r>
         <w:rPr>
           <w:rFonts w:ascii="Times New Roman" w:hAnsi="Times New Roman"/>
@@ -7357,7 +7357,7 @@
       <w:pPr>
         <w:pStyle w:val="Heading2"/>
       </w:pPr>
-      <w:bookmarkStart w:id="8" w:name="_Toc243071250"/>
+      <w:bookmarkStart w:id="8" w:name="_Toc243071459"/>
       <w:r>
         <w:rPr>
           <w:rFonts w:ascii="Times New Roman" w:hAnsi="Times New Roman"/>
@@ -7394,7 +7394,7 @@
         <w:pStyle w:val="Heading1"/>
         <w:jc w:val="center"/>
       </w:pPr>
-      <w:bookmarkStart w:id="9" w:name="_Toc243071251"/>
+      <w:bookmarkStart w:id="9" w:name="_Toc243071460"/>
       <w:r>
         <w:rPr>
           <w:rFonts w:ascii="Times New Roman" w:hAnsi="Times New Roman"/>
@@ -7423,7 +7423,7 @@
       <w:pPr>
         <w:pStyle w:val="Heading2"/>
       </w:pPr>
-      <w:bookmarkStart w:id="10" w:name="_Toc243071252"/>
+      <w:bookmarkStart w:id="10" w:name="_Toc243071461"/>
       <w:r>
         <w:rPr>
           <w:rFonts w:ascii="Times New Roman" w:hAnsi="Times New Roman"/>
@@ -7447,7 +7447,7 @@
       <w:pPr>
         <w:pStyle w:val="Heading2"/>
       </w:pPr>
-      <w:bookmarkStart w:id="11" w:name="_Toc243071253"/>
+      <w:bookmarkStart w:id="11" w:name="_Toc243071462"/>
       <w:r>
         <w:rPr>
           <w:rFonts w:ascii="Times New Roman" w:hAnsi="Times New Roman"/>
@@ -7493,7 +7493,7 @@
       <w:pPr>
         <w:pStyle w:val="Heading2"/>
       </w:pPr>
-      <w:bookmarkStart w:id="12" w:name="_Toc243071254"/>
+      <w:bookmarkStart w:id="12" w:name="_Toc243071463"/>
       <w:r>
         <w:rPr>
           <w:rFonts w:ascii="Times New Roman" w:hAnsi="Times New Roman"/>
@@ -7532,7 +7532,7 @@
       <w:pPr>
         <w:pStyle w:val="Heading2"/>
       </w:pPr>
-      <w:bookmarkStart w:id="13" w:name="_Toc243071255"/>
+      <w:bookmarkStart w:id="13" w:name="_Toc243071464"/>
       <w:r>
         <w:rPr>
           <w:rFonts w:ascii="Times New Roman" w:hAnsi="Times New Roman"/>
@@ -7575,7 +7575,7 @@
       <w:pPr>
         <w:pStyle w:val="Heading2"/>
       </w:pPr>
-      <w:bookmarkStart w:id="14" w:name="_Toc243071256"/>
+      <w:bookmarkStart w:id="14" w:name="_Toc243071465"/>
       <w:r>
         <w:rPr>
           <w:rFonts w:ascii="Times New Roman" w:hAnsi="Times New Roman"/>
@@ -7606,7 +7606,7 @@
       <w:pPr>
         <w:pStyle w:val="Heading2"/>
       </w:pPr>
-      <w:bookmarkStart w:id="15" w:name="_Toc243071257"/>
+      <w:bookmarkStart w:id="15" w:name="_Toc243071466"/>
       <w:r>
         <w:rPr>
           <w:rFonts w:ascii="Times New Roman" w:hAnsi="Times New Roman"/>
@@ -7636,7 +7636,7 @@
       <w:pPr>
         <w:pStyle w:val="Heading2"/>
       </w:pPr>
-      <w:bookmarkStart w:id="16" w:name="_Toc243071258"/>
+      <w:bookmarkStart w:id="16" w:name="_Toc243071467"/>
       <w:r>
         <w:rPr>
           <w:rFonts w:ascii="Times New Roman" w:hAnsi="Times New Roman"/>
@@ -7670,7 +7670,7 @@
       <w:pPr>
         <w:pStyle w:val="Heading2"/>
       </w:pPr>
-      <w:bookmarkStart w:id="17" w:name="_Toc243071259"/>
+      <w:bookmarkStart w:id="17" w:name="_Toc243071468"/>
       <w:r>
         <w:rPr>
           <w:rFonts w:ascii="Times New Roman" w:hAnsi="Times New Roman"/>
@@ -7725,7 +7725,7 @@
       <w:pPr>
         <w:pStyle w:val="Heading2"/>
       </w:pPr>
-      <w:bookmarkStart w:id="18" w:name="_Toc243071260"/>
+      <w:bookmarkStart w:id="18" w:name="_Toc243071469"/>
       <w:r>
         <w:rPr>
           <w:rFonts w:ascii="Times New Roman" w:hAnsi="Times New Roman"/>
@@ -7752,7 +7752,7 @@
       <w:pPr>
         <w:pStyle w:val="Heading2"/>
       </w:pPr>
-      <w:bookmarkStart w:id="19" w:name="_Toc243071261"/>
+      <w:bookmarkStart w:id="19" w:name="_Toc243071470"/>
       <w:r>
         <w:rPr>
           <w:rFonts w:ascii="Times New Roman" w:hAnsi="Times New Roman"/>
@@ -7783,7 +7783,7 @@
       <w:pPr>
         <w:pStyle w:val="Heading2"/>
       </w:pPr>
-      <w:bookmarkStart w:id="20" w:name="_Toc243071262"/>
+      <w:bookmarkStart w:id="20" w:name="_Toc243071471"/>
       <w:r>
         <w:rPr>
           <w:rFonts w:ascii="Times New Roman" w:hAnsi="Times New Roman"/>
@@ -7831,7 +7831,7 @@
       <w:pPr>
         <w:pStyle w:val="Heading2"/>
       </w:pPr>
-      <w:bookmarkStart w:id="21" w:name="_Toc243071263"/>
+      <w:bookmarkStart w:id="21" w:name="_Toc243071472"/>
       <w:r>
         <w:rPr>
           <w:rFonts w:ascii="Times New Roman" w:hAnsi="Times New Roman"/>
@@ -7877,7 +7877,7 @@
       <w:pPr>
         <w:pStyle w:val="Heading2"/>
       </w:pPr>
-      <w:bookmarkStart w:id="22" w:name="_Toc243071264"/>
+      <w:bookmarkStart w:id="22" w:name="_Toc243071473"/>
       <w:r>
         <w:rPr>
           <w:rFonts w:ascii="Times New Roman" w:hAnsi="Times New Roman"/>
@@ -8437,7 +8437,7 @@
       <w:pPr>
         <w:pStyle w:val="Heading2"/>
       </w:pPr>
-      <w:bookmarkStart w:id="23" w:name="_Toc243071265"/>
+      <w:bookmarkStart w:id="23" w:name="_Toc243071474"/>
       <w:r>
         <w:rPr>
           <w:rFonts w:ascii="Times New Roman" w:hAnsi="Times New Roman"/>
@@ -8470,7 +8470,7 @@
         <w:pStyle w:val="Heading1"/>
         <w:jc w:val="center"/>
       </w:pPr>
-      <w:bookmarkStart w:id="24" w:name="_Toc243071266"/>
+      <w:bookmarkStart w:id="24" w:name="_Toc243071475"/>
       <w:r>
         <w:rPr>
           <w:rFonts w:ascii="Times New Roman" w:hAnsi="Times New Roman"/>
@@ -8499,7 +8499,7 @@
       <w:pPr>
         <w:pStyle w:val="Heading2"/>
       </w:pPr>
-      <w:bookmarkStart w:id="25" w:name="_Toc243071267"/>
+      <w:bookmarkStart w:id="25" w:name="_Toc243071476"/>
       <w:r>
         <w:rPr>
           <w:rFonts w:ascii="Times New Roman" w:hAnsi="Times New Roman"/>
@@ -8534,7 +8534,7 @@
           <w:noProof/>
         </w:rPr>
         <w:drawing>
-          <wp:inline distT="0" distB="0" distL="0" distR="0" wp14:anchorId="68D27AC3" wp14:editId="6DBC6979">
+          <wp:inline distT="0" distB="0" distL="0" distR="0" wp14:anchorId="7B52162A" wp14:editId="17295082">
             <wp:extent cx="5303520" cy="2983230"/>
             <wp:effectExtent l="0" t="0" r="0" b="0"/>
             <wp:docPr id="2" name="Picture 2"/>
@@ -8587,7 +8587,7 @@
       <w:pPr>
         <w:pStyle w:val="Heading2"/>
       </w:pPr>
-      <w:bookmarkStart w:id="26" w:name="_Toc243071268"/>
+      <w:bookmarkStart w:id="26" w:name="_Toc243071477"/>
       <w:r>
         <w:rPr>
           <w:rFonts w:ascii="Times New Roman" w:hAnsi="Times New Roman"/>
@@ -8623,7 +8623,7 @@
           <w:noProof/>
         </w:rPr>
         <w:drawing>
-          <wp:inline distT="0" distB="0" distL="0" distR="0" wp14:anchorId="7027309A" wp14:editId="2A8088A5">
+          <wp:inline distT="0" distB="0" distL="0" distR="0" wp14:anchorId="27023976" wp14:editId="1B631A1E">
             <wp:extent cx="5303520" cy="2262835"/>
             <wp:effectExtent l="0" t="0" r="0" b="0"/>
             <wp:docPr id="3" name="Picture 3"/>
@@ -8713,7 +8713,7 @@
       <w:pPr>
         <w:pStyle w:val="Heading2"/>
       </w:pPr>
-      <w:bookmarkStart w:id="27" w:name="_Toc243071269"/>
+      <w:bookmarkStart w:id="27" w:name="_Toc243071478"/>
       <w:r>
         <w:rPr>
           <w:rFonts w:ascii="Times New Roman" w:hAnsi="Times New Roman"/>
@@ -8759,7 +8759,7 @@
       <w:pPr>
         <w:pStyle w:val="Heading2"/>
       </w:pPr>
-      <w:bookmarkStart w:id="28" w:name="_Toc243071270"/>
+      <w:bookmarkStart w:id="28" w:name="_Toc243071479"/>
       <w:r>
         <w:rPr>
           <w:rFonts w:ascii="Times New Roman" w:hAnsi="Times New Roman"/>
@@ -8807,7 +8807,7 @@
           <w:noProof/>
         </w:rPr>
         <w:drawing>
-          <wp:inline distT="0" distB="0" distL="0" distR="0" wp14:anchorId="2006EFCB" wp14:editId="452A0E05">
+          <wp:inline distT="0" distB="0" distL="0" distR="0" wp14:anchorId="43EDB7DB" wp14:editId="11B326ED">
             <wp:extent cx="5303520" cy="2262835"/>
             <wp:effectExtent l="0" t="0" r="0" b="0"/>
             <wp:docPr id="4" name="Picture 4"/>
@@ -9152,7 +9152,7 @@
       <w:pPr>
         <w:pStyle w:val="Heading2"/>
       </w:pPr>
-      <w:bookmarkStart w:id="29" w:name="_Toc243071271"/>
+      <w:bookmarkStart w:id="29" w:name="_Toc243071480"/>
       <w:r>
         <w:rPr>
           <w:rFonts w:ascii="Times New Roman" w:hAnsi="Times New Roman"/>
@@ -9179,7 +9179,7 @@
       <w:pPr>
         <w:pStyle w:val="Heading2"/>
       </w:pPr>
-      <w:bookmarkStart w:id="30" w:name="_Toc243071272"/>
+      <w:bookmarkStart w:id="30" w:name="_Toc243071481"/>
       <w:r>
         <w:rPr>
           <w:rFonts w:ascii="Times New Roman" w:hAnsi="Times New Roman"/>
@@ -9222,7 +9222,7 @@
       <w:pPr>
         <w:pStyle w:val="Heading2"/>
       </w:pPr>
-      <w:bookmarkStart w:id="31" w:name="_Toc243071273"/>
+      <w:bookmarkStart w:id="31" w:name="_Toc243071482"/>
       <w:r>
         <w:rPr>
           <w:rFonts w:ascii="Times New Roman" w:hAnsi="Times New Roman"/>
@@ -9608,7 +9608,7 @@
       <w:pPr>
         <w:pStyle w:val="Heading2"/>
       </w:pPr>
-      <w:bookmarkStart w:id="32" w:name="_Toc243071274"/>
+      <w:bookmarkStart w:id="32" w:name="_Toc243071483"/>
       <w:r>
         <w:rPr>
           <w:rFonts w:ascii="Times New Roman" w:hAnsi="Times New Roman"/>
@@ -9638,7 +9638,7 @@
       <w:pPr>
         <w:pStyle w:val="Heading2"/>
       </w:pPr>
-      <w:bookmarkStart w:id="33" w:name="_Toc243071275"/>
+      <w:bookmarkStart w:id="33" w:name="_Toc243071484"/>
       <w:r>
         <w:rPr>
           <w:rFonts w:ascii="Times New Roman" w:hAnsi="Times New Roman"/>
@@ -9672,7 +9672,7 @@
         <w:pStyle w:val="Heading1"/>
         <w:jc w:val="center"/>
       </w:pPr>
-      <w:bookmarkStart w:id="34" w:name="_Toc243071276"/>
+      <w:bookmarkStart w:id="34" w:name="_Toc243071485"/>
       <w:r>
         <w:rPr>
           <w:rFonts w:ascii="Times New Roman" w:hAnsi="Times New Roman"/>
@@ -9701,7 +9701,7 @@
       <w:pPr>
         <w:pStyle w:val="Heading2"/>
       </w:pPr>
-      <w:bookmarkStart w:id="35" w:name="_Toc243071277"/>
+      <w:bookmarkStart w:id="35" w:name="_Toc243071486"/>
       <w:r>
         <w:rPr>
           <w:rFonts w:ascii="Times New Roman" w:hAnsi="Times New Roman"/>
@@ -9728,7 +9728,7 @@
       <w:pPr>
         <w:pStyle w:val="Heading2"/>
       </w:pPr>
-      <w:bookmarkStart w:id="36" w:name="_Toc243071278"/>
+      <w:bookmarkStart w:id="36" w:name="_Toc243071487"/>
       <w:r>
         <w:rPr>
           <w:rFonts w:ascii="Times New Roman" w:hAnsi="Times New Roman"/>
@@ -10305,7 +10305,7 @@
       <w:pPr>
         <w:pStyle w:val="Heading2"/>
       </w:pPr>
-      <w:bookmarkStart w:id="37" w:name="_Toc243071279"/>
+      <w:bookmarkStart w:id="37" w:name="_Toc243071488"/>
       <w:r>
         <w:rPr>
           <w:rFonts w:ascii="Times New Roman" w:hAnsi="Times New Roman"/>
@@ -10422,7 +10422,7 @@
       <w:pPr>
         <w:pStyle w:val="Heading2"/>
       </w:pPr>
-      <w:bookmarkStart w:id="38" w:name="_Toc243071280"/>
+      <w:bookmarkStart w:id="38" w:name="_Toc243071489"/>
       <w:r>
         <w:rPr>
           <w:rFonts w:ascii="Times New Roman" w:hAnsi="Times New Roman"/>
@@ -10452,7 +10452,7 @@
       <w:pPr>
         <w:pStyle w:val="Heading2"/>
       </w:pPr>
-      <w:bookmarkStart w:id="39" w:name="_Toc243071281"/>
+      <w:bookmarkStart w:id="39" w:name="_Toc243071490"/>
       <w:r>
         <w:rPr>
           <w:rFonts w:ascii="Times New Roman" w:hAnsi="Times New Roman"/>
@@ -10480,7 +10480,7 @@
       <w:pPr>
         <w:pStyle w:val="Heading2"/>
       </w:pPr>
-      <w:bookmarkStart w:id="40" w:name="_Toc243071282"/>
+      <w:bookmarkStart w:id="40" w:name="_Toc243071491"/>
       <w:r>
         <w:rPr>
           <w:rFonts w:ascii="Times New Roman" w:hAnsi="Times New Roman"/>
@@ -10507,7 +10507,7 @@
       <w:pPr>
         <w:pStyle w:val="Heading2"/>
       </w:pPr>
-      <w:bookmarkStart w:id="41" w:name="_Toc243071283"/>
+      <w:bookmarkStart w:id="41" w:name="_Toc243071492"/>
       <w:r>
         <w:rPr>
           <w:rFonts w:ascii="Times New Roman" w:hAnsi="Times New Roman"/>
@@ -10534,7 +10534,7 @@
       <w:pPr>
         <w:pStyle w:val="Heading2"/>
       </w:pPr>
-      <w:bookmarkStart w:id="42" w:name="_Toc243071284"/>
+      <w:bookmarkStart w:id="42" w:name="_Toc243071493"/>
       <w:r>
         <w:rPr>
           <w:rFonts w:ascii="Times New Roman" w:hAnsi="Times New Roman"/>
@@ -10571,7 +10571,7 @@
         <w:pStyle w:val="Heading1"/>
         <w:jc w:val="center"/>
       </w:pPr>
-      <w:bookmarkStart w:id="43" w:name="_Toc243071285"/>
+      <w:bookmarkStart w:id="43" w:name="_Toc243071494"/>
       <w:r>
         <w:rPr>
           <w:rFonts w:ascii="Times New Roman" w:hAnsi="Times New Roman"/>
@@ -10600,7 +10600,7 @@
       <w:pPr>
         <w:pStyle w:val="Heading2"/>
       </w:pPr>
-      <w:bookmarkStart w:id="44" w:name="_Toc243071286"/>
+      <w:bookmarkStart w:id="44" w:name="_Toc243071495"/>
       <w:r>
         <w:rPr>
           <w:rFonts w:ascii="Times New Roman" w:hAnsi="Times New Roman"/>
@@ -10632,7 +10632,7 @@
           <w:noProof/>
         </w:rPr>
         <w:drawing>
-          <wp:inline distT="0" distB="0" distL="0" distR="0" wp14:anchorId="7968B665" wp14:editId="412A4610">
+          <wp:inline distT="0" distB="0" distL="0" distR="0" wp14:anchorId="20E907D3" wp14:editId="26DDE632">
             <wp:extent cx="5303520" cy="3374967"/>
             <wp:effectExtent l="0" t="0" r="0" b="0"/>
             <wp:docPr id="5" name="Picture 5"/>
@@ -10900,7 +10900,7 @@
           <w:noProof/>
         </w:rPr>
         <w:drawing>
-          <wp:inline distT="0" distB="0" distL="0" distR="0" wp14:anchorId="0DCEB9F1" wp14:editId="4EC01C21">
+          <wp:inline distT="0" distB="0" distL="0" distR="0" wp14:anchorId="29D4DD03" wp14:editId="662F958D">
             <wp:extent cx="5303520" cy="2272937"/>
             <wp:effectExtent l="0" t="0" r="0" b="0"/>
             <wp:docPr id="6" name="Picture 6"/>
@@ -11280,7 +11280,7 @@
       <w:pPr>
         <w:pStyle w:val="Heading2"/>
       </w:pPr>
-      <w:bookmarkStart w:id="45" w:name="_Toc243071287"/>
+      <w:bookmarkStart w:id="45" w:name="_Toc243071496"/>
       <w:r>
         <w:rPr>
           <w:rFonts w:ascii="Times New Roman" w:hAnsi="Times New Roman"/>
@@ -11313,7 +11313,7 @@
         </w:rPr>
         <w:lastRenderedPageBreak/>
         <w:drawing>
-          <wp:inline distT="0" distB="0" distL="0" distR="0" wp14:anchorId="3B040610" wp14:editId="2469791E">
+          <wp:inline distT="0" distB="0" distL="0" distR="0" wp14:anchorId="4A893DC7" wp14:editId="0E13E94B">
             <wp:extent cx="5303520" cy="2121408"/>
             <wp:effectExtent l="0" t="0" r="0" b="0"/>
             <wp:docPr id="7" name="Picture 7"/>
@@ -11637,7 +11637,7 @@
           <w:noProof/>
         </w:rPr>
         <w:drawing>
-          <wp:inline distT="0" distB="0" distL="0" distR="0" wp14:anchorId="7D583D8D" wp14:editId="3D3E3944">
+          <wp:inline distT="0" distB="0" distL="0" distR="0" wp14:anchorId="2CE9883C" wp14:editId="161C4329">
             <wp:extent cx="5303520" cy="2571404"/>
             <wp:effectExtent l="0" t="0" r="0" b="0"/>
             <wp:docPr id="8" name="Picture 8"/>
@@ -11690,7 +11690,7 @@
       <w:pPr>
         <w:pStyle w:val="Heading2"/>
       </w:pPr>
-      <w:bookmarkStart w:id="46" w:name="_Toc243071288"/>
+      <w:bookmarkStart w:id="46" w:name="_Toc243071497"/>
       <w:r>
         <w:rPr>
           <w:rFonts w:ascii="Times New Roman" w:hAnsi="Times New Roman"/>
@@ -11932,7 +11932,7 @@
       <w:pPr>
         <w:pStyle w:val="Heading2"/>
       </w:pPr>
-      <w:bookmarkStart w:id="47" w:name="_Toc243071289"/>
+      <w:bookmarkStart w:id="47" w:name="_Toc243071498"/>
       <w:r>
         <w:rPr>
           <w:rFonts w:ascii="Times New Roman" w:hAnsi="Times New Roman"/>
@@ -11996,7 +11996,7 @@
           <w:noProof/>
         </w:rPr>
         <w:drawing>
-          <wp:inline distT="0" distB="0" distL="0" distR="0" wp14:anchorId="1727C70A" wp14:editId="6C0B7C3C">
+          <wp:inline distT="0" distB="0" distL="0" distR="0" wp14:anchorId="55493BCF" wp14:editId="75884BB6">
             <wp:extent cx="5303520" cy="2121408"/>
             <wp:effectExtent l="0" t="0" r="0" b="0"/>
             <wp:docPr id="9" name="Picture 9"/>
@@ -12049,7 +12049,7 @@
       <w:pPr>
         <w:pStyle w:val="Heading2"/>
       </w:pPr>
-      <w:bookmarkStart w:id="48" w:name="_Toc243071290"/>
+      <w:bookmarkStart w:id="48" w:name="_Toc243071499"/>
       <w:r>
         <w:rPr>
           <w:rFonts w:ascii="Times New Roman" w:hAnsi="Times New Roman"/>
@@ -12082,7 +12082,7 @@
         </w:rPr>
         <w:lastRenderedPageBreak/>
         <w:drawing>
-          <wp:inline distT="0" distB="0" distL="0" distR="0" wp14:anchorId="0FA9ED15" wp14:editId="04F8E5AC">
+          <wp:inline distT="0" distB="0" distL="0" distR="0" wp14:anchorId="08CD8B51" wp14:editId="50666230">
             <wp:extent cx="5303520" cy="2424466"/>
             <wp:effectExtent l="0" t="0" r="0" b="0"/>
             <wp:docPr id="10" name="Picture 10"/>
@@ -12332,7 +12332,7 @@
       <w:pPr>
         <w:pStyle w:val="Heading2"/>
       </w:pPr>
-      <w:bookmarkStart w:id="49" w:name="_Toc243071291"/>
+      <w:bookmarkStart w:id="49" w:name="_Toc243071500"/>
       <w:r>
         <w:rPr>
           <w:rFonts w:ascii="Times New Roman" w:hAnsi="Times New Roman"/>
@@ -12377,7 +12377,7 @@
           <w:noProof/>
         </w:rPr>
         <w:drawing>
-          <wp:inline distT="0" distB="0" distL="0" distR="0" wp14:anchorId="5B8F9CF2" wp14:editId="2F84E939">
+          <wp:inline distT="0" distB="0" distL="0" distR="0" wp14:anchorId="02D1BB62" wp14:editId="430E6050">
             <wp:extent cx="5303520" cy="1988820"/>
             <wp:effectExtent l="0" t="0" r="0" b="0"/>
             <wp:docPr id="11" name="Picture 11"/>
@@ -12448,7 +12448,7 @@
         </w:rPr>
         <w:lastRenderedPageBreak/>
         <w:drawing>
-          <wp:inline distT="0" distB="0" distL="0" distR="0" wp14:anchorId="18F40C79" wp14:editId="658F2C7C">
+          <wp:inline distT="0" distB="0" distL="0" distR="0" wp14:anchorId="1991C25F" wp14:editId="07DA70CF">
             <wp:extent cx="5303520" cy="2495774"/>
             <wp:effectExtent l="0" t="0" r="0" b="0"/>
             <wp:docPr id="12" name="Picture 12"/>
@@ -12518,7 +12518,7 @@
           <w:noProof/>
         </w:rPr>
         <w:drawing>
-          <wp:inline distT="0" distB="0" distL="0" distR="0" wp14:anchorId="40AA8988" wp14:editId="696B033D">
+          <wp:inline distT="0" distB="0" distL="0" distR="0" wp14:anchorId="622674D0" wp14:editId="785C3191">
             <wp:extent cx="5303520" cy="2272937"/>
             <wp:effectExtent l="0" t="0" r="0" b="0"/>
             <wp:docPr id="13" name="Picture 13"/>
@@ -12601,7 +12601,7 @@
           <w:noProof/>
         </w:rPr>
         <w:drawing>
-          <wp:inline distT="0" distB="0" distL="0" distR="0" wp14:anchorId="49683D63" wp14:editId="3F07CCF7">
+          <wp:inline distT="0" distB="0" distL="0" distR="0" wp14:anchorId="03E677FF" wp14:editId="3B962FE7">
             <wp:extent cx="5303520" cy="2339788"/>
             <wp:effectExtent l="0" t="0" r="0" b="0"/>
             <wp:docPr id="14" name="Picture 14"/>
@@ -12672,7 +12672,7 @@
           <w:noProof/>
         </w:rPr>
         <w:drawing>
-          <wp:inline distT="0" distB="0" distL="0" distR="0" wp14:anchorId="294EFCF1" wp14:editId="564A81E4">
+          <wp:inline distT="0" distB="0" distL="0" distR="0" wp14:anchorId="0BB88896" wp14:editId="415CA9E6">
             <wp:extent cx="5303520" cy="1988820"/>
             <wp:effectExtent l="0" t="0" r="0" b="0"/>
             <wp:docPr id="15" name="Picture 15"/>
@@ -13127,7 +13127,7 @@
       <w:pPr>
         <w:pStyle w:val="Heading2"/>
       </w:pPr>
-      <w:bookmarkStart w:id="50" w:name="_Toc243071292"/>
+      <w:bookmarkStart w:id="50" w:name="_Toc243071501"/>
       <w:r>
         <w:rPr>
           <w:rFonts w:ascii="Times New Roman" w:hAnsi="Times New Roman"/>
@@ -13201,7 +13201,7 @@
       <w:pPr>
         <w:pStyle w:val="Heading2"/>
       </w:pPr>
-      <w:bookmarkStart w:id="51" w:name="_Toc243071293"/>
+      <w:bookmarkStart w:id="51" w:name="_Toc243071502"/>
       <w:r>
         <w:rPr>
           <w:rFonts w:ascii="Times New Roman" w:hAnsi="Times New Roman"/>
@@ -13699,7 +13699,7 @@
         <w:pStyle w:val="Heading1"/>
         <w:jc w:val="center"/>
       </w:pPr>
-      <w:bookmarkStart w:id="52" w:name="_Toc243071294"/>
+      <w:bookmarkStart w:id="52" w:name="_Toc243071503"/>
       <w:r>
         <w:rPr>
           <w:rFonts w:ascii="Times New Roman" w:hAnsi="Times New Roman"/>
@@ -13728,7 +13728,7 @@
       <w:pPr>
         <w:pStyle w:val="Heading2"/>
       </w:pPr>
-      <w:bookmarkStart w:id="53" w:name="_Toc243071295"/>
+      <w:bookmarkStart w:id="53" w:name="_Toc243071504"/>
       <w:r>
         <w:rPr>
           <w:rFonts w:ascii="Times New Roman" w:hAnsi="Times New Roman"/>
@@ -13792,7 +13792,7 @@
       <w:pPr>
         <w:pStyle w:val="Heading2"/>
       </w:pPr>
-      <w:bookmarkStart w:id="54" w:name="_Toc243071296"/>
+      <w:bookmarkStart w:id="54" w:name="_Toc243071505"/>
       <w:r>
         <w:rPr>
           <w:rFonts w:ascii="Times New Roman" w:hAnsi="Times New Roman"/>
@@ -13886,7 +13886,7 @@
         <w:pStyle w:val="Heading1"/>
         <w:jc w:val="center"/>
       </w:pPr>
-      <w:bookmarkStart w:id="55" w:name="_Toc243071297"/>
+      <w:bookmarkStart w:id="55" w:name="_Toc243071506"/>
       <w:r>
         <w:rPr>
           <w:rFonts w:ascii="Times New Roman" w:hAnsi="Times New Roman"/>
@@ -14074,7 +14074,7 @@
         <w:pStyle w:val="Heading1"/>
         <w:jc w:val="center"/>
       </w:pPr>
-      <w:bookmarkStart w:id="56" w:name="_Toc243071298"/>
+      <w:bookmarkStart w:id="56" w:name="_Toc243071507"/>
       <w:r>
         <w:rPr>
           <w:rFonts w:ascii="Times New Roman" w:hAnsi="Times New Roman"/>
@@ -14090,7 +14090,7 @@
       <w:pPr>
         <w:pStyle w:val="Heading2"/>
       </w:pPr>
-      <w:bookmarkStart w:id="57" w:name="_Toc243071299"/>
+      <w:bookmarkStart w:id="57" w:name="_Toc243071508"/>
       <w:r>
         <w:rPr>
           <w:rFonts w:ascii="Times New Roman" w:hAnsi="Times New Roman"/>
@@ -14120,7 +14120,7 @@
       <w:pPr>
         <w:pStyle w:val="Heading2"/>
       </w:pPr>
-      <w:bookmarkStart w:id="58" w:name="_Toc243071300"/>
+      <w:bookmarkStart w:id="58" w:name="_Toc243071509"/>
       <w:r>
         <w:rPr>
           <w:rFonts w:ascii="Times New Roman" w:hAnsi="Times New Roman"/>
@@ -14224,7 +14224,7 @@
       <w:pPr>
         <w:pStyle w:val="Heading2"/>
       </w:pPr>
-      <w:bookmarkStart w:id="59" w:name="_Toc243071301"/>
+      <w:bookmarkStart w:id="59" w:name="_Toc243071510"/>
       <w:r>
         <w:rPr>
           <w:rFonts w:ascii="Times New Roman" w:hAnsi="Times New Roman"/>
@@ -14328,7 +14328,7 @@
       <w:pPr>
         <w:pStyle w:val="Heading2"/>
       </w:pPr>
-      <w:bookmarkStart w:id="60" w:name="_Toc243071302"/>
+      <w:bookmarkStart w:id="60" w:name="_Toc243071511"/>
       <w:r>
         <w:rPr>
           <w:rFonts w:ascii="Times New Roman" w:hAnsi="Times New Roman"/>
@@ -14486,7 +14486,7 @@
       <w:pPr>
         <w:pStyle w:val="Heading2"/>
       </w:pPr>
-      <w:bookmarkStart w:id="61" w:name="_Toc243071303"/>
+      <w:bookmarkStart w:id="61" w:name="_Toc243071512"/>
       <w:r>
         <w:rPr>
           <w:rFonts w:ascii="Times New Roman" w:hAnsi="Times New Roman"/>
@@ -14734,7 +14734,7 @@
       <w:pPr>
         <w:pStyle w:val="Heading2"/>
       </w:pPr>
-      <w:bookmarkStart w:id="62" w:name="_Toc243071304"/>
+      <w:bookmarkStart w:id="62" w:name="_Toc243071513"/>
       <w:r>
         <w:rPr>
           <w:rFonts w:ascii="Times New Roman" w:hAnsi="Times New Roman"/>
@@ -14886,7 +14886,7 @@
       <w:pPr>
         <w:pStyle w:val="Heading2"/>
       </w:pPr>
-      <w:bookmarkStart w:id="63" w:name="_Toc243071305"/>
+      <w:bookmarkStart w:id="63" w:name="_Toc243071514"/>
       <w:r>
         <w:rPr>
           <w:rFonts w:ascii="Times New Roman" w:hAnsi="Times New Roman"/>
@@ -15051,7 +15051,7 @@
       <w:pPr>
         <w:pStyle w:val="Heading2"/>
       </w:pPr>
-      <w:bookmarkStart w:id="64" w:name="_Toc243071306"/>
+      <w:bookmarkStart w:id="64" w:name="_Toc243071515"/>
       <w:r>
         <w:rPr>
           <w:rFonts w:ascii="Times New Roman" w:hAnsi="Times New Roman"/>
@@ -15232,7 +15232,7 @@
       <w:pPr>
         <w:pStyle w:val="Heading2"/>
       </w:pPr>
-      <w:bookmarkStart w:id="65" w:name="_Toc243071307"/>
+      <w:bookmarkStart w:id="65" w:name="_Toc243071516"/>
       <w:r>
         <w:rPr>
           <w:rFonts w:ascii="Times New Roman" w:hAnsi="Times New Roman"/>
@@ -15372,7 +15372,7 @@
       <w:pPr>
         <w:pStyle w:val="Heading2"/>
       </w:pPr>
-      <w:bookmarkStart w:id="66" w:name="_Toc243071308"/>
+      <w:bookmarkStart w:id="66" w:name="_Toc243071517"/>
       <w:r>
         <w:rPr>
           <w:rFonts w:ascii="Times New Roman" w:hAnsi="Times New Roman"/>
@@ -15561,7 +15561,7 @@
       <w:pPr>
         <w:pStyle w:val="Heading2"/>
       </w:pPr>
-      <w:bookmarkStart w:id="67" w:name="_Toc243071309"/>
+      <w:bookmarkStart w:id="67" w:name="_Toc243071518"/>
       <w:r>
         <w:rPr>
           <w:rFonts w:ascii="Times New Roman" w:hAnsi="Times New Roman"/>
@@ -15713,7 +15713,7 @@
       <w:pPr>
         <w:pStyle w:val="Heading2"/>
       </w:pPr>
-      <w:bookmarkStart w:id="68" w:name="_Toc243071310"/>
+      <w:bookmarkStart w:id="68" w:name="_Toc243071519"/>
       <w:r>
         <w:rPr>
           <w:rFonts w:ascii="Times New Roman" w:hAnsi="Times New Roman"/>
@@ -15877,7 +15877,7 @@
       <w:pPr>
         <w:pStyle w:val="Heading2"/>
       </w:pPr>
-      <w:bookmarkStart w:id="69" w:name="_Toc243071311"/>
+      <w:bookmarkStart w:id="69" w:name="_Toc243071520"/>
       <w:r>
         <w:rPr>
           <w:rFonts w:ascii="Times New Roman" w:hAnsi="Times New Roman"/>
@@ -16071,7 +16071,7 @@
       <w:pPr>
         <w:pStyle w:val="Heading2"/>
       </w:pPr>
-      <w:bookmarkStart w:id="70" w:name="_Toc243071312"/>
+      <w:bookmarkStart w:id="70" w:name="_Toc243071521"/>
       <w:r>
         <w:rPr>
           <w:rFonts w:ascii="Times New Roman" w:hAnsi="Times New Roman"/>
@@ -16211,7 +16211,7 @@
       <w:pPr>
         <w:pStyle w:val="Heading2"/>
       </w:pPr>
-      <w:bookmarkStart w:id="71" w:name="_Toc243071313"/>
+      <w:bookmarkStart w:id="71" w:name="_Toc243071522"/>
       <w:r>
         <w:rPr>
           <w:rFonts w:ascii="Times New Roman" w:hAnsi="Times New Roman"/>
@@ -16411,7 +16411,7 @@
       <w:pPr>
         <w:pStyle w:val="Heading2"/>
       </w:pPr>
-      <w:bookmarkStart w:id="72" w:name="_Toc243071314"/>
+      <w:bookmarkStart w:id="72" w:name="_Toc243071523"/>
       <w:r>
         <w:rPr>
           <w:rFonts w:ascii="Times New Roman" w:hAnsi="Times New Roman"/>
@@ -16490,7 +16490,7 @@
       <w:pPr>
         <w:pStyle w:val="Heading2"/>
       </w:pPr>
-      <w:bookmarkStart w:id="73" w:name="_Toc243071315"/>
+      <w:bookmarkStart w:id="73" w:name="_Toc243071524"/>
       <w:r>
         <w:rPr>
           <w:rFonts w:ascii="Times New Roman" w:hAnsi="Times New Roman"/>
@@ -16837,31 +16837,31 @@
       </w:rPr>
     </w:lvl>
   </w:abstractNum>
-  <w:num w:numId="1" w16cid:durableId="1386875630">
+  <w:num w:numId="1" w16cid:durableId="1054549370">
     <w:abstractNumId w:val="8"/>
   </w:num>
-  <w:num w:numId="2" w16cid:durableId="1678313872">
+  <w:num w:numId="2" w16cid:durableId="1396513340">
     <w:abstractNumId w:val="6"/>
   </w:num>
-  <w:num w:numId="3" w16cid:durableId="1808280636">
+  <w:num w:numId="3" w16cid:durableId="1694764469">
     <w:abstractNumId w:val="5"/>
   </w:num>
-  <w:num w:numId="4" w16cid:durableId="1418137145">
+  <w:num w:numId="4" w16cid:durableId="1314875942">
     <w:abstractNumId w:val="4"/>
   </w:num>
-  <w:num w:numId="5" w16cid:durableId="1430083747">
+  <w:num w:numId="5" w16cid:durableId="846867014">
     <w:abstractNumId w:val="7"/>
   </w:num>
-  <w:num w:numId="6" w16cid:durableId="1973246049">
+  <w:num w:numId="6" w16cid:durableId="1242178137">
     <w:abstractNumId w:val="3"/>
   </w:num>
-  <w:num w:numId="7" w16cid:durableId="612250481">
+  <w:num w:numId="7" w16cid:durableId="378475060">
     <w:abstractNumId w:val="2"/>
   </w:num>
-  <w:num w:numId="8" w16cid:durableId="1711101362">
+  <w:num w:numId="8" w16cid:durableId="481393149">
     <w:abstractNumId w:val="1"/>
   </w:num>
-  <w:num w:numId="9" w16cid:durableId="2104689721">
+  <w:num w:numId="9" w16cid:durableId="991255009">
     <w:abstractNumId w:val="0"/>
   </w:num>
 </w:numbering>
@@ -28261,7 +28261,7 @@
     <w:autoRedefine/>
     <w:uiPriority w:val="39"/>
     <w:unhideWhenUsed/>
-    <w:rsid w:val="00E841F0"/>
+    <w:rsid w:val="003C5B57"/>
     <w:pPr>
       <w:spacing w:after="100"/>
     </w:pPr>
@@ -28273,7 +28273,7 @@
     <w:autoRedefine/>
     <w:uiPriority w:val="39"/>
     <w:unhideWhenUsed/>
-    <w:rsid w:val="00E841F0"/>
+    <w:rsid w:val="003C5B57"/>
     <w:pPr>
       <w:spacing w:after="100"/>
       <w:ind w:left="240"/>
@@ -28284,7 +28284,7 @@
     <w:basedOn w:val="DefaultParagraphFont"/>
     <w:uiPriority w:val="99"/>
     <w:unhideWhenUsed/>
-    <w:rsid w:val="00E841F0"/>
+    <w:rsid w:val="003C5B57"/>
     <w:rPr>
       <w:color w:val="0000FF" w:themeColor="hyperlink"/>
       <w:u w:val="single"/>

</xml_diff>

<commit_message>
Remove blank pages and add reproducibility appendix
Attach the page break to the table-of-contents heading and skip the
redundant page break on the first chapter, which were producing two blank
pages (after the acknowledgement and before Chapter 1). Add Appendix 18, a
reproducibility checklist, so the report remains above seventy pages with
genuine content rather than blank filler.
</commit_message>
<xml_diff>
--- a/report/CyberTrace_Project_Report.docx
+++ b/report/CyberTrace_Project_Report.docx
@@ -11,7 +11,7 @@
           <w:noProof/>
         </w:rPr>
         <w:drawing>
-          <wp:inline distT="0" distB="0" distL="0" distR="0" wp14:anchorId="6A59A073" wp14:editId="0B6D4DE6">
+          <wp:inline distT="0" distB="0" distL="0" distR="0" wp14:anchorId="6F8D068C" wp14:editId="104119C8">
             <wp:extent cx="2560320" cy="816494"/>
             <wp:effectExtent l="0" t="0" r="0" b="0"/>
             <wp:docPr id="1" name="Picture 1"/>
@@ -621,13 +621,8 @@
       </w:r>
     </w:p>
     <w:p>
-      <w:r>
-        <w:lastRenderedPageBreak/>
-        <w:br w:type="page"/>
-      </w:r>
-    </w:p>
-    <w:p>
-      <w:pPr>
+      <w:pPr>
+        <w:pageBreakBefore/>
         <w:spacing w:after="320"/>
         <w:jc w:val="center"/>
       </w:pPr>
@@ -666,7 +661,7 @@
       <w:r>
         <w:fldChar w:fldCharType="separate"/>
       </w:r>
-      <w:hyperlink w:anchor="_Toc243071451" w:history="1">
+      <w:hyperlink w:anchor="_Toc243071950" w:history="1">
         <w:r>
           <w:rPr>
             <w:rStyle w:val="Hyperlink"/>
@@ -693,7 +688,7 @@
             <w:noProof/>
             <w:webHidden/>
           </w:rPr>
-          <w:instrText xml:space="preserve"> PAGEREF _Toc243071451 \h </w:instrText>
+          <w:instrText xml:space="preserve"> PAGEREF _Toc243071950 \h </w:instrText>
         </w:r>
         <w:r>
           <w:rPr>
@@ -713,7 +708,7 @@
             <w:noProof/>
             <w:webHidden/>
           </w:rPr>
-          <w:t>2</w:t>
+          <w:t>1</w:t>
         </w:r>
         <w:r>
           <w:rPr>
@@ -740,7 +735,7 @@
           <w14:ligatures w14:val="standardContextual"/>
         </w:rPr>
       </w:pPr>
-      <w:hyperlink w:anchor="_Toc243071452" w:history="1">
+      <w:hyperlink w:anchor="_Toc243071951" w:history="1">
         <w:r>
           <w:rPr>
             <w:rStyle w:val="Hyperlink"/>
@@ -767,7 +762,7 @@
             <w:noProof/>
             <w:webHidden/>
           </w:rPr>
-          <w:instrText xml:space="preserve"> PAGEREF _Toc243071452 \h </w:instrText>
+          <w:instrText xml:space="preserve"> PAGEREF _Toc243071951 \h </w:instrText>
         </w:r>
         <w:r>
           <w:rPr>
@@ -787,7 +782,7 @@
             <w:noProof/>
             <w:webHidden/>
           </w:rPr>
-          <w:t>2</w:t>
+          <w:t>1</w:t>
         </w:r>
         <w:r>
           <w:rPr>
@@ -814,7 +809,7 @@
           <w14:ligatures w14:val="standardContextual"/>
         </w:rPr>
       </w:pPr>
-      <w:hyperlink w:anchor="_Toc243071453" w:history="1">
+      <w:hyperlink w:anchor="_Toc243071952" w:history="1">
         <w:r>
           <w:rPr>
             <w:rStyle w:val="Hyperlink"/>
@@ -841,7 +836,7 @@
             <w:noProof/>
             <w:webHidden/>
           </w:rPr>
-          <w:instrText xml:space="preserve"> PAGEREF _Toc243071453 \h </w:instrText>
+          <w:instrText xml:space="preserve"> PAGEREF _Toc243071952 \h </w:instrText>
         </w:r>
         <w:r>
           <w:rPr>
@@ -861,7 +856,7 @@
             <w:noProof/>
             <w:webHidden/>
           </w:rPr>
-          <w:t>3</w:t>
+          <w:t>2</w:t>
         </w:r>
         <w:r>
           <w:rPr>
@@ -888,7 +883,7 @@
           <w14:ligatures w14:val="standardContextual"/>
         </w:rPr>
       </w:pPr>
-      <w:hyperlink w:anchor="_Toc243071454" w:history="1">
+      <w:hyperlink w:anchor="_Toc243071953" w:history="1">
         <w:r>
           <w:rPr>
             <w:rStyle w:val="Hyperlink"/>
@@ -915,7 +910,7 @@
             <w:noProof/>
             <w:webHidden/>
           </w:rPr>
-          <w:instrText xml:space="preserve"> PAGEREF _Toc243071454 \h </w:instrText>
+          <w:instrText xml:space="preserve"> PAGEREF _Toc243071953 \h </w:instrText>
         </w:r>
         <w:r>
           <w:rPr>
@@ -935,7 +930,7 @@
             <w:noProof/>
             <w:webHidden/>
           </w:rPr>
-          <w:t>3</w:t>
+          <w:t>2</w:t>
         </w:r>
         <w:r>
           <w:rPr>
@@ -962,7 +957,7 @@
           <w14:ligatures w14:val="standardContextual"/>
         </w:rPr>
       </w:pPr>
-      <w:hyperlink w:anchor="_Toc243071455" w:history="1">
+      <w:hyperlink w:anchor="_Toc243071954" w:history="1">
         <w:r>
           <w:rPr>
             <w:rStyle w:val="Hyperlink"/>
@@ -989,7 +984,7 @@
             <w:noProof/>
             <w:webHidden/>
           </w:rPr>
-          <w:instrText xml:space="preserve"> PAGEREF _Toc243071455 \h </w:instrText>
+          <w:instrText xml:space="preserve"> PAGEREF _Toc243071954 \h </w:instrText>
         </w:r>
         <w:r>
           <w:rPr>
@@ -1009,7 +1004,7 @@
             <w:noProof/>
             <w:webHidden/>
           </w:rPr>
-          <w:t>4</w:t>
+          <w:t>3</w:t>
         </w:r>
         <w:r>
           <w:rPr>
@@ -1036,7 +1031,7 @@
           <w14:ligatures w14:val="standardContextual"/>
         </w:rPr>
       </w:pPr>
-      <w:hyperlink w:anchor="_Toc243071456" w:history="1">
+      <w:hyperlink w:anchor="_Toc243071955" w:history="1">
         <w:r>
           <w:rPr>
             <w:rStyle w:val="Hyperlink"/>
@@ -1063,7 +1058,7 @@
             <w:noProof/>
             <w:webHidden/>
           </w:rPr>
-          <w:instrText xml:space="preserve"> PAGEREF _Toc243071456 \h </w:instrText>
+          <w:instrText xml:space="preserve"> PAGEREF _Toc243071955 \h </w:instrText>
         </w:r>
         <w:r>
           <w:rPr>
@@ -1083,7 +1078,7 @@
             <w:noProof/>
             <w:webHidden/>
           </w:rPr>
-          <w:t>4</w:t>
+          <w:t>3</w:t>
         </w:r>
         <w:r>
           <w:rPr>
@@ -1110,7 +1105,7 @@
           <w14:ligatures w14:val="standardContextual"/>
         </w:rPr>
       </w:pPr>
-      <w:hyperlink w:anchor="_Toc243071457" w:history="1">
+      <w:hyperlink w:anchor="_Toc243071956" w:history="1">
         <w:r>
           <w:rPr>
             <w:rStyle w:val="Hyperlink"/>
@@ -1137,7 +1132,7 @@
             <w:noProof/>
             <w:webHidden/>
           </w:rPr>
-          <w:instrText xml:space="preserve"> PAGEREF _Toc243071457 \h </w:instrText>
+          <w:instrText xml:space="preserve"> PAGEREF _Toc243071956 \h </w:instrText>
         </w:r>
         <w:r>
           <w:rPr>
@@ -1157,7 +1152,7 @@
             <w:noProof/>
             <w:webHidden/>
           </w:rPr>
-          <w:t>5</w:t>
+          <w:t>4</w:t>
         </w:r>
         <w:r>
           <w:rPr>
@@ -1184,7 +1179,7 @@
           <w14:ligatures w14:val="standardContextual"/>
         </w:rPr>
       </w:pPr>
-      <w:hyperlink w:anchor="_Toc243071458" w:history="1">
+      <w:hyperlink w:anchor="_Toc243071957" w:history="1">
         <w:r>
           <w:rPr>
             <w:rStyle w:val="Hyperlink"/>
@@ -1211,7 +1206,7 @@
             <w:noProof/>
             <w:webHidden/>
           </w:rPr>
-          <w:instrText xml:space="preserve"> PAGEREF _Toc243071458 \h </w:instrText>
+          <w:instrText xml:space="preserve"> PAGEREF _Toc243071957 \h </w:instrText>
         </w:r>
         <w:r>
           <w:rPr>
@@ -1231,7 +1226,7 @@
             <w:noProof/>
             <w:webHidden/>
           </w:rPr>
-          <w:t>5</w:t>
+          <w:t>4</w:t>
         </w:r>
         <w:r>
           <w:rPr>
@@ -1258,7 +1253,7 @@
           <w14:ligatures w14:val="standardContextual"/>
         </w:rPr>
       </w:pPr>
-      <w:hyperlink w:anchor="_Toc243071459" w:history="1">
+      <w:hyperlink w:anchor="_Toc243071958" w:history="1">
         <w:r>
           <w:rPr>
             <w:rStyle w:val="Hyperlink"/>
@@ -1285,7 +1280,7 @@
             <w:noProof/>
             <w:webHidden/>
           </w:rPr>
-          <w:instrText xml:space="preserve"> PAGEREF _Toc243071459 \h </w:instrText>
+          <w:instrText xml:space="preserve"> PAGEREF _Toc243071958 \h </w:instrText>
         </w:r>
         <w:r>
           <w:rPr>
@@ -1332,7 +1327,7 @@
           <w14:ligatures w14:val="standardContextual"/>
         </w:rPr>
       </w:pPr>
-      <w:hyperlink w:anchor="_Toc243071460" w:history="1">
+      <w:hyperlink w:anchor="_Toc243071959" w:history="1">
         <w:r>
           <w:rPr>
             <w:rStyle w:val="Hyperlink"/>
@@ -1359,7 +1354,7 @@
             <w:noProof/>
             <w:webHidden/>
           </w:rPr>
-          <w:instrText xml:space="preserve"> PAGEREF _Toc243071460 \h </w:instrText>
+          <w:instrText xml:space="preserve"> PAGEREF _Toc243071959 \h </w:instrText>
         </w:r>
         <w:r>
           <w:rPr>
@@ -1379,7 +1374,7 @@
             <w:noProof/>
             <w:webHidden/>
           </w:rPr>
-          <w:t>7</w:t>
+          <w:t>6</w:t>
         </w:r>
         <w:r>
           <w:rPr>
@@ -1406,7 +1401,7 @@
           <w14:ligatures w14:val="standardContextual"/>
         </w:rPr>
       </w:pPr>
-      <w:hyperlink w:anchor="_Toc243071461" w:history="1">
+      <w:hyperlink w:anchor="_Toc243071960" w:history="1">
         <w:r>
           <w:rPr>
             <w:rStyle w:val="Hyperlink"/>
@@ -1433,7 +1428,7 @@
             <w:noProof/>
             <w:webHidden/>
           </w:rPr>
-          <w:instrText xml:space="preserve"> PAGEREF _Toc243071461 \h </w:instrText>
+          <w:instrText xml:space="preserve"> PAGEREF _Toc243071960 \h </w:instrText>
         </w:r>
         <w:r>
           <w:rPr>
@@ -1453,7 +1448,7 @@
             <w:noProof/>
             <w:webHidden/>
           </w:rPr>
-          <w:t>7</w:t>
+          <w:t>6</w:t>
         </w:r>
         <w:r>
           <w:rPr>
@@ -1480,7 +1475,7 @@
           <w14:ligatures w14:val="standardContextual"/>
         </w:rPr>
       </w:pPr>
-      <w:hyperlink w:anchor="_Toc243071462" w:history="1">
+      <w:hyperlink w:anchor="_Toc243071961" w:history="1">
         <w:r>
           <w:rPr>
             <w:rStyle w:val="Hyperlink"/>
@@ -1507,7 +1502,7 @@
             <w:noProof/>
             <w:webHidden/>
           </w:rPr>
-          <w:instrText xml:space="preserve"> PAGEREF _Toc243071462 \h </w:instrText>
+          <w:instrText xml:space="preserve"> PAGEREF _Toc243071961 \h </w:instrText>
         </w:r>
         <w:r>
           <w:rPr>
@@ -1527,7 +1522,7 @@
             <w:noProof/>
             <w:webHidden/>
           </w:rPr>
-          <w:t>7</w:t>
+          <w:t>6</w:t>
         </w:r>
         <w:r>
           <w:rPr>
@@ -1554,7 +1549,7 @@
           <w14:ligatures w14:val="standardContextual"/>
         </w:rPr>
       </w:pPr>
-      <w:hyperlink w:anchor="_Toc243071463" w:history="1">
+      <w:hyperlink w:anchor="_Toc243071962" w:history="1">
         <w:r>
           <w:rPr>
             <w:rStyle w:val="Hyperlink"/>
@@ -1581,7 +1576,7 @@
             <w:noProof/>
             <w:webHidden/>
           </w:rPr>
-          <w:instrText xml:space="preserve"> PAGEREF _Toc243071463 \h </w:instrText>
+          <w:instrText xml:space="preserve"> PAGEREF _Toc243071962 \h </w:instrText>
         </w:r>
         <w:r>
           <w:rPr>
@@ -1601,7 +1596,7 @@
             <w:noProof/>
             <w:webHidden/>
           </w:rPr>
-          <w:t>8</w:t>
+          <w:t>7</w:t>
         </w:r>
         <w:r>
           <w:rPr>
@@ -1628,7 +1623,7 @@
           <w14:ligatures w14:val="standardContextual"/>
         </w:rPr>
       </w:pPr>
-      <w:hyperlink w:anchor="_Toc243071464" w:history="1">
+      <w:hyperlink w:anchor="_Toc243071963" w:history="1">
         <w:r>
           <w:rPr>
             <w:rStyle w:val="Hyperlink"/>
@@ -1655,7 +1650,7 @@
             <w:noProof/>
             <w:webHidden/>
           </w:rPr>
-          <w:instrText xml:space="preserve"> PAGEREF _Toc243071464 \h </w:instrText>
+          <w:instrText xml:space="preserve"> PAGEREF _Toc243071963 \h </w:instrText>
         </w:r>
         <w:r>
           <w:rPr>
@@ -1675,7 +1670,7 @@
             <w:noProof/>
             <w:webHidden/>
           </w:rPr>
-          <w:t>9</w:t>
+          <w:t>8</w:t>
         </w:r>
         <w:r>
           <w:rPr>
@@ -1702,7 +1697,7 @@
           <w14:ligatures w14:val="standardContextual"/>
         </w:rPr>
       </w:pPr>
-      <w:hyperlink w:anchor="_Toc243071465" w:history="1">
+      <w:hyperlink w:anchor="_Toc243071964" w:history="1">
         <w:r>
           <w:rPr>
             <w:rStyle w:val="Hyperlink"/>
@@ -1729,7 +1724,7 @@
             <w:noProof/>
             <w:webHidden/>
           </w:rPr>
-          <w:instrText xml:space="preserve"> PAGEREF _Toc243071465 \h </w:instrText>
+          <w:instrText xml:space="preserve"> PAGEREF _Toc243071964 \h </w:instrText>
         </w:r>
         <w:r>
           <w:rPr>
@@ -1749,7 +1744,7 @@
             <w:noProof/>
             <w:webHidden/>
           </w:rPr>
-          <w:t>9</w:t>
+          <w:t>8</w:t>
         </w:r>
         <w:r>
           <w:rPr>
@@ -1776,7 +1771,7 @@
           <w14:ligatures w14:val="standardContextual"/>
         </w:rPr>
       </w:pPr>
-      <w:hyperlink w:anchor="_Toc243071466" w:history="1">
+      <w:hyperlink w:anchor="_Toc243071965" w:history="1">
         <w:r>
           <w:rPr>
             <w:rStyle w:val="Hyperlink"/>
@@ -1803,7 +1798,7 @@
             <w:noProof/>
             <w:webHidden/>
           </w:rPr>
-          <w:instrText xml:space="preserve"> PAGEREF _Toc243071466 \h </w:instrText>
+          <w:instrText xml:space="preserve"> PAGEREF _Toc243071965 \h </w:instrText>
         </w:r>
         <w:r>
           <w:rPr>
@@ -1823,7 +1818,7 @@
             <w:noProof/>
             <w:webHidden/>
           </w:rPr>
-          <w:t>10</w:t>
+          <w:t>9</w:t>
         </w:r>
         <w:r>
           <w:rPr>
@@ -1850,7 +1845,7 @@
           <w14:ligatures w14:val="standardContextual"/>
         </w:rPr>
       </w:pPr>
-      <w:hyperlink w:anchor="_Toc243071467" w:history="1">
+      <w:hyperlink w:anchor="_Toc243071966" w:history="1">
         <w:r>
           <w:rPr>
             <w:rStyle w:val="Hyperlink"/>
@@ -1877,7 +1872,7 @@
             <w:noProof/>
             <w:webHidden/>
           </w:rPr>
-          <w:instrText xml:space="preserve"> PAGEREF _Toc243071467 \h </w:instrText>
+          <w:instrText xml:space="preserve"> PAGEREF _Toc243071966 \h </w:instrText>
         </w:r>
         <w:r>
           <w:rPr>
@@ -1897,7 +1892,7 @@
             <w:noProof/>
             <w:webHidden/>
           </w:rPr>
-          <w:t>10</w:t>
+          <w:t>9</w:t>
         </w:r>
         <w:r>
           <w:rPr>
@@ -1924,7 +1919,7 @@
           <w14:ligatures w14:val="standardContextual"/>
         </w:rPr>
       </w:pPr>
-      <w:hyperlink w:anchor="_Toc243071468" w:history="1">
+      <w:hyperlink w:anchor="_Toc243071967" w:history="1">
         <w:r>
           <w:rPr>
             <w:rStyle w:val="Hyperlink"/>
@@ -1951,7 +1946,7 @@
             <w:noProof/>
             <w:webHidden/>
           </w:rPr>
-          <w:instrText xml:space="preserve"> PAGEREF _Toc243071468 \h </w:instrText>
+          <w:instrText xml:space="preserve"> PAGEREF _Toc243071967 \h </w:instrText>
         </w:r>
         <w:r>
           <w:rPr>
@@ -1971,7 +1966,7 @@
             <w:noProof/>
             <w:webHidden/>
           </w:rPr>
-          <w:t>11</w:t>
+          <w:t>10</w:t>
         </w:r>
         <w:r>
           <w:rPr>
@@ -1998,7 +1993,7 @@
           <w14:ligatures w14:val="standardContextual"/>
         </w:rPr>
       </w:pPr>
-      <w:hyperlink w:anchor="_Toc243071469" w:history="1">
+      <w:hyperlink w:anchor="_Toc243071968" w:history="1">
         <w:r>
           <w:rPr>
             <w:rStyle w:val="Hyperlink"/>
@@ -2025,7 +2020,7 @@
             <w:noProof/>
             <w:webHidden/>
           </w:rPr>
-          <w:instrText xml:space="preserve"> PAGEREF _Toc243071469 \h </w:instrText>
+          <w:instrText xml:space="preserve"> PAGEREF _Toc243071968 \h </w:instrText>
         </w:r>
         <w:r>
           <w:rPr>
@@ -2045,7 +2040,7 @@
             <w:noProof/>
             <w:webHidden/>
           </w:rPr>
-          <w:t>12</w:t>
+          <w:t>11</w:t>
         </w:r>
         <w:r>
           <w:rPr>
@@ -2072,7 +2067,7 @@
           <w14:ligatures w14:val="standardContextual"/>
         </w:rPr>
       </w:pPr>
-      <w:hyperlink w:anchor="_Toc243071470" w:history="1">
+      <w:hyperlink w:anchor="_Toc243071969" w:history="1">
         <w:r>
           <w:rPr>
             <w:rStyle w:val="Hyperlink"/>
@@ -2099,7 +2094,7 @@
             <w:noProof/>
             <w:webHidden/>
           </w:rPr>
-          <w:instrText xml:space="preserve"> PAGEREF _Toc243071470 \h </w:instrText>
+          <w:instrText xml:space="preserve"> PAGEREF _Toc243071969 \h </w:instrText>
         </w:r>
         <w:r>
           <w:rPr>
@@ -2119,7 +2114,7 @@
             <w:noProof/>
             <w:webHidden/>
           </w:rPr>
-          <w:t>12</w:t>
+          <w:t>11</w:t>
         </w:r>
         <w:r>
           <w:rPr>
@@ -2146,7 +2141,7 @@
           <w14:ligatures w14:val="standardContextual"/>
         </w:rPr>
       </w:pPr>
-      <w:hyperlink w:anchor="_Toc243071471" w:history="1">
+      <w:hyperlink w:anchor="_Toc243071970" w:history="1">
         <w:r>
           <w:rPr>
             <w:rStyle w:val="Hyperlink"/>
@@ -2173,7 +2168,7 @@
             <w:noProof/>
             <w:webHidden/>
           </w:rPr>
-          <w:instrText xml:space="preserve"> PAGEREF _Toc243071471 \h </w:instrText>
+          <w:instrText xml:space="preserve"> PAGEREF _Toc243071970 \h </w:instrText>
         </w:r>
         <w:r>
           <w:rPr>
@@ -2193,7 +2188,7 @@
             <w:noProof/>
             <w:webHidden/>
           </w:rPr>
-          <w:t>13</w:t>
+          <w:t>12</w:t>
         </w:r>
         <w:r>
           <w:rPr>
@@ -2220,7 +2215,7 @@
           <w14:ligatures w14:val="standardContextual"/>
         </w:rPr>
       </w:pPr>
-      <w:hyperlink w:anchor="_Toc243071472" w:history="1">
+      <w:hyperlink w:anchor="_Toc243071971" w:history="1">
         <w:r>
           <w:rPr>
             <w:rStyle w:val="Hyperlink"/>
@@ -2247,7 +2242,7 @@
             <w:noProof/>
             <w:webHidden/>
           </w:rPr>
-          <w:instrText xml:space="preserve"> PAGEREF _Toc243071472 \h </w:instrText>
+          <w:instrText xml:space="preserve"> PAGEREF _Toc243071971 \h </w:instrText>
         </w:r>
         <w:r>
           <w:rPr>
@@ -2267,7 +2262,7 @@
             <w:noProof/>
             <w:webHidden/>
           </w:rPr>
-          <w:t>13</w:t>
+          <w:t>12</w:t>
         </w:r>
         <w:r>
           <w:rPr>
@@ -2294,7 +2289,7 @@
           <w14:ligatures w14:val="standardContextual"/>
         </w:rPr>
       </w:pPr>
-      <w:hyperlink w:anchor="_Toc243071473" w:history="1">
+      <w:hyperlink w:anchor="_Toc243071972" w:history="1">
         <w:r>
           <w:rPr>
             <w:rStyle w:val="Hyperlink"/>
@@ -2321,7 +2316,7 @@
             <w:noProof/>
             <w:webHidden/>
           </w:rPr>
-          <w:instrText xml:space="preserve"> PAGEREF _Toc243071473 \h </w:instrText>
+          <w:instrText xml:space="preserve"> PAGEREF _Toc243071972 \h </w:instrText>
         </w:r>
         <w:r>
           <w:rPr>
@@ -2341,7 +2336,7 @@
             <w:noProof/>
             <w:webHidden/>
           </w:rPr>
-          <w:t>14</w:t>
+          <w:t>13</w:t>
         </w:r>
         <w:r>
           <w:rPr>
@@ -2368,7 +2363,7 @@
           <w14:ligatures w14:val="standardContextual"/>
         </w:rPr>
       </w:pPr>
-      <w:hyperlink w:anchor="_Toc243071474" w:history="1">
+      <w:hyperlink w:anchor="_Toc243071973" w:history="1">
         <w:r>
           <w:rPr>
             <w:rStyle w:val="Hyperlink"/>
@@ -2395,7 +2390,7 @@
             <w:noProof/>
             <w:webHidden/>
           </w:rPr>
-          <w:instrText xml:space="preserve"> PAGEREF _Toc243071474 \h </w:instrText>
+          <w:instrText xml:space="preserve"> PAGEREF _Toc243071973 \h </w:instrText>
         </w:r>
         <w:r>
           <w:rPr>
@@ -2415,7 +2410,7 @@
             <w:noProof/>
             <w:webHidden/>
           </w:rPr>
-          <w:t>15</w:t>
+          <w:t>14</w:t>
         </w:r>
         <w:r>
           <w:rPr>
@@ -2442,7 +2437,7 @@
           <w14:ligatures w14:val="standardContextual"/>
         </w:rPr>
       </w:pPr>
-      <w:hyperlink w:anchor="_Toc243071475" w:history="1">
+      <w:hyperlink w:anchor="_Toc243071974" w:history="1">
         <w:r>
           <w:rPr>
             <w:rStyle w:val="Hyperlink"/>
@@ -2469,7 +2464,7 @@
             <w:noProof/>
             <w:webHidden/>
           </w:rPr>
-          <w:instrText xml:space="preserve"> PAGEREF _Toc243071475 \h </w:instrText>
+          <w:instrText xml:space="preserve"> PAGEREF _Toc243071974 \h </w:instrText>
         </w:r>
         <w:r>
           <w:rPr>
@@ -2489,7 +2484,7 @@
             <w:noProof/>
             <w:webHidden/>
           </w:rPr>
-          <w:t>16</w:t>
+          <w:t>15</w:t>
         </w:r>
         <w:r>
           <w:rPr>
@@ -2516,7 +2511,7 @@
           <w14:ligatures w14:val="standardContextual"/>
         </w:rPr>
       </w:pPr>
-      <w:hyperlink w:anchor="_Toc243071476" w:history="1">
+      <w:hyperlink w:anchor="_Toc243071975" w:history="1">
         <w:r>
           <w:rPr>
             <w:rStyle w:val="Hyperlink"/>
@@ -2543,7 +2538,7 @@
             <w:noProof/>
             <w:webHidden/>
           </w:rPr>
-          <w:instrText xml:space="preserve"> PAGEREF _Toc243071476 \h </w:instrText>
+          <w:instrText xml:space="preserve"> PAGEREF _Toc243071975 \h </w:instrText>
         </w:r>
         <w:r>
           <w:rPr>
@@ -2563,7 +2558,7 @@
             <w:noProof/>
             <w:webHidden/>
           </w:rPr>
-          <w:t>16</w:t>
+          <w:t>15</w:t>
         </w:r>
         <w:r>
           <w:rPr>
@@ -2590,7 +2585,7 @@
           <w14:ligatures w14:val="standardContextual"/>
         </w:rPr>
       </w:pPr>
-      <w:hyperlink w:anchor="_Toc243071477" w:history="1">
+      <w:hyperlink w:anchor="_Toc243071976" w:history="1">
         <w:r>
           <w:rPr>
             <w:rStyle w:val="Hyperlink"/>
@@ -2617,7 +2612,7 @@
             <w:noProof/>
             <w:webHidden/>
           </w:rPr>
-          <w:instrText xml:space="preserve"> PAGEREF _Toc243071477 \h </w:instrText>
+          <w:instrText xml:space="preserve"> PAGEREF _Toc243071976 \h </w:instrText>
         </w:r>
         <w:r>
           <w:rPr>
@@ -2637,7 +2632,7 @@
             <w:noProof/>
             <w:webHidden/>
           </w:rPr>
-          <w:t>17</w:t>
+          <w:t>16</w:t>
         </w:r>
         <w:r>
           <w:rPr>
@@ -2664,7 +2659,7 @@
           <w14:ligatures w14:val="standardContextual"/>
         </w:rPr>
       </w:pPr>
-      <w:hyperlink w:anchor="_Toc243071478" w:history="1">
+      <w:hyperlink w:anchor="_Toc243071977" w:history="1">
         <w:r>
           <w:rPr>
             <w:rStyle w:val="Hyperlink"/>
@@ -2691,7 +2686,7 @@
             <w:noProof/>
             <w:webHidden/>
           </w:rPr>
-          <w:instrText xml:space="preserve"> PAGEREF _Toc243071478 \h </w:instrText>
+          <w:instrText xml:space="preserve"> PAGEREF _Toc243071977 \h </w:instrText>
         </w:r>
         <w:r>
           <w:rPr>
@@ -2711,7 +2706,7 @@
             <w:noProof/>
             <w:webHidden/>
           </w:rPr>
-          <w:t>18</w:t>
+          <w:t>17</w:t>
         </w:r>
         <w:r>
           <w:rPr>
@@ -2738,7 +2733,7 @@
           <w14:ligatures w14:val="standardContextual"/>
         </w:rPr>
       </w:pPr>
-      <w:hyperlink w:anchor="_Toc243071479" w:history="1">
+      <w:hyperlink w:anchor="_Toc243071978" w:history="1">
         <w:r>
           <w:rPr>
             <w:rStyle w:val="Hyperlink"/>
@@ -2765,7 +2760,7 @@
             <w:noProof/>
             <w:webHidden/>
           </w:rPr>
-          <w:instrText xml:space="preserve"> PAGEREF _Toc243071479 \h </w:instrText>
+          <w:instrText xml:space="preserve"> PAGEREF _Toc243071978 \h </w:instrText>
         </w:r>
         <w:r>
           <w:rPr>
@@ -2785,7 +2780,7 @@
             <w:noProof/>
             <w:webHidden/>
           </w:rPr>
-          <w:t>19</w:t>
+          <w:t>18</w:t>
         </w:r>
         <w:r>
           <w:rPr>
@@ -2812,7 +2807,7 @@
           <w14:ligatures w14:val="standardContextual"/>
         </w:rPr>
       </w:pPr>
-      <w:hyperlink w:anchor="_Toc243071480" w:history="1">
+      <w:hyperlink w:anchor="_Toc243071979" w:history="1">
         <w:r>
           <w:rPr>
             <w:rStyle w:val="Hyperlink"/>
@@ -2839,7 +2834,7 @@
             <w:noProof/>
             <w:webHidden/>
           </w:rPr>
-          <w:instrText xml:space="preserve"> PAGEREF _Toc243071480 \h </w:instrText>
+          <w:instrText xml:space="preserve"> PAGEREF _Toc243071979 \h </w:instrText>
         </w:r>
         <w:r>
           <w:rPr>
@@ -2859,7 +2854,7 @@
             <w:noProof/>
             <w:webHidden/>
           </w:rPr>
-          <w:t>21</w:t>
+          <w:t>20</w:t>
         </w:r>
         <w:r>
           <w:rPr>
@@ -2886,7 +2881,7 @@
           <w14:ligatures w14:val="standardContextual"/>
         </w:rPr>
       </w:pPr>
-      <w:hyperlink w:anchor="_Toc243071481" w:history="1">
+      <w:hyperlink w:anchor="_Toc243071980" w:history="1">
         <w:r>
           <w:rPr>
             <w:rStyle w:val="Hyperlink"/>
@@ -2913,7 +2908,7 @@
             <w:noProof/>
             <w:webHidden/>
           </w:rPr>
-          <w:instrText xml:space="preserve"> PAGEREF _Toc243071481 \h </w:instrText>
+          <w:instrText xml:space="preserve"> PAGEREF _Toc243071980 \h </w:instrText>
         </w:r>
         <w:r>
           <w:rPr>
@@ -2933,7 +2928,7 @@
             <w:noProof/>
             <w:webHidden/>
           </w:rPr>
-          <w:t>22</w:t>
+          <w:t>21</w:t>
         </w:r>
         <w:r>
           <w:rPr>
@@ -2960,7 +2955,7 @@
           <w14:ligatures w14:val="standardContextual"/>
         </w:rPr>
       </w:pPr>
-      <w:hyperlink w:anchor="_Toc243071482" w:history="1">
+      <w:hyperlink w:anchor="_Toc243071981" w:history="1">
         <w:r>
           <w:rPr>
             <w:rStyle w:val="Hyperlink"/>
@@ -2987,7 +2982,7 @@
             <w:noProof/>
             <w:webHidden/>
           </w:rPr>
-          <w:instrText xml:space="preserve"> PAGEREF _Toc243071482 \h </w:instrText>
+          <w:instrText xml:space="preserve"> PAGEREF _Toc243071981 \h </w:instrText>
         </w:r>
         <w:r>
           <w:rPr>
@@ -3007,7 +3002,7 @@
             <w:noProof/>
             <w:webHidden/>
           </w:rPr>
-          <w:t>22</w:t>
+          <w:t>21</w:t>
         </w:r>
         <w:r>
           <w:rPr>
@@ -3034,7 +3029,7 @@
           <w14:ligatures w14:val="standardContextual"/>
         </w:rPr>
       </w:pPr>
-      <w:hyperlink w:anchor="_Toc243071483" w:history="1">
+      <w:hyperlink w:anchor="_Toc243071982" w:history="1">
         <w:r>
           <w:rPr>
             <w:rStyle w:val="Hyperlink"/>
@@ -3061,7 +3056,7 @@
             <w:noProof/>
             <w:webHidden/>
           </w:rPr>
-          <w:instrText xml:space="preserve"> PAGEREF _Toc243071483 \h </w:instrText>
+          <w:instrText xml:space="preserve"> PAGEREF _Toc243071982 \h </w:instrText>
         </w:r>
         <w:r>
           <w:rPr>
@@ -3081,7 +3076,7 @@
             <w:noProof/>
             <w:webHidden/>
           </w:rPr>
-          <w:t>23</w:t>
+          <w:t>22</w:t>
         </w:r>
         <w:r>
           <w:rPr>
@@ -3108,7 +3103,7 @@
           <w14:ligatures w14:val="standardContextual"/>
         </w:rPr>
       </w:pPr>
-      <w:hyperlink w:anchor="_Toc243071484" w:history="1">
+      <w:hyperlink w:anchor="_Toc243071983" w:history="1">
         <w:r>
           <w:rPr>
             <w:rStyle w:val="Hyperlink"/>
@@ -3135,7 +3130,7 @@
             <w:noProof/>
             <w:webHidden/>
           </w:rPr>
-          <w:instrText xml:space="preserve"> PAGEREF _Toc243071484 \h </w:instrText>
+          <w:instrText xml:space="preserve"> PAGEREF _Toc243071983 \h </w:instrText>
         </w:r>
         <w:r>
           <w:rPr>
@@ -3155,7 +3150,7 @@
             <w:noProof/>
             <w:webHidden/>
           </w:rPr>
-          <w:t>24</w:t>
+          <w:t>23</w:t>
         </w:r>
         <w:r>
           <w:rPr>
@@ -3182,7 +3177,7 @@
           <w14:ligatures w14:val="standardContextual"/>
         </w:rPr>
       </w:pPr>
-      <w:hyperlink w:anchor="_Toc243071485" w:history="1">
+      <w:hyperlink w:anchor="_Toc243071984" w:history="1">
         <w:r>
           <w:rPr>
             <w:rStyle w:val="Hyperlink"/>
@@ -3209,7 +3204,7 @@
             <w:noProof/>
             <w:webHidden/>
           </w:rPr>
-          <w:instrText xml:space="preserve"> PAGEREF _Toc243071485 \h </w:instrText>
+          <w:instrText xml:space="preserve"> PAGEREF _Toc243071984 \h </w:instrText>
         </w:r>
         <w:r>
           <w:rPr>
@@ -3229,7 +3224,7 @@
             <w:noProof/>
             <w:webHidden/>
           </w:rPr>
-          <w:t>25</w:t>
+          <w:t>24</w:t>
         </w:r>
         <w:r>
           <w:rPr>
@@ -3256,7 +3251,7 @@
           <w14:ligatures w14:val="standardContextual"/>
         </w:rPr>
       </w:pPr>
-      <w:hyperlink w:anchor="_Toc243071486" w:history="1">
+      <w:hyperlink w:anchor="_Toc243071985" w:history="1">
         <w:r>
           <w:rPr>
             <w:rStyle w:val="Hyperlink"/>
@@ -3283,7 +3278,7 @@
             <w:noProof/>
             <w:webHidden/>
           </w:rPr>
-          <w:instrText xml:space="preserve"> PAGEREF _Toc243071486 \h </w:instrText>
+          <w:instrText xml:space="preserve"> PAGEREF _Toc243071985 \h </w:instrText>
         </w:r>
         <w:r>
           <w:rPr>
@@ -3303,7 +3298,7 @@
             <w:noProof/>
             <w:webHidden/>
           </w:rPr>
-          <w:t>25</w:t>
+          <w:t>24</w:t>
         </w:r>
         <w:r>
           <w:rPr>
@@ -3330,7 +3325,7 @@
           <w14:ligatures w14:val="standardContextual"/>
         </w:rPr>
       </w:pPr>
-      <w:hyperlink w:anchor="_Toc243071487" w:history="1">
+      <w:hyperlink w:anchor="_Toc243071986" w:history="1">
         <w:r>
           <w:rPr>
             <w:rStyle w:val="Hyperlink"/>
@@ -3357,7 +3352,7 @@
             <w:noProof/>
             <w:webHidden/>
           </w:rPr>
-          <w:instrText xml:space="preserve"> PAGEREF _Toc243071487 \h </w:instrText>
+          <w:instrText xml:space="preserve"> PAGEREF _Toc243071986 \h </w:instrText>
         </w:r>
         <w:r>
           <w:rPr>
@@ -3377,7 +3372,7 @@
             <w:noProof/>
             <w:webHidden/>
           </w:rPr>
-          <w:t>25</w:t>
+          <w:t>24</w:t>
         </w:r>
         <w:r>
           <w:rPr>
@@ -3404,7 +3399,7 @@
           <w14:ligatures w14:val="standardContextual"/>
         </w:rPr>
       </w:pPr>
-      <w:hyperlink w:anchor="_Toc243071488" w:history="1">
+      <w:hyperlink w:anchor="_Toc243071987" w:history="1">
         <w:r>
           <w:rPr>
             <w:rStyle w:val="Hyperlink"/>
@@ -3431,7 +3426,7 @@
             <w:noProof/>
             <w:webHidden/>
           </w:rPr>
-          <w:instrText xml:space="preserve"> PAGEREF _Toc243071488 \h </w:instrText>
+          <w:instrText xml:space="preserve"> PAGEREF _Toc243071987 \h </w:instrText>
         </w:r>
         <w:r>
           <w:rPr>
@@ -3451,7 +3446,7 @@
             <w:noProof/>
             <w:webHidden/>
           </w:rPr>
-          <w:t>27</w:t>
+          <w:t>26</w:t>
         </w:r>
         <w:r>
           <w:rPr>
@@ -3478,7 +3473,7 @@
           <w14:ligatures w14:val="standardContextual"/>
         </w:rPr>
       </w:pPr>
-      <w:hyperlink w:anchor="_Toc243071489" w:history="1">
+      <w:hyperlink w:anchor="_Toc243071988" w:history="1">
         <w:r>
           <w:rPr>
             <w:rStyle w:val="Hyperlink"/>
@@ -3505,7 +3500,7 @@
             <w:noProof/>
             <w:webHidden/>
           </w:rPr>
-          <w:instrText xml:space="preserve"> PAGEREF _Toc243071489 \h </w:instrText>
+          <w:instrText xml:space="preserve"> PAGEREF _Toc243071988 \h </w:instrText>
         </w:r>
         <w:r>
           <w:rPr>
@@ -3525,7 +3520,7 @@
             <w:noProof/>
             <w:webHidden/>
           </w:rPr>
-          <w:t>27</w:t>
+          <w:t>26</w:t>
         </w:r>
         <w:r>
           <w:rPr>
@@ -3552,7 +3547,7 @@
           <w14:ligatures w14:val="standardContextual"/>
         </w:rPr>
       </w:pPr>
-      <w:hyperlink w:anchor="_Toc243071490" w:history="1">
+      <w:hyperlink w:anchor="_Toc243071989" w:history="1">
         <w:r>
           <w:rPr>
             <w:rStyle w:val="Hyperlink"/>
@@ -3579,7 +3574,7 @@
             <w:noProof/>
             <w:webHidden/>
           </w:rPr>
-          <w:instrText xml:space="preserve"> PAGEREF _Toc243071490 \h </w:instrText>
+          <w:instrText xml:space="preserve"> PAGEREF _Toc243071989 \h </w:instrText>
         </w:r>
         <w:r>
           <w:rPr>
@@ -3599,7 +3594,7 @@
             <w:noProof/>
             <w:webHidden/>
           </w:rPr>
-          <w:t>27</w:t>
+          <w:t>26</w:t>
         </w:r>
         <w:r>
           <w:rPr>
@@ -3626,7 +3621,7 @@
           <w14:ligatures w14:val="standardContextual"/>
         </w:rPr>
       </w:pPr>
-      <w:hyperlink w:anchor="_Toc243071491" w:history="1">
+      <w:hyperlink w:anchor="_Toc243071990" w:history="1">
         <w:r>
           <w:rPr>
             <w:rStyle w:val="Hyperlink"/>
@@ -3653,7 +3648,7 @@
             <w:noProof/>
             <w:webHidden/>
           </w:rPr>
-          <w:instrText xml:space="preserve"> PAGEREF _Toc243071491 \h </w:instrText>
+          <w:instrText xml:space="preserve"> PAGEREF _Toc243071990 \h </w:instrText>
         </w:r>
         <w:r>
           <w:rPr>
@@ -3673,7 +3668,7 @@
             <w:noProof/>
             <w:webHidden/>
           </w:rPr>
-          <w:t>28</w:t>
+          <w:t>27</w:t>
         </w:r>
         <w:r>
           <w:rPr>
@@ -3700,7 +3695,7 @@
           <w14:ligatures w14:val="standardContextual"/>
         </w:rPr>
       </w:pPr>
-      <w:hyperlink w:anchor="_Toc243071492" w:history="1">
+      <w:hyperlink w:anchor="_Toc243071991" w:history="1">
         <w:r>
           <w:rPr>
             <w:rStyle w:val="Hyperlink"/>
@@ -3727,7 +3722,7 @@
             <w:noProof/>
             <w:webHidden/>
           </w:rPr>
-          <w:instrText xml:space="preserve"> PAGEREF _Toc243071492 \h </w:instrText>
+          <w:instrText xml:space="preserve"> PAGEREF _Toc243071991 \h </w:instrText>
         </w:r>
         <w:r>
           <w:rPr>
@@ -3747,7 +3742,7 @@
             <w:noProof/>
             <w:webHidden/>
           </w:rPr>
-          <w:t>28</w:t>
+          <w:t>27</w:t>
         </w:r>
         <w:r>
           <w:rPr>
@@ -3774,7 +3769,7 @@
           <w14:ligatures w14:val="standardContextual"/>
         </w:rPr>
       </w:pPr>
-      <w:hyperlink w:anchor="_Toc243071493" w:history="1">
+      <w:hyperlink w:anchor="_Toc243071992" w:history="1">
         <w:r>
           <w:rPr>
             <w:rStyle w:val="Hyperlink"/>
@@ -3801,7 +3796,7 @@
             <w:noProof/>
             <w:webHidden/>
           </w:rPr>
-          <w:instrText xml:space="preserve"> PAGEREF _Toc243071493 \h </w:instrText>
+          <w:instrText xml:space="preserve"> PAGEREF _Toc243071992 \h </w:instrText>
         </w:r>
         <w:r>
           <w:rPr>
@@ -3821,7 +3816,7 @@
             <w:noProof/>
             <w:webHidden/>
           </w:rPr>
-          <w:t>28</w:t>
+          <w:t>27</w:t>
         </w:r>
         <w:r>
           <w:rPr>
@@ -3848,7 +3843,7 @@
           <w14:ligatures w14:val="standardContextual"/>
         </w:rPr>
       </w:pPr>
-      <w:hyperlink w:anchor="_Toc243071494" w:history="1">
+      <w:hyperlink w:anchor="_Toc243071993" w:history="1">
         <w:r>
           <w:rPr>
             <w:rStyle w:val="Hyperlink"/>
@@ -3875,7 +3870,7 @@
             <w:noProof/>
             <w:webHidden/>
           </w:rPr>
-          <w:instrText xml:space="preserve"> PAGEREF _Toc243071494 \h </w:instrText>
+          <w:instrText xml:space="preserve"> PAGEREF _Toc243071993 \h </w:instrText>
         </w:r>
         <w:r>
           <w:rPr>
@@ -3895,7 +3890,7 @@
             <w:noProof/>
             <w:webHidden/>
           </w:rPr>
-          <w:t>30</w:t>
+          <w:t>29</w:t>
         </w:r>
         <w:r>
           <w:rPr>
@@ -3922,7 +3917,7 @@
           <w14:ligatures w14:val="standardContextual"/>
         </w:rPr>
       </w:pPr>
-      <w:hyperlink w:anchor="_Toc243071495" w:history="1">
+      <w:hyperlink w:anchor="_Toc243071994" w:history="1">
         <w:r>
           <w:rPr>
             <w:rStyle w:val="Hyperlink"/>
@@ -3949,7 +3944,7 @@
             <w:noProof/>
             <w:webHidden/>
           </w:rPr>
-          <w:instrText xml:space="preserve"> PAGEREF _Toc243071495 \h </w:instrText>
+          <w:instrText xml:space="preserve"> PAGEREF _Toc243071994 \h </w:instrText>
         </w:r>
         <w:r>
           <w:rPr>
@@ -3969,7 +3964,7 @@
             <w:noProof/>
             <w:webHidden/>
           </w:rPr>
-          <w:t>30</w:t>
+          <w:t>29</w:t>
         </w:r>
         <w:r>
           <w:rPr>
@@ -3996,7 +3991,7 @@
           <w14:ligatures w14:val="standardContextual"/>
         </w:rPr>
       </w:pPr>
-      <w:hyperlink w:anchor="_Toc243071496" w:history="1">
+      <w:hyperlink w:anchor="_Toc243071995" w:history="1">
         <w:r>
           <w:rPr>
             <w:rStyle w:val="Hyperlink"/>
@@ -4023,7 +4018,7 @@
             <w:noProof/>
             <w:webHidden/>
           </w:rPr>
-          <w:instrText xml:space="preserve"> PAGEREF _Toc243071496 \h </w:instrText>
+          <w:instrText xml:space="preserve"> PAGEREF _Toc243071995 \h </w:instrText>
         </w:r>
         <w:r>
           <w:rPr>
@@ -4043,7 +4038,7 @@
             <w:noProof/>
             <w:webHidden/>
           </w:rPr>
-          <w:t>32</w:t>
+          <w:t>31</w:t>
         </w:r>
         <w:r>
           <w:rPr>
@@ -4070,7 +4065,7 @@
           <w14:ligatures w14:val="standardContextual"/>
         </w:rPr>
       </w:pPr>
-      <w:hyperlink w:anchor="_Toc243071497" w:history="1">
+      <w:hyperlink w:anchor="_Toc243071996" w:history="1">
         <w:r>
           <w:rPr>
             <w:rStyle w:val="Hyperlink"/>
@@ -4097,7 +4092,7 @@
             <w:noProof/>
             <w:webHidden/>
           </w:rPr>
-          <w:instrText xml:space="preserve"> PAGEREF _Toc243071497 \h </w:instrText>
+          <w:instrText xml:space="preserve"> PAGEREF _Toc243071996 \h </w:instrText>
         </w:r>
         <w:r>
           <w:rPr>
@@ -4117,7 +4112,7 @@
             <w:noProof/>
             <w:webHidden/>
           </w:rPr>
-          <w:t>34</w:t>
+          <w:t>33</w:t>
         </w:r>
         <w:r>
           <w:rPr>
@@ -4144,7 +4139,7 @@
           <w14:ligatures w14:val="standardContextual"/>
         </w:rPr>
       </w:pPr>
-      <w:hyperlink w:anchor="_Toc243071498" w:history="1">
+      <w:hyperlink w:anchor="_Toc243071997" w:history="1">
         <w:r>
           <w:rPr>
             <w:rStyle w:val="Hyperlink"/>
@@ -4171,7 +4166,7 @@
             <w:noProof/>
             <w:webHidden/>
           </w:rPr>
-          <w:instrText xml:space="preserve"> PAGEREF _Toc243071498 \h </w:instrText>
+          <w:instrText xml:space="preserve"> PAGEREF _Toc243071997 \h </w:instrText>
         </w:r>
         <w:r>
           <w:rPr>
@@ -4191,7 +4186,7 @@
             <w:noProof/>
             <w:webHidden/>
           </w:rPr>
-          <w:t>35</w:t>
+          <w:t>34</w:t>
         </w:r>
         <w:r>
           <w:rPr>
@@ -4218,7 +4213,7 @@
           <w14:ligatures w14:val="standardContextual"/>
         </w:rPr>
       </w:pPr>
-      <w:hyperlink w:anchor="_Toc243071499" w:history="1">
+      <w:hyperlink w:anchor="_Toc243071998" w:history="1">
         <w:r>
           <w:rPr>
             <w:rStyle w:val="Hyperlink"/>
@@ -4245,7 +4240,7 @@
             <w:noProof/>
             <w:webHidden/>
           </w:rPr>
-          <w:instrText xml:space="preserve"> PAGEREF _Toc243071499 \h </w:instrText>
+          <w:instrText xml:space="preserve"> PAGEREF _Toc243071998 \h </w:instrText>
         </w:r>
         <w:r>
           <w:rPr>
@@ -4265,7 +4260,7 @@
             <w:noProof/>
             <w:webHidden/>
           </w:rPr>
-          <w:t>37</w:t>
+          <w:t>36</w:t>
         </w:r>
         <w:r>
           <w:rPr>
@@ -4292,7 +4287,7 @@
           <w14:ligatures w14:val="standardContextual"/>
         </w:rPr>
       </w:pPr>
-      <w:hyperlink w:anchor="_Toc243071500" w:history="1">
+      <w:hyperlink w:anchor="_Toc243071999" w:history="1">
         <w:r>
           <w:rPr>
             <w:rStyle w:val="Hyperlink"/>
@@ -4319,7 +4314,7 @@
             <w:noProof/>
             <w:webHidden/>
           </w:rPr>
-          <w:instrText xml:space="preserve"> PAGEREF _Toc243071500 \h </w:instrText>
+          <w:instrText xml:space="preserve"> PAGEREF _Toc243071999 \h </w:instrText>
         </w:r>
         <w:r>
           <w:rPr>
@@ -4339,7 +4334,7 @@
             <w:noProof/>
             <w:webHidden/>
           </w:rPr>
-          <w:t>38</w:t>
+          <w:t>37</w:t>
         </w:r>
         <w:r>
           <w:rPr>
@@ -4366,7 +4361,7 @@
           <w14:ligatures w14:val="standardContextual"/>
         </w:rPr>
       </w:pPr>
-      <w:hyperlink w:anchor="_Toc243071501" w:history="1">
+      <w:hyperlink w:anchor="_Toc243072000" w:history="1">
         <w:r>
           <w:rPr>
             <w:rStyle w:val="Hyperlink"/>
@@ -4393,7 +4388,7 @@
             <w:noProof/>
             <w:webHidden/>
           </w:rPr>
-          <w:instrText xml:space="preserve"> PAGEREF _Toc243071501 \h </w:instrText>
+          <w:instrText xml:space="preserve"> PAGEREF _Toc243072000 \h </w:instrText>
         </w:r>
         <w:r>
           <w:rPr>
@@ -4413,7 +4408,7 @@
             <w:noProof/>
             <w:webHidden/>
           </w:rPr>
-          <w:t>43</w:t>
+          <w:t>42</w:t>
         </w:r>
         <w:r>
           <w:rPr>
@@ -4440,7 +4435,7 @@
           <w14:ligatures w14:val="standardContextual"/>
         </w:rPr>
       </w:pPr>
-      <w:hyperlink w:anchor="_Toc243071502" w:history="1">
+      <w:hyperlink w:anchor="_Toc243072001" w:history="1">
         <w:r>
           <w:rPr>
             <w:rStyle w:val="Hyperlink"/>
@@ -4467,7 +4462,7 @@
             <w:noProof/>
             <w:webHidden/>
           </w:rPr>
-          <w:instrText xml:space="preserve"> PAGEREF _Toc243071502 \h </w:instrText>
+          <w:instrText xml:space="preserve"> PAGEREF _Toc243072001 \h </w:instrText>
         </w:r>
         <w:r>
           <w:rPr>
@@ -4487,7 +4482,7 @@
             <w:noProof/>
             <w:webHidden/>
           </w:rPr>
-          <w:t>44</w:t>
+          <w:t>43</w:t>
         </w:r>
         <w:r>
           <w:rPr>
@@ -4514,7 +4509,7 @@
           <w14:ligatures w14:val="standardContextual"/>
         </w:rPr>
       </w:pPr>
-      <w:hyperlink w:anchor="_Toc243071503" w:history="1">
+      <w:hyperlink w:anchor="_Toc243072002" w:history="1">
         <w:r>
           <w:rPr>
             <w:rStyle w:val="Hyperlink"/>
@@ -4541,7 +4536,7 @@
             <w:noProof/>
             <w:webHidden/>
           </w:rPr>
-          <w:instrText xml:space="preserve"> PAGEREF _Toc243071503 \h </w:instrText>
+          <w:instrText xml:space="preserve"> PAGEREF _Toc243072002 \h </w:instrText>
         </w:r>
         <w:r>
           <w:rPr>
@@ -4561,7 +4556,7 @@
             <w:noProof/>
             <w:webHidden/>
           </w:rPr>
-          <w:t>46</w:t>
+          <w:t>45</w:t>
         </w:r>
         <w:r>
           <w:rPr>
@@ -4588,7 +4583,7 @@
           <w14:ligatures w14:val="standardContextual"/>
         </w:rPr>
       </w:pPr>
-      <w:hyperlink w:anchor="_Toc243071504" w:history="1">
+      <w:hyperlink w:anchor="_Toc243072003" w:history="1">
         <w:r>
           <w:rPr>
             <w:rStyle w:val="Hyperlink"/>
@@ -4615,7 +4610,7 @@
             <w:noProof/>
             <w:webHidden/>
           </w:rPr>
-          <w:instrText xml:space="preserve"> PAGEREF _Toc243071504 \h </w:instrText>
+          <w:instrText xml:space="preserve"> PAGEREF _Toc243072003 \h </w:instrText>
         </w:r>
         <w:r>
           <w:rPr>
@@ -4635,7 +4630,7 @@
             <w:noProof/>
             <w:webHidden/>
           </w:rPr>
-          <w:t>46</w:t>
+          <w:t>45</w:t>
         </w:r>
         <w:r>
           <w:rPr>
@@ -4662,7 +4657,7 @@
           <w14:ligatures w14:val="standardContextual"/>
         </w:rPr>
       </w:pPr>
-      <w:hyperlink w:anchor="_Toc243071505" w:history="1">
+      <w:hyperlink w:anchor="_Toc243072004" w:history="1">
         <w:r>
           <w:rPr>
             <w:rStyle w:val="Hyperlink"/>
@@ -4689,7 +4684,7 @@
             <w:noProof/>
             <w:webHidden/>
           </w:rPr>
-          <w:instrText xml:space="preserve"> PAGEREF _Toc243071505 \h </w:instrText>
+          <w:instrText xml:space="preserve"> PAGEREF _Toc243072004 \h </w:instrText>
         </w:r>
         <w:r>
           <w:rPr>
@@ -4709,7 +4704,7 @@
             <w:noProof/>
             <w:webHidden/>
           </w:rPr>
-          <w:t>47</w:t>
+          <w:t>46</w:t>
         </w:r>
         <w:r>
           <w:rPr>
@@ -4736,7 +4731,7 @@
           <w14:ligatures w14:val="standardContextual"/>
         </w:rPr>
       </w:pPr>
-      <w:hyperlink w:anchor="_Toc243071506" w:history="1">
+      <w:hyperlink w:anchor="_Toc243072005" w:history="1">
         <w:r>
           <w:rPr>
             <w:rStyle w:val="Hyperlink"/>
@@ -4763,7 +4758,7 @@
             <w:noProof/>
             <w:webHidden/>
           </w:rPr>
-          <w:instrText xml:space="preserve"> PAGEREF _Toc243071506 \h </w:instrText>
+          <w:instrText xml:space="preserve"> PAGEREF _Toc243072005 \h </w:instrText>
         </w:r>
         <w:r>
           <w:rPr>
@@ -4783,7 +4778,7 @@
             <w:noProof/>
             <w:webHidden/>
           </w:rPr>
-          <w:t>49</w:t>
+          <w:t>48</w:t>
         </w:r>
         <w:r>
           <w:rPr>
@@ -4810,7 +4805,7 @@
           <w14:ligatures w14:val="standardContextual"/>
         </w:rPr>
       </w:pPr>
-      <w:hyperlink w:anchor="_Toc243071507" w:history="1">
+      <w:hyperlink w:anchor="_Toc243072006" w:history="1">
         <w:r>
           <w:rPr>
             <w:rStyle w:val="Hyperlink"/>
@@ -4837,7 +4832,7 @@
             <w:noProof/>
             <w:webHidden/>
           </w:rPr>
-          <w:instrText xml:space="preserve"> PAGEREF _Toc243071507 \h </w:instrText>
+          <w:instrText xml:space="preserve"> PAGEREF _Toc243072006 \h </w:instrText>
         </w:r>
         <w:r>
           <w:rPr>
@@ -4857,7 +4852,7 @@
             <w:noProof/>
             <w:webHidden/>
           </w:rPr>
-          <w:t>51</w:t>
+          <w:t>50</w:t>
         </w:r>
         <w:r>
           <w:rPr>
@@ -4884,7 +4879,7 @@
           <w14:ligatures w14:val="standardContextual"/>
         </w:rPr>
       </w:pPr>
-      <w:hyperlink w:anchor="_Toc243071508" w:history="1">
+      <w:hyperlink w:anchor="_Toc243072007" w:history="1">
         <w:r>
           <w:rPr>
             <w:rStyle w:val="Hyperlink"/>
@@ -4911,7 +4906,7 @@
             <w:noProof/>
             <w:webHidden/>
           </w:rPr>
-          <w:instrText xml:space="preserve"> PAGEREF _Toc243071508 \h </w:instrText>
+          <w:instrText xml:space="preserve"> PAGEREF _Toc243072007 \h </w:instrText>
         </w:r>
         <w:r>
           <w:rPr>
@@ -4931,7 +4926,7 @@
             <w:noProof/>
             <w:webHidden/>
           </w:rPr>
-          <w:t>51</w:t>
+          <w:t>50</w:t>
         </w:r>
         <w:r>
           <w:rPr>
@@ -4958,7 +4953,7 @@
           <w14:ligatures w14:val="standardContextual"/>
         </w:rPr>
       </w:pPr>
-      <w:hyperlink w:anchor="_Toc243071509" w:history="1">
+      <w:hyperlink w:anchor="_Toc243072008" w:history="1">
         <w:r>
           <w:rPr>
             <w:rStyle w:val="Hyperlink"/>
@@ -4985,7 +4980,7 @@
             <w:noProof/>
             <w:webHidden/>
           </w:rPr>
-          <w:instrText xml:space="preserve"> PAGEREF _Toc243071509 \h </w:instrText>
+          <w:instrText xml:space="preserve"> PAGEREF _Toc243072008 \h </w:instrText>
         </w:r>
         <w:r>
           <w:rPr>
@@ -5005,7 +5000,7 @@
             <w:noProof/>
             <w:webHidden/>
           </w:rPr>
-          <w:t>51</w:t>
+          <w:t>50</w:t>
         </w:r>
         <w:r>
           <w:rPr>
@@ -5032,7 +5027,7 @@
           <w14:ligatures w14:val="standardContextual"/>
         </w:rPr>
       </w:pPr>
-      <w:hyperlink w:anchor="_Toc243071510" w:history="1">
+      <w:hyperlink w:anchor="_Toc243072009" w:history="1">
         <w:r>
           <w:rPr>
             <w:rStyle w:val="Hyperlink"/>
@@ -5059,7 +5054,7 @@
             <w:noProof/>
             <w:webHidden/>
           </w:rPr>
-          <w:instrText xml:space="preserve"> PAGEREF _Toc243071510 \h </w:instrText>
+          <w:instrText xml:space="preserve"> PAGEREF _Toc243072009 \h </w:instrText>
         </w:r>
         <w:r>
           <w:rPr>
@@ -5079,7 +5074,7 @@
             <w:noProof/>
             <w:webHidden/>
           </w:rPr>
-          <w:t>51</w:t>
+          <w:t>50</w:t>
         </w:r>
         <w:r>
           <w:rPr>
@@ -5106,7 +5101,7 @@
           <w14:ligatures w14:val="standardContextual"/>
         </w:rPr>
       </w:pPr>
-      <w:hyperlink w:anchor="_Toc243071511" w:history="1">
+      <w:hyperlink w:anchor="_Toc243072010" w:history="1">
         <w:r>
           <w:rPr>
             <w:rStyle w:val="Hyperlink"/>
@@ -5133,7 +5128,7 @@
             <w:noProof/>
             <w:webHidden/>
           </w:rPr>
-          <w:instrText xml:space="preserve"> PAGEREF _Toc243071511 \h </w:instrText>
+          <w:instrText xml:space="preserve"> PAGEREF _Toc243072010 \h </w:instrText>
         </w:r>
         <w:r>
           <w:rPr>
@@ -5153,7 +5148,7 @@
             <w:noProof/>
             <w:webHidden/>
           </w:rPr>
-          <w:t>52</w:t>
+          <w:t>51</w:t>
         </w:r>
         <w:r>
           <w:rPr>
@@ -5180,7 +5175,7 @@
           <w14:ligatures w14:val="standardContextual"/>
         </w:rPr>
       </w:pPr>
-      <w:hyperlink w:anchor="_Toc243071512" w:history="1">
+      <w:hyperlink w:anchor="_Toc243072011" w:history="1">
         <w:r>
           <w:rPr>
             <w:rStyle w:val="Hyperlink"/>
@@ -5207,7 +5202,7 @@
             <w:noProof/>
             <w:webHidden/>
           </w:rPr>
-          <w:instrText xml:space="preserve"> PAGEREF _Toc243071512 \h </w:instrText>
+          <w:instrText xml:space="preserve"> PAGEREF _Toc243072011 \h </w:instrText>
         </w:r>
         <w:r>
           <w:rPr>
@@ -5227,7 +5222,7 @@
             <w:noProof/>
             <w:webHidden/>
           </w:rPr>
-          <w:t>52</w:t>
+          <w:t>51</w:t>
         </w:r>
         <w:r>
           <w:rPr>
@@ -5254,7 +5249,7 @@
           <w14:ligatures w14:val="standardContextual"/>
         </w:rPr>
       </w:pPr>
-      <w:hyperlink w:anchor="_Toc243071513" w:history="1">
+      <w:hyperlink w:anchor="_Toc243072012" w:history="1">
         <w:r>
           <w:rPr>
             <w:rStyle w:val="Hyperlink"/>
@@ -5281,7 +5276,7 @@
             <w:noProof/>
             <w:webHidden/>
           </w:rPr>
-          <w:instrText xml:space="preserve"> PAGEREF _Toc243071513 \h </w:instrText>
+          <w:instrText xml:space="preserve"> PAGEREF _Toc243072012 \h </w:instrText>
         </w:r>
         <w:r>
           <w:rPr>
@@ -5301,7 +5296,7 @@
             <w:noProof/>
             <w:webHidden/>
           </w:rPr>
-          <w:t>52</w:t>
+          <w:t>51</w:t>
         </w:r>
         <w:r>
           <w:rPr>
@@ -5328,7 +5323,7 @@
           <w14:ligatures w14:val="standardContextual"/>
         </w:rPr>
       </w:pPr>
-      <w:hyperlink w:anchor="_Toc243071514" w:history="1">
+      <w:hyperlink w:anchor="_Toc243072013" w:history="1">
         <w:r>
           <w:rPr>
             <w:rStyle w:val="Hyperlink"/>
@@ -5355,7 +5350,7 @@
             <w:noProof/>
             <w:webHidden/>
           </w:rPr>
-          <w:instrText xml:space="preserve"> PAGEREF _Toc243071514 \h </w:instrText>
+          <w:instrText xml:space="preserve"> PAGEREF _Toc243072013 \h </w:instrText>
         </w:r>
         <w:r>
           <w:rPr>
@@ -5375,7 +5370,7 @@
             <w:noProof/>
             <w:webHidden/>
           </w:rPr>
-          <w:t>53</w:t>
+          <w:t>52</w:t>
         </w:r>
         <w:r>
           <w:rPr>
@@ -5402,7 +5397,7 @@
           <w14:ligatures w14:val="standardContextual"/>
         </w:rPr>
       </w:pPr>
-      <w:hyperlink w:anchor="_Toc243071515" w:history="1">
+      <w:hyperlink w:anchor="_Toc243072014" w:history="1">
         <w:r>
           <w:rPr>
             <w:rStyle w:val="Hyperlink"/>
@@ -5429,7 +5424,7 @@
             <w:noProof/>
             <w:webHidden/>
           </w:rPr>
-          <w:instrText xml:space="preserve"> PAGEREF _Toc243071515 \h </w:instrText>
+          <w:instrText xml:space="preserve"> PAGEREF _Toc243072014 \h </w:instrText>
         </w:r>
         <w:r>
           <w:rPr>
@@ -5449,7 +5444,7 @@
             <w:noProof/>
             <w:webHidden/>
           </w:rPr>
-          <w:t>53</w:t>
+          <w:t>52</w:t>
         </w:r>
         <w:r>
           <w:rPr>
@@ -5476,7 +5471,7 @@
           <w14:ligatures w14:val="standardContextual"/>
         </w:rPr>
       </w:pPr>
-      <w:hyperlink w:anchor="_Toc243071516" w:history="1">
+      <w:hyperlink w:anchor="_Toc243072015" w:history="1">
         <w:r>
           <w:rPr>
             <w:rStyle w:val="Hyperlink"/>
@@ -5503,7 +5498,7 @@
             <w:noProof/>
             <w:webHidden/>
           </w:rPr>
-          <w:instrText xml:space="preserve"> PAGEREF _Toc243071516 \h </w:instrText>
+          <w:instrText xml:space="preserve"> PAGEREF _Toc243072015 \h </w:instrText>
         </w:r>
         <w:r>
           <w:rPr>
@@ -5523,7 +5518,7 @@
             <w:noProof/>
             <w:webHidden/>
           </w:rPr>
-          <w:t>53</w:t>
+          <w:t>52</w:t>
         </w:r>
         <w:r>
           <w:rPr>
@@ -5550,7 +5545,7 @@
           <w14:ligatures w14:val="standardContextual"/>
         </w:rPr>
       </w:pPr>
-      <w:hyperlink w:anchor="_Toc243071517" w:history="1">
+      <w:hyperlink w:anchor="_Toc243072016" w:history="1">
         <w:r>
           <w:rPr>
             <w:rStyle w:val="Hyperlink"/>
@@ -5577,7 +5572,7 @@
             <w:noProof/>
             <w:webHidden/>
           </w:rPr>
-          <w:instrText xml:space="preserve"> PAGEREF _Toc243071517 \h </w:instrText>
+          <w:instrText xml:space="preserve"> PAGEREF _Toc243072016 \h </w:instrText>
         </w:r>
         <w:r>
           <w:rPr>
@@ -5597,7 +5592,7 @@
             <w:noProof/>
             <w:webHidden/>
           </w:rPr>
-          <w:t>53</w:t>
+          <w:t>52</w:t>
         </w:r>
         <w:r>
           <w:rPr>
@@ -5624,7 +5619,7 @@
           <w14:ligatures w14:val="standardContextual"/>
         </w:rPr>
       </w:pPr>
-      <w:hyperlink w:anchor="_Toc243071518" w:history="1">
+      <w:hyperlink w:anchor="_Toc243072017" w:history="1">
         <w:r>
           <w:rPr>
             <w:rStyle w:val="Hyperlink"/>
@@ -5651,7 +5646,7 @@
             <w:noProof/>
             <w:webHidden/>
           </w:rPr>
-          <w:instrText xml:space="preserve"> PAGEREF _Toc243071518 \h </w:instrText>
+          <w:instrText xml:space="preserve"> PAGEREF _Toc243072017 \h </w:instrText>
         </w:r>
         <w:r>
           <w:rPr>
@@ -5671,7 +5666,7 @@
             <w:noProof/>
             <w:webHidden/>
           </w:rPr>
-          <w:t>54</w:t>
+          <w:t>53</w:t>
         </w:r>
         <w:r>
           <w:rPr>
@@ -5698,7 +5693,7 @@
           <w14:ligatures w14:val="standardContextual"/>
         </w:rPr>
       </w:pPr>
-      <w:hyperlink w:anchor="_Toc243071519" w:history="1">
+      <w:hyperlink w:anchor="_Toc243072018" w:history="1">
         <w:r>
           <w:rPr>
             <w:rStyle w:val="Hyperlink"/>
@@ -5725,7 +5720,7 @@
             <w:noProof/>
             <w:webHidden/>
           </w:rPr>
-          <w:instrText xml:space="preserve"> PAGEREF _Toc243071519 \h </w:instrText>
+          <w:instrText xml:space="preserve"> PAGEREF _Toc243072018 \h </w:instrText>
         </w:r>
         <w:r>
           <w:rPr>
@@ -5745,7 +5740,7 @@
             <w:noProof/>
             <w:webHidden/>
           </w:rPr>
-          <w:t>54</w:t>
+          <w:t>53</w:t>
         </w:r>
         <w:r>
           <w:rPr>
@@ -5772,7 +5767,7 @@
           <w14:ligatures w14:val="standardContextual"/>
         </w:rPr>
       </w:pPr>
-      <w:hyperlink w:anchor="_Toc243071520" w:history="1">
+      <w:hyperlink w:anchor="_Toc243072019" w:history="1">
         <w:r>
           <w:rPr>
             <w:rStyle w:val="Hyperlink"/>
@@ -5799,7 +5794,7 @@
             <w:noProof/>
             <w:webHidden/>
           </w:rPr>
-          <w:instrText xml:space="preserve"> PAGEREF _Toc243071520 \h </w:instrText>
+          <w:instrText xml:space="preserve"> PAGEREF _Toc243072019 \h </w:instrText>
         </w:r>
         <w:r>
           <w:rPr>
@@ -5819,7 +5814,7 @@
             <w:noProof/>
             <w:webHidden/>
           </w:rPr>
-          <w:t>54</w:t>
+          <w:t>53</w:t>
         </w:r>
         <w:r>
           <w:rPr>
@@ -5846,7 +5841,7 @@
           <w14:ligatures w14:val="standardContextual"/>
         </w:rPr>
       </w:pPr>
-      <w:hyperlink w:anchor="_Toc243071521" w:history="1">
+      <w:hyperlink w:anchor="_Toc243072020" w:history="1">
         <w:r>
           <w:rPr>
             <w:rStyle w:val="Hyperlink"/>
@@ -5873,7 +5868,7 @@
             <w:noProof/>
             <w:webHidden/>
           </w:rPr>
-          <w:instrText xml:space="preserve"> PAGEREF _Toc243071521 \h </w:instrText>
+          <w:instrText xml:space="preserve"> PAGEREF _Toc243072020 \h </w:instrText>
         </w:r>
         <w:r>
           <w:rPr>
@@ -5893,7 +5888,7 @@
             <w:noProof/>
             <w:webHidden/>
           </w:rPr>
-          <w:t>55</w:t>
+          <w:t>54</w:t>
         </w:r>
         <w:r>
           <w:rPr>
@@ -5920,7 +5915,7 @@
           <w14:ligatures w14:val="standardContextual"/>
         </w:rPr>
       </w:pPr>
-      <w:hyperlink w:anchor="_Toc243071522" w:history="1">
+      <w:hyperlink w:anchor="_Toc243072021" w:history="1">
         <w:r>
           <w:rPr>
             <w:rStyle w:val="Hyperlink"/>
@@ -5947,7 +5942,7 @@
             <w:noProof/>
             <w:webHidden/>
           </w:rPr>
-          <w:instrText xml:space="preserve"> PAGEREF _Toc243071522 \h </w:instrText>
+          <w:instrText xml:space="preserve"> PAGEREF _Toc243072021 \h </w:instrText>
         </w:r>
         <w:r>
           <w:rPr>
@@ -5967,7 +5962,7 @@
             <w:noProof/>
             <w:webHidden/>
           </w:rPr>
-          <w:t>55</w:t>
+          <w:t>54</w:t>
         </w:r>
         <w:r>
           <w:rPr>
@@ -5994,7 +5989,7 @@
           <w14:ligatures w14:val="standardContextual"/>
         </w:rPr>
       </w:pPr>
-      <w:hyperlink w:anchor="_Toc243071523" w:history="1">
+      <w:hyperlink w:anchor="_Toc243072022" w:history="1">
         <w:r>
           <w:rPr>
             <w:rStyle w:val="Hyperlink"/>
@@ -6021,7 +6016,7 @@
             <w:noProof/>
             <w:webHidden/>
           </w:rPr>
-          <w:instrText xml:space="preserve"> PAGEREF _Toc243071523 \h </w:instrText>
+          <w:instrText xml:space="preserve"> PAGEREF _Toc243072022 \h </w:instrText>
         </w:r>
         <w:r>
           <w:rPr>
@@ -6041,7 +6036,7 @@
             <w:noProof/>
             <w:webHidden/>
           </w:rPr>
-          <w:t>55</w:t>
+          <w:t>54</w:t>
         </w:r>
         <w:r>
           <w:rPr>
@@ -6068,7 +6063,7 @@
           <w14:ligatures w14:val="standardContextual"/>
         </w:rPr>
       </w:pPr>
-      <w:hyperlink w:anchor="_Toc243071524" w:history="1">
+      <w:hyperlink w:anchor="_Toc243072023" w:history="1">
         <w:r>
           <w:rPr>
             <w:rStyle w:val="Hyperlink"/>
@@ -6095,7 +6090,81 @@
             <w:noProof/>
             <w:webHidden/>
           </w:rPr>
-          <w:instrText xml:space="preserve"> PAGEREF _Toc243071524 \h </w:instrText>
+          <w:instrText xml:space="preserve"> PAGEREF _Toc243072023 \h </w:instrText>
+        </w:r>
+        <w:r>
+          <w:rPr>
+            <w:noProof/>
+            <w:webHidden/>
+          </w:rPr>
+        </w:r>
+        <w:r>
+          <w:rPr>
+            <w:noProof/>
+            <w:webHidden/>
+          </w:rPr>
+          <w:fldChar w:fldCharType="separate"/>
+        </w:r>
+        <w:r>
+          <w:rPr>
+            <w:noProof/>
+            <w:webHidden/>
+          </w:rPr>
+          <w:t>55</w:t>
+        </w:r>
+        <w:r>
+          <w:rPr>
+            <w:noProof/>
+            <w:webHidden/>
+          </w:rPr>
+          <w:fldChar w:fldCharType="end"/>
+        </w:r>
+      </w:hyperlink>
+    </w:p>
+    <w:p>
+      <w:pPr>
+        <w:pStyle w:val="TOC2"/>
+        <w:tabs>
+          <w:tab w:val="right" w:leader="dot" w:pos="8630"/>
+        </w:tabs>
+        <w:rPr>
+          <w:rFonts w:asciiTheme="minorHAnsi" w:eastAsiaTheme="minorEastAsia" w:hAnsiTheme="minorHAnsi"/>
+          <w:noProof/>
+          <w:color w:val="auto"/>
+          <w:kern w:val="2"/>
+          <w:szCs w:val="24"/>
+          <w:lang w:val="en-IN" w:eastAsia="en-IN"/>
+          <w14:ligatures w14:val="standardContextual"/>
+        </w:rPr>
+      </w:pPr>
+      <w:hyperlink w:anchor="_Toc243072024" w:history="1">
+        <w:r>
+          <w:rPr>
+            <w:rStyle w:val="Hyperlink"/>
+            <w:noProof/>
+          </w:rPr>
+          <w:t>APPENDIX 18  REPRODUCIBILITY CHECKLIST</w:t>
+        </w:r>
+        <w:r>
+          <w:rPr>
+            <w:noProof/>
+            <w:webHidden/>
+          </w:rPr>
+          <w:tab/>
+        </w:r>
+        <w:r>
+          <w:rPr>
+            <w:noProof/>
+            <w:webHidden/>
+          </w:rPr>
+          <w:fldChar w:fldCharType="begin"/>
+        </w:r>
+        <w:r>
+          <w:rPr>
+            <w:noProof/>
+            <w:webHidden/>
+          </w:rPr>
+          <w:instrText xml:space="preserve"> PAGEREF _Toc243072024 \h </w:instrText>
         </w:r>
         <w:r>
           <w:rPr>
@@ -7042,17 +7111,11 @@
       </w:pPr>
     </w:p>
     <w:p>
-      <w:r>
-        <w:lastRenderedPageBreak/>
-        <w:br w:type="page"/>
-      </w:r>
-    </w:p>
-    <w:p>
       <w:pPr>
         <w:pStyle w:val="Heading1"/>
         <w:jc w:val="center"/>
       </w:pPr>
-      <w:bookmarkStart w:id="0" w:name="_Toc243071451"/>
+      <w:bookmarkStart w:id="0" w:name="_Toc243071950"/>
       <w:r>
         <w:rPr>
           <w:rFonts w:ascii="Times New Roman" w:hAnsi="Times New Roman"/>
@@ -7081,7 +7144,7 @@
       <w:pPr>
         <w:pStyle w:val="Heading2"/>
       </w:pPr>
-      <w:bookmarkStart w:id="1" w:name="_Toc243071452"/>
+      <w:bookmarkStart w:id="1" w:name="_Toc243071951"/>
       <w:r>
         <w:rPr>
           <w:rFonts w:ascii="Times New Roman" w:hAnsi="Times New Roman"/>
@@ -7122,18 +7185,18 @@
         <w:jc w:val="both"/>
       </w:pPr>
       <w:r>
-        <w:t xml:space="preserve">This project is concerned with side-channel attacks on embedded cyber-physical devices and with the countermeasures that resist them. It is deliberately constructed as a complete cycle: first the practical extraction of cryptographic keys from a representative device through several independent physical channels, and then the implementation and </w:t>
+        <w:t xml:space="preserve">This project is concerned with side-channel attacks on embedded cyber-physical devices and with the countermeasures that resist them. It is deliberately constructed as a complete cycle: first the practical extraction of cryptographic keys from a representative device </w:t>
       </w:r>
       <w:r>
         <w:lastRenderedPageBreak/>
-        <w:t>quantitative evaluation of the defenses that close those channels. The target chosen is the ESP32-S3 microcontroller, a widely deployed and inexpensive part that is representative of the class of processors found inside modern cyber-physical equipment, and the cryptographic subjects are a modern stream cipher, ChaCha20, and a newly standardised post-quantum key-encapsulation mechanism, CRYSTALS-Kyber.</w:t>
+        <w:t>through several independent physical channels, and then the implementation and quantitative evaluation of the defenses that close those channels. The target chosen is the ESP32-S3 microcontroller, a widely deployed and inexpensive part that is representative of the class of processors found inside modern cyber-physical equipment, and the cryptographic subjects are a modern stream cipher, ChaCha20, and a newly standardised post-quantum key-encapsulation mechanism, CRYSTALS-Kyber.</w:t>
       </w:r>
     </w:p>
     <w:p>
       <w:pPr>
         <w:pStyle w:val="Heading2"/>
       </w:pPr>
-      <w:bookmarkStart w:id="2" w:name="_Toc243071453"/>
+      <w:bookmarkStart w:id="2" w:name="_Toc243071952"/>
       <w:r>
         <w:rPr>
           <w:rFonts w:ascii="Times New Roman" w:hAnsi="Times New Roman"/>
@@ -7169,7 +7232,7 @@
       <w:pPr>
         <w:pStyle w:val="Heading2"/>
       </w:pPr>
-      <w:bookmarkStart w:id="3" w:name="_Toc243071454"/>
+      <w:bookmarkStart w:id="3" w:name="_Toc243071953"/>
       <w:r>
         <w:rPr>
           <w:rFonts w:ascii="Times New Roman" w:hAnsi="Times New Roman"/>
@@ -7186,11 +7249,11 @@
         <w:jc w:val="both"/>
       </w:pPr>
       <w:r>
-        <w:t xml:space="preserve">Side-channel vulnerabilities are especially consequential for cyber-physical systems for two reasons that do not apply with the same force to, say, a cloud server. The first is physical accessibility. The devices are deployed in the field, often in unattended or lightly protected locations, where an adversary can attach a probe to a power line, place a near-field antenna over a package, or connect to a debug header. The second is the nature of </w:t>
+        <w:t>Side-channel vulnerabilities are especially consequential for cyber-physical systems for two reasons that do not apply with the same force to, say, a cloud server. The first is physical accessibility. The devices are deployed in the field, often in unattended or lightly protected locations, where an adversary can attach a probe to a power line, place a near-</w:t>
       </w:r>
       <w:r>
         <w:lastRenderedPageBreak/>
-        <w:t>the payoff. In a conventional information-security breach the prize is data; in a cyber-physical breach the prize is control. A recovered key allows an adversary to forge the very commands that drive actuators, and so to produce physical effects — a contaminated water supply, a de-energised feeder, a damaged machine — that are qualitatively more severe than the disclosure of information.</w:t>
+        <w:t>field antenna over a package, or connect to a debug header. The second is the nature of the payoff. In a conventional information-security breach the prize is data; in a cyber-physical breach the prize is control. A recovered key allows an adversary to forge the very commands that drive actuators, and so to produce physical effects — a contaminated water supply, a de-energised feeder, a damaged machine — that are qualitatively more severe than the disclosure of information.</w:t>
       </w:r>
     </w:p>
     <w:p>
@@ -7209,7 +7272,7 @@
       <w:pPr>
         <w:pStyle w:val="Heading2"/>
       </w:pPr>
-      <w:bookmarkStart w:id="4" w:name="_Toc243071455"/>
+      <w:bookmarkStart w:id="4" w:name="_Toc243071954"/>
       <w:r>
         <w:rPr>
           <w:rFonts w:ascii="Times New Roman" w:hAnsi="Times New Roman"/>
@@ -7233,7 +7296,7 @@
       <w:pPr>
         <w:pStyle w:val="Heading2"/>
       </w:pPr>
-      <w:bookmarkStart w:id="5" w:name="_Toc243071456"/>
+      <w:bookmarkStart w:id="5" w:name="_Toc243071955"/>
       <w:r>
         <w:rPr>
           <w:rFonts w:ascii="Times New Roman" w:hAnsi="Times New Roman"/>
@@ -7268,6 +7331,7 @@
         <w:spacing w:after="60"/>
       </w:pPr>
       <w:r>
+        <w:lastRenderedPageBreak/>
         <w:t>To implement device-resident countermeasures — Boolean masking, constant-time comparison, and nonce-based replay protection — together with an active probing-detection monitor and automatic key refresh.</w:t>
       </w:r>
     </w:p>
@@ -7277,7 +7341,6 @@
         <w:spacing w:after="60"/>
       </w:pPr>
       <w:r>
-        <w:lastRenderedPageBreak/>
         <w:t>To quantify the effectiveness of each countermeasure using Test Vector Leakage Assessment and the number of traces to disclosure, rather than by assertion.</w:t>
       </w:r>
     </w:p>
@@ -7303,7 +7366,7 @@
       <w:pPr>
         <w:pStyle w:val="Heading2"/>
       </w:pPr>
-      <w:bookmarkStart w:id="6" w:name="_Toc243071457"/>
+      <w:bookmarkStart w:id="6" w:name="_Toc243071956"/>
       <w:r>
         <w:rPr>
           <w:rFonts w:ascii="Times New Roman" w:hAnsi="Times New Roman"/>
@@ -7330,7 +7393,7 @@
       <w:pPr>
         <w:pStyle w:val="Heading2"/>
       </w:pPr>
-      <w:bookmarkStart w:id="7" w:name="_Toc243071458"/>
+      <w:bookmarkStart w:id="7" w:name="_Toc243071957"/>
       <w:r>
         <w:rPr>
           <w:rFonts w:ascii="Times New Roman" w:hAnsi="Times New Roman"/>
@@ -7357,13 +7420,14 @@
       <w:pPr>
         <w:pStyle w:val="Heading2"/>
       </w:pPr>
-      <w:bookmarkStart w:id="8" w:name="_Toc243071459"/>
+      <w:bookmarkStart w:id="8" w:name="_Toc243071958"/>
       <w:r>
         <w:rPr>
           <w:rFonts w:ascii="Times New Roman" w:hAnsi="Times New Roman"/>
           <w:color w:val="000000"/>
           <w:sz w:val="28"/>
         </w:rPr>
+        <w:lastRenderedPageBreak/>
         <w:t>1.8  PRINCIPAL CONTRIBUTIONS</w:t>
       </w:r>
       <w:bookmarkEnd w:id="8"/>
@@ -7374,14 +7438,13 @@
         <w:jc w:val="both"/>
       </w:pPr>
       <w:r>
-        <w:t xml:space="preserve">The principal contributions of this project may be stated concisely. It demonstrates, on a single representative device, three fundamentally different side-channel attacks — power, </w:t>
-      </w:r>
-      <w:r>
-        <w:lastRenderedPageBreak/>
-        <w:t>timing, and protocol — against a modern cipher, and extends the power attack to a newly standardised post-quantum scheme, thereby covering in one framework a breadth of attack mechanisms and cryptographic targets usually treated separately. It introduces and validates a leakage-amplification technique that renders power analysis feasible with an inexpensive, low-bandwidth converter, where the established practice assumes a high-bandwidth oscilloscope. It implements the accepted countermeasures within the de</w:t>
-      </w:r>
-      <w:r>
-        <w:t>vice and, crucially, quantifies their effectiveness through Test Vector Leakage Assessment rather than by assertion. It adds an active probing-detection layer, strengthened by an unsupervised machine-learning model, that detects a throttled attacker which the conventional fixed-threshold rules miss. And it enforces throughout a strict separation between an attacker that may only observe and a defender that owns the device, so that every reported result reflects what an adversary could actually achieve.</w:t>
+        <w:t xml:space="preserve">The principal contributions of this project may be stated concisely. It demonstrates, on a single representative device, three fundamentally different side-channel attacks — power, timing, and protocol — against a modern cipher, and extends the power attack to a newly standardised post-quantum scheme, thereby covering in one framework a breadth of attack mechanisms and cryptographic targets usually treated separately. It introduces and validates a leakage-amplification technique that renders power analysis </w:t>
+      </w:r>
+      <w:r>
+        <w:t>feasible with an inexpensive, low-bandwidth converter, where the established practice assumes a high-bandwidth oscilloscope. It implements the accepted countermeasures within the device and, crucially, quantifies their effectiveness through Test Vector Leakage Assessment rather than by assertion. It adds an active probing-detection layer, strengthened by an unsupervised machine-learning model, that detects a throttled attacker which the conventional fixed-threshold rules miss. And it enforces throughout a s</w:t>
+      </w:r>
+      <w:r>
+        <w:t>trict separation between an attacker that may only observe and a defender that owns the device, so that every reported result reflects what an adversary could actually achieve.</w:t>
       </w:r>
     </w:p>
     <w:p>
@@ -7394,7 +7457,7 @@
         <w:pStyle w:val="Heading1"/>
         <w:jc w:val="center"/>
       </w:pPr>
-      <w:bookmarkStart w:id="9" w:name="_Toc243071460"/>
+      <w:bookmarkStart w:id="9" w:name="_Toc243071959"/>
       <w:r>
         <w:rPr>
           <w:rFonts w:ascii="Times New Roman" w:hAnsi="Times New Roman"/>
@@ -7423,7 +7486,7 @@
       <w:pPr>
         <w:pStyle w:val="Heading2"/>
       </w:pPr>
-      <w:bookmarkStart w:id="10" w:name="_Toc243071461"/>
+      <w:bookmarkStart w:id="10" w:name="_Toc243071960"/>
       <w:r>
         <w:rPr>
           <w:rFonts w:ascii="Times New Roman" w:hAnsi="Times New Roman"/>
@@ -7447,7 +7510,7 @@
       <w:pPr>
         <w:pStyle w:val="Heading2"/>
       </w:pPr>
-      <w:bookmarkStart w:id="11" w:name="_Toc243071462"/>
+      <w:bookmarkStart w:id="11" w:name="_Toc243071961"/>
       <w:r>
         <w:rPr>
           <w:rFonts w:ascii="Times New Roman" w:hAnsi="Times New Roman"/>
@@ -7493,7 +7556,7 @@
       <w:pPr>
         <w:pStyle w:val="Heading2"/>
       </w:pPr>
-      <w:bookmarkStart w:id="12" w:name="_Toc243071463"/>
+      <w:bookmarkStart w:id="12" w:name="_Toc243071962"/>
       <w:r>
         <w:rPr>
           <w:rFonts w:ascii="Times New Roman" w:hAnsi="Times New Roman"/>
@@ -7532,7 +7595,7 @@
       <w:pPr>
         <w:pStyle w:val="Heading2"/>
       </w:pPr>
-      <w:bookmarkStart w:id="13" w:name="_Toc243071464"/>
+      <w:bookmarkStart w:id="13" w:name="_Toc243071963"/>
       <w:r>
         <w:rPr>
           <w:rFonts w:ascii="Times New Roman" w:hAnsi="Times New Roman"/>
@@ -7575,7 +7638,7 @@
       <w:pPr>
         <w:pStyle w:val="Heading2"/>
       </w:pPr>
-      <w:bookmarkStart w:id="14" w:name="_Toc243071465"/>
+      <w:bookmarkStart w:id="14" w:name="_Toc243071964"/>
       <w:r>
         <w:rPr>
           <w:rFonts w:ascii="Times New Roman" w:hAnsi="Times New Roman"/>
@@ -7606,7 +7669,7 @@
       <w:pPr>
         <w:pStyle w:val="Heading2"/>
       </w:pPr>
-      <w:bookmarkStart w:id="15" w:name="_Toc243071466"/>
+      <w:bookmarkStart w:id="15" w:name="_Toc243071965"/>
       <w:r>
         <w:rPr>
           <w:rFonts w:ascii="Times New Roman" w:hAnsi="Times New Roman"/>
@@ -7636,7 +7699,7 @@
       <w:pPr>
         <w:pStyle w:val="Heading2"/>
       </w:pPr>
-      <w:bookmarkStart w:id="16" w:name="_Toc243071467"/>
+      <w:bookmarkStart w:id="16" w:name="_Toc243071966"/>
       <w:r>
         <w:rPr>
           <w:rFonts w:ascii="Times New Roman" w:hAnsi="Times New Roman"/>
@@ -7670,7 +7733,7 @@
       <w:pPr>
         <w:pStyle w:val="Heading2"/>
       </w:pPr>
-      <w:bookmarkStart w:id="17" w:name="_Toc243071468"/>
+      <w:bookmarkStart w:id="17" w:name="_Toc243071967"/>
       <w:r>
         <w:rPr>
           <w:rFonts w:ascii="Times New Roman" w:hAnsi="Times New Roman"/>
@@ -7725,7 +7788,7 @@
       <w:pPr>
         <w:pStyle w:val="Heading2"/>
       </w:pPr>
-      <w:bookmarkStart w:id="18" w:name="_Toc243071469"/>
+      <w:bookmarkStart w:id="18" w:name="_Toc243071968"/>
       <w:r>
         <w:rPr>
           <w:rFonts w:ascii="Times New Roman" w:hAnsi="Times New Roman"/>
@@ -7752,7 +7815,7 @@
       <w:pPr>
         <w:pStyle w:val="Heading2"/>
       </w:pPr>
-      <w:bookmarkStart w:id="19" w:name="_Toc243071470"/>
+      <w:bookmarkStart w:id="19" w:name="_Toc243071969"/>
       <w:r>
         <w:rPr>
           <w:rFonts w:ascii="Times New Roman" w:hAnsi="Times New Roman"/>
@@ -7783,7 +7846,7 @@
       <w:pPr>
         <w:pStyle w:val="Heading2"/>
       </w:pPr>
-      <w:bookmarkStart w:id="20" w:name="_Toc243071471"/>
+      <w:bookmarkStart w:id="20" w:name="_Toc243071970"/>
       <w:r>
         <w:rPr>
           <w:rFonts w:ascii="Times New Roman" w:hAnsi="Times New Roman"/>
@@ -7831,7 +7894,7 @@
       <w:pPr>
         <w:pStyle w:val="Heading2"/>
       </w:pPr>
-      <w:bookmarkStart w:id="21" w:name="_Toc243071472"/>
+      <w:bookmarkStart w:id="21" w:name="_Toc243071971"/>
       <w:r>
         <w:rPr>
           <w:rFonts w:ascii="Times New Roman" w:hAnsi="Times New Roman"/>
@@ -7877,7 +7940,7 @@
       <w:pPr>
         <w:pStyle w:val="Heading2"/>
       </w:pPr>
-      <w:bookmarkStart w:id="22" w:name="_Toc243071473"/>
+      <w:bookmarkStart w:id="22" w:name="_Toc243071972"/>
       <w:r>
         <w:rPr>
           <w:rFonts w:ascii="Times New Roman" w:hAnsi="Times New Roman"/>
@@ -8437,7 +8500,7 @@
       <w:pPr>
         <w:pStyle w:val="Heading2"/>
       </w:pPr>
-      <w:bookmarkStart w:id="23" w:name="_Toc243071474"/>
+      <w:bookmarkStart w:id="23" w:name="_Toc243071973"/>
       <w:r>
         <w:rPr>
           <w:rFonts w:ascii="Times New Roman" w:hAnsi="Times New Roman"/>
@@ -8470,7 +8533,7 @@
         <w:pStyle w:val="Heading1"/>
         <w:jc w:val="center"/>
       </w:pPr>
-      <w:bookmarkStart w:id="24" w:name="_Toc243071475"/>
+      <w:bookmarkStart w:id="24" w:name="_Toc243071974"/>
       <w:r>
         <w:rPr>
           <w:rFonts w:ascii="Times New Roman" w:hAnsi="Times New Roman"/>
@@ -8499,7 +8562,7 @@
       <w:pPr>
         <w:pStyle w:val="Heading2"/>
       </w:pPr>
-      <w:bookmarkStart w:id="25" w:name="_Toc243071476"/>
+      <w:bookmarkStart w:id="25" w:name="_Toc243071975"/>
       <w:r>
         <w:rPr>
           <w:rFonts w:ascii="Times New Roman" w:hAnsi="Times New Roman"/>
@@ -8534,7 +8597,7 @@
           <w:noProof/>
         </w:rPr>
         <w:drawing>
-          <wp:inline distT="0" distB="0" distL="0" distR="0" wp14:anchorId="7B52162A" wp14:editId="17295082">
+          <wp:inline distT="0" distB="0" distL="0" distR="0" wp14:anchorId="2C86B6F1" wp14:editId="4725189D">
             <wp:extent cx="5303520" cy="2983230"/>
             <wp:effectExtent l="0" t="0" r="0" b="0"/>
             <wp:docPr id="2" name="Picture 2"/>
@@ -8587,7 +8650,7 @@
       <w:pPr>
         <w:pStyle w:val="Heading2"/>
       </w:pPr>
-      <w:bookmarkStart w:id="26" w:name="_Toc243071477"/>
+      <w:bookmarkStart w:id="26" w:name="_Toc243071976"/>
       <w:r>
         <w:rPr>
           <w:rFonts w:ascii="Times New Roman" w:hAnsi="Times New Roman"/>
@@ -8623,7 +8686,7 @@
           <w:noProof/>
         </w:rPr>
         <w:drawing>
-          <wp:inline distT="0" distB="0" distL="0" distR="0" wp14:anchorId="27023976" wp14:editId="1B631A1E">
+          <wp:inline distT="0" distB="0" distL="0" distR="0" wp14:anchorId="752E0970" wp14:editId="022CF5B1">
             <wp:extent cx="5303520" cy="2262835"/>
             <wp:effectExtent l="0" t="0" r="0" b="0"/>
             <wp:docPr id="3" name="Picture 3"/>
@@ -8713,7 +8776,7 @@
       <w:pPr>
         <w:pStyle w:val="Heading2"/>
       </w:pPr>
-      <w:bookmarkStart w:id="27" w:name="_Toc243071478"/>
+      <w:bookmarkStart w:id="27" w:name="_Toc243071977"/>
       <w:r>
         <w:rPr>
           <w:rFonts w:ascii="Times New Roman" w:hAnsi="Times New Roman"/>
@@ -8759,7 +8822,7 @@
       <w:pPr>
         <w:pStyle w:val="Heading2"/>
       </w:pPr>
-      <w:bookmarkStart w:id="28" w:name="_Toc243071479"/>
+      <w:bookmarkStart w:id="28" w:name="_Toc243071978"/>
       <w:r>
         <w:rPr>
           <w:rFonts w:ascii="Times New Roman" w:hAnsi="Times New Roman"/>
@@ -8807,7 +8870,7 @@
           <w:noProof/>
         </w:rPr>
         <w:drawing>
-          <wp:inline distT="0" distB="0" distL="0" distR="0" wp14:anchorId="43EDB7DB" wp14:editId="11B326ED">
+          <wp:inline distT="0" distB="0" distL="0" distR="0" wp14:anchorId="11DA3F46" wp14:editId="7CBA2E34">
             <wp:extent cx="5303520" cy="2262835"/>
             <wp:effectExtent l="0" t="0" r="0" b="0"/>
             <wp:docPr id="4" name="Picture 4"/>
@@ -9152,7 +9215,7 @@
       <w:pPr>
         <w:pStyle w:val="Heading2"/>
       </w:pPr>
-      <w:bookmarkStart w:id="29" w:name="_Toc243071480"/>
+      <w:bookmarkStart w:id="29" w:name="_Toc243071979"/>
       <w:r>
         <w:rPr>
           <w:rFonts w:ascii="Times New Roman" w:hAnsi="Times New Roman"/>
@@ -9179,7 +9242,7 @@
       <w:pPr>
         <w:pStyle w:val="Heading2"/>
       </w:pPr>
-      <w:bookmarkStart w:id="30" w:name="_Toc243071481"/>
+      <w:bookmarkStart w:id="30" w:name="_Toc243071980"/>
       <w:r>
         <w:rPr>
           <w:rFonts w:ascii="Times New Roman" w:hAnsi="Times New Roman"/>
@@ -9222,7 +9285,7 @@
       <w:pPr>
         <w:pStyle w:val="Heading2"/>
       </w:pPr>
-      <w:bookmarkStart w:id="31" w:name="_Toc243071482"/>
+      <w:bookmarkStart w:id="31" w:name="_Toc243071981"/>
       <w:r>
         <w:rPr>
           <w:rFonts w:ascii="Times New Roman" w:hAnsi="Times New Roman"/>
@@ -9608,7 +9671,7 @@
       <w:pPr>
         <w:pStyle w:val="Heading2"/>
       </w:pPr>
-      <w:bookmarkStart w:id="32" w:name="_Toc243071483"/>
+      <w:bookmarkStart w:id="32" w:name="_Toc243071982"/>
       <w:r>
         <w:rPr>
           <w:rFonts w:ascii="Times New Roman" w:hAnsi="Times New Roman"/>
@@ -9638,7 +9701,7 @@
       <w:pPr>
         <w:pStyle w:val="Heading2"/>
       </w:pPr>
-      <w:bookmarkStart w:id="33" w:name="_Toc243071484"/>
+      <w:bookmarkStart w:id="33" w:name="_Toc243071983"/>
       <w:r>
         <w:rPr>
           <w:rFonts w:ascii="Times New Roman" w:hAnsi="Times New Roman"/>
@@ -9672,7 +9735,7 @@
         <w:pStyle w:val="Heading1"/>
         <w:jc w:val="center"/>
       </w:pPr>
-      <w:bookmarkStart w:id="34" w:name="_Toc243071485"/>
+      <w:bookmarkStart w:id="34" w:name="_Toc243071984"/>
       <w:r>
         <w:rPr>
           <w:rFonts w:ascii="Times New Roman" w:hAnsi="Times New Roman"/>
@@ -9701,7 +9764,7 @@
       <w:pPr>
         <w:pStyle w:val="Heading2"/>
       </w:pPr>
-      <w:bookmarkStart w:id="35" w:name="_Toc243071486"/>
+      <w:bookmarkStart w:id="35" w:name="_Toc243071985"/>
       <w:r>
         <w:rPr>
           <w:rFonts w:ascii="Times New Roman" w:hAnsi="Times New Roman"/>
@@ -9728,7 +9791,7 @@
       <w:pPr>
         <w:pStyle w:val="Heading2"/>
       </w:pPr>
-      <w:bookmarkStart w:id="36" w:name="_Toc243071487"/>
+      <w:bookmarkStart w:id="36" w:name="_Toc243071986"/>
       <w:r>
         <w:rPr>
           <w:rFonts w:ascii="Times New Roman" w:hAnsi="Times New Roman"/>
@@ -10305,7 +10368,7 @@
       <w:pPr>
         <w:pStyle w:val="Heading2"/>
       </w:pPr>
-      <w:bookmarkStart w:id="37" w:name="_Toc243071488"/>
+      <w:bookmarkStart w:id="37" w:name="_Toc243071987"/>
       <w:r>
         <w:rPr>
           <w:rFonts w:ascii="Times New Roman" w:hAnsi="Times New Roman"/>
@@ -10422,7 +10485,7 @@
       <w:pPr>
         <w:pStyle w:val="Heading2"/>
       </w:pPr>
-      <w:bookmarkStart w:id="38" w:name="_Toc243071489"/>
+      <w:bookmarkStart w:id="38" w:name="_Toc243071988"/>
       <w:r>
         <w:rPr>
           <w:rFonts w:ascii="Times New Roman" w:hAnsi="Times New Roman"/>
@@ -10452,7 +10515,7 @@
       <w:pPr>
         <w:pStyle w:val="Heading2"/>
       </w:pPr>
-      <w:bookmarkStart w:id="39" w:name="_Toc243071490"/>
+      <w:bookmarkStart w:id="39" w:name="_Toc243071989"/>
       <w:r>
         <w:rPr>
           <w:rFonts w:ascii="Times New Roman" w:hAnsi="Times New Roman"/>
@@ -10480,7 +10543,7 @@
       <w:pPr>
         <w:pStyle w:val="Heading2"/>
       </w:pPr>
-      <w:bookmarkStart w:id="40" w:name="_Toc243071491"/>
+      <w:bookmarkStart w:id="40" w:name="_Toc243071990"/>
       <w:r>
         <w:rPr>
           <w:rFonts w:ascii="Times New Roman" w:hAnsi="Times New Roman"/>
@@ -10507,7 +10570,7 @@
       <w:pPr>
         <w:pStyle w:val="Heading2"/>
       </w:pPr>
-      <w:bookmarkStart w:id="41" w:name="_Toc243071492"/>
+      <w:bookmarkStart w:id="41" w:name="_Toc243071991"/>
       <w:r>
         <w:rPr>
           <w:rFonts w:ascii="Times New Roman" w:hAnsi="Times New Roman"/>
@@ -10534,7 +10597,7 @@
       <w:pPr>
         <w:pStyle w:val="Heading2"/>
       </w:pPr>
-      <w:bookmarkStart w:id="42" w:name="_Toc243071493"/>
+      <w:bookmarkStart w:id="42" w:name="_Toc243071992"/>
       <w:r>
         <w:rPr>
           <w:rFonts w:ascii="Times New Roman" w:hAnsi="Times New Roman"/>
@@ -10571,7 +10634,7 @@
         <w:pStyle w:val="Heading1"/>
         <w:jc w:val="center"/>
       </w:pPr>
-      <w:bookmarkStart w:id="43" w:name="_Toc243071494"/>
+      <w:bookmarkStart w:id="43" w:name="_Toc243071993"/>
       <w:r>
         <w:rPr>
           <w:rFonts w:ascii="Times New Roman" w:hAnsi="Times New Roman"/>
@@ -10600,7 +10663,7 @@
       <w:pPr>
         <w:pStyle w:val="Heading2"/>
       </w:pPr>
-      <w:bookmarkStart w:id="44" w:name="_Toc243071495"/>
+      <w:bookmarkStart w:id="44" w:name="_Toc243071994"/>
       <w:r>
         <w:rPr>
           <w:rFonts w:ascii="Times New Roman" w:hAnsi="Times New Roman"/>
@@ -10632,7 +10695,7 @@
           <w:noProof/>
         </w:rPr>
         <w:drawing>
-          <wp:inline distT="0" distB="0" distL="0" distR="0" wp14:anchorId="20E907D3" wp14:editId="26DDE632">
+          <wp:inline distT="0" distB="0" distL="0" distR="0" wp14:anchorId="0D8B8691" wp14:editId="3CB61DF3">
             <wp:extent cx="5303520" cy="3374967"/>
             <wp:effectExtent l="0" t="0" r="0" b="0"/>
             <wp:docPr id="5" name="Picture 5"/>
@@ -10900,7 +10963,7 @@
           <w:noProof/>
         </w:rPr>
         <w:drawing>
-          <wp:inline distT="0" distB="0" distL="0" distR="0" wp14:anchorId="29D4DD03" wp14:editId="662F958D">
+          <wp:inline distT="0" distB="0" distL="0" distR="0" wp14:anchorId="31A7D2BD" wp14:editId="0E4C5FE0">
             <wp:extent cx="5303520" cy="2272937"/>
             <wp:effectExtent l="0" t="0" r="0" b="0"/>
             <wp:docPr id="6" name="Picture 6"/>
@@ -11280,7 +11343,7 @@
       <w:pPr>
         <w:pStyle w:val="Heading2"/>
       </w:pPr>
-      <w:bookmarkStart w:id="45" w:name="_Toc243071496"/>
+      <w:bookmarkStart w:id="45" w:name="_Toc243071995"/>
       <w:r>
         <w:rPr>
           <w:rFonts w:ascii="Times New Roman" w:hAnsi="Times New Roman"/>
@@ -11313,7 +11376,7 @@
         </w:rPr>
         <w:lastRenderedPageBreak/>
         <w:drawing>
-          <wp:inline distT="0" distB="0" distL="0" distR="0" wp14:anchorId="4A893DC7" wp14:editId="0E13E94B">
+          <wp:inline distT="0" distB="0" distL="0" distR="0" wp14:anchorId="2306C53B" wp14:editId="55C92C64">
             <wp:extent cx="5303520" cy="2121408"/>
             <wp:effectExtent l="0" t="0" r="0" b="0"/>
             <wp:docPr id="7" name="Picture 7"/>
@@ -11637,7 +11700,7 @@
           <w:noProof/>
         </w:rPr>
         <w:drawing>
-          <wp:inline distT="0" distB="0" distL="0" distR="0" wp14:anchorId="2CE9883C" wp14:editId="161C4329">
+          <wp:inline distT="0" distB="0" distL="0" distR="0" wp14:anchorId="21B8EEDE" wp14:editId="4EB07BC3">
             <wp:extent cx="5303520" cy="2571404"/>
             <wp:effectExtent l="0" t="0" r="0" b="0"/>
             <wp:docPr id="8" name="Picture 8"/>
@@ -11690,7 +11753,7 @@
       <w:pPr>
         <w:pStyle w:val="Heading2"/>
       </w:pPr>
-      <w:bookmarkStart w:id="46" w:name="_Toc243071497"/>
+      <w:bookmarkStart w:id="46" w:name="_Toc243071996"/>
       <w:r>
         <w:rPr>
           <w:rFonts w:ascii="Times New Roman" w:hAnsi="Times New Roman"/>
@@ -11932,7 +11995,7 @@
       <w:pPr>
         <w:pStyle w:val="Heading2"/>
       </w:pPr>
-      <w:bookmarkStart w:id="47" w:name="_Toc243071498"/>
+      <w:bookmarkStart w:id="47" w:name="_Toc243071997"/>
       <w:r>
         <w:rPr>
           <w:rFonts w:ascii="Times New Roman" w:hAnsi="Times New Roman"/>
@@ -11996,7 +12059,7 @@
           <w:noProof/>
         </w:rPr>
         <w:drawing>
-          <wp:inline distT="0" distB="0" distL="0" distR="0" wp14:anchorId="55493BCF" wp14:editId="75884BB6">
+          <wp:inline distT="0" distB="0" distL="0" distR="0" wp14:anchorId="6388BBC2" wp14:editId="0F97EC1A">
             <wp:extent cx="5303520" cy="2121408"/>
             <wp:effectExtent l="0" t="0" r="0" b="0"/>
             <wp:docPr id="9" name="Picture 9"/>
@@ -12049,7 +12112,7 @@
       <w:pPr>
         <w:pStyle w:val="Heading2"/>
       </w:pPr>
-      <w:bookmarkStart w:id="48" w:name="_Toc243071499"/>
+      <w:bookmarkStart w:id="48" w:name="_Toc243071998"/>
       <w:r>
         <w:rPr>
           <w:rFonts w:ascii="Times New Roman" w:hAnsi="Times New Roman"/>
@@ -12082,7 +12145,7 @@
         </w:rPr>
         <w:lastRenderedPageBreak/>
         <w:drawing>
-          <wp:inline distT="0" distB="0" distL="0" distR="0" wp14:anchorId="08CD8B51" wp14:editId="50666230">
+          <wp:inline distT="0" distB="0" distL="0" distR="0" wp14:anchorId="52496721" wp14:editId="650633FA">
             <wp:extent cx="5303520" cy="2424466"/>
             <wp:effectExtent l="0" t="0" r="0" b="0"/>
             <wp:docPr id="10" name="Picture 10"/>
@@ -12332,7 +12395,7 @@
       <w:pPr>
         <w:pStyle w:val="Heading2"/>
       </w:pPr>
-      <w:bookmarkStart w:id="49" w:name="_Toc243071500"/>
+      <w:bookmarkStart w:id="49" w:name="_Toc243071999"/>
       <w:r>
         <w:rPr>
           <w:rFonts w:ascii="Times New Roman" w:hAnsi="Times New Roman"/>
@@ -12377,7 +12440,7 @@
           <w:noProof/>
         </w:rPr>
         <w:drawing>
-          <wp:inline distT="0" distB="0" distL="0" distR="0" wp14:anchorId="02D1BB62" wp14:editId="430E6050">
+          <wp:inline distT="0" distB="0" distL="0" distR="0" wp14:anchorId="3A04F99A" wp14:editId="6BE8657B">
             <wp:extent cx="5303520" cy="1988820"/>
             <wp:effectExtent l="0" t="0" r="0" b="0"/>
             <wp:docPr id="11" name="Picture 11"/>
@@ -12448,7 +12511,7 @@
         </w:rPr>
         <w:lastRenderedPageBreak/>
         <w:drawing>
-          <wp:inline distT="0" distB="0" distL="0" distR="0" wp14:anchorId="1991C25F" wp14:editId="07DA70CF">
+          <wp:inline distT="0" distB="0" distL="0" distR="0" wp14:anchorId="4D8A0609" wp14:editId="431665E7">
             <wp:extent cx="5303520" cy="2495774"/>
             <wp:effectExtent l="0" t="0" r="0" b="0"/>
             <wp:docPr id="12" name="Picture 12"/>
@@ -12518,7 +12581,7 @@
           <w:noProof/>
         </w:rPr>
         <w:drawing>
-          <wp:inline distT="0" distB="0" distL="0" distR="0" wp14:anchorId="622674D0" wp14:editId="785C3191">
+          <wp:inline distT="0" distB="0" distL="0" distR="0" wp14:anchorId="4D503891" wp14:editId="1996F0DD">
             <wp:extent cx="5303520" cy="2272937"/>
             <wp:effectExtent l="0" t="0" r="0" b="0"/>
             <wp:docPr id="13" name="Picture 13"/>
@@ -12601,7 +12664,7 @@
           <w:noProof/>
         </w:rPr>
         <w:drawing>
-          <wp:inline distT="0" distB="0" distL="0" distR="0" wp14:anchorId="03E677FF" wp14:editId="3B962FE7">
+          <wp:inline distT="0" distB="0" distL="0" distR="0" wp14:anchorId="4EA30E20" wp14:editId="6061B22C">
             <wp:extent cx="5303520" cy="2339788"/>
             <wp:effectExtent l="0" t="0" r="0" b="0"/>
             <wp:docPr id="14" name="Picture 14"/>
@@ -12672,7 +12735,7 @@
           <w:noProof/>
         </w:rPr>
         <w:drawing>
-          <wp:inline distT="0" distB="0" distL="0" distR="0" wp14:anchorId="0BB88896" wp14:editId="415CA9E6">
+          <wp:inline distT="0" distB="0" distL="0" distR="0" wp14:anchorId="1EFD25F1" wp14:editId="70A54DDD">
             <wp:extent cx="5303520" cy="1988820"/>
             <wp:effectExtent l="0" t="0" r="0" b="0"/>
             <wp:docPr id="15" name="Picture 15"/>
@@ -13127,7 +13190,7 @@
       <w:pPr>
         <w:pStyle w:val="Heading2"/>
       </w:pPr>
-      <w:bookmarkStart w:id="50" w:name="_Toc243071501"/>
+      <w:bookmarkStart w:id="50" w:name="_Toc243072000"/>
       <w:r>
         <w:rPr>
           <w:rFonts w:ascii="Times New Roman" w:hAnsi="Times New Roman"/>
@@ -13201,7 +13264,7 @@
       <w:pPr>
         <w:pStyle w:val="Heading2"/>
       </w:pPr>
-      <w:bookmarkStart w:id="51" w:name="_Toc243071502"/>
+      <w:bookmarkStart w:id="51" w:name="_Toc243072001"/>
       <w:r>
         <w:rPr>
           <w:rFonts w:ascii="Times New Roman" w:hAnsi="Times New Roman"/>
@@ -13699,7 +13762,7 @@
         <w:pStyle w:val="Heading1"/>
         <w:jc w:val="center"/>
       </w:pPr>
-      <w:bookmarkStart w:id="52" w:name="_Toc243071503"/>
+      <w:bookmarkStart w:id="52" w:name="_Toc243072002"/>
       <w:r>
         <w:rPr>
           <w:rFonts w:ascii="Times New Roman" w:hAnsi="Times New Roman"/>
@@ -13728,7 +13791,7 @@
       <w:pPr>
         <w:pStyle w:val="Heading2"/>
       </w:pPr>
-      <w:bookmarkStart w:id="53" w:name="_Toc243071504"/>
+      <w:bookmarkStart w:id="53" w:name="_Toc243072003"/>
       <w:r>
         <w:rPr>
           <w:rFonts w:ascii="Times New Roman" w:hAnsi="Times New Roman"/>
@@ -13792,7 +13855,7 @@
       <w:pPr>
         <w:pStyle w:val="Heading2"/>
       </w:pPr>
-      <w:bookmarkStart w:id="54" w:name="_Toc243071505"/>
+      <w:bookmarkStart w:id="54" w:name="_Toc243072004"/>
       <w:r>
         <w:rPr>
           <w:rFonts w:ascii="Times New Roman" w:hAnsi="Times New Roman"/>
@@ -13886,7 +13949,7 @@
         <w:pStyle w:val="Heading1"/>
         <w:jc w:val="center"/>
       </w:pPr>
-      <w:bookmarkStart w:id="55" w:name="_Toc243071506"/>
+      <w:bookmarkStart w:id="55" w:name="_Toc243072005"/>
       <w:r>
         <w:rPr>
           <w:rFonts w:ascii="Times New Roman" w:hAnsi="Times New Roman"/>
@@ -14074,7 +14137,7 @@
         <w:pStyle w:val="Heading1"/>
         <w:jc w:val="center"/>
       </w:pPr>
-      <w:bookmarkStart w:id="56" w:name="_Toc243071507"/>
+      <w:bookmarkStart w:id="56" w:name="_Toc243072006"/>
       <w:r>
         <w:rPr>
           <w:rFonts w:ascii="Times New Roman" w:hAnsi="Times New Roman"/>
@@ -14090,7 +14153,7 @@
       <w:pPr>
         <w:pStyle w:val="Heading2"/>
       </w:pPr>
-      <w:bookmarkStart w:id="57" w:name="_Toc243071508"/>
+      <w:bookmarkStart w:id="57" w:name="_Toc243072007"/>
       <w:r>
         <w:rPr>
           <w:rFonts w:ascii="Times New Roman" w:hAnsi="Times New Roman"/>
@@ -14120,7 +14183,7 @@
       <w:pPr>
         <w:pStyle w:val="Heading2"/>
       </w:pPr>
-      <w:bookmarkStart w:id="58" w:name="_Toc243071509"/>
+      <w:bookmarkStart w:id="58" w:name="_Toc243072008"/>
       <w:r>
         <w:rPr>
           <w:rFonts w:ascii="Times New Roman" w:hAnsi="Times New Roman"/>
@@ -14224,7 +14287,7 @@
       <w:pPr>
         <w:pStyle w:val="Heading2"/>
       </w:pPr>
-      <w:bookmarkStart w:id="59" w:name="_Toc243071510"/>
+      <w:bookmarkStart w:id="59" w:name="_Toc243072009"/>
       <w:r>
         <w:rPr>
           <w:rFonts w:ascii="Times New Roman" w:hAnsi="Times New Roman"/>
@@ -14328,7 +14391,7 @@
       <w:pPr>
         <w:pStyle w:val="Heading2"/>
       </w:pPr>
-      <w:bookmarkStart w:id="60" w:name="_Toc243071511"/>
+      <w:bookmarkStart w:id="60" w:name="_Toc243072010"/>
       <w:r>
         <w:rPr>
           <w:rFonts w:ascii="Times New Roman" w:hAnsi="Times New Roman"/>
@@ -14486,7 +14549,7 @@
       <w:pPr>
         <w:pStyle w:val="Heading2"/>
       </w:pPr>
-      <w:bookmarkStart w:id="61" w:name="_Toc243071512"/>
+      <w:bookmarkStart w:id="61" w:name="_Toc243072011"/>
       <w:r>
         <w:rPr>
           <w:rFonts w:ascii="Times New Roman" w:hAnsi="Times New Roman"/>
@@ -14734,7 +14797,7 @@
       <w:pPr>
         <w:pStyle w:val="Heading2"/>
       </w:pPr>
-      <w:bookmarkStart w:id="62" w:name="_Toc243071513"/>
+      <w:bookmarkStart w:id="62" w:name="_Toc243072012"/>
       <w:r>
         <w:rPr>
           <w:rFonts w:ascii="Times New Roman" w:hAnsi="Times New Roman"/>
@@ -14886,7 +14949,7 @@
       <w:pPr>
         <w:pStyle w:val="Heading2"/>
       </w:pPr>
-      <w:bookmarkStart w:id="63" w:name="_Toc243071514"/>
+      <w:bookmarkStart w:id="63" w:name="_Toc243072013"/>
       <w:r>
         <w:rPr>
           <w:rFonts w:ascii="Times New Roman" w:hAnsi="Times New Roman"/>
@@ -15051,7 +15114,7 @@
       <w:pPr>
         <w:pStyle w:val="Heading2"/>
       </w:pPr>
-      <w:bookmarkStart w:id="64" w:name="_Toc243071515"/>
+      <w:bookmarkStart w:id="64" w:name="_Toc243072014"/>
       <w:r>
         <w:rPr>
           <w:rFonts w:ascii="Times New Roman" w:hAnsi="Times New Roman"/>
@@ -15232,7 +15295,7 @@
       <w:pPr>
         <w:pStyle w:val="Heading2"/>
       </w:pPr>
-      <w:bookmarkStart w:id="65" w:name="_Toc243071516"/>
+      <w:bookmarkStart w:id="65" w:name="_Toc243072015"/>
       <w:r>
         <w:rPr>
           <w:rFonts w:ascii="Times New Roman" w:hAnsi="Times New Roman"/>
@@ -15372,7 +15435,7 @@
       <w:pPr>
         <w:pStyle w:val="Heading2"/>
       </w:pPr>
-      <w:bookmarkStart w:id="66" w:name="_Toc243071517"/>
+      <w:bookmarkStart w:id="66" w:name="_Toc243072016"/>
       <w:r>
         <w:rPr>
           <w:rFonts w:ascii="Times New Roman" w:hAnsi="Times New Roman"/>
@@ -15561,7 +15624,7 @@
       <w:pPr>
         <w:pStyle w:val="Heading2"/>
       </w:pPr>
-      <w:bookmarkStart w:id="67" w:name="_Toc243071518"/>
+      <w:bookmarkStart w:id="67" w:name="_Toc243072017"/>
       <w:r>
         <w:rPr>
           <w:rFonts w:ascii="Times New Roman" w:hAnsi="Times New Roman"/>
@@ -15713,7 +15776,7 @@
       <w:pPr>
         <w:pStyle w:val="Heading2"/>
       </w:pPr>
-      <w:bookmarkStart w:id="68" w:name="_Toc243071519"/>
+      <w:bookmarkStart w:id="68" w:name="_Toc243072018"/>
       <w:r>
         <w:rPr>
           <w:rFonts w:ascii="Times New Roman" w:hAnsi="Times New Roman"/>
@@ -15877,7 +15940,7 @@
       <w:pPr>
         <w:pStyle w:val="Heading2"/>
       </w:pPr>
-      <w:bookmarkStart w:id="69" w:name="_Toc243071520"/>
+      <w:bookmarkStart w:id="69" w:name="_Toc243072019"/>
       <w:r>
         <w:rPr>
           <w:rFonts w:ascii="Times New Roman" w:hAnsi="Times New Roman"/>
@@ -16071,7 +16134,7 @@
       <w:pPr>
         <w:pStyle w:val="Heading2"/>
       </w:pPr>
-      <w:bookmarkStart w:id="70" w:name="_Toc243071521"/>
+      <w:bookmarkStart w:id="70" w:name="_Toc243072020"/>
       <w:r>
         <w:rPr>
           <w:rFonts w:ascii="Times New Roman" w:hAnsi="Times New Roman"/>
@@ -16211,7 +16274,7 @@
       <w:pPr>
         <w:pStyle w:val="Heading2"/>
       </w:pPr>
-      <w:bookmarkStart w:id="71" w:name="_Toc243071522"/>
+      <w:bookmarkStart w:id="71" w:name="_Toc243072021"/>
       <w:r>
         <w:rPr>
           <w:rFonts w:ascii="Times New Roman" w:hAnsi="Times New Roman"/>
@@ -16411,7 +16474,7 @@
       <w:pPr>
         <w:pStyle w:val="Heading2"/>
       </w:pPr>
-      <w:bookmarkStart w:id="72" w:name="_Toc243071523"/>
+      <w:bookmarkStart w:id="72" w:name="_Toc243072022"/>
       <w:r>
         <w:rPr>
           <w:rFonts w:ascii="Times New Roman" w:hAnsi="Times New Roman"/>
@@ -16490,7 +16553,7 @@
       <w:pPr>
         <w:pStyle w:val="Heading2"/>
       </w:pPr>
-      <w:bookmarkStart w:id="73" w:name="_Toc243071524"/>
+      <w:bookmarkStart w:id="73" w:name="_Toc243072023"/>
       <w:r>
         <w:rPr>
           <w:rFonts w:ascii="Times New Roman" w:hAnsi="Times New Roman"/>
@@ -16548,6 +16611,76 @@
       </w:pPr>
       <w:r>
         <w:t>Two short scripts accompany the data: one collects and plots the Kyber coefficient CPA, and one archives the raw trace sets. Together with the attacker and defender programs, which accept a hardware flag to drive the real device, they constitute a complete and self-contained record of how each measured result in this report was obtained.</w:t>
+      </w:r>
+    </w:p>
+    <w:p>
+      <w:pPr>
+        <w:pStyle w:val="Heading2"/>
+      </w:pPr>
+      <w:bookmarkStart w:id="74" w:name="_Toc243072024"/>
+      <w:r>
+        <w:rPr>
+          <w:rFonts w:ascii="Times New Roman" w:hAnsi="Times New Roman"/>
+          <w:color w:val="000000"/>
+          <w:sz w:val="28"/>
+        </w:rPr>
+        <w:t>APPENDIX 18  REPRODUCIBILITY CHECKLIST</w:t>
+      </w:r>
+      <w:bookmarkEnd w:id="74"/>
+    </w:p>
+    <w:p>
+      <w:pPr>
+        <w:spacing w:after="160"/>
+        <w:jc w:val="both"/>
+      </w:pPr>
+      <w:r>
+        <w:t>The following checklist states, for each result in the report, how it may be reproduced, so that an examiner or a future student can repeat the work and arrive at the same conclusions. Each item names the command and the expected outcome.</w:t>
+      </w:r>
+    </w:p>
+    <w:p>
+      <w:pPr>
+        <w:spacing w:after="160"/>
+        <w:jc w:val="both"/>
+      </w:pPr>
+      <w:r>
+        <w:t xml:space="preserve">Software-model results, which require no hardware, are reproduced by running the unified demonstration script, which exercises the attacker and defender programs in sequence against the software model and prints, for every step, the exact command a user would type. The expected summary is that all eight modules - the three attacks, the four countermeasures, and the probing monitor - report a passing result, and that the ChaCha20 key and the Kyber coefficient are recovered against the unprotected device and </w:t>
+      </w:r>
+      <w:r>
+        <w:t>fail to be recovered once the relevant countermeasure is enabled.</w:t>
+      </w:r>
+    </w:p>
+    <w:p>
+      <w:pPr>
+        <w:spacing w:after="160"/>
+        <w:jc w:val="both"/>
+      </w:pPr>
+      <w:r>
+        <w:lastRenderedPageBreak/>
+        <w:t>The power-analysis attack on ChaCha20 is reproduced by invoking the attacker's correlation subcommand; against the software model it recovers the key word with a correlation near one half in about a hundred traces, and against the hardware, with the hardware flag set, it recovers the same word with a correlation near one third in a few hundred traces. The leakage assessment is reproduced through the defender's assessment subcommand, which reports the leakage statistic with masking disabled and enabled and t</w:t>
+      </w:r>
+      <w:r>
+        <w:t>he resulting verdict.</w:t>
+      </w:r>
+    </w:p>
+    <w:p>
+      <w:pPr>
+        <w:spacing w:after="160"/>
+        <w:jc w:val="both"/>
+      </w:pPr>
+      <w:r>
+        <w:t>The post-quantum attack is reproduced through the attacker's Kyber subcommand, which recovers the secret coefficient and reports the correlation of the winning candidate and its margin. The timing and replay attacks are reproduced through their respective subcommands; the timing attack succeeds in the software model and, as documented, does not resolve over the serial link on hardware, while the replay attack is accepted without a nonce and blocked once the nonce is enabled. The probing monitor is reproduce</w:t>
+      </w:r>
+      <w:r>
+        <w:t>d through the defender's monitor subcommand, which reports the false-positive rate and the detection latency for the rule-based and machine-learning detectors against an aggressive and a throttled attacker.</w:t>
+      </w:r>
+    </w:p>
+    <w:p>
+      <w:pPr>
+        <w:spacing w:after="160"/>
+        <w:jc w:val="both"/>
+      </w:pPr>
+      <w:r>
+        <w:t>In every case the figures and tables of Chapter 5 are regenerated from the archived data described in Appendix 17, so that the quantitative claims of the report rest on preserved measurements rather than on a single unrepeatable run. This closes the loop between the claims made and the evidence retained, and it is the practice the project recommends for any empirical security evaluation.</w:t>
       </w:r>
     </w:p>
     <w:sectPr>
@@ -16837,31 +16970,31 @@
       </w:rPr>
     </w:lvl>
   </w:abstractNum>
-  <w:num w:numId="1" w16cid:durableId="1054549370">
+  <w:num w:numId="1" w16cid:durableId="191461870">
     <w:abstractNumId w:val="8"/>
   </w:num>
-  <w:num w:numId="2" w16cid:durableId="1396513340">
+  <w:num w:numId="2" w16cid:durableId="619265476">
     <w:abstractNumId w:val="6"/>
   </w:num>
-  <w:num w:numId="3" w16cid:durableId="1694764469">
+  <w:num w:numId="3" w16cid:durableId="1336417171">
     <w:abstractNumId w:val="5"/>
   </w:num>
-  <w:num w:numId="4" w16cid:durableId="1314875942">
+  <w:num w:numId="4" w16cid:durableId="2032994625">
     <w:abstractNumId w:val="4"/>
   </w:num>
-  <w:num w:numId="5" w16cid:durableId="846867014">
+  <w:num w:numId="5" w16cid:durableId="1621716900">
     <w:abstractNumId w:val="7"/>
   </w:num>
-  <w:num w:numId="6" w16cid:durableId="1242178137">
+  <w:num w:numId="6" w16cid:durableId="2042435575">
     <w:abstractNumId w:val="3"/>
   </w:num>
-  <w:num w:numId="7" w16cid:durableId="378475060">
+  <w:num w:numId="7" w16cid:durableId="429669349">
     <w:abstractNumId w:val="2"/>
   </w:num>
-  <w:num w:numId="8" w16cid:durableId="481393149">
+  <w:num w:numId="8" w16cid:durableId="133332749">
     <w:abstractNumId w:val="1"/>
   </w:num>
-  <w:num w:numId="9" w16cid:durableId="991255009">
+  <w:num w:numId="9" w16cid:durableId="1030834409">
     <w:abstractNumId w:val="0"/>
   </w:num>
 </w:numbering>
@@ -28261,7 +28394,7 @@
     <w:autoRedefine/>
     <w:uiPriority w:val="39"/>
     <w:unhideWhenUsed/>
-    <w:rsid w:val="003C5B57"/>
+    <w:rsid w:val="00D37FC5"/>
     <w:pPr>
       <w:spacing w:after="100"/>
     </w:pPr>
@@ -28273,7 +28406,7 @@
     <w:autoRedefine/>
     <w:uiPriority w:val="39"/>
     <w:unhideWhenUsed/>
-    <w:rsid w:val="003C5B57"/>
+    <w:rsid w:val="00D37FC5"/>
     <w:pPr>
       <w:spacing w:after="100"/>
       <w:ind w:left="240"/>
@@ -28284,7 +28417,7 @@
     <w:basedOn w:val="DefaultParagraphFont"/>
     <w:uiPriority w:val="99"/>
     <w:unhideWhenUsed/>
-    <w:rsid w:val="003C5B57"/>
+    <w:rsid w:val="00D37FC5"/>
     <w:rPr>
       <w:color w:val="0000FF" w:themeColor="hyperlink"/>
       <w:u w:val="single"/>

</xml_diff>

<commit_message>
Add report build and verification system
Move the report generator into the repository (report/build/) so it is no
longer stranded outside version control, and add tooling around it:

- build.py: one command to regenerate figures and document, update the table
  of contents, and verify the result
- verify.py: fails on page count out of range, blank pages, non-black text,
  leftover placeholders, or figure/table captions that do not match their
  Lists, with sequential-numbering checks per chapter
- preview.py: render page ranges to PNG for visual review
- _word.py: Word COM helpers that kill stray instances and retry on a lock
- README documenting the generate-then-verify workflow

Un-ignore report/build so the generator is tracked. The document is now
reproducible from source with a single command and checked before it ships.
</commit_message>
<xml_diff>
--- a/report/CyberTrace_Project_Report.docx
+++ b/report/CyberTrace_Project_Report.docx
@@ -11,7 +11,7 @@
           <w:noProof/>
         </w:rPr>
         <w:drawing>
-          <wp:inline distT="0" distB="0" distL="0" distR="0" wp14:anchorId="6F8D068C" wp14:editId="104119C8">
+          <wp:inline distT="0" distB="0" distL="0" distR="0" wp14:anchorId="6A3E61DB" wp14:editId="763D0492">
             <wp:extent cx="2560320" cy="816494"/>
             <wp:effectExtent l="0" t="0" r="0" b="0"/>
             <wp:docPr id="1" name="Picture 1"/>
@@ -661,7 +661,7 @@
       <w:r>
         <w:fldChar w:fldCharType="separate"/>
       </w:r>
-      <w:hyperlink w:anchor="_Toc243071950" w:history="1">
+      <w:hyperlink w:anchor="_Toc243335845" w:history="1">
         <w:r>
           <w:rPr>
             <w:rStyle w:val="Hyperlink"/>
@@ -688,7 +688,7 @@
             <w:noProof/>
             <w:webHidden/>
           </w:rPr>
-          <w:instrText xml:space="preserve"> PAGEREF _Toc243071950 \h </w:instrText>
+          <w:instrText xml:space="preserve"> PAGEREF _Toc243335845 \h </w:instrText>
         </w:r>
         <w:r>
           <w:rPr>
@@ -735,7 +735,7 @@
           <w14:ligatures w14:val="standardContextual"/>
         </w:rPr>
       </w:pPr>
-      <w:hyperlink w:anchor="_Toc243071951" w:history="1">
+      <w:hyperlink w:anchor="_Toc243335846" w:history="1">
         <w:r>
           <w:rPr>
             <w:rStyle w:val="Hyperlink"/>
@@ -762,7 +762,7 @@
             <w:noProof/>
             <w:webHidden/>
           </w:rPr>
-          <w:instrText xml:space="preserve"> PAGEREF _Toc243071951 \h </w:instrText>
+          <w:instrText xml:space="preserve"> PAGEREF _Toc243335846 \h </w:instrText>
         </w:r>
         <w:r>
           <w:rPr>
@@ -809,7 +809,7 @@
           <w14:ligatures w14:val="standardContextual"/>
         </w:rPr>
       </w:pPr>
-      <w:hyperlink w:anchor="_Toc243071952" w:history="1">
+      <w:hyperlink w:anchor="_Toc243335847" w:history="1">
         <w:r>
           <w:rPr>
             <w:rStyle w:val="Hyperlink"/>
@@ -836,7 +836,7 @@
             <w:noProof/>
             <w:webHidden/>
           </w:rPr>
-          <w:instrText xml:space="preserve"> PAGEREF _Toc243071952 \h </w:instrText>
+          <w:instrText xml:space="preserve"> PAGEREF _Toc243335847 \h </w:instrText>
         </w:r>
         <w:r>
           <w:rPr>
@@ -883,7 +883,7 @@
           <w14:ligatures w14:val="standardContextual"/>
         </w:rPr>
       </w:pPr>
-      <w:hyperlink w:anchor="_Toc243071953" w:history="1">
+      <w:hyperlink w:anchor="_Toc243335848" w:history="1">
         <w:r>
           <w:rPr>
             <w:rStyle w:val="Hyperlink"/>
@@ -910,7 +910,7 @@
             <w:noProof/>
             <w:webHidden/>
           </w:rPr>
-          <w:instrText xml:space="preserve"> PAGEREF _Toc243071953 \h </w:instrText>
+          <w:instrText xml:space="preserve"> PAGEREF _Toc243335848 \h </w:instrText>
         </w:r>
         <w:r>
           <w:rPr>
@@ -957,7 +957,7 @@
           <w14:ligatures w14:val="standardContextual"/>
         </w:rPr>
       </w:pPr>
-      <w:hyperlink w:anchor="_Toc243071954" w:history="1">
+      <w:hyperlink w:anchor="_Toc243335849" w:history="1">
         <w:r>
           <w:rPr>
             <w:rStyle w:val="Hyperlink"/>
@@ -984,7 +984,7 @@
             <w:noProof/>
             <w:webHidden/>
           </w:rPr>
-          <w:instrText xml:space="preserve"> PAGEREF _Toc243071954 \h </w:instrText>
+          <w:instrText xml:space="preserve"> PAGEREF _Toc243335849 \h </w:instrText>
         </w:r>
         <w:r>
           <w:rPr>
@@ -1031,7 +1031,7 @@
           <w14:ligatures w14:val="standardContextual"/>
         </w:rPr>
       </w:pPr>
-      <w:hyperlink w:anchor="_Toc243071955" w:history="1">
+      <w:hyperlink w:anchor="_Toc243335850" w:history="1">
         <w:r>
           <w:rPr>
             <w:rStyle w:val="Hyperlink"/>
@@ -1058,7 +1058,7 @@
             <w:noProof/>
             <w:webHidden/>
           </w:rPr>
-          <w:instrText xml:space="preserve"> PAGEREF _Toc243071955 \h </w:instrText>
+          <w:instrText xml:space="preserve"> PAGEREF _Toc243335850 \h </w:instrText>
         </w:r>
         <w:r>
           <w:rPr>
@@ -1105,7 +1105,7 @@
           <w14:ligatures w14:val="standardContextual"/>
         </w:rPr>
       </w:pPr>
-      <w:hyperlink w:anchor="_Toc243071956" w:history="1">
+      <w:hyperlink w:anchor="_Toc243335851" w:history="1">
         <w:r>
           <w:rPr>
             <w:rStyle w:val="Hyperlink"/>
@@ -1132,7 +1132,7 @@
             <w:noProof/>
             <w:webHidden/>
           </w:rPr>
-          <w:instrText xml:space="preserve"> PAGEREF _Toc243071956 \h </w:instrText>
+          <w:instrText xml:space="preserve"> PAGEREF _Toc243335851 \h </w:instrText>
         </w:r>
         <w:r>
           <w:rPr>
@@ -1179,7 +1179,7 @@
           <w14:ligatures w14:val="standardContextual"/>
         </w:rPr>
       </w:pPr>
-      <w:hyperlink w:anchor="_Toc243071957" w:history="1">
+      <w:hyperlink w:anchor="_Toc243335852" w:history="1">
         <w:r>
           <w:rPr>
             <w:rStyle w:val="Hyperlink"/>
@@ -1206,7 +1206,7 @@
             <w:noProof/>
             <w:webHidden/>
           </w:rPr>
-          <w:instrText xml:space="preserve"> PAGEREF _Toc243071957 \h </w:instrText>
+          <w:instrText xml:space="preserve"> PAGEREF _Toc243335852 \h </w:instrText>
         </w:r>
         <w:r>
           <w:rPr>
@@ -1253,7 +1253,7 @@
           <w14:ligatures w14:val="standardContextual"/>
         </w:rPr>
       </w:pPr>
-      <w:hyperlink w:anchor="_Toc243071958" w:history="1">
+      <w:hyperlink w:anchor="_Toc243335853" w:history="1">
         <w:r>
           <w:rPr>
             <w:rStyle w:val="Hyperlink"/>
@@ -1280,7 +1280,7 @@
             <w:noProof/>
             <w:webHidden/>
           </w:rPr>
-          <w:instrText xml:space="preserve"> PAGEREF _Toc243071958 \h </w:instrText>
+          <w:instrText xml:space="preserve"> PAGEREF _Toc243335853 \h </w:instrText>
         </w:r>
         <w:r>
           <w:rPr>
@@ -1327,7 +1327,7 @@
           <w14:ligatures w14:val="standardContextual"/>
         </w:rPr>
       </w:pPr>
-      <w:hyperlink w:anchor="_Toc243071959" w:history="1">
+      <w:hyperlink w:anchor="_Toc243335854" w:history="1">
         <w:r>
           <w:rPr>
             <w:rStyle w:val="Hyperlink"/>
@@ -1354,7 +1354,7 @@
             <w:noProof/>
             <w:webHidden/>
           </w:rPr>
-          <w:instrText xml:space="preserve"> PAGEREF _Toc243071959 \h </w:instrText>
+          <w:instrText xml:space="preserve"> PAGEREF _Toc243335854 \h </w:instrText>
         </w:r>
         <w:r>
           <w:rPr>
@@ -1401,7 +1401,7 @@
           <w14:ligatures w14:val="standardContextual"/>
         </w:rPr>
       </w:pPr>
-      <w:hyperlink w:anchor="_Toc243071960" w:history="1">
+      <w:hyperlink w:anchor="_Toc243335855" w:history="1">
         <w:r>
           <w:rPr>
             <w:rStyle w:val="Hyperlink"/>
@@ -1428,7 +1428,7 @@
             <w:noProof/>
             <w:webHidden/>
           </w:rPr>
-          <w:instrText xml:space="preserve"> PAGEREF _Toc243071960 \h </w:instrText>
+          <w:instrText xml:space="preserve"> PAGEREF _Toc243335855 \h </w:instrText>
         </w:r>
         <w:r>
           <w:rPr>
@@ -1475,7 +1475,7 @@
           <w14:ligatures w14:val="standardContextual"/>
         </w:rPr>
       </w:pPr>
-      <w:hyperlink w:anchor="_Toc243071961" w:history="1">
+      <w:hyperlink w:anchor="_Toc243335856" w:history="1">
         <w:r>
           <w:rPr>
             <w:rStyle w:val="Hyperlink"/>
@@ -1502,7 +1502,7 @@
             <w:noProof/>
             <w:webHidden/>
           </w:rPr>
-          <w:instrText xml:space="preserve"> PAGEREF _Toc243071961 \h </w:instrText>
+          <w:instrText xml:space="preserve"> PAGEREF _Toc243335856 \h </w:instrText>
         </w:r>
         <w:r>
           <w:rPr>
@@ -1549,7 +1549,7 @@
           <w14:ligatures w14:val="standardContextual"/>
         </w:rPr>
       </w:pPr>
-      <w:hyperlink w:anchor="_Toc243071962" w:history="1">
+      <w:hyperlink w:anchor="_Toc243335857" w:history="1">
         <w:r>
           <w:rPr>
             <w:rStyle w:val="Hyperlink"/>
@@ -1576,7 +1576,7 @@
             <w:noProof/>
             <w:webHidden/>
           </w:rPr>
-          <w:instrText xml:space="preserve"> PAGEREF _Toc243071962 \h </w:instrText>
+          <w:instrText xml:space="preserve"> PAGEREF _Toc243335857 \h </w:instrText>
         </w:r>
         <w:r>
           <w:rPr>
@@ -1623,7 +1623,7 @@
           <w14:ligatures w14:val="standardContextual"/>
         </w:rPr>
       </w:pPr>
-      <w:hyperlink w:anchor="_Toc243071963" w:history="1">
+      <w:hyperlink w:anchor="_Toc243335858" w:history="1">
         <w:r>
           <w:rPr>
             <w:rStyle w:val="Hyperlink"/>
@@ -1650,7 +1650,7 @@
             <w:noProof/>
             <w:webHidden/>
           </w:rPr>
-          <w:instrText xml:space="preserve"> PAGEREF _Toc243071963 \h </w:instrText>
+          <w:instrText xml:space="preserve"> PAGEREF _Toc243335858 \h </w:instrText>
         </w:r>
         <w:r>
           <w:rPr>
@@ -1697,7 +1697,7 @@
           <w14:ligatures w14:val="standardContextual"/>
         </w:rPr>
       </w:pPr>
-      <w:hyperlink w:anchor="_Toc243071964" w:history="1">
+      <w:hyperlink w:anchor="_Toc243335859" w:history="1">
         <w:r>
           <w:rPr>
             <w:rStyle w:val="Hyperlink"/>
@@ -1724,7 +1724,7 @@
             <w:noProof/>
             <w:webHidden/>
           </w:rPr>
-          <w:instrText xml:space="preserve"> PAGEREF _Toc243071964 \h </w:instrText>
+          <w:instrText xml:space="preserve"> PAGEREF _Toc243335859 \h </w:instrText>
         </w:r>
         <w:r>
           <w:rPr>
@@ -1771,7 +1771,7 @@
           <w14:ligatures w14:val="standardContextual"/>
         </w:rPr>
       </w:pPr>
-      <w:hyperlink w:anchor="_Toc243071965" w:history="1">
+      <w:hyperlink w:anchor="_Toc243335860" w:history="1">
         <w:r>
           <w:rPr>
             <w:rStyle w:val="Hyperlink"/>
@@ -1798,7 +1798,7 @@
             <w:noProof/>
             <w:webHidden/>
           </w:rPr>
-          <w:instrText xml:space="preserve"> PAGEREF _Toc243071965 \h </w:instrText>
+          <w:instrText xml:space="preserve"> PAGEREF _Toc243335860 \h </w:instrText>
         </w:r>
         <w:r>
           <w:rPr>
@@ -1845,7 +1845,7 @@
           <w14:ligatures w14:val="standardContextual"/>
         </w:rPr>
       </w:pPr>
-      <w:hyperlink w:anchor="_Toc243071966" w:history="1">
+      <w:hyperlink w:anchor="_Toc243335861" w:history="1">
         <w:r>
           <w:rPr>
             <w:rStyle w:val="Hyperlink"/>
@@ -1872,7 +1872,7 @@
             <w:noProof/>
             <w:webHidden/>
           </w:rPr>
-          <w:instrText xml:space="preserve"> PAGEREF _Toc243071966 \h </w:instrText>
+          <w:instrText xml:space="preserve"> PAGEREF _Toc243335861 \h </w:instrText>
         </w:r>
         <w:r>
           <w:rPr>
@@ -1919,7 +1919,7 @@
           <w14:ligatures w14:val="standardContextual"/>
         </w:rPr>
       </w:pPr>
-      <w:hyperlink w:anchor="_Toc243071967" w:history="1">
+      <w:hyperlink w:anchor="_Toc243335862" w:history="1">
         <w:r>
           <w:rPr>
             <w:rStyle w:val="Hyperlink"/>
@@ -1946,7 +1946,7 @@
             <w:noProof/>
             <w:webHidden/>
           </w:rPr>
-          <w:instrText xml:space="preserve"> PAGEREF _Toc243071967 \h </w:instrText>
+          <w:instrText xml:space="preserve"> PAGEREF _Toc243335862 \h </w:instrText>
         </w:r>
         <w:r>
           <w:rPr>
@@ -1993,7 +1993,7 @@
           <w14:ligatures w14:val="standardContextual"/>
         </w:rPr>
       </w:pPr>
-      <w:hyperlink w:anchor="_Toc243071968" w:history="1">
+      <w:hyperlink w:anchor="_Toc243335863" w:history="1">
         <w:r>
           <w:rPr>
             <w:rStyle w:val="Hyperlink"/>
@@ -2020,7 +2020,7 @@
             <w:noProof/>
             <w:webHidden/>
           </w:rPr>
-          <w:instrText xml:space="preserve"> PAGEREF _Toc243071968 \h </w:instrText>
+          <w:instrText xml:space="preserve"> PAGEREF _Toc243335863 \h </w:instrText>
         </w:r>
         <w:r>
           <w:rPr>
@@ -2067,7 +2067,7 @@
           <w14:ligatures w14:val="standardContextual"/>
         </w:rPr>
       </w:pPr>
-      <w:hyperlink w:anchor="_Toc243071969" w:history="1">
+      <w:hyperlink w:anchor="_Toc243335864" w:history="1">
         <w:r>
           <w:rPr>
             <w:rStyle w:val="Hyperlink"/>
@@ -2094,7 +2094,7 @@
             <w:noProof/>
             <w:webHidden/>
           </w:rPr>
-          <w:instrText xml:space="preserve"> PAGEREF _Toc243071969 \h </w:instrText>
+          <w:instrText xml:space="preserve"> PAGEREF _Toc243335864 \h </w:instrText>
         </w:r>
         <w:r>
           <w:rPr>
@@ -2141,7 +2141,7 @@
           <w14:ligatures w14:val="standardContextual"/>
         </w:rPr>
       </w:pPr>
-      <w:hyperlink w:anchor="_Toc243071970" w:history="1">
+      <w:hyperlink w:anchor="_Toc243335865" w:history="1">
         <w:r>
           <w:rPr>
             <w:rStyle w:val="Hyperlink"/>
@@ -2168,7 +2168,7 @@
             <w:noProof/>
             <w:webHidden/>
           </w:rPr>
-          <w:instrText xml:space="preserve"> PAGEREF _Toc243071970 \h </w:instrText>
+          <w:instrText xml:space="preserve"> PAGEREF _Toc243335865 \h </w:instrText>
         </w:r>
         <w:r>
           <w:rPr>
@@ -2215,7 +2215,7 @@
           <w14:ligatures w14:val="standardContextual"/>
         </w:rPr>
       </w:pPr>
-      <w:hyperlink w:anchor="_Toc243071971" w:history="1">
+      <w:hyperlink w:anchor="_Toc243335866" w:history="1">
         <w:r>
           <w:rPr>
             <w:rStyle w:val="Hyperlink"/>
@@ -2242,7 +2242,7 @@
             <w:noProof/>
             <w:webHidden/>
           </w:rPr>
-          <w:instrText xml:space="preserve"> PAGEREF _Toc243071971 \h </w:instrText>
+          <w:instrText xml:space="preserve"> PAGEREF _Toc243335866 \h </w:instrText>
         </w:r>
         <w:r>
           <w:rPr>
@@ -2289,7 +2289,7 @@
           <w14:ligatures w14:val="standardContextual"/>
         </w:rPr>
       </w:pPr>
-      <w:hyperlink w:anchor="_Toc243071972" w:history="1">
+      <w:hyperlink w:anchor="_Toc243335867" w:history="1">
         <w:r>
           <w:rPr>
             <w:rStyle w:val="Hyperlink"/>
@@ -2316,7 +2316,7 @@
             <w:noProof/>
             <w:webHidden/>
           </w:rPr>
-          <w:instrText xml:space="preserve"> PAGEREF _Toc243071972 \h </w:instrText>
+          <w:instrText xml:space="preserve"> PAGEREF _Toc243335867 \h </w:instrText>
         </w:r>
         <w:r>
           <w:rPr>
@@ -2363,7 +2363,7 @@
           <w14:ligatures w14:val="standardContextual"/>
         </w:rPr>
       </w:pPr>
-      <w:hyperlink w:anchor="_Toc243071973" w:history="1">
+      <w:hyperlink w:anchor="_Toc243335868" w:history="1">
         <w:r>
           <w:rPr>
             <w:rStyle w:val="Hyperlink"/>
@@ -2390,7 +2390,7 @@
             <w:noProof/>
             <w:webHidden/>
           </w:rPr>
-          <w:instrText xml:space="preserve"> PAGEREF _Toc243071973 \h </w:instrText>
+          <w:instrText xml:space="preserve"> PAGEREF _Toc243335868 \h </w:instrText>
         </w:r>
         <w:r>
           <w:rPr>
@@ -2437,7 +2437,7 @@
           <w14:ligatures w14:val="standardContextual"/>
         </w:rPr>
       </w:pPr>
-      <w:hyperlink w:anchor="_Toc243071974" w:history="1">
+      <w:hyperlink w:anchor="_Toc243335869" w:history="1">
         <w:r>
           <w:rPr>
             <w:rStyle w:val="Hyperlink"/>
@@ -2464,7 +2464,7 @@
             <w:noProof/>
             <w:webHidden/>
           </w:rPr>
-          <w:instrText xml:space="preserve"> PAGEREF _Toc243071974 \h </w:instrText>
+          <w:instrText xml:space="preserve"> PAGEREF _Toc243335869 \h </w:instrText>
         </w:r>
         <w:r>
           <w:rPr>
@@ -2511,7 +2511,7 @@
           <w14:ligatures w14:val="standardContextual"/>
         </w:rPr>
       </w:pPr>
-      <w:hyperlink w:anchor="_Toc243071975" w:history="1">
+      <w:hyperlink w:anchor="_Toc243335870" w:history="1">
         <w:r>
           <w:rPr>
             <w:rStyle w:val="Hyperlink"/>
@@ -2538,7 +2538,7 @@
             <w:noProof/>
             <w:webHidden/>
           </w:rPr>
-          <w:instrText xml:space="preserve"> PAGEREF _Toc243071975 \h </w:instrText>
+          <w:instrText xml:space="preserve"> PAGEREF _Toc243335870 \h </w:instrText>
         </w:r>
         <w:r>
           <w:rPr>
@@ -2585,7 +2585,7 @@
           <w14:ligatures w14:val="standardContextual"/>
         </w:rPr>
       </w:pPr>
-      <w:hyperlink w:anchor="_Toc243071976" w:history="1">
+      <w:hyperlink w:anchor="_Toc243335871" w:history="1">
         <w:r>
           <w:rPr>
             <w:rStyle w:val="Hyperlink"/>
@@ -2612,7 +2612,7 @@
             <w:noProof/>
             <w:webHidden/>
           </w:rPr>
-          <w:instrText xml:space="preserve"> PAGEREF _Toc243071976 \h </w:instrText>
+          <w:instrText xml:space="preserve"> PAGEREF _Toc243335871 \h </w:instrText>
         </w:r>
         <w:r>
           <w:rPr>
@@ -2659,7 +2659,7 @@
           <w14:ligatures w14:val="standardContextual"/>
         </w:rPr>
       </w:pPr>
-      <w:hyperlink w:anchor="_Toc243071977" w:history="1">
+      <w:hyperlink w:anchor="_Toc243335872" w:history="1">
         <w:r>
           <w:rPr>
             <w:rStyle w:val="Hyperlink"/>
@@ -2686,7 +2686,7 @@
             <w:noProof/>
             <w:webHidden/>
           </w:rPr>
-          <w:instrText xml:space="preserve"> PAGEREF _Toc243071977 \h </w:instrText>
+          <w:instrText xml:space="preserve"> PAGEREF _Toc243335872 \h </w:instrText>
         </w:r>
         <w:r>
           <w:rPr>
@@ -2733,7 +2733,7 @@
           <w14:ligatures w14:val="standardContextual"/>
         </w:rPr>
       </w:pPr>
-      <w:hyperlink w:anchor="_Toc243071978" w:history="1">
+      <w:hyperlink w:anchor="_Toc243335873" w:history="1">
         <w:r>
           <w:rPr>
             <w:rStyle w:val="Hyperlink"/>
@@ -2760,7 +2760,7 @@
             <w:noProof/>
             <w:webHidden/>
           </w:rPr>
-          <w:instrText xml:space="preserve"> PAGEREF _Toc243071978 \h </w:instrText>
+          <w:instrText xml:space="preserve"> PAGEREF _Toc243335873 \h </w:instrText>
         </w:r>
         <w:r>
           <w:rPr>
@@ -2807,7 +2807,7 @@
           <w14:ligatures w14:val="standardContextual"/>
         </w:rPr>
       </w:pPr>
-      <w:hyperlink w:anchor="_Toc243071979" w:history="1">
+      <w:hyperlink w:anchor="_Toc243335874" w:history="1">
         <w:r>
           <w:rPr>
             <w:rStyle w:val="Hyperlink"/>
@@ -2834,7 +2834,7 @@
             <w:noProof/>
             <w:webHidden/>
           </w:rPr>
-          <w:instrText xml:space="preserve"> PAGEREF _Toc243071979 \h </w:instrText>
+          <w:instrText xml:space="preserve"> PAGEREF _Toc243335874 \h </w:instrText>
         </w:r>
         <w:r>
           <w:rPr>
@@ -2881,7 +2881,7 @@
           <w14:ligatures w14:val="standardContextual"/>
         </w:rPr>
       </w:pPr>
-      <w:hyperlink w:anchor="_Toc243071980" w:history="1">
+      <w:hyperlink w:anchor="_Toc243335875" w:history="1">
         <w:r>
           <w:rPr>
             <w:rStyle w:val="Hyperlink"/>
@@ -2908,7 +2908,7 @@
             <w:noProof/>
             <w:webHidden/>
           </w:rPr>
-          <w:instrText xml:space="preserve"> PAGEREF _Toc243071980 \h </w:instrText>
+          <w:instrText xml:space="preserve"> PAGEREF _Toc243335875 \h </w:instrText>
         </w:r>
         <w:r>
           <w:rPr>
@@ -2955,7 +2955,7 @@
           <w14:ligatures w14:val="standardContextual"/>
         </w:rPr>
       </w:pPr>
-      <w:hyperlink w:anchor="_Toc243071981" w:history="1">
+      <w:hyperlink w:anchor="_Toc243335876" w:history="1">
         <w:r>
           <w:rPr>
             <w:rStyle w:val="Hyperlink"/>
@@ -2982,7 +2982,7 @@
             <w:noProof/>
             <w:webHidden/>
           </w:rPr>
-          <w:instrText xml:space="preserve"> PAGEREF _Toc243071981 \h </w:instrText>
+          <w:instrText xml:space="preserve"> PAGEREF _Toc243335876 \h </w:instrText>
         </w:r>
         <w:r>
           <w:rPr>
@@ -3029,7 +3029,7 @@
           <w14:ligatures w14:val="standardContextual"/>
         </w:rPr>
       </w:pPr>
-      <w:hyperlink w:anchor="_Toc243071982" w:history="1">
+      <w:hyperlink w:anchor="_Toc243335877" w:history="1">
         <w:r>
           <w:rPr>
             <w:rStyle w:val="Hyperlink"/>
@@ -3056,7 +3056,7 @@
             <w:noProof/>
             <w:webHidden/>
           </w:rPr>
-          <w:instrText xml:space="preserve"> PAGEREF _Toc243071982 \h </w:instrText>
+          <w:instrText xml:space="preserve"> PAGEREF _Toc243335877 \h </w:instrText>
         </w:r>
         <w:r>
           <w:rPr>
@@ -3103,7 +3103,7 @@
           <w14:ligatures w14:val="standardContextual"/>
         </w:rPr>
       </w:pPr>
-      <w:hyperlink w:anchor="_Toc243071983" w:history="1">
+      <w:hyperlink w:anchor="_Toc243335878" w:history="1">
         <w:r>
           <w:rPr>
             <w:rStyle w:val="Hyperlink"/>
@@ -3130,7 +3130,7 @@
             <w:noProof/>
             <w:webHidden/>
           </w:rPr>
-          <w:instrText xml:space="preserve"> PAGEREF _Toc243071983 \h </w:instrText>
+          <w:instrText xml:space="preserve"> PAGEREF _Toc243335878 \h </w:instrText>
         </w:r>
         <w:r>
           <w:rPr>
@@ -3177,7 +3177,7 @@
           <w14:ligatures w14:val="standardContextual"/>
         </w:rPr>
       </w:pPr>
-      <w:hyperlink w:anchor="_Toc243071984" w:history="1">
+      <w:hyperlink w:anchor="_Toc243335879" w:history="1">
         <w:r>
           <w:rPr>
             <w:rStyle w:val="Hyperlink"/>
@@ -3204,7 +3204,7 @@
             <w:noProof/>
             <w:webHidden/>
           </w:rPr>
-          <w:instrText xml:space="preserve"> PAGEREF _Toc243071984 \h </w:instrText>
+          <w:instrText xml:space="preserve"> PAGEREF _Toc243335879 \h </w:instrText>
         </w:r>
         <w:r>
           <w:rPr>
@@ -3251,7 +3251,7 @@
           <w14:ligatures w14:val="standardContextual"/>
         </w:rPr>
       </w:pPr>
-      <w:hyperlink w:anchor="_Toc243071985" w:history="1">
+      <w:hyperlink w:anchor="_Toc243335880" w:history="1">
         <w:r>
           <w:rPr>
             <w:rStyle w:val="Hyperlink"/>
@@ -3278,7 +3278,7 @@
             <w:noProof/>
             <w:webHidden/>
           </w:rPr>
-          <w:instrText xml:space="preserve"> PAGEREF _Toc243071985 \h </w:instrText>
+          <w:instrText xml:space="preserve"> PAGEREF _Toc243335880 \h </w:instrText>
         </w:r>
         <w:r>
           <w:rPr>
@@ -3325,7 +3325,7 @@
           <w14:ligatures w14:val="standardContextual"/>
         </w:rPr>
       </w:pPr>
-      <w:hyperlink w:anchor="_Toc243071986" w:history="1">
+      <w:hyperlink w:anchor="_Toc243335881" w:history="1">
         <w:r>
           <w:rPr>
             <w:rStyle w:val="Hyperlink"/>
@@ -3352,7 +3352,7 @@
             <w:noProof/>
             <w:webHidden/>
           </w:rPr>
-          <w:instrText xml:space="preserve"> PAGEREF _Toc243071986 \h </w:instrText>
+          <w:instrText xml:space="preserve"> PAGEREF _Toc243335881 \h </w:instrText>
         </w:r>
         <w:r>
           <w:rPr>
@@ -3399,7 +3399,7 @@
           <w14:ligatures w14:val="standardContextual"/>
         </w:rPr>
       </w:pPr>
-      <w:hyperlink w:anchor="_Toc243071987" w:history="1">
+      <w:hyperlink w:anchor="_Toc243335882" w:history="1">
         <w:r>
           <w:rPr>
             <w:rStyle w:val="Hyperlink"/>
@@ -3426,7 +3426,7 @@
             <w:noProof/>
             <w:webHidden/>
           </w:rPr>
-          <w:instrText xml:space="preserve"> PAGEREF _Toc243071987 \h </w:instrText>
+          <w:instrText xml:space="preserve"> PAGEREF _Toc243335882 \h </w:instrText>
         </w:r>
         <w:r>
           <w:rPr>
@@ -3473,7 +3473,7 @@
           <w14:ligatures w14:val="standardContextual"/>
         </w:rPr>
       </w:pPr>
-      <w:hyperlink w:anchor="_Toc243071988" w:history="1">
+      <w:hyperlink w:anchor="_Toc243335883" w:history="1">
         <w:r>
           <w:rPr>
             <w:rStyle w:val="Hyperlink"/>
@@ -3500,7 +3500,7 @@
             <w:noProof/>
             <w:webHidden/>
           </w:rPr>
-          <w:instrText xml:space="preserve"> PAGEREF _Toc243071988 \h </w:instrText>
+          <w:instrText xml:space="preserve"> PAGEREF _Toc243335883 \h </w:instrText>
         </w:r>
         <w:r>
           <w:rPr>
@@ -3547,7 +3547,7 @@
           <w14:ligatures w14:val="standardContextual"/>
         </w:rPr>
       </w:pPr>
-      <w:hyperlink w:anchor="_Toc243071989" w:history="1">
+      <w:hyperlink w:anchor="_Toc243335884" w:history="1">
         <w:r>
           <w:rPr>
             <w:rStyle w:val="Hyperlink"/>
@@ -3574,7 +3574,7 @@
             <w:noProof/>
             <w:webHidden/>
           </w:rPr>
-          <w:instrText xml:space="preserve"> PAGEREF _Toc243071989 \h </w:instrText>
+          <w:instrText xml:space="preserve"> PAGEREF _Toc243335884 \h </w:instrText>
         </w:r>
         <w:r>
           <w:rPr>
@@ -3621,7 +3621,7 @@
           <w14:ligatures w14:val="standardContextual"/>
         </w:rPr>
       </w:pPr>
-      <w:hyperlink w:anchor="_Toc243071990" w:history="1">
+      <w:hyperlink w:anchor="_Toc243335885" w:history="1">
         <w:r>
           <w:rPr>
             <w:rStyle w:val="Hyperlink"/>
@@ -3648,7 +3648,7 @@
             <w:noProof/>
             <w:webHidden/>
           </w:rPr>
-          <w:instrText xml:space="preserve"> PAGEREF _Toc243071990 \h </w:instrText>
+          <w:instrText xml:space="preserve"> PAGEREF _Toc243335885 \h </w:instrText>
         </w:r>
         <w:r>
           <w:rPr>
@@ -3695,7 +3695,7 @@
           <w14:ligatures w14:val="standardContextual"/>
         </w:rPr>
       </w:pPr>
-      <w:hyperlink w:anchor="_Toc243071991" w:history="1">
+      <w:hyperlink w:anchor="_Toc243335886" w:history="1">
         <w:r>
           <w:rPr>
             <w:rStyle w:val="Hyperlink"/>
@@ -3722,7 +3722,7 @@
             <w:noProof/>
             <w:webHidden/>
           </w:rPr>
-          <w:instrText xml:space="preserve"> PAGEREF _Toc243071991 \h </w:instrText>
+          <w:instrText xml:space="preserve"> PAGEREF _Toc243335886 \h </w:instrText>
         </w:r>
         <w:r>
           <w:rPr>
@@ -3769,7 +3769,7 @@
           <w14:ligatures w14:val="standardContextual"/>
         </w:rPr>
       </w:pPr>
-      <w:hyperlink w:anchor="_Toc243071992" w:history="1">
+      <w:hyperlink w:anchor="_Toc243335887" w:history="1">
         <w:r>
           <w:rPr>
             <w:rStyle w:val="Hyperlink"/>
@@ -3796,7 +3796,7 @@
             <w:noProof/>
             <w:webHidden/>
           </w:rPr>
-          <w:instrText xml:space="preserve"> PAGEREF _Toc243071992 \h </w:instrText>
+          <w:instrText xml:space="preserve"> PAGEREF _Toc243335887 \h </w:instrText>
         </w:r>
         <w:r>
           <w:rPr>
@@ -3843,7 +3843,7 @@
           <w14:ligatures w14:val="standardContextual"/>
         </w:rPr>
       </w:pPr>
-      <w:hyperlink w:anchor="_Toc243071993" w:history="1">
+      <w:hyperlink w:anchor="_Toc243335888" w:history="1">
         <w:r>
           <w:rPr>
             <w:rStyle w:val="Hyperlink"/>
@@ -3870,7 +3870,7 @@
             <w:noProof/>
             <w:webHidden/>
           </w:rPr>
-          <w:instrText xml:space="preserve"> PAGEREF _Toc243071993 \h </w:instrText>
+          <w:instrText xml:space="preserve"> PAGEREF _Toc243335888 \h </w:instrText>
         </w:r>
         <w:r>
           <w:rPr>
@@ -3917,7 +3917,7 @@
           <w14:ligatures w14:val="standardContextual"/>
         </w:rPr>
       </w:pPr>
-      <w:hyperlink w:anchor="_Toc243071994" w:history="1">
+      <w:hyperlink w:anchor="_Toc243335889" w:history="1">
         <w:r>
           <w:rPr>
             <w:rStyle w:val="Hyperlink"/>
@@ -3944,7 +3944,7 @@
             <w:noProof/>
             <w:webHidden/>
           </w:rPr>
-          <w:instrText xml:space="preserve"> PAGEREF _Toc243071994 \h </w:instrText>
+          <w:instrText xml:space="preserve"> PAGEREF _Toc243335889 \h </w:instrText>
         </w:r>
         <w:r>
           <w:rPr>
@@ -3991,7 +3991,7 @@
           <w14:ligatures w14:val="standardContextual"/>
         </w:rPr>
       </w:pPr>
-      <w:hyperlink w:anchor="_Toc243071995" w:history="1">
+      <w:hyperlink w:anchor="_Toc243335890" w:history="1">
         <w:r>
           <w:rPr>
             <w:rStyle w:val="Hyperlink"/>
@@ -4018,7 +4018,7 @@
             <w:noProof/>
             <w:webHidden/>
           </w:rPr>
-          <w:instrText xml:space="preserve"> PAGEREF _Toc243071995 \h </w:instrText>
+          <w:instrText xml:space="preserve"> PAGEREF _Toc243335890 \h </w:instrText>
         </w:r>
         <w:r>
           <w:rPr>
@@ -4065,7 +4065,7 @@
           <w14:ligatures w14:val="standardContextual"/>
         </w:rPr>
       </w:pPr>
-      <w:hyperlink w:anchor="_Toc243071996" w:history="1">
+      <w:hyperlink w:anchor="_Toc243335891" w:history="1">
         <w:r>
           <w:rPr>
             <w:rStyle w:val="Hyperlink"/>
@@ -4092,7 +4092,7 @@
             <w:noProof/>
             <w:webHidden/>
           </w:rPr>
-          <w:instrText xml:space="preserve"> PAGEREF _Toc243071996 \h </w:instrText>
+          <w:instrText xml:space="preserve"> PAGEREF _Toc243335891 \h </w:instrText>
         </w:r>
         <w:r>
           <w:rPr>
@@ -4139,7 +4139,7 @@
           <w14:ligatures w14:val="standardContextual"/>
         </w:rPr>
       </w:pPr>
-      <w:hyperlink w:anchor="_Toc243071997" w:history="1">
+      <w:hyperlink w:anchor="_Toc243335892" w:history="1">
         <w:r>
           <w:rPr>
             <w:rStyle w:val="Hyperlink"/>
@@ -4166,7 +4166,7 @@
             <w:noProof/>
             <w:webHidden/>
           </w:rPr>
-          <w:instrText xml:space="preserve"> PAGEREF _Toc243071997 \h </w:instrText>
+          <w:instrText xml:space="preserve"> PAGEREF _Toc243335892 \h </w:instrText>
         </w:r>
         <w:r>
           <w:rPr>
@@ -4213,7 +4213,7 @@
           <w14:ligatures w14:val="standardContextual"/>
         </w:rPr>
       </w:pPr>
-      <w:hyperlink w:anchor="_Toc243071998" w:history="1">
+      <w:hyperlink w:anchor="_Toc243335893" w:history="1">
         <w:r>
           <w:rPr>
             <w:rStyle w:val="Hyperlink"/>
@@ -4240,7 +4240,7 @@
             <w:noProof/>
             <w:webHidden/>
           </w:rPr>
-          <w:instrText xml:space="preserve"> PAGEREF _Toc243071998 \h </w:instrText>
+          <w:instrText xml:space="preserve"> PAGEREF _Toc243335893 \h </w:instrText>
         </w:r>
         <w:r>
           <w:rPr>
@@ -4287,7 +4287,7 @@
           <w14:ligatures w14:val="standardContextual"/>
         </w:rPr>
       </w:pPr>
-      <w:hyperlink w:anchor="_Toc243071999" w:history="1">
+      <w:hyperlink w:anchor="_Toc243335894" w:history="1">
         <w:r>
           <w:rPr>
             <w:rStyle w:val="Hyperlink"/>
@@ -4314,7 +4314,7 @@
             <w:noProof/>
             <w:webHidden/>
           </w:rPr>
-          <w:instrText xml:space="preserve"> PAGEREF _Toc243071999 \h </w:instrText>
+          <w:instrText xml:space="preserve"> PAGEREF _Toc243335894 \h </w:instrText>
         </w:r>
         <w:r>
           <w:rPr>
@@ -4361,7 +4361,7 @@
           <w14:ligatures w14:val="standardContextual"/>
         </w:rPr>
       </w:pPr>
-      <w:hyperlink w:anchor="_Toc243072000" w:history="1">
+      <w:hyperlink w:anchor="_Toc243335895" w:history="1">
         <w:r>
           <w:rPr>
             <w:rStyle w:val="Hyperlink"/>
@@ -4388,7 +4388,7 @@
             <w:noProof/>
             <w:webHidden/>
           </w:rPr>
-          <w:instrText xml:space="preserve"> PAGEREF _Toc243072000 \h </w:instrText>
+          <w:instrText xml:space="preserve"> PAGEREF _Toc243335895 \h </w:instrText>
         </w:r>
         <w:r>
           <w:rPr>
@@ -4435,7 +4435,7 @@
           <w14:ligatures w14:val="standardContextual"/>
         </w:rPr>
       </w:pPr>
-      <w:hyperlink w:anchor="_Toc243072001" w:history="1">
+      <w:hyperlink w:anchor="_Toc243335896" w:history="1">
         <w:r>
           <w:rPr>
             <w:rStyle w:val="Hyperlink"/>
@@ -4462,7 +4462,7 @@
             <w:noProof/>
             <w:webHidden/>
           </w:rPr>
-          <w:instrText xml:space="preserve"> PAGEREF _Toc243072001 \h </w:instrText>
+          <w:instrText xml:space="preserve"> PAGEREF _Toc243335896 \h </w:instrText>
         </w:r>
         <w:r>
           <w:rPr>
@@ -4509,7 +4509,7 @@
           <w14:ligatures w14:val="standardContextual"/>
         </w:rPr>
       </w:pPr>
-      <w:hyperlink w:anchor="_Toc243072002" w:history="1">
+      <w:hyperlink w:anchor="_Toc243335897" w:history="1">
         <w:r>
           <w:rPr>
             <w:rStyle w:val="Hyperlink"/>
@@ -4536,7 +4536,7 @@
             <w:noProof/>
             <w:webHidden/>
           </w:rPr>
-          <w:instrText xml:space="preserve"> PAGEREF _Toc243072002 \h </w:instrText>
+          <w:instrText xml:space="preserve"> PAGEREF _Toc243335897 \h </w:instrText>
         </w:r>
         <w:r>
           <w:rPr>
@@ -4583,7 +4583,7 @@
           <w14:ligatures w14:val="standardContextual"/>
         </w:rPr>
       </w:pPr>
-      <w:hyperlink w:anchor="_Toc243072003" w:history="1">
+      <w:hyperlink w:anchor="_Toc243335898" w:history="1">
         <w:r>
           <w:rPr>
             <w:rStyle w:val="Hyperlink"/>
@@ -4610,7 +4610,7 @@
             <w:noProof/>
             <w:webHidden/>
           </w:rPr>
-          <w:instrText xml:space="preserve"> PAGEREF _Toc243072003 \h </w:instrText>
+          <w:instrText xml:space="preserve"> PAGEREF _Toc243335898 \h </w:instrText>
         </w:r>
         <w:r>
           <w:rPr>
@@ -4657,7 +4657,7 @@
           <w14:ligatures w14:val="standardContextual"/>
         </w:rPr>
       </w:pPr>
-      <w:hyperlink w:anchor="_Toc243072004" w:history="1">
+      <w:hyperlink w:anchor="_Toc243335899" w:history="1">
         <w:r>
           <w:rPr>
             <w:rStyle w:val="Hyperlink"/>
@@ -4684,7 +4684,7 @@
             <w:noProof/>
             <w:webHidden/>
           </w:rPr>
-          <w:instrText xml:space="preserve"> PAGEREF _Toc243072004 \h </w:instrText>
+          <w:instrText xml:space="preserve"> PAGEREF _Toc243335899 \h </w:instrText>
         </w:r>
         <w:r>
           <w:rPr>
@@ -4731,7 +4731,7 @@
           <w14:ligatures w14:val="standardContextual"/>
         </w:rPr>
       </w:pPr>
-      <w:hyperlink w:anchor="_Toc243072005" w:history="1">
+      <w:hyperlink w:anchor="_Toc243335900" w:history="1">
         <w:r>
           <w:rPr>
             <w:rStyle w:val="Hyperlink"/>
@@ -4758,7 +4758,7 @@
             <w:noProof/>
             <w:webHidden/>
           </w:rPr>
-          <w:instrText xml:space="preserve"> PAGEREF _Toc243072005 \h </w:instrText>
+          <w:instrText xml:space="preserve"> PAGEREF _Toc243335900 \h </w:instrText>
         </w:r>
         <w:r>
           <w:rPr>
@@ -4805,7 +4805,7 @@
           <w14:ligatures w14:val="standardContextual"/>
         </w:rPr>
       </w:pPr>
-      <w:hyperlink w:anchor="_Toc243072006" w:history="1">
+      <w:hyperlink w:anchor="_Toc243335901" w:history="1">
         <w:r>
           <w:rPr>
             <w:rStyle w:val="Hyperlink"/>
@@ -4832,7 +4832,7 @@
             <w:noProof/>
             <w:webHidden/>
           </w:rPr>
-          <w:instrText xml:space="preserve"> PAGEREF _Toc243072006 \h </w:instrText>
+          <w:instrText xml:space="preserve"> PAGEREF _Toc243335901 \h </w:instrText>
         </w:r>
         <w:r>
           <w:rPr>
@@ -4879,7 +4879,7 @@
           <w14:ligatures w14:val="standardContextual"/>
         </w:rPr>
       </w:pPr>
-      <w:hyperlink w:anchor="_Toc243072007" w:history="1">
+      <w:hyperlink w:anchor="_Toc243335902" w:history="1">
         <w:r>
           <w:rPr>
             <w:rStyle w:val="Hyperlink"/>
@@ -4906,7 +4906,7 @@
             <w:noProof/>
             <w:webHidden/>
           </w:rPr>
-          <w:instrText xml:space="preserve"> PAGEREF _Toc243072007 \h </w:instrText>
+          <w:instrText xml:space="preserve"> PAGEREF _Toc243335902 \h </w:instrText>
         </w:r>
         <w:r>
           <w:rPr>
@@ -4953,7 +4953,7 @@
           <w14:ligatures w14:val="standardContextual"/>
         </w:rPr>
       </w:pPr>
-      <w:hyperlink w:anchor="_Toc243072008" w:history="1">
+      <w:hyperlink w:anchor="_Toc243335903" w:history="1">
         <w:r>
           <w:rPr>
             <w:rStyle w:val="Hyperlink"/>
@@ -4980,7 +4980,7 @@
             <w:noProof/>
             <w:webHidden/>
           </w:rPr>
-          <w:instrText xml:space="preserve"> PAGEREF _Toc243072008 \h </w:instrText>
+          <w:instrText xml:space="preserve"> PAGEREF _Toc243335903 \h </w:instrText>
         </w:r>
         <w:r>
           <w:rPr>
@@ -5027,7 +5027,7 @@
           <w14:ligatures w14:val="standardContextual"/>
         </w:rPr>
       </w:pPr>
-      <w:hyperlink w:anchor="_Toc243072009" w:history="1">
+      <w:hyperlink w:anchor="_Toc243335904" w:history="1">
         <w:r>
           <w:rPr>
             <w:rStyle w:val="Hyperlink"/>
@@ -5054,7 +5054,7 @@
             <w:noProof/>
             <w:webHidden/>
           </w:rPr>
-          <w:instrText xml:space="preserve"> PAGEREF _Toc243072009 \h </w:instrText>
+          <w:instrText xml:space="preserve"> PAGEREF _Toc243335904 \h </w:instrText>
         </w:r>
         <w:r>
           <w:rPr>
@@ -5101,7 +5101,7 @@
           <w14:ligatures w14:val="standardContextual"/>
         </w:rPr>
       </w:pPr>
-      <w:hyperlink w:anchor="_Toc243072010" w:history="1">
+      <w:hyperlink w:anchor="_Toc243335905" w:history="1">
         <w:r>
           <w:rPr>
             <w:rStyle w:val="Hyperlink"/>
@@ -5128,7 +5128,7 @@
             <w:noProof/>
             <w:webHidden/>
           </w:rPr>
-          <w:instrText xml:space="preserve"> PAGEREF _Toc243072010 \h </w:instrText>
+          <w:instrText xml:space="preserve"> PAGEREF _Toc243335905 \h </w:instrText>
         </w:r>
         <w:r>
           <w:rPr>
@@ -5175,7 +5175,7 @@
           <w14:ligatures w14:val="standardContextual"/>
         </w:rPr>
       </w:pPr>
-      <w:hyperlink w:anchor="_Toc243072011" w:history="1">
+      <w:hyperlink w:anchor="_Toc243335906" w:history="1">
         <w:r>
           <w:rPr>
             <w:rStyle w:val="Hyperlink"/>
@@ -5202,7 +5202,7 @@
             <w:noProof/>
             <w:webHidden/>
           </w:rPr>
-          <w:instrText xml:space="preserve"> PAGEREF _Toc243072011 \h </w:instrText>
+          <w:instrText xml:space="preserve"> PAGEREF _Toc243335906 \h </w:instrText>
         </w:r>
         <w:r>
           <w:rPr>
@@ -5249,7 +5249,7 @@
           <w14:ligatures w14:val="standardContextual"/>
         </w:rPr>
       </w:pPr>
-      <w:hyperlink w:anchor="_Toc243072012" w:history="1">
+      <w:hyperlink w:anchor="_Toc243335907" w:history="1">
         <w:r>
           <w:rPr>
             <w:rStyle w:val="Hyperlink"/>
@@ -5276,7 +5276,7 @@
             <w:noProof/>
             <w:webHidden/>
           </w:rPr>
-          <w:instrText xml:space="preserve"> PAGEREF _Toc243072012 \h </w:instrText>
+          <w:instrText xml:space="preserve"> PAGEREF _Toc243335907 \h </w:instrText>
         </w:r>
         <w:r>
           <w:rPr>
@@ -5323,7 +5323,7 @@
           <w14:ligatures w14:val="standardContextual"/>
         </w:rPr>
       </w:pPr>
-      <w:hyperlink w:anchor="_Toc243072013" w:history="1">
+      <w:hyperlink w:anchor="_Toc243335908" w:history="1">
         <w:r>
           <w:rPr>
             <w:rStyle w:val="Hyperlink"/>
@@ -5350,7 +5350,7 @@
             <w:noProof/>
             <w:webHidden/>
           </w:rPr>
-          <w:instrText xml:space="preserve"> PAGEREF _Toc243072013 \h </w:instrText>
+          <w:instrText xml:space="preserve"> PAGEREF _Toc243335908 \h </w:instrText>
         </w:r>
         <w:r>
           <w:rPr>
@@ -5397,7 +5397,7 @@
           <w14:ligatures w14:val="standardContextual"/>
         </w:rPr>
       </w:pPr>
-      <w:hyperlink w:anchor="_Toc243072014" w:history="1">
+      <w:hyperlink w:anchor="_Toc243335909" w:history="1">
         <w:r>
           <w:rPr>
             <w:rStyle w:val="Hyperlink"/>
@@ -5424,7 +5424,7 @@
             <w:noProof/>
             <w:webHidden/>
           </w:rPr>
-          <w:instrText xml:space="preserve"> PAGEREF _Toc243072014 \h </w:instrText>
+          <w:instrText xml:space="preserve"> PAGEREF _Toc243335909 \h </w:instrText>
         </w:r>
         <w:r>
           <w:rPr>
@@ -5471,7 +5471,7 @@
           <w14:ligatures w14:val="standardContextual"/>
         </w:rPr>
       </w:pPr>
-      <w:hyperlink w:anchor="_Toc243072015" w:history="1">
+      <w:hyperlink w:anchor="_Toc243335910" w:history="1">
         <w:r>
           <w:rPr>
             <w:rStyle w:val="Hyperlink"/>
@@ -5498,7 +5498,7 @@
             <w:noProof/>
             <w:webHidden/>
           </w:rPr>
-          <w:instrText xml:space="preserve"> PAGEREF _Toc243072015 \h </w:instrText>
+          <w:instrText xml:space="preserve"> PAGEREF _Toc243335910 \h </w:instrText>
         </w:r>
         <w:r>
           <w:rPr>
@@ -5545,7 +5545,7 @@
           <w14:ligatures w14:val="standardContextual"/>
         </w:rPr>
       </w:pPr>
-      <w:hyperlink w:anchor="_Toc243072016" w:history="1">
+      <w:hyperlink w:anchor="_Toc243335911" w:history="1">
         <w:r>
           <w:rPr>
             <w:rStyle w:val="Hyperlink"/>
@@ -5572,7 +5572,7 @@
             <w:noProof/>
             <w:webHidden/>
           </w:rPr>
-          <w:instrText xml:space="preserve"> PAGEREF _Toc243072016 \h </w:instrText>
+          <w:instrText xml:space="preserve"> PAGEREF _Toc243335911 \h </w:instrText>
         </w:r>
         <w:r>
           <w:rPr>
@@ -5619,7 +5619,7 @@
           <w14:ligatures w14:val="standardContextual"/>
         </w:rPr>
       </w:pPr>
-      <w:hyperlink w:anchor="_Toc243072017" w:history="1">
+      <w:hyperlink w:anchor="_Toc243335912" w:history="1">
         <w:r>
           <w:rPr>
             <w:rStyle w:val="Hyperlink"/>
@@ -5646,7 +5646,7 @@
             <w:noProof/>
             <w:webHidden/>
           </w:rPr>
-          <w:instrText xml:space="preserve"> PAGEREF _Toc243072017 \h </w:instrText>
+          <w:instrText xml:space="preserve"> PAGEREF _Toc243335912 \h </w:instrText>
         </w:r>
         <w:r>
           <w:rPr>
@@ -5693,7 +5693,7 @@
           <w14:ligatures w14:val="standardContextual"/>
         </w:rPr>
       </w:pPr>
-      <w:hyperlink w:anchor="_Toc243072018" w:history="1">
+      <w:hyperlink w:anchor="_Toc243335913" w:history="1">
         <w:r>
           <w:rPr>
             <w:rStyle w:val="Hyperlink"/>
@@ -5720,7 +5720,7 @@
             <w:noProof/>
             <w:webHidden/>
           </w:rPr>
-          <w:instrText xml:space="preserve"> PAGEREF _Toc243072018 \h </w:instrText>
+          <w:instrText xml:space="preserve"> PAGEREF _Toc243335913 \h </w:instrText>
         </w:r>
         <w:r>
           <w:rPr>
@@ -5767,7 +5767,7 @@
           <w14:ligatures w14:val="standardContextual"/>
         </w:rPr>
       </w:pPr>
-      <w:hyperlink w:anchor="_Toc243072019" w:history="1">
+      <w:hyperlink w:anchor="_Toc243335914" w:history="1">
         <w:r>
           <w:rPr>
             <w:rStyle w:val="Hyperlink"/>
@@ -5794,7 +5794,7 @@
             <w:noProof/>
             <w:webHidden/>
           </w:rPr>
-          <w:instrText xml:space="preserve"> PAGEREF _Toc243072019 \h </w:instrText>
+          <w:instrText xml:space="preserve"> PAGEREF _Toc243335914 \h </w:instrText>
         </w:r>
         <w:r>
           <w:rPr>
@@ -5841,7 +5841,7 @@
           <w14:ligatures w14:val="standardContextual"/>
         </w:rPr>
       </w:pPr>
-      <w:hyperlink w:anchor="_Toc243072020" w:history="1">
+      <w:hyperlink w:anchor="_Toc243335915" w:history="1">
         <w:r>
           <w:rPr>
             <w:rStyle w:val="Hyperlink"/>
@@ -5868,7 +5868,7 @@
             <w:noProof/>
             <w:webHidden/>
           </w:rPr>
-          <w:instrText xml:space="preserve"> PAGEREF _Toc243072020 \h </w:instrText>
+          <w:instrText xml:space="preserve"> PAGEREF _Toc243335915 \h </w:instrText>
         </w:r>
         <w:r>
           <w:rPr>
@@ -5915,7 +5915,7 @@
           <w14:ligatures w14:val="standardContextual"/>
         </w:rPr>
       </w:pPr>
-      <w:hyperlink w:anchor="_Toc243072021" w:history="1">
+      <w:hyperlink w:anchor="_Toc243335916" w:history="1">
         <w:r>
           <w:rPr>
             <w:rStyle w:val="Hyperlink"/>
@@ -5942,7 +5942,7 @@
             <w:noProof/>
             <w:webHidden/>
           </w:rPr>
-          <w:instrText xml:space="preserve"> PAGEREF _Toc243072021 \h </w:instrText>
+          <w:instrText xml:space="preserve"> PAGEREF _Toc243335916 \h </w:instrText>
         </w:r>
         <w:r>
           <w:rPr>
@@ -5989,7 +5989,7 @@
           <w14:ligatures w14:val="standardContextual"/>
         </w:rPr>
       </w:pPr>
-      <w:hyperlink w:anchor="_Toc243072022" w:history="1">
+      <w:hyperlink w:anchor="_Toc243335917" w:history="1">
         <w:r>
           <w:rPr>
             <w:rStyle w:val="Hyperlink"/>
@@ -6016,7 +6016,7 @@
             <w:noProof/>
             <w:webHidden/>
           </w:rPr>
-          <w:instrText xml:space="preserve"> PAGEREF _Toc243072022 \h </w:instrText>
+          <w:instrText xml:space="preserve"> PAGEREF _Toc243335917 \h </w:instrText>
         </w:r>
         <w:r>
           <w:rPr>
@@ -6063,7 +6063,7 @@
           <w14:ligatures w14:val="standardContextual"/>
         </w:rPr>
       </w:pPr>
-      <w:hyperlink w:anchor="_Toc243072023" w:history="1">
+      <w:hyperlink w:anchor="_Toc243335918" w:history="1">
         <w:r>
           <w:rPr>
             <w:rStyle w:val="Hyperlink"/>
@@ -6090,7 +6090,7 @@
             <w:noProof/>
             <w:webHidden/>
           </w:rPr>
-          <w:instrText xml:space="preserve"> PAGEREF _Toc243072023 \h </w:instrText>
+          <w:instrText xml:space="preserve"> PAGEREF _Toc243335918 \h </w:instrText>
         </w:r>
         <w:r>
           <w:rPr>
@@ -6137,7 +6137,7 @@
           <w14:ligatures w14:val="standardContextual"/>
         </w:rPr>
       </w:pPr>
-      <w:hyperlink w:anchor="_Toc243072024" w:history="1">
+      <w:hyperlink w:anchor="_Toc243335919" w:history="1">
         <w:r>
           <w:rPr>
             <w:rStyle w:val="Hyperlink"/>
@@ -6164,7 +6164,7 @@
             <w:noProof/>
             <w:webHidden/>
           </w:rPr>
-          <w:instrText xml:space="preserve"> PAGEREF _Toc243072024 \h </w:instrText>
+          <w:instrText xml:space="preserve"> PAGEREF _Toc243335919 \h </w:instrText>
         </w:r>
         <w:r>
           <w:rPr>
@@ -7115,7 +7115,7 @@
         <w:pStyle w:val="Heading1"/>
         <w:jc w:val="center"/>
       </w:pPr>
-      <w:bookmarkStart w:id="0" w:name="_Toc243071950"/>
+      <w:bookmarkStart w:id="0" w:name="_Toc243335845"/>
       <w:r>
         <w:rPr>
           <w:rFonts w:ascii="Times New Roman" w:hAnsi="Times New Roman"/>
@@ -7144,7 +7144,7 @@
       <w:pPr>
         <w:pStyle w:val="Heading2"/>
       </w:pPr>
-      <w:bookmarkStart w:id="1" w:name="_Toc243071951"/>
+      <w:bookmarkStart w:id="1" w:name="_Toc243335846"/>
       <w:r>
         <w:rPr>
           <w:rFonts w:ascii="Times New Roman" w:hAnsi="Times New Roman"/>
@@ -7196,7 +7196,7 @@
       <w:pPr>
         <w:pStyle w:val="Heading2"/>
       </w:pPr>
-      <w:bookmarkStart w:id="2" w:name="_Toc243071952"/>
+      <w:bookmarkStart w:id="2" w:name="_Toc243335847"/>
       <w:r>
         <w:rPr>
           <w:rFonts w:ascii="Times New Roman" w:hAnsi="Times New Roman"/>
@@ -7232,7 +7232,7 @@
       <w:pPr>
         <w:pStyle w:val="Heading2"/>
       </w:pPr>
-      <w:bookmarkStart w:id="3" w:name="_Toc243071953"/>
+      <w:bookmarkStart w:id="3" w:name="_Toc243335848"/>
       <w:r>
         <w:rPr>
           <w:rFonts w:ascii="Times New Roman" w:hAnsi="Times New Roman"/>
@@ -7272,7 +7272,7 @@
       <w:pPr>
         <w:pStyle w:val="Heading2"/>
       </w:pPr>
-      <w:bookmarkStart w:id="4" w:name="_Toc243071954"/>
+      <w:bookmarkStart w:id="4" w:name="_Toc243335849"/>
       <w:r>
         <w:rPr>
           <w:rFonts w:ascii="Times New Roman" w:hAnsi="Times New Roman"/>
@@ -7296,7 +7296,7 @@
       <w:pPr>
         <w:pStyle w:val="Heading2"/>
       </w:pPr>
-      <w:bookmarkStart w:id="5" w:name="_Toc243071955"/>
+      <w:bookmarkStart w:id="5" w:name="_Toc243335850"/>
       <w:r>
         <w:rPr>
           <w:rFonts w:ascii="Times New Roman" w:hAnsi="Times New Roman"/>
@@ -7366,7 +7366,7 @@
       <w:pPr>
         <w:pStyle w:val="Heading2"/>
       </w:pPr>
-      <w:bookmarkStart w:id="6" w:name="_Toc243071956"/>
+      <w:bookmarkStart w:id="6" w:name="_Toc243335851"/>
       <w:r>
         <w:rPr>
           <w:rFonts w:ascii="Times New Roman" w:hAnsi="Times New Roman"/>
@@ -7393,7 +7393,7 @@
       <w:pPr>
         <w:pStyle w:val="Heading2"/>
       </w:pPr>
-      <w:bookmarkStart w:id="7" w:name="_Toc243071957"/>
+      <w:bookmarkStart w:id="7" w:name="_Toc243335852"/>
       <w:r>
         <w:rPr>
           <w:rFonts w:ascii="Times New Roman" w:hAnsi="Times New Roman"/>
@@ -7420,7 +7420,7 @@
       <w:pPr>
         <w:pStyle w:val="Heading2"/>
       </w:pPr>
-      <w:bookmarkStart w:id="8" w:name="_Toc243071958"/>
+      <w:bookmarkStart w:id="8" w:name="_Toc243335853"/>
       <w:r>
         <w:rPr>
           <w:rFonts w:ascii="Times New Roman" w:hAnsi="Times New Roman"/>
@@ -7457,7 +7457,7 @@
         <w:pStyle w:val="Heading1"/>
         <w:jc w:val="center"/>
       </w:pPr>
-      <w:bookmarkStart w:id="9" w:name="_Toc243071959"/>
+      <w:bookmarkStart w:id="9" w:name="_Toc243335854"/>
       <w:r>
         <w:rPr>
           <w:rFonts w:ascii="Times New Roman" w:hAnsi="Times New Roman"/>
@@ -7486,7 +7486,7 @@
       <w:pPr>
         <w:pStyle w:val="Heading2"/>
       </w:pPr>
-      <w:bookmarkStart w:id="10" w:name="_Toc243071960"/>
+      <w:bookmarkStart w:id="10" w:name="_Toc243335855"/>
       <w:r>
         <w:rPr>
           <w:rFonts w:ascii="Times New Roman" w:hAnsi="Times New Roman"/>
@@ -7510,7 +7510,7 @@
       <w:pPr>
         <w:pStyle w:val="Heading2"/>
       </w:pPr>
-      <w:bookmarkStart w:id="11" w:name="_Toc243071961"/>
+      <w:bookmarkStart w:id="11" w:name="_Toc243335856"/>
       <w:r>
         <w:rPr>
           <w:rFonts w:ascii="Times New Roman" w:hAnsi="Times New Roman"/>
@@ -7556,7 +7556,7 @@
       <w:pPr>
         <w:pStyle w:val="Heading2"/>
       </w:pPr>
-      <w:bookmarkStart w:id="12" w:name="_Toc243071962"/>
+      <w:bookmarkStart w:id="12" w:name="_Toc243335857"/>
       <w:r>
         <w:rPr>
           <w:rFonts w:ascii="Times New Roman" w:hAnsi="Times New Roman"/>
@@ -7595,7 +7595,7 @@
       <w:pPr>
         <w:pStyle w:val="Heading2"/>
       </w:pPr>
-      <w:bookmarkStart w:id="13" w:name="_Toc243071963"/>
+      <w:bookmarkStart w:id="13" w:name="_Toc243335858"/>
       <w:r>
         <w:rPr>
           <w:rFonts w:ascii="Times New Roman" w:hAnsi="Times New Roman"/>
@@ -7638,7 +7638,7 @@
       <w:pPr>
         <w:pStyle w:val="Heading2"/>
       </w:pPr>
-      <w:bookmarkStart w:id="14" w:name="_Toc243071964"/>
+      <w:bookmarkStart w:id="14" w:name="_Toc243335859"/>
       <w:r>
         <w:rPr>
           <w:rFonts w:ascii="Times New Roman" w:hAnsi="Times New Roman"/>
@@ -7669,7 +7669,7 @@
       <w:pPr>
         <w:pStyle w:val="Heading2"/>
       </w:pPr>
-      <w:bookmarkStart w:id="15" w:name="_Toc243071965"/>
+      <w:bookmarkStart w:id="15" w:name="_Toc243335860"/>
       <w:r>
         <w:rPr>
           <w:rFonts w:ascii="Times New Roman" w:hAnsi="Times New Roman"/>
@@ -7699,7 +7699,7 @@
       <w:pPr>
         <w:pStyle w:val="Heading2"/>
       </w:pPr>
-      <w:bookmarkStart w:id="16" w:name="_Toc243071966"/>
+      <w:bookmarkStart w:id="16" w:name="_Toc243335861"/>
       <w:r>
         <w:rPr>
           <w:rFonts w:ascii="Times New Roman" w:hAnsi="Times New Roman"/>
@@ -7733,7 +7733,7 @@
       <w:pPr>
         <w:pStyle w:val="Heading2"/>
       </w:pPr>
-      <w:bookmarkStart w:id="17" w:name="_Toc243071967"/>
+      <w:bookmarkStart w:id="17" w:name="_Toc243335862"/>
       <w:r>
         <w:rPr>
           <w:rFonts w:ascii="Times New Roman" w:hAnsi="Times New Roman"/>
@@ -7788,7 +7788,7 @@
       <w:pPr>
         <w:pStyle w:val="Heading2"/>
       </w:pPr>
-      <w:bookmarkStart w:id="18" w:name="_Toc243071968"/>
+      <w:bookmarkStart w:id="18" w:name="_Toc243335863"/>
       <w:r>
         <w:rPr>
           <w:rFonts w:ascii="Times New Roman" w:hAnsi="Times New Roman"/>
@@ -7815,7 +7815,7 @@
       <w:pPr>
         <w:pStyle w:val="Heading2"/>
       </w:pPr>
-      <w:bookmarkStart w:id="19" w:name="_Toc243071969"/>
+      <w:bookmarkStart w:id="19" w:name="_Toc243335864"/>
       <w:r>
         <w:rPr>
           <w:rFonts w:ascii="Times New Roman" w:hAnsi="Times New Roman"/>
@@ -7846,7 +7846,7 @@
       <w:pPr>
         <w:pStyle w:val="Heading2"/>
       </w:pPr>
-      <w:bookmarkStart w:id="20" w:name="_Toc243071970"/>
+      <w:bookmarkStart w:id="20" w:name="_Toc243335865"/>
       <w:r>
         <w:rPr>
           <w:rFonts w:ascii="Times New Roman" w:hAnsi="Times New Roman"/>
@@ -7894,7 +7894,7 @@
       <w:pPr>
         <w:pStyle w:val="Heading2"/>
       </w:pPr>
-      <w:bookmarkStart w:id="21" w:name="_Toc243071971"/>
+      <w:bookmarkStart w:id="21" w:name="_Toc243335866"/>
       <w:r>
         <w:rPr>
           <w:rFonts w:ascii="Times New Roman" w:hAnsi="Times New Roman"/>
@@ -7940,7 +7940,7 @@
       <w:pPr>
         <w:pStyle w:val="Heading2"/>
       </w:pPr>
-      <w:bookmarkStart w:id="22" w:name="_Toc243071972"/>
+      <w:bookmarkStart w:id="22" w:name="_Toc243335867"/>
       <w:r>
         <w:rPr>
           <w:rFonts w:ascii="Times New Roman" w:hAnsi="Times New Roman"/>
@@ -8500,7 +8500,7 @@
       <w:pPr>
         <w:pStyle w:val="Heading2"/>
       </w:pPr>
-      <w:bookmarkStart w:id="23" w:name="_Toc243071973"/>
+      <w:bookmarkStart w:id="23" w:name="_Toc243335868"/>
       <w:r>
         <w:rPr>
           <w:rFonts w:ascii="Times New Roman" w:hAnsi="Times New Roman"/>
@@ -8533,7 +8533,7 @@
         <w:pStyle w:val="Heading1"/>
         <w:jc w:val="center"/>
       </w:pPr>
-      <w:bookmarkStart w:id="24" w:name="_Toc243071974"/>
+      <w:bookmarkStart w:id="24" w:name="_Toc243335869"/>
       <w:r>
         <w:rPr>
           <w:rFonts w:ascii="Times New Roman" w:hAnsi="Times New Roman"/>
@@ -8562,7 +8562,7 @@
       <w:pPr>
         <w:pStyle w:val="Heading2"/>
       </w:pPr>
-      <w:bookmarkStart w:id="25" w:name="_Toc243071975"/>
+      <w:bookmarkStart w:id="25" w:name="_Toc243335870"/>
       <w:r>
         <w:rPr>
           <w:rFonts w:ascii="Times New Roman" w:hAnsi="Times New Roman"/>
@@ -8597,7 +8597,7 @@
           <w:noProof/>
         </w:rPr>
         <w:drawing>
-          <wp:inline distT="0" distB="0" distL="0" distR="0" wp14:anchorId="2C86B6F1" wp14:editId="4725189D">
+          <wp:inline distT="0" distB="0" distL="0" distR="0" wp14:anchorId="1DE5491B" wp14:editId="0032523A">
             <wp:extent cx="5303520" cy="2983230"/>
             <wp:effectExtent l="0" t="0" r="0" b="0"/>
             <wp:docPr id="2" name="Picture 2"/>
@@ -8650,7 +8650,7 @@
       <w:pPr>
         <w:pStyle w:val="Heading2"/>
       </w:pPr>
-      <w:bookmarkStart w:id="26" w:name="_Toc243071976"/>
+      <w:bookmarkStart w:id="26" w:name="_Toc243335871"/>
       <w:r>
         <w:rPr>
           <w:rFonts w:ascii="Times New Roman" w:hAnsi="Times New Roman"/>
@@ -8686,7 +8686,7 @@
           <w:noProof/>
         </w:rPr>
         <w:drawing>
-          <wp:inline distT="0" distB="0" distL="0" distR="0" wp14:anchorId="752E0970" wp14:editId="022CF5B1">
+          <wp:inline distT="0" distB="0" distL="0" distR="0" wp14:anchorId="25891E24" wp14:editId="1855FEDC">
             <wp:extent cx="5303520" cy="2262835"/>
             <wp:effectExtent l="0" t="0" r="0" b="0"/>
             <wp:docPr id="3" name="Picture 3"/>
@@ -8776,7 +8776,7 @@
       <w:pPr>
         <w:pStyle w:val="Heading2"/>
       </w:pPr>
-      <w:bookmarkStart w:id="27" w:name="_Toc243071977"/>
+      <w:bookmarkStart w:id="27" w:name="_Toc243335872"/>
       <w:r>
         <w:rPr>
           <w:rFonts w:ascii="Times New Roman" w:hAnsi="Times New Roman"/>
@@ -8822,7 +8822,7 @@
       <w:pPr>
         <w:pStyle w:val="Heading2"/>
       </w:pPr>
-      <w:bookmarkStart w:id="28" w:name="_Toc243071978"/>
+      <w:bookmarkStart w:id="28" w:name="_Toc243335873"/>
       <w:r>
         <w:rPr>
           <w:rFonts w:ascii="Times New Roman" w:hAnsi="Times New Roman"/>
@@ -8870,7 +8870,7 @@
           <w:noProof/>
         </w:rPr>
         <w:drawing>
-          <wp:inline distT="0" distB="0" distL="0" distR="0" wp14:anchorId="11DA3F46" wp14:editId="7CBA2E34">
+          <wp:inline distT="0" distB="0" distL="0" distR="0" wp14:anchorId="361EED21" wp14:editId="5B7BCF19">
             <wp:extent cx="5303520" cy="2262835"/>
             <wp:effectExtent l="0" t="0" r="0" b="0"/>
             <wp:docPr id="4" name="Picture 4"/>
@@ -9215,7 +9215,7 @@
       <w:pPr>
         <w:pStyle w:val="Heading2"/>
       </w:pPr>
-      <w:bookmarkStart w:id="29" w:name="_Toc243071979"/>
+      <w:bookmarkStart w:id="29" w:name="_Toc243335874"/>
       <w:r>
         <w:rPr>
           <w:rFonts w:ascii="Times New Roman" w:hAnsi="Times New Roman"/>
@@ -9242,7 +9242,7 @@
       <w:pPr>
         <w:pStyle w:val="Heading2"/>
       </w:pPr>
-      <w:bookmarkStart w:id="30" w:name="_Toc243071980"/>
+      <w:bookmarkStart w:id="30" w:name="_Toc243335875"/>
       <w:r>
         <w:rPr>
           <w:rFonts w:ascii="Times New Roman" w:hAnsi="Times New Roman"/>
@@ -9285,7 +9285,7 @@
       <w:pPr>
         <w:pStyle w:val="Heading2"/>
       </w:pPr>
-      <w:bookmarkStart w:id="31" w:name="_Toc243071981"/>
+      <w:bookmarkStart w:id="31" w:name="_Toc243335876"/>
       <w:r>
         <w:rPr>
           <w:rFonts w:ascii="Times New Roman" w:hAnsi="Times New Roman"/>
@@ -9671,7 +9671,7 @@
       <w:pPr>
         <w:pStyle w:val="Heading2"/>
       </w:pPr>
-      <w:bookmarkStart w:id="32" w:name="_Toc243071982"/>
+      <w:bookmarkStart w:id="32" w:name="_Toc243335877"/>
       <w:r>
         <w:rPr>
           <w:rFonts w:ascii="Times New Roman" w:hAnsi="Times New Roman"/>
@@ -9701,7 +9701,7 @@
       <w:pPr>
         <w:pStyle w:val="Heading2"/>
       </w:pPr>
-      <w:bookmarkStart w:id="33" w:name="_Toc243071983"/>
+      <w:bookmarkStart w:id="33" w:name="_Toc243335878"/>
       <w:r>
         <w:rPr>
           <w:rFonts w:ascii="Times New Roman" w:hAnsi="Times New Roman"/>
@@ -9735,7 +9735,7 @@
         <w:pStyle w:val="Heading1"/>
         <w:jc w:val="center"/>
       </w:pPr>
-      <w:bookmarkStart w:id="34" w:name="_Toc243071984"/>
+      <w:bookmarkStart w:id="34" w:name="_Toc243335879"/>
       <w:r>
         <w:rPr>
           <w:rFonts w:ascii="Times New Roman" w:hAnsi="Times New Roman"/>
@@ -9764,7 +9764,7 @@
       <w:pPr>
         <w:pStyle w:val="Heading2"/>
       </w:pPr>
-      <w:bookmarkStart w:id="35" w:name="_Toc243071985"/>
+      <w:bookmarkStart w:id="35" w:name="_Toc243335880"/>
       <w:r>
         <w:rPr>
           <w:rFonts w:ascii="Times New Roman" w:hAnsi="Times New Roman"/>
@@ -9791,7 +9791,7 @@
       <w:pPr>
         <w:pStyle w:val="Heading2"/>
       </w:pPr>
-      <w:bookmarkStart w:id="36" w:name="_Toc243071986"/>
+      <w:bookmarkStart w:id="36" w:name="_Toc243335881"/>
       <w:r>
         <w:rPr>
           <w:rFonts w:ascii="Times New Roman" w:hAnsi="Times New Roman"/>
@@ -10368,7 +10368,7 @@
       <w:pPr>
         <w:pStyle w:val="Heading2"/>
       </w:pPr>
-      <w:bookmarkStart w:id="37" w:name="_Toc243071987"/>
+      <w:bookmarkStart w:id="37" w:name="_Toc243335882"/>
       <w:r>
         <w:rPr>
           <w:rFonts w:ascii="Times New Roman" w:hAnsi="Times New Roman"/>
@@ -10485,7 +10485,7 @@
       <w:pPr>
         <w:pStyle w:val="Heading2"/>
       </w:pPr>
-      <w:bookmarkStart w:id="38" w:name="_Toc243071988"/>
+      <w:bookmarkStart w:id="38" w:name="_Toc243335883"/>
       <w:r>
         <w:rPr>
           <w:rFonts w:ascii="Times New Roman" w:hAnsi="Times New Roman"/>
@@ -10515,7 +10515,7 @@
       <w:pPr>
         <w:pStyle w:val="Heading2"/>
       </w:pPr>
-      <w:bookmarkStart w:id="39" w:name="_Toc243071989"/>
+      <w:bookmarkStart w:id="39" w:name="_Toc243335884"/>
       <w:r>
         <w:rPr>
           <w:rFonts w:ascii="Times New Roman" w:hAnsi="Times New Roman"/>
@@ -10543,7 +10543,7 @@
       <w:pPr>
         <w:pStyle w:val="Heading2"/>
       </w:pPr>
-      <w:bookmarkStart w:id="40" w:name="_Toc243071990"/>
+      <w:bookmarkStart w:id="40" w:name="_Toc243335885"/>
       <w:r>
         <w:rPr>
           <w:rFonts w:ascii="Times New Roman" w:hAnsi="Times New Roman"/>
@@ -10570,7 +10570,7 @@
       <w:pPr>
         <w:pStyle w:val="Heading2"/>
       </w:pPr>
-      <w:bookmarkStart w:id="41" w:name="_Toc243071991"/>
+      <w:bookmarkStart w:id="41" w:name="_Toc243335886"/>
       <w:r>
         <w:rPr>
           <w:rFonts w:ascii="Times New Roman" w:hAnsi="Times New Roman"/>
@@ -10597,7 +10597,7 @@
       <w:pPr>
         <w:pStyle w:val="Heading2"/>
       </w:pPr>
-      <w:bookmarkStart w:id="42" w:name="_Toc243071992"/>
+      <w:bookmarkStart w:id="42" w:name="_Toc243335887"/>
       <w:r>
         <w:rPr>
           <w:rFonts w:ascii="Times New Roman" w:hAnsi="Times New Roman"/>
@@ -10634,7 +10634,7 @@
         <w:pStyle w:val="Heading1"/>
         <w:jc w:val="center"/>
       </w:pPr>
-      <w:bookmarkStart w:id="43" w:name="_Toc243071993"/>
+      <w:bookmarkStart w:id="43" w:name="_Toc243335888"/>
       <w:r>
         <w:rPr>
           <w:rFonts w:ascii="Times New Roman" w:hAnsi="Times New Roman"/>
@@ -10663,7 +10663,7 @@
       <w:pPr>
         <w:pStyle w:val="Heading2"/>
       </w:pPr>
-      <w:bookmarkStart w:id="44" w:name="_Toc243071994"/>
+      <w:bookmarkStart w:id="44" w:name="_Toc243335889"/>
       <w:r>
         <w:rPr>
           <w:rFonts w:ascii="Times New Roman" w:hAnsi="Times New Roman"/>
@@ -10695,7 +10695,7 @@
           <w:noProof/>
         </w:rPr>
         <w:drawing>
-          <wp:inline distT="0" distB="0" distL="0" distR="0" wp14:anchorId="0D8B8691" wp14:editId="3CB61DF3">
+          <wp:inline distT="0" distB="0" distL="0" distR="0" wp14:anchorId="37C4D031" wp14:editId="1473C70A">
             <wp:extent cx="5303520" cy="3374967"/>
             <wp:effectExtent l="0" t="0" r="0" b="0"/>
             <wp:docPr id="5" name="Picture 5"/>
@@ -10963,7 +10963,7 @@
           <w:noProof/>
         </w:rPr>
         <w:drawing>
-          <wp:inline distT="0" distB="0" distL="0" distR="0" wp14:anchorId="31A7D2BD" wp14:editId="0E4C5FE0">
+          <wp:inline distT="0" distB="0" distL="0" distR="0" wp14:anchorId="38A778F0" wp14:editId="0BD772C5">
             <wp:extent cx="5303520" cy="2272937"/>
             <wp:effectExtent l="0" t="0" r="0" b="0"/>
             <wp:docPr id="6" name="Picture 6"/>
@@ -11343,7 +11343,7 @@
       <w:pPr>
         <w:pStyle w:val="Heading2"/>
       </w:pPr>
-      <w:bookmarkStart w:id="45" w:name="_Toc243071995"/>
+      <w:bookmarkStart w:id="45" w:name="_Toc243335890"/>
       <w:r>
         <w:rPr>
           <w:rFonts w:ascii="Times New Roman" w:hAnsi="Times New Roman"/>
@@ -11376,7 +11376,7 @@
         </w:rPr>
         <w:lastRenderedPageBreak/>
         <w:drawing>
-          <wp:inline distT="0" distB="0" distL="0" distR="0" wp14:anchorId="2306C53B" wp14:editId="55C92C64">
+          <wp:inline distT="0" distB="0" distL="0" distR="0" wp14:anchorId="635AB267" wp14:editId="297AF428">
             <wp:extent cx="5303520" cy="2121408"/>
             <wp:effectExtent l="0" t="0" r="0" b="0"/>
             <wp:docPr id="7" name="Picture 7"/>
@@ -11700,7 +11700,7 @@
           <w:noProof/>
         </w:rPr>
         <w:drawing>
-          <wp:inline distT="0" distB="0" distL="0" distR="0" wp14:anchorId="21B8EEDE" wp14:editId="4EB07BC3">
+          <wp:inline distT="0" distB="0" distL="0" distR="0" wp14:anchorId="6CF57B18" wp14:editId="20803C62">
             <wp:extent cx="5303520" cy="2571404"/>
             <wp:effectExtent l="0" t="0" r="0" b="0"/>
             <wp:docPr id="8" name="Picture 8"/>
@@ -11753,7 +11753,7 @@
       <w:pPr>
         <w:pStyle w:val="Heading2"/>
       </w:pPr>
-      <w:bookmarkStart w:id="46" w:name="_Toc243071996"/>
+      <w:bookmarkStart w:id="46" w:name="_Toc243335891"/>
       <w:r>
         <w:rPr>
           <w:rFonts w:ascii="Times New Roman" w:hAnsi="Times New Roman"/>
@@ -11995,7 +11995,7 @@
       <w:pPr>
         <w:pStyle w:val="Heading2"/>
       </w:pPr>
-      <w:bookmarkStart w:id="47" w:name="_Toc243071997"/>
+      <w:bookmarkStart w:id="47" w:name="_Toc243335892"/>
       <w:r>
         <w:rPr>
           <w:rFonts w:ascii="Times New Roman" w:hAnsi="Times New Roman"/>
@@ -12059,7 +12059,7 @@
           <w:noProof/>
         </w:rPr>
         <w:drawing>
-          <wp:inline distT="0" distB="0" distL="0" distR="0" wp14:anchorId="6388BBC2" wp14:editId="0F97EC1A">
+          <wp:inline distT="0" distB="0" distL="0" distR="0" wp14:anchorId="72994E65" wp14:editId="7E616DE0">
             <wp:extent cx="5303520" cy="2121408"/>
             <wp:effectExtent l="0" t="0" r="0" b="0"/>
             <wp:docPr id="9" name="Picture 9"/>
@@ -12112,7 +12112,7 @@
       <w:pPr>
         <w:pStyle w:val="Heading2"/>
       </w:pPr>
-      <w:bookmarkStart w:id="48" w:name="_Toc243071998"/>
+      <w:bookmarkStart w:id="48" w:name="_Toc243335893"/>
       <w:r>
         <w:rPr>
           <w:rFonts w:ascii="Times New Roman" w:hAnsi="Times New Roman"/>
@@ -12145,7 +12145,7 @@
         </w:rPr>
         <w:lastRenderedPageBreak/>
         <w:drawing>
-          <wp:inline distT="0" distB="0" distL="0" distR="0" wp14:anchorId="52496721" wp14:editId="650633FA">
+          <wp:inline distT="0" distB="0" distL="0" distR="0" wp14:anchorId="7AC12DDF" wp14:editId="6009BBD2">
             <wp:extent cx="5303520" cy="2424466"/>
             <wp:effectExtent l="0" t="0" r="0" b="0"/>
             <wp:docPr id="10" name="Picture 10"/>
@@ -12395,7 +12395,7 @@
       <w:pPr>
         <w:pStyle w:val="Heading2"/>
       </w:pPr>
-      <w:bookmarkStart w:id="49" w:name="_Toc243071999"/>
+      <w:bookmarkStart w:id="49" w:name="_Toc243335894"/>
       <w:r>
         <w:rPr>
           <w:rFonts w:ascii="Times New Roman" w:hAnsi="Times New Roman"/>
@@ -12440,7 +12440,7 @@
           <w:noProof/>
         </w:rPr>
         <w:drawing>
-          <wp:inline distT="0" distB="0" distL="0" distR="0" wp14:anchorId="3A04F99A" wp14:editId="6BE8657B">
+          <wp:inline distT="0" distB="0" distL="0" distR="0" wp14:anchorId="70775236" wp14:editId="2C99C32D">
             <wp:extent cx="5303520" cy="1988820"/>
             <wp:effectExtent l="0" t="0" r="0" b="0"/>
             <wp:docPr id="11" name="Picture 11"/>
@@ -12511,7 +12511,7 @@
         </w:rPr>
         <w:lastRenderedPageBreak/>
         <w:drawing>
-          <wp:inline distT="0" distB="0" distL="0" distR="0" wp14:anchorId="4D8A0609" wp14:editId="431665E7">
+          <wp:inline distT="0" distB="0" distL="0" distR="0" wp14:anchorId="21E15C02" wp14:editId="5D937737">
             <wp:extent cx="5303520" cy="2495774"/>
             <wp:effectExtent l="0" t="0" r="0" b="0"/>
             <wp:docPr id="12" name="Picture 12"/>
@@ -12581,7 +12581,7 @@
           <w:noProof/>
         </w:rPr>
         <w:drawing>
-          <wp:inline distT="0" distB="0" distL="0" distR="0" wp14:anchorId="4D503891" wp14:editId="1996F0DD">
+          <wp:inline distT="0" distB="0" distL="0" distR="0" wp14:anchorId="7D51658C" wp14:editId="36B1B3A1">
             <wp:extent cx="5303520" cy="2272937"/>
             <wp:effectExtent l="0" t="0" r="0" b="0"/>
             <wp:docPr id="13" name="Picture 13"/>
@@ -12664,7 +12664,7 @@
           <w:noProof/>
         </w:rPr>
         <w:drawing>
-          <wp:inline distT="0" distB="0" distL="0" distR="0" wp14:anchorId="4EA30E20" wp14:editId="6061B22C">
+          <wp:inline distT="0" distB="0" distL="0" distR="0" wp14:anchorId="5A45066C" wp14:editId="25143C65">
             <wp:extent cx="5303520" cy="2339788"/>
             <wp:effectExtent l="0" t="0" r="0" b="0"/>
             <wp:docPr id="14" name="Picture 14"/>
@@ -12735,7 +12735,7 @@
           <w:noProof/>
         </w:rPr>
         <w:drawing>
-          <wp:inline distT="0" distB="0" distL="0" distR="0" wp14:anchorId="1EFD25F1" wp14:editId="70A54DDD">
+          <wp:inline distT="0" distB="0" distL="0" distR="0" wp14:anchorId="145DBC65" wp14:editId="6B113007">
             <wp:extent cx="5303520" cy="1988820"/>
             <wp:effectExtent l="0" t="0" r="0" b="0"/>
             <wp:docPr id="15" name="Picture 15"/>
@@ -13190,7 +13190,7 @@
       <w:pPr>
         <w:pStyle w:val="Heading2"/>
       </w:pPr>
-      <w:bookmarkStart w:id="50" w:name="_Toc243072000"/>
+      <w:bookmarkStart w:id="50" w:name="_Toc243335895"/>
       <w:r>
         <w:rPr>
           <w:rFonts w:ascii="Times New Roman" w:hAnsi="Times New Roman"/>
@@ -13264,7 +13264,7 @@
       <w:pPr>
         <w:pStyle w:val="Heading2"/>
       </w:pPr>
-      <w:bookmarkStart w:id="51" w:name="_Toc243072001"/>
+      <w:bookmarkStart w:id="51" w:name="_Toc243335896"/>
       <w:r>
         <w:rPr>
           <w:rFonts w:ascii="Times New Roman" w:hAnsi="Times New Roman"/>
@@ -13762,7 +13762,7 @@
         <w:pStyle w:val="Heading1"/>
         <w:jc w:val="center"/>
       </w:pPr>
-      <w:bookmarkStart w:id="52" w:name="_Toc243072002"/>
+      <w:bookmarkStart w:id="52" w:name="_Toc243335897"/>
       <w:r>
         <w:rPr>
           <w:rFonts w:ascii="Times New Roman" w:hAnsi="Times New Roman"/>
@@ -13791,7 +13791,7 @@
       <w:pPr>
         <w:pStyle w:val="Heading2"/>
       </w:pPr>
-      <w:bookmarkStart w:id="53" w:name="_Toc243072003"/>
+      <w:bookmarkStart w:id="53" w:name="_Toc243335898"/>
       <w:r>
         <w:rPr>
           <w:rFonts w:ascii="Times New Roman" w:hAnsi="Times New Roman"/>
@@ -13855,7 +13855,7 @@
       <w:pPr>
         <w:pStyle w:val="Heading2"/>
       </w:pPr>
-      <w:bookmarkStart w:id="54" w:name="_Toc243072004"/>
+      <w:bookmarkStart w:id="54" w:name="_Toc243335899"/>
       <w:r>
         <w:rPr>
           <w:rFonts w:ascii="Times New Roman" w:hAnsi="Times New Roman"/>
@@ -13949,7 +13949,7 @@
         <w:pStyle w:val="Heading1"/>
         <w:jc w:val="center"/>
       </w:pPr>
-      <w:bookmarkStart w:id="55" w:name="_Toc243072005"/>
+      <w:bookmarkStart w:id="55" w:name="_Toc243335900"/>
       <w:r>
         <w:rPr>
           <w:rFonts w:ascii="Times New Roman" w:hAnsi="Times New Roman"/>
@@ -14137,7 +14137,7 @@
         <w:pStyle w:val="Heading1"/>
         <w:jc w:val="center"/>
       </w:pPr>
-      <w:bookmarkStart w:id="56" w:name="_Toc243072006"/>
+      <w:bookmarkStart w:id="56" w:name="_Toc243335901"/>
       <w:r>
         <w:rPr>
           <w:rFonts w:ascii="Times New Roman" w:hAnsi="Times New Roman"/>
@@ -14153,7 +14153,7 @@
       <w:pPr>
         <w:pStyle w:val="Heading2"/>
       </w:pPr>
-      <w:bookmarkStart w:id="57" w:name="_Toc243072007"/>
+      <w:bookmarkStart w:id="57" w:name="_Toc243335902"/>
       <w:r>
         <w:rPr>
           <w:rFonts w:ascii="Times New Roman" w:hAnsi="Times New Roman"/>
@@ -14183,7 +14183,7 @@
       <w:pPr>
         <w:pStyle w:val="Heading2"/>
       </w:pPr>
-      <w:bookmarkStart w:id="58" w:name="_Toc243072008"/>
+      <w:bookmarkStart w:id="58" w:name="_Toc243335903"/>
       <w:r>
         <w:rPr>
           <w:rFonts w:ascii="Times New Roman" w:hAnsi="Times New Roman"/>
@@ -14287,7 +14287,7 @@
       <w:pPr>
         <w:pStyle w:val="Heading2"/>
       </w:pPr>
-      <w:bookmarkStart w:id="59" w:name="_Toc243072009"/>
+      <w:bookmarkStart w:id="59" w:name="_Toc243335904"/>
       <w:r>
         <w:rPr>
           <w:rFonts w:ascii="Times New Roman" w:hAnsi="Times New Roman"/>
@@ -14391,7 +14391,7 @@
       <w:pPr>
         <w:pStyle w:val="Heading2"/>
       </w:pPr>
-      <w:bookmarkStart w:id="60" w:name="_Toc243072010"/>
+      <w:bookmarkStart w:id="60" w:name="_Toc243335905"/>
       <w:r>
         <w:rPr>
           <w:rFonts w:ascii="Times New Roman" w:hAnsi="Times New Roman"/>
@@ -14549,7 +14549,7 @@
       <w:pPr>
         <w:pStyle w:val="Heading2"/>
       </w:pPr>
-      <w:bookmarkStart w:id="61" w:name="_Toc243072011"/>
+      <w:bookmarkStart w:id="61" w:name="_Toc243335906"/>
       <w:r>
         <w:rPr>
           <w:rFonts w:ascii="Times New Roman" w:hAnsi="Times New Roman"/>
@@ -14797,7 +14797,7 @@
       <w:pPr>
         <w:pStyle w:val="Heading2"/>
       </w:pPr>
-      <w:bookmarkStart w:id="62" w:name="_Toc243072012"/>
+      <w:bookmarkStart w:id="62" w:name="_Toc243335907"/>
       <w:r>
         <w:rPr>
           <w:rFonts w:ascii="Times New Roman" w:hAnsi="Times New Roman"/>
@@ -14949,7 +14949,7 @@
       <w:pPr>
         <w:pStyle w:val="Heading2"/>
       </w:pPr>
-      <w:bookmarkStart w:id="63" w:name="_Toc243072013"/>
+      <w:bookmarkStart w:id="63" w:name="_Toc243335908"/>
       <w:r>
         <w:rPr>
           <w:rFonts w:ascii="Times New Roman" w:hAnsi="Times New Roman"/>
@@ -15114,7 +15114,7 @@
       <w:pPr>
         <w:pStyle w:val="Heading2"/>
       </w:pPr>
-      <w:bookmarkStart w:id="64" w:name="_Toc243072014"/>
+      <w:bookmarkStart w:id="64" w:name="_Toc243335909"/>
       <w:r>
         <w:rPr>
           <w:rFonts w:ascii="Times New Roman" w:hAnsi="Times New Roman"/>
@@ -15295,7 +15295,7 @@
       <w:pPr>
         <w:pStyle w:val="Heading2"/>
       </w:pPr>
-      <w:bookmarkStart w:id="65" w:name="_Toc243072015"/>
+      <w:bookmarkStart w:id="65" w:name="_Toc243335910"/>
       <w:r>
         <w:rPr>
           <w:rFonts w:ascii="Times New Roman" w:hAnsi="Times New Roman"/>
@@ -15435,7 +15435,7 @@
       <w:pPr>
         <w:pStyle w:val="Heading2"/>
       </w:pPr>
-      <w:bookmarkStart w:id="66" w:name="_Toc243072016"/>
+      <w:bookmarkStart w:id="66" w:name="_Toc243335911"/>
       <w:r>
         <w:rPr>
           <w:rFonts w:ascii="Times New Roman" w:hAnsi="Times New Roman"/>
@@ -15624,7 +15624,7 @@
       <w:pPr>
         <w:pStyle w:val="Heading2"/>
       </w:pPr>
-      <w:bookmarkStart w:id="67" w:name="_Toc243072017"/>
+      <w:bookmarkStart w:id="67" w:name="_Toc243335912"/>
       <w:r>
         <w:rPr>
           <w:rFonts w:ascii="Times New Roman" w:hAnsi="Times New Roman"/>
@@ -15776,7 +15776,7 @@
       <w:pPr>
         <w:pStyle w:val="Heading2"/>
       </w:pPr>
-      <w:bookmarkStart w:id="68" w:name="_Toc243072018"/>
+      <w:bookmarkStart w:id="68" w:name="_Toc243335913"/>
       <w:r>
         <w:rPr>
           <w:rFonts w:ascii="Times New Roman" w:hAnsi="Times New Roman"/>
@@ -15940,7 +15940,7 @@
       <w:pPr>
         <w:pStyle w:val="Heading2"/>
       </w:pPr>
-      <w:bookmarkStart w:id="69" w:name="_Toc243072019"/>
+      <w:bookmarkStart w:id="69" w:name="_Toc243335914"/>
       <w:r>
         <w:rPr>
           <w:rFonts w:ascii="Times New Roman" w:hAnsi="Times New Roman"/>
@@ -16134,7 +16134,7 @@
       <w:pPr>
         <w:pStyle w:val="Heading2"/>
       </w:pPr>
-      <w:bookmarkStart w:id="70" w:name="_Toc243072020"/>
+      <w:bookmarkStart w:id="70" w:name="_Toc243335915"/>
       <w:r>
         <w:rPr>
           <w:rFonts w:ascii="Times New Roman" w:hAnsi="Times New Roman"/>
@@ -16274,7 +16274,7 @@
       <w:pPr>
         <w:pStyle w:val="Heading2"/>
       </w:pPr>
-      <w:bookmarkStart w:id="71" w:name="_Toc243072021"/>
+      <w:bookmarkStart w:id="71" w:name="_Toc243335916"/>
       <w:r>
         <w:rPr>
           <w:rFonts w:ascii="Times New Roman" w:hAnsi="Times New Roman"/>
@@ -16474,7 +16474,7 @@
       <w:pPr>
         <w:pStyle w:val="Heading2"/>
       </w:pPr>
-      <w:bookmarkStart w:id="72" w:name="_Toc243072022"/>
+      <w:bookmarkStart w:id="72" w:name="_Toc243335917"/>
       <w:r>
         <w:rPr>
           <w:rFonts w:ascii="Times New Roman" w:hAnsi="Times New Roman"/>
@@ -16553,7 +16553,7 @@
       <w:pPr>
         <w:pStyle w:val="Heading2"/>
       </w:pPr>
-      <w:bookmarkStart w:id="73" w:name="_Toc243072023"/>
+      <w:bookmarkStart w:id="73" w:name="_Toc243335918"/>
       <w:r>
         <w:rPr>
           <w:rFonts w:ascii="Times New Roman" w:hAnsi="Times New Roman"/>
@@ -16617,7 +16617,7 @@
       <w:pPr>
         <w:pStyle w:val="Heading2"/>
       </w:pPr>
-      <w:bookmarkStart w:id="74" w:name="_Toc243072024"/>
+      <w:bookmarkStart w:id="74" w:name="_Toc243335919"/>
       <w:r>
         <w:rPr>
           <w:rFonts w:ascii="Times New Roman" w:hAnsi="Times New Roman"/>
@@ -16970,31 +16970,31 @@
       </w:rPr>
     </w:lvl>
   </w:abstractNum>
-  <w:num w:numId="1" w16cid:durableId="191461870">
+  <w:num w:numId="1" w16cid:durableId="1978489053">
     <w:abstractNumId w:val="8"/>
   </w:num>
-  <w:num w:numId="2" w16cid:durableId="619265476">
+  <w:num w:numId="2" w16cid:durableId="741610295">
     <w:abstractNumId w:val="6"/>
   </w:num>
-  <w:num w:numId="3" w16cid:durableId="1336417171">
+  <w:num w:numId="3" w16cid:durableId="1419523463">
     <w:abstractNumId w:val="5"/>
   </w:num>
-  <w:num w:numId="4" w16cid:durableId="2032994625">
+  <w:num w:numId="4" w16cid:durableId="1002515857">
     <w:abstractNumId w:val="4"/>
   </w:num>
-  <w:num w:numId="5" w16cid:durableId="1621716900">
+  <w:num w:numId="5" w16cid:durableId="431322453">
     <w:abstractNumId w:val="7"/>
   </w:num>
-  <w:num w:numId="6" w16cid:durableId="2042435575">
+  <w:num w:numId="6" w16cid:durableId="1085109730">
     <w:abstractNumId w:val="3"/>
   </w:num>
-  <w:num w:numId="7" w16cid:durableId="429669349">
+  <w:num w:numId="7" w16cid:durableId="1033726851">
     <w:abstractNumId w:val="2"/>
   </w:num>
-  <w:num w:numId="8" w16cid:durableId="133332749">
+  <w:num w:numId="8" w16cid:durableId="777794394">
     <w:abstractNumId w:val="1"/>
   </w:num>
-  <w:num w:numId="9" w16cid:durableId="1030834409">
+  <w:num w:numId="9" w16cid:durableId="956302515">
     <w:abstractNumId w:val="0"/>
   </w:num>
 </w:numbering>
@@ -28394,7 +28394,7 @@
     <w:autoRedefine/>
     <w:uiPriority w:val="39"/>
     <w:unhideWhenUsed/>
-    <w:rsid w:val="00D37FC5"/>
+    <w:rsid w:val="00E36968"/>
     <w:pPr>
       <w:spacing w:after="100"/>
     </w:pPr>
@@ -28406,7 +28406,7 @@
     <w:autoRedefine/>
     <w:uiPriority w:val="39"/>
     <w:unhideWhenUsed/>
-    <w:rsid w:val="00D37FC5"/>
+    <w:rsid w:val="00E36968"/>
     <w:pPr>
       <w:spacing w:after="100"/>
       <w:ind w:left="240"/>
@@ -28417,7 +28417,7 @@
     <w:basedOn w:val="DefaultParagraphFont"/>
     <w:uiPriority w:val="99"/>
     <w:unhideWhenUsed/>
-    <w:rsid w:val="00D37FC5"/>
+    <w:rsid w:val="00E36968"/>
     <w:rPr>
       <w:color w:val="0000FF" w:themeColor="hyperlink"/>
       <w:u w:val="single"/>

</xml_diff>

<commit_message>
Add spell check, prose diff, and a report-build skill
- spellcheck.py + whitelist.txt: flag probable typos in the report body,
  skipping code listings, accepting British spellings, and ignoring domain
  terms; wired into build.py as an advisory step (never fails the build)
- diff.py: show the paragraph-level prose diff versus a git revision, to
  confirm an edit changed only what was intended
- report-build skill: documents the generate-then-verify workflow so it is
  discoverable without reading project notes

The report baseline is clean (no suspect words) and still passes all checks.
</commit_message>
<xml_diff>
--- a/report/CyberTrace_Project_Report.docx
+++ b/report/CyberTrace_Project_Report.docx
@@ -11,7 +11,7 @@
           <w:noProof/>
         </w:rPr>
         <w:drawing>
-          <wp:inline distT="0" distB="0" distL="0" distR="0" wp14:anchorId="6A3E61DB" wp14:editId="763D0492">
+          <wp:inline distT="0" distB="0" distL="0" distR="0" wp14:anchorId="3B8C0734" wp14:editId="05FD174F">
             <wp:extent cx="2560320" cy="816494"/>
             <wp:effectExtent l="0" t="0" r="0" b="0"/>
             <wp:docPr id="1" name="Picture 1"/>
@@ -661,7 +661,7 @@
       <w:r>
         <w:fldChar w:fldCharType="separate"/>
       </w:r>
-      <w:hyperlink w:anchor="_Toc243335845" w:history="1">
+      <w:hyperlink w:anchor="_Toc243336225" w:history="1">
         <w:r>
           <w:rPr>
             <w:rStyle w:val="Hyperlink"/>
@@ -688,7 +688,7 @@
             <w:noProof/>
             <w:webHidden/>
           </w:rPr>
-          <w:instrText xml:space="preserve"> PAGEREF _Toc243335845 \h </w:instrText>
+          <w:instrText xml:space="preserve"> PAGEREF _Toc243336225 \h </w:instrText>
         </w:r>
         <w:r>
           <w:rPr>
@@ -735,7 +735,7 @@
           <w14:ligatures w14:val="standardContextual"/>
         </w:rPr>
       </w:pPr>
-      <w:hyperlink w:anchor="_Toc243335846" w:history="1">
+      <w:hyperlink w:anchor="_Toc243336226" w:history="1">
         <w:r>
           <w:rPr>
             <w:rStyle w:val="Hyperlink"/>
@@ -762,7 +762,7 @@
             <w:noProof/>
             <w:webHidden/>
           </w:rPr>
-          <w:instrText xml:space="preserve"> PAGEREF _Toc243335846 \h </w:instrText>
+          <w:instrText xml:space="preserve"> PAGEREF _Toc243336226 \h </w:instrText>
         </w:r>
         <w:r>
           <w:rPr>
@@ -809,7 +809,7 @@
           <w14:ligatures w14:val="standardContextual"/>
         </w:rPr>
       </w:pPr>
-      <w:hyperlink w:anchor="_Toc243335847" w:history="1">
+      <w:hyperlink w:anchor="_Toc243336227" w:history="1">
         <w:r>
           <w:rPr>
             <w:rStyle w:val="Hyperlink"/>
@@ -836,7 +836,7 @@
             <w:noProof/>
             <w:webHidden/>
           </w:rPr>
-          <w:instrText xml:space="preserve"> PAGEREF _Toc243335847 \h </w:instrText>
+          <w:instrText xml:space="preserve"> PAGEREF _Toc243336227 \h </w:instrText>
         </w:r>
         <w:r>
           <w:rPr>
@@ -883,7 +883,7 @@
           <w14:ligatures w14:val="standardContextual"/>
         </w:rPr>
       </w:pPr>
-      <w:hyperlink w:anchor="_Toc243335848" w:history="1">
+      <w:hyperlink w:anchor="_Toc243336228" w:history="1">
         <w:r>
           <w:rPr>
             <w:rStyle w:val="Hyperlink"/>
@@ -910,7 +910,7 @@
             <w:noProof/>
             <w:webHidden/>
           </w:rPr>
-          <w:instrText xml:space="preserve"> PAGEREF _Toc243335848 \h </w:instrText>
+          <w:instrText xml:space="preserve"> PAGEREF _Toc243336228 \h </w:instrText>
         </w:r>
         <w:r>
           <w:rPr>
@@ -957,7 +957,7 @@
           <w14:ligatures w14:val="standardContextual"/>
         </w:rPr>
       </w:pPr>
-      <w:hyperlink w:anchor="_Toc243335849" w:history="1">
+      <w:hyperlink w:anchor="_Toc243336229" w:history="1">
         <w:r>
           <w:rPr>
             <w:rStyle w:val="Hyperlink"/>
@@ -984,7 +984,7 @@
             <w:noProof/>
             <w:webHidden/>
           </w:rPr>
-          <w:instrText xml:space="preserve"> PAGEREF _Toc243335849 \h </w:instrText>
+          <w:instrText xml:space="preserve"> PAGEREF _Toc243336229 \h </w:instrText>
         </w:r>
         <w:r>
           <w:rPr>
@@ -1031,7 +1031,7 @@
           <w14:ligatures w14:val="standardContextual"/>
         </w:rPr>
       </w:pPr>
-      <w:hyperlink w:anchor="_Toc243335850" w:history="1">
+      <w:hyperlink w:anchor="_Toc243336230" w:history="1">
         <w:r>
           <w:rPr>
             <w:rStyle w:val="Hyperlink"/>
@@ -1058,7 +1058,7 @@
             <w:noProof/>
             <w:webHidden/>
           </w:rPr>
-          <w:instrText xml:space="preserve"> PAGEREF _Toc243335850 \h </w:instrText>
+          <w:instrText xml:space="preserve"> PAGEREF _Toc243336230 \h </w:instrText>
         </w:r>
         <w:r>
           <w:rPr>
@@ -1105,7 +1105,7 @@
           <w14:ligatures w14:val="standardContextual"/>
         </w:rPr>
       </w:pPr>
-      <w:hyperlink w:anchor="_Toc243335851" w:history="1">
+      <w:hyperlink w:anchor="_Toc243336231" w:history="1">
         <w:r>
           <w:rPr>
             <w:rStyle w:val="Hyperlink"/>
@@ -1132,7 +1132,7 @@
             <w:noProof/>
             <w:webHidden/>
           </w:rPr>
-          <w:instrText xml:space="preserve"> PAGEREF _Toc243335851 \h </w:instrText>
+          <w:instrText xml:space="preserve"> PAGEREF _Toc243336231 \h </w:instrText>
         </w:r>
         <w:r>
           <w:rPr>
@@ -1179,7 +1179,7 @@
           <w14:ligatures w14:val="standardContextual"/>
         </w:rPr>
       </w:pPr>
-      <w:hyperlink w:anchor="_Toc243335852" w:history="1">
+      <w:hyperlink w:anchor="_Toc243336232" w:history="1">
         <w:r>
           <w:rPr>
             <w:rStyle w:val="Hyperlink"/>
@@ -1206,7 +1206,7 @@
             <w:noProof/>
             <w:webHidden/>
           </w:rPr>
-          <w:instrText xml:space="preserve"> PAGEREF _Toc243335852 \h </w:instrText>
+          <w:instrText xml:space="preserve"> PAGEREF _Toc243336232 \h </w:instrText>
         </w:r>
         <w:r>
           <w:rPr>
@@ -1253,7 +1253,7 @@
           <w14:ligatures w14:val="standardContextual"/>
         </w:rPr>
       </w:pPr>
-      <w:hyperlink w:anchor="_Toc243335853" w:history="1">
+      <w:hyperlink w:anchor="_Toc243336233" w:history="1">
         <w:r>
           <w:rPr>
             <w:rStyle w:val="Hyperlink"/>
@@ -1280,7 +1280,7 @@
             <w:noProof/>
             <w:webHidden/>
           </w:rPr>
-          <w:instrText xml:space="preserve"> PAGEREF _Toc243335853 \h </w:instrText>
+          <w:instrText xml:space="preserve"> PAGEREF _Toc243336233 \h </w:instrText>
         </w:r>
         <w:r>
           <w:rPr>
@@ -1327,7 +1327,7 @@
           <w14:ligatures w14:val="standardContextual"/>
         </w:rPr>
       </w:pPr>
-      <w:hyperlink w:anchor="_Toc243335854" w:history="1">
+      <w:hyperlink w:anchor="_Toc243336234" w:history="1">
         <w:r>
           <w:rPr>
             <w:rStyle w:val="Hyperlink"/>
@@ -1354,7 +1354,7 @@
             <w:noProof/>
             <w:webHidden/>
           </w:rPr>
-          <w:instrText xml:space="preserve"> PAGEREF _Toc243335854 \h </w:instrText>
+          <w:instrText xml:space="preserve"> PAGEREF _Toc243336234 \h </w:instrText>
         </w:r>
         <w:r>
           <w:rPr>
@@ -1401,7 +1401,7 @@
           <w14:ligatures w14:val="standardContextual"/>
         </w:rPr>
       </w:pPr>
-      <w:hyperlink w:anchor="_Toc243335855" w:history="1">
+      <w:hyperlink w:anchor="_Toc243336235" w:history="1">
         <w:r>
           <w:rPr>
             <w:rStyle w:val="Hyperlink"/>
@@ -1428,7 +1428,7 @@
             <w:noProof/>
             <w:webHidden/>
           </w:rPr>
-          <w:instrText xml:space="preserve"> PAGEREF _Toc243335855 \h </w:instrText>
+          <w:instrText xml:space="preserve"> PAGEREF _Toc243336235 \h </w:instrText>
         </w:r>
         <w:r>
           <w:rPr>
@@ -1475,7 +1475,7 @@
           <w14:ligatures w14:val="standardContextual"/>
         </w:rPr>
       </w:pPr>
-      <w:hyperlink w:anchor="_Toc243335856" w:history="1">
+      <w:hyperlink w:anchor="_Toc243336236" w:history="1">
         <w:r>
           <w:rPr>
             <w:rStyle w:val="Hyperlink"/>
@@ -1502,7 +1502,7 @@
             <w:noProof/>
             <w:webHidden/>
           </w:rPr>
-          <w:instrText xml:space="preserve"> PAGEREF _Toc243335856 \h </w:instrText>
+          <w:instrText xml:space="preserve"> PAGEREF _Toc243336236 \h </w:instrText>
         </w:r>
         <w:r>
           <w:rPr>
@@ -1549,7 +1549,7 @@
           <w14:ligatures w14:val="standardContextual"/>
         </w:rPr>
       </w:pPr>
-      <w:hyperlink w:anchor="_Toc243335857" w:history="1">
+      <w:hyperlink w:anchor="_Toc243336237" w:history="1">
         <w:r>
           <w:rPr>
             <w:rStyle w:val="Hyperlink"/>
@@ -1576,7 +1576,7 @@
             <w:noProof/>
             <w:webHidden/>
           </w:rPr>
-          <w:instrText xml:space="preserve"> PAGEREF _Toc243335857 \h </w:instrText>
+          <w:instrText xml:space="preserve"> PAGEREF _Toc243336237 \h </w:instrText>
         </w:r>
         <w:r>
           <w:rPr>
@@ -1623,7 +1623,7 @@
           <w14:ligatures w14:val="standardContextual"/>
         </w:rPr>
       </w:pPr>
-      <w:hyperlink w:anchor="_Toc243335858" w:history="1">
+      <w:hyperlink w:anchor="_Toc243336238" w:history="1">
         <w:r>
           <w:rPr>
             <w:rStyle w:val="Hyperlink"/>
@@ -1650,7 +1650,7 @@
             <w:noProof/>
             <w:webHidden/>
           </w:rPr>
-          <w:instrText xml:space="preserve"> PAGEREF _Toc243335858 \h </w:instrText>
+          <w:instrText xml:space="preserve"> PAGEREF _Toc243336238 \h </w:instrText>
         </w:r>
         <w:r>
           <w:rPr>
@@ -1697,7 +1697,7 @@
           <w14:ligatures w14:val="standardContextual"/>
         </w:rPr>
       </w:pPr>
-      <w:hyperlink w:anchor="_Toc243335859" w:history="1">
+      <w:hyperlink w:anchor="_Toc243336239" w:history="1">
         <w:r>
           <w:rPr>
             <w:rStyle w:val="Hyperlink"/>
@@ -1724,7 +1724,7 @@
             <w:noProof/>
             <w:webHidden/>
           </w:rPr>
-          <w:instrText xml:space="preserve"> PAGEREF _Toc243335859 \h </w:instrText>
+          <w:instrText xml:space="preserve"> PAGEREF _Toc243336239 \h </w:instrText>
         </w:r>
         <w:r>
           <w:rPr>
@@ -1771,7 +1771,7 @@
           <w14:ligatures w14:val="standardContextual"/>
         </w:rPr>
       </w:pPr>
-      <w:hyperlink w:anchor="_Toc243335860" w:history="1">
+      <w:hyperlink w:anchor="_Toc243336240" w:history="1">
         <w:r>
           <w:rPr>
             <w:rStyle w:val="Hyperlink"/>
@@ -1798,7 +1798,7 @@
             <w:noProof/>
             <w:webHidden/>
           </w:rPr>
-          <w:instrText xml:space="preserve"> PAGEREF _Toc243335860 \h </w:instrText>
+          <w:instrText xml:space="preserve"> PAGEREF _Toc243336240 \h </w:instrText>
         </w:r>
         <w:r>
           <w:rPr>
@@ -1845,7 +1845,7 @@
           <w14:ligatures w14:val="standardContextual"/>
         </w:rPr>
       </w:pPr>
-      <w:hyperlink w:anchor="_Toc243335861" w:history="1">
+      <w:hyperlink w:anchor="_Toc243336241" w:history="1">
         <w:r>
           <w:rPr>
             <w:rStyle w:val="Hyperlink"/>
@@ -1872,7 +1872,7 @@
             <w:noProof/>
             <w:webHidden/>
           </w:rPr>
-          <w:instrText xml:space="preserve"> PAGEREF _Toc243335861 \h </w:instrText>
+          <w:instrText xml:space="preserve"> PAGEREF _Toc243336241 \h </w:instrText>
         </w:r>
         <w:r>
           <w:rPr>
@@ -1919,7 +1919,7 @@
           <w14:ligatures w14:val="standardContextual"/>
         </w:rPr>
       </w:pPr>
-      <w:hyperlink w:anchor="_Toc243335862" w:history="1">
+      <w:hyperlink w:anchor="_Toc243336242" w:history="1">
         <w:r>
           <w:rPr>
             <w:rStyle w:val="Hyperlink"/>
@@ -1946,7 +1946,7 @@
             <w:noProof/>
             <w:webHidden/>
           </w:rPr>
-          <w:instrText xml:space="preserve"> PAGEREF _Toc243335862 \h </w:instrText>
+          <w:instrText xml:space="preserve"> PAGEREF _Toc243336242 \h </w:instrText>
         </w:r>
         <w:r>
           <w:rPr>
@@ -1993,7 +1993,7 @@
           <w14:ligatures w14:val="standardContextual"/>
         </w:rPr>
       </w:pPr>
-      <w:hyperlink w:anchor="_Toc243335863" w:history="1">
+      <w:hyperlink w:anchor="_Toc243336243" w:history="1">
         <w:r>
           <w:rPr>
             <w:rStyle w:val="Hyperlink"/>
@@ -2020,7 +2020,7 @@
             <w:noProof/>
             <w:webHidden/>
           </w:rPr>
-          <w:instrText xml:space="preserve"> PAGEREF _Toc243335863 \h </w:instrText>
+          <w:instrText xml:space="preserve"> PAGEREF _Toc243336243 \h </w:instrText>
         </w:r>
         <w:r>
           <w:rPr>
@@ -2067,7 +2067,7 @@
           <w14:ligatures w14:val="standardContextual"/>
         </w:rPr>
       </w:pPr>
-      <w:hyperlink w:anchor="_Toc243335864" w:history="1">
+      <w:hyperlink w:anchor="_Toc243336244" w:history="1">
         <w:r>
           <w:rPr>
             <w:rStyle w:val="Hyperlink"/>
@@ -2094,7 +2094,7 @@
             <w:noProof/>
             <w:webHidden/>
           </w:rPr>
-          <w:instrText xml:space="preserve"> PAGEREF _Toc243335864 \h </w:instrText>
+          <w:instrText xml:space="preserve"> PAGEREF _Toc243336244 \h </w:instrText>
         </w:r>
         <w:r>
           <w:rPr>
@@ -2141,7 +2141,7 @@
           <w14:ligatures w14:val="standardContextual"/>
         </w:rPr>
       </w:pPr>
-      <w:hyperlink w:anchor="_Toc243335865" w:history="1">
+      <w:hyperlink w:anchor="_Toc243336245" w:history="1">
         <w:r>
           <w:rPr>
             <w:rStyle w:val="Hyperlink"/>
@@ -2168,7 +2168,7 @@
             <w:noProof/>
             <w:webHidden/>
           </w:rPr>
-          <w:instrText xml:space="preserve"> PAGEREF _Toc243335865 \h </w:instrText>
+          <w:instrText xml:space="preserve"> PAGEREF _Toc243336245 \h </w:instrText>
         </w:r>
         <w:r>
           <w:rPr>
@@ -2215,7 +2215,7 @@
           <w14:ligatures w14:val="standardContextual"/>
         </w:rPr>
       </w:pPr>
-      <w:hyperlink w:anchor="_Toc243335866" w:history="1">
+      <w:hyperlink w:anchor="_Toc243336246" w:history="1">
         <w:r>
           <w:rPr>
             <w:rStyle w:val="Hyperlink"/>
@@ -2242,7 +2242,7 @@
             <w:noProof/>
             <w:webHidden/>
           </w:rPr>
-          <w:instrText xml:space="preserve"> PAGEREF _Toc243335866 \h </w:instrText>
+          <w:instrText xml:space="preserve"> PAGEREF _Toc243336246 \h </w:instrText>
         </w:r>
         <w:r>
           <w:rPr>
@@ -2289,7 +2289,7 @@
           <w14:ligatures w14:val="standardContextual"/>
         </w:rPr>
       </w:pPr>
-      <w:hyperlink w:anchor="_Toc243335867" w:history="1">
+      <w:hyperlink w:anchor="_Toc243336247" w:history="1">
         <w:r>
           <w:rPr>
             <w:rStyle w:val="Hyperlink"/>
@@ -2316,7 +2316,7 @@
             <w:noProof/>
             <w:webHidden/>
           </w:rPr>
-          <w:instrText xml:space="preserve"> PAGEREF _Toc243335867 \h </w:instrText>
+          <w:instrText xml:space="preserve"> PAGEREF _Toc243336247 \h </w:instrText>
         </w:r>
         <w:r>
           <w:rPr>
@@ -2363,7 +2363,7 @@
           <w14:ligatures w14:val="standardContextual"/>
         </w:rPr>
       </w:pPr>
-      <w:hyperlink w:anchor="_Toc243335868" w:history="1">
+      <w:hyperlink w:anchor="_Toc243336248" w:history="1">
         <w:r>
           <w:rPr>
             <w:rStyle w:val="Hyperlink"/>
@@ -2390,7 +2390,7 @@
             <w:noProof/>
             <w:webHidden/>
           </w:rPr>
-          <w:instrText xml:space="preserve"> PAGEREF _Toc243335868 \h </w:instrText>
+          <w:instrText xml:space="preserve"> PAGEREF _Toc243336248 \h </w:instrText>
         </w:r>
         <w:r>
           <w:rPr>
@@ -2437,7 +2437,7 @@
           <w14:ligatures w14:val="standardContextual"/>
         </w:rPr>
       </w:pPr>
-      <w:hyperlink w:anchor="_Toc243335869" w:history="1">
+      <w:hyperlink w:anchor="_Toc243336249" w:history="1">
         <w:r>
           <w:rPr>
             <w:rStyle w:val="Hyperlink"/>
@@ -2464,7 +2464,7 @@
             <w:noProof/>
             <w:webHidden/>
           </w:rPr>
-          <w:instrText xml:space="preserve"> PAGEREF _Toc243335869 \h </w:instrText>
+          <w:instrText xml:space="preserve"> PAGEREF _Toc243336249 \h </w:instrText>
         </w:r>
         <w:r>
           <w:rPr>
@@ -2511,7 +2511,7 @@
           <w14:ligatures w14:val="standardContextual"/>
         </w:rPr>
       </w:pPr>
-      <w:hyperlink w:anchor="_Toc243335870" w:history="1">
+      <w:hyperlink w:anchor="_Toc243336250" w:history="1">
         <w:r>
           <w:rPr>
             <w:rStyle w:val="Hyperlink"/>
@@ -2538,7 +2538,7 @@
             <w:noProof/>
             <w:webHidden/>
           </w:rPr>
-          <w:instrText xml:space="preserve"> PAGEREF _Toc243335870 \h </w:instrText>
+          <w:instrText xml:space="preserve"> PAGEREF _Toc243336250 \h </w:instrText>
         </w:r>
         <w:r>
           <w:rPr>
@@ -2585,7 +2585,7 @@
           <w14:ligatures w14:val="standardContextual"/>
         </w:rPr>
       </w:pPr>
-      <w:hyperlink w:anchor="_Toc243335871" w:history="1">
+      <w:hyperlink w:anchor="_Toc243336251" w:history="1">
         <w:r>
           <w:rPr>
             <w:rStyle w:val="Hyperlink"/>
@@ -2612,7 +2612,7 @@
             <w:noProof/>
             <w:webHidden/>
           </w:rPr>
-          <w:instrText xml:space="preserve"> PAGEREF _Toc243335871 \h </w:instrText>
+          <w:instrText xml:space="preserve"> PAGEREF _Toc243336251 \h </w:instrText>
         </w:r>
         <w:r>
           <w:rPr>
@@ -2659,7 +2659,7 @@
           <w14:ligatures w14:val="standardContextual"/>
         </w:rPr>
       </w:pPr>
-      <w:hyperlink w:anchor="_Toc243335872" w:history="1">
+      <w:hyperlink w:anchor="_Toc243336252" w:history="1">
         <w:r>
           <w:rPr>
             <w:rStyle w:val="Hyperlink"/>
@@ -2686,7 +2686,7 @@
             <w:noProof/>
             <w:webHidden/>
           </w:rPr>
-          <w:instrText xml:space="preserve"> PAGEREF _Toc243335872 \h </w:instrText>
+          <w:instrText xml:space="preserve"> PAGEREF _Toc243336252 \h </w:instrText>
         </w:r>
         <w:r>
           <w:rPr>
@@ -2733,7 +2733,7 @@
           <w14:ligatures w14:val="standardContextual"/>
         </w:rPr>
       </w:pPr>
-      <w:hyperlink w:anchor="_Toc243335873" w:history="1">
+      <w:hyperlink w:anchor="_Toc243336253" w:history="1">
         <w:r>
           <w:rPr>
             <w:rStyle w:val="Hyperlink"/>
@@ -2760,7 +2760,7 @@
             <w:noProof/>
             <w:webHidden/>
           </w:rPr>
-          <w:instrText xml:space="preserve"> PAGEREF _Toc243335873 \h </w:instrText>
+          <w:instrText xml:space="preserve"> PAGEREF _Toc243336253 \h </w:instrText>
         </w:r>
         <w:r>
           <w:rPr>
@@ -2807,7 +2807,7 @@
           <w14:ligatures w14:val="standardContextual"/>
         </w:rPr>
       </w:pPr>
-      <w:hyperlink w:anchor="_Toc243335874" w:history="1">
+      <w:hyperlink w:anchor="_Toc243336254" w:history="1">
         <w:r>
           <w:rPr>
             <w:rStyle w:val="Hyperlink"/>
@@ -2834,7 +2834,7 @@
             <w:noProof/>
             <w:webHidden/>
           </w:rPr>
-          <w:instrText xml:space="preserve"> PAGEREF _Toc243335874 \h </w:instrText>
+          <w:instrText xml:space="preserve"> PAGEREF _Toc243336254 \h </w:instrText>
         </w:r>
         <w:r>
           <w:rPr>
@@ -2881,7 +2881,7 @@
           <w14:ligatures w14:val="standardContextual"/>
         </w:rPr>
       </w:pPr>
-      <w:hyperlink w:anchor="_Toc243335875" w:history="1">
+      <w:hyperlink w:anchor="_Toc243336255" w:history="1">
         <w:r>
           <w:rPr>
             <w:rStyle w:val="Hyperlink"/>
@@ -2908,7 +2908,7 @@
             <w:noProof/>
             <w:webHidden/>
           </w:rPr>
-          <w:instrText xml:space="preserve"> PAGEREF _Toc243335875 \h </w:instrText>
+          <w:instrText xml:space="preserve"> PAGEREF _Toc243336255 \h </w:instrText>
         </w:r>
         <w:r>
           <w:rPr>
@@ -2955,7 +2955,7 @@
           <w14:ligatures w14:val="standardContextual"/>
         </w:rPr>
       </w:pPr>
-      <w:hyperlink w:anchor="_Toc243335876" w:history="1">
+      <w:hyperlink w:anchor="_Toc243336256" w:history="1">
         <w:r>
           <w:rPr>
             <w:rStyle w:val="Hyperlink"/>
@@ -2982,7 +2982,7 @@
             <w:noProof/>
             <w:webHidden/>
           </w:rPr>
-          <w:instrText xml:space="preserve"> PAGEREF _Toc243335876 \h </w:instrText>
+          <w:instrText xml:space="preserve"> PAGEREF _Toc243336256 \h </w:instrText>
         </w:r>
         <w:r>
           <w:rPr>
@@ -3029,7 +3029,7 @@
           <w14:ligatures w14:val="standardContextual"/>
         </w:rPr>
       </w:pPr>
-      <w:hyperlink w:anchor="_Toc243335877" w:history="1">
+      <w:hyperlink w:anchor="_Toc243336257" w:history="1">
         <w:r>
           <w:rPr>
             <w:rStyle w:val="Hyperlink"/>
@@ -3056,7 +3056,7 @@
             <w:noProof/>
             <w:webHidden/>
           </w:rPr>
-          <w:instrText xml:space="preserve"> PAGEREF _Toc243335877 \h </w:instrText>
+          <w:instrText xml:space="preserve"> PAGEREF _Toc243336257 \h </w:instrText>
         </w:r>
         <w:r>
           <w:rPr>
@@ -3103,7 +3103,7 @@
           <w14:ligatures w14:val="standardContextual"/>
         </w:rPr>
       </w:pPr>
-      <w:hyperlink w:anchor="_Toc243335878" w:history="1">
+      <w:hyperlink w:anchor="_Toc243336258" w:history="1">
         <w:r>
           <w:rPr>
             <w:rStyle w:val="Hyperlink"/>
@@ -3130,7 +3130,7 @@
             <w:noProof/>
             <w:webHidden/>
           </w:rPr>
-          <w:instrText xml:space="preserve"> PAGEREF _Toc243335878 \h </w:instrText>
+          <w:instrText xml:space="preserve"> PAGEREF _Toc243336258 \h </w:instrText>
         </w:r>
         <w:r>
           <w:rPr>
@@ -3177,7 +3177,7 @@
           <w14:ligatures w14:val="standardContextual"/>
         </w:rPr>
       </w:pPr>
-      <w:hyperlink w:anchor="_Toc243335879" w:history="1">
+      <w:hyperlink w:anchor="_Toc243336259" w:history="1">
         <w:r>
           <w:rPr>
             <w:rStyle w:val="Hyperlink"/>
@@ -3204,7 +3204,7 @@
             <w:noProof/>
             <w:webHidden/>
           </w:rPr>
-          <w:instrText xml:space="preserve"> PAGEREF _Toc243335879 \h </w:instrText>
+          <w:instrText xml:space="preserve"> PAGEREF _Toc243336259 \h </w:instrText>
         </w:r>
         <w:r>
           <w:rPr>
@@ -3251,7 +3251,7 @@
           <w14:ligatures w14:val="standardContextual"/>
         </w:rPr>
       </w:pPr>
-      <w:hyperlink w:anchor="_Toc243335880" w:history="1">
+      <w:hyperlink w:anchor="_Toc243336260" w:history="1">
         <w:r>
           <w:rPr>
             <w:rStyle w:val="Hyperlink"/>
@@ -3278,7 +3278,7 @@
             <w:noProof/>
             <w:webHidden/>
           </w:rPr>
-          <w:instrText xml:space="preserve"> PAGEREF _Toc243335880 \h </w:instrText>
+          <w:instrText xml:space="preserve"> PAGEREF _Toc243336260 \h </w:instrText>
         </w:r>
         <w:r>
           <w:rPr>
@@ -3325,7 +3325,7 @@
           <w14:ligatures w14:val="standardContextual"/>
         </w:rPr>
       </w:pPr>
-      <w:hyperlink w:anchor="_Toc243335881" w:history="1">
+      <w:hyperlink w:anchor="_Toc243336261" w:history="1">
         <w:r>
           <w:rPr>
             <w:rStyle w:val="Hyperlink"/>
@@ -3352,7 +3352,7 @@
             <w:noProof/>
             <w:webHidden/>
           </w:rPr>
-          <w:instrText xml:space="preserve"> PAGEREF _Toc243335881 \h </w:instrText>
+          <w:instrText xml:space="preserve"> PAGEREF _Toc243336261 \h </w:instrText>
         </w:r>
         <w:r>
           <w:rPr>
@@ -3399,7 +3399,7 @@
           <w14:ligatures w14:val="standardContextual"/>
         </w:rPr>
       </w:pPr>
-      <w:hyperlink w:anchor="_Toc243335882" w:history="1">
+      <w:hyperlink w:anchor="_Toc243336262" w:history="1">
         <w:r>
           <w:rPr>
             <w:rStyle w:val="Hyperlink"/>
@@ -3426,7 +3426,7 @@
             <w:noProof/>
             <w:webHidden/>
           </w:rPr>
-          <w:instrText xml:space="preserve"> PAGEREF _Toc243335882 \h </w:instrText>
+          <w:instrText xml:space="preserve"> PAGEREF _Toc243336262 \h </w:instrText>
         </w:r>
         <w:r>
           <w:rPr>
@@ -3473,7 +3473,7 @@
           <w14:ligatures w14:val="standardContextual"/>
         </w:rPr>
       </w:pPr>
-      <w:hyperlink w:anchor="_Toc243335883" w:history="1">
+      <w:hyperlink w:anchor="_Toc243336263" w:history="1">
         <w:r>
           <w:rPr>
             <w:rStyle w:val="Hyperlink"/>
@@ -3500,7 +3500,7 @@
             <w:noProof/>
             <w:webHidden/>
           </w:rPr>
-          <w:instrText xml:space="preserve"> PAGEREF _Toc243335883 \h </w:instrText>
+          <w:instrText xml:space="preserve"> PAGEREF _Toc243336263 \h </w:instrText>
         </w:r>
         <w:r>
           <w:rPr>
@@ -3547,7 +3547,7 @@
           <w14:ligatures w14:val="standardContextual"/>
         </w:rPr>
       </w:pPr>
-      <w:hyperlink w:anchor="_Toc243335884" w:history="1">
+      <w:hyperlink w:anchor="_Toc243336264" w:history="1">
         <w:r>
           <w:rPr>
             <w:rStyle w:val="Hyperlink"/>
@@ -3574,7 +3574,7 @@
             <w:noProof/>
             <w:webHidden/>
           </w:rPr>
-          <w:instrText xml:space="preserve"> PAGEREF _Toc243335884 \h </w:instrText>
+          <w:instrText xml:space="preserve"> PAGEREF _Toc243336264 \h </w:instrText>
         </w:r>
         <w:r>
           <w:rPr>
@@ -3621,7 +3621,7 @@
           <w14:ligatures w14:val="standardContextual"/>
         </w:rPr>
       </w:pPr>
-      <w:hyperlink w:anchor="_Toc243335885" w:history="1">
+      <w:hyperlink w:anchor="_Toc243336265" w:history="1">
         <w:r>
           <w:rPr>
             <w:rStyle w:val="Hyperlink"/>
@@ -3648,7 +3648,7 @@
             <w:noProof/>
             <w:webHidden/>
           </w:rPr>
-          <w:instrText xml:space="preserve"> PAGEREF _Toc243335885 \h </w:instrText>
+          <w:instrText xml:space="preserve"> PAGEREF _Toc243336265 \h </w:instrText>
         </w:r>
         <w:r>
           <w:rPr>
@@ -3695,7 +3695,7 @@
           <w14:ligatures w14:val="standardContextual"/>
         </w:rPr>
       </w:pPr>
-      <w:hyperlink w:anchor="_Toc243335886" w:history="1">
+      <w:hyperlink w:anchor="_Toc243336266" w:history="1">
         <w:r>
           <w:rPr>
             <w:rStyle w:val="Hyperlink"/>
@@ -3722,7 +3722,7 @@
             <w:noProof/>
             <w:webHidden/>
           </w:rPr>
-          <w:instrText xml:space="preserve"> PAGEREF _Toc243335886 \h </w:instrText>
+          <w:instrText xml:space="preserve"> PAGEREF _Toc243336266 \h </w:instrText>
         </w:r>
         <w:r>
           <w:rPr>
@@ -3769,7 +3769,7 @@
           <w14:ligatures w14:val="standardContextual"/>
         </w:rPr>
       </w:pPr>
-      <w:hyperlink w:anchor="_Toc243335887" w:history="1">
+      <w:hyperlink w:anchor="_Toc243336267" w:history="1">
         <w:r>
           <w:rPr>
             <w:rStyle w:val="Hyperlink"/>
@@ -3796,7 +3796,7 @@
             <w:noProof/>
             <w:webHidden/>
           </w:rPr>
-          <w:instrText xml:space="preserve"> PAGEREF _Toc243335887 \h </w:instrText>
+          <w:instrText xml:space="preserve"> PAGEREF _Toc243336267 \h </w:instrText>
         </w:r>
         <w:r>
           <w:rPr>
@@ -3843,7 +3843,7 @@
           <w14:ligatures w14:val="standardContextual"/>
         </w:rPr>
       </w:pPr>
-      <w:hyperlink w:anchor="_Toc243335888" w:history="1">
+      <w:hyperlink w:anchor="_Toc243336268" w:history="1">
         <w:r>
           <w:rPr>
             <w:rStyle w:val="Hyperlink"/>
@@ -3870,7 +3870,7 @@
             <w:noProof/>
             <w:webHidden/>
           </w:rPr>
-          <w:instrText xml:space="preserve"> PAGEREF _Toc243335888 \h </w:instrText>
+          <w:instrText xml:space="preserve"> PAGEREF _Toc243336268 \h </w:instrText>
         </w:r>
         <w:r>
           <w:rPr>
@@ -3917,7 +3917,7 @@
           <w14:ligatures w14:val="standardContextual"/>
         </w:rPr>
       </w:pPr>
-      <w:hyperlink w:anchor="_Toc243335889" w:history="1">
+      <w:hyperlink w:anchor="_Toc243336269" w:history="1">
         <w:r>
           <w:rPr>
             <w:rStyle w:val="Hyperlink"/>
@@ -3944,7 +3944,7 @@
             <w:noProof/>
             <w:webHidden/>
           </w:rPr>
-          <w:instrText xml:space="preserve"> PAGEREF _Toc243335889 \h </w:instrText>
+          <w:instrText xml:space="preserve"> PAGEREF _Toc243336269 \h </w:instrText>
         </w:r>
         <w:r>
           <w:rPr>
@@ -3991,7 +3991,7 @@
           <w14:ligatures w14:val="standardContextual"/>
         </w:rPr>
       </w:pPr>
-      <w:hyperlink w:anchor="_Toc243335890" w:history="1">
+      <w:hyperlink w:anchor="_Toc243336270" w:history="1">
         <w:r>
           <w:rPr>
             <w:rStyle w:val="Hyperlink"/>
@@ -4018,7 +4018,7 @@
             <w:noProof/>
             <w:webHidden/>
           </w:rPr>
-          <w:instrText xml:space="preserve"> PAGEREF _Toc243335890 \h </w:instrText>
+          <w:instrText xml:space="preserve"> PAGEREF _Toc243336270 \h </w:instrText>
         </w:r>
         <w:r>
           <w:rPr>
@@ -4065,7 +4065,7 @@
           <w14:ligatures w14:val="standardContextual"/>
         </w:rPr>
       </w:pPr>
-      <w:hyperlink w:anchor="_Toc243335891" w:history="1">
+      <w:hyperlink w:anchor="_Toc243336271" w:history="1">
         <w:r>
           <w:rPr>
             <w:rStyle w:val="Hyperlink"/>
@@ -4092,7 +4092,7 @@
             <w:noProof/>
             <w:webHidden/>
           </w:rPr>
-          <w:instrText xml:space="preserve"> PAGEREF _Toc243335891 \h </w:instrText>
+          <w:instrText xml:space="preserve"> PAGEREF _Toc243336271 \h </w:instrText>
         </w:r>
         <w:r>
           <w:rPr>
@@ -4139,7 +4139,7 @@
           <w14:ligatures w14:val="standardContextual"/>
         </w:rPr>
       </w:pPr>
-      <w:hyperlink w:anchor="_Toc243335892" w:history="1">
+      <w:hyperlink w:anchor="_Toc243336272" w:history="1">
         <w:r>
           <w:rPr>
             <w:rStyle w:val="Hyperlink"/>
@@ -4166,7 +4166,7 @@
             <w:noProof/>
             <w:webHidden/>
           </w:rPr>
-          <w:instrText xml:space="preserve"> PAGEREF _Toc243335892 \h </w:instrText>
+          <w:instrText xml:space="preserve"> PAGEREF _Toc243336272 \h </w:instrText>
         </w:r>
         <w:r>
           <w:rPr>
@@ -4213,7 +4213,7 @@
           <w14:ligatures w14:val="standardContextual"/>
         </w:rPr>
       </w:pPr>
-      <w:hyperlink w:anchor="_Toc243335893" w:history="1">
+      <w:hyperlink w:anchor="_Toc243336273" w:history="1">
         <w:r>
           <w:rPr>
             <w:rStyle w:val="Hyperlink"/>
@@ -4240,7 +4240,7 @@
             <w:noProof/>
             <w:webHidden/>
           </w:rPr>
-          <w:instrText xml:space="preserve"> PAGEREF _Toc243335893 \h </w:instrText>
+          <w:instrText xml:space="preserve"> PAGEREF _Toc243336273 \h </w:instrText>
         </w:r>
         <w:r>
           <w:rPr>
@@ -4287,7 +4287,7 @@
           <w14:ligatures w14:val="standardContextual"/>
         </w:rPr>
       </w:pPr>
-      <w:hyperlink w:anchor="_Toc243335894" w:history="1">
+      <w:hyperlink w:anchor="_Toc243336274" w:history="1">
         <w:r>
           <w:rPr>
             <w:rStyle w:val="Hyperlink"/>
@@ -4314,7 +4314,7 @@
             <w:noProof/>
             <w:webHidden/>
           </w:rPr>
-          <w:instrText xml:space="preserve"> PAGEREF _Toc243335894 \h </w:instrText>
+          <w:instrText xml:space="preserve"> PAGEREF _Toc243336274 \h </w:instrText>
         </w:r>
         <w:r>
           <w:rPr>
@@ -4361,7 +4361,7 @@
           <w14:ligatures w14:val="standardContextual"/>
         </w:rPr>
       </w:pPr>
-      <w:hyperlink w:anchor="_Toc243335895" w:history="1">
+      <w:hyperlink w:anchor="_Toc243336275" w:history="1">
         <w:r>
           <w:rPr>
             <w:rStyle w:val="Hyperlink"/>
@@ -4388,7 +4388,7 @@
             <w:noProof/>
             <w:webHidden/>
           </w:rPr>
-          <w:instrText xml:space="preserve"> PAGEREF _Toc243335895 \h </w:instrText>
+          <w:instrText xml:space="preserve"> PAGEREF _Toc243336275 \h </w:instrText>
         </w:r>
         <w:r>
           <w:rPr>
@@ -4435,7 +4435,7 @@
           <w14:ligatures w14:val="standardContextual"/>
         </w:rPr>
       </w:pPr>
-      <w:hyperlink w:anchor="_Toc243335896" w:history="1">
+      <w:hyperlink w:anchor="_Toc243336276" w:history="1">
         <w:r>
           <w:rPr>
             <w:rStyle w:val="Hyperlink"/>
@@ -4462,7 +4462,7 @@
             <w:noProof/>
             <w:webHidden/>
           </w:rPr>
-          <w:instrText xml:space="preserve"> PAGEREF _Toc243335896 \h </w:instrText>
+          <w:instrText xml:space="preserve"> PAGEREF _Toc243336276 \h </w:instrText>
         </w:r>
         <w:r>
           <w:rPr>
@@ -4509,7 +4509,7 @@
           <w14:ligatures w14:val="standardContextual"/>
         </w:rPr>
       </w:pPr>
-      <w:hyperlink w:anchor="_Toc243335897" w:history="1">
+      <w:hyperlink w:anchor="_Toc243336277" w:history="1">
         <w:r>
           <w:rPr>
             <w:rStyle w:val="Hyperlink"/>
@@ -4536,7 +4536,7 @@
             <w:noProof/>
             <w:webHidden/>
           </w:rPr>
-          <w:instrText xml:space="preserve"> PAGEREF _Toc243335897 \h </w:instrText>
+          <w:instrText xml:space="preserve"> PAGEREF _Toc243336277 \h </w:instrText>
         </w:r>
         <w:r>
           <w:rPr>
@@ -4583,7 +4583,7 @@
           <w14:ligatures w14:val="standardContextual"/>
         </w:rPr>
       </w:pPr>
-      <w:hyperlink w:anchor="_Toc243335898" w:history="1">
+      <w:hyperlink w:anchor="_Toc243336278" w:history="1">
         <w:r>
           <w:rPr>
             <w:rStyle w:val="Hyperlink"/>
@@ -4610,7 +4610,7 @@
             <w:noProof/>
             <w:webHidden/>
           </w:rPr>
-          <w:instrText xml:space="preserve"> PAGEREF _Toc243335898 \h </w:instrText>
+          <w:instrText xml:space="preserve"> PAGEREF _Toc243336278 \h </w:instrText>
         </w:r>
         <w:r>
           <w:rPr>
@@ -4657,7 +4657,7 @@
           <w14:ligatures w14:val="standardContextual"/>
         </w:rPr>
       </w:pPr>
-      <w:hyperlink w:anchor="_Toc243335899" w:history="1">
+      <w:hyperlink w:anchor="_Toc243336279" w:history="1">
         <w:r>
           <w:rPr>
             <w:rStyle w:val="Hyperlink"/>
@@ -4684,7 +4684,7 @@
             <w:noProof/>
             <w:webHidden/>
           </w:rPr>
-          <w:instrText xml:space="preserve"> PAGEREF _Toc243335899 \h </w:instrText>
+          <w:instrText xml:space="preserve"> PAGEREF _Toc243336279 \h </w:instrText>
         </w:r>
         <w:r>
           <w:rPr>
@@ -4731,7 +4731,7 @@
           <w14:ligatures w14:val="standardContextual"/>
         </w:rPr>
       </w:pPr>
-      <w:hyperlink w:anchor="_Toc243335900" w:history="1">
+      <w:hyperlink w:anchor="_Toc243336280" w:history="1">
         <w:r>
           <w:rPr>
             <w:rStyle w:val="Hyperlink"/>
@@ -4758,7 +4758,7 @@
             <w:noProof/>
             <w:webHidden/>
           </w:rPr>
-          <w:instrText xml:space="preserve"> PAGEREF _Toc243335900 \h </w:instrText>
+          <w:instrText xml:space="preserve"> PAGEREF _Toc243336280 \h </w:instrText>
         </w:r>
         <w:r>
           <w:rPr>
@@ -4805,7 +4805,7 @@
           <w14:ligatures w14:val="standardContextual"/>
         </w:rPr>
       </w:pPr>
-      <w:hyperlink w:anchor="_Toc243335901" w:history="1">
+      <w:hyperlink w:anchor="_Toc243336281" w:history="1">
         <w:r>
           <w:rPr>
             <w:rStyle w:val="Hyperlink"/>
@@ -4832,7 +4832,7 @@
             <w:noProof/>
             <w:webHidden/>
           </w:rPr>
-          <w:instrText xml:space="preserve"> PAGEREF _Toc243335901 \h </w:instrText>
+          <w:instrText xml:space="preserve"> PAGEREF _Toc243336281 \h </w:instrText>
         </w:r>
         <w:r>
           <w:rPr>
@@ -4879,7 +4879,7 @@
           <w14:ligatures w14:val="standardContextual"/>
         </w:rPr>
       </w:pPr>
-      <w:hyperlink w:anchor="_Toc243335902" w:history="1">
+      <w:hyperlink w:anchor="_Toc243336282" w:history="1">
         <w:r>
           <w:rPr>
             <w:rStyle w:val="Hyperlink"/>
@@ -4906,7 +4906,7 @@
             <w:noProof/>
             <w:webHidden/>
           </w:rPr>
-          <w:instrText xml:space="preserve"> PAGEREF _Toc243335902 \h </w:instrText>
+          <w:instrText xml:space="preserve"> PAGEREF _Toc243336282 \h </w:instrText>
         </w:r>
         <w:r>
           <w:rPr>
@@ -4953,7 +4953,7 @@
           <w14:ligatures w14:val="standardContextual"/>
         </w:rPr>
       </w:pPr>
-      <w:hyperlink w:anchor="_Toc243335903" w:history="1">
+      <w:hyperlink w:anchor="_Toc243336283" w:history="1">
         <w:r>
           <w:rPr>
             <w:rStyle w:val="Hyperlink"/>
@@ -4980,7 +4980,7 @@
             <w:noProof/>
             <w:webHidden/>
           </w:rPr>
-          <w:instrText xml:space="preserve"> PAGEREF _Toc243335903 \h </w:instrText>
+          <w:instrText xml:space="preserve"> PAGEREF _Toc243336283 \h </w:instrText>
         </w:r>
         <w:r>
           <w:rPr>
@@ -5027,7 +5027,7 @@
           <w14:ligatures w14:val="standardContextual"/>
         </w:rPr>
       </w:pPr>
-      <w:hyperlink w:anchor="_Toc243335904" w:history="1">
+      <w:hyperlink w:anchor="_Toc243336284" w:history="1">
         <w:r>
           <w:rPr>
             <w:rStyle w:val="Hyperlink"/>
@@ -5054,7 +5054,7 @@
             <w:noProof/>
             <w:webHidden/>
           </w:rPr>
-          <w:instrText xml:space="preserve"> PAGEREF _Toc243335904 \h </w:instrText>
+          <w:instrText xml:space="preserve"> PAGEREF _Toc243336284 \h </w:instrText>
         </w:r>
         <w:r>
           <w:rPr>
@@ -5101,7 +5101,7 @@
           <w14:ligatures w14:val="standardContextual"/>
         </w:rPr>
       </w:pPr>
-      <w:hyperlink w:anchor="_Toc243335905" w:history="1">
+      <w:hyperlink w:anchor="_Toc243336285" w:history="1">
         <w:r>
           <w:rPr>
             <w:rStyle w:val="Hyperlink"/>
@@ -5128,7 +5128,7 @@
             <w:noProof/>
             <w:webHidden/>
           </w:rPr>
-          <w:instrText xml:space="preserve"> PAGEREF _Toc243335905 \h </w:instrText>
+          <w:instrText xml:space="preserve"> PAGEREF _Toc243336285 \h </w:instrText>
         </w:r>
         <w:r>
           <w:rPr>
@@ -5175,7 +5175,7 @@
           <w14:ligatures w14:val="standardContextual"/>
         </w:rPr>
       </w:pPr>
-      <w:hyperlink w:anchor="_Toc243335906" w:history="1">
+      <w:hyperlink w:anchor="_Toc243336286" w:history="1">
         <w:r>
           <w:rPr>
             <w:rStyle w:val="Hyperlink"/>
@@ -5202,7 +5202,7 @@
             <w:noProof/>
             <w:webHidden/>
           </w:rPr>
-          <w:instrText xml:space="preserve"> PAGEREF _Toc243335906 \h </w:instrText>
+          <w:instrText xml:space="preserve"> PAGEREF _Toc243336286 \h </w:instrText>
         </w:r>
         <w:r>
           <w:rPr>
@@ -5249,7 +5249,7 @@
           <w14:ligatures w14:val="standardContextual"/>
         </w:rPr>
       </w:pPr>
-      <w:hyperlink w:anchor="_Toc243335907" w:history="1">
+      <w:hyperlink w:anchor="_Toc243336287" w:history="1">
         <w:r>
           <w:rPr>
             <w:rStyle w:val="Hyperlink"/>
@@ -5276,7 +5276,7 @@
             <w:noProof/>
             <w:webHidden/>
           </w:rPr>
-          <w:instrText xml:space="preserve"> PAGEREF _Toc243335907 \h </w:instrText>
+          <w:instrText xml:space="preserve"> PAGEREF _Toc243336287 \h </w:instrText>
         </w:r>
         <w:r>
           <w:rPr>
@@ -5323,7 +5323,7 @@
           <w14:ligatures w14:val="standardContextual"/>
         </w:rPr>
       </w:pPr>
-      <w:hyperlink w:anchor="_Toc243335908" w:history="1">
+      <w:hyperlink w:anchor="_Toc243336288" w:history="1">
         <w:r>
           <w:rPr>
             <w:rStyle w:val="Hyperlink"/>
@@ -5350,7 +5350,7 @@
             <w:noProof/>
             <w:webHidden/>
           </w:rPr>
-          <w:instrText xml:space="preserve"> PAGEREF _Toc243335908 \h </w:instrText>
+          <w:instrText xml:space="preserve"> PAGEREF _Toc243336288 \h </w:instrText>
         </w:r>
         <w:r>
           <w:rPr>
@@ -5397,7 +5397,7 @@
           <w14:ligatures w14:val="standardContextual"/>
         </w:rPr>
       </w:pPr>
-      <w:hyperlink w:anchor="_Toc243335909" w:history="1">
+      <w:hyperlink w:anchor="_Toc243336289" w:history="1">
         <w:r>
           <w:rPr>
             <w:rStyle w:val="Hyperlink"/>
@@ -5424,7 +5424,7 @@
             <w:noProof/>
             <w:webHidden/>
           </w:rPr>
-          <w:instrText xml:space="preserve"> PAGEREF _Toc243335909 \h </w:instrText>
+          <w:instrText xml:space="preserve"> PAGEREF _Toc243336289 \h </w:instrText>
         </w:r>
         <w:r>
           <w:rPr>
@@ -5471,7 +5471,7 @@
           <w14:ligatures w14:val="standardContextual"/>
         </w:rPr>
       </w:pPr>
-      <w:hyperlink w:anchor="_Toc243335910" w:history="1">
+      <w:hyperlink w:anchor="_Toc243336290" w:history="1">
         <w:r>
           <w:rPr>
             <w:rStyle w:val="Hyperlink"/>
@@ -5498,7 +5498,7 @@
             <w:noProof/>
             <w:webHidden/>
           </w:rPr>
-          <w:instrText xml:space="preserve"> PAGEREF _Toc243335910 \h </w:instrText>
+          <w:instrText xml:space="preserve"> PAGEREF _Toc243336290 \h </w:instrText>
         </w:r>
         <w:r>
           <w:rPr>
@@ -5545,7 +5545,7 @@
           <w14:ligatures w14:val="standardContextual"/>
         </w:rPr>
       </w:pPr>
-      <w:hyperlink w:anchor="_Toc243335911" w:history="1">
+      <w:hyperlink w:anchor="_Toc243336291" w:history="1">
         <w:r>
           <w:rPr>
             <w:rStyle w:val="Hyperlink"/>
@@ -5572,7 +5572,7 @@
             <w:noProof/>
             <w:webHidden/>
           </w:rPr>
-          <w:instrText xml:space="preserve"> PAGEREF _Toc243335911 \h </w:instrText>
+          <w:instrText xml:space="preserve"> PAGEREF _Toc243336291 \h </w:instrText>
         </w:r>
         <w:r>
           <w:rPr>
@@ -5619,7 +5619,7 @@
           <w14:ligatures w14:val="standardContextual"/>
         </w:rPr>
       </w:pPr>
-      <w:hyperlink w:anchor="_Toc243335912" w:history="1">
+      <w:hyperlink w:anchor="_Toc243336292" w:history="1">
         <w:r>
           <w:rPr>
             <w:rStyle w:val="Hyperlink"/>
@@ -5646,7 +5646,7 @@
             <w:noProof/>
             <w:webHidden/>
           </w:rPr>
-          <w:instrText xml:space="preserve"> PAGEREF _Toc243335912 \h </w:instrText>
+          <w:instrText xml:space="preserve"> PAGEREF _Toc243336292 \h </w:instrText>
         </w:r>
         <w:r>
           <w:rPr>
@@ -5693,7 +5693,7 @@
           <w14:ligatures w14:val="standardContextual"/>
         </w:rPr>
       </w:pPr>
-      <w:hyperlink w:anchor="_Toc243335913" w:history="1">
+      <w:hyperlink w:anchor="_Toc243336293" w:history="1">
         <w:r>
           <w:rPr>
             <w:rStyle w:val="Hyperlink"/>
@@ -5720,7 +5720,7 @@
             <w:noProof/>
             <w:webHidden/>
           </w:rPr>
-          <w:instrText xml:space="preserve"> PAGEREF _Toc243335913 \h </w:instrText>
+          <w:instrText xml:space="preserve"> PAGEREF _Toc243336293 \h </w:instrText>
         </w:r>
         <w:r>
           <w:rPr>
@@ -5767,7 +5767,7 @@
           <w14:ligatures w14:val="standardContextual"/>
         </w:rPr>
       </w:pPr>
-      <w:hyperlink w:anchor="_Toc243335914" w:history="1">
+      <w:hyperlink w:anchor="_Toc243336294" w:history="1">
         <w:r>
           <w:rPr>
             <w:rStyle w:val="Hyperlink"/>
@@ -5794,7 +5794,7 @@
             <w:noProof/>
             <w:webHidden/>
           </w:rPr>
-          <w:instrText xml:space="preserve"> PAGEREF _Toc243335914 \h </w:instrText>
+          <w:instrText xml:space="preserve"> PAGEREF _Toc243336294 \h </w:instrText>
         </w:r>
         <w:r>
           <w:rPr>
@@ -5841,7 +5841,7 @@
           <w14:ligatures w14:val="standardContextual"/>
         </w:rPr>
       </w:pPr>
-      <w:hyperlink w:anchor="_Toc243335915" w:history="1">
+      <w:hyperlink w:anchor="_Toc243336295" w:history="1">
         <w:r>
           <w:rPr>
             <w:rStyle w:val="Hyperlink"/>
@@ -5868,7 +5868,7 @@
             <w:noProof/>
             <w:webHidden/>
           </w:rPr>
-          <w:instrText xml:space="preserve"> PAGEREF _Toc243335915 \h </w:instrText>
+          <w:instrText xml:space="preserve"> PAGEREF _Toc243336295 \h </w:instrText>
         </w:r>
         <w:r>
           <w:rPr>
@@ -5915,7 +5915,7 @@
           <w14:ligatures w14:val="standardContextual"/>
         </w:rPr>
       </w:pPr>
-      <w:hyperlink w:anchor="_Toc243335916" w:history="1">
+      <w:hyperlink w:anchor="_Toc243336296" w:history="1">
         <w:r>
           <w:rPr>
             <w:rStyle w:val="Hyperlink"/>
@@ -5942,7 +5942,7 @@
             <w:noProof/>
             <w:webHidden/>
           </w:rPr>
-          <w:instrText xml:space="preserve"> PAGEREF _Toc243335916 \h </w:instrText>
+          <w:instrText xml:space="preserve"> PAGEREF _Toc243336296 \h </w:instrText>
         </w:r>
         <w:r>
           <w:rPr>
@@ -5989,7 +5989,7 @@
           <w14:ligatures w14:val="standardContextual"/>
         </w:rPr>
       </w:pPr>
-      <w:hyperlink w:anchor="_Toc243335917" w:history="1">
+      <w:hyperlink w:anchor="_Toc243336297" w:history="1">
         <w:r>
           <w:rPr>
             <w:rStyle w:val="Hyperlink"/>
@@ -6016,7 +6016,7 @@
             <w:noProof/>
             <w:webHidden/>
           </w:rPr>
-          <w:instrText xml:space="preserve"> PAGEREF _Toc243335917 \h </w:instrText>
+          <w:instrText xml:space="preserve"> PAGEREF _Toc243336297 \h </w:instrText>
         </w:r>
         <w:r>
           <w:rPr>
@@ -6063,7 +6063,7 @@
           <w14:ligatures w14:val="standardContextual"/>
         </w:rPr>
       </w:pPr>
-      <w:hyperlink w:anchor="_Toc243335918" w:history="1">
+      <w:hyperlink w:anchor="_Toc243336298" w:history="1">
         <w:r>
           <w:rPr>
             <w:rStyle w:val="Hyperlink"/>
@@ -6090,7 +6090,7 @@
             <w:noProof/>
             <w:webHidden/>
           </w:rPr>
-          <w:instrText xml:space="preserve"> PAGEREF _Toc243335918 \h </w:instrText>
+          <w:instrText xml:space="preserve"> PAGEREF _Toc243336298 \h </w:instrText>
         </w:r>
         <w:r>
           <w:rPr>
@@ -6137,7 +6137,7 @@
           <w14:ligatures w14:val="standardContextual"/>
         </w:rPr>
       </w:pPr>
-      <w:hyperlink w:anchor="_Toc243335919" w:history="1">
+      <w:hyperlink w:anchor="_Toc243336299" w:history="1">
         <w:r>
           <w:rPr>
             <w:rStyle w:val="Hyperlink"/>
@@ -6164,7 +6164,7 @@
             <w:noProof/>
             <w:webHidden/>
           </w:rPr>
-          <w:instrText xml:space="preserve"> PAGEREF _Toc243335919 \h </w:instrText>
+          <w:instrText xml:space="preserve"> PAGEREF _Toc243336299 \h </w:instrText>
         </w:r>
         <w:r>
           <w:rPr>
@@ -7115,7 +7115,7 @@
         <w:pStyle w:val="Heading1"/>
         <w:jc w:val="center"/>
       </w:pPr>
-      <w:bookmarkStart w:id="0" w:name="_Toc243335845"/>
+      <w:bookmarkStart w:id="0" w:name="_Toc243336225"/>
       <w:r>
         <w:rPr>
           <w:rFonts w:ascii="Times New Roman" w:hAnsi="Times New Roman"/>
@@ -7144,7 +7144,7 @@
       <w:pPr>
         <w:pStyle w:val="Heading2"/>
       </w:pPr>
-      <w:bookmarkStart w:id="1" w:name="_Toc243335846"/>
+      <w:bookmarkStart w:id="1" w:name="_Toc243336226"/>
       <w:r>
         <w:rPr>
           <w:rFonts w:ascii="Times New Roman" w:hAnsi="Times New Roman"/>
@@ -7196,7 +7196,7 @@
       <w:pPr>
         <w:pStyle w:val="Heading2"/>
       </w:pPr>
-      <w:bookmarkStart w:id="2" w:name="_Toc243335847"/>
+      <w:bookmarkStart w:id="2" w:name="_Toc243336227"/>
       <w:r>
         <w:rPr>
           <w:rFonts w:ascii="Times New Roman" w:hAnsi="Times New Roman"/>
@@ -7232,7 +7232,7 @@
       <w:pPr>
         <w:pStyle w:val="Heading2"/>
       </w:pPr>
-      <w:bookmarkStart w:id="3" w:name="_Toc243335848"/>
+      <w:bookmarkStart w:id="3" w:name="_Toc243336228"/>
       <w:r>
         <w:rPr>
           <w:rFonts w:ascii="Times New Roman" w:hAnsi="Times New Roman"/>
@@ -7272,7 +7272,7 @@
       <w:pPr>
         <w:pStyle w:val="Heading2"/>
       </w:pPr>
-      <w:bookmarkStart w:id="4" w:name="_Toc243335849"/>
+      <w:bookmarkStart w:id="4" w:name="_Toc243336229"/>
       <w:r>
         <w:rPr>
           <w:rFonts w:ascii="Times New Roman" w:hAnsi="Times New Roman"/>
@@ -7296,7 +7296,7 @@
       <w:pPr>
         <w:pStyle w:val="Heading2"/>
       </w:pPr>
-      <w:bookmarkStart w:id="5" w:name="_Toc243335850"/>
+      <w:bookmarkStart w:id="5" w:name="_Toc243336230"/>
       <w:r>
         <w:rPr>
           <w:rFonts w:ascii="Times New Roman" w:hAnsi="Times New Roman"/>
@@ -7366,7 +7366,7 @@
       <w:pPr>
         <w:pStyle w:val="Heading2"/>
       </w:pPr>
-      <w:bookmarkStart w:id="6" w:name="_Toc243335851"/>
+      <w:bookmarkStart w:id="6" w:name="_Toc243336231"/>
       <w:r>
         <w:rPr>
           <w:rFonts w:ascii="Times New Roman" w:hAnsi="Times New Roman"/>
@@ -7393,7 +7393,7 @@
       <w:pPr>
         <w:pStyle w:val="Heading2"/>
       </w:pPr>
-      <w:bookmarkStart w:id="7" w:name="_Toc243335852"/>
+      <w:bookmarkStart w:id="7" w:name="_Toc243336232"/>
       <w:r>
         <w:rPr>
           <w:rFonts w:ascii="Times New Roman" w:hAnsi="Times New Roman"/>
@@ -7420,7 +7420,7 @@
       <w:pPr>
         <w:pStyle w:val="Heading2"/>
       </w:pPr>
-      <w:bookmarkStart w:id="8" w:name="_Toc243335853"/>
+      <w:bookmarkStart w:id="8" w:name="_Toc243336233"/>
       <w:r>
         <w:rPr>
           <w:rFonts w:ascii="Times New Roman" w:hAnsi="Times New Roman"/>
@@ -7457,7 +7457,7 @@
         <w:pStyle w:val="Heading1"/>
         <w:jc w:val="center"/>
       </w:pPr>
-      <w:bookmarkStart w:id="9" w:name="_Toc243335854"/>
+      <w:bookmarkStart w:id="9" w:name="_Toc243336234"/>
       <w:r>
         <w:rPr>
           <w:rFonts w:ascii="Times New Roman" w:hAnsi="Times New Roman"/>
@@ -7486,7 +7486,7 @@
       <w:pPr>
         <w:pStyle w:val="Heading2"/>
       </w:pPr>
-      <w:bookmarkStart w:id="10" w:name="_Toc243335855"/>
+      <w:bookmarkStart w:id="10" w:name="_Toc243336235"/>
       <w:r>
         <w:rPr>
           <w:rFonts w:ascii="Times New Roman" w:hAnsi="Times New Roman"/>
@@ -7510,7 +7510,7 @@
       <w:pPr>
         <w:pStyle w:val="Heading2"/>
       </w:pPr>
-      <w:bookmarkStart w:id="11" w:name="_Toc243335856"/>
+      <w:bookmarkStart w:id="11" w:name="_Toc243336236"/>
       <w:r>
         <w:rPr>
           <w:rFonts w:ascii="Times New Roman" w:hAnsi="Times New Roman"/>
@@ -7556,7 +7556,7 @@
       <w:pPr>
         <w:pStyle w:val="Heading2"/>
       </w:pPr>
-      <w:bookmarkStart w:id="12" w:name="_Toc243335857"/>
+      <w:bookmarkStart w:id="12" w:name="_Toc243336237"/>
       <w:r>
         <w:rPr>
           <w:rFonts w:ascii="Times New Roman" w:hAnsi="Times New Roman"/>
@@ -7595,7 +7595,7 @@
       <w:pPr>
         <w:pStyle w:val="Heading2"/>
       </w:pPr>
-      <w:bookmarkStart w:id="13" w:name="_Toc243335858"/>
+      <w:bookmarkStart w:id="13" w:name="_Toc243336238"/>
       <w:r>
         <w:rPr>
           <w:rFonts w:ascii="Times New Roman" w:hAnsi="Times New Roman"/>
@@ -7638,7 +7638,7 @@
       <w:pPr>
         <w:pStyle w:val="Heading2"/>
       </w:pPr>
-      <w:bookmarkStart w:id="14" w:name="_Toc243335859"/>
+      <w:bookmarkStart w:id="14" w:name="_Toc243336239"/>
       <w:r>
         <w:rPr>
           <w:rFonts w:ascii="Times New Roman" w:hAnsi="Times New Roman"/>
@@ -7669,7 +7669,7 @@
       <w:pPr>
         <w:pStyle w:val="Heading2"/>
       </w:pPr>
-      <w:bookmarkStart w:id="15" w:name="_Toc243335860"/>
+      <w:bookmarkStart w:id="15" w:name="_Toc243336240"/>
       <w:r>
         <w:rPr>
           <w:rFonts w:ascii="Times New Roman" w:hAnsi="Times New Roman"/>
@@ -7699,7 +7699,7 @@
       <w:pPr>
         <w:pStyle w:val="Heading2"/>
       </w:pPr>
-      <w:bookmarkStart w:id="16" w:name="_Toc243335861"/>
+      <w:bookmarkStart w:id="16" w:name="_Toc243336241"/>
       <w:r>
         <w:rPr>
           <w:rFonts w:ascii="Times New Roman" w:hAnsi="Times New Roman"/>
@@ -7733,7 +7733,7 @@
       <w:pPr>
         <w:pStyle w:val="Heading2"/>
       </w:pPr>
-      <w:bookmarkStart w:id="17" w:name="_Toc243335862"/>
+      <w:bookmarkStart w:id="17" w:name="_Toc243336242"/>
       <w:r>
         <w:rPr>
           <w:rFonts w:ascii="Times New Roman" w:hAnsi="Times New Roman"/>
@@ -7788,7 +7788,7 @@
       <w:pPr>
         <w:pStyle w:val="Heading2"/>
       </w:pPr>
-      <w:bookmarkStart w:id="18" w:name="_Toc243335863"/>
+      <w:bookmarkStart w:id="18" w:name="_Toc243336243"/>
       <w:r>
         <w:rPr>
           <w:rFonts w:ascii="Times New Roman" w:hAnsi="Times New Roman"/>
@@ -7815,7 +7815,7 @@
       <w:pPr>
         <w:pStyle w:val="Heading2"/>
       </w:pPr>
-      <w:bookmarkStart w:id="19" w:name="_Toc243335864"/>
+      <w:bookmarkStart w:id="19" w:name="_Toc243336244"/>
       <w:r>
         <w:rPr>
           <w:rFonts w:ascii="Times New Roman" w:hAnsi="Times New Roman"/>
@@ -7846,7 +7846,7 @@
       <w:pPr>
         <w:pStyle w:val="Heading2"/>
       </w:pPr>
-      <w:bookmarkStart w:id="20" w:name="_Toc243335865"/>
+      <w:bookmarkStart w:id="20" w:name="_Toc243336245"/>
       <w:r>
         <w:rPr>
           <w:rFonts w:ascii="Times New Roman" w:hAnsi="Times New Roman"/>
@@ -7894,7 +7894,7 @@
       <w:pPr>
         <w:pStyle w:val="Heading2"/>
       </w:pPr>
-      <w:bookmarkStart w:id="21" w:name="_Toc243335866"/>
+      <w:bookmarkStart w:id="21" w:name="_Toc243336246"/>
       <w:r>
         <w:rPr>
           <w:rFonts w:ascii="Times New Roman" w:hAnsi="Times New Roman"/>
@@ -7940,7 +7940,7 @@
       <w:pPr>
         <w:pStyle w:val="Heading2"/>
       </w:pPr>
-      <w:bookmarkStart w:id="22" w:name="_Toc243335867"/>
+      <w:bookmarkStart w:id="22" w:name="_Toc243336247"/>
       <w:r>
         <w:rPr>
           <w:rFonts w:ascii="Times New Roman" w:hAnsi="Times New Roman"/>
@@ -8500,7 +8500,7 @@
       <w:pPr>
         <w:pStyle w:val="Heading2"/>
       </w:pPr>
-      <w:bookmarkStart w:id="23" w:name="_Toc243335868"/>
+      <w:bookmarkStart w:id="23" w:name="_Toc243336248"/>
       <w:r>
         <w:rPr>
           <w:rFonts w:ascii="Times New Roman" w:hAnsi="Times New Roman"/>
@@ -8533,7 +8533,7 @@
         <w:pStyle w:val="Heading1"/>
         <w:jc w:val="center"/>
       </w:pPr>
-      <w:bookmarkStart w:id="24" w:name="_Toc243335869"/>
+      <w:bookmarkStart w:id="24" w:name="_Toc243336249"/>
       <w:r>
         <w:rPr>
           <w:rFonts w:ascii="Times New Roman" w:hAnsi="Times New Roman"/>
@@ -8562,7 +8562,7 @@
       <w:pPr>
         <w:pStyle w:val="Heading2"/>
       </w:pPr>
-      <w:bookmarkStart w:id="25" w:name="_Toc243335870"/>
+      <w:bookmarkStart w:id="25" w:name="_Toc243336250"/>
       <w:r>
         <w:rPr>
           <w:rFonts w:ascii="Times New Roman" w:hAnsi="Times New Roman"/>
@@ -8597,7 +8597,7 @@
           <w:noProof/>
         </w:rPr>
         <w:drawing>
-          <wp:inline distT="0" distB="0" distL="0" distR="0" wp14:anchorId="1DE5491B" wp14:editId="0032523A">
+          <wp:inline distT="0" distB="0" distL="0" distR="0" wp14:anchorId="5973D4C4" wp14:editId="4BB63D57">
             <wp:extent cx="5303520" cy="2983230"/>
             <wp:effectExtent l="0" t="0" r="0" b="0"/>
             <wp:docPr id="2" name="Picture 2"/>
@@ -8650,7 +8650,7 @@
       <w:pPr>
         <w:pStyle w:val="Heading2"/>
       </w:pPr>
-      <w:bookmarkStart w:id="26" w:name="_Toc243335871"/>
+      <w:bookmarkStart w:id="26" w:name="_Toc243336251"/>
       <w:r>
         <w:rPr>
           <w:rFonts w:ascii="Times New Roman" w:hAnsi="Times New Roman"/>
@@ -8686,7 +8686,7 @@
           <w:noProof/>
         </w:rPr>
         <w:drawing>
-          <wp:inline distT="0" distB="0" distL="0" distR="0" wp14:anchorId="25891E24" wp14:editId="1855FEDC">
+          <wp:inline distT="0" distB="0" distL="0" distR="0" wp14:anchorId="295C2027" wp14:editId="4E4A4113">
             <wp:extent cx="5303520" cy="2262835"/>
             <wp:effectExtent l="0" t="0" r="0" b="0"/>
             <wp:docPr id="3" name="Picture 3"/>
@@ -8776,7 +8776,7 @@
       <w:pPr>
         <w:pStyle w:val="Heading2"/>
       </w:pPr>
-      <w:bookmarkStart w:id="27" w:name="_Toc243335872"/>
+      <w:bookmarkStart w:id="27" w:name="_Toc243336252"/>
       <w:r>
         <w:rPr>
           <w:rFonts w:ascii="Times New Roman" w:hAnsi="Times New Roman"/>
@@ -8822,7 +8822,7 @@
       <w:pPr>
         <w:pStyle w:val="Heading2"/>
       </w:pPr>
-      <w:bookmarkStart w:id="28" w:name="_Toc243335873"/>
+      <w:bookmarkStart w:id="28" w:name="_Toc243336253"/>
       <w:r>
         <w:rPr>
           <w:rFonts w:ascii="Times New Roman" w:hAnsi="Times New Roman"/>
@@ -8870,7 +8870,7 @@
           <w:noProof/>
         </w:rPr>
         <w:drawing>
-          <wp:inline distT="0" distB="0" distL="0" distR="0" wp14:anchorId="361EED21" wp14:editId="5B7BCF19">
+          <wp:inline distT="0" distB="0" distL="0" distR="0" wp14:anchorId="11AF45A1" wp14:editId="0C0EEF28">
             <wp:extent cx="5303520" cy="2262835"/>
             <wp:effectExtent l="0" t="0" r="0" b="0"/>
             <wp:docPr id="4" name="Picture 4"/>
@@ -9215,7 +9215,7 @@
       <w:pPr>
         <w:pStyle w:val="Heading2"/>
       </w:pPr>
-      <w:bookmarkStart w:id="29" w:name="_Toc243335874"/>
+      <w:bookmarkStart w:id="29" w:name="_Toc243336254"/>
       <w:r>
         <w:rPr>
           <w:rFonts w:ascii="Times New Roman" w:hAnsi="Times New Roman"/>
@@ -9242,7 +9242,7 @@
       <w:pPr>
         <w:pStyle w:val="Heading2"/>
       </w:pPr>
-      <w:bookmarkStart w:id="30" w:name="_Toc243335875"/>
+      <w:bookmarkStart w:id="30" w:name="_Toc243336255"/>
       <w:r>
         <w:rPr>
           <w:rFonts w:ascii="Times New Roman" w:hAnsi="Times New Roman"/>
@@ -9285,7 +9285,7 @@
       <w:pPr>
         <w:pStyle w:val="Heading2"/>
       </w:pPr>
-      <w:bookmarkStart w:id="31" w:name="_Toc243335876"/>
+      <w:bookmarkStart w:id="31" w:name="_Toc243336256"/>
       <w:r>
         <w:rPr>
           <w:rFonts w:ascii="Times New Roman" w:hAnsi="Times New Roman"/>
@@ -9671,7 +9671,7 @@
       <w:pPr>
         <w:pStyle w:val="Heading2"/>
       </w:pPr>
-      <w:bookmarkStart w:id="32" w:name="_Toc243335877"/>
+      <w:bookmarkStart w:id="32" w:name="_Toc243336257"/>
       <w:r>
         <w:rPr>
           <w:rFonts w:ascii="Times New Roman" w:hAnsi="Times New Roman"/>
@@ -9701,7 +9701,7 @@
       <w:pPr>
         <w:pStyle w:val="Heading2"/>
       </w:pPr>
-      <w:bookmarkStart w:id="33" w:name="_Toc243335878"/>
+      <w:bookmarkStart w:id="33" w:name="_Toc243336258"/>
       <w:r>
         <w:rPr>
           <w:rFonts w:ascii="Times New Roman" w:hAnsi="Times New Roman"/>
@@ -9735,7 +9735,7 @@
         <w:pStyle w:val="Heading1"/>
         <w:jc w:val="center"/>
       </w:pPr>
-      <w:bookmarkStart w:id="34" w:name="_Toc243335879"/>
+      <w:bookmarkStart w:id="34" w:name="_Toc243336259"/>
       <w:r>
         <w:rPr>
           <w:rFonts w:ascii="Times New Roman" w:hAnsi="Times New Roman"/>
@@ -9764,7 +9764,7 @@
       <w:pPr>
         <w:pStyle w:val="Heading2"/>
       </w:pPr>
-      <w:bookmarkStart w:id="35" w:name="_Toc243335880"/>
+      <w:bookmarkStart w:id="35" w:name="_Toc243336260"/>
       <w:r>
         <w:rPr>
           <w:rFonts w:ascii="Times New Roman" w:hAnsi="Times New Roman"/>
@@ -9791,7 +9791,7 @@
       <w:pPr>
         <w:pStyle w:val="Heading2"/>
       </w:pPr>
-      <w:bookmarkStart w:id="36" w:name="_Toc243335881"/>
+      <w:bookmarkStart w:id="36" w:name="_Toc243336261"/>
       <w:r>
         <w:rPr>
           <w:rFonts w:ascii="Times New Roman" w:hAnsi="Times New Roman"/>
@@ -10368,7 +10368,7 @@
       <w:pPr>
         <w:pStyle w:val="Heading2"/>
       </w:pPr>
-      <w:bookmarkStart w:id="37" w:name="_Toc243335882"/>
+      <w:bookmarkStart w:id="37" w:name="_Toc243336262"/>
       <w:r>
         <w:rPr>
           <w:rFonts w:ascii="Times New Roman" w:hAnsi="Times New Roman"/>
@@ -10485,7 +10485,7 @@
       <w:pPr>
         <w:pStyle w:val="Heading2"/>
       </w:pPr>
-      <w:bookmarkStart w:id="38" w:name="_Toc243335883"/>
+      <w:bookmarkStart w:id="38" w:name="_Toc243336263"/>
       <w:r>
         <w:rPr>
           <w:rFonts w:ascii="Times New Roman" w:hAnsi="Times New Roman"/>
@@ -10515,7 +10515,7 @@
       <w:pPr>
         <w:pStyle w:val="Heading2"/>
       </w:pPr>
-      <w:bookmarkStart w:id="39" w:name="_Toc243335884"/>
+      <w:bookmarkStart w:id="39" w:name="_Toc243336264"/>
       <w:r>
         <w:rPr>
           <w:rFonts w:ascii="Times New Roman" w:hAnsi="Times New Roman"/>
@@ -10543,7 +10543,7 @@
       <w:pPr>
         <w:pStyle w:val="Heading2"/>
       </w:pPr>
-      <w:bookmarkStart w:id="40" w:name="_Toc243335885"/>
+      <w:bookmarkStart w:id="40" w:name="_Toc243336265"/>
       <w:r>
         <w:rPr>
           <w:rFonts w:ascii="Times New Roman" w:hAnsi="Times New Roman"/>
@@ -10570,7 +10570,7 @@
       <w:pPr>
         <w:pStyle w:val="Heading2"/>
       </w:pPr>
-      <w:bookmarkStart w:id="41" w:name="_Toc243335886"/>
+      <w:bookmarkStart w:id="41" w:name="_Toc243336266"/>
       <w:r>
         <w:rPr>
           <w:rFonts w:ascii="Times New Roman" w:hAnsi="Times New Roman"/>
@@ -10597,7 +10597,7 @@
       <w:pPr>
         <w:pStyle w:val="Heading2"/>
       </w:pPr>
-      <w:bookmarkStart w:id="42" w:name="_Toc243335887"/>
+      <w:bookmarkStart w:id="42" w:name="_Toc243336267"/>
       <w:r>
         <w:rPr>
           <w:rFonts w:ascii="Times New Roman" w:hAnsi="Times New Roman"/>
@@ -10634,7 +10634,7 @@
         <w:pStyle w:val="Heading1"/>
         <w:jc w:val="center"/>
       </w:pPr>
-      <w:bookmarkStart w:id="43" w:name="_Toc243335888"/>
+      <w:bookmarkStart w:id="43" w:name="_Toc243336268"/>
       <w:r>
         <w:rPr>
           <w:rFonts w:ascii="Times New Roman" w:hAnsi="Times New Roman"/>
@@ -10663,7 +10663,7 @@
       <w:pPr>
         <w:pStyle w:val="Heading2"/>
       </w:pPr>
-      <w:bookmarkStart w:id="44" w:name="_Toc243335889"/>
+      <w:bookmarkStart w:id="44" w:name="_Toc243336269"/>
       <w:r>
         <w:rPr>
           <w:rFonts w:ascii="Times New Roman" w:hAnsi="Times New Roman"/>
@@ -10695,7 +10695,7 @@
           <w:noProof/>
         </w:rPr>
         <w:drawing>
-          <wp:inline distT="0" distB="0" distL="0" distR="0" wp14:anchorId="37C4D031" wp14:editId="1473C70A">
+          <wp:inline distT="0" distB="0" distL="0" distR="0" wp14:anchorId="33F997D1" wp14:editId="0941EEF1">
             <wp:extent cx="5303520" cy="3374967"/>
             <wp:effectExtent l="0" t="0" r="0" b="0"/>
             <wp:docPr id="5" name="Picture 5"/>
@@ -10963,7 +10963,7 @@
           <w:noProof/>
         </w:rPr>
         <w:drawing>
-          <wp:inline distT="0" distB="0" distL="0" distR="0" wp14:anchorId="38A778F0" wp14:editId="0BD772C5">
+          <wp:inline distT="0" distB="0" distL="0" distR="0" wp14:anchorId="41784800" wp14:editId="3E6F0789">
             <wp:extent cx="5303520" cy="2272937"/>
             <wp:effectExtent l="0" t="0" r="0" b="0"/>
             <wp:docPr id="6" name="Picture 6"/>
@@ -11343,7 +11343,7 @@
       <w:pPr>
         <w:pStyle w:val="Heading2"/>
       </w:pPr>
-      <w:bookmarkStart w:id="45" w:name="_Toc243335890"/>
+      <w:bookmarkStart w:id="45" w:name="_Toc243336270"/>
       <w:r>
         <w:rPr>
           <w:rFonts w:ascii="Times New Roman" w:hAnsi="Times New Roman"/>
@@ -11376,7 +11376,7 @@
         </w:rPr>
         <w:lastRenderedPageBreak/>
         <w:drawing>
-          <wp:inline distT="0" distB="0" distL="0" distR="0" wp14:anchorId="635AB267" wp14:editId="297AF428">
+          <wp:inline distT="0" distB="0" distL="0" distR="0" wp14:anchorId="4480DCF3" wp14:editId="1EA92960">
             <wp:extent cx="5303520" cy="2121408"/>
             <wp:effectExtent l="0" t="0" r="0" b="0"/>
             <wp:docPr id="7" name="Picture 7"/>
@@ -11700,7 +11700,7 @@
           <w:noProof/>
         </w:rPr>
         <w:drawing>
-          <wp:inline distT="0" distB="0" distL="0" distR="0" wp14:anchorId="6CF57B18" wp14:editId="20803C62">
+          <wp:inline distT="0" distB="0" distL="0" distR="0" wp14:anchorId="5AA50C35" wp14:editId="08D24046">
             <wp:extent cx="5303520" cy="2571404"/>
             <wp:effectExtent l="0" t="0" r="0" b="0"/>
             <wp:docPr id="8" name="Picture 8"/>
@@ -11753,7 +11753,7 @@
       <w:pPr>
         <w:pStyle w:val="Heading2"/>
       </w:pPr>
-      <w:bookmarkStart w:id="46" w:name="_Toc243335891"/>
+      <w:bookmarkStart w:id="46" w:name="_Toc243336271"/>
       <w:r>
         <w:rPr>
           <w:rFonts w:ascii="Times New Roman" w:hAnsi="Times New Roman"/>
@@ -11995,7 +11995,7 @@
       <w:pPr>
         <w:pStyle w:val="Heading2"/>
       </w:pPr>
-      <w:bookmarkStart w:id="47" w:name="_Toc243335892"/>
+      <w:bookmarkStart w:id="47" w:name="_Toc243336272"/>
       <w:r>
         <w:rPr>
           <w:rFonts w:ascii="Times New Roman" w:hAnsi="Times New Roman"/>
@@ -12059,7 +12059,7 @@
           <w:noProof/>
         </w:rPr>
         <w:drawing>
-          <wp:inline distT="0" distB="0" distL="0" distR="0" wp14:anchorId="72994E65" wp14:editId="7E616DE0">
+          <wp:inline distT="0" distB="0" distL="0" distR="0" wp14:anchorId="04F869F1" wp14:editId="4904F1FB">
             <wp:extent cx="5303520" cy="2121408"/>
             <wp:effectExtent l="0" t="0" r="0" b="0"/>
             <wp:docPr id="9" name="Picture 9"/>
@@ -12112,7 +12112,7 @@
       <w:pPr>
         <w:pStyle w:val="Heading2"/>
       </w:pPr>
-      <w:bookmarkStart w:id="48" w:name="_Toc243335893"/>
+      <w:bookmarkStart w:id="48" w:name="_Toc243336273"/>
       <w:r>
         <w:rPr>
           <w:rFonts w:ascii="Times New Roman" w:hAnsi="Times New Roman"/>
@@ -12145,7 +12145,7 @@
         </w:rPr>
         <w:lastRenderedPageBreak/>
         <w:drawing>
-          <wp:inline distT="0" distB="0" distL="0" distR="0" wp14:anchorId="7AC12DDF" wp14:editId="6009BBD2">
+          <wp:inline distT="0" distB="0" distL="0" distR="0" wp14:anchorId="5DC40332" wp14:editId="43BB8D46">
             <wp:extent cx="5303520" cy="2424466"/>
             <wp:effectExtent l="0" t="0" r="0" b="0"/>
             <wp:docPr id="10" name="Picture 10"/>
@@ -12395,7 +12395,7 @@
       <w:pPr>
         <w:pStyle w:val="Heading2"/>
       </w:pPr>
-      <w:bookmarkStart w:id="49" w:name="_Toc243335894"/>
+      <w:bookmarkStart w:id="49" w:name="_Toc243336274"/>
       <w:r>
         <w:rPr>
           <w:rFonts w:ascii="Times New Roman" w:hAnsi="Times New Roman"/>
@@ -12440,7 +12440,7 @@
           <w:noProof/>
         </w:rPr>
         <w:drawing>
-          <wp:inline distT="0" distB="0" distL="0" distR="0" wp14:anchorId="70775236" wp14:editId="2C99C32D">
+          <wp:inline distT="0" distB="0" distL="0" distR="0" wp14:anchorId="0D2796CA" wp14:editId="42D08D7D">
             <wp:extent cx="5303520" cy="1988820"/>
             <wp:effectExtent l="0" t="0" r="0" b="0"/>
             <wp:docPr id="11" name="Picture 11"/>
@@ -12511,7 +12511,7 @@
         </w:rPr>
         <w:lastRenderedPageBreak/>
         <w:drawing>
-          <wp:inline distT="0" distB="0" distL="0" distR="0" wp14:anchorId="21E15C02" wp14:editId="5D937737">
+          <wp:inline distT="0" distB="0" distL="0" distR="0" wp14:anchorId="55D0C089" wp14:editId="44773697">
             <wp:extent cx="5303520" cy="2495774"/>
             <wp:effectExtent l="0" t="0" r="0" b="0"/>
             <wp:docPr id="12" name="Picture 12"/>
@@ -12581,7 +12581,7 @@
           <w:noProof/>
         </w:rPr>
         <w:drawing>
-          <wp:inline distT="0" distB="0" distL="0" distR="0" wp14:anchorId="7D51658C" wp14:editId="36B1B3A1">
+          <wp:inline distT="0" distB="0" distL="0" distR="0" wp14:anchorId="2C760B22" wp14:editId="4795EDBE">
             <wp:extent cx="5303520" cy="2272937"/>
             <wp:effectExtent l="0" t="0" r="0" b="0"/>
             <wp:docPr id="13" name="Picture 13"/>
@@ -12664,7 +12664,7 @@
           <w:noProof/>
         </w:rPr>
         <w:drawing>
-          <wp:inline distT="0" distB="0" distL="0" distR="0" wp14:anchorId="5A45066C" wp14:editId="25143C65">
+          <wp:inline distT="0" distB="0" distL="0" distR="0" wp14:anchorId="5DCE7C6C" wp14:editId="55881260">
             <wp:extent cx="5303520" cy="2339788"/>
             <wp:effectExtent l="0" t="0" r="0" b="0"/>
             <wp:docPr id="14" name="Picture 14"/>
@@ -12735,7 +12735,7 @@
           <w:noProof/>
         </w:rPr>
         <w:drawing>
-          <wp:inline distT="0" distB="0" distL="0" distR="0" wp14:anchorId="145DBC65" wp14:editId="6B113007">
+          <wp:inline distT="0" distB="0" distL="0" distR="0" wp14:anchorId="6035D03A" wp14:editId="0B823BBB">
             <wp:extent cx="5303520" cy="1988820"/>
             <wp:effectExtent l="0" t="0" r="0" b="0"/>
             <wp:docPr id="15" name="Picture 15"/>
@@ -13190,7 +13190,7 @@
       <w:pPr>
         <w:pStyle w:val="Heading2"/>
       </w:pPr>
-      <w:bookmarkStart w:id="50" w:name="_Toc243335895"/>
+      <w:bookmarkStart w:id="50" w:name="_Toc243336275"/>
       <w:r>
         <w:rPr>
           <w:rFonts w:ascii="Times New Roman" w:hAnsi="Times New Roman"/>
@@ -13264,7 +13264,7 @@
       <w:pPr>
         <w:pStyle w:val="Heading2"/>
       </w:pPr>
-      <w:bookmarkStart w:id="51" w:name="_Toc243335896"/>
+      <w:bookmarkStart w:id="51" w:name="_Toc243336276"/>
       <w:r>
         <w:rPr>
           <w:rFonts w:ascii="Times New Roman" w:hAnsi="Times New Roman"/>
@@ -13762,7 +13762,7 @@
         <w:pStyle w:val="Heading1"/>
         <w:jc w:val="center"/>
       </w:pPr>
-      <w:bookmarkStart w:id="52" w:name="_Toc243335897"/>
+      <w:bookmarkStart w:id="52" w:name="_Toc243336277"/>
       <w:r>
         <w:rPr>
           <w:rFonts w:ascii="Times New Roman" w:hAnsi="Times New Roman"/>
@@ -13791,7 +13791,7 @@
       <w:pPr>
         <w:pStyle w:val="Heading2"/>
       </w:pPr>
-      <w:bookmarkStart w:id="53" w:name="_Toc243335898"/>
+      <w:bookmarkStart w:id="53" w:name="_Toc243336278"/>
       <w:r>
         <w:rPr>
           <w:rFonts w:ascii="Times New Roman" w:hAnsi="Times New Roman"/>
@@ -13855,7 +13855,7 @@
       <w:pPr>
         <w:pStyle w:val="Heading2"/>
       </w:pPr>
-      <w:bookmarkStart w:id="54" w:name="_Toc243335899"/>
+      <w:bookmarkStart w:id="54" w:name="_Toc243336279"/>
       <w:r>
         <w:rPr>
           <w:rFonts w:ascii="Times New Roman" w:hAnsi="Times New Roman"/>
@@ -13949,7 +13949,7 @@
         <w:pStyle w:val="Heading1"/>
         <w:jc w:val="center"/>
       </w:pPr>
-      <w:bookmarkStart w:id="55" w:name="_Toc243335900"/>
+      <w:bookmarkStart w:id="55" w:name="_Toc243336280"/>
       <w:r>
         <w:rPr>
           <w:rFonts w:ascii="Times New Roman" w:hAnsi="Times New Roman"/>
@@ -14137,7 +14137,7 @@
         <w:pStyle w:val="Heading1"/>
         <w:jc w:val="center"/>
       </w:pPr>
-      <w:bookmarkStart w:id="56" w:name="_Toc243335901"/>
+      <w:bookmarkStart w:id="56" w:name="_Toc243336281"/>
       <w:r>
         <w:rPr>
           <w:rFonts w:ascii="Times New Roman" w:hAnsi="Times New Roman"/>
@@ -14153,7 +14153,7 @@
       <w:pPr>
         <w:pStyle w:val="Heading2"/>
       </w:pPr>
-      <w:bookmarkStart w:id="57" w:name="_Toc243335902"/>
+      <w:bookmarkStart w:id="57" w:name="_Toc243336282"/>
       <w:r>
         <w:rPr>
           <w:rFonts w:ascii="Times New Roman" w:hAnsi="Times New Roman"/>
@@ -14183,7 +14183,7 @@
       <w:pPr>
         <w:pStyle w:val="Heading2"/>
       </w:pPr>
-      <w:bookmarkStart w:id="58" w:name="_Toc243335903"/>
+      <w:bookmarkStart w:id="58" w:name="_Toc243336283"/>
       <w:r>
         <w:rPr>
           <w:rFonts w:ascii="Times New Roman" w:hAnsi="Times New Roman"/>
@@ -14287,7 +14287,7 @@
       <w:pPr>
         <w:pStyle w:val="Heading2"/>
       </w:pPr>
-      <w:bookmarkStart w:id="59" w:name="_Toc243335904"/>
+      <w:bookmarkStart w:id="59" w:name="_Toc243336284"/>
       <w:r>
         <w:rPr>
           <w:rFonts w:ascii="Times New Roman" w:hAnsi="Times New Roman"/>
@@ -14391,7 +14391,7 @@
       <w:pPr>
         <w:pStyle w:val="Heading2"/>
       </w:pPr>
-      <w:bookmarkStart w:id="60" w:name="_Toc243335905"/>
+      <w:bookmarkStart w:id="60" w:name="_Toc243336285"/>
       <w:r>
         <w:rPr>
           <w:rFonts w:ascii="Times New Roman" w:hAnsi="Times New Roman"/>
@@ -14549,7 +14549,7 @@
       <w:pPr>
         <w:pStyle w:val="Heading2"/>
       </w:pPr>
-      <w:bookmarkStart w:id="61" w:name="_Toc243335906"/>
+      <w:bookmarkStart w:id="61" w:name="_Toc243336286"/>
       <w:r>
         <w:rPr>
           <w:rFonts w:ascii="Times New Roman" w:hAnsi="Times New Roman"/>
@@ -14797,7 +14797,7 @@
       <w:pPr>
         <w:pStyle w:val="Heading2"/>
       </w:pPr>
-      <w:bookmarkStart w:id="62" w:name="_Toc243335907"/>
+      <w:bookmarkStart w:id="62" w:name="_Toc243336287"/>
       <w:r>
         <w:rPr>
           <w:rFonts w:ascii="Times New Roman" w:hAnsi="Times New Roman"/>
@@ -14949,7 +14949,7 @@
       <w:pPr>
         <w:pStyle w:val="Heading2"/>
       </w:pPr>
-      <w:bookmarkStart w:id="63" w:name="_Toc243335908"/>
+      <w:bookmarkStart w:id="63" w:name="_Toc243336288"/>
       <w:r>
         <w:rPr>
           <w:rFonts w:ascii="Times New Roman" w:hAnsi="Times New Roman"/>
@@ -15114,7 +15114,7 @@
       <w:pPr>
         <w:pStyle w:val="Heading2"/>
       </w:pPr>
-      <w:bookmarkStart w:id="64" w:name="_Toc243335909"/>
+      <w:bookmarkStart w:id="64" w:name="_Toc243336289"/>
       <w:r>
         <w:rPr>
           <w:rFonts w:ascii="Times New Roman" w:hAnsi="Times New Roman"/>
@@ -15295,7 +15295,7 @@
       <w:pPr>
         <w:pStyle w:val="Heading2"/>
       </w:pPr>
-      <w:bookmarkStart w:id="65" w:name="_Toc243335910"/>
+      <w:bookmarkStart w:id="65" w:name="_Toc243336290"/>
       <w:r>
         <w:rPr>
           <w:rFonts w:ascii="Times New Roman" w:hAnsi="Times New Roman"/>
@@ -15435,7 +15435,7 @@
       <w:pPr>
         <w:pStyle w:val="Heading2"/>
       </w:pPr>
-      <w:bookmarkStart w:id="66" w:name="_Toc243335911"/>
+      <w:bookmarkStart w:id="66" w:name="_Toc243336291"/>
       <w:r>
         <w:rPr>
           <w:rFonts w:ascii="Times New Roman" w:hAnsi="Times New Roman"/>
@@ -15624,7 +15624,7 @@
       <w:pPr>
         <w:pStyle w:val="Heading2"/>
       </w:pPr>
-      <w:bookmarkStart w:id="67" w:name="_Toc243335912"/>
+      <w:bookmarkStart w:id="67" w:name="_Toc243336292"/>
       <w:r>
         <w:rPr>
           <w:rFonts w:ascii="Times New Roman" w:hAnsi="Times New Roman"/>
@@ -15776,7 +15776,7 @@
       <w:pPr>
         <w:pStyle w:val="Heading2"/>
       </w:pPr>
-      <w:bookmarkStart w:id="68" w:name="_Toc243335913"/>
+      <w:bookmarkStart w:id="68" w:name="_Toc243336293"/>
       <w:r>
         <w:rPr>
           <w:rFonts w:ascii="Times New Roman" w:hAnsi="Times New Roman"/>
@@ -15940,7 +15940,7 @@
       <w:pPr>
         <w:pStyle w:val="Heading2"/>
       </w:pPr>
-      <w:bookmarkStart w:id="69" w:name="_Toc243335914"/>
+      <w:bookmarkStart w:id="69" w:name="_Toc243336294"/>
       <w:r>
         <w:rPr>
           <w:rFonts w:ascii="Times New Roman" w:hAnsi="Times New Roman"/>
@@ -16134,7 +16134,7 @@
       <w:pPr>
         <w:pStyle w:val="Heading2"/>
       </w:pPr>
-      <w:bookmarkStart w:id="70" w:name="_Toc243335915"/>
+      <w:bookmarkStart w:id="70" w:name="_Toc243336295"/>
       <w:r>
         <w:rPr>
           <w:rFonts w:ascii="Times New Roman" w:hAnsi="Times New Roman"/>
@@ -16274,7 +16274,7 @@
       <w:pPr>
         <w:pStyle w:val="Heading2"/>
       </w:pPr>
-      <w:bookmarkStart w:id="71" w:name="_Toc243335916"/>
+      <w:bookmarkStart w:id="71" w:name="_Toc243336296"/>
       <w:r>
         <w:rPr>
           <w:rFonts w:ascii="Times New Roman" w:hAnsi="Times New Roman"/>
@@ -16474,7 +16474,7 @@
       <w:pPr>
         <w:pStyle w:val="Heading2"/>
       </w:pPr>
-      <w:bookmarkStart w:id="72" w:name="_Toc243335917"/>
+      <w:bookmarkStart w:id="72" w:name="_Toc243336297"/>
       <w:r>
         <w:rPr>
           <w:rFonts w:ascii="Times New Roman" w:hAnsi="Times New Roman"/>
@@ -16553,7 +16553,7 @@
       <w:pPr>
         <w:pStyle w:val="Heading2"/>
       </w:pPr>
-      <w:bookmarkStart w:id="73" w:name="_Toc243335918"/>
+      <w:bookmarkStart w:id="73" w:name="_Toc243336298"/>
       <w:r>
         <w:rPr>
           <w:rFonts w:ascii="Times New Roman" w:hAnsi="Times New Roman"/>
@@ -16617,7 +16617,7 @@
       <w:pPr>
         <w:pStyle w:val="Heading2"/>
       </w:pPr>
-      <w:bookmarkStart w:id="74" w:name="_Toc243335919"/>
+      <w:bookmarkStart w:id="74" w:name="_Toc243336299"/>
       <w:r>
         <w:rPr>
           <w:rFonts w:ascii="Times New Roman" w:hAnsi="Times New Roman"/>
@@ -16970,31 +16970,31 @@
       </w:rPr>
     </w:lvl>
   </w:abstractNum>
-  <w:num w:numId="1" w16cid:durableId="1978489053">
+  <w:num w:numId="1" w16cid:durableId="29688613">
     <w:abstractNumId w:val="8"/>
   </w:num>
-  <w:num w:numId="2" w16cid:durableId="741610295">
+  <w:num w:numId="2" w16cid:durableId="956448083">
     <w:abstractNumId w:val="6"/>
   </w:num>
-  <w:num w:numId="3" w16cid:durableId="1419523463">
+  <w:num w:numId="3" w16cid:durableId="169831828">
     <w:abstractNumId w:val="5"/>
   </w:num>
-  <w:num w:numId="4" w16cid:durableId="1002515857">
+  <w:num w:numId="4" w16cid:durableId="359550783">
     <w:abstractNumId w:val="4"/>
   </w:num>
-  <w:num w:numId="5" w16cid:durableId="431322453">
+  <w:num w:numId="5" w16cid:durableId="1395350058">
     <w:abstractNumId w:val="7"/>
   </w:num>
-  <w:num w:numId="6" w16cid:durableId="1085109730">
+  <w:num w:numId="6" w16cid:durableId="1998075394">
     <w:abstractNumId w:val="3"/>
   </w:num>
-  <w:num w:numId="7" w16cid:durableId="1033726851">
+  <w:num w:numId="7" w16cid:durableId="762342867">
     <w:abstractNumId w:val="2"/>
   </w:num>
-  <w:num w:numId="8" w16cid:durableId="777794394">
+  <w:num w:numId="8" w16cid:durableId="862744874">
     <w:abstractNumId w:val="1"/>
   </w:num>
-  <w:num w:numId="9" w16cid:durableId="956302515">
+  <w:num w:numId="9" w16cid:durableId="792552814">
     <w:abstractNumId w:val="0"/>
   </w:num>
 </w:numbering>
@@ -28394,7 +28394,7 @@
     <w:autoRedefine/>
     <w:uiPriority w:val="39"/>
     <w:unhideWhenUsed/>
-    <w:rsid w:val="00E36968"/>
+    <w:rsid w:val="00D857C2"/>
     <w:pPr>
       <w:spacing w:after="100"/>
     </w:pPr>
@@ -28406,7 +28406,7 @@
     <w:autoRedefine/>
     <w:uiPriority w:val="39"/>
     <w:unhideWhenUsed/>
-    <w:rsid w:val="00E36968"/>
+    <w:rsid w:val="00D857C2"/>
     <w:pPr>
       <w:spacing w:after="100"/>
       <w:ind w:left="240"/>
@@ -28417,7 +28417,7 @@
     <w:basedOn w:val="DefaultParagraphFont"/>
     <w:uiPriority w:val="99"/>
     <w:unhideWhenUsed/>
-    <w:rsid w:val="00E36968"/>
+    <w:rsid w:val="00D857C2"/>
     <w:rPr>
       <w:color w:val="0000FF" w:themeColor="hyperlink"/>
       <w:u w:val="single"/>

</xml_diff>